<commit_message>
Update report_vi.docx 2026-05-11 20:27
</commit_message>
<xml_diff>
--- a/report_vi.docx
+++ b/report_vi.docx
@@ -3088,7 +3088,7 @@
                 <w:color w:val="003B71"/>
                 <w:sz w:val="17"/>
               </w:rPr>
-              <w:t>EIMLER-10</w:t>
+              <w:t>Empagliflozin</w:t>
             </w:r>
           </w:p>
         </w:tc>
@@ -3109,7 +3109,7 @@
                 <w:color w:val="374151"/>
                 <w:sz w:val="17"/>
               </w:rPr>
-              <w:t>Empagliflozin 10mg · Đái tháo đường / Suy tim</w:t>
+              <w:t>Tiểu đường / Suy tim</w:t>
             </w:r>
           </w:p>
         </w:tc>
@@ -3130,14 +3130,14 @@
                 <w:color w:val="374151"/>
                 <w:sz w:val="17"/>
               </w:rPr>
-              <w:t>597.000đ/ Hộp 30 viên</w:t>
+              <w:t>Cơ hội cao</w:t>
             </w:r>
           </w:p>
         </w:tc>
         <w:tc>
           <w:tcPr>
             <w:tcW w:type="dxa" w:w="1247"/>
-            <w:shd w:val="clear" w:color="auto" w:fill="E7F9EE"/>
+            <w:shd w:val="clear" w:color="auto" w:fill="EFF6FF"/>
           </w:tcPr>
           <w:p>
             <w:pPr>
@@ -3149,10 +3149,10 @@
                 <w:rFonts w:ascii="Calibri" w:hAnsi="Calibri"/>
                 <w:b/>
                 <w:i w:val="0"/>
-                <w:color w:val="166534"/>
+                <w:color w:val="0056D2"/>
                 <w:sz w:val="17"/>
               </w:rPr>
-              <w:t>Cơ hội cao</w:t>
+              <w:t>Ưu tiên thầu Nhóm 1</w:t>
             </w:r>
           </w:p>
         </w:tc>
@@ -3173,7 +3173,6 @@
                 <w:color w:val="374151"/>
                 <w:sz w:val="17"/>
               </w:rPr>
-              <w:t>Ưu tiên thầu Nhóm 1 – GMP-EU</w:t>
             </w:r>
           </w:p>
         </w:tc>
@@ -3196,7 +3195,7 @@
                 <w:color w:val="003B71"/>
                 <w:sz w:val="17"/>
               </w:rPr>
-              <w:t>JANUS-30</w:t>
+              <w:t>Tadalafil</w:t>
             </w:r>
           </w:p>
         </w:tc>
@@ -3217,7 +3216,7 @@
                 <w:color w:val="374151"/>
                 <w:sz w:val="17"/>
               </w:rPr>
-              <w:t>Dapoxetin 30mg · Tiết niệu – Nam khoa</w:t>
+              <w:t>Nam khoa</w:t>
             </w:r>
           </w:p>
         </w:tc>
@@ -3238,7 +3237,7 @@
                 <w:color w:val="374151"/>
                 <w:sz w:val="17"/>
               </w:rPr>
-              <w:t>480.000đ/ Hộp 8 viên</w:t>
+              <w:t>Cạnh tranh</w:t>
             </w:r>
           </w:p>
         </w:tc>
@@ -3260,7 +3259,7 @@
                 <w:color w:val="0056D2"/>
                 <w:sz w:val="17"/>
               </w:rPr>
-              <w:t>Ổn định</w:t>
+              <w:t>Theo dõi giá Sun Pharma</w:t>
             </w:r>
           </w:p>
         </w:tc>
@@ -3281,7 +3280,6 @@
                 <w:color w:val="374151"/>
                 <w:sz w:val="17"/>
               </w:rPr>
-              <w:t>Kiểm tra listing Long Châu / Pharmacity</w:t>
             </w:r>
           </w:p>
         </w:tc>
@@ -3304,7 +3302,7 @@
                 <w:color w:val="003B71"/>
                 <w:sz w:val="17"/>
               </w:rPr>
-              <w:t>TADALAFIL 20MG</w:t>
+              <w:t>Dapoxetine</w:t>
             </w:r>
           </w:p>
         </w:tc>
@@ -3325,7 +3323,7 @@
                 <w:color w:val="374151"/>
                 <w:sz w:val="17"/>
               </w:rPr>
-              <w:t>Tadalafil 20mg · Tiết niệu – Nam khoa</w:t>
+              <w:t>Nam khoa</w:t>
             </w:r>
           </w:p>
         </w:tc>
@@ -3346,14 +3344,14 @@
                 <w:color w:val="374151"/>
                 <w:sz w:val="17"/>
               </w:rPr>
-              <w:t>42.000đ/ Hộp 2 viên</w:t>
+              <w:t>Ổn định</w:t>
             </w:r>
           </w:p>
         </w:tc>
         <w:tc>
           <w:tcPr>
             <w:tcW w:type="dxa" w:w="1247"/>
-            <w:shd w:val="clear" w:color="auto" w:fill="FFF7ED"/>
+            <w:shd w:val="clear" w:color="auto" w:fill="EFF6FF"/>
           </w:tcPr>
           <w:p>
             <w:pPr>
@@ -3365,10 +3363,10 @@
                 <w:rFonts w:ascii="Calibri" w:hAnsi="Calibri"/>
                 <w:b/>
                 <w:i w:val="0"/>
-                <w:color w:val="D97706"/>
+                <w:color w:val="0056D2"/>
                 <w:sz w:val="17"/>
               </w:rPr>
-              <w:t>Cạnh tranh</w:t>
+              <w:t>Kiểm tra Long Châu listing</w:t>
             </w:r>
           </w:p>
         </w:tc>
@@ -3389,7 +3387,220 @@
                 <w:color w:val="374151"/>
                 <w:sz w:val="17"/>
               </w:rPr>
-              <w:t>Theo dõi giá Sun Pharma &amp; biên lợi nhuận</w:t>
+            </w:r>
+          </w:p>
+        </w:tc>
+      </w:tr>
+      <w:tr>
+        <w:tc>
+          <w:tcPr>
+            <w:tcW w:type="dxa" w:w="1701"/>
+          </w:tcPr>
+          <w:p>
+            <w:pPr>
+              <w:spacing w:before="60" w:after="60"/>
+              <w:ind w:left="85"/>
+            </w:pPr>
+            <w:r>
+              <w:rPr>
+                <w:rFonts w:ascii="Calibri" w:hAnsi="Calibri"/>
+                <w:b/>
+                <w:i w:val="0"/>
+                <w:color w:val="003B71"/>
+                <w:sz w:val="17"/>
+              </w:rPr>
+              <w:t>Cytisine</w:t>
+            </w:r>
+          </w:p>
+        </w:tc>
+        <w:tc>
+          <w:tcPr>
+            <w:tcW w:type="dxa" w:w="2381"/>
+          </w:tcPr>
+          <w:p>
+            <w:pPr>
+              <w:spacing w:before="60" w:after="60"/>
+              <w:ind w:left="85"/>
+            </w:pPr>
+            <w:r>
+              <w:rPr>
+                <w:rFonts w:ascii="Calibri" w:hAnsi="Calibri"/>
+                <w:b w:val="0"/>
+                <w:i w:val="0"/>
+                <w:color w:val="374151"/>
+                <w:sz w:val="17"/>
+              </w:rPr>
+              <w:t>Cai thuốc lá</w:t>
+            </w:r>
+          </w:p>
+        </w:tc>
+        <w:tc>
+          <w:tcPr>
+            <w:tcW w:type="dxa" w:w="1134"/>
+          </w:tcPr>
+          <w:p>
+            <w:pPr>
+              <w:spacing w:before="60" w:after="60"/>
+              <w:ind w:left="85"/>
+            </w:pPr>
+            <w:r>
+              <w:rPr>
+                <w:rFonts w:ascii="Calibri" w:hAnsi="Calibri"/>
+                <w:b w:val="0"/>
+                <w:i w:val="0"/>
+                <w:color w:val="374151"/>
+                <w:sz w:val="17"/>
+              </w:rPr>
+              <w:t>Pre-launch</w:t>
+            </w:r>
+          </w:p>
+        </w:tc>
+        <w:tc>
+          <w:tcPr>
+            <w:tcW w:type="dxa" w:w="1247"/>
+            <w:shd w:val="clear" w:color="auto" w:fill="EFF6FF"/>
+          </w:tcPr>
+          <w:p>
+            <w:pPr>
+              <w:spacing w:before="60" w:after="60"/>
+              <w:ind w:left="85"/>
+            </w:pPr>
+            <w:r>
+              <w:rPr>
+                <w:rFonts w:ascii="Calibri" w:hAnsi="Calibri"/>
+                <w:b/>
+                <w:i w:val="0"/>
+                <w:color w:val="0056D2"/>
+                <w:sz w:val="17"/>
+              </w:rPr>
+              <w:t>Q4/2026 – Cơ hội vàng</w:t>
+            </w:r>
+          </w:p>
+        </w:tc>
+        <w:tc>
+          <w:tcPr>
+            <w:tcW w:type="dxa" w:w="2608"/>
+          </w:tcPr>
+          <w:p>
+            <w:pPr>
+              <w:spacing w:before="60" w:after="60"/>
+              <w:ind w:left="85"/>
+            </w:pPr>
+            <w:r>
+              <w:rPr>
+                <w:rFonts w:ascii="Calibri" w:hAnsi="Calibri"/>
+                <w:b w:val="0"/>
+                <w:i w:val="0"/>
+                <w:color w:val="374151"/>
+                <w:sz w:val="17"/>
+              </w:rPr>
+            </w:r>
+          </w:p>
+        </w:tc>
+      </w:tr>
+      <w:tr>
+        <w:tc>
+          <w:tcPr>
+            <w:tcW w:type="dxa" w:w="1701"/>
+          </w:tcPr>
+          <w:p>
+            <w:pPr>
+              <w:spacing w:before="60" w:after="60"/>
+              <w:ind w:left="85"/>
+            </w:pPr>
+            <w:r>
+              <w:rPr>
+                <w:rFonts w:ascii="Calibri" w:hAnsi="Calibri"/>
+                <w:b/>
+                <w:i w:val="0"/>
+                <w:color w:val="003B71"/>
+                <w:sz w:val="17"/>
+              </w:rPr>
+              <w:t>Metilone</w:t>
+            </w:r>
+          </w:p>
+        </w:tc>
+        <w:tc>
+          <w:tcPr>
+            <w:tcW w:type="dxa" w:w="2381"/>
+          </w:tcPr>
+          <w:p>
+            <w:pPr>
+              <w:spacing w:before="60" w:after="60"/>
+              <w:ind w:left="85"/>
+            </w:pPr>
+            <w:r>
+              <w:rPr>
+                <w:rFonts w:ascii="Calibri" w:hAnsi="Calibri"/>
+                <w:b w:val="0"/>
+                <w:i w:val="0"/>
+                <w:color w:val="374151"/>
+                <w:sz w:val="17"/>
+              </w:rPr>
+              <w:t>Kháng viêm</w:t>
+            </w:r>
+          </w:p>
+        </w:tc>
+        <w:tc>
+          <w:tcPr>
+            <w:tcW w:type="dxa" w:w="1134"/>
+          </w:tcPr>
+          <w:p>
+            <w:pPr>
+              <w:spacing w:before="60" w:after="60"/>
+              <w:ind w:left="85"/>
+            </w:pPr>
+            <w:r>
+              <w:rPr>
+                <w:rFonts w:ascii="Calibri" w:hAnsi="Calibri"/>
+                <w:b w:val="0"/>
+                <w:i w:val="0"/>
+                <w:color w:val="374151"/>
+                <w:sz w:val="17"/>
+              </w:rPr>
+              <w:t>Ổn định</w:t>
+            </w:r>
+          </w:p>
+        </w:tc>
+        <w:tc>
+          <w:tcPr>
+            <w:tcW w:type="dxa" w:w="1247"/>
+            <w:shd w:val="clear" w:color="auto" w:fill="EFF6FF"/>
+          </w:tcPr>
+          <w:p>
+            <w:pPr>
+              <w:spacing w:before="60" w:after="60"/>
+              <w:ind w:left="85"/>
+            </w:pPr>
+            <w:r>
+              <w:rPr>
+                <w:rFonts w:ascii="Calibri" w:hAnsi="Calibri"/>
+                <w:b/>
+                <w:i w:val="0"/>
+                <w:color w:val="0056D2"/>
+                <w:sz w:val="17"/>
+              </w:rPr>
+              <w:t>Duy trì kênh ETC</w:t>
+            </w:r>
+          </w:p>
+        </w:tc>
+        <w:tc>
+          <w:tcPr>
+            <w:tcW w:type="dxa" w:w="2608"/>
+          </w:tcPr>
+          <w:p>
+            <w:pPr>
+              <w:spacing w:before="60" w:after="60"/>
+              <w:ind w:left="85"/>
+            </w:pPr>
+            <w:r>
+              <w:rPr>
+                <w:rFonts w:ascii="Calibri" w:hAnsi="Calibri"/>
+                <w:b w:val="0"/>
+                <w:i w:val="0"/>
+                <w:color w:val="374151"/>
+                <w:sz w:val="17"/>
+              </w:rPr>
             </w:r>
           </w:p>
         </w:tc>

</xml_diff>

<commit_message>
Update report_vi.docx 2026-05-12 18:01
</commit_message>
<xml_diff>
--- a/report_vi.docx
+++ b/report_vi.docx
@@ -258,7 +258,7 @@
                 <w:color w:val="111827"/>
                 <w:sz w:val="19"/>
               </w:rPr>
-              <w:t>11/05/2026</w:t>
+              <w:t>12/05/2026</w:t>
             </w:r>
           </w:p>
         </w:tc>
@@ -3641,7 +3641,7 @@
           <w:color w:val="9CA3AF"/>
           <w:sz w:val="17"/>
         </w:rPr>
-        <w:t>Google Search Console  ·  30 ngày gần nhất  ·  Dữ liệu: 11/05/2026</w:t>
+        <w:t>Google Search Console  ·  30 ngày gần nhất  ·  Dữ liệu: 12/05/2026</w:t>
       </w:r>
     </w:p>
     <w:p>
@@ -4573,7 +4573,7 @@
                 <w:color w:val="9CA3AF"/>
                 <w:sz w:val="15"/>
               </w:rPr>
-              <w:t>Davipharm Market Intelligence System  ·  Powered by Claude Sonnet 4.6  ·  11/05/2026  ·  CONFIDENTIAL</w:t>
+              <w:t>Davipharm Market Intelligence System  ·  Powered by Claude Sonnet 4.6  ·  12/05/2026  ·  CONFIDENTIAL</w:t>
             </w:r>
           </w:p>
         </w:tc>

</xml_diff>

<commit_message>
Update report_vi.docx 2026-05-13 10:02
</commit_message>
<xml_diff>
--- a/report_vi.docx
+++ b/report_vi.docx
@@ -258,7 +258,7 @@
                 <w:color w:val="111827"/>
                 <w:sz w:val="19"/>
               </w:rPr>
-              <w:t>12/05/2026</w:t>
+              <w:t>13/05/2026</w:t>
             </w:r>
           </w:p>
         </w:tc>
@@ -820,7 +820,7 @@
         <w:tc>
           <w:tcPr>
             <w:tcW w:type="dxa" w:w="1701"/>
-            <w:shd w:val="clear" w:color="auto" w:fill="DCFCE7"/>
+            <w:shd w:val="clear" w:color="auto" w:fill="E9FBF0"/>
             <w:tcBorders>
               <w:top w:val="none" w:sz="6" w:color="auto"/>
               <w:bottom w:val="none" w:sz="6" w:color="auto"/>
@@ -836,19 +836,19 @@
             <w:r>
               <w:rPr>
                 <w:rFonts w:ascii="Calibri" w:hAnsi="Calibri"/>
-                <w:b/>
+                <w:b w:val="0"/>
                 <w:i w:val="0"/>
-                <w:color w:val="166534"/>
+                <w:color w:val="CCCCCC"/>
                 <w:sz w:val="22"/>
               </w:rPr>
-              <w:t>2</w:t>
+              <w:t>—</w:t>
             </w:r>
           </w:p>
         </w:tc>
         <w:tc>
           <w:tcPr>
             <w:tcW w:type="dxa" w:w="1984"/>
-            <w:shd w:val="clear" w:color="auto" w:fill="F3F4F6"/>
+            <w:shd w:val="clear" w:color="auto" w:fill="F9FAFB"/>
             <w:tcBorders>
               <w:top w:val="none" w:sz="6" w:color="auto"/>
               <w:bottom w:val="none" w:sz="6" w:color="auto"/>
@@ -864,12 +864,12 @@
             <w:r>
               <w:rPr>
                 <w:rFonts w:ascii="Calibri" w:hAnsi="Calibri"/>
-                <w:b/>
+                <w:b w:val="0"/>
                 <w:i w:val="0"/>
-                <w:color w:val="374151"/>
+                <w:color w:val="CCCCCC"/>
                 <w:sz w:val="22"/>
               </w:rPr>
-              <w:t>1</w:t>
+              <w:t>—</w:t>
             </w:r>
           </w:p>
         </w:tc>
@@ -934,7 +934,7 @@
         <w:tc>
           <w:tcPr>
             <w:tcW w:type="dxa" w:w="1701"/>
-            <w:shd w:val="clear" w:color="auto" w:fill="DCFCE7"/>
+            <w:shd w:val="clear" w:color="auto" w:fill="E9FBF0"/>
             <w:tcBorders>
               <w:top w:val="none" w:sz="6" w:color="auto"/>
               <w:bottom w:val="none" w:sz="6" w:color="auto"/>
@@ -950,19 +950,19 @@
             <w:r>
               <w:rPr>
                 <w:rFonts w:ascii="Calibri" w:hAnsi="Calibri"/>
-                <w:b/>
+                <w:b w:val="0"/>
                 <w:i w:val="0"/>
-                <w:color w:val="166534"/>
+                <w:color w:val="CCCCCC"/>
                 <w:sz w:val="22"/>
               </w:rPr>
-              <w:t>3</w:t>
+              <w:t>—</w:t>
             </w:r>
           </w:p>
         </w:tc>
         <w:tc>
           <w:tcPr>
             <w:tcW w:type="dxa" w:w="1984"/>
-            <w:shd w:val="clear" w:color="auto" w:fill="F3F4F6"/>
+            <w:shd w:val="clear" w:color="auto" w:fill="F9FAFB"/>
             <w:tcBorders>
               <w:top w:val="none" w:sz="6" w:color="auto"/>
               <w:bottom w:val="none" w:sz="6" w:color="auto"/>
@@ -978,12 +978,12 @@
             <w:r>
               <w:rPr>
                 <w:rFonts w:ascii="Calibri" w:hAnsi="Calibri"/>
-                <w:b/>
+                <w:b w:val="0"/>
                 <w:i w:val="0"/>
-                <w:color w:val="374151"/>
+                <w:color w:val="CCCCCC"/>
                 <w:sz w:val="22"/>
               </w:rPr>
-              <w:t>2</w:t>
+              <w:t>—</w:t>
             </w:r>
           </w:p>
         </w:tc>
@@ -1104,7 +1104,7 @@
         <w:tc>
           <w:tcPr>
             <w:tcW w:type="dxa" w:w="2268"/>
-            <w:shd w:val="clear" w:color="auto" w:fill="FEE2E2"/>
+            <w:shd w:val="clear" w:color="auto" w:fill="FFF0F0"/>
             <w:tcBorders>
               <w:top w:val="none" w:sz="6" w:color="auto"/>
               <w:bottom w:val="none" w:sz="6" w:color="auto"/>
@@ -1120,12 +1120,12 @@
             <w:r>
               <w:rPr>
                 <w:rFonts w:ascii="Calibri" w:hAnsi="Calibri"/>
-                <w:b/>
+                <w:b w:val="0"/>
                 <w:i w:val="0"/>
-                <w:color w:val="991B1B"/>
+                <w:color w:val="CCCCCC"/>
                 <w:sz w:val="22"/>
               </w:rPr>
-              <w:t>3</w:t>
+              <w:t>—</w:t>
             </w:r>
           </w:p>
         </w:tc>
@@ -1159,474 +1159,6 @@
         <w:t>CHÍNH SÁCH &amp; PHÁP LÝ</w:t>
       </w:r>
     </w:p>
-    <w:tbl>
-      <w:tblPr>
-        <w:tblStyle w:val="TableGrid"/>
-        <w:tblW w:type="auto" w:w="0"/>
-        <w:jc w:val="left"/>
-        <w:tblLook w:firstColumn="1" w:firstRow="1" w:lastColumn="0" w:lastRow="0" w:noHBand="0" w:noVBand="1" w:val="04A0"/>
-      </w:tblPr>
-      <w:tblGrid>
-        <w:gridCol w:w="4536"/>
-        <w:gridCol w:w="4536"/>
-      </w:tblGrid>
-      <w:tr>
-        <w:tc>
-          <w:tcPr>
-            <w:tcW w:type="dxa" w:w="1984"/>
-            <w:shd w:val="clear" w:color="auto" w:fill="EEF2FF"/>
-            <w:tcBorders>
-              <w:top w:val="none" w:sz="6" w:color="auto"/>
-              <w:bottom w:val="none" w:sz="6" w:color="auto"/>
-              <w:left w:val="none" w:sz="6" w:color="auto"/>
-              <w:right w:val="none" w:sz="6" w:color="auto"/>
-            </w:tcBorders>
-          </w:tcPr>
-          <w:p>
-            <w:pPr>
-              <w:spacing w:before="80" w:after="80"/>
-              <w:ind w:left="85"/>
-            </w:pPr>
-            <w:r>
-              <w:rPr>
-                <w:rFonts w:ascii="Calibri" w:hAnsi="Calibri"/>
-                <w:b/>
-                <w:i w:val="0"/>
-                <w:color w:val="4338CA"/>
-                <w:sz w:val="15"/>
-              </w:rPr>
-              <w:t>ĐẤU THẦU THUỐC</w:t>
-            </w:r>
-          </w:p>
-        </w:tc>
-        <w:tc>
-          <w:tcPr>
-            <w:tcW w:type="dxa" w:w="4536"/>
-            <w:tcBorders>
-              <w:top w:val="none" w:sz="6" w:color="auto"/>
-              <w:bottom w:val="none" w:sz="6" w:color="auto"/>
-              <w:left w:val="none" w:sz="6" w:color="auto"/>
-              <w:right w:val="none" w:sz="6" w:color="auto"/>
-            </w:tcBorders>
-          </w:tcPr>
-          <w:p>
-            <w:pPr>
-              <w:spacing w:before="60" w:after="60"/>
-              <w:ind w:left="113"/>
-            </w:pPr>
-            <w:r>
-              <w:rPr>
-                <w:rFonts w:ascii="Calibri" w:hAnsi="Calibri"/>
-                <w:b/>
-                <w:i w:val="0"/>
-                <w:color w:val="111827"/>
-                <w:sz w:val="21"/>
-              </w:rPr>
-              <w:t>Thuốc giá rẻ không còn chiếm ưu thế tuyệt đối trong đấu thầu</w:t>
-            </w:r>
-          </w:p>
-        </w:tc>
-      </w:tr>
-    </w:tbl>
-    <w:p>
-      <w:pPr>
-        <w:spacing w:before="40" w:after="40"/>
-        <w:ind w:left="170"/>
-      </w:pPr>
-      <w:r>
-        <w:rPr>
-          <w:rFonts w:ascii="Calibri" w:hAnsi="Calibri"/>
-          <w:b w:val="0"/>
-          <w:i/>
-          <w:color w:val="6B7280"/>
-          <w:sz w:val="18"/>
-        </w:rPr>
-        <w:t>Các quy định đấu thầu thuốc mới đang dịch chuyển tiêu chí lựa chọn từ "giá thấp nhất" sang tổng hợp nhiều yếu tố như chất lượng, năng lực sản xuất và tiêu chuẩn GMP, tạo ra sân chơi bình đẳng hơn cho các nhà sản xuất dược phẩm trong nước đạt chuẩn cao.</w:t>
-      </w:r>
-    </w:p>
-    <w:p>
-      <w:pPr>
-        <w:spacing w:before="20" w:after="40"/>
-        <w:ind w:left="170"/>
-      </w:pPr>
-      <w:r>
-        <w:rPr>
-          <w:rFonts w:ascii="Calibri" w:hAnsi="Calibri"/>
-          <w:b/>
-          <w:i w:val="0"/>
-          <w:color w:val="166534"/>
-          <w:sz w:val="17"/>
-        </w:rPr>
-        <w:t>✅ Tích cực — Cơ hội lớn cho nhà sản xuất đạt chuẩn chất lượng cao</w:t>
-      </w:r>
-    </w:p>
-    <w:tbl>
-      <w:tblPr>
-        <w:tblStyle w:val="TableGrid"/>
-        <w:tblW w:type="auto" w:w="0"/>
-        <w:tblLook w:firstColumn="1" w:firstRow="1" w:lastColumn="0" w:lastRow="0" w:noHBand="0" w:noVBand="1" w:val="04A0"/>
-      </w:tblPr>
-      <w:tblGrid>
-        <w:gridCol w:w="9072"/>
-      </w:tblGrid>
-      <w:tr>
-        <w:tc>
-          <w:tcPr>
-            <w:tcW w:type="dxa" w:w="9072"/>
-            <w:shd w:val="clear" w:color="auto" w:fill="F8FAFC"/>
-            <w:tcBorders>
-              <w:top w:val="none" w:sz="6" w:color="auto"/>
-              <w:bottom w:val="none" w:sz="6" w:color="auto"/>
-              <w:left w:val="single" w:sz="12" w:color="003B71"/>
-              <w:right w:val="none" w:sz="6" w:color="auto"/>
-            </w:tcBorders>
-          </w:tcPr>
-          <w:p>
-            <w:pPr>
-              <w:spacing w:before="60" w:after="60"/>
-              <w:ind w:left="142"/>
-            </w:pPr>
-            <w:r>
-              <w:rPr>
-                <w:rFonts w:ascii="Calibri" w:hAnsi="Calibri"/>
-                <w:b/>
-                <w:i w:val="0"/>
-                <w:color w:val="003B71"/>
-                <w:sz w:val="17"/>
-              </w:rPr>
-              <w:t xml:space="preserve">Strategy  </w:t>
-            </w:r>
-            <w:r>
-              <w:rPr>
-                <w:rFonts w:ascii="Calibri" w:hAnsi="Calibri"/>
-                <w:b w:val="0"/>
-                <w:i w:val="0"/>
-                <w:color w:val="334155"/>
-                <w:sz w:val="17"/>
-              </w:rPr>
-              <w:t>🎯 Cơ hội chiến lược:Sự dịch chuyển tiêu chí đấu thầu từ "giá rẻ nhất" sang "giá trị tổng thể" là tin cực kỳ thuận lợi cho Davipharm — một nhà sản xuất đầu tư bài bản vào tiêu chuẩn EU-GMP/WHO-GMP. Trước đây, Davipharm thường bị cạnh tranh bởi các đối thủ cắt giảm chi phí sản xuất để thắng thầu bằng giá. Nay, lợi thế chất lượng trở thành vũ khí cạnh tranh hợp pháp trong đấu thầu.⚔️ Cạnh tranh với đối thủ trực tiếp (Imexpharm, DHG, Traphaco):Đây là cuộc đua mới về "hồ sơ năng lực". Imexpharm với chuẩn EU-GMP sẽ là đối thủ đáng gờm nhất trong phân khúc đấu thầu bệnh viện hạng cao. DHG và Traphaco có danh mục rộng nhưng cần đánh giá lại mức độ đạt chuẩn từng nhà máy. Davipharm cầnchủ động xây dựng hồ sơ năng lực chuẩn hóa(GMP certificates, stability data, bioequivalence studies) để tối đa hóa điểm kỹ thuật trong các gói thầu nhóm 1-2.📋 Hành động ưu tiên:(1) Rà soát toàn bộ danh mục sản phẩm để xác định SKU đủ điều kiện dự thầu nhóm 1 (EU-GMP); (2) Tăng cường đội ngũ đấu thầu chuyên biệt với năng lực soạn hồ sơ kỹ thuật vượt trội; (3) Định vị thương hiệu Davipharm = "Chất lượng châu Âu, Giá Việt Nam" trong truyền thông B2B với bệnh viện và Sở Y tế.</w:t>
-            </w:r>
-          </w:p>
-        </w:tc>
-      </w:tr>
-    </w:tbl>
-    <w:p>
-      <w:pPr>
-        <w:spacing w:before="40" w:after="120"/>
-      </w:pPr>
-    </w:p>
-    <w:tbl>
-      <w:tblPr>
-        <w:tblStyle w:val="TableGrid"/>
-        <w:tblW w:type="auto" w:w="0"/>
-        <w:jc w:val="left"/>
-        <w:tblLook w:firstColumn="1" w:firstRow="1" w:lastColumn="0" w:lastRow="0" w:noHBand="0" w:noVBand="1" w:val="04A0"/>
-      </w:tblPr>
-      <w:tblGrid>
-        <w:gridCol w:w="4536"/>
-        <w:gridCol w:w="4536"/>
-      </w:tblGrid>
-      <w:tr>
-        <w:tc>
-          <w:tcPr>
-            <w:tcW w:type="dxa" w:w="1984"/>
-            <w:shd w:val="clear" w:color="auto" w:fill="EEF2FF"/>
-            <w:tcBorders>
-              <w:top w:val="none" w:sz="6" w:color="auto"/>
-              <w:bottom w:val="none" w:sz="6" w:color="auto"/>
-              <w:left w:val="none" w:sz="6" w:color="auto"/>
-              <w:right w:val="none" w:sz="6" w:color="auto"/>
-            </w:tcBorders>
-          </w:tcPr>
-          <w:p>
-            <w:pPr>
-              <w:spacing w:before="80" w:after="80"/>
-              <w:ind w:left="85"/>
-            </w:pPr>
-            <w:r>
-              <w:rPr>
-                <w:rFonts w:ascii="Calibri" w:hAnsi="Calibri"/>
-                <w:b/>
-                <w:i w:val="0"/>
-                <w:color w:val="4338CA"/>
-                <w:sz w:val="15"/>
-              </w:rPr>
-              <w:t>CHÍNH SÁCH DƯỢC PHẨM VIỆT NAM</w:t>
-            </w:r>
-          </w:p>
-        </w:tc>
-        <w:tc>
-          <w:tcPr>
-            <w:tcW w:type="dxa" w:w="4536"/>
-            <w:tcBorders>
-              <w:top w:val="none" w:sz="6" w:color="auto"/>
-              <w:bottom w:val="none" w:sz="6" w:color="auto"/>
-              <w:left w:val="none" w:sz="6" w:color="auto"/>
-              <w:right w:val="none" w:sz="6" w:color="auto"/>
-            </w:tcBorders>
-          </w:tcPr>
-          <w:p>
-            <w:pPr>
-              <w:spacing w:before="60" w:after="60"/>
-              <w:ind w:left="113"/>
-            </w:pPr>
-            <w:r>
-              <w:rPr>
-                <w:rFonts w:ascii="Calibri" w:hAnsi="Calibri"/>
-                <w:b/>
-                <w:i w:val="0"/>
-                <w:color w:val="111827"/>
-                <w:sz w:val="21"/>
-              </w:rPr>
-              <w:t>Mỹ nêu lo ngại về chính sách dược phẩm của Hàn Quốc - KBS WORLD Radio</w:t>
-            </w:r>
-          </w:p>
-        </w:tc>
-      </w:tr>
-    </w:tbl>
-    <w:p>
-      <w:pPr>
-        <w:spacing w:before="40" w:after="40"/>
-        <w:ind w:left="170"/>
-      </w:pPr>
-      <w:r>
-        <w:rPr>
-          <w:rFonts w:ascii="Calibri" w:hAnsi="Calibri"/>
-          <w:b w:val="0"/>
-          <w:i/>
-          <w:color w:val="6B7280"/>
-          <w:sz w:val="18"/>
-        </w:rPr>
-        <w:t>Hoa Kỳ chính thức bày tỏ lo ngại với Hàn Quốc về các chính sách dược phẩm, bao gồm cơ chế định giá thuốc, điều kiện hoàn trả bảo hiểm y tế và rào cản tiếp cận thị trường đối với các sản phẩm dược phẩm nước ngoài. Đây là một phần trong khuôn khổ đàm phán thương mại song phương, phản ánh xu hướng các cường quốc ngày càng chú trọng đến minh bạch hóa chính sách dược phẩm toàn cầu.</w:t>
-      </w:r>
-    </w:p>
-    <w:p>
-      <w:pPr>
-        <w:spacing w:before="20" w:after="40"/>
-        <w:ind w:left="170"/>
-      </w:pPr>
-      <w:r>
-        <w:rPr>
-          <w:rFonts w:ascii="Calibri" w:hAnsi="Calibri"/>
-          <w:b/>
-          <w:i w:val="0"/>
-          <w:color w:val="374151"/>
-          <w:sz w:val="17"/>
-        </w:rPr>
-        <w:t>⚠️ Tác động gián tiếp — Tín hiệu cảnh báo chính sách cho thị trường Việt Nam</w:t>
-      </w:r>
-    </w:p>
-    <w:tbl>
-      <w:tblPr>
-        <w:tblStyle w:val="TableGrid"/>
-        <w:tblW w:type="auto" w:w="0"/>
-        <w:tblLook w:firstColumn="1" w:firstRow="1" w:lastColumn="0" w:lastRow="0" w:noHBand="0" w:noVBand="1" w:val="04A0"/>
-      </w:tblPr>
-      <w:tblGrid>
-        <w:gridCol w:w="9072"/>
-      </w:tblGrid>
-      <w:tr>
-        <w:tc>
-          <w:tcPr>
-            <w:tcW w:type="dxa" w:w="9072"/>
-            <w:shd w:val="clear" w:color="auto" w:fill="F8FAFC"/>
-            <w:tcBorders>
-              <w:top w:val="none" w:sz="6" w:color="auto"/>
-              <w:bottom w:val="none" w:sz="6" w:color="auto"/>
-              <w:left w:val="single" w:sz="12" w:color="003B71"/>
-              <w:right w:val="none" w:sz="6" w:color="auto"/>
-            </w:tcBorders>
-          </w:tcPr>
-          <w:p>
-            <w:pPr>
-              <w:spacing w:before="60" w:after="60"/>
-              <w:ind w:left="142"/>
-            </w:pPr>
-            <w:r>
-              <w:rPr>
-                <w:rFonts w:ascii="Calibri" w:hAnsi="Calibri"/>
-                <w:b/>
-                <w:i w:val="0"/>
-                <w:color w:val="003B71"/>
-                <w:sz w:val="17"/>
-              </w:rPr>
-              <w:t xml:space="preserve">Strategy  </w:t>
-            </w:r>
-            <w:r>
-              <w:rPr>
-                <w:rFonts w:ascii="Calibri" w:hAnsi="Calibri"/>
-                <w:b w:val="0"/>
-                <w:i w:val="0"/>
-                <w:color w:val="334155"/>
-                <w:sz w:val="17"/>
-              </w:rPr>
-              <w:t>Sự kiện Mỹ gây áp lực lên chính sách dược phẩm Hàn Quốc là tín hiệu chiến lược quan trọng cho Davipharm trên nhiều chiều:1. Rủi ro chính sách tại Việt Nam:Việt Nam đang trong quá trình đàm phán và thực thi các FTA (EVFTA, CPTPP, UKVFTA). Áp lực tương tự từ các đối tác thương mại lớn có thể buộc Bộ Y tế điều chỉnh cơ chế đấu thầu, định giá và hoàn trả BHYT — ảnh hưởng trực tiếp đến danh mục generic của Davipharm.2. Cơ hội cho Empagliflozin &amp; Dapoxetine:Nếu chính sách hoàn trả BHYT được mở rộng theo hướng minh bạch hơn (dưới áp lực quốc tế), các sản phẩm generic chất lượng cao như Empagliflozin (điều trị đái tháo đường type 2) và Dapoxetine (rối loạn xuất tinh sớm) của Davipharm có cơ hội được đưa vào danh mục thanh toán BHYT, mở rộng tệp bệnh nhân tiếp cận.3. Tadalafil — Định vị OTC chiến lược:Trong bối cảnh chính sách hoàn trả có thể bị siết chặt hoặc tái cơ cấu, Tadalafil nên được Davipharm đẩy mạnh theo kênh OTC và ETC song song, giảm phụ thuộc vào đấu thầu bệnh viện.Khuyến nghị:Davipharm cần theo dõi sát diễn biến đàm phán thương mại Mỹ–Việt và chủ động tham gia các diễn đàn chính sách dược phẩm trong nước để bảo vệ lợi thế cạnh tranh của dòng sản phẩm generic nội địa.</w:t>
-            </w:r>
-          </w:p>
-        </w:tc>
-      </w:tr>
-    </w:tbl>
-    <w:p>
-      <w:pPr>
-        <w:spacing w:before="40" w:after="120"/>
-      </w:pPr>
-    </w:p>
-    <w:tbl>
-      <w:tblPr>
-        <w:tblStyle w:val="TableGrid"/>
-        <w:tblW w:type="auto" w:w="0"/>
-        <w:jc w:val="left"/>
-        <w:tblLook w:firstColumn="1" w:firstRow="1" w:lastColumn="0" w:lastRow="0" w:noHBand="0" w:noVBand="1" w:val="04A0"/>
-      </w:tblPr>
-      <w:tblGrid>
-        <w:gridCol w:w="4536"/>
-        <w:gridCol w:w="4536"/>
-      </w:tblGrid>
-      <w:tr>
-        <w:tc>
-          <w:tcPr>
-            <w:tcW w:type="dxa" w:w="1984"/>
-            <w:shd w:val="clear" w:color="auto" w:fill="EEF2FF"/>
-            <w:tcBorders>
-              <w:top w:val="none" w:sz="6" w:color="auto"/>
-              <w:bottom w:val="none" w:sz="6" w:color="auto"/>
-              <w:left w:val="none" w:sz="6" w:color="auto"/>
-              <w:right w:val="none" w:sz="6" w:color="auto"/>
-            </w:tcBorders>
-          </w:tcPr>
-          <w:p>
-            <w:pPr>
-              <w:spacing w:before="80" w:after="80"/>
-              <w:ind w:left="85"/>
-            </w:pPr>
-            <w:r>
-              <w:rPr>
-                <w:rFonts w:ascii="Calibri" w:hAnsi="Calibri"/>
-                <w:b/>
-                <w:i w:val="0"/>
-                <w:color w:val="4338CA"/>
-                <w:sz w:val="15"/>
-              </w:rPr>
-              <w:t>BỘ Y TẾ · ĐẤU THẦU &amp; MUA SẮM</w:t>
-            </w:r>
-          </w:p>
-        </w:tc>
-        <w:tc>
-          <w:tcPr>
-            <w:tcW w:type="dxa" w:w="4536"/>
-            <w:tcBorders>
-              <w:top w:val="none" w:sz="6" w:color="auto"/>
-              <w:bottom w:val="none" w:sz="6" w:color="auto"/>
-              <w:left w:val="none" w:sz="6" w:color="auto"/>
-              <w:right w:val="none" w:sz="6" w:color="auto"/>
-            </w:tcBorders>
-          </w:tcPr>
-          <w:p>
-            <w:pPr>
-              <w:spacing w:before="60" w:after="60"/>
-              <w:ind w:left="113"/>
-            </w:pPr>
-            <w:r>
-              <w:rPr>
-                <w:rFonts w:ascii="Calibri" w:hAnsi="Calibri"/>
-                <w:b/>
-                <w:i w:val="0"/>
-                <w:color w:val="111827"/>
-                <w:sz w:val="21"/>
-              </w:rPr>
-              <w:t>Bộ trưởng Bộ Y tế thông tin về mua sắm, đấu thầu vaccine tiêm chủng mở rộng</w:t>
-            </w:r>
-          </w:p>
-        </w:tc>
-      </w:tr>
-    </w:tbl>
-    <w:p>
-      <w:pPr>
-        <w:spacing w:before="40" w:after="40"/>
-        <w:ind w:left="170"/>
-      </w:pPr>
-      <w:r>
-        <w:rPr>
-          <w:rFonts w:ascii="Calibri" w:hAnsi="Calibri"/>
-          <w:b w:val="0"/>
-          <w:i/>
-          <w:color w:val="6B7280"/>
-          <w:sz w:val="18"/>
-        </w:rPr>
-        <w:t>Bộ trưởng Bộ Y tế đã cung cấp thông tin chính thức về quy trình mua sắm và đấu thầu vaccine trong Chương trình Tiêm chủng Mở rộng Quốc gia, nhấn mạnh yêu cầu minh bạch, đúng quy định pháp luật và đảm bảo nguồn cung ổn định cho người dân. Đây là tín hiệu cho thấy Chính phủ đang tăng cường giám sát và cải thiện cơ chế đấu thầu dược phẩm công.</w:t>
-      </w:r>
-    </w:p>
-    <w:p>
-      <w:pPr>
-        <w:spacing w:before="20" w:after="40"/>
-        <w:ind w:left="170"/>
-      </w:pPr>
-      <w:r>
-        <w:rPr>
-          <w:rFonts w:ascii="Calibri" w:hAnsi="Calibri"/>
-          <w:b/>
-          <w:i w:val="0"/>
-          <w:color w:val="166534"/>
-          <w:sz w:val="17"/>
-        </w:rPr>
-        <w:t>✅ Tích cực — Cải cách đấu thầu công tạo môi trường cạnh tranh minh bạch hơn cho doanh nghiệp dược nội địa</w:t>
-      </w:r>
-    </w:p>
-    <w:tbl>
-      <w:tblPr>
-        <w:tblStyle w:val="TableGrid"/>
-        <w:tblW w:type="auto" w:w="0"/>
-        <w:tblLook w:firstColumn="1" w:firstRow="1" w:lastColumn="0" w:lastRow="0" w:noHBand="0" w:noVBand="1" w:val="04A0"/>
-      </w:tblPr>
-      <w:tblGrid>
-        <w:gridCol w:w="9072"/>
-      </w:tblGrid>
-      <w:tr>
-        <w:tc>
-          <w:tcPr>
-            <w:tcW w:type="dxa" w:w="9072"/>
-            <w:shd w:val="clear" w:color="auto" w:fill="F8FAFC"/>
-            <w:tcBorders>
-              <w:top w:val="none" w:sz="6" w:color="auto"/>
-              <w:bottom w:val="none" w:sz="6" w:color="auto"/>
-              <w:left w:val="single" w:sz="12" w:color="003B71"/>
-              <w:right w:val="none" w:sz="6" w:color="auto"/>
-            </w:tcBorders>
-          </w:tcPr>
-          <w:p>
-            <w:pPr>
-              <w:spacing w:before="60" w:after="60"/>
-              <w:ind w:left="142"/>
-            </w:pPr>
-            <w:r>
-              <w:rPr>
-                <w:rFonts w:ascii="Calibri" w:hAnsi="Calibri"/>
-                <w:b/>
-                <w:i w:val="0"/>
-                <w:color w:val="003B71"/>
-                <w:sz w:val="17"/>
-              </w:rPr>
-              <w:t xml:space="preserve">Strategy  </w:t>
-            </w:r>
-            <w:r>
-              <w:rPr>
-                <w:rFonts w:ascii="Calibri" w:hAnsi="Calibri"/>
-                <w:b w:val="0"/>
-                <w:i w:val="0"/>
-                <w:color w:val="334155"/>
-                <w:sz w:val="17"/>
-              </w:rPr>
-              <w:t>Mặc dù bài báo tập trung vào vaccine — không phải phân khúc cốt lõi của Davipharm — nhưng tín hiệu cải cách đấu thầu công có tác động lan tỏa quan trọng:① Cơ hội hệ thống:Việc Bộ Y tế tăng cường minh bạch hóa quy trình đấu thầu (Thông tư 14, 15) tạo điều kiện thuận lợi hơn cho các sản phẩm generic chất lượng cao của Davipharm — đặc biệtEmpagliflozin(điều trị đái tháo đường type 2) vàTadalafil— tham gia đấu thầu bệnh viện nhóm 1–2 với lợi thế cạnh tranh về giá và tiêu chuẩn GMP.② Rủi ro cần theo dõi:Nếu cơ chế đấu thầu tập trung quốc gia được mở rộng sang các nhóm thuốc điều trị mãn tính (tim mạch, tiểu đường), áp lực giảm giá sẽ gia tăng — đòi hỏi Davipharm tối ưu hóa chi phí sản xuất và xây dựng hồ sơ năng lực đấu thầu vững chắc.③ Chiến lược đề xuất:Chủ động chuẩn bị hồ sơ kỹ thuật đầy đủ choDapoxetinevàEmpagliflozinđể sẵn sàng tham gia các gói thầu bệnh viện tuyến tỉnh/trung ương ngay khi danh mục đấu thầu tập trung được cập nhật trong Q3–Q4/2025.</w:t>
-            </w:r>
-          </w:p>
-        </w:tc>
-      </w:tr>
-    </w:tbl>
-    <w:p>
-      <w:pPr>
-        <w:spacing w:before="40" w:after="120"/>
-      </w:pPr>
-    </w:p>
     <w:p>
       <w:r>
         <w:br w:type="page"/>
@@ -1650,786 +1182,6 @@
         <w:t>TIN NGÀNH DƯỢC</w:t>
       </w:r>
     </w:p>
-    <w:tbl>
-      <w:tblPr>
-        <w:tblStyle w:val="TableGrid"/>
-        <w:tblW w:type="auto" w:w="0"/>
-        <w:jc w:val="left"/>
-        <w:tblLook w:firstColumn="1" w:firstRow="1" w:lastColumn="0" w:lastRow="0" w:noHBand="0" w:noVBand="1" w:val="04A0"/>
-      </w:tblPr>
-      <w:tblGrid>
-        <w:gridCol w:w="4536"/>
-        <w:gridCol w:w="4536"/>
-      </w:tblGrid>
-      <w:tr>
-        <w:tc>
-          <w:tcPr>
-            <w:tcW w:type="dxa" w:w="1984"/>
-            <w:shd w:val="clear" w:color="auto" w:fill="EEF2FF"/>
-            <w:tcBorders>
-              <w:top w:val="none" w:sz="6" w:color="auto"/>
-              <w:bottom w:val="none" w:sz="6" w:color="auto"/>
-              <w:left w:val="none" w:sz="6" w:color="auto"/>
-              <w:right w:val="none" w:sz="6" w:color="auto"/>
-            </w:tcBorders>
-          </w:tcPr>
-          <w:p>
-            <w:pPr>
-              <w:spacing w:before="80" w:after="80"/>
-              <w:ind w:left="85"/>
-            </w:pPr>
-            <w:r>
-              <w:rPr>
-                <w:rFonts w:ascii="Calibri" w:hAnsi="Calibri"/>
-                <w:b/>
-                <w:i w:val="0"/>
-                <w:color w:val="4338CA"/>
-                <w:sz w:val="15"/>
-              </w:rPr>
-              <w:t>THỊ TRƯỜNG DƯỢC PHẨM VIỆT NAM</w:t>
-            </w:r>
-          </w:p>
-        </w:tc>
-        <w:tc>
-          <w:tcPr>
-            <w:tcW w:type="dxa" w:w="4536"/>
-            <w:tcBorders>
-              <w:top w:val="none" w:sz="6" w:color="auto"/>
-              <w:bottom w:val="none" w:sz="6" w:color="auto"/>
-              <w:left w:val="none" w:sz="6" w:color="auto"/>
-              <w:right w:val="none" w:sz="6" w:color="auto"/>
-            </w:tcBorders>
-          </w:tcPr>
-          <w:p>
-            <w:pPr>
-              <w:spacing w:before="60" w:after="60"/>
-              <w:ind w:left="113"/>
-            </w:pPr>
-            <w:r>
-              <w:rPr>
-                <w:rFonts w:ascii="Calibri" w:hAnsi="Calibri"/>
-                <w:b/>
-                <w:i w:val="0"/>
-                <w:color w:val="111827"/>
-                <w:sz w:val="21"/>
-              </w:rPr>
-              <w:t>Nhượng quyền chuỗi nhà thuốc: Hướng mở rộng thị trường gắn với chuẩn hóa quản trị dược phẩm</w:t>
-            </w:r>
-          </w:p>
-        </w:tc>
-      </w:tr>
-    </w:tbl>
-    <w:p>
-      <w:pPr>
-        <w:spacing w:before="40" w:after="40"/>
-        <w:ind w:left="170"/>
-      </w:pPr>
-      <w:r>
-        <w:rPr>
-          <w:rFonts w:ascii="Calibri" w:hAnsi="Calibri"/>
-          <w:b w:val="0"/>
-          <w:i/>
-          <w:color w:val="6B7280"/>
-          <w:sz w:val="18"/>
-        </w:rPr>
-        <w:t>Mô hình nhượng quyền chuỗi nhà thuốc đang nổi lên như một xu hướng mở rộng thị trường bán lẻ dược phẩm tại Việt Nam, kết hợp giữa tăng trưởng điểm bán và chuẩn hóa quy trình quản trị, kiểm soát chất lượng thuốc theo tiêu chuẩn GPP. Các chuỗi lớn như Long Châu, Pharmacity đang đẩy mạnh mô hình này để nhanh chóng phủ rộng mạng lưới phân phối trên toàn quốc.</w:t>
-      </w:r>
-    </w:p>
-    <w:p>
-      <w:pPr>
-        <w:spacing w:before="20" w:after="40"/>
-        <w:ind w:left="170"/>
-      </w:pPr>
-      <w:r>
-        <w:rPr>
-          <w:rFonts w:ascii="Calibri" w:hAnsi="Calibri"/>
-          <w:b/>
-          <w:i w:val="0"/>
-          <w:color w:val="166534"/>
-          <w:sz w:val="17"/>
-        </w:rPr>
-        <w:t>⚡ Tác động Tích cực có Điều kiện — Mở rộng kênh phân phối tạo cơ hội tiếp cận thị trường rộng hơn cho nhà sản xuất, nhưng đi kèm áp lực đàm phán listing phí và shelf-space ngày càng tăng.</w:t>
-      </w:r>
-    </w:p>
-    <w:tbl>
-      <w:tblPr>
-        <w:tblStyle w:val="TableGrid"/>
-        <w:tblW w:type="auto" w:w="0"/>
-        <w:tblLook w:firstColumn="1" w:firstRow="1" w:lastColumn="0" w:lastRow="0" w:noHBand="0" w:noVBand="1" w:val="04A0"/>
-      </w:tblPr>
-      <w:tblGrid>
-        <w:gridCol w:w="9072"/>
-      </w:tblGrid>
-      <w:tr>
-        <w:tc>
-          <w:tcPr>
-            <w:tcW w:type="dxa" w:w="9072"/>
-            <w:shd w:val="clear" w:color="auto" w:fill="F8FAFC"/>
-            <w:tcBorders>
-              <w:top w:val="none" w:sz="6" w:color="auto"/>
-              <w:bottom w:val="none" w:sz="6" w:color="auto"/>
-              <w:left w:val="single" w:sz="12" w:color="003B71"/>
-              <w:right w:val="none" w:sz="6" w:color="auto"/>
-            </w:tcBorders>
-          </w:tcPr>
-          <w:p>
-            <w:pPr>
-              <w:spacing w:before="60" w:after="60"/>
-              <w:ind w:left="142"/>
-            </w:pPr>
-            <w:r>
-              <w:rPr>
-                <w:rFonts w:ascii="Calibri" w:hAnsi="Calibri"/>
-                <w:b/>
-                <w:i w:val="0"/>
-                <w:color w:val="003B71"/>
-                <w:sz w:val="17"/>
-              </w:rPr>
-              <w:t xml:space="preserve">Strategy  </w:t>
-            </w:r>
-            <w:r>
-              <w:rPr>
-                <w:rFonts w:ascii="Calibri" w:hAnsi="Calibri"/>
-                <w:b w:val="0"/>
-                <w:i w:val="0"/>
-                <w:color w:val="334155"/>
-                <w:sz w:val="17"/>
-              </w:rPr>
-              <w:t>🏪 Quyền lực kênh (Channel Power) — Rủi ro cốt lõi cần theo dõi:Khi Long Châu và Pharmacity mở rộng mạng lưới nhượng quyền, quy mô điểm bán tăng nhanh đồng nghĩa với việc quyền lực đàm phán của các chuỗi này với nhà sản xuất ngày càng lớn hơn. Davipharm cần cảnh giác với 3 rủi ro chính: (1)Listing fee leo thang— chi phí để sản phẩm Davipharm xuất hiện trên kệ chuỗi nhượng quyền có thể tăng đáng kể; (2)Shelf-space bị thu hẹp— các chuỗi ưu tiên nhãn hàng riêng (private label) hoặc đối tác độc quyền, đẩy sản phẩm Davipharm xuống vị trí kém thuận lợi; (3)Áp lực chiết khấu— mô hình nhượng quyền cần biên lợi nhuận hấp dẫn cho franchisee, tạo áp lực giảm giá bán buôn từ nhà sản xuất.✅ Cơ hội chiến lược cho Davipharm:Ngược lại, sự chuẩn hóa GPP trong mô hình nhượng quyền là lợi thế cho Davipharm — các sản phẩm đạt chuẩn GMP-WHO, có hồ sơ chất lượng rõ ràng sẽ dễ được chấp thuận listing hơn. Davipharm nên: (1) Chủ động đàm phánpartnership agreementvới các chuỗi lớn ở cấp độ tập đoàn (không chỉ từng điểm bán) để đảm bảo shelf-space ổn định; (2) Phát triển danh mục sản phẩmOTC có thương hiệu mạnhđể tạo pull-demand từ người tiêu dùng, giảm phụ thuộc vào quyết định của chuỗi; (3) Xem xét hợp tác cung cấpprivate labelcó chọn lọc để duy trì doanh số sản lượng trong khi xây dựng thương hiệu riêng song song.</w:t>
-            </w:r>
-          </w:p>
-        </w:tc>
-      </w:tr>
-    </w:tbl>
-    <w:p>
-      <w:pPr>
-        <w:spacing w:before="40" w:after="120"/>
-      </w:pPr>
-    </w:p>
-    <w:tbl>
-      <w:tblPr>
-        <w:tblStyle w:val="TableGrid"/>
-        <w:tblW w:type="auto" w:w="0"/>
-        <w:jc w:val="left"/>
-        <w:tblLook w:firstColumn="1" w:firstRow="1" w:lastColumn="0" w:lastRow="0" w:noHBand="0" w:noVBand="1" w:val="04A0"/>
-      </w:tblPr>
-      <w:tblGrid>
-        <w:gridCol w:w="4536"/>
-        <w:gridCol w:w="4536"/>
-      </w:tblGrid>
-      <w:tr>
-        <w:tc>
-          <w:tcPr>
-            <w:tcW w:type="dxa" w:w="1984"/>
-            <w:shd w:val="clear" w:color="auto" w:fill="EEF2FF"/>
-            <w:tcBorders>
-              <w:top w:val="none" w:sz="6" w:color="auto"/>
-              <w:bottom w:val="none" w:sz="6" w:color="auto"/>
-              <w:left w:val="none" w:sz="6" w:color="auto"/>
-              <w:right w:val="none" w:sz="6" w:color="auto"/>
-            </w:tcBorders>
-          </w:tcPr>
-          <w:p>
-            <w:pPr>
-              <w:spacing w:before="80" w:after="80"/>
-              <w:ind w:left="85"/>
-            </w:pPr>
-            <w:r>
-              <w:rPr>
-                <w:rFonts w:ascii="Calibri" w:hAnsi="Calibri"/>
-                <w:b/>
-                <w:i w:val="0"/>
-                <w:color w:val="4338CA"/>
-                <w:sz w:val="15"/>
-              </w:rPr>
-              <w:t>THỊ TRƯỜNG DƯỢC PHẨM VIỆT NAM</w:t>
-            </w:r>
-          </w:p>
-        </w:tc>
-        <w:tc>
-          <w:tcPr>
-            <w:tcW w:type="dxa" w:w="4536"/>
-            <w:tcBorders>
-              <w:top w:val="none" w:sz="6" w:color="auto"/>
-              <w:bottom w:val="none" w:sz="6" w:color="auto"/>
-              <w:left w:val="none" w:sz="6" w:color="auto"/>
-              <w:right w:val="none" w:sz="6" w:color="auto"/>
-            </w:tcBorders>
-          </w:tcPr>
-          <w:p>
-            <w:pPr>
-              <w:spacing w:before="60" w:after="60"/>
-              <w:ind w:left="113"/>
-            </w:pPr>
-            <w:r>
-              <w:rPr>
-                <w:rFonts w:ascii="Calibri" w:hAnsi="Calibri"/>
-                <w:b/>
-                <w:i w:val="0"/>
-                <w:color w:val="111827"/>
-                <w:sz w:val="21"/>
-              </w:rPr>
-              <w:t>3 tháng đầu năm 2026: Kim ngạch nhập khẩu nguyên phụ liệu dược phẩm của Việt Nam giảm mạnh</w:t>
-            </w:r>
-          </w:p>
-        </w:tc>
-      </w:tr>
-    </w:tbl>
-    <w:p>
-      <w:pPr>
-        <w:spacing w:before="40" w:after="40"/>
-        <w:ind w:left="170"/>
-      </w:pPr>
-      <w:r>
-        <w:rPr>
-          <w:rFonts w:ascii="Calibri" w:hAnsi="Calibri"/>
-          <w:b w:val="0"/>
-          <w:i/>
-          <w:color w:val="6B7280"/>
-          <w:sz w:val="18"/>
-        </w:rPr>
-        <w:t>Theo số liệu từ Vinanet, kim ngạch nhập khẩu nguyên phụ liệu dược phẩm của Việt Nam trong 3 tháng đầu năm 2026 ghi nhận mức giảm đáng kể so với cùng kỳ năm trước. Điều này phản ánh sự thay đổi trong chuỗi cung ứng dược phẩm toàn cầu, áp lực tỷ giá, cũng như xu hướng các nhà sản xuất trong nước tìm kiếm nguồn nguyên liệu thay thế hoặc tối ưu hóa tồn kho.</w:t>
-      </w:r>
-    </w:p>
-    <w:p>
-      <w:pPr>
-        <w:spacing w:before="20" w:after="40"/>
-        <w:ind w:left="170"/>
-      </w:pPr>
-      <w:r>
-        <w:rPr>
-          <w:rFonts w:ascii="Calibri" w:hAnsi="Calibri"/>
-          <w:b/>
-          <w:i w:val="0"/>
-          <w:color w:val="374151"/>
-          <w:sz w:val="17"/>
-        </w:rPr>
-        <w:t>⚠️ Tác động Trung lập – Hai chiều: Rủi ro thiếu hụt nguyên liệu nhưng mở ra cơ hội tái cơ cấu chuỗi cung ứng và nâng cao lợi thế cạnh tranh nội địa</w:t>
-      </w:r>
-    </w:p>
-    <w:tbl>
-      <w:tblPr>
-        <w:tblStyle w:val="TableGrid"/>
-        <w:tblW w:type="auto" w:w="0"/>
-        <w:tblLook w:firstColumn="1" w:firstRow="1" w:lastColumn="0" w:lastRow="0" w:noHBand="0" w:noVBand="1" w:val="04A0"/>
-      </w:tblPr>
-      <w:tblGrid>
-        <w:gridCol w:w="9072"/>
-      </w:tblGrid>
-      <w:tr>
-        <w:tc>
-          <w:tcPr>
-            <w:tcW w:type="dxa" w:w="9072"/>
-            <w:shd w:val="clear" w:color="auto" w:fill="F8FAFC"/>
-            <w:tcBorders>
-              <w:top w:val="none" w:sz="6" w:color="auto"/>
-              <w:bottom w:val="none" w:sz="6" w:color="auto"/>
-              <w:left w:val="single" w:sz="12" w:color="003B71"/>
-              <w:right w:val="none" w:sz="6" w:color="auto"/>
-            </w:tcBorders>
-          </w:tcPr>
-          <w:p>
-            <w:pPr>
-              <w:spacing w:before="60" w:after="60"/>
-              <w:ind w:left="142"/>
-            </w:pPr>
-            <w:r>
-              <w:rPr>
-                <w:rFonts w:ascii="Calibri" w:hAnsi="Calibri"/>
-                <w:b/>
-                <w:i w:val="0"/>
-                <w:color w:val="003B71"/>
-                <w:sz w:val="17"/>
-              </w:rPr>
-              <w:t xml:space="preserve">Strategy  </w:t>
-            </w:r>
-            <w:r>
-              <w:rPr>
-                <w:rFonts w:ascii="Calibri" w:hAnsi="Calibri"/>
-                <w:b w:val="0"/>
-                <w:i w:val="0"/>
-                <w:color w:val="334155"/>
-                <w:sz w:val="17"/>
-              </w:rPr>
-              <w:t>🔴 Thách thức – Rủi ro chuỗi cung ứng:Sự sụt giảm nhập khẩu nguyên phụ liệu có thể báo hiệu tình trạng khan hiếm nguồn cung trong ngắn hạn, đặc biệt với các hoạt chất nhập từ Trung Quốc và Ấn Độ – hai thị trường cung cấp chính cho Davipharm. Nếu không có kế hoạch dự trữ chiến lược, Davipharm có nguy cơ gián đoạn sản xuất, ảnh hưởng đến tiến độ giao hàng cho các hợp đồng đấu thầu bệnh viện và nhà thuốc.🟡 Rủi ro chi phí &amp; giá thành:Khi nguồn cung nguyên liệu giảm, giá nguyên liệu thô có thể tăng do cạnh tranh thu mua giữa các nhà sản xuất nội địa (Imexpharm, DHG, Traphaco). Điều này tạo áp lực lên biên lợi nhuận gộp của Davipharm, đặc biệt trong bối cảnh đấu thầu thuốc generic vốn cạnh tranh về giá.🟢 Cơ hội chiến lược – Đa dạng hóa nguồn cung:Đây là thời điểm Davipharm nên đẩy nhanh chiến lược đa dạng hóa nhà cung cấp nguyên liệu, bao gồm tìm kiếm đối tác từ châu Âu (EU-GMP) để vừa giảm rủi ro địa chính trị vừa nâng cao tiêu chuẩn chất lượng – tạo lợi thế trong đấu thầu nhóm 1, nhóm 2.🟢 Lợi thế cạnh tranh so với đối thủ:Nếu Davipharm có tồn kho nguyên liệu tốt hơn hoặc hợp đồng dài hạn với nhà cung cấp, đây là cơ hội đểtăng thị phần đấu thầukhi các đối thủ như Imexpharm, DHG, Traphaco gặp khó khăn về nguồn nguyên liệu và buộc phải giảm sản lượng hoặc tăng giá bán.📌</w:t>
-            </w:r>
-          </w:p>
-        </w:tc>
-      </w:tr>
-    </w:tbl>
-    <w:p>
-      <w:pPr>
-        <w:spacing w:before="40" w:after="120"/>
-      </w:pPr>
-    </w:p>
-    <w:tbl>
-      <w:tblPr>
-        <w:tblStyle w:val="TableGrid"/>
-        <w:tblW w:type="auto" w:w="0"/>
-        <w:jc w:val="left"/>
-        <w:tblLook w:firstColumn="1" w:firstRow="1" w:lastColumn="0" w:lastRow="0" w:noHBand="0" w:noVBand="1" w:val="04A0"/>
-      </w:tblPr>
-      <w:tblGrid>
-        <w:gridCol w:w="4536"/>
-        <w:gridCol w:w="4536"/>
-      </w:tblGrid>
-      <w:tr>
-        <w:tc>
-          <w:tcPr>
-            <w:tcW w:type="dxa" w:w="1984"/>
-            <w:shd w:val="clear" w:color="auto" w:fill="EEF2FF"/>
-            <w:tcBorders>
-              <w:top w:val="none" w:sz="6" w:color="auto"/>
-              <w:bottom w:val="none" w:sz="6" w:color="auto"/>
-              <w:left w:val="none" w:sz="6" w:color="auto"/>
-              <w:right w:val="none" w:sz="6" w:color="auto"/>
-            </w:tcBorders>
-          </w:tcPr>
-          <w:p>
-            <w:pPr>
-              <w:spacing w:before="80" w:after="80"/>
-              <w:ind w:left="85"/>
-            </w:pPr>
-            <w:r>
-              <w:rPr>
-                <w:rFonts w:ascii="Calibri" w:hAnsi="Calibri"/>
-                <w:b/>
-                <w:i w:val="0"/>
-                <w:color w:val="4338CA"/>
-                <w:sz w:val="15"/>
-              </w:rPr>
-              <w:t>THỊ TRƯỜNG DƯỢC PHẨM VIỆT NAM</w:t>
-            </w:r>
-          </w:p>
-        </w:tc>
-        <w:tc>
-          <w:tcPr>
-            <w:tcW w:type="dxa" w:w="4536"/>
-            <w:tcBorders>
-              <w:top w:val="none" w:sz="6" w:color="auto"/>
-              <w:bottom w:val="none" w:sz="6" w:color="auto"/>
-              <w:left w:val="none" w:sz="6" w:color="auto"/>
-              <w:right w:val="none" w:sz="6" w:color="auto"/>
-            </w:tcBorders>
-          </w:tcPr>
-          <w:p>
-            <w:pPr>
-              <w:spacing w:before="60" w:after="60"/>
-              <w:ind w:left="113"/>
-            </w:pPr>
-            <w:r>
-              <w:rPr>
-                <w:rFonts w:ascii="Calibri" w:hAnsi="Calibri"/>
-                <w:b/>
-                <w:i w:val="0"/>
-                <w:color w:val="111827"/>
-                <w:sz w:val="21"/>
-              </w:rPr>
-              <w:t>Dược phẩm 2/9 đặt mục tiêu doanh thu trăm tỉ đồng, kiện toàn nhân sự cấp cao</w:t>
-            </w:r>
-          </w:p>
-        </w:tc>
-      </w:tr>
-    </w:tbl>
-    <w:p>
-      <w:pPr>
-        <w:spacing w:before="40" w:after="40"/>
-        <w:ind w:left="170"/>
-      </w:pPr>
-      <w:r>
-        <w:rPr>
-          <w:rFonts w:ascii="Calibri" w:hAnsi="Calibri"/>
-          <w:b w:val="0"/>
-          <w:i/>
-          <w:color w:val="6B7280"/>
-          <w:sz w:val="18"/>
-        </w:rPr>
-        <w:t>Công ty Dược phẩm 2/9 (DNP) công bố mục tiêu doanh thu trăm tỉ đồng trong năm tài chính tới, đồng thời thực hiện kiện toàn nhân sự cấp cao nhằm tăng cường năng lực quản trị và thúc đẩy tăng trưởng. Đây là tín hiệu cho thấy các doanh nghiệp dược vừa và nhỏ trong nước đang tích cực tái cơ cấu để cạnh tranh trong bối cảnh thị trường ngày càng sôi động.</w:t>
-      </w:r>
-    </w:p>
-    <w:p>
-      <w:pPr>
-        <w:spacing w:before="20" w:after="40"/>
-        <w:ind w:left="170"/>
-      </w:pPr>
-      <w:r>
-        <w:rPr>
-          <w:rFonts w:ascii="Calibri" w:hAnsi="Calibri"/>
-          <w:b/>
-          <w:i w:val="0"/>
-          <w:color w:val="374151"/>
-          <w:sz w:val="17"/>
-        </w:rPr>
-        <w:t>⚠️ Trung lập – Tín hiệu cạnh tranh gián tiếp từ phân khúc dược nội địa tầm trung</w:t>
-      </w:r>
-    </w:p>
-    <w:tbl>
-      <w:tblPr>
-        <w:tblStyle w:val="TableGrid"/>
-        <w:tblW w:type="auto" w:w="0"/>
-        <w:tblLook w:firstColumn="1" w:firstRow="1" w:lastColumn="0" w:lastRow="0" w:noHBand="0" w:noVBand="1" w:val="04A0"/>
-      </w:tblPr>
-      <w:tblGrid>
-        <w:gridCol w:w="9072"/>
-      </w:tblGrid>
-      <w:tr>
-        <w:tc>
-          <w:tcPr>
-            <w:tcW w:type="dxa" w:w="9072"/>
-            <w:shd w:val="clear" w:color="auto" w:fill="F8FAFC"/>
-            <w:tcBorders>
-              <w:top w:val="none" w:sz="6" w:color="auto"/>
-              <w:bottom w:val="none" w:sz="6" w:color="auto"/>
-              <w:left w:val="single" w:sz="12" w:color="003B71"/>
-              <w:right w:val="none" w:sz="6" w:color="auto"/>
-            </w:tcBorders>
-          </w:tcPr>
-          <w:p>
-            <w:pPr>
-              <w:spacing w:before="60" w:after="60"/>
-              <w:ind w:left="142"/>
-            </w:pPr>
-            <w:r>
-              <w:rPr>
-                <w:rFonts w:ascii="Calibri" w:hAnsi="Calibri"/>
-                <w:b/>
-                <w:i w:val="0"/>
-                <w:color w:val="003B71"/>
-                <w:sz w:val="17"/>
-              </w:rPr>
-              <w:t xml:space="preserve">Strategy  </w:t>
-            </w:r>
-            <w:r>
-              <w:rPr>
-                <w:rFonts w:ascii="Calibri" w:hAnsi="Calibri"/>
-                <w:b w:val="0"/>
-                <w:i w:val="0"/>
-                <w:color w:val="334155"/>
-                <w:sz w:val="17"/>
-              </w:rPr>
-              <w:t>🔍 Bối cảnh cạnh tranh – Nhà sản xuất nội địa tầm trung đang trỗi dậy:Dược phẩm 2/9 không phải đối thủ trực tiếp lớn của Davipharm, nhưng động thái đặt mục tiêu doanh thu trăm tỉ và kiện toàn nhân sự cấp cao phản ánh xu hướngtái cơ cấu mạnh mẽcủa các nhà sản xuất dược nội địa quy mô vừa. Đây là tín hiệu cảnh báo sớm:làn sóng chuyên nghiệp hóađang lan rộng trong ngành, thu hẹp khoảng cách năng lực giữa các doanh nghiệp.⚔️ Cạnh tranh sản phẩm &amp; Đấu thầu:Khi DNP nâng cấp nhân sự và đặt mục tiêu tăng trưởng tham vọng, khả năng họ sẽmở rộng danh mục sản phẩmvà tích cực hơn trong các gói thầu bệnh viện (ETC channel) là rất cao. Davipharm cần rà soát các phân khúc sản phẩm có thể bị chồng lấn, đặc biệt ở nhóm generic phổ thông và các gói thầu địa phương tại khu vực phía Nam – nơi DNP có lợi thế địa lý.💡 Khuyến nghị chiến lược cho Davipharm:Củng cố vị thế thương hiệu:Đẩy mạnh định vị "chất lượng EU-GMP" để tạo khoảng cách rõ ràng với các đối thủ tầm trung đang nâng cấp.Ưu tiên đấu thầu chiến lược:Tập trung vào các gói thầu nhóm 1-2 (tiêu chí kỹ thuật cao) thay vì cạnh tranh giá ở nhóm generic thông thường.Theo dõi nhân sự DNP:Các lãnh đạo mới được bổ nhiệm có thể mang theo chiến lược từ các công ty dược lớn hơn – cần cập nhật thông tin tình báo cạnh tranh.Cơ hội M&amp;A/hợp tác:Sự tái cơ cấu của DNP cũng có thể mở ra cơ hội hợp tác phân phối hoặc nhượng quyền sản phẩm tại các thị trường ngách mà Davipharm chưa phủ sâu.</w:t>
-            </w:r>
-          </w:p>
-        </w:tc>
-      </w:tr>
-    </w:tbl>
-    <w:p>
-      <w:pPr>
-        <w:spacing w:before="40" w:after="120"/>
-      </w:pPr>
-    </w:p>
-    <w:tbl>
-      <w:tblPr>
-        <w:tblStyle w:val="TableGrid"/>
-        <w:tblW w:type="auto" w:w="0"/>
-        <w:jc w:val="left"/>
-        <w:tblLook w:firstColumn="1" w:firstRow="1" w:lastColumn="0" w:lastRow="0" w:noHBand="0" w:noVBand="1" w:val="04A0"/>
-      </w:tblPr>
-      <w:tblGrid>
-        <w:gridCol w:w="4536"/>
-        <w:gridCol w:w="4536"/>
-      </w:tblGrid>
-      <w:tr>
-        <w:tc>
-          <w:tcPr>
-            <w:tcW w:type="dxa" w:w="1984"/>
-            <w:shd w:val="clear" w:color="auto" w:fill="EEF2FF"/>
-            <w:tcBorders>
-              <w:top w:val="none" w:sz="6" w:color="auto"/>
-              <w:bottom w:val="none" w:sz="6" w:color="auto"/>
-              <w:left w:val="none" w:sz="6" w:color="auto"/>
-              <w:right w:val="none" w:sz="6" w:color="auto"/>
-            </w:tcBorders>
-          </w:tcPr>
-          <w:p>
-            <w:pPr>
-              <w:spacing w:before="80" w:after="80"/>
-              <w:ind w:left="85"/>
-            </w:pPr>
-            <w:r>
-              <w:rPr>
-                <w:rFonts w:ascii="Calibri" w:hAnsi="Calibri"/>
-                <w:b/>
-                <w:i w:val="0"/>
-                <w:color w:val="4338CA"/>
-                <w:sz w:val="15"/>
-              </w:rPr>
-              <w:t>FPT RETAIL LONG CHÂU</w:t>
-            </w:r>
-          </w:p>
-        </w:tc>
-        <w:tc>
-          <w:tcPr>
-            <w:tcW w:type="dxa" w:w="4536"/>
-            <w:tcBorders>
-              <w:top w:val="none" w:sz="6" w:color="auto"/>
-              <w:bottom w:val="none" w:sz="6" w:color="auto"/>
-              <w:left w:val="none" w:sz="6" w:color="auto"/>
-              <w:right w:val="none" w:sz="6" w:color="auto"/>
-            </w:tcBorders>
-          </w:tcPr>
-          <w:p>
-            <w:pPr>
-              <w:spacing w:before="60" w:after="60"/>
-              <w:ind w:left="113"/>
-            </w:pPr>
-            <w:r>
-              <w:rPr>
-                <w:rFonts w:ascii="Calibri" w:hAnsi="Calibri"/>
-                <w:b/>
-                <w:i w:val="0"/>
-                <w:color w:val="111827"/>
-                <w:sz w:val="21"/>
-              </w:rPr>
-              <w:t>Long Châu dẫn đầu tăng trưởng FPT Retail, đặt lợi ích người dân làm trung tâm</w:t>
-            </w:r>
-          </w:p>
-        </w:tc>
-      </w:tr>
-    </w:tbl>
-    <w:p>
-      <w:pPr>
-        <w:spacing w:before="40" w:after="40"/>
-        <w:ind w:left="170"/>
-      </w:pPr>
-      <w:r>
-        <w:rPr>
-          <w:rFonts w:ascii="Calibri" w:hAnsi="Calibri"/>
-          <w:b w:val="0"/>
-          <w:i/>
-          <w:color w:val="6B7280"/>
-          <w:sz w:val="18"/>
-        </w:rPr>
-        <w:t>Chuỗi nhà thuốc Long Châu (thuộc FPT Retail) tiếp tục là động lực tăng trưởng chủ lực, mở rộng mạng lưới và củng cố vị thế dẫn đầu thị trường bán lẻ dược phẩm tại Việt Nam. Chiến lược của Long Châu tập trung vào việc phục vụ lợi ích sức khỏe cộng đồng, gia tăng độ phủ điểm bán và nâng cao trải nghiệm khách hàng.</w:t>
-      </w:r>
-    </w:p>
-    <w:p>
-      <w:pPr>
-        <w:spacing w:before="20" w:after="40"/>
-        <w:ind w:left="170"/>
-      </w:pPr>
-      <w:r>
-        <w:rPr>
-          <w:rFonts w:ascii="Calibri" w:hAnsi="Calibri"/>
-          <w:b/>
-          <w:i w:val="0"/>
-          <w:color w:val="166534"/>
-          <w:sz w:val="17"/>
-        </w:rPr>
-        <w:t>⚡ Tác động Kép: Cơ hội mở rộng kênh phân phối — nhưng kèm rủi ro phụ thuộc &amp; áp lực đàm phán giá</w:t>
-      </w:r>
-    </w:p>
-    <w:tbl>
-      <w:tblPr>
-        <w:tblStyle w:val="TableGrid"/>
-        <w:tblW w:type="auto" w:w="0"/>
-        <w:tblLook w:firstColumn="1" w:firstRow="1" w:lastColumn="0" w:lastRow="0" w:noHBand="0" w:noVBand="1" w:val="04A0"/>
-      </w:tblPr>
-      <w:tblGrid>
-        <w:gridCol w:w="9072"/>
-      </w:tblGrid>
-      <w:tr>
-        <w:tc>
-          <w:tcPr>
-            <w:tcW w:type="dxa" w:w="9072"/>
-            <w:shd w:val="clear" w:color="auto" w:fill="F8FAFC"/>
-            <w:tcBorders>
-              <w:top w:val="none" w:sz="6" w:color="auto"/>
-              <w:bottom w:val="none" w:sz="6" w:color="auto"/>
-              <w:left w:val="single" w:sz="12" w:color="003B71"/>
-              <w:right w:val="none" w:sz="6" w:color="auto"/>
-            </w:tcBorders>
-          </w:tcPr>
-          <w:p>
-            <w:pPr>
-              <w:spacing w:before="60" w:after="60"/>
-              <w:ind w:left="142"/>
-            </w:pPr>
-            <w:r>
-              <w:rPr>
-                <w:rFonts w:ascii="Calibri" w:hAnsi="Calibri"/>
-                <w:b/>
-                <w:i w:val="0"/>
-                <w:color w:val="003B71"/>
-                <w:sz w:val="17"/>
-              </w:rPr>
-              <w:t xml:space="preserve">Strategy  </w:t>
-            </w:r>
-            <w:r>
-              <w:rPr>
-                <w:rFonts w:ascii="Calibri" w:hAnsi="Calibri"/>
-                <w:b w:val="0"/>
-                <w:i w:val="0"/>
-                <w:color w:val="334155"/>
-                <w:sz w:val="17"/>
-              </w:rPr>
-              <w:t>🏪 Quyền lực kênh (Channel Power):Sự tăng trưởng liên tục của Long Châu — hiện sở hữu hơn 1.800+ điểm bán trên toàn quốc — đang tái định hình cán cân quyền lực giữa nhà sản xuất và nhà bán lẻ. Khi Long Châu chiếm tỷ trọng ngày càng lớn trong doanh thu OTC của Davipharm, nhà bán lẻ này có thể yêu cầu chiết khấu cao hơn, điều kiện thanh toán dài hơn, hoặc độc quyền SKU nhất định — tạo ra rủi ro phụ thuộc kênh nghiêm trọng.📦 Shelf-space &amp; Danh mục sản phẩm:Với chiến lược "đặt lợi ích người dân làm trung tâm", Long Châu có xu hướng ưu tiên các sản phẩm có giá trị lâm sàng rõ ràng, giá cạnh tranh và nhận diện thương hiệu mạnh. Davipharm cần chủ động đàm phán vị trí shelf-space ưu tiên (eye-level, end-cap) cho các dòng sản phẩm chiến lược, đặc biệt là các nhóm vitamin, kháng sinh OTC và sản phẩm generic cao cấp.🤝 Khuyến nghị chiến lược:(1) Xây dựng chương trình đối tác chiến lược (Strategic Partnership Program) với Long Châu, bao gồm hỗ trợ đào tạo dược sĩ tư vấn về sản phẩm Davipharm; (2) Phát triển SKU độc quyền hoặc bundle pack dành riêng cho kênh Long Châu để tăng tính gắn kết; (3) Đầu tư vào dữ liệu sell-out từ Long Châu để tối ưu hóa dự báo nhu cầu và tránh tình trạng out-of-stock; (4) Đồng thời đa dạng hóa kênh phân phối (Pharmacity, nhà thuốc độc lập, kênh ETC) để giảm thiểu rủi ro phụ thuộc vào một kênh duy nhất.</w:t>
-            </w:r>
-          </w:p>
-        </w:tc>
-      </w:tr>
-    </w:tbl>
-    <w:p>
-      <w:pPr>
-        <w:spacing w:before="40" w:after="120"/>
-      </w:pPr>
-    </w:p>
-    <w:tbl>
-      <w:tblPr>
-        <w:tblStyle w:val="TableGrid"/>
-        <w:tblW w:type="auto" w:w="0"/>
-        <w:jc w:val="left"/>
-        <w:tblLook w:firstColumn="1" w:firstRow="1" w:lastColumn="0" w:lastRow="0" w:noHBand="0" w:noVBand="1" w:val="04A0"/>
-      </w:tblPr>
-      <w:tblGrid>
-        <w:gridCol w:w="4536"/>
-        <w:gridCol w:w="4536"/>
-      </w:tblGrid>
-      <w:tr>
-        <w:tc>
-          <w:tcPr>
-            <w:tcW w:type="dxa" w:w="1984"/>
-            <w:shd w:val="clear" w:color="auto" w:fill="EEF2FF"/>
-            <w:tcBorders>
-              <w:top w:val="none" w:sz="6" w:color="auto"/>
-              <w:bottom w:val="none" w:sz="6" w:color="auto"/>
-              <w:left w:val="none" w:sz="6" w:color="auto"/>
-              <w:right w:val="none" w:sz="6" w:color="auto"/>
-            </w:tcBorders>
-          </w:tcPr>
-          <w:p>
-            <w:pPr>
-              <w:spacing w:before="80" w:after="80"/>
-              <w:ind w:left="85"/>
-            </w:pPr>
-            <w:r>
-              <w:rPr>
-                <w:rFonts w:ascii="Calibri" w:hAnsi="Calibri"/>
-                <w:b/>
-                <w:i w:val="0"/>
-                <w:color w:val="4338CA"/>
-                <w:sz w:val="15"/>
-              </w:rPr>
-              <w:t>PHARMACITY</w:t>
-            </w:r>
-          </w:p>
-        </w:tc>
-        <w:tc>
-          <w:tcPr>
-            <w:tcW w:type="dxa" w:w="4536"/>
-            <w:tcBorders>
-              <w:top w:val="none" w:sz="6" w:color="auto"/>
-              <w:bottom w:val="none" w:sz="6" w:color="auto"/>
-              <w:left w:val="none" w:sz="6" w:color="auto"/>
-              <w:right w:val="none" w:sz="6" w:color="auto"/>
-            </w:tcBorders>
-          </w:tcPr>
-          <w:p>
-            <w:pPr>
-              <w:spacing w:before="60" w:after="60"/>
-              <w:ind w:left="113"/>
-            </w:pPr>
-            <w:r>
-              <w:rPr>
-                <w:rFonts w:ascii="Calibri" w:hAnsi="Calibri"/>
-                <w:b/>
-                <w:i w:val="0"/>
-                <w:color w:val="111827"/>
-                <w:sz w:val="21"/>
-              </w:rPr>
-              <w:t>Pharmacity: Khát vọng 'nối liền bản đồ y tế' và sứ mệnh phụng sự vì sức khỏe Việt</w:t>
-            </w:r>
-          </w:p>
-        </w:tc>
-      </w:tr>
-    </w:tbl>
-    <w:p>
-      <w:pPr>
-        <w:spacing w:before="40" w:after="40"/>
-        <w:ind w:left="170"/>
-      </w:pPr>
-      <w:r>
-        <w:rPr>
-          <w:rFonts w:ascii="Calibri" w:hAnsi="Calibri"/>
-          <w:b w:val="0"/>
-          <w:i/>
-          <w:color w:val="6B7280"/>
-          <w:sz w:val="18"/>
-        </w:rPr>
-        <w:t>Pharmacity tiếp tục khẳng định tầm nhìn mở rộng mạng lưới chuỗi nhà thuốc trên toàn quốc, hướng đến mục tiêu phủ sóng rộng khắp các tỉnh thành, kể cả vùng sâu vùng xa, nhằm "nối liền bản đồ y tế" Việt Nam. Chuỗi này nhấn mạnh sứ mệnh cung cấp dịch vụ chăm sóc sức khỏe toàn diện, không chỉ bán thuốc mà còn tư vấn và kết nối bệnh nhân với hệ sinh thái y tế.</w:t>
-      </w:r>
-    </w:p>
-    <w:p>
-      <w:pPr>
-        <w:spacing w:before="20" w:after="40"/>
-        <w:ind w:left="170"/>
-      </w:pPr>
-      <w:r>
-        <w:rPr>
-          <w:rFonts w:ascii="Calibri" w:hAnsi="Calibri"/>
-          <w:b/>
-          <w:i w:val="0"/>
-          <w:color w:val="166534"/>
-          <w:sz w:val="17"/>
-        </w:rPr>
-        <w:t>⚡ Tác động Tích cực có Điều kiện — Cơ hội mở rộng kênh phân phối lớn, nhưng đi kèm rủi ro phụ thuộc và áp lực shelf-space</w:t>
-      </w:r>
-    </w:p>
-    <w:tbl>
-      <w:tblPr>
-        <w:tblStyle w:val="TableGrid"/>
-        <w:tblW w:type="auto" w:w="0"/>
-        <w:tblLook w:firstColumn="1" w:firstRow="1" w:lastColumn="0" w:lastRow="0" w:noHBand="0" w:noVBand="1" w:val="04A0"/>
-      </w:tblPr>
-      <w:tblGrid>
-        <w:gridCol w:w="9072"/>
-      </w:tblGrid>
-      <w:tr>
-        <w:tc>
-          <w:tcPr>
-            <w:tcW w:type="dxa" w:w="9072"/>
-            <w:shd w:val="clear" w:color="auto" w:fill="F8FAFC"/>
-            <w:tcBorders>
-              <w:top w:val="none" w:sz="6" w:color="auto"/>
-              <w:bottom w:val="none" w:sz="6" w:color="auto"/>
-              <w:left w:val="single" w:sz="12" w:color="003B71"/>
-              <w:right w:val="none" w:sz="6" w:color="auto"/>
-            </w:tcBorders>
-          </w:tcPr>
-          <w:p>
-            <w:pPr>
-              <w:spacing w:before="60" w:after="60"/>
-              <w:ind w:left="142"/>
-            </w:pPr>
-            <w:r>
-              <w:rPr>
-                <w:rFonts w:ascii="Calibri" w:hAnsi="Calibri"/>
-                <w:b/>
-                <w:i w:val="0"/>
-                <w:color w:val="003B71"/>
-                <w:sz w:val="17"/>
-              </w:rPr>
-              <w:t xml:space="preserve">Strategy  </w:t>
-            </w:r>
-            <w:r>
-              <w:rPr>
-                <w:rFonts w:ascii="Calibri" w:hAnsi="Calibri"/>
-                <w:b w:val="0"/>
-                <w:i w:val="0"/>
-                <w:color w:val="334155"/>
-                <w:sz w:val="17"/>
-              </w:rPr>
-              <w:t>🏪 Quyền lực kênh (Channel Power):Pharmacity mở rộng mạng lưới đồng nghĩa với việc chuỗi này ngày càng nắm giữ quyền lực lớn hơn trong chuỗi giá trị dược phẩm OTC. Khi Pharmacity "nối liền bản đồ y tế" — đặc biệt tại các tỉnh thành vùng sâu vùng xa — họ trở thành cổng tiếp cận người tiêu dùng không thể thiếu. Davipharm cần đánh giá lại mức độ phụ thuộc vào kênh này: nếu doanh thu từ Pharmacity chiếm tỷ trọng cao, rủi ro đàm phán giá và điều khoản sẽ tăng theo.📦 Shelf-space &amp; Listing Fee:Tham vọng mở rộng của Pharmacity thường đi kèm với yêu cầu listing fee cao hơn, yêu cầu SKU tối ưu hóa và áp lực co-marketing. Davipharm cần chủ động đàm phán vị trí trưng bày ưu tiên (prime shelf) cho các sản phẩm chiến lược, đặc biệt là các dòng OTC có biên lợi nhuận cao. Cần xây dựng bộ dữ liệu sell-through để chứng minh giá trị sản phẩm với buyer của Pharmacity.🌏 Cơ hội địa lý:Việc Pharmacity phủ sóng vùng sâu vùng xa là cơ hội vàng để Davipharm đưa sản phẩm đến các thị trường mà trước đây khó tiếp cận qua kênh truyền thống. Đây là đòn bẩy để tăng trưởng doanh thu mà không cần đầu tư hạ tầng phân phối riêng.⚠️ Khuyến nghị chiến lược:Duy trì đa dạng hóa kênh (không để Pharmacity chiếm &gt;30% doanh thu OTC); đồng thời xây dựng chương trình đối tác chiến lược dài hạn với Pharmacity để đảm bảo vị thế ưu tiên trong danh mục sản phẩm của chuỗi.</w:t>
-            </w:r>
-          </w:p>
-        </w:tc>
-      </w:tr>
-    </w:tbl>
-    <w:p>
-      <w:pPr>
-        <w:spacing w:before="40" w:after="120"/>
-      </w:pPr>
-    </w:p>
     <w:p>
       <w:r>
         <w:br w:type="page"/>
@@ -2452,474 +1204,6 @@
         </w:rPr>
         <w:t>ĐỐI THỦ CẠNH TRANH</w:t>
       </w:r>
-    </w:p>
-    <w:tbl>
-      <w:tblPr>
-        <w:tblStyle w:val="TableGrid"/>
-        <w:tblW w:type="auto" w:w="0"/>
-        <w:jc w:val="left"/>
-        <w:tblLook w:firstColumn="1" w:firstRow="1" w:lastColumn="0" w:lastRow="0" w:noHBand="0" w:noVBand="1" w:val="04A0"/>
-      </w:tblPr>
-      <w:tblGrid>
-        <w:gridCol w:w="4536"/>
-        <w:gridCol w:w="4536"/>
-      </w:tblGrid>
-      <w:tr>
-        <w:tc>
-          <w:tcPr>
-            <w:tcW w:type="dxa" w:w="1984"/>
-            <w:shd w:val="clear" w:color="auto" w:fill="EEF2FF"/>
-            <w:tcBorders>
-              <w:top w:val="none" w:sz="6" w:color="auto"/>
-              <w:bottom w:val="none" w:sz="6" w:color="auto"/>
-              <w:left w:val="none" w:sz="6" w:color="auto"/>
-              <w:right w:val="none" w:sz="6" w:color="auto"/>
-            </w:tcBorders>
-          </w:tcPr>
-          <w:p>
-            <w:pPr>
-              <w:spacing w:before="80" w:after="80"/>
-              <w:ind w:left="85"/>
-            </w:pPr>
-            <w:r>
-              <w:rPr>
-                <w:rFonts w:ascii="Calibri" w:hAnsi="Calibri"/>
-                <w:b/>
-                <w:i w:val="0"/>
-                <w:color w:val="4338CA"/>
-                <w:sz w:val="15"/>
-              </w:rPr>
-              <w:t>DƯỢC HẬU GIANG</w:t>
-            </w:r>
-          </w:p>
-        </w:tc>
-        <w:tc>
-          <w:tcPr>
-            <w:tcW w:type="dxa" w:w="4536"/>
-            <w:tcBorders>
-              <w:top w:val="none" w:sz="6" w:color="auto"/>
-              <w:bottom w:val="none" w:sz="6" w:color="auto"/>
-              <w:left w:val="none" w:sz="6" w:color="auto"/>
-              <w:right w:val="none" w:sz="6" w:color="auto"/>
-            </w:tcBorders>
-          </w:tcPr>
-          <w:p>
-            <w:pPr>
-              <w:spacing w:before="60" w:after="60"/>
-              <w:ind w:left="113"/>
-            </w:pPr>
-            <w:r>
-              <w:rPr>
-                <w:rFonts w:ascii="Calibri" w:hAnsi="Calibri"/>
-                <w:b/>
-                <w:i w:val="0"/>
-                <w:color w:val="111827"/>
-                <w:sz w:val="21"/>
-              </w:rPr>
-              <w:t>Dược Hậu Giang chi cổ tức đậm, ông lớn Nhật Taisho đều đặn bỏ túi trăm tỷ</w:t>
-            </w:r>
-          </w:p>
-        </w:tc>
-      </w:tr>
-    </w:tbl>
-    <w:p>
-      <w:pPr>
-        <w:spacing w:before="40" w:after="40"/>
-        <w:ind w:left="170"/>
-      </w:pPr>
-      <w:r>
-        <w:rPr>
-          <w:rFonts w:ascii="Calibri" w:hAnsi="Calibri"/>
-          <w:b w:val="0"/>
-          <w:i/>
-          <w:color w:val="6B7280"/>
-          <w:sz w:val="18"/>
-        </w:rPr>
-        <w:t>Dược Hậu Giang (DHG) tiếp tục duy trì chính sách chi trả cổ tức cao, qua đó cổ đông chiến lược Taisho (Nhật Bản) — đang nắm giữ tỷ lệ cổ phần lớn — đều đặn thu về hàng trăm tỷ đồng mỗi năm. Điều này phản ánh nền tảng tài chính vững mạnh và khả năng sinh lời ổn định của DHG trong ngành dược phẩm Việt Nam.</w:t>
-      </w:r>
-    </w:p>
-    <w:p>
-      <w:pPr>
-        <w:spacing w:before="20" w:after="40"/>
-        <w:ind w:left="170"/>
-      </w:pPr>
-      <w:r>
-        <w:rPr>
-          <w:rFonts w:ascii="Calibri" w:hAnsi="Calibri"/>
-          <w:b/>
-          <w:i w:val="0"/>
-          <w:color w:val="991B1B"/>
-          <w:sz w:val="17"/>
-        </w:rPr>
-        <w:t>⚠️ Thách thức — Đối thủ được hậu thuẫn tài chính mạnh từ cổ đông Nhật Bản, gia tăng áp lực cạnh tranh dài hạn lên Davipharm</w:t>
-      </w:r>
-    </w:p>
-    <w:tbl>
-      <w:tblPr>
-        <w:tblStyle w:val="TableGrid"/>
-        <w:tblW w:type="auto" w:w="0"/>
-        <w:tblLook w:firstColumn="1" w:firstRow="1" w:lastColumn="0" w:lastRow="0" w:noHBand="0" w:noVBand="1" w:val="04A0"/>
-      </w:tblPr>
-      <w:tblGrid>
-        <w:gridCol w:w="9072"/>
-      </w:tblGrid>
-      <w:tr>
-        <w:tc>
-          <w:tcPr>
-            <w:tcW w:type="dxa" w:w="9072"/>
-            <w:shd w:val="clear" w:color="auto" w:fill="F8FAFC"/>
-            <w:tcBorders>
-              <w:top w:val="none" w:sz="6" w:color="auto"/>
-              <w:bottom w:val="none" w:sz="6" w:color="auto"/>
-              <w:left w:val="single" w:sz="12" w:color="003B71"/>
-              <w:right w:val="none" w:sz="6" w:color="auto"/>
-            </w:tcBorders>
-          </w:tcPr>
-          <w:p>
-            <w:pPr>
-              <w:spacing w:before="60" w:after="60"/>
-              <w:ind w:left="142"/>
-            </w:pPr>
-            <w:r>
-              <w:rPr>
-                <w:rFonts w:ascii="Calibri" w:hAnsi="Calibri"/>
-                <w:b/>
-                <w:i w:val="0"/>
-                <w:color w:val="003B71"/>
-                <w:sz w:val="17"/>
-              </w:rPr>
-              <w:t xml:space="preserve">Strategy  </w:t>
-            </w:r>
-            <w:r>
-              <w:rPr>
-                <w:rFonts w:ascii="Calibri" w:hAnsi="Calibri"/>
-                <w:b w:val="0"/>
-                <w:i w:val="0"/>
-                <w:color w:val="334155"/>
-                <w:sz w:val="17"/>
-              </w:rPr>
-              <w:t>🔴 Cạnh tranh sản phẩm &amp; Năng lực tài chính đối thủ:Việc DHG duy trì cổ tức cao và được Taisho hậu thuẫn tài chính bền vững cho thấy đối thủ này có nguồn lực dồi dào để tiếp tục đầu tư vào R&amp;D, nâng cấp dây chuyền sản xuất (GMP), và mở rộng danh mục sản phẩm — đặc biệt trong phân khúc OTC và generic cao cấp, vốn là địa bàn cạnh tranh trực tiếp với Davipharm.🔴 Đấu thầu bệnh viện:Với nền tảng tài chính vững chắc, DHG có khả năng chấp nhận biên lợi nhuận thấp hơn trong các gói thầu bệnh viện (ETC channel) để giành thị phần, tạo áp lực giá đáng kể lên Davipharm tại kênh đấu thầu.🟡 Cơ hội cho Davipharm:Sự tập trung của DHG vào việc duy trì lợi nhuận để trả cổ tức có thể khiến họ thận trọng hơn trong việc đầu tư mạo hiểm vào các phân khúc mới hoặc sản phẩm chuyên biệt. Davipharm nên tận dụng khoảng trống này để đẩy mạnh đổi mới sản phẩm, tấn công vào các phân khúc điều trị chuyên sâu mà DHG chưa phủ mạnh, đồng thời xây dựng lợi thế cạnh tranh bền vững thông qua chất lượng sản xuất (EU-GMP) và tốc độ đưa sản phẩm ra thị trường.</w:t>
-            </w:r>
-          </w:p>
-        </w:tc>
-      </w:tr>
-    </w:tbl>
-    <w:p>
-      <w:pPr>
-        <w:spacing w:before="40" w:after="120"/>
-      </w:pPr>
-    </w:p>
-    <w:tbl>
-      <w:tblPr>
-        <w:tblStyle w:val="TableGrid"/>
-        <w:tblW w:type="auto" w:w="0"/>
-        <w:jc w:val="left"/>
-        <w:tblLook w:firstColumn="1" w:firstRow="1" w:lastColumn="0" w:lastRow="0" w:noHBand="0" w:noVBand="1" w:val="04A0"/>
-      </w:tblPr>
-      <w:tblGrid>
-        <w:gridCol w:w="4536"/>
-        <w:gridCol w:w="4536"/>
-      </w:tblGrid>
-      <w:tr>
-        <w:tc>
-          <w:tcPr>
-            <w:tcW w:type="dxa" w:w="1984"/>
-            <w:shd w:val="clear" w:color="auto" w:fill="EEF2FF"/>
-            <w:tcBorders>
-              <w:top w:val="none" w:sz="6" w:color="auto"/>
-              <w:bottom w:val="none" w:sz="6" w:color="auto"/>
-              <w:left w:val="none" w:sz="6" w:color="auto"/>
-              <w:right w:val="none" w:sz="6" w:color="auto"/>
-            </w:tcBorders>
-          </w:tcPr>
-          <w:p>
-            <w:pPr>
-              <w:spacing w:before="80" w:after="80"/>
-              <w:ind w:left="85"/>
-            </w:pPr>
-            <w:r>
-              <w:rPr>
-                <w:rFonts w:ascii="Calibri" w:hAnsi="Calibri"/>
-                <w:b/>
-                <w:i w:val="0"/>
-                <w:color w:val="4338CA"/>
-                <w:sz w:val="15"/>
-              </w:rPr>
-              <w:t>CHUỖI NHÀ THUỐC LONG CHÂU</w:t>
-            </w:r>
-          </w:p>
-        </w:tc>
-        <w:tc>
-          <w:tcPr>
-            <w:tcW w:type="dxa" w:w="4536"/>
-            <w:tcBorders>
-              <w:top w:val="none" w:sz="6" w:color="auto"/>
-              <w:bottom w:val="none" w:sz="6" w:color="auto"/>
-              <w:left w:val="none" w:sz="6" w:color="auto"/>
-              <w:right w:val="none" w:sz="6" w:color="auto"/>
-            </w:tcBorders>
-          </w:tcPr>
-          <w:p>
-            <w:pPr>
-              <w:spacing w:before="60" w:after="60"/>
-              <w:ind w:left="113"/>
-            </w:pPr>
-            <w:r>
-              <w:rPr>
-                <w:rFonts w:ascii="Calibri" w:hAnsi="Calibri"/>
-                <w:b/>
-                <w:i w:val="0"/>
-                <w:color w:val="111827"/>
-                <w:sz w:val="21"/>
-              </w:rPr>
-              <w:t>Long Châu: Tiên phong ứng dụng dữ liệu số, ra mắt dịch vụ y tế đột phá</w:t>
-            </w:r>
-          </w:p>
-        </w:tc>
-      </w:tr>
-    </w:tbl>
-    <w:p>
-      <w:pPr>
-        <w:spacing w:before="40" w:after="40"/>
-        <w:ind w:left="170"/>
-      </w:pPr>
-      <w:r>
-        <w:rPr>
-          <w:rFonts w:ascii="Calibri" w:hAnsi="Calibri"/>
-          <w:b w:val="0"/>
-          <w:i/>
-          <w:color w:val="6B7280"/>
-          <w:sz w:val="18"/>
-        </w:rPr>
-        <w:t>Chuỗi nhà thuốc Long Châu (FPT Retail) đang đẩy mạnh ứng dụng dữ liệu số và công nghệ vào vận hành, ra mắt các dịch vụ y tế mới nhằm nâng cao trải nghiệm khách hàng và củng cố vị thế dẫn đầu thị trường bán lẻ dược phẩm tại Việt Nam. Chiến lược này bao gồm cá nhân hóa tư vấn sức khỏe, tích hợp hồ sơ bệnh nhân số và mở rộng hệ sinh thái chăm sóc sức khỏe toàn diện.</w:t>
-      </w:r>
-    </w:p>
-    <w:p>
-      <w:pPr>
-        <w:spacing w:before="20" w:after="40"/>
-        <w:ind w:left="170"/>
-      </w:pPr>
-      <w:r>
-        <w:rPr>
-          <w:rFonts w:ascii="Calibri" w:hAnsi="Calibri"/>
-          <w:b/>
-          <w:i w:val="0"/>
-          <w:color w:val="991B1B"/>
-          <w:sz w:val="17"/>
-        </w:rPr>
-        <w:t>⚠️ Thách thức cạnh tranh cao — Long Châu tăng tốc số hóa, tạo áp lực lớn lên nhà cung cấp dược phẩm generic</w:t>
-      </w:r>
-    </w:p>
-    <w:tbl>
-      <w:tblPr>
-        <w:tblStyle w:val="TableGrid"/>
-        <w:tblW w:type="auto" w:w="0"/>
-        <w:tblLook w:firstColumn="1" w:firstRow="1" w:lastColumn="0" w:lastRow="0" w:noHBand="0" w:noVBand="1" w:val="04A0"/>
-      </w:tblPr>
-      <w:tblGrid>
-        <w:gridCol w:w="9072"/>
-      </w:tblGrid>
-      <w:tr>
-        <w:tc>
-          <w:tcPr>
-            <w:tcW w:type="dxa" w:w="9072"/>
-            <w:shd w:val="clear" w:color="auto" w:fill="F8FAFC"/>
-            <w:tcBorders>
-              <w:top w:val="none" w:sz="6" w:color="auto"/>
-              <w:bottom w:val="none" w:sz="6" w:color="auto"/>
-              <w:left w:val="single" w:sz="12" w:color="003B71"/>
-              <w:right w:val="none" w:sz="6" w:color="auto"/>
-            </w:tcBorders>
-          </w:tcPr>
-          <w:p>
-            <w:pPr>
-              <w:spacing w:before="60" w:after="60"/>
-              <w:ind w:left="142"/>
-            </w:pPr>
-            <w:r>
-              <w:rPr>
-                <w:rFonts w:ascii="Calibri" w:hAnsi="Calibri"/>
-                <w:b/>
-                <w:i w:val="0"/>
-                <w:color w:val="003B71"/>
-                <w:sz w:val="17"/>
-              </w:rPr>
-              <w:t xml:space="preserve">Strategy  </w:t>
-            </w:r>
-            <w:r>
-              <w:rPr>
-                <w:rFonts w:ascii="Calibri" w:hAnsi="Calibri"/>
-                <w:b w:val="0"/>
-                <w:i w:val="0"/>
-                <w:color w:val="334155"/>
-                <w:sz w:val="17"/>
-              </w:rPr>
-              <w:t>Thách thức trực tiếp:Khi Long Châu tích hợp dữ liệu số và cá nhân hóa tư vấn, chuỗi này sẽ có xu hướng ưu tiên các sản phẩm có dữ liệu lâm sàng mạnh, nhãn hiệu được nhận diện tốt hoặc sản phẩm độc quyền phân phối — gây bất lợi cho các generic chưa có chiến lược thương hiệu rõ ràng của Davipharm.Rủi ro với Empagliflozin:Trong phân khúc đái tháo đường type 2, Long Châu có thể ưu tiên đẩy các sản phẩm originator (Jardiance) hoặc generic đã có thỏa thuận độc quyền. Davipharm cần đàm phán vị trí ưu tiên trên kệ số (digital shelf) và trong hệ thống gợi ý AI của Long Châu.Cơ hội với Tadalafil &amp; Dapoxetine:Dịch vụ tư vấn sức khỏe nam giới qua kênh số/kín đáo của Long Châu là cơ hội vàng. Davipharm nên đề xuất chương trình co-branding hoặc gói tư vấn sức khỏe nam giới tích hợp sản phẩm Tadalafil/Dapoxetine vào hành trình khách hàng số của Long Châu.Hành động chiến lược:Ưu tiên ký kết thỏa thuận cung ứng chiến lược với Long Châu; đầu tư vào dữ liệu thực địa (RWE) cho Empagliflozin để đáp ứng tiêu chí lựa chọn dựa trên bằng chứng của nền tảng số Long Châu.</w:t>
-            </w:r>
-          </w:p>
-        </w:tc>
-      </w:tr>
-    </w:tbl>
-    <w:p>
-      <w:pPr>
-        <w:spacing w:before="40" w:after="120"/>
-      </w:pPr>
-    </w:p>
-    <w:tbl>
-      <w:tblPr>
-        <w:tblStyle w:val="TableGrid"/>
-        <w:tblW w:type="auto" w:w="0"/>
-        <w:jc w:val="left"/>
-        <w:tblLook w:firstColumn="1" w:firstRow="1" w:lastColumn="0" w:lastRow="0" w:noHBand="0" w:noVBand="1" w:val="04A0"/>
-      </w:tblPr>
-      <w:tblGrid>
-        <w:gridCol w:w="4536"/>
-        <w:gridCol w:w="4536"/>
-      </w:tblGrid>
-      <w:tr>
-        <w:tc>
-          <w:tcPr>
-            <w:tcW w:type="dxa" w:w="1984"/>
-            <w:shd w:val="clear" w:color="auto" w:fill="EEF2FF"/>
-            <w:tcBorders>
-              <w:top w:val="none" w:sz="6" w:color="auto"/>
-              <w:bottom w:val="none" w:sz="6" w:color="auto"/>
-              <w:left w:val="none" w:sz="6" w:color="auto"/>
-              <w:right w:val="none" w:sz="6" w:color="auto"/>
-            </w:tcBorders>
-          </w:tcPr>
-          <w:p>
-            <w:pPr>
-              <w:spacing w:before="80" w:after="80"/>
-              <w:ind w:left="85"/>
-            </w:pPr>
-            <w:r>
-              <w:rPr>
-                <w:rFonts w:ascii="Calibri" w:hAnsi="Calibri"/>
-                <w:b/>
-                <w:i w:val="0"/>
-                <w:color w:val="4338CA"/>
-                <w:sz w:val="15"/>
-              </w:rPr>
-              <w:t>FPT RETAIL LONG CHÂU</w:t>
-            </w:r>
-          </w:p>
-        </w:tc>
-        <w:tc>
-          <w:tcPr>
-            <w:tcW w:type="dxa" w:w="4536"/>
-            <w:tcBorders>
-              <w:top w:val="none" w:sz="6" w:color="auto"/>
-              <w:bottom w:val="none" w:sz="6" w:color="auto"/>
-              <w:left w:val="none" w:sz="6" w:color="auto"/>
-              <w:right w:val="none" w:sz="6" w:color="auto"/>
-            </w:tcBorders>
-          </w:tcPr>
-          <w:p>
-            <w:pPr>
-              <w:spacing w:before="60" w:after="60"/>
-              <w:ind w:left="113"/>
-            </w:pPr>
-            <w:r>
-              <w:rPr>
-                <w:rFonts w:ascii="Calibri" w:hAnsi="Calibri"/>
-                <w:b/>
-                <w:i w:val="0"/>
-                <w:color w:val="111827"/>
-                <w:sz w:val="21"/>
-              </w:rPr>
-              <w:t>FPT Retail báo lãi quý 1/2026 tăng 73% — Chuỗi Long Châu tiếp tục dẫn dắt tăng trưởng</w:t>
-            </w:r>
-          </w:p>
-        </w:tc>
-      </w:tr>
-    </w:tbl>
-    <w:p>
-      <w:pPr>
-        <w:spacing w:before="40" w:after="40"/>
-        <w:ind w:left="170"/>
-      </w:pPr>
-      <w:r>
-        <w:rPr>
-          <w:rFonts w:ascii="Calibri" w:hAnsi="Calibri"/>
-          <w:b w:val="0"/>
-          <w:i/>
-          <w:color w:val="6B7280"/>
-          <w:sz w:val="18"/>
-        </w:rPr>
-        <w:t>FPT Retail ghi nhận lợi nhuận sau thuế quý 1/2026 tăng trưởng 73% so với cùng kỳ năm trước, chủ yếu nhờ chuỗi nhà thuốc Long Châu mở rộng mạng lưới điểm bán, tăng doanh thu từ dược phẩm kê đơn và OTC, đồng thời cải thiện biên lợi nhuận gộp thông qua tối ưu hóa danh mục sản phẩm và đàm phán trực tiếp với nhà sản xuất.</w:t>
-      </w:r>
-    </w:p>
-    <w:p>
-      <w:pPr>
-        <w:spacing w:before="20" w:after="40"/>
-        <w:ind w:left="170"/>
-      </w:pPr>
-      <w:r>
-        <w:rPr>
-          <w:rFonts w:ascii="Calibri" w:hAnsi="Calibri"/>
-          <w:b/>
-          <w:i w:val="0"/>
-          <w:color w:val="991B1B"/>
-          <w:sz w:val="17"/>
-        </w:rPr>
-        <w:t>⚠️ Tác động tiêu cực — Long Châu tăng trưởng mạnh đồng nghĩa áp lực cạnh tranh kênh bán lẻ dược phẩm gia tăng đáng kể với Davipharm</w:t>
-      </w:r>
-    </w:p>
-    <w:tbl>
-      <w:tblPr>
-        <w:tblStyle w:val="TableGrid"/>
-        <w:tblW w:type="auto" w:w="0"/>
-        <w:tblLook w:firstColumn="1" w:firstRow="1" w:lastColumn="0" w:lastRow="0" w:noHBand="0" w:noVBand="1" w:val="04A0"/>
-      </w:tblPr>
-      <w:tblGrid>
-        <w:gridCol w:w="9072"/>
-      </w:tblGrid>
-      <w:tr>
-        <w:tc>
-          <w:tcPr>
-            <w:tcW w:type="dxa" w:w="9072"/>
-            <w:shd w:val="clear" w:color="auto" w:fill="F8FAFC"/>
-            <w:tcBorders>
-              <w:top w:val="none" w:sz="6" w:color="auto"/>
-              <w:bottom w:val="none" w:sz="6" w:color="auto"/>
-              <w:left w:val="single" w:sz="12" w:color="003B71"/>
-              <w:right w:val="none" w:sz="6" w:color="auto"/>
-            </w:tcBorders>
-          </w:tcPr>
-          <w:p>
-            <w:pPr>
-              <w:spacing w:before="60" w:after="60"/>
-              <w:ind w:left="142"/>
-            </w:pPr>
-            <w:r>
-              <w:rPr>
-                <w:rFonts w:ascii="Calibri" w:hAnsi="Calibri"/>
-                <w:b/>
-                <w:i w:val="0"/>
-                <w:color w:val="003B71"/>
-                <w:sz w:val="17"/>
-              </w:rPr>
-              <w:t xml:space="preserve">Strategy  </w:t>
-            </w:r>
-            <w:r>
-              <w:rPr>
-                <w:rFonts w:ascii="Calibri" w:hAnsi="Calibri"/>
-                <w:b w:val="0"/>
-                <w:i w:val="0"/>
-                <w:color w:val="334155"/>
-                <w:sz w:val="17"/>
-              </w:rPr>
-              <w:t>Thách thức trực tiếp:Long Châu với hơn 3.000 điểm bán và tăng trưởng lợi nhuận 73% đang củng cố vị thế đàm phán vượt trội so với nhà sản xuất. Điều này tạo áp lực giảm giá bán buôn và rút ngắn thời hạn thanh toán đối với Davipharm trong các hợp đồng cung ứng. Đặc biệt vớiEmpagliflozin(điều trị đái tháo đường type 2) — phân khúc đang tăng trưởng nóng — Long Châu có thể ưu tiên nhập hàng từ các đối thủ generic quốc tế có giá thấp hơn nếu Davipharm không duy trì lợi thế cạnh tranh về giá và chính sách chiết khấu.Cơ hội chiến lược:Tốc độ mở rộng của Long Châu tạo ra nhu cầu lớn về nguồn cung ổn định, đặc biệt các sản phẩm có biên lợi nhuận cao nhưTadalafilvàDapoxetine— nhóm sản phẩm nhạy cảm mà Long Châu cần đối tác sản xuất uy tín trong nước để đảm bảo tính hợp pháp và kiểm soát chất lượng. Davipharm nên chủ động đàm phán hợp đồng độc quyền hoặc ưu tiên cung ứng cho Long Châu với các SKU này, kèm chương trình hỗ trợ đào tạo dược sĩ tư vấn tại quầy.Khuyến nghị hành động:(1) Xây dựng đề xuất giá trị riêng biệt cho kênh Long Châu với gói combo Empagliflozin + tư vấn tuân thủ điều trị; (2) Đàm phán listing fee ưu đãi đổi lấy cam kết doanh số tối thiểu; (3) Theo dõi sát chiến lược nhãn hàng riêng (private label) của Long Châu để phòng ngừa rủi ro bị thay thế.</w:t>
-            </w:r>
-          </w:p>
-        </w:tc>
-      </w:tr>
-    </w:tbl>
-    <w:p>
-      <w:pPr>
-        <w:spacing w:before="40" w:after="120"/>
-      </w:pPr>
     </w:p>
     <w:p>
       <w:r>
@@ -3641,7 +1925,7 @@
           <w:color w:val="9CA3AF"/>
           <w:sz w:val="17"/>
         </w:rPr>
-        <w:t>Google Search Console  ·  30 ngày gần nhất  ·  Dữ liệu: 12/05/2026</w:t>
+        <w:t>Google Search Console  ·  30 ngày gần nhất  ·  Dữ liệu: 13/05/2026</w:t>
       </w:r>
     </w:p>
     <w:p>
@@ -4573,7 +2857,7 @@
                 <w:color w:val="9CA3AF"/>
                 <w:sz w:val="15"/>
               </w:rPr>
-              <w:t>Davipharm Market Intelligence System  ·  Powered by Claude Sonnet 4.6  ·  12/05/2026  ·  CONFIDENTIAL</w:t>
+              <w:t>Davipharm Market Intelligence System  ·  Powered by Claude Sonnet 4.6  ·  13/05/2026  ·  CONFIDENTIAL</w:t>
             </w:r>
           </w:p>
         </w:tc>

</xml_diff>

<commit_message>
Update report_vi.docx 2026-05-13 10:05
</commit_message>
<xml_diff>
--- a/report_vi.docx
+++ b/report_vi.docx
@@ -338,7 +338,7 @@
                 <w:color w:val="111827"/>
                 <w:sz w:val="20"/>
               </w:rPr>
-              <w:t>Tuần này: Cải cách đấu thầu mở cơ hội cho Davipharm trong khi Long Châu tăng tốc mở rộng tạo áp lực kênh phân phối.</w:t>
+              <w:t>Tuần 11–17/05: Ba cơ hội tăng trưởng nổi bật cho Davipharm — đấu thầu bệnh viện tuyến giáp, OTC thảo dược nội địa, và tái định vị Levetiracetam sang phân khúc thần kinh cao cấp.</w:t>
             </w:r>
           </w:p>
         </w:tc>
@@ -406,7 +406,7 @@
                 <w:color w:val="111827"/>
                 <w:sz w:val="17"/>
               </w:rPr>
-              <w:t>▸  Đấu thầu:Tiêu chí không còn là "giá thấp nhất" — nhà sản xuất GMP-EU được hưởng lợi trực tiếp.</w:t>
+              <w:t>▸  Du lịch y tế &amp; tuyến giáp:Lượng bệnh nhân quốc tế tăng tại các BV chuyên sâu nâng tiêu chuẩn thuốc chỉ định, mở cửa sổ cạnh tranh cho generic chất lượng cao của Davipharm so với thuốc nhập khẩu.</w:t>
             </w:r>
           </w:p>
           <w:p>
@@ -422,7 +422,7 @@
                 <w:color w:val="111827"/>
                 <w:sz w:val="17"/>
               </w:rPr>
-              <w:t>▸  Kênh OTC:FPT Retail lãi tăng 73% Q1/2026, Long Châu dẫn dắt tăng trưởng — đàm phán shelf-space ngày càng khó.</w:t>
+              <w:t>▸  Thảo dược nội địa:Truyền thông đại chúng đang kích cầu tự nhiên cho dòng OTC/thực phẩm chức năng thảo dược Việt — lợi thế nguyên liệu nội địa chi phí thấp của Davipharm chưa được khai thác đủ.</w:t>
             </w:r>
           </w:p>
           <w:p>
@@ -438,7 +438,7 @@
                 <w:color w:val="111827"/>
                 <w:sz w:val="17"/>
               </w:rPr>
-              <w:t>▸  Cung ứng:Nhập khẩu nguyên liệu Q1/2026 giảm mạnh — cần đánh giá lại chuỗi cung ứng API.</w:t>
+              <w:t>▸  Levetiracetam &amp; Alzheimer:Nghiên cứu Mỹ xác nhận tiềm năng drug repurposing của Levetiracetam sang chỉ định Alzheimer, tạo cơ hội định vị premium và mở danh mục đấu thầu thần kinh mới nếu Davipharm có hoạt chất này trong pipeline.</w:t>
             </w:r>
           </w:p>
           <w:p>
@@ -454,39 +454,7 @@
                 <w:color w:val="111827"/>
                 <w:sz w:val="17"/>
               </w:rPr>
-              <w:t>▸  P1RA/Marketing: Chuẩn bị hồ sơ EU-GMP để đủ điều kiện thầu Nhóm 1 theo quy định mới.</w:t>
-            </w:r>
-          </w:p>
-          <w:p>
-            <w:pPr>
-              <w:spacing w:before="20" w:after="60"/>
-              <w:ind w:left="142"/>
-            </w:pPr>
-            <w:r>
-              <w:rPr>
-                <w:rFonts w:ascii="Calibri" w:hAnsi="Calibri"/>
-                <w:b w:val="0"/>
-                <w:i w:val="0"/>
-                <w:color w:val="111827"/>
-                <w:sz w:val="17"/>
-              </w:rPr>
-              <w:t>▸  P2Sales: Đàm phán partnership cấp tập đoàn với Long Châu — tránh đàm phán từng điểm bán.</w:t>
-            </w:r>
-          </w:p>
-          <w:p>
-            <w:pPr>
-              <w:spacing w:before="20" w:after="60"/>
-              <w:ind w:left="142"/>
-            </w:pPr>
-            <w:r>
-              <w:rPr>
-                <w:rFonts w:ascii="Calibri" w:hAnsi="Calibri"/>
-                <w:b w:val="0"/>
-                <w:i w:val="0"/>
-                <w:color w:val="111827"/>
-                <w:sz w:val="17"/>
-              </w:rPr>
-              <w:t>▸  P3Supply Chain: Rà soát tồn kho API, đánh giá nguồn cung thay thế trong bối cảnh nhập khẩu giảm.</w:t>
+              <w:t>▸  P1BD/Đấu thầu tiếp cận ngay BV Nội tiết TW và BV Bạch Mai để đưa levothyroxine, canxi và kháng sinh hậu phẫu vào danh mục đấu thầu ưu tiên trước mùa đấu thầu tiếp theo.</w:t>
             </w:r>
           </w:p>
         </w:tc>
@@ -530,39 +498,7 @@
                 <w:color w:val="0056D2"/>
                 <w:sz w:val="17"/>
               </w:rPr>
-              <w:t>→  P1RA/Marketing: Chuẩn bị hồ sơ EU-GMP để đủ điều kiện thầu Nhóm 1 theo quy định mới.</w:t>
-            </w:r>
-          </w:p>
-          <w:p>
-            <w:pPr>
-              <w:spacing w:before="20" w:after="60"/>
-              <w:ind w:left="142"/>
-            </w:pPr>
-            <w:r>
-              <w:rPr>
-                <w:rFonts w:ascii="Calibri" w:hAnsi="Calibri"/>
-                <w:b w:val="0"/>
-                <w:i w:val="0"/>
-                <w:color w:val="0056D2"/>
-                <w:sz w:val="17"/>
-              </w:rPr>
-              <w:t>→  P2Sales: Đàm phán partnership cấp tập đoàn với Long Châu — tránh đàm phán từng điểm bán.</w:t>
-            </w:r>
-          </w:p>
-          <w:p>
-            <w:pPr>
-              <w:spacing w:before="20" w:after="60"/>
-              <w:ind w:left="142"/>
-            </w:pPr>
-            <w:r>
-              <w:rPr>
-                <w:rFonts w:ascii="Calibri" w:hAnsi="Calibri"/>
-                <w:b w:val="0"/>
-                <w:i w:val="0"/>
-                <w:color w:val="0056D2"/>
-                <w:sz w:val="17"/>
-              </w:rPr>
-              <w:t>→  P3Supply Chain: Rà soát tồn kho API, đánh giá nguồn cung thay thế trong bối cảnh nhập khẩu giảm.</w:t>
+              <w:t>→  P1BD/Đấu thầu tiếp cận ngay BV Nội tiết TW và BV Bạch Mai để đưa levothyroxine, canxi và kháng sinh hậu phẫu vào danh mục đấu thầu ưu tiên trước mùa đấu thầu tiếp theo.</w:t>
             </w:r>
           </w:p>
         </w:tc>
@@ -571,67 +507,6 @@
     <w:p>
       <w:pPr>
         <w:spacing w:after="120"/>
-      </w:pPr>
-    </w:p>
-    <w:p>
-      <w:pPr>
-        <w:spacing w:before="200" w:after="80"/>
-      </w:pPr>
-      <w:r>
-        <w:rPr>
-          <w:rFonts w:ascii="Calibri" w:hAnsi="Calibri"/>
-          <w:b/>
-          <w:i w:val="0"/>
-          <w:color w:val="9CA3AF"/>
-          <w:sz w:val="20"/>
-        </w:rPr>
-        <w:t>📡  Đề cập thương hiệu — Davipharm · Adamed</w:t>
-      </w:r>
-    </w:p>
-    <w:tbl>
-      <w:tblPr>
-        <w:tblStyle w:val="TableGrid"/>
-        <w:tblW w:type="auto" w:w="0"/>
-        <w:jc w:val="left"/>
-        <w:tblLook w:firstColumn="1" w:firstRow="1" w:lastColumn="0" w:lastRow="0" w:noHBand="0" w:noVBand="1" w:val="04A0"/>
-      </w:tblPr>
-      <w:tblGrid>
-        <w:gridCol w:w="9072"/>
-      </w:tblGrid>
-      <w:tr>
-        <w:tc>
-          <w:tcPr>
-            <w:tcW w:type="dxa" w:w="9071"/>
-            <w:shd w:val="clear" w:color="auto" w:fill="F0FDF4"/>
-            <w:tcBorders>
-              <w:top w:val="none" w:sz="6" w:color="auto"/>
-              <w:bottom w:val="none" w:sz="6" w:color="auto"/>
-              <w:left w:val="single" w:sz="18" w:color="166534"/>
-              <w:right w:val="none" w:sz="6" w:color="auto"/>
-            </w:tcBorders>
-          </w:tcPr>
-          <w:p>
-            <w:pPr>
-              <w:spacing w:before="80" w:after="80"/>
-              <w:ind w:left="170"/>
-            </w:pPr>
-            <w:r>
-              <w:rPr>
-                <w:rFonts w:ascii="Calibri" w:hAnsi="Calibri"/>
-                <w:b/>
-                <w:i w:val="0"/>
-                <w:color w:val="111827"/>
-                <w:sz w:val="18"/>
-              </w:rPr>
-              <w:t>✅ Không có đề cập tiêu cực nào về Davipharm hoặc Adamed trong 7 ngày qua. Thương hiệu đang ở trạng thái yên tĩnh — không cần xử lý khủng hoảng truyền thông.</w:t>
-            </w:r>
-          </w:p>
-        </w:tc>
-      </w:tr>
-    </w:tbl>
-    <w:p>
-      <w:pPr>
-        <w:spacing w:before="80"/>
       </w:pPr>
     </w:p>
     <w:p>
@@ -820,7 +695,7 @@
         <w:tc>
           <w:tcPr>
             <w:tcW w:type="dxa" w:w="1701"/>
-            <w:shd w:val="clear" w:color="auto" w:fill="E9FBF0"/>
+            <w:shd w:val="clear" w:color="auto" w:fill="DCFCE7"/>
             <w:tcBorders>
               <w:top w:val="none" w:sz="6" w:color="auto"/>
               <w:bottom w:val="none" w:sz="6" w:color="auto"/>
@@ -836,12 +711,12 @@
             <w:r>
               <w:rPr>
                 <w:rFonts w:ascii="Calibri" w:hAnsi="Calibri"/>
-                <w:b w:val="0"/>
+                <w:b/>
                 <w:i w:val="0"/>
-                <w:color w:val="CCCCCC"/>
+                <w:color w:val="166534"/>
                 <w:sz w:val="22"/>
               </w:rPr>
-              <w:t>—</w:t>
+              <w:t>1</w:t>
             </w:r>
           </w:p>
         </w:tc>
@@ -934,7 +809,7 @@
         <w:tc>
           <w:tcPr>
             <w:tcW w:type="dxa" w:w="1701"/>
-            <w:shd w:val="clear" w:color="auto" w:fill="E9FBF0"/>
+            <w:shd w:val="clear" w:color="auto" w:fill="DCFCE7"/>
             <w:tcBorders>
               <w:top w:val="none" w:sz="6" w:color="auto"/>
               <w:bottom w:val="none" w:sz="6" w:color="auto"/>
@@ -950,19 +825,19 @@
             <w:r>
               <w:rPr>
                 <w:rFonts w:ascii="Calibri" w:hAnsi="Calibri"/>
-                <w:b w:val="0"/>
+                <w:b/>
                 <w:i w:val="0"/>
-                <w:color w:val="CCCCCC"/>
+                <w:color w:val="166534"/>
                 <w:sz w:val="22"/>
               </w:rPr>
-              <w:t>—</w:t>
+              <w:t>2</w:t>
             </w:r>
           </w:p>
         </w:tc>
         <w:tc>
           <w:tcPr>
             <w:tcW w:type="dxa" w:w="1984"/>
-            <w:shd w:val="clear" w:color="auto" w:fill="F9FAFB"/>
+            <w:shd w:val="clear" w:color="auto" w:fill="F3F4F6"/>
             <w:tcBorders>
               <w:top w:val="none" w:sz="6" w:color="auto"/>
               <w:bottom w:val="none" w:sz="6" w:color="auto"/>
@@ -978,12 +853,12 @@
             <w:r>
               <w:rPr>
                 <w:rFonts w:ascii="Calibri" w:hAnsi="Calibri"/>
-                <w:b w:val="0"/>
+                <w:b/>
                 <w:i w:val="0"/>
-                <w:color w:val="CCCCCC"/>
+                <w:color w:val="374151"/>
                 <w:sz w:val="22"/>
               </w:rPr>
-              <w:t>—</w:t>
+              <w:t>1</w:t>
             </w:r>
           </w:p>
         </w:tc>
@@ -1159,6 +1034,162 @@
         <w:t>CHÍNH SÁCH &amp; PHÁP LÝ</w:t>
       </w:r>
     </w:p>
+    <w:tbl>
+      <w:tblPr>
+        <w:tblStyle w:val="TableGrid"/>
+        <w:tblW w:type="auto" w:w="0"/>
+        <w:jc w:val="left"/>
+        <w:tblLook w:firstColumn="1" w:firstRow="1" w:lastColumn="0" w:lastRow="0" w:noHBand="0" w:noVBand="1" w:val="04A0"/>
+      </w:tblPr>
+      <w:tblGrid>
+        <w:gridCol w:w="4536"/>
+        <w:gridCol w:w="4536"/>
+      </w:tblGrid>
+      <w:tr>
+        <w:tc>
+          <w:tcPr>
+            <w:tcW w:type="dxa" w:w="1984"/>
+            <w:shd w:val="clear" w:color="auto" w:fill="EEF2FF"/>
+            <w:tcBorders>
+              <w:top w:val="none" w:sz="6" w:color="auto"/>
+              <w:bottom w:val="none" w:sz="6" w:color="auto"/>
+              <w:left w:val="none" w:sz="6" w:color="auto"/>
+              <w:right w:val="none" w:sz="6" w:color="auto"/>
+            </w:tcBorders>
+          </w:tcPr>
+          <w:p>
+            <w:pPr>
+              <w:spacing w:before="80" w:after="80"/>
+              <w:ind w:left="85"/>
+            </w:pPr>
+            <w:r>
+              <w:rPr>
+                <w:rFonts w:ascii="Calibri" w:hAnsi="Calibri"/>
+                <w:b/>
+                <w:i w:val="0"/>
+                <w:color w:val="4338CA"/>
+                <w:sz w:val="15"/>
+              </w:rPr>
+              <w:t>NHÂN DÂN – XÃ HỘI</w:t>
+            </w:r>
+          </w:p>
+        </w:tc>
+        <w:tc>
+          <w:tcPr>
+            <w:tcW w:type="dxa" w:w="4536"/>
+            <w:tcBorders>
+              <w:top w:val="none" w:sz="6" w:color="auto"/>
+              <w:bottom w:val="none" w:sz="6" w:color="auto"/>
+              <w:left w:val="none" w:sz="6" w:color="auto"/>
+              <w:right w:val="none" w:sz="6" w:color="auto"/>
+            </w:tcBorders>
+          </w:tcPr>
+          <w:p>
+            <w:pPr>
+              <w:spacing w:before="60" w:after="60"/>
+              <w:ind w:left="113"/>
+            </w:pPr>
+            <w:r>
+              <w:rPr>
+                <w:rFonts w:ascii="Calibri" w:hAnsi="Calibri"/>
+                <w:b/>
+                <w:i w:val="0"/>
+                <w:color w:val="111827"/>
+                <w:sz w:val="21"/>
+              </w:rPr>
+              <w:t>Kỹ thuật mổ nội soi tuyến giáp "Dr Lương" thu hút bệnh nhân &amp; bác sĩ quốc tế đến Việt Nam</w:t>
+            </w:r>
+          </w:p>
+        </w:tc>
+      </w:tr>
+    </w:tbl>
+    <w:p>
+      <w:pPr>
+        <w:spacing w:before="40" w:after="40"/>
+        <w:ind w:left="170"/>
+      </w:pPr>
+      <w:r>
+        <w:rPr>
+          <w:rFonts w:ascii="Calibri" w:hAnsi="Calibri"/>
+          <w:b w:val="0"/>
+          <w:i/>
+          <w:color w:val="6B7280"/>
+          <w:sz w:val="18"/>
+        </w:rPr>
+        <w:t>Phương pháp mổ nội soi tuyến giáp "Dr Lương" của Việt Nam đang thu hút bệnh nhân từ Philippines và bác sĩ từ Azerbaijan, Ấn Độ đến học hỏi, khẳng định vị thế trung tâm y tế chất lượng cao trong khu vực. Xu hướng du lịch y tế quốc tế vào Việt Nam mở ra nhu cầu gia tăng đối với dược phẩm hậu phẫu và thuốc đặc trị tuyến giáp tại các bệnh viện tuyến đầu.</w:t>
+      </w:r>
+    </w:p>
+    <w:p>
+      <w:pPr>
+        <w:spacing w:before="20" w:after="40"/>
+        <w:ind w:left="170"/>
+      </w:pPr>
+      <w:r>
+        <w:rPr>
+          <w:rFonts w:ascii="Calibri" w:hAnsi="Calibri"/>
+          <w:b/>
+          <w:i w:val="0"/>
+          <w:color w:val="166534"/>
+          <w:sz w:val="17"/>
+        </w:rPr>
+        <w:t>🟢 Tín hiệu tích cực gián tiếp — du lịch y tế tăng trưởng thúc đẩy nhu cầu dược phẩm hậu phẫu tuyến giáp tại bệnh viện đối tác.</w:t>
+      </w:r>
+    </w:p>
+    <w:tbl>
+      <w:tblPr>
+        <w:tblStyle w:val="TableGrid"/>
+        <w:tblW w:type="auto" w:w="0"/>
+        <w:tblLook w:firstColumn="1" w:firstRow="1" w:lastColumn="0" w:lastRow="0" w:noHBand="0" w:noVBand="1" w:val="04A0"/>
+      </w:tblPr>
+      <w:tblGrid>
+        <w:gridCol w:w="9072"/>
+      </w:tblGrid>
+      <w:tr>
+        <w:tc>
+          <w:tcPr>
+            <w:tcW w:type="dxa" w:w="9072"/>
+            <w:shd w:val="clear" w:color="auto" w:fill="F8FAFC"/>
+            <w:tcBorders>
+              <w:top w:val="none" w:sz="6" w:color="auto"/>
+              <w:bottom w:val="none" w:sz="6" w:color="auto"/>
+              <w:left w:val="single" w:sz="12" w:color="003B71"/>
+              <w:right w:val="none" w:sz="6" w:color="auto"/>
+            </w:tcBorders>
+          </w:tcPr>
+          <w:p>
+            <w:pPr>
+              <w:spacing w:before="60" w:after="60"/>
+              <w:ind w:left="142"/>
+            </w:pPr>
+            <w:r>
+              <w:rPr>
+                <w:rFonts w:ascii="Calibri" w:hAnsi="Calibri"/>
+                <w:b/>
+                <w:i w:val="0"/>
+                <w:color w:val="003B71"/>
+                <w:sz w:val="17"/>
+              </w:rPr>
+              <w:t xml:space="preserve">Strategy  </w:t>
+            </w:r>
+            <w:r>
+              <w:rPr>
+                <w:rFonts w:ascii="Calibri" w:hAnsi="Calibri"/>
+                <w:b w:val="0"/>
+                <w:i w:val="0"/>
+                <w:color w:val="334155"/>
+                <w:sz w:val="17"/>
+              </w:rPr>
+              <w:t>Davipharm nên chủ động tiếp cận các bệnh viện chuyên sâu thực hiện kỹ thuật "Dr Lương" (như BV Nội tiết TW, BV Bạch Mai) để đưa thuốc levothyroxine, canxi và kháng sinh hậu phẫu vào danh mục ưu tiên đấu thầu. Đây là cơ hội xây dựng quan hệ đối tác bệnh viện dài hạn, đặc biệt khi lượng bệnh nhân quốc tế gia tăng sẽ nâng cao tiêu chuẩn thuốc được chỉ định.</w:t>
+            </w:r>
+          </w:p>
+        </w:tc>
+      </w:tr>
+    </w:tbl>
+    <w:p>
+      <w:pPr>
+        <w:spacing w:before="40" w:after="120"/>
+      </w:pPr>
+    </w:p>
     <w:p>
       <w:r>
         <w:br w:type="page"/>
@@ -1181,6 +1212,474 @@
         </w:rPr>
         <w:t>TIN NGÀNH DƯỢC</w:t>
       </w:r>
+    </w:p>
+    <w:tbl>
+      <w:tblPr>
+        <w:tblStyle w:val="TableGrid"/>
+        <w:tblW w:type="auto" w:w="0"/>
+        <w:jc w:val="left"/>
+        <w:tblLook w:firstColumn="1" w:firstRow="1" w:lastColumn="0" w:lastRow="0" w:noHBand="0" w:noVBand="1" w:val="04A0"/>
+      </w:tblPr>
+      <w:tblGrid>
+        <w:gridCol w:w="4536"/>
+        <w:gridCol w:w="4536"/>
+      </w:tblGrid>
+      <w:tr>
+        <w:tc>
+          <w:tcPr>
+            <w:tcW w:type="dxa" w:w="1984"/>
+            <w:shd w:val="clear" w:color="auto" w:fill="EEF2FF"/>
+            <w:tcBorders>
+              <w:top w:val="none" w:sz="6" w:color="auto"/>
+              <w:bottom w:val="none" w:sz="6" w:color="auto"/>
+              <w:left w:val="none" w:sz="6" w:color="auto"/>
+              <w:right w:val="none" w:sz="6" w:color="auto"/>
+            </w:tcBorders>
+          </w:tcPr>
+          <w:p>
+            <w:pPr>
+              <w:spacing w:before="80" w:after="80"/>
+              <w:ind w:left="85"/>
+            </w:pPr>
+            <w:r>
+              <w:rPr>
+                <w:rFonts w:ascii="Calibri" w:hAnsi="Calibri"/>
+                <w:b/>
+                <w:i w:val="0"/>
+                <w:color w:val="4338CA"/>
+                <w:sz w:val="15"/>
+              </w:rPr>
+              <w:t>VIETNAMPLUS – SỨC KHỎE</w:t>
+            </w:r>
+          </w:p>
+        </w:tc>
+        <w:tc>
+          <w:tcPr>
+            <w:tcW w:type="dxa" w:w="4536"/>
+            <w:tcBorders>
+              <w:top w:val="none" w:sz="6" w:color="auto"/>
+              <w:bottom w:val="none" w:sz="6" w:color="auto"/>
+              <w:left w:val="none" w:sz="6" w:color="auto"/>
+              <w:right w:val="none" w:sz="6" w:color="auto"/>
+            </w:tcBorders>
+          </w:tcPr>
+          <w:p>
+            <w:pPr>
+              <w:spacing w:before="60" w:after="60"/>
+              <w:ind w:left="113"/>
+            </w:pPr>
+            <w:r>
+              <w:rPr>
+                <w:rFonts w:ascii="Calibri" w:hAnsi="Calibri"/>
+                <w:b/>
+                <w:i w:val="0"/>
+                <w:color w:val="111827"/>
+                <w:sz w:val="21"/>
+              </w:rPr>
+              <w:t>Tin tức địa chính trị quốc tế — Không liên quan đến ngành dược Việt Nam</w:t>
+            </w:r>
+          </w:p>
+        </w:tc>
+      </w:tr>
+    </w:tbl>
+    <w:p>
+      <w:pPr>
+        <w:spacing w:before="40" w:after="40"/>
+        <w:ind w:left="170"/>
+      </w:pPr>
+      <w:r>
+        <w:rPr>
+          <w:rFonts w:ascii="Calibri" w:hAnsi="Calibri"/>
+          <w:b w:val="0"/>
+          <w:i/>
+          <w:color w:val="6B7280"/>
+          <w:sz w:val="18"/>
+        </w:rPr>
+        <w:t>Bài báo đề cập đến tranh chấp địa chính trị giữa Mỹ, NATO và Greenland — hoàn toàn nằm ngoài phạm vi thị trường dược phẩm Việt Nam. Nội dung không cung cấp tín hiệu thị trường nào có giá trị cho hoạt động kinh doanh của Davipharm.</w:t>
+      </w:r>
+    </w:p>
+    <w:p>
+      <w:pPr>
+        <w:spacing w:before="20" w:after="40"/>
+        <w:ind w:left="170"/>
+      </w:pPr>
+      <w:r>
+        <w:rPr>
+          <w:rFonts w:ascii="Calibri" w:hAnsi="Calibri"/>
+          <w:b/>
+          <w:i w:val="0"/>
+          <w:color w:val="374151"/>
+          <w:sz w:val="17"/>
+        </w:rPr>
+        <w:t>⚪ Không có tác động trực tiếp đến Davipharm — tin này không thuộc phạm vi theo dõi market intelligence dược phẩm.</w:t>
+      </w:r>
+    </w:p>
+    <w:tbl>
+      <w:tblPr>
+        <w:tblStyle w:val="TableGrid"/>
+        <w:tblW w:type="auto" w:w="0"/>
+        <w:tblLook w:firstColumn="1" w:firstRow="1" w:lastColumn="0" w:lastRow="0" w:noHBand="0" w:noVBand="1" w:val="04A0"/>
+      </w:tblPr>
+      <w:tblGrid>
+        <w:gridCol w:w="9072"/>
+      </w:tblGrid>
+      <w:tr>
+        <w:tc>
+          <w:tcPr>
+            <w:tcW w:type="dxa" w:w="9072"/>
+            <w:shd w:val="clear" w:color="auto" w:fill="F8FAFC"/>
+            <w:tcBorders>
+              <w:top w:val="none" w:sz="6" w:color="auto"/>
+              <w:bottom w:val="none" w:sz="6" w:color="auto"/>
+              <w:left w:val="single" w:sz="12" w:color="003B71"/>
+              <w:right w:val="none" w:sz="6" w:color="auto"/>
+            </w:tcBorders>
+          </w:tcPr>
+          <w:p>
+            <w:pPr>
+              <w:spacing w:before="60" w:after="60"/>
+              <w:ind w:left="142"/>
+            </w:pPr>
+            <w:r>
+              <w:rPr>
+                <w:rFonts w:ascii="Calibri" w:hAnsi="Calibri"/>
+                <w:b/>
+                <w:i w:val="0"/>
+                <w:color w:val="003B71"/>
+                <w:sz w:val="17"/>
+              </w:rPr>
+              <w:t xml:space="preserve">Strategy  </w:t>
+            </w:r>
+            <w:r>
+              <w:rPr>
+                <w:rFonts w:ascii="Calibri" w:hAnsi="Calibri"/>
+                <w:b w:val="0"/>
+                <w:i w:val="0"/>
+                <w:color w:val="334155"/>
+                <w:sz w:val="17"/>
+              </w:rPr>
+              <w:t>Đề xuất lọc nguồn tin: cần cấu hình lại bộ lọc keyword để loại bỏ các bài địa chính trị không liên quan, tối ưu hóa chất lượng báo cáo BOD. Không có hành động chiến lược nào cần thiết từ bài viết này.</w:t>
+            </w:r>
+          </w:p>
+        </w:tc>
+      </w:tr>
+    </w:tbl>
+    <w:p>
+      <w:pPr>
+        <w:spacing w:before="40" w:after="120"/>
+      </w:pPr>
+    </w:p>
+    <w:tbl>
+      <w:tblPr>
+        <w:tblStyle w:val="TableGrid"/>
+        <w:tblW w:type="auto" w:w="0"/>
+        <w:jc w:val="left"/>
+        <w:tblLook w:firstColumn="1" w:firstRow="1" w:lastColumn="0" w:lastRow="0" w:noHBand="0" w:noVBand="1" w:val="04A0"/>
+      </w:tblPr>
+      <w:tblGrid>
+        <w:gridCol w:w="4536"/>
+        <w:gridCol w:w="4536"/>
+      </w:tblGrid>
+      <w:tr>
+        <w:tc>
+          <w:tcPr>
+            <w:tcW w:type="dxa" w:w="1984"/>
+            <w:shd w:val="clear" w:color="auto" w:fill="EEF2FF"/>
+            <w:tcBorders>
+              <w:top w:val="none" w:sz="6" w:color="auto"/>
+              <w:bottom w:val="none" w:sz="6" w:color="auto"/>
+              <w:left w:val="none" w:sz="6" w:color="auto"/>
+              <w:right w:val="none" w:sz="6" w:color="auto"/>
+            </w:tcBorders>
+          </w:tcPr>
+          <w:p>
+            <w:pPr>
+              <w:spacing w:before="80" w:after="80"/>
+              <w:ind w:left="85"/>
+            </w:pPr>
+            <w:r>
+              <w:rPr>
+                <w:rFonts w:ascii="Calibri" w:hAnsi="Calibri"/>
+                <w:b/>
+                <w:i w:val="0"/>
+                <w:color w:val="4338CA"/>
+                <w:sz w:val="15"/>
+              </w:rPr>
+              <w:t>VIETNAMPLUS – SỨC KHỎE</w:t>
+            </w:r>
+          </w:p>
+        </w:tc>
+        <w:tc>
+          <w:tcPr>
+            <w:tcW w:type="dxa" w:w="4536"/>
+            <w:tcBorders>
+              <w:top w:val="none" w:sz="6" w:color="auto"/>
+              <w:bottom w:val="none" w:sz="6" w:color="auto"/>
+              <w:left w:val="none" w:sz="6" w:color="auto"/>
+              <w:right w:val="none" w:sz="6" w:color="auto"/>
+            </w:tcBorders>
+          </w:tcPr>
+          <w:p>
+            <w:pPr>
+              <w:spacing w:before="60" w:after="60"/>
+              <w:ind w:left="113"/>
+            </w:pPr>
+            <w:r>
+              <w:rPr>
+                <w:rFonts w:ascii="Calibri" w:hAnsi="Calibri"/>
+                <w:b/>
+                <w:i w:val="0"/>
+                <w:color w:val="111827"/>
+                <w:sz w:val="21"/>
+              </w:rPr>
+              <w:t>Rau Diếp Cá: Xu Hướng Dược Liệu Tự Nhiên Từ Vườn Nhà</w:t>
+            </w:r>
+          </w:p>
+        </w:tc>
+      </w:tr>
+    </w:tbl>
+    <w:p>
+      <w:pPr>
+        <w:spacing w:before="40" w:after="40"/>
+        <w:ind w:left="170"/>
+      </w:pPr>
+      <w:r>
+        <w:rPr>
+          <w:rFonts w:ascii="Calibri" w:hAnsi="Calibri"/>
+          <w:b w:val="0"/>
+          <w:i/>
+          <w:color w:val="6B7280"/>
+          <w:sz w:val="18"/>
+        </w:rPr>
+        <w:t>Rau diếp cá đang được truyền thông y tế chủ lưu quảng bá rộng rãi nhờ các công dụng chăm sóc da và sức khỏe, phản ánh xu hướng tiêu dùng nghiêng về thảo dược tự nhiên bản địa. Xu hướng này tạo nền tảng thị trường thuận lợi cho các sản phẩm OTC/thực phẩm chức năng có nguồn gốc thảo dược Việt.</w:t>
+      </w:r>
+    </w:p>
+    <w:p>
+      <w:pPr>
+        <w:spacing w:before="20" w:after="40"/>
+        <w:ind w:left="170"/>
+      </w:pPr>
+      <w:r>
+        <w:rPr>
+          <w:rFonts w:ascii="Calibri" w:hAnsi="Calibri"/>
+          <w:b/>
+          <w:i w:val="0"/>
+          <w:color w:val="166534"/>
+          <w:sz w:val="17"/>
+        </w:rPr>
+        <w:t>🌿 Tín hiệu tích cực nhẹ — truyền thông đại chúng đang "làm ấm" thị trường cho dòng sản phẩm thảo dược nội địa mà Davipharm có thể khai thác.</w:t>
+      </w:r>
+    </w:p>
+    <w:tbl>
+      <w:tblPr>
+        <w:tblStyle w:val="TableGrid"/>
+        <w:tblW w:type="auto" w:w="0"/>
+        <w:tblLook w:firstColumn="1" w:firstRow="1" w:lastColumn="0" w:lastRow="0" w:noHBand="0" w:noVBand="1" w:val="04A0"/>
+      </w:tblPr>
+      <w:tblGrid>
+        <w:gridCol w:w="9072"/>
+      </w:tblGrid>
+      <w:tr>
+        <w:tc>
+          <w:tcPr>
+            <w:tcW w:type="dxa" w:w="9072"/>
+            <w:shd w:val="clear" w:color="auto" w:fill="F8FAFC"/>
+            <w:tcBorders>
+              <w:top w:val="none" w:sz="6" w:color="auto"/>
+              <w:bottom w:val="none" w:sz="6" w:color="auto"/>
+              <w:left w:val="single" w:sz="12" w:color="003B71"/>
+              <w:right w:val="none" w:sz="6" w:color="auto"/>
+            </w:tcBorders>
+          </w:tcPr>
+          <w:p>
+            <w:pPr>
+              <w:spacing w:before="60" w:after="60"/>
+              <w:ind w:left="142"/>
+            </w:pPr>
+            <w:r>
+              <w:rPr>
+                <w:rFonts w:ascii="Calibri" w:hAnsi="Calibri"/>
+                <w:b/>
+                <w:i w:val="0"/>
+                <w:color w:val="003B71"/>
+                <w:sz w:val="17"/>
+              </w:rPr>
+              <w:t xml:space="preserve">Strategy  </w:t>
+            </w:r>
+            <w:r>
+              <w:rPr>
+                <w:rFonts w:ascii="Calibri" w:hAnsi="Calibri"/>
+                <w:b w:val="0"/>
+                <w:i w:val="0"/>
+                <w:color w:val="334155"/>
+                <w:sz w:val="17"/>
+              </w:rPr>
+              <w:t>Đánh giá khả năng phát triển hoặc repositioning dòng sản phẩm OTC/thực phẩm chức năng có chiết xuất diếp cá (kháng viêm, hỗ trợ da liễu), tận dụng nguồn nguyên liệu nội địa chi phí thấp và sóng truyền thông hiện tại. Ưu tiên kênh chuỗi nhà thuốc (Long Châu, Pharmacity) để tiếp cận nhóm người tiêu dùng quan tâm đến sản phẩm tự nhiên.</w:t>
+            </w:r>
+          </w:p>
+        </w:tc>
+      </w:tr>
+    </w:tbl>
+    <w:p>
+      <w:pPr>
+        <w:spacing w:before="40" w:after="120"/>
+      </w:pPr>
+    </w:p>
+    <w:tbl>
+      <w:tblPr>
+        <w:tblStyle w:val="TableGrid"/>
+        <w:tblW w:type="auto" w:w="0"/>
+        <w:jc w:val="left"/>
+        <w:tblLook w:firstColumn="1" w:firstRow="1" w:lastColumn="0" w:lastRow="0" w:noHBand="0" w:noVBand="1" w:val="04A0"/>
+      </w:tblPr>
+      <w:tblGrid>
+        <w:gridCol w:w="4536"/>
+        <w:gridCol w:w="4536"/>
+      </w:tblGrid>
+      <w:tr>
+        <w:tc>
+          <w:tcPr>
+            <w:tcW w:type="dxa" w:w="1984"/>
+            <w:shd w:val="clear" w:color="auto" w:fill="EEF2FF"/>
+            <w:tcBorders>
+              <w:top w:val="none" w:sz="6" w:color="auto"/>
+              <w:bottom w:val="none" w:sz="6" w:color="auto"/>
+              <w:left w:val="none" w:sz="6" w:color="auto"/>
+              <w:right w:val="none" w:sz="6" w:color="auto"/>
+            </w:tcBorders>
+          </w:tcPr>
+          <w:p>
+            <w:pPr>
+              <w:spacing w:before="80" w:after="80"/>
+              <w:ind w:left="85"/>
+            </w:pPr>
+            <w:r>
+              <w:rPr>
+                <w:rFonts w:ascii="Calibri" w:hAnsi="Calibri"/>
+                <w:b/>
+                <w:i w:val="0"/>
+                <w:color w:val="4338CA"/>
+                <w:sz w:val="15"/>
+              </w:rPr>
+              <w:t>VIETNAMPLUS – SỨC KHỎE</w:t>
+            </w:r>
+          </w:p>
+        </w:tc>
+        <w:tc>
+          <w:tcPr>
+            <w:tcW w:type="dxa" w:w="4536"/>
+            <w:tcBorders>
+              <w:top w:val="none" w:sz="6" w:color="auto"/>
+              <w:bottom w:val="none" w:sz="6" w:color="auto"/>
+              <w:left w:val="none" w:sz="6" w:color="auto"/>
+              <w:right w:val="none" w:sz="6" w:color="auto"/>
+            </w:tcBorders>
+          </w:tcPr>
+          <w:p>
+            <w:pPr>
+              <w:spacing w:before="60" w:after="60"/>
+              <w:ind w:left="113"/>
+            </w:pPr>
+            <w:r>
+              <w:rPr>
+                <w:rFonts w:ascii="Calibri" w:hAnsi="Calibri"/>
+                <w:b/>
+                <w:i w:val="0"/>
+                <w:color w:val="111827"/>
+                <w:sz w:val="21"/>
+              </w:rPr>
+              <w:t>Thuốc chống co giật Levetiracetam có tiềm năng ngăn ngừa Alzheimer</w:t>
+            </w:r>
+          </w:p>
+        </w:tc>
+      </w:tr>
+    </w:tbl>
+    <w:p>
+      <w:pPr>
+        <w:spacing w:before="40" w:after="40"/>
+        <w:ind w:left="170"/>
+      </w:pPr>
+      <w:r>
+        <w:rPr>
+          <w:rFonts w:ascii="Calibri" w:hAnsi="Calibri"/>
+          <w:b w:val="0"/>
+          <w:i/>
+          <w:color w:val="6B7280"/>
+          <w:sz w:val="18"/>
+        </w:rPr>
+        <w:t>Các nhà khoa học Mỹ phát hiện Levetiracetam — thuốc chống co giật đã có mặt lâu trên thị trường — có khả năng ức chế hình thành amyloid-beta 42, protein chủ chốt trong cơ chế bệnh sinh Alzheimer. Phát hiện này mở ra tiềm năng tái định vị (drug repurposing) một phân tử generic đã được chứng minh an toàn cho chỉ định mới có giá trị cao.</w:t>
+      </w:r>
+    </w:p>
+    <w:p>
+      <w:pPr>
+        <w:spacing w:before="20" w:after="40"/>
+        <w:ind w:left="170"/>
+      </w:pPr>
+      <w:r>
+        <w:rPr>
+          <w:rFonts w:ascii="Calibri" w:hAnsi="Calibri"/>
+          <w:b/>
+          <w:i w:val="0"/>
+          <w:color w:val="166534"/>
+          <w:sz w:val="17"/>
+        </w:rPr>
+        <w:t>🟢 Cơ hội tái định vị sản phẩm generic Levetiracetam sang phân khúc thần kinh cao cấp nếu Davipharm đang hoặc có kế hoạch sản xuất hoạt chất này.</w:t>
+      </w:r>
+    </w:p>
+    <w:tbl>
+      <w:tblPr>
+        <w:tblStyle w:val="TableGrid"/>
+        <w:tblW w:type="auto" w:w="0"/>
+        <w:tblLook w:firstColumn="1" w:firstRow="1" w:lastColumn="0" w:lastRow="0" w:noHBand="0" w:noVBand="1" w:val="04A0"/>
+      </w:tblPr>
+      <w:tblGrid>
+        <w:gridCol w:w="9072"/>
+      </w:tblGrid>
+      <w:tr>
+        <w:tc>
+          <w:tcPr>
+            <w:tcW w:type="dxa" w:w="9072"/>
+            <w:shd w:val="clear" w:color="auto" w:fill="F8FAFC"/>
+            <w:tcBorders>
+              <w:top w:val="none" w:sz="6" w:color="auto"/>
+              <w:bottom w:val="none" w:sz="6" w:color="auto"/>
+              <w:left w:val="single" w:sz="12" w:color="003B71"/>
+              <w:right w:val="none" w:sz="6" w:color="auto"/>
+            </w:tcBorders>
+          </w:tcPr>
+          <w:p>
+            <w:pPr>
+              <w:spacing w:before="60" w:after="60"/>
+              <w:ind w:left="142"/>
+            </w:pPr>
+            <w:r>
+              <w:rPr>
+                <w:rFonts w:ascii="Calibri" w:hAnsi="Calibri"/>
+                <w:b/>
+                <w:i w:val="0"/>
+                <w:color w:val="003B71"/>
+                <w:sz w:val="17"/>
+              </w:rPr>
+              <w:t xml:space="preserve">Strategy  </w:t>
+            </w:r>
+            <w:r>
+              <w:rPr>
+                <w:rFonts w:ascii="Calibri" w:hAnsi="Calibri"/>
+                <w:b w:val="0"/>
+                <w:i w:val="0"/>
+                <w:color w:val="334155"/>
+                <w:sz w:val="17"/>
+              </w:rPr>
+              <w:t>Rà soát ngay danh mục R&amp;D/sản xuất: nếu Levetiracetam đã có hoặc khả thi về nguyên liệu, ưu tiên theo dõi các thử nghiệm lâm sàng giai đoạn tiếp theo để chuẩn bị hồ sơ đăng ký chỉ định bổ sung, đón đầu nhu cầu từ kênh bệnh viện chuyên khoa thần kinh và chuỗi nhà thuốc cao cấp.</w:t>
+            </w:r>
+          </w:p>
+        </w:tc>
+      </w:tr>
+    </w:tbl>
+    <w:p>
+      <w:pPr>
+        <w:spacing w:before="40" w:after="120"/>
+      </w:pPr>
     </w:p>
     <w:p>
       <w:r>
@@ -2188,7 +2687,7 @@
                 <w:color w:val="111827"/>
                 <w:sz w:val="18"/>
               </w:rPr>
-              <w:t>Chuẩn bị hồ sơ EU-GMP để tham gia thầu Nhóm 1</w:t>
+              <w:t>Đàm phán listing levothyroxine/canxi vào danh mục đấu thầu BV Nội tiết TW, Bạch Mai</w:t>
             </w:r>
           </w:p>
         </w:tc>
@@ -2216,7 +2715,7 @@
                 <w:color w:val="003B71"/>
                 <w:sz w:val="17"/>
               </w:rPr>
-              <w:t>RA &amp; Marketing</w:t>
+              <w:t>Sales</w:t>
             </w:r>
           </w:p>
         </w:tc>
@@ -2244,7 +2743,7 @@
                 <w:color w:val="6B7280"/>
                 <w:sz w:val="17"/>
               </w:rPr>
-              <w:t>Chính sách đấu thầu</w:t>
+              <w:t>Du lịch y tế tuyến giáp tăng</w:t>
             </w:r>
           </w:p>
         </w:tc>
@@ -2323,7 +2822,7 @@
                 <w:color w:val="111827"/>
                 <w:sz w:val="18"/>
               </w:rPr>
-              <w:t>Đàm phán partnership cấp tập đoàn với Long Châu/Pharmacity</w:t>
+              <w:t>Rà soát danh mục R&amp;D: xác nhận khả thi sản xuất Levetiracetam trong 30 ngày</w:t>
             </w:r>
           </w:p>
         </w:tc>
@@ -2351,7 +2850,7 @@
                 <w:color w:val="003B71"/>
                 <w:sz w:val="17"/>
               </w:rPr>
-              <w:t>Sales</w:t>
+              <w:t>RA</w:t>
             </w:r>
           </w:p>
         </w:tc>
@@ -2379,7 +2878,7 @@
                 <w:color w:val="6B7280"/>
                 <w:sz w:val="17"/>
               </w:rPr>
-              <w:t>Long Châu expansion</w:t>
+              <w:t>Levetiracetam – tiềm năng Alzheimer</w:t>
             </w:r>
           </w:p>
         </w:tc>
@@ -2458,7 +2957,7 @@
                 <w:color w:val="111827"/>
                 <w:sz w:val="18"/>
               </w:rPr>
-              <w:t>Rà soát API inventory, tìm nguồn cung thay thế</w:t>
+              <w:t>Theo dõi thử nghiệm lâm sàng Levetiracetam/Alzheimer để chuẩn bị hồ sơ chỉ định bổ sung</w:t>
             </w:r>
           </w:p>
         </w:tc>
@@ -2486,7 +2985,7 @@
                 <w:color w:val="003B71"/>
                 <w:sz w:val="17"/>
               </w:rPr>
-              <w:t>Supply Chain</w:t>
+              <w:t>Strategy</w:t>
             </w:r>
           </w:p>
         </w:tc>
@@ -2514,7 +3013,7 @@
                 <w:color w:val="6B7280"/>
                 <w:sz w:val="17"/>
               </w:rPr>
-              <w:t>Nhập khẩu nguyên liệu</w:t>
+              <w:t>Levetiracetam – tiềm năng Alzheimer</w:t>
             </w:r>
           </w:p>
         </w:tc>
@@ -2593,7 +3092,7 @@
                 <w:color w:val="111827"/>
                 <w:sz w:val="18"/>
               </w:rPr>
-              <w:t>Theo dõi giá Sun Pharma cho Tadalafil, điều chỉnh chiến lược giá</w:t>
+              <w:t>Đánh giá phát triển SKU OTC chiết xuất diếp cá cho kênh Long Châu, Pharmacity</w:t>
             </w:r>
           </w:p>
         </w:tc>
@@ -2649,7 +3148,7 @@
                 <w:color w:val="6B7280"/>
                 <w:sz w:val="17"/>
               </w:rPr>
-              <w:t>Sản phẩm Tadalafil</w:t>
+              <w:t>Xu hướng thảo dược diếp cá</w:t>
             </w:r>
           </w:p>
         </w:tc>
@@ -2677,142 +3176,7 @@
                 <w:color w:val="D97706"/>
                 <w:sz w:val="17"/>
               </w:rPr>
-              <w:t>🟡 Trung</w:t>
-            </w:r>
-          </w:p>
-        </w:tc>
-      </w:tr>
-      <w:tr>
-        <w:tc>
-          <w:tcPr>
-            <w:tcW w:type="dxa" w:w="454"/>
-            <w:shd w:val="clear" w:color="auto" w:fill="DCFCE7"/>
-            <w:tcBorders>
-              <w:top w:val="none" w:sz="6" w:color="auto"/>
-              <w:bottom w:val="none" w:sz="6" w:color="auto"/>
-              <w:left w:val="none" w:sz="6" w:color="auto"/>
-              <w:right w:val="none" w:sz="6" w:color="auto"/>
-            </w:tcBorders>
-          </w:tcPr>
-          <w:p>
-            <w:pPr>
-              <w:spacing w:before="100" w:after="100"/>
-              <w:jc w:val="center"/>
-            </w:pPr>
-            <w:r>
-              <w:t>🟢</w:t>
-            </w:r>
-          </w:p>
-        </w:tc>
-        <w:tc>
-          <w:tcPr>
-            <w:tcW w:type="dxa" w:w="4422"/>
-            <w:shd w:val="clear" w:color="auto" w:fill="FFFFFF"/>
-            <w:tcBorders>
-              <w:top w:val="none" w:sz="6" w:color="auto"/>
-              <w:bottom w:val="none" w:sz="6" w:color="auto"/>
-              <w:left w:val="none" w:sz="6" w:color="auto"/>
-              <w:right w:val="none" w:sz="6" w:color="auto"/>
-            </w:tcBorders>
-          </w:tcPr>
-          <w:p>
-            <w:pPr>
-              <w:spacing w:before="80" w:after="80"/>
-              <w:ind w:left="85"/>
-            </w:pPr>
-            <w:r>
-              <w:rPr>
-                <w:rFonts w:ascii="Calibri" w:hAnsi="Calibri"/>
-                <w:b/>
-                <w:i w:val="0"/>
-                <w:color w:val="111827"/>
-                <w:sz w:val="18"/>
-              </w:rPr>
-              <w:t>Lập kế hoạch ra mắt Cytisine Q4/2026 — phân tích thị trường cai thuốc lá</w:t>
-            </w:r>
-          </w:p>
-        </w:tc>
-        <w:tc>
-          <w:tcPr>
-            <w:tcW w:type="dxa" w:w="1417"/>
-            <w:shd w:val="clear" w:color="auto" w:fill="FFFFFF"/>
-            <w:tcBorders>
-              <w:top w:val="none" w:sz="6" w:color="auto"/>
-              <w:bottom w:val="none" w:sz="6" w:color="auto"/>
-              <w:left w:val="none" w:sz="6" w:color="auto"/>
-              <w:right w:val="none" w:sz="6" w:color="auto"/>
-            </w:tcBorders>
-          </w:tcPr>
-          <w:p>
-            <w:pPr>
-              <w:spacing w:before="80" w:after="80"/>
-              <w:jc w:val="center"/>
-            </w:pPr>
-            <w:r>
-              <w:rPr>
-                <w:rFonts w:ascii="Calibri" w:hAnsi="Calibri"/>
-                <w:b w:val="0"/>
-                <w:i w:val="0"/>
-                <w:color w:val="003B71"/>
-                <w:sz w:val="17"/>
-              </w:rPr>
-              <w:t>Strategy</w:t>
-            </w:r>
-          </w:p>
-        </w:tc>
-        <w:tc>
-          <w:tcPr>
-            <w:tcW w:type="dxa" w:w="1134"/>
-            <w:shd w:val="clear" w:color="auto" w:fill="FFFFFF"/>
-            <w:tcBorders>
-              <w:top w:val="none" w:sz="6" w:color="auto"/>
-              <w:bottom w:val="none" w:sz="6" w:color="auto"/>
-              <w:left w:val="none" w:sz="6" w:color="auto"/>
-              <w:right w:val="none" w:sz="6" w:color="auto"/>
-            </w:tcBorders>
-          </w:tcPr>
-          <w:p>
-            <w:pPr>
-              <w:spacing w:before="80" w:after="80"/>
-              <w:jc w:val="center"/>
-            </w:pPr>
-            <w:r>
-              <w:rPr>
-                <w:rFonts w:ascii="Calibri" w:hAnsi="Calibri"/>
-                <w:b w:val="0"/>
-                <w:i w:val="0"/>
-                <w:color w:val="6B7280"/>
-                <w:sz w:val="17"/>
-              </w:rPr>
-              <w:t>Portfolio Cytisine</w:t>
-            </w:r>
-          </w:p>
-        </w:tc>
-        <w:tc>
-          <w:tcPr>
-            <w:tcW w:type="dxa" w:w="1644"/>
-            <w:shd w:val="clear" w:color="auto" w:fill="DCFCE7"/>
-            <w:tcBorders>
-              <w:top w:val="none" w:sz="6" w:color="auto"/>
-              <w:bottom w:val="none" w:sz="6" w:color="auto"/>
-              <w:left w:val="none" w:sz="6" w:color="auto"/>
-              <w:right w:val="none" w:sz="6" w:color="auto"/>
-            </w:tcBorders>
-          </w:tcPr>
-          <w:p>
-            <w:pPr>
-              <w:spacing w:before="80" w:after="80"/>
-              <w:jc w:val="center"/>
-            </w:pPr>
-            <w:r>
-              <w:rPr>
-                <w:rFonts w:ascii="Calibri" w:hAnsi="Calibri"/>
-                <w:b/>
-                <w:i w:val="0"/>
-                <w:color w:val="22C55E"/>
-                <w:sz w:val="17"/>
-              </w:rPr>
-              <w:t>🟢 Thấp</w:t>
+              <w:t>🟡 Trung&lt;/td</w:t>
             </w:r>
           </w:p>
         </w:tc>

</xml_diff>

<commit_message>
Update report_vi.docx 2026-05-13 10:10
</commit_message>
<xml_diff>
--- a/report_vi.docx
+++ b/report_vi.docx
@@ -338,7 +338,7 @@
                 <w:color w:val="111827"/>
                 <w:sz w:val="20"/>
               </w:rPr>
-              <w:t>Tuần 11–17/05: Ba cơ hội tăng trưởng nổi bật cho Davipharm — đấu thầu bệnh viện tuyến giáp, OTC thảo dược nội địa, và tái định vị Levetiracetam sang phân khúc thần kinh cao cấp.</w:t>
+              <w:t>Tuần 11–17/05: Hai tín hiệu thị trường tích cực — nhu cầu nhi khoa mùa thủy đậu và phân khúc dinh dưỡng 50+ — mở ra cơ hội tăng trưởng ngắn và trung hạn cho danh mục OTC/ETC của Davipharm.</w:t>
             </w:r>
           </w:p>
         </w:tc>
@@ -406,7 +406,7 @@
                 <w:color w:val="111827"/>
                 <w:sz w:val="17"/>
               </w:rPr>
-              <w:t>▸  Du lịch y tế &amp; tuyến giáp:Lượng bệnh nhân quốc tế tăng tại các BV chuyên sâu nâng tiêu chuẩn thuốc chỉ định, mở cửa sổ cạnh tranh cho generic chất lượng cao của Davipharm so với thuốc nhập khẩu.</w:t>
+              <w:t>▸  Nhi khoa – Thủy đậu:Ca biến chứng nặng được truyền thông hóa tạo nhu cầu tức thời cho kháng sinh phổ rộng và acyclovir tại kênh bệnh viện nhi.</w:t>
             </w:r>
           </w:p>
           <w:p>
@@ -422,7 +422,7 @@
                 <w:color w:val="111827"/>
                 <w:sz w:val="17"/>
               </w:rPr>
-              <w:t>▸  Thảo dược nội địa:Truyền thông đại chúng đang kích cầu tự nhiên cho dòng OTC/thực phẩm chức năng thảo dược Việt — lợi thế nguyên liệu nội địa chi phí thấp của Davipharm chưa được khai thác đủ.</w:t>
+              <w:t>▸  Dinh dưỡng 50+:Truyền thông y tế đang khuếch đại nhu cầu canxi, vitamin D và omega-3 cho người cao tuổi — phân khúc tăng trưởng nhanh chưa bị khai thác tối đa.</w:t>
             </w:r>
           </w:p>
           <w:p>
@@ -438,7 +438,7 @@
                 <w:color w:val="111827"/>
                 <w:sz w:val="17"/>
               </w:rPr>
-              <w:t>▸  Levetiracetam &amp; Alzheimer:Nghiên cứu Mỹ xác nhận tiềm năng drug repurposing của Levetiracetam sang chỉ định Alzheimer, tạo cơ hội định vị premium và mở danh mục đấu thầu thần kinh mới nếu Davipharm có hoạt chất này trong pipeline.</w:t>
+              <w:t>▸  An toàn thuốc – Tim mạch:Cảnh báo tương tác TPCN–chống đông tạo dư địa định vị Davipharm là thương hiệu "dược phẩm có trách nhiệm" trong kênh ETC tim mạch.</w:t>
             </w:r>
           </w:p>
           <w:p>
@@ -454,7 +454,23 @@
                 <w:color w:val="111827"/>
                 <w:sz w:val="17"/>
               </w:rPr>
-              <w:t>▸  P1BD/Đấu thầu tiếp cận ngay BV Nội tiết TW và BV Bạch Mai để đưa levothyroxine, canxi và kháng sinh hậu phẫu vào danh mục đấu thầu ưu tiên trước mùa đấu thầu tiếp theo.</w:t>
+              <w:t>▸  P1Sales Director chỉ đạo Medical Rep tăng tần suất ghé thăm bệnh viện nhi và phòng khám nhi trong tháng 5–6, ưu tiên push kháng sinh amoxicillin-clavulanate, cephalosporin và acyclovir.</w:t>
+            </w:r>
+          </w:p>
+          <w:p>
+            <w:pPr>
+              <w:spacing w:before="20" w:after="60"/>
+              <w:ind w:left="142"/>
+            </w:pPr>
+            <w:r>
+              <w:rPr>
+                <w:rFonts w:ascii="Calibri" w:hAnsi="Calibri"/>
+                <w:b w:val="0"/>
+                <w:i w:val="0"/>
+                <w:color w:val="111827"/>
+                <w:sz w:val="17"/>
+              </w:rPr>
+              <w:t>▸  P2Marketing Director đánh giá khả năng ra mắt combo "Active 50+" (canxi + vitamin D + omega-3) và lên kế hoạch truyền</w:t>
             </w:r>
           </w:p>
         </w:tc>
@@ -498,7 +514,23 @@
                 <w:color w:val="0056D2"/>
                 <w:sz w:val="17"/>
               </w:rPr>
-              <w:t>→  P1BD/Đấu thầu tiếp cận ngay BV Nội tiết TW và BV Bạch Mai để đưa levothyroxine, canxi và kháng sinh hậu phẫu vào danh mục đấu thầu ưu tiên trước mùa đấu thầu tiếp theo.</w:t>
+              <w:t>→  P1Sales Director chỉ đạo Medical Rep tăng tần suất ghé thăm bệnh viện nhi và phòng khám nhi trong tháng 5–6, ưu tiên push kháng sinh amoxicillin-clavulanate, cephalosporin và acyclovir.</w:t>
+            </w:r>
+          </w:p>
+          <w:p>
+            <w:pPr>
+              <w:spacing w:before="20" w:after="60"/>
+              <w:ind w:left="142"/>
+            </w:pPr>
+            <w:r>
+              <w:rPr>
+                <w:rFonts w:ascii="Calibri" w:hAnsi="Calibri"/>
+                <w:b w:val="0"/>
+                <w:i w:val="0"/>
+                <w:color w:val="0056D2"/>
+                <w:sz w:val="17"/>
+              </w:rPr>
+              <w:t>→  P2Marketing Director đánh giá khả năng ra mắt combo "Active 50+" (canxi + vitamin D + omega-3) và lên kế hoạch truyền</w:t>
             </w:r>
           </w:p>
         </w:tc>
@@ -716,14 +748,14 @@
                 <w:color w:val="166534"/>
                 <w:sz w:val="22"/>
               </w:rPr>
-              <w:t>1</w:t>
+              <w:t>4</w:t>
             </w:r>
           </w:p>
         </w:tc>
         <w:tc>
           <w:tcPr>
             <w:tcW w:type="dxa" w:w="1984"/>
-            <w:shd w:val="clear" w:color="auto" w:fill="F9FAFB"/>
+            <w:shd w:val="clear" w:color="auto" w:fill="F3F4F6"/>
             <w:tcBorders>
               <w:top w:val="none" w:sz="6" w:color="auto"/>
               <w:bottom w:val="none" w:sz="6" w:color="auto"/>
@@ -739,12 +771,12 @@
             <w:r>
               <w:rPr>
                 <w:rFonts w:ascii="Calibri" w:hAnsi="Calibri"/>
-                <w:b w:val="0"/>
+                <w:b/>
                 <w:i w:val="0"/>
-                <w:color w:val="CCCCCC"/>
+                <w:color w:val="374151"/>
                 <w:sz w:val="22"/>
               </w:rPr>
-              <w:t>—</w:t>
+              <w:t>1</w:t>
             </w:r>
           </w:p>
         </w:tc>
@@ -1033,6 +1065,630 @@
         </w:rPr>
         <w:t>CHÍNH SÁCH &amp; PHÁP LÝ</w:t>
       </w:r>
+    </w:p>
+    <w:tbl>
+      <w:tblPr>
+        <w:tblStyle w:val="TableGrid"/>
+        <w:tblW w:type="auto" w:w="0"/>
+        <w:jc w:val="left"/>
+        <w:tblLook w:firstColumn="1" w:firstRow="1" w:lastColumn="0" w:lastRow="0" w:noHBand="0" w:noVBand="1" w:val="04A0"/>
+      </w:tblPr>
+      <w:tblGrid>
+        <w:gridCol w:w="4536"/>
+        <w:gridCol w:w="4536"/>
+      </w:tblGrid>
+      <w:tr>
+        <w:tc>
+          <w:tcPr>
+            <w:tcW w:type="dxa" w:w="1984"/>
+            <w:shd w:val="clear" w:color="auto" w:fill="EEF2FF"/>
+            <w:tcBorders>
+              <w:top w:val="none" w:sz="6" w:color="auto"/>
+              <w:bottom w:val="none" w:sz="6" w:color="auto"/>
+              <w:left w:val="none" w:sz="6" w:color="auto"/>
+              <w:right w:val="none" w:sz="6" w:color="auto"/>
+            </w:tcBorders>
+          </w:tcPr>
+          <w:p>
+            <w:pPr>
+              <w:spacing w:before="80" w:after="80"/>
+              <w:ind w:left="85"/>
+            </w:pPr>
+            <w:r>
+              <w:rPr>
+                <w:rFonts w:ascii="Calibri" w:hAnsi="Calibri"/>
+                <w:b/>
+                <w:i w:val="0"/>
+                <w:color w:val="4338CA"/>
+                <w:sz w:val="15"/>
+              </w:rPr>
+              <w:t>SK&amp;ĐS – DƯỢC MỸ PHẨM</w:t>
+            </w:r>
+          </w:p>
+        </w:tc>
+        <w:tc>
+          <w:tcPr>
+            <w:tcW w:type="dxa" w:w="4536"/>
+            <w:tcBorders>
+              <w:top w:val="none" w:sz="6" w:color="auto"/>
+              <w:bottom w:val="none" w:sz="6" w:color="auto"/>
+              <w:left w:val="none" w:sz="6" w:color="auto"/>
+              <w:right w:val="none" w:sz="6" w:color="auto"/>
+            </w:tcBorders>
+          </w:tcPr>
+          <w:p>
+            <w:pPr>
+              <w:spacing w:before="60" w:after="60"/>
+              <w:ind w:left="113"/>
+            </w:pPr>
+            <w:r>
+              <w:rPr>
+                <w:rFonts w:ascii="Calibri" w:hAnsi="Calibri"/>
+                <w:b/>
+                <w:i w:val="0"/>
+                <w:color w:val="111827"/>
+                <w:sz w:val="21"/>
+              </w:rPr>
+              <w:t>Bệnh viện S.I.S Cần Thơ được hướng dẫn xử lý nước thải y tế</w:t>
+            </w:r>
+          </w:p>
+        </w:tc>
+      </w:tr>
+    </w:tbl>
+    <w:p>
+      <w:pPr>
+        <w:spacing w:before="40" w:after="40"/>
+        <w:ind w:left="170"/>
+      </w:pPr>
+      <w:r>
+        <w:rPr>
+          <w:rFonts w:ascii="Calibri" w:hAnsi="Calibri"/>
+          <w:b w:val="0"/>
+          <w:i/>
+          <w:color w:val="6B7280"/>
+          <w:sz w:val="18"/>
+        </w:rPr>
+        <w:t>Bài báo phản ánh hoạt động tuân thủ môi trường tại bệnh viện tư nhân S.I.S Cần Thơ liên quan đến thu gom và xử lý nước thải y tế — không liên quan trực tiếp đến ngành dược phẩm hay thị trường phân phối thuốc. Nội dung bài mang tính thông tin địa phương, không có dữ liệu thị trường có giá trị phân tích.</w:t>
+      </w:r>
+    </w:p>
+    <w:p>
+      <w:pPr>
+        <w:spacing w:before="20" w:after="40"/>
+        <w:ind w:left="170"/>
+      </w:pPr>
+      <w:r>
+        <w:rPr>
+          <w:rFonts w:ascii="Calibri" w:hAnsi="Calibri"/>
+          <w:b/>
+          <w:i w:val="0"/>
+          <w:color w:val="374151"/>
+          <w:sz w:val="17"/>
+        </w:rPr>
+        <w:t>⚪ Tin tức không có tác động đến hoạt động kinh doanh hoặc chiến lược của Davipharm.</w:t>
+      </w:r>
+    </w:p>
+    <w:tbl>
+      <w:tblPr>
+        <w:tblStyle w:val="TableGrid"/>
+        <w:tblW w:type="auto" w:w="0"/>
+        <w:tblLook w:firstColumn="1" w:firstRow="1" w:lastColumn="0" w:lastRow="0" w:noHBand="0" w:noVBand="1" w:val="04A0"/>
+      </w:tblPr>
+      <w:tblGrid>
+        <w:gridCol w:w="9072"/>
+      </w:tblGrid>
+      <w:tr>
+        <w:tc>
+          <w:tcPr>
+            <w:tcW w:type="dxa" w:w="9072"/>
+            <w:shd w:val="clear" w:color="auto" w:fill="F8FAFC"/>
+            <w:tcBorders>
+              <w:top w:val="none" w:sz="6" w:color="auto"/>
+              <w:bottom w:val="none" w:sz="6" w:color="auto"/>
+              <w:left w:val="single" w:sz="12" w:color="003B71"/>
+              <w:right w:val="none" w:sz="6" w:color="auto"/>
+            </w:tcBorders>
+          </w:tcPr>
+          <w:p>
+            <w:pPr>
+              <w:spacing w:before="60" w:after="60"/>
+              <w:ind w:left="142"/>
+            </w:pPr>
+            <w:r>
+              <w:rPr>
+                <w:rFonts w:ascii="Calibri" w:hAnsi="Calibri"/>
+                <w:b/>
+                <w:i w:val="0"/>
+                <w:color w:val="003B71"/>
+                <w:sz w:val="17"/>
+              </w:rPr>
+              <w:t xml:space="preserve">Strategy  </w:t>
+            </w:r>
+            <w:r>
+              <w:rPr>
+                <w:rFonts w:ascii="Calibri" w:hAnsi="Calibri"/>
+                <w:b w:val="0"/>
+                <w:i w:val="0"/>
+                <w:color w:val="334155"/>
+                <w:sz w:val="17"/>
+              </w:rPr>
+              <w:t>Không có hành động cần thiết — bài báo nằm ngoài phạm vi theo dõi chiến lược dược phẩm; khuyến nghị loại khỏi bộ lọc tin tức BOD để tối ưu thời gian phân tích.</w:t>
+            </w:r>
+          </w:p>
+        </w:tc>
+      </w:tr>
+    </w:tbl>
+    <w:p>
+      <w:pPr>
+        <w:spacing w:before="40" w:after="120"/>
+      </w:pPr>
+    </w:p>
+    <w:tbl>
+      <w:tblPr>
+        <w:tblStyle w:val="TableGrid"/>
+        <w:tblW w:type="auto" w:w="0"/>
+        <w:jc w:val="left"/>
+        <w:tblLook w:firstColumn="1" w:firstRow="1" w:lastColumn="0" w:lastRow="0" w:noHBand="0" w:noVBand="1" w:val="04A0"/>
+      </w:tblPr>
+      <w:tblGrid>
+        <w:gridCol w:w="4536"/>
+        <w:gridCol w:w="4536"/>
+      </w:tblGrid>
+      <w:tr>
+        <w:tc>
+          <w:tcPr>
+            <w:tcW w:type="dxa" w:w="1984"/>
+            <w:shd w:val="clear" w:color="auto" w:fill="EEF2FF"/>
+            <w:tcBorders>
+              <w:top w:val="none" w:sz="6" w:color="auto"/>
+              <w:bottom w:val="none" w:sz="6" w:color="auto"/>
+              <w:left w:val="none" w:sz="6" w:color="auto"/>
+              <w:right w:val="none" w:sz="6" w:color="auto"/>
+            </w:tcBorders>
+          </w:tcPr>
+          <w:p>
+            <w:pPr>
+              <w:spacing w:before="80" w:after="80"/>
+              <w:ind w:left="85"/>
+            </w:pPr>
+            <w:r>
+              <w:rPr>
+                <w:rFonts w:ascii="Calibri" w:hAnsi="Calibri"/>
+                <w:b/>
+                <w:i w:val="0"/>
+                <w:color w:val="4338CA"/>
+                <w:sz w:val="15"/>
+              </w:rPr>
+              <w:t>SK&amp;ĐS – DƯỢC MỸ PHẨM</w:t>
+            </w:r>
+          </w:p>
+        </w:tc>
+        <w:tc>
+          <w:tcPr>
+            <w:tcW w:type="dxa" w:w="4536"/>
+            <w:tcBorders>
+              <w:top w:val="none" w:sz="6" w:color="auto"/>
+              <w:bottom w:val="none" w:sz="6" w:color="auto"/>
+              <w:left w:val="none" w:sz="6" w:color="auto"/>
+              <w:right w:val="none" w:sz="6" w:color="auto"/>
+            </w:tcBorders>
+          </w:tcPr>
+          <w:p>
+            <w:pPr>
+              <w:spacing w:before="60" w:after="60"/>
+              <w:ind w:left="113"/>
+            </w:pPr>
+            <w:r>
+              <w:rPr>
+                <w:rFonts w:ascii="Calibri" w:hAnsi="Calibri"/>
+                <w:b/>
+                <w:i w:val="0"/>
+                <w:color w:val="111827"/>
+                <w:sz w:val="21"/>
+              </w:rPr>
+              <w:t>5 nhóm thực phẩm thiết yếu trong dinh dưỡng sau tuổi 50</w:t>
+            </w:r>
+          </w:p>
+        </w:tc>
+      </w:tr>
+    </w:tbl>
+    <w:p>
+      <w:pPr>
+        <w:spacing w:before="40" w:after="40"/>
+        <w:ind w:left="170"/>
+      </w:pPr>
+      <w:r>
+        <w:rPr>
+          <w:rFonts w:ascii="Calibri" w:hAnsi="Calibri"/>
+          <w:b w:val="0"/>
+          <w:i/>
+          <w:color w:val="6B7280"/>
+          <w:sz w:val="18"/>
+        </w:rPr>
+        <w:t>Truyền thông y tế đang đẩy mạnh nội dung dinh dưỡng cho người cao tuổi, phản ánh nhu cầu ngày càng tăng của nhóm dân số trên 50 tuổi tại Việt Nam. Xu hướng này tạo ra không gian thị trường rõ ràng cho các sản phẩm thực phẩm chức năng bổ sung vi chất, canxi, vitamin D và omega-3.</w:t>
+      </w:r>
+    </w:p>
+    <w:p>
+      <w:pPr>
+        <w:spacing w:before="20" w:after="40"/>
+        <w:ind w:left="170"/>
+      </w:pPr>
+      <w:r>
+        <w:rPr>
+          <w:rFonts w:ascii="Calibri" w:hAnsi="Calibri"/>
+          <w:b/>
+          <w:i w:val="0"/>
+          <w:color w:val="166534"/>
+          <w:sz w:val="17"/>
+        </w:rPr>
+        <w:t>📈 Nội dung truyền thông y tế về dinh dưỡng người cao tuổi gia tăng — cơ hội mở rộng danh mục TPCN cho phân khúc 50+ của Davipharm.</w:t>
+      </w:r>
+    </w:p>
+    <w:tbl>
+      <w:tblPr>
+        <w:tblStyle w:val="TableGrid"/>
+        <w:tblW w:type="auto" w:w="0"/>
+        <w:tblLook w:firstColumn="1" w:firstRow="1" w:lastColumn="0" w:lastRow="0" w:noHBand="0" w:noVBand="1" w:val="04A0"/>
+      </w:tblPr>
+      <w:tblGrid>
+        <w:gridCol w:w="9072"/>
+      </w:tblGrid>
+      <w:tr>
+        <w:tc>
+          <w:tcPr>
+            <w:tcW w:type="dxa" w:w="9072"/>
+            <w:shd w:val="clear" w:color="auto" w:fill="F8FAFC"/>
+            <w:tcBorders>
+              <w:top w:val="none" w:sz="6" w:color="auto"/>
+              <w:bottom w:val="none" w:sz="6" w:color="auto"/>
+              <w:left w:val="single" w:sz="12" w:color="003B71"/>
+              <w:right w:val="none" w:sz="6" w:color="auto"/>
+            </w:tcBorders>
+          </w:tcPr>
+          <w:p>
+            <w:pPr>
+              <w:spacing w:before="60" w:after="60"/>
+              <w:ind w:left="142"/>
+            </w:pPr>
+            <w:r>
+              <w:rPr>
+                <w:rFonts w:ascii="Calibri" w:hAnsi="Calibri"/>
+                <w:b/>
+                <w:i w:val="0"/>
+                <w:color w:val="003B71"/>
+                <w:sz w:val="17"/>
+              </w:rPr>
+              <w:t xml:space="preserve">Strategy  </w:t>
+            </w:r>
+            <w:r>
+              <w:rPr>
+                <w:rFonts w:ascii="Calibri" w:hAnsi="Calibri"/>
+                <w:b w:val="0"/>
+                <w:i w:val="0"/>
+                <w:color w:val="334155"/>
+                <w:sz w:val="17"/>
+              </w:rPr>
+              <w:t>Tận dụng xu hướng truyền thông này để đẩy mạnh marketing cho các sản phẩm canxi, vitamin D tổng hợp và omega-3 hiện có, đồng thời xem xét phát triển combo dinh dưỡng "Active 50+" nhằm chiếm lĩnh phân khúc người cao tuổi đang tăng trưởng nhanh.</w:t>
+            </w:r>
+          </w:p>
+        </w:tc>
+      </w:tr>
+    </w:tbl>
+    <w:p>
+      <w:pPr>
+        <w:spacing w:before="40" w:after="120"/>
+      </w:pPr>
+    </w:p>
+    <w:tbl>
+      <w:tblPr>
+        <w:tblStyle w:val="TableGrid"/>
+        <w:tblW w:type="auto" w:w="0"/>
+        <w:jc w:val="left"/>
+        <w:tblLook w:firstColumn="1" w:firstRow="1" w:lastColumn="0" w:lastRow="0" w:noHBand="0" w:noVBand="1" w:val="04A0"/>
+      </w:tblPr>
+      <w:tblGrid>
+        <w:gridCol w:w="4536"/>
+        <w:gridCol w:w="4536"/>
+      </w:tblGrid>
+      <w:tr>
+        <w:tc>
+          <w:tcPr>
+            <w:tcW w:type="dxa" w:w="1984"/>
+            <w:shd w:val="clear" w:color="auto" w:fill="EEF2FF"/>
+            <w:tcBorders>
+              <w:top w:val="none" w:sz="6" w:color="auto"/>
+              <w:bottom w:val="none" w:sz="6" w:color="auto"/>
+              <w:left w:val="none" w:sz="6" w:color="auto"/>
+              <w:right w:val="none" w:sz="6" w:color="auto"/>
+            </w:tcBorders>
+          </w:tcPr>
+          <w:p>
+            <w:pPr>
+              <w:spacing w:before="80" w:after="80"/>
+              <w:ind w:left="85"/>
+            </w:pPr>
+            <w:r>
+              <w:rPr>
+                <w:rFonts w:ascii="Calibri" w:hAnsi="Calibri"/>
+                <w:b/>
+                <w:i w:val="0"/>
+                <w:color w:val="4338CA"/>
+                <w:sz w:val="15"/>
+              </w:rPr>
+              <w:t>SK&amp;ĐS – DƯỢC MỸ PHẨM</w:t>
+            </w:r>
+          </w:p>
+        </w:tc>
+        <w:tc>
+          <w:tcPr>
+            <w:tcW w:type="dxa" w:w="4536"/>
+            <w:tcBorders>
+              <w:top w:val="none" w:sz="6" w:color="auto"/>
+              <w:bottom w:val="none" w:sz="6" w:color="auto"/>
+              <w:left w:val="none" w:sz="6" w:color="auto"/>
+              <w:right w:val="none" w:sz="6" w:color="auto"/>
+            </w:tcBorders>
+          </w:tcPr>
+          <w:p>
+            <w:pPr>
+              <w:spacing w:before="60" w:after="60"/>
+              <w:ind w:left="113"/>
+            </w:pPr>
+            <w:r>
+              <w:rPr>
+                <w:rFonts w:ascii="Calibri" w:hAnsi="Calibri"/>
+                <w:b/>
+                <w:i w:val="0"/>
+                <w:color w:val="111827"/>
+                <w:sz w:val="21"/>
+              </w:rPr>
+              <w:t>11 thực phẩm chức năng cần tránh khi dùng thuốc chống đông máu</w:t>
+            </w:r>
+          </w:p>
+        </w:tc>
+      </w:tr>
+    </w:tbl>
+    <w:p>
+      <w:pPr>
+        <w:spacing w:before="40" w:after="40"/>
+        <w:ind w:left="170"/>
+      </w:pPr>
+      <w:r>
+        <w:rPr>
+          <w:rFonts w:ascii="Calibri" w:hAnsi="Calibri"/>
+          <w:b w:val="0"/>
+          <w:i/>
+          <w:color w:val="6B7280"/>
+          <w:sz w:val="18"/>
+        </w:rPr>
+        <w:t>Báo SK&amp;ĐS cảnh báo 11 nhóm thực phẩm chức năng (TPCN) có tương tác nguy hiểm với thuốc chống đông, làm tăng nguy cơ chảy máu hoặc đông máu bất thường. Thông tin này xuất hiện trong bối cảnh thị trường TPCN Việt Nam tăng trưởng mạnh nhưng nhận thức về tương tác thuốc-TPCN còn thấp.</w:t>
+      </w:r>
+    </w:p>
+    <w:p>
+      <w:pPr>
+        <w:spacing w:before="20" w:after="40"/>
+        <w:ind w:left="170"/>
+      </w:pPr>
+      <w:r>
+        <w:rPr>
+          <w:rFonts w:ascii="Calibri" w:hAnsi="Calibri"/>
+          <w:b/>
+          <w:i w:val="0"/>
+          <w:color w:val="166534"/>
+          <w:sz w:val="17"/>
+        </w:rPr>
+        <w:t>💡 Cơ hội định vị Davipharm như chuyên gia an toàn dùng thuốc — lợi thế truyền thông B2B và B2C trong phân khúc tim mạch.</w:t>
+      </w:r>
+    </w:p>
+    <w:tbl>
+      <w:tblPr>
+        <w:tblStyle w:val="TableGrid"/>
+        <w:tblW w:type="auto" w:w="0"/>
+        <w:tblLook w:firstColumn="1" w:firstRow="1" w:lastColumn="0" w:lastRow="0" w:noHBand="0" w:noVBand="1" w:val="04A0"/>
+      </w:tblPr>
+      <w:tblGrid>
+        <w:gridCol w:w="9072"/>
+      </w:tblGrid>
+      <w:tr>
+        <w:tc>
+          <w:tcPr>
+            <w:tcW w:type="dxa" w:w="9072"/>
+            <w:shd w:val="clear" w:color="auto" w:fill="F8FAFC"/>
+            <w:tcBorders>
+              <w:top w:val="none" w:sz="6" w:color="auto"/>
+              <w:bottom w:val="none" w:sz="6" w:color="auto"/>
+              <w:left w:val="single" w:sz="12" w:color="003B71"/>
+              <w:right w:val="none" w:sz="6" w:color="auto"/>
+            </w:tcBorders>
+          </w:tcPr>
+          <w:p>
+            <w:pPr>
+              <w:spacing w:before="60" w:after="60"/>
+              <w:ind w:left="142"/>
+            </w:pPr>
+            <w:r>
+              <w:rPr>
+                <w:rFonts w:ascii="Calibri" w:hAnsi="Calibri"/>
+                <w:b/>
+                <w:i w:val="0"/>
+                <w:color w:val="003B71"/>
+                <w:sz w:val="17"/>
+              </w:rPr>
+              <w:t xml:space="preserve">Strategy  </w:t>
+            </w:r>
+            <w:r>
+              <w:rPr>
+                <w:rFonts w:ascii="Calibri" w:hAnsi="Calibri"/>
+                <w:b w:val="0"/>
+                <w:i w:val="0"/>
+                <w:color w:val="334155"/>
+                <w:sz w:val="17"/>
+              </w:rPr>
+              <w:t>Phát triển tài liệu tư vấn "Hướng dẫn dùng thuốc chống đông an toàn" phân phối qua nhà thuốc và bác sĩ kê toa — tăng nhận diện thương hiệu trong phân khúc tim mạch và củng cố quan hệ với kênh ETC/OTC. Đồng thời, rà soát danh mục TPCN/OTC hiện có để đảm bảo nhãn sản phẩm cảnh báo đầy đủ tương tác thuốc, giảm thiểu rủi ro pháp lý.</w:t>
+            </w:r>
+          </w:p>
+        </w:tc>
+      </w:tr>
+    </w:tbl>
+    <w:p>
+      <w:pPr>
+        <w:spacing w:before="40" w:after="120"/>
+      </w:pPr>
+    </w:p>
+    <w:tbl>
+      <w:tblPr>
+        <w:tblStyle w:val="TableGrid"/>
+        <w:tblW w:type="auto" w:w="0"/>
+        <w:jc w:val="left"/>
+        <w:tblLook w:firstColumn="1" w:firstRow="1" w:lastColumn="0" w:lastRow="0" w:noHBand="0" w:noVBand="1" w:val="04A0"/>
+      </w:tblPr>
+      <w:tblGrid>
+        <w:gridCol w:w="4536"/>
+        <w:gridCol w:w="4536"/>
+      </w:tblGrid>
+      <w:tr>
+        <w:tc>
+          <w:tcPr>
+            <w:tcW w:type="dxa" w:w="1984"/>
+            <w:shd w:val="clear" w:color="auto" w:fill="EEF2FF"/>
+            <w:tcBorders>
+              <w:top w:val="none" w:sz="6" w:color="auto"/>
+              <w:bottom w:val="none" w:sz="6" w:color="auto"/>
+              <w:left w:val="none" w:sz="6" w:color="auto"/>
+              <w:right w:val="none" w:sz="6" w:color="auto"/>
+            </w:tcBorders>
+          </w:tcPr>
+          <w:p>
+            <w:pPr>
+              <w:spacing w:before="80" w:after="80"/>
+              <w:ind w:left="85"/>
+            </w:pPr>
+            <w:r>
+              <w:rPr>
+                <w:rFonts w:ascii="Calibri" w:hAnsi="Calibri"/>
+                <w:b/>
+                <w:i w:val="0"/>
+                <w:color w:val="4338CA"/>
+                <w:sz w:val="15"/>
+              </w:rPr>
+              <w:t>SK&amp;ĐS – DƯỢC MỸ PHẨM</w:t>
+            </w:r>
+          </w:p>
+        </w:tc>
+        <w:tc>
+          <w:tcPr>
+            <w:tcW w:type="dxa" w:w="4536"/>
+            <w:tcBorders>
+              <w:top w:val="none" w:sz="6" w:color="auto"/>
+              <w:bottom w:val="none" w:sz="6" w:color="auto"/>
+              <w:left w:val="none" w:sz="6" w:color="auto"/>
+              <w:right w:val="none" w:sz="6" w:color="auto"/>
+            </w:tcBorders>
+          </w:tcPr>
+          <w:p>
+            <w:pPr>
+              <w:spacing w:before="60" w:after="60"/>
+              <w:ind w:left="113"/>
+            </w:pPr>
+            <w:r>
+              <w:rPr>
+                <w:rFonts w:ascii="Calibri" w:hAnsi="Calibri"/>
+                <w:b/>
+                <w:i w:val="0"/>
+                <w:color w:val="111827"/>
+                <w:sz w:val="21"/>
+              </w:rPr>
+              <w:t>Biến chứng thủy đậu nghiêm trọng: Trẻ 6 tuổi nhiễm khuẩn huyết, thở máy nguy kịch</w:t>
+            </w:r>
+          </w:p>
+        </w:tc>
+      </w:tr>
+    </w:tbl>
+    <w:p>
+      <w:pPr>
+        <w:spacing w:before="40" w:after="40"/>
+        <w:ind w:left="170"/>
+      </w:pPr>
+      <w:r>
+        <w:rPr>
+          <w:rFonts w:ascii="Calibri" w:hAnsi="Calibri"/>
+          <w:b w:val="0"/>
+          <w:i/>
+          <w:color w:val="6B7280"/>
+          <w:sz w:val="18"/>
+        </w:rPr>
+        <w:t>Trường hợp trẻ 6 tuổi biến chứng nhiễm khuẩn huyết do thủy đậu gây chú ý dư luận, làm tăng nhận thức cộng đồng về nguy cơ bội nhiễm vi khuẩn sau nhiễm virus. Nhu cầu kháng sinh điều trị nhiễm khuẩn thứ phát và thuốc kháng virus tại các cơ sở nhi khoa dự kiến gia tăng trong mùa dịch thủy đậu.</w:t>
+      </w:r>
+    </w:p>
+    <w:p>
+      <w:pPr>
+        <w:spacing w:before="20" w:after="40"/>
+        <w:ind w:left="170"/>
+      </w:pPr>
+      <w:r>
+        <w:rPr>
+          <w:rFonts w:ascii="Calibri" w:hAnsi="Calibri"/>
+          <w:b/>
+          <w:i w:val="0"/>
+          <w:color w:val="166534"/>
+          <w:sz w:val="17"/>
+        </w:rPr>
+        <w:t>📈 Cơ hội tăng trưởng ngắn hạn cho danh mục kháng sinh nhi khoa và thuốc hỗ trợ điều trị biến chứng thủy đậu của Davipharm.</w:t>
+      </w:r>
+    </w:p>
+    <w:tbl>
+      <w:tblPr>
+        <w:tblStyle w:val="TableGrid"/>
+        <w:tblW w:type="auto" w:w="0"/>
+        <w:tblLook w:firstColumn="1" w:firstRow="1" w:lastColumn="0" w:lastRow="0" w:noHBand="0" w:noVBand="1" w:val="04A0"/>
+      </w:tblPr>
+      <w:tblGrid>
+        <w:gridCol w:w="9072"/>
+      </w:tblGrid>
+      <w:tr>
+        <w:tc>
+          <w:tcPr>
+            <w:tcW w:type="dxa" w:w="9072"/>
+            <w:shd w:val="clear" w:color="auto" w:fill="F8FAFC"/>
+            <w:tcBorders>
+              <w:top w:val="none" w:sz="6" w:color="auto"/>
+              <w:bottom w:val="none" w:sz="6" w:color="auto"/>
+              <w:left w:val="single" w:sz="12" w:color="003B71"/>
+              <w:right w:val="none" w:sz="6" w:color="auto"/>
+            </w:tcBorders>
+          </w:tcPr>
+          <w:p>
+            <w:pPr>
+              <w:spacing w:before="60" w:after="60"/>
+              <w:ind w:left="142"/>
+            </w:pPr>
+            <w:r>
+              <w:rPr>
+                <w:rFonts w:ascii="Calibri" w:hAnsi="Calibri"/>
+                <w:b/>
+                <w:i w:val="0"/>
+                <w:color w:val="003B71"/>
+                <w:sz w:val="17"/>
+              </w:rPr>
+              <w:t xml:space="preserve">Strategy  </w:t>
+            </w:r>
+            <w:r>
+              <w:rPr>
+                <w:rFonts w:ascii="Calibri" w:hAnsi="Calibri"/>
+                <w:b w:val="0"/>
+                <w:i w:val="0"/>
+                <w:color w:val="334155"/>
+                <w:sz w:val="17"/>
+              </w:rPr>
+              <w:t>Đẩy mạnh hoạt động Medical Rep tại các bệnh viện nhi và phòng khám nhi khoa với danh mục kháng sinh phổ rộng (amoxicillin-clavulanate, cephalosporin) và acyclovir — nhấn mạnh vai trò điều trị sớm để ngăn biến chứng. Cân nhắc phát hành tài liệu KOL/y văn hỗ trợ bác sĩ nhi về phác đồ xử lý biến chứng thủy đậu nhằm tăng nhận diện thương hiệu Davipharm trong phân khúc này.</w:t>
+            </w:r>
+          </w:p>
+        </w:tc>
+      </w:tr>
+    </w:tbl>
+    <w:p>
+      <w:pPr>
+        <w:spacing w:before="40" w:after="120"/>
+      </w:pPr>
     </w:p>
     <w:tbl>
       <w:tblPr>
@@ -2687,7 +3343,7 @@
                 <w:color w:val="111827"/>
                 <w:sz w:val="18"/>
               </w:rPr>
-              <w:t>Đàm phán listing levothyroxine/canxi vào danh mục đấu thầu BV Nội tiết TW, Bạch Mai</w:t>
+              <w:t>Triển khai chiến dịch marketing combo "Active 50+" cho canxi, vitamin D, omega-3</w:t>
             </w:r>
           </w:p>
         </w:tc>
@@ -2715,7 +3371,7 @@
                 <w:color w:val="003B71"/>
                 <w:sz w:val="17"/>
               </w:rPr>
-              <w:t>Sales</w:t>
+              <w:t>Marketing</w:t>
             </w:r>
           </w:p>
         </w:tc>
@@ -2743,7 +3399,7 @@
                 <w:color w:val="6B7280"/>
                 <w:sz w:val="17"/>
               </w:rPr>
-              <w:t>Du lịch y tế tuyến giáp tăng</w:t>
+              <w:t>Xu hướng dinh dưỡng người cao tuổi 50+</w:t>
             </w:r>
           </w:p>
         </w:tc>
@@ -2822,7 +3478,7 @@
                 <w:color w:val="111827"/>
                 <w:sz w:val="18"/>
               </w:rPr>
-              <w:t>Rà soát danh mục R&amp;D: xác nhận khả thi sản xuất Levetiracetam trong 30 ngày</w:t>
+              <w:t>Tăng cường Medical Rep tại bệnh viện nhi với kháng sinh và acyclovir mùa thủy đậu</w:t>
             </w:r>
           </w:p>
         </w:tc>
@@ -2850,7 +3506,7 @@
                 <w:color w:val="003B71"/>
                 <w:sz w:val="17"/>
               </w:rPr>
-              <w:t>RA</w:t>
+              <w:t>Sales</w:t>
             </w:r>
           </w:p>
         </w:tc>
@@ -2878,7 +3534,7 @@
                 <w:color w:val="6B7280"/>
                 <w:sz w:val="17"/>
               </w:rPr>
-              <w:t>Levetiracetam – tiềm năng Alzheimer</w:t>
+              <w:t>Biến chứng thủy đậu nghiêm trọng ở trẻ em</w:t>
             </w:r>
           </w:p>
         </w:tc>
@@ -2957,7 +3613,7 @@
                 <w:color w:val="111827"/>
                 <w:sz w:val="18"/>
               </w:rPr>
-              <w:t>Theo dõi thử nghiệm lâm sàng Levetiracetam/Alzheimer để chuẩn bị hồ sơ chỉ định bổ sung</w:t>
+              <w:t>Phát hành tài liệu KOL về phác đồ xử lý biến chứng thủy đậu cho bác sĩ nhi</w:t>
             </w:r>
           </w:p>
         </w:tc>
@@ -2985,7 +3641,7 @@
                 <w:color w:val="003B71"/>
                 <w:sz w:val="17"/>
               </w:rPr>
-              <w:t>Strategy</w:t>
+              <w:t>Marketing</w:t>
             </w:r>
           </w:p>
         </w:tc>
@@ -3013,7 +3669,7 @@
                 <w:color w:val="6B7280"/>
                 <w:sz w:val="17"/>
               </w:rPr>
-              <w:t>Levetiracetam – tiềm năng Alzheimer</w:t>
+              <w:t>Biến chứng thủy đậu nghiêm trọng ở trẻ em</w:t>
             </w:r>
           </w:p>
         </w:tc>
@@ -3092,7 +3748,7 @@
                 <w:color w:val="111827"/>
                 <w:sz w:val="18"/>
               </w:rPr>
-              <w:t>Đánh giá phát triển SKU OTC chiết xuất diếp cá cho kênh Long Châu, Pharmacity</w:t>
+              <w:t>Soạn và phân phối tài liệu "Dùng thuốc chống đông an toàn" qua nhà thuốc và bác sĩ</w:t>
             </w:r>
           </w:p>
         </w:tc>
@@ -3148,7 +3804,7 @@
                 <w:color w:val="6B7280"/>
                 <w:sz w:val="17"/>
               </w:rPr>
-              <w:t>Xu hướng thảo dược diếp cá</w:t>
+              <w:t>Tương tác TPCN – thuốc chống đông máu</w:t>
             </w:r>
           </w:p>
         </w:tc>
@@ -3176,7 +3832,139 @@
                 <w:color w:val="D97706"/>
                 <w:sz w:val="17"/>
               </w:rPr>
-              <w:t>🟡 Trung&lt;/td</w:t>
+              <w:t>🟡 Trung</w:t>
+            </w:r>
+          </w:p>
+        </w:tc>
+      </w:tr>
+      <w:tr>
+        <w:tc>
+          <w:tcPr>
+            <w:tcW w:type="dxa" w:w="454"/>
+            <w:shd w:val="clear" w:color="auto" w:fill="DCFCE7"/>
+            <w:tcBorders>
+              <w:top w:val="none" w:sz="6" w:color="auto"/>
+              <w:bottom w:val="none" w:sz="6" w:color="auto"/>
+              <w:left w:val="none" w:sz="6" w:color="auto"/>
+              <w:right w:val="none" w:sz="6" w:color="auto"/>
+            </w:tcBorders>
+          </w:tcPr>
+          <w:p>
+            <w:pPr>
+              <w:spacing w:before="100" w:after="100"/>
+              <w:jc w:val="center"/>
+            </w:pPr>
+            <w:r>
+              <w:t>🟢</w:t>
+            </w:r>
+          </w:p>
+        </w:tc>
+        <w:tc>
+          <w:tcPr>
+            <w:tcW w:type="dxa" w:w="4422"/>
+            <w:shd w:val="clear" w:color="auto" w:fill="FFFFFF"/>
+            <w:tcBorders>
+              <w:top w:val="none" w:sz="6" w:color="auto"/>
+              <w:bottom w:val="none" w:sz="6" w:color="auto"/>
+              <w:left w:val="none" w:sz="6" w:color="auto"/>
+              <w:right w:val="none" w:sz="6" w:color="auto"/>
+            </w:tcBorders>
+          </w:tcPr>
+          <w:p>
+            <w:pPr>
+              <w:spacing w:before="80" w:after="80"/>
+              <w:ind w:left="85"/>
+            </w:pPr>
+            <w:r>
+              <w:rPr>
+                <w:rFonts w:ascii="Calibri" w:hAnsi="Calibri"/>
+                <w:b/>
+                <w:i w:val="0"/>
+                <w:color w:val="111827"/>
+                <w:sz w:val="18"/>
+              </w:rPr>
+              <w:t>&lt;span class="</w:t>
+            </w:r>
+          </w:p>
+        </w:tc>
+        <w:tc>
+          <w:tcPr>
+            <w:tcW w:type="dxa" w:w="1417"/>
+            <w:shd w:val="clear" w:color="auto" w:fill="FFFFFF"/>
+            <w:tcBorders>
+              <w:top w:val="none" w:sz="6" w:color="auto"/>
+              <w:bottom w:val="none" w:sz="6" w:color="auto"/>
+              <w:left w:val="none" w:sz="6" w:color="auto"/>
+              <w:right w:val="none" w:sz="6" w:color="auto"/>
+            </w:tcBorders>
+          </w:tcPr>
+          <w:p>
+            <w:pPr>
+              <w:spacing w:before="80" w:after="80"/>
+              <w:jc w:val="center"/>
+            </w:pPr>
+            <w:r>
+              <w:rPr>
+                <w:rFonts w:ascii="Calibri" w:hAnsi="Calibri"/>
+                <w:b w:val="0"/>
+                <w:i w:val="0"/>
+                <w:color w:val="003B71"/>
+                <w:sz w:val="17"/>
+              </w:rPr>
+            </w:r>
+          </w:p>
+        </w:tc>
+        <w:tc>
+          <w:tcPr>
+            <w:tcW w:type="dxa" w:w="1134"/>
+            <w:shd w:val="clear" w:color="auto" w:fill="FFFFFF"/>
+            <w:tcBorders>
+              <w:top w:val="none" w:sz="6" w:color="auto"/>
+              <w:bottom w:val="none" w:sz="6" w:color="auto"/>
+              <w:left w:val="none" w:sz="6" w:color="auto"/>
+              <w:right w:val="none" w:sz="6" w:color="auto"/>
+            </w:tcBorders>
+          </w:tcPr>
+          <w:p>
+            <w:pPr>
+              <w:spacing w:before="80" w:after="80"/>
+              <w:jc w:val="center"/>
+            </w:pPr>
+            <w:r>
+              <w:rPr>
+                <w:rFonts w:ascii="Calibri" w:hAnsi="Calibri"/>
+                <w:b w:val="0"/>
+                <w:i w:val="0"/>
+                <w:color w:val="6B7280"/>
+                <w:sz w:val="17"/>
+              </w:rPr>
+            </w:r>
+          </w:p>
+        </w:tc>
+        <w:tc>
+          <w:tcPr>
+            <w:tcW w:type="dxa" w:w="1644"/>
+            <w:shd w:val="clear" w:color="auto" w:fill="DCFCE7"/>
+            <w:tcBorders>
+              <w:top w:val="none" w:sz="6" w:color="auto"/>
+              <w:bottom w:val="none" w:sz="6" w:color="auto"/>
+              <w:left w:val="none" w:sz="6" w:color="auto"/>
+              <w:right w:val="none" w:sz="6" w:color="auto"/>
+            </w:tcBorders>
+          </w:tcPr>
+          <w:p>
+            <w:pPr>
+              <w:spacing w:before="80" w:after="80"/>
+              <w:jc w:val="center"/>
+            </w:pPr>
+            <w:r>
+              <w:rPr>
+                <w:rFonts w:ascii="Calibri" w:hAnsi="Calibri"/>
+                <w:b/>
+                <w:i w:val="0"/>
+                <w:color w:val="22C55E"/>
+                <w:sz w:val="17"/>
+              </w:rPr>
             </w:r>
           </w:p>
         </w:tc>

</xml_diff>

<commit_message>
Update report_vi.docx 2026-05-13 10:31
</commit_message>
<xml_diff>
--- a/report_vi.docx
+++ b/report_vi.docx
@@ -338,7 +338,7 @@
                 <w:color w:val="111827"/>
                 <w:sz w:val="20"/>
               </w:rPr>
-              <w:t>Tuần 11–17/05: Hai tín hiệu thị trường tích cực — nhu cầu nhi khoa mùa thủy đậu và phân khúc dinh dưỡng 50+ — mở ra cơ hội tăng trưởng ngắn và trung hạn cho danh mục OTC/ETC của Davipharm.</w:t>
+              <w:t>Tuần 11–17/05/2026: Bằng chứng khoa học về lão hóa tăng tốc và làn sóng ung thư ngày càng trẻ hóa xác nhận nhu cầu dài hạn cho toàn bộ danh mục bệnh mạn tính và ung thư của Davipharm, mở cơ hội listing tại kênh bệnh viện tư chuyên sâu.</w:t>
             </w:r>
           </w:p>
         </w:tc>
@@ -406,7 +406,7 @@
                 <w:color w:val="111827"/>
                 <w:sz w:val="17"/>
               </w:rPr>
-              <w:t>▸  Nhi khoa – Thủy đậu:Ca biến chứng nặng được truyền thông hóa tạo nhu cầu tức thời cho kháng sinh phổ rộng và acyclovir tại kênh bệnh viện nhi.</w:t>
+              <w:t>▸  Lão hóa tăng tốc ở 44 &amp; 60:Dữ liệu Stanford xác nhận hai phân khúc bệnh nhân ưu tiên (40–50 và 60+) — nền tảng khoa học mạnh để Marketing định vị "can thiệp sớm" cho RAVASTEL, EIMLER-10, PECHAUNOX và ZENTOGOUT.</w:t>
             </w:r>
           </w:p>
           <w:p>
@@ -422,7 +422,7 @@
                 <w:color w:val="111827"/>
                 <w:sz w:val="17"/>
               </w:rPr>
-              <w:t>▸  Dinh dưỡng 50+:Truyền thông y tế đang khuếch đại nhu cầu canxi, vitamin D và omega-3 cho người cao tuổi — phân khúc tăng trưởng nhanh chưa bị khai thác tối đa.</w:t>
+              <w:t>▸  Ung thư đại tràng — ~17.000 ca/năm:Bệnh nhân đa bệnh lý (tim mạch, tiêu hóa, huyết khối) tại bệnh viện tư lớn mở cơ hội cross-listing cho JIRACEK, PECHAUNOX và ZABALES trong phác đồ hỗ trợ peri-operative.</w:t>
             </w:r>
           </w:p>
           <w:p>
@@ -438,7 +438,7 @@
                 <w:color w:val="111827"/>
                 <w:sz w:val="17"/>
               </w:rPr>
-              <w:t>▸  An toàn thuốc – Tim mạch:Cảnh báo tương tác TPCN–chống đông tạo dư địa định vị Davipharm là thương hiệu "dược phẩm có trách nhiệm" trong kênh ETC tim mạch.</w:t>
+              <w:t>▸  Khoảng trống danh mục ung thư vú:Thị trường hormone therapy ung thư vú đang mở rộng nhưng Davipharm chưa có sản phẩm phù hợp — cần đánh giá M&amp;A/in-licensing aromatase inhibitors hoặc anti-estrogens.</w:t>
             </w:r>
           </w:p>
           <w:p>
@@ -454,23 +454,7 @@
                 <w:color w:val="111827"/>
                 <w:sz w:val="17"/>
               </w:rPr>
-              <w:t>▸  P1Sales Director chỉ đạo Medical Rep tăng tần suất ghé thăm bệnh viện nhi và phòng khám nhi trong tháng 5–6, ưu tiên push kháng sinh amoxicillin-clavulanate, cephalosporin và acyclovir.</w:t>
-            </w:r>
-          </w:p>
-          <w:p>
-            <w:pPr>
-              <w:spacing w:before="20" w:after="60"/>
-              <w:ind w:left="142"/>
-            </w:pPr>
-            <w:r>
-              <w:rPr>
-                <w:rFonts w:ascii="Calibri" w:hAnsi="Calibri"/>
-                <w:b w:val="0"/>
-                <w:i w:val="0"/>
-                <w:color w:val="111827"/>
-                <w:sz w:val="17"/>
-              </w:rPr>
-              <w:t>▸  P2Marketing Director đánh giá khả năng ra mắt combo "Active 50+" (canxi + vitamin D + omega-3) và lên kế hoạch truyền</w:t>
+              <w:t>▸  P1Marketing &amp; Medical Affairs triển khai chương trình KOL/CME khai thác dữ liệu Stanford</w:t>
             </w:r>
           </w:p>
         </w:tc>
@@ -514,23 +498,7 @@
                 <w:color w:val="0056D2"/>
                 <w:sz w:val="17"/>
               </w:rPr>
-              <w:t>→  P1Sales Director chỉ đạo Medical Rep tăng tần suất ghé thăm bệnh viện nhi và phòng khám nhi trong tháng 5–6, ưu tiên push kháng sinh amoxicillin-clavulanate, cephalosporin và acyclovir.</w:t>
-            </w:r>
-          </w:p>
-          <w:p>
-            <w:pPr>
-              <w:spacing w:before="20" w:after="60"/>
-              <w:ind w:left="142"/>
-            </w:pPr>
-            <w:r>
-              <w:rPr>
-                <w:rFonts w:ascii="Calibri" w:hAnsi="Calibri"/>
-                <w:b w:val="0"/>
-                <w:i w:val="0"/>
-                <w:color w:val="0056D2"/>
-                <w:sz w:val="17"/>
-              </w:rPr>
-              <w:t>→  P2Marketing Director đánh giá khả năng ra mắt combo "Active 50+" (canxi + vitamin D + omega-3) và lên kế hoạch truyền</w:t>
+              <w:t>→  P1Marketing &amp; Medical Affairs triển khai chương trình KOL/CME khai thác dữ liệu Stanford</w:t>
             </w:r>
           </w:p>
         </w:tc>
@@ -862,7 +830,7 @@
                 <w:color w:val="166534"/>
                 <w:sz w:val="22"/>
               </w:rPr>
-              <w:t>2</w:t>
+              <w:t>4</w:t>
             </w:r>
           </w:p>
         </w:tc>
@@ -890,7 +858,7 @@
                 <w:color w:val="374151"/>
                 <w:sz w:val="22"/>
               </w:rPr>
-              <w:t>1</w:t>
+              <w:t>5</w:t>
             </w:r>
           </w:p>
         </w:tc>
@@ -1905,6 +1873,942 @@
                 <w:color w:val="4338CA"/>
                 <w:sz w:val="15"/>
               </w:rPr>
+              <w:t>SK&amp;ĐS – DƯỢC MỸ PHẨM</w:t>
+            </w:r>
+          </w:p>
+        </w:tc>
+        <w:tc>
+          <w:tcPr>
+            <w:tcW w:type="dxa" w:w="4536"/>
+            <w:tcBorders>
+              <w:top w:val="none" w:sz="6" w:color="auto"/>
+              <w:bottom w:val="none" w:sz="6" w:color="auto"/>
+              <w:left w:val="none" w:sz="6" w:color="auto"/>
+              <w:right w:val="none" w:sz="6" w:color="auto"/>
+            </w:tcBorders>
+          </w:tcPr>
+          <w:p>
+            <w:pPr>
+              <w:spacing w:before="60" w:after="60"/>
+              <w:ind w:left="113"/>
+            </w:pPr>
+            <w:r>
+              <w:rPr>
+                <w:rFonts w:ascii="Calibri" w:hAnsi="Calibri"/>
+                <w:b/>
+                <w:i w:val="0"/>
+                <w:color w:val="111827"/>
+                <w:sz w:val="21"/>
+              </w:rPr>
+              <w:t>Bổ nhiệm Cục trưởng Cục An toàn Thực phẩm — Thay đổi nhân sự lãnh đạo quản lý ATTP</w:t>
+            </w:r>
+          </w:p>
+        </w:tc>
+      </w:tr>
+    </w:tbl>
+    <w:p>
+      <w:pPr>
+        <w:spacing w:before="40" w:after="40"/>
+        <w:ind w:left="170"/>
+      </w:pPr>
+      <w:r>
+        <w:rPr>
+          <w:rFonts w:ascii="Calibri" w:hAnsi="Calibri"/>
+          <w:b w:val="0"/>
+          <w:i/>
+          <w:color w:val="6B7280"/>
+          <w:sz w:val="18"/>
+        </w:rPr>
+        <w:t>Bộ trưởng Bộ Y tế Đào Hồng Lan trao quyết định bổ nhiệm Cục trưởng Cục An toàn Thực phẩm (VFA) — cơ quan quản lý thực phẩm chức năng, mỹ phẩm và một số sản phẩm y tế liên quan. Sự thay đổi nhân sự này có thể ảnh hưởng đến định hướng chính sách kiểm soát quảng cáo, cấp phép sản phẩm TPCN và mỹ phẩm trong thời gian tới.</w:t>
+      </w:r>
+    </w:p>
+    <w:p>
+      <w:pPr>
+        <w:spacing w:before="20" w:after="40"/>
+        <w:ind w:left="170"/>
+      </w:pPr>
+      <w:r>
+        <w:rPr>
+          <w:rFonts w:ascii="Calibri" w:hAnsi="Calibri"/>
+          <w:b/>
+          <w:i w:val="0"/>
+          <w:color w:val="374151"/>
+          <w:sz w:val="17"/>
+        </w:rPr>
+        <w:t>👀 Tác động gián tiếp — VFA không quản lý thuốc kê đơn của Davipharm, nhưng cần theo dõi nếu có thay đổi chính sách liên quan đến quảng cáo hoặc phân loại sản phẩm.</w:t>
+      </w:r>
+    </w:p>
+    <w:tbl>
+      <w:tblPr>
+        <w:tblStyle w:val="TableGrid"/>
+        <w:tblW w:type="auto" w:w="0"/>
+        <w:tblLook w:firstColumn="1" w:firstRow="1" w:lastColumn="0" w:lastRow="0" w:noHBand="0" w:noVBand="1" w:val="04A0"/>
+      </w:tblPr>
+      <w:tblGrid>
+        <w:gridCol w:w="9072"/>
+      </w:tblGrid>
+      <w:tr>
+        <w:tc>
+          <w:tcPr>
+            <w:tcW w:type="dxa" w:w="9072"/>
+            <w:shd w:val="clear" w:color="auto" w:fill="F8FAFC"/>
+            <w:tcBorders>
+              <w:top w:val="none" w:sz="6" w:color="auto"/>
+              <w:bottom w:val="none" w:sz="6" w:color="auto"/>
+              <w:left w:val="single" w:sz="12" w:color="003B71"/>
+              <w:right w:val="none" w:sz="6" w:color="auto"/>
+            </w:tcBorders>
+          </w:tcPr>
+          <w:p>
+            <w:pPr>
+              <w:spacing w:before="60" w:after="60"/>
+              <w:ind w:left="142"/>
+            </w:pPr>
+            <w:r>
+              <w:rPr>
+                <w:rFonts w:ascii="Calibri" w:hAnsi="Calibri"/>
+                <w:b/>
+                <w:i w:val="0"/>
+                <w:color w:val="003B71"/>
+                <w:sz w:val="17"/>
+              </w:rPr>
+              <w:t xml:space="preserve">Strategy  </w:t>
+            </w:r>
+            <w:r>
+              <w:rPr>
+                <w:rFonts w:ascii="Calibri" w:hAnsi="Calibri"/>
+                <w:b w:val="0"/>
+                <w:i w:val="0"/>
+                <w:color w:val="334155"/>
+                <w:sz w:val="17"/>
+              </w:rPr>
+              <w:t>Regulatory Affairs Team theo dõi định hướng mới của Cục trưởng VFA trong Q2/2025, đặc biệt nếu Davipharm có kế hoạch mở rộng sang phân khúc thực phẩm chức năng hoặc OTC liên quan đến ATTP; không cần hành động khẩn.</w:t>
+            </w:r>
+          </w:p>
+        </w:tc>
+      </w:tr>
+    </w:tbl>
+    <w:p>
+      <w:pPr>
+        <w:spacing w:before="40" w:after="120"/>
+      </w:pPr>
+    </w:p>
+    <w:tbl>
+      <w:tblPr>
+        <w:tblStyle w:val="TableGrid"/>
+        <w:tblW w:type="auto" w:w="0"/>
+        <w:jc w:val="left"/>
+        <w:tblLook w:firstColumn="1" w:firstRow="1" w:lastColumn="0" w:lastRow="0" w:noHBand="0" w:noVBand="1" w:val="04A0"/>
+      </w:tblPr>
+      <w:tblGrid>
+        <w:gridCol w:w="4536"/>
+        <w:gridCol w:w="4536"/>
+      </w:tblGrid>
+      <w:tr>
+        <w:tc>
+          <w:tcPr>
+            <w:tcW w:type="dxa" w:w="1984"/>
+            <w:shd w:val="clear" w:color="auto" w:fill="EEF2FF"/>
+            <w:tcBorders>
+              <w:top w:val="none" w:sz="6" w:color="auto"/>
+              <w:bottom w:val="none" w:sz="6" w:color="auto"/>
+              <w:left w:val="none" w:sz="6" w:color="auto"/>
+              <w:right w:val="none" w:sz="6" w:color="auto"/>
+            </w:tcBorders>
+          </w:tcPr>
+          <w:p>
+            <w:pPr>
+              <w:spacing w:before="80" w:after="80"/>
+              <w:ind w:left="85"/>
+            </w:pPr>
+            <w:r>
+              <w:rPr>
+                <w:rFonts w:ascii="Calibri" w:hAnsi="Calibri"/>
+                <w:b/>
+                <w:i w:val="0"/>
+                <w:color w:val="4338CA"/>
+                <w:sz w:val="15"/>
+              </w:rPr>
+              <w:t>SK&amp;ĐS – DƯỢC MỸ PHẨM</w:t>
+            </w:r>
+          </w:p>
+        </w:tc>
+        <w:tc>
+          <w:tcPr>
+            <w:tcW w:type="dxa" w:w="4536"/>
+            <w:tcBorders>
+              <w:top w:val="none" w:sz="6" w:color="auto"/>
+              <w:bottom w:val="none" w:sz="6" w:color="auto"/>
+              <w:left w:val="none" w:sz="6" w:color="auto"/>
+              <w:right w:val="none" w:sz="6" w:color="auto"/>
+            </w:tcBorders>
+          </w:tcPr>
+          <w:p>
+            <w:pPr>
+              <w:spacing w:before="60" w:after="60"/>
+              <w:ind w:left="113"/>
+            </w:pPr>
+            <w:r>
+              <w:rPr>
+                <w:rFonts w:ascii="Calibri" w:hAnsi="Calibri"/>
+                <w:b/>
+                <w:i w:val="0"/>
+                <w:color w:val="111827"/>
+                <w:sz w:val="21"/>
+              </w:rPr>
+              <w:t>Trẻ em mắc ung thư giai đoạn cuối do lạm dụng trà sữa — cảnh báo về lối sống và bệnh không lây nhiễm</w:t>
+            </w:r>
+          </w:p>
+        </w:tc>
+      </w:tr>
+    </w:tbl>
+    <w:p>
+      <w:pPr>
+        <w:spacing w:before="40" w:after="40"/>
+        <w:ind w:left="170"/>
+      </w:pPr>
+      <w:r>
+        <w:rPr>
+          <w:rFonts w:ascii="Calibri" w:hAnsi="Calibri"/>
+          <w:b w:val="0"/>
+          <w:i/>
+          <w:color w:val="6B7280"/>
+          <w:sz w:val="18"/>
+        </w:rPr>
+        <w:t>Một bé trai 12 tuổi tại Việt Nam được chẩn đoán ung thư giai đoạn cuối sau thời gian dài uống trà sữa thay nước lọc, làm dấy lên lo ngại công cộng về thói quen dinh dưỡng và nguy cơ bệnh không lây nhiễm ở giới trẻ. Bài viết không liên quan trực tiếp đến danh mục sản phẩm Davipharm nhưng phản ánh xu hướng gia tăng nhận thức về ung thư và nhu cầu điều trị ung thư tại Việt Nam.</w:t>
+      </w:r>
+    </w:p>
+    <w:p>
+      <w:pPr>
+        <w:spacing w:before="20" w:after="40"/>
+        <w:ind w:left="170"/>
+      </w:pPr>
+      <w:r>
+        <w:rPr>
+          <w:rFonts w:ascii="Calibri" w:hAnsi="Calibri"/>
+          <w:b/>
+          <w:i w:val="0"/>
+          <w:color w:val="374151"/>
+          <w:sz w:val="17"/>
+        </w:rPr>
+        <w:t>📊 Tin có tác động gián tiếp — xu hướng nhận thức ung thư tăng có thể hỗ trợ nhu cầu thị trường cho HYYR (Erlotinib) và LARRIVEY (Bicalutamide), nhưng chưa tạo tác động kinh doanh ngắn hạn rõ ràng.</w:t>
+      </w:r>
+    </w:p>
+    <w:tbl>
+      <w:tblPr>
+        <w:tblStyle w:val="TableGrid"/>
+        <w:tblW w:type="auto" w:w="0"/>
+        <w:tblLook w:firstColumn="1" w:firstRow="1" w:lastColumn="0" w:lastRow="0" w:noHBand="0" w:noVBand="1" w:val="04A0"/>
+      </w:tblPr>
+      <w:tblGrid>
+        <w:gridCol w:w="9072"/>
+      </w:tblGrid>
+      <w:tr>
+        <w:tc>
+          <w:tcPr>
+            <w:tcW w:type="dxa" w:w="9072"/>
+            <w:shd w:val="clear" w:color="auto" w:fill="F8FAFC"/>
+            <w:tcBorders>
+              <w:top w:val="none" w:sz="6" w:color="auto"/>
+              <w:bottom w:val="none" w:sz="6" w:color="auto"/>
+              <w:left w:val="single" w:sz="12" w:color="003B71"/>
+              <w:right w:val="none" w:sz="6" w:color="auto"/>
+            </w:tcBorders>
+          </w:tcPr>
+          <w:p>
+            <w:pPr>
+              <w:spacing w:before="60" w:after="60"/>
+              <w:ind w:left="142"/>
+            </w:pPr>
+            <w:r>
+              <w:rPr>
+                <w:rFonts w:ascii="Calibri" w:hAnsi="Calibri"/>
+                <w:b/>
+                <w:i w:val="0"/>
+                <w:color w:val="003B71"/>
+                <w:sz w:val="17"/>
+              </w:rPr>
+              <w:t xml:space="preserve">Strategy  </w:t>
+            </w:r>
+            <w:r>
+              <w:rPr>
+                <w:rFonts w:ascii="Calibri" w:hAnsi="Calibri"/>
+                <w:b w:val="0"/>
+                <w:i w:val="0"/>
+                <w:color w:val="334155"/>
+                <w:sz w:val="17"/>
+              </w:rPr>
+              <w:t>Team Oncology theo dõi xu hướng truyền thông về ung thư để xây dựng tài liệu giáo dục HCP (healthcare professional) liên quan đến HYYR và LARRIVEY; không cần hành động khẩn cấp, ưu tiên thấp trong chu kỳ báo cáo này.</w:t>
+            </w:r>
+          </w:p>
+        </w:tc>
+      </w:tr>
+    </w:tbl>
+    <w:p>
+      <w:pPr>
+        <w:spacing w:before="40" w:after="120"/>
+      </w:pPr>
+    </w:p>
+    <w:tbl>
+      <w:tblPr>
+        <w:tblStyle w:val="TableGrid"/>
+        <w:tblW w:type="auto" w:w="0"/>
+        <w:jc w:val="left"/>
+        <w:tblLook w:firstColumn="1" w:firstRow="1" w:lastColumn="0" w:lastRow="0" w:noHBand="0" w:noVBand="1" w:val="04A0"/>
+      </w:tblPr>
+      <w:tblGrid>
+        <w:gridCol w:w="4536"/>
+        <w:gridCol w:w="4536"/>
+      </w:tblGrid>
+      <w:tr>
+        <w:tc>
+          <w:tcPr>
+            <w:tcW w:type="dxa" w:w="1984"/>
+            <w:shd w:val="clear" w:color="auto" w:fill="EEF2FF"/>
+            <w:tcBorders>
+              <w:top w:val="none" w:sz="6" w:color="auto"/>
+              <w:bottom w:val="none" w:sz="6" w:color="auto"/>
+              <w:left w:val="none" w:sz="6" w:color="auto"/>
+              <w:right w:val="none" w:sz="6" w:color="auto"/>
+            </w:tcBorders>
+          </w:tcPr>
+          <w:p>
+            <w:pPr>
+              <w:spacing w:before="80" w:after="80"/>
+              <w:ind w:left="85"/>
+            </w:pPr>
+            <w:r>
+              <w:rPr>
+                <w:rFonts w:ascii="Calibri" w:hAnsi="Calibri"/>
+                <w:b/>
+                <w:i w:val="0"/>
+                <w:color w:val="4338CA"/>
+                <w:sz w:val="15"/>
+              </w:rPr>
+              <w:t>VNEXPRESS – SỨC KHỎE</w:t>
+            </w:r>
+          </w:p>
+        </w:tc>
+        <w:tc>
+          <w:tcPr>
+            <w:tcW w:type="dxa" w:w="4536"/>
+            <w:tcBorders>
+              <w:top w:val="none" w:sz="6" w:color="auto"/>
+              <w:bottom w:val="none" w:sz="6" w:color="auto"/>
+              <w:left w:val="none" w:sz="6" w:color="auto"/>
+              <w:right w:val="none" w:sz="6" w:color="auto"/>
+            </w:tcBorders>
+          </w:tcPr>
+          <w:p>
+            <w:pPr>
+              <w:spacing w:before="60" w:after="60"/>
+              <w:ind w:left="113"/>
+            </w:pPr>
+            <w:r>
+              <w:rPr>
+                <w:rFonts w:ascii="Calibri" w:hAnsi="Calibri"/>
+                <w:b/>
+                <w:i w:val="0"/>
+                <w:color w:val="111827"/>
+                <w:sz w:val="21"/>
+              </w:rPr>
+              <w:t>Lão hóa tăng tốc ở mốc 44 &amp; 60 tuổi — Cơ hội mở rộng danh mục tim mạch, đái tháo đường, gout</w:t>
+            </w:r>
+          </w:p>
+        </w:tc>
+      </w:tr>
+    </w:tbl>
+    <w:p>
+      <w:pPr>
+        <w:spacing w:before="40" w:after="40"/>
+        <w:ind w:left="170"/>
+      </w:pPr>
+      <w:r>
+        <w:rPr>
+          <w:rFonts w:ascii="Calibri" w:hAnsi="Calibri"/>
+          <w:b w:val="0"/>
+          <w:i/>
+          <w:color w:val="6B7280"/>
+          <w:sz w:val="18"/>
+        </w:rPr>
+        <w:t>Nghiên cứu Stanford xác nhận lão hóa tăng tốc đột ngột ở tuổi ~44 (chuyển hóa, viêm nền, nội tiết) và ~60 (tim mạch, thận, glucose), tạo ra hai "điểm nóng" bệnh mạn tính rõ ràng theo độ tuổi. Điều này trực tiếp củng cố nhu cầu dài hạn cho các nhóm thuốc cốt lõi của Davipharm gồm tim mạch (PECHAUNOX, RAVASTEL, ZABALES), đái tháo đường (EIMLER-10, ZLATKO), gout (ZENTOGOUT, MAGRAX) và giảm đau (COXTONE).</w:t>
+      </w:r>
+    </w:p>
+    <w:p>
+      <w:pPr>
+        <w:spacing w:before="20" w:after="40"/>
+        <w:ind w:left="170"/>
+      </w:pPr>
+      <w:r>
+        <w:rPr>
+          <w:rFonts w:ascii="Calibri" w:hAnsi="Calibri"/>
+          <w:b/>
+          <w:i w:val="0"/>
+          <w:color w:val="166534"/>
+          <w:sz w:val="17"/>
+        </w:rPr>
+        <w:t>🟢 Bằng chứng khoa học quốc tế xác nhận hai phân khúc bệnh nhân trọng điểm (40–50 và 60+) — cơ sở để Marketing team xây dựng thông điệp "phòng ngừa chủ động" cho toàn bộ danh mục bệnh mạn tính của Davipharm.</w:t>
+      </w:r>
+    </w:p>
+    <w:tbl>
+      <w:tblPr>
+        <w:tblStyle w:val="TableGrid"/>
+        <w:tblW w:type="auto" w:w="0"/>
+        <w:tblLook w:firstColumn="1" w:firstRow="1" w:lastColumn="0" w:lastRow="0" w:noHBand="0" w:noVBand="1" w:val="04A0"/>
+      </w:tblPr>
+      <w:tblGrid>
+        <w:gridCol w:w="9072"/>
+      </w:tblGrid>
+      <w:tr>
+        <w:tc>
+          <w:tcPr>
+            <w:tcW w:type="dxa" w:w="9072"/>
+            <w:shd w:val="clear" w:color="auto" w:fill="F8FAFC"/>
+            <w:tcBorders>
+              <w:top w:val="none" w:sz="6" w:color="auto"/>
+              <w:bottom w:val="none" w:sz="6" w:color="auto"/>
+              <w:left w:val="single" w:sz="12" w:color="003B71"/>
+              <w:right w:val="none" w:sz="6" w:color="auto"/>
+            </w:tcBorders>
+          </w:tcPr>
+          <w:p>
+            <w:pPr>
+              <w:spacing w:before="60" w:after="60"/>
+              <w:ind w:left="142"/>
+            </w:pPr>
+            <w:r>
+              <w:rPr>
+                <w:rFonts w:ascii="Calibri" w:hAnsi="Calibri"/>
+                <w:b/>
+                <w:i w:val="0"/>
+                <w:color w:val="003B71"/>
+                <w:sz w:val="17"/>
+              </w:rPr>
+              <w:t xml:space="preserve">Strategy  </w:t>
+            </w:r>
+            <w:r>
+              <w:rPr>
+                <w:rFonts w:ascii="Calibri" w:hAnsi="Calibri"/>
+                <w:b w:val="0"/>
+                <w:i w:val="0"/>
+                <w:color w:val="334155"/>
+                <w:sz w:val="17"/>
+              </w:rPr>
+              <w:t>Marketing &amp; Medical Affairs team cần phát triển tài liệu KOL/CME khai thác dữ liệu Stanford này để định vị chiến lược "can thiệp sớm ở mốc 40+" — ưu tiên RAVASTEL (kiểm soát LDL), EIMLER-10 (bảo vệ thận/tim), ZENTOGOUT (kiểm soát uric acid) và PECHAUNOX (huyết áp) trong Q3/2025; đồng thời phối hợp Sales team mở rộng detailing tại phân khúc phòng khám nội tiết và tim mạch cho nhóm bệnh nhân 40–65 tuổi.</w:t>
+            </w:r>
+          </w:p>
+        </w:tc>
+      </w:tr>
+    </w:tbl>
+    <w:p>
+      <w:pPr>
+        <w:spacing w:before="40" w:after="120"/>
+      </w:pPr>
+    </w:p>
+    <w:tbl>
+      <w:tblPr>
+        <w:tblStyle w:val="TableGrid"/>
+        <w:tblW w:type="auto" w:w="0"/>
+        <w:jc w:val="left"/>
+        <w:tblLook w:firstColumn="1" w:firstRow="1" w:lastColumn="0" w:lastRow="0" w:noHBand="0" w:noVBand="1" w:val="04A0"/>
+      </w:tblPr>
+      <w:tblGrid>
+        <w:gridCol w:w="4536"/>
+        <w:gridCol w:w="4536"/>
+      </w:tblGrid>
+      <w:tr>
+        <w:tc>
+          <w:tcPr>
+            <w:tcW w:type="dxa" w:w="1984"/>
+            <w:shd w:val="clear" w:color="auto" w:fill="EEF2FF"/>
+            <w:tcBorders>
+              <w:top w:val="none" w:sz="6" w:color="auto"/>
+              <w:bottom w:val="none" w:sz="6" w:color="auto"/>
+              <w:left w:val="none" w:sz="6" w:color="auto"/>
+              <w:right w:val="none" w:sz="6" w:color="auto"/>
+            </w:tcBorders>
+          </w:tcPr>
+          <w:p>
+            <w:pPr>
+              <w:spacing w:before="80" w:after="80"/>
+              <w:ind w:left="85"/>
+            </w:pPr>
+            <w:r>
+              <w:rPr>
+                <w:rFonts w:ascii="Calibri" w:hAnsi="Calibri"/>
+                <w:b/>
+                <w:i w:val="0"/>
+                <w:color w:val="4338CA"/>
+                <w:sz w:val="15"/>
+              </w:rPr>
+              <w:t>VNEXPRESS – SỨC KHỎE</w:t>
+            </w:r>
+          </w:p>
+        </w:tc>
+        <w:tc>
+          <w:tcPr>
+            <w:tcW w:type="dxa" w:w="4536"/>
+            <w:tcBorders>
+              <w:top w:val="none" w:sz="6" w:color="auto"/>
+              <w:bottom w:val="none" w:sz="6" w:color="auto"/>
+              <w:left w:val="none" w:sz="6" w:color="auto"/>
+              <w:right w:val="none" w:sz="6" w:color="auto"/>
+            </w:tcBorders>
+          </w:tcPr>
+          <w:p>
+            <w:pPr>
+              <w:spacing w:before="60" w:after="60"/>
+              <w:ind w:left="113"/>
+            </w:pPr>
+            <w:r>
+              <w:rPr>
+                <w:rFonts w:ascii="Calibri" w:hAnsi="Calibri"/>
+                <w:b/>
+                <w:i w:val="0"/>
+                <w:color w:val="111827"/>
+                <w:sz w:val="21"/>
+              </w:rPr>
+              <w:t>Tổng quan ung thư tụy: Cơ hội cho danh mục ung thư Davipharm (HYYR – Erlotinib)</w:t>
+            </w:r>
+          </w:p>
+        </w:tc>
+      </w:tr>
+    </w:tbl>
+    <w:p>
+      <w:pPr>
+        <w:spacing w:before="40" w:after="40"/>
+        <w:ind w:left="170"/>
+      </w:pPr>
+      <w:r>
+        <w:rPr>
+          <w:rFonts w:ascii="Calibri" w:hAnsi="Calibri"/>
+          <w:b w:val="0"/>
+          <w:i/>
+          <w:color w:val="6B7280"/>
+          <w:sz w:val="18"/>
+        </w:rPr>
+        <w:t>Bài cẩm nang của VnExpress phổ biến kiến thức về ung thư tụy — loại ung thư có tiên lượng xấu, ít triệu chứng sớm và nhu cầu điều trị ung thư tiêu hóa ngày càng tăng tại Việt Nam. Mặc dù Erlotinib (HYYR) có chỉ định trong ung thư phổi và tụy, nội dung này phản ánh xu hướng nâng cao nhận thức bệnh lý ung thư đường tiêu hóa — phân khúc mà danh mục ung thư Davipharm có thể khai thác.</w:t>
+      </w:r>
+    </w:p>
+    <w:p>
+      <w:pPr>
+        <w:spacing w:before="20" w:after="40"/>
+        <w:ind w:left="170"/>
+      </w:pPr>
+      <w:r>
+        <w:rPr>
+          <w:rFonts w:ascii="Calibri" w:hAnsi="Calibri"/>
+          <w:b/>
+          <w:i w:val="0"/>
+          <w:color w:val="374151"/>
+          <w:sz w:val="17"/>
+        </w:rPr>
+        <w:t>📊 Tín hiệu nhận thức thị trường ở mức nền — chưa tạo tác động doanh số ngay, nhưng là cơ sở để team Oncology xây dựng nội dung truyền thông khoa học cho HYYR trong chỉ định ung thư tụy.</w:t>
+      </w:r>
+    </w:p>
+    <w:tbl>
+      <w:tblPr>
+        <w:tblStyle w:val="TableGrid"/>
+        <w:tblW w:type="auto" w:w="0"/>
+        <w:tblLook w:firstColumn="1" w:firstRow="1" w:lastColumn="0" w:lastRow="0" w:noHBand="0" w:noVBand="1" w:val="04A0"/>
+      </w:tblPr>
+      <w:tblGrid>
+        <w:gridCol w:w="9072"/>
+      </w:tblGrid>
+      <w:tr>
+        <w:tc>
+          <w:tcPr>
+            <w:tcW w:type="dxa" w:w="9072"/>
+            <w:shd w:val="clear" w:color="auto" w:fill="F8FAFC"/>
+            <w:tcBorders>
+              <w:top w:val="none" w:sz="6" w:color="auto"/>
+              <w:bottom w:val="none" w:sz="6" w:color="auto"/>
+              <w:left w:val="single" w:sz="12" w:color="003B71"/>
+              <w:right w:val="none" w:sz="6" w:color="auto"/>
+            </w:tcBorders>
+          </w:tcPr>
+          <w:p>
+            <w:pPr>
+              <w:spacing w:before="60" w:after="60"/>
+              <w:ind w:left="142"/>
+            </w:pPr>
+            <w:r>
+              <w:rPr>
+                <w:rFonts w:ascii="Calibri" w:hAnsi="Calibri"/>
+                <w:b/>
+                <w:i w:val="0"/>
+                <w:color w:val="003B71"/>
+                <w:sz w:val="17"/>
+              </w:rPr>
+              <w:t xml:space="preserve">Strategy  </w:t>
+            </w:r>
+            <w:r>
+              <w:rPr>
+                <w:rFonts w:ascii="Calibri" w:hAnsi="Calibri"/>
+                <w:b w:val="0"/>
+                <w:i w:val="0"/>
+                <w:color w:val="334155"/>
+                <w:sz w:val="17"/>
+              </w:rPr>
+              <w:t>Team Oncology phối hợp với Medical Affairs rà soát hồ sơ chỉ định của HYYR (Erlotinib) trong ung thư tụy giai đoạn tiến triển; xây dựng tài liệu hỗ trợ KOL/bác sĩ ung bướu tại các bệnh viện tuyến trung ương (K, Chợ Rẫy, Ung bướu TP.HCM) trong Q3/2025.</w:t>
+            </w:r>
+          </w:p>
+        </w:tc>
+      </w:tr>
+    </w:tbl>
+    <w:p>
+      <w:pPr>
+        <w:spacing w:before="40" w:after="120"/>
+      </w:pPr>
+    </w:p>
+    <w:tbl>
+      <w:tblPr>
+        <w:tblStyle w:val="TableGrid"/>
+        <w:tblW w:type="auto" w:w="0"/>
+        <w:jc w:val="left"/>
+        <w:tblLook w:firstColumn="1" w:firstRow="1" w:lastColumn="0" w:lastRow="0" w:noHBand="0" w:noVBand="1" w:val="04A0"/>
+      </w:tblPr>
+      <w:tblGrid>
+        <w:gridCol w:w="4536"/>
+        <w:gridCol w:w="4536"/>
+      </w:tblGrid>
+      <w:tr>
+        <w:tc>
+          <w:tcPr>
+            <w:tcW w:type="dxa" w:w="1984"/>
+            <w:shd w:val="clear" w:color="auto" w:fill="EEF2FF"/>
+            <w:tcBorders>
+              <w:top w:val="none" w:sz="6" w:color="auto"/>
+              <w:bottom w:val="none" w:sz="6" w:color="auto"/>
+              <w:left w:val="none" w:sz="6" w:color="auto"/>
+              <w:right w:val="none" w:sz="6" w:color="auto"/>
+            </w:tcBorders>
+          </w:tcPr>
+          <w:p>
+            <w:pPr>
+              <w:spacing w:before="80" w:after="80"/>
+              <w:ind w:left="85"/>
+            </w:pPr>
+            <w:r>
+              <w:rPr>
+                <w:rFonts w:ascii="Calibri" w:hAnsi="Calibri"/>
+                <w:b/>
+                <w:i w:val="0"/>
+                <w:color w:val="4338CA"/>
+                <w:sz w:val="15"/>
+              </w:rPr>
+              <w:t>VNEXPRESS – SỨC KHỎE</w:t>
+            </w:r>
+          </w:p>
+        </w:tc>
+        <w:tc>
+          <w:tcPr>
+            <w:tcW w:type="dxa" w:w="4536"/>
+            <w:tcBorders>
+              <w:top w:val="none" w:sz="6" w:color="auto"/>
+              <w:bottom w:val="none" w:sz="6" w:color="auto"/>
+              <w:left w:val="none" w:sz="6" w:color="auto"/>
+              <w:right w:val="none" w:sz="6" w:color="auto"/>
+            </w:tcBorders>
+          </w:tcPr>
+          <w:p>
+            <w:pPr>
+              <w:spacing w:before="60" w:after="60"/>
+              <w:ind w:left="113"/>
+            </w:pPr>
+            <w:r>
+              <w:rPr>
+                <w:rFonts w:ascii="Calibri" w:hAnsi="Calibri"/>
+                <w:b/>
+                <w:i w:val="0"/>
+                <w:color w:val="111827"/>
+                <w:sz w:val="21"/>
+              </w:rPr>
+              <w:t>Ung thư đại tràng: ~17.000 ca mắc mới/năm tại Việt Nam — cơ hội thị trường cho phác đồ hỗ trợ điều trị</w:t>
+            </w:r>
+          </w:p>
+        </w:tc>
+      </w:tr>
+    </w:tbl>
+    <w:p>
+      <w:pPr>
+        <w:spacing w:before="40" w:after="40"/>
+        <w:ind w:left="170"/>
+      </w:pPr>
+      <w:r>
+        <w:rPr>
+          <w:rFonts w:ascii="Calibri" w:hAnsi="Calibri"/>
+          <w:b w:val="0"/>
+          <w:i/>
+          <w:color w:val="6B7280"/>
+          <w:sz w:val="18"/>
+        </w:rPr>
+        <w:t>Bệnh viện Tâm Anh ứng dụng robot Da Vinci Xi trong phẫu thuật ung thư đại tràng, phản ánh xu hướng nâng cấp năng lực điều trị ung thư tiêu hóa tại các bệnh viện tư lớn; theo Globocan 2022, Việt Nam ghi nhận 16.000–17.000 ca ung thư đại trực tràng mới và hơn 8.400 ca tử vong mỗi năm. Đây là phân khúc bệnh nhân nặng, đa bệnh lý (tim mạch, huyết khối, tiêu hóa) — tạo nhu cầu cao cho các thuốc hỗ trợ trước/sau phẫu thuật từ danh mục Davipharm.</w:t>
+      </w:r>
+    </w:p>
+    <w:p>
+      <w:pPr>
+        <w:spacing w:before="20" w:after="40"/>
+        <w:ind w:left="170"/>
+      </w:pPr>
+      <w:r>
+        <w:rPr>
+          <w:rFonts w:ascii="Calibri" w:hAnsi="Calibri"/>
+          <w:b/>
+          <w:i w:val="0"/>
+          <w:color w:val="166534"/>
+          <w:sz w:val="17"/>
+        </w:rPr>
+        <w:t>🟢 Nhóm bệnh nhân ung thư đại tràng đa bệnh lý mở cơ hội listing bổ sung cho JIRACEK (Esomeprazole), PECHAUNOX (Perindopril+Amlodipin), ZABALES (Clopidogrel) và LARRIVEY (Bicalutamide) tại kênh bệnh viện tư chuyên sâu.</w:t>
+      </w:r>
+    </w:p>
+    <w:tbl>
+      <w:tblPr>
+        <w:tblStyle w:val="TableGrid"/>
+        <w:tblW w:type="auto" w:w="0"/>
+        <w:tblLook w:firstColumn="1" w:firstRow="1" w:lastColumn="0" w:lastRow="0" w:noHBand="0" w:noVBand="1" w:val="04A0"/>
+      </w:tblPr>
+      <w:tblGrid>
+        <w:gridCol w:w="9072"/>
+      </w:tblGrid>
+      <w:tr>
+        <w:tc>
+          <w:tcPr>
+            <w:tcW w:type="dxa" w:w="9072"/>
+            <w:shd w:val="clear" w:color="auto" w:fill="F8FAFC"/>
+            <w:tcBorders>
+              <w:top w:val="none" w:sz="6" w:color="auto"/>
+              <w:bottom w:val="none" w:sz="6" w:color="auto"/>
+              <w:left w:val="single" w:sz="12" w:color="003B71"/>
+              <w:right w:val="none" w:sz="6" w:color="auto"/>
+            </w:tcBorders>
+          </w:tcPr>
+          <w:p>
+            <w:pPr>
+              <w:spacing w:before="60" w:after="60"/>
+              <w:ind w:left="142"/>
+            </w:pPr>
+            <w:r>
+              <w:rPr>
+                <w:rFonts w:ascii="Calibri" w:hAnsi="Calibri"/>
+                <w:b/>
+                <w:i w:val="0"/>
+                <w:color w:val="003B71"/>
+                <w:sz w:val="17"/>
+              </w:rPr>
+              <w:t xml:space="preserve">Strategy  </w:t>
+            </w:r>
+            <w:r>
+              <w:rPr>
+                <w:rFonts w:ascii="Calibri" w:hAnsi="Calibri"/>
+                <w:b w:val="0"/>
+                <w:i w:val="0"/>
+                <w:color w:val="334155"/>
+                <w:sz w:val="17"/>
+              </w:rPr>
+              <w:t>Team Medical Affairs phối hợp với team ETC Sales xây dựng gói tài liệu khoa học nhắm vào phác đồ hỗ trợ peri-operative tại các bệnh viện tư có khoa ung bướu–ngoại tiêu hóa (Tâm Anh, Vinmec, FV), ưu tiên JIRACEK (bảo vệ niêm mạc sau phẫu thuật), PECHAUNOX/ZABALES (kiểm soát tim mạch–huyết khối đồng mắc) — đề xuất kế hoạch listing Q3/2025.</w:t>
+            </w:r>
+          </w:p>
+        </w:tc>
+      </w:tr>
+    </w:tbl>
+    <w:p>
+      <w:pPr>
+        <w:spacing w:before="40" w:after="120"/>
+      </w:pPr>
+    </w:p>
+    <w:tbl>
+      <w:tblPr>
+        <w:tblStyle w:val="TableGrid"/>
+        <w:tblW w:type="auto" w:w="0"/>
+        <w:jc w:val="left"/>
+        <w:tblLook w:firstColumn="1" w:firstRow="1" w:lastColumn="0" w:lastRow="0" w:noHBand="0" w:noVBand="1" w:val="04A0"/>
+      </w:tblPr>
+      <w:tblGrid>
+        <w:gridCol w:w="4536"/>
+        <w:gridCol w:w="4536"/>
+      </w:tblGrid>
+      <w:tr>
+        <w:tc>
+          <w:tcPr>
+            <w:tcW w:type="dxa" w:w="1984"/>
+            <w:shd w:val="clear" w:color="auto" w:fill="EEF2FF"/>
+            <w:tcBorders>
+              <w:top w:val="none" w:sz="6" w:color="auto"/>
+              <w:bottom w:val="none" w:sz="6" w:color="auto"/>
+              <w:left w:val="none" w:sz="6" w:color="auto"/>
+              <w:right w:val="none" w:sz="6" w:color="auto"/>
+            </w:tcBorders>
+          </w:tcPr>
+          <w:p>
+            <w:pPr>
+              <w:spacing w:before="80" w:after="80"/>
+              <w:ind w:left="85"/>
+            </w:pPr>
+            <w:r>
+              <w:rPr>
+                <w:rFonts w:ascii="Calibri" w:hAnsi="Calibri"/>
+                <w:b/>
+                <w:i w:val="0"/>
+                <w:color w:val="4338CA"/>
+                <w:sz w:val="15"/>
+              </w:rPr>
+              <w:t>VNEXPRESS – SỨC KHỎE</w:t>
+            </w:r>
+          </w:p>
+        </w:tc>
+        <w:tc>
+          <w:tcPr>
+            <w:tcW w:type="dxa" w:w="4536"/>
+            <w:tcBorders>
+              <w:top w:val="none" w:sz="6" w:color="auto"/>
+              <w:bottom w:val="none" w:sz="6" w:color="auto"/>
+              <w:left w:val="none" w:sz="6" w:color="auto"/>
+              <w:right w:val="none" w:sz="6" w:color="auto"/>
+            </w:tcBorders>
+          </w:tcPr>
+          <w:p>
+            <w:pPr>
+              <w:spacing w:before="60" w:after="60"/>
+              <w:ind w:left="113"/>
+            </w:pPr>
+            <w:r>
+              <w:rPr>
+                <w:rFonts w:ascii="Calibri" w:hAnsi="Calibri"/>
+                <w:b/>
+                <w:i w:val="0"/>
+                <w:color w:val="111827"/>
+                <w:sz w:val="21"/>
+              </w:rPr>
+              <w:t>Xu hướng trẻ hóa ung thư vú &amp; phác đồ đa mô thức: Cơ hội cho LARRIVEY (Bicalutamide) và danh mục ung thư</w:t>
+            </w:r>
+          </w:p>
+        </w:tc>
+      </w:tr>
+    </w:tbl>
+    <w:p>
+      <w:pPr>
+        <w:spacing w:before="40" w:after="40"/>
+        <w:ind w:left="170"/>
+      </w:pPr>
+      <w:r>
+        <w:rPr>
+          <w:rFonts w:ascii="Calibri" w:hAnsi="Calibri"/>
+          <w:b w:val="0"/>
+          <w:i/>
+          <w:color w:val="6B7280"/>
+          <w:sz w:val="18"/>
+        </w:rPr>
+        <w:t>Bài viết từ chuyên gia BV Tâm Anh xác nhận ung thư vú có xu hướng trẻ hóa và điều trị đa mô thức (xạ trị, hóa trị, nội tiết) ngày càng phổ biến, kéo dài 5–10 năm; nhu cầu thuốc điều trị ung thư nội tiết tố tăng bền vững. Davipharm hiện có LARRIVEY (Bicalutamide) trong danh mục ung thư nhưng chưa có sản phẩm trực tiếp trong phân khúc ung thư vú nội tiết dương tính — đây là khoảng trống cần đánh giá.</w:t>
+      </w:r>
+    </w:p>
+    <w:p>
+      <w:pPr>
+        <w:spacing w:before="20" w:after="40"/>
+        <w:ind w:left="170"/>
+      </w:pPr>
+      <w:r>
+        <w:rPr>
+          <w:rFonts w:ascii="Calibri" w:hAnsi="Calibri"/>
+          <w:b/>
+          <w:i w:val="0"/>
+          <w:color w:val="374151"/>
+          <w:sz w:val="17"/>
+        </w:rPr>
+        <w:t>🔍 Tín hiệu theo dõi: thị trường ung thư vú nội tiết dương tính đang mở rộng nhưng Davipharm chưa có sản phẩm phù hợp để khai thác trực tiếp phân khúc này.</w:t>
+      </w:r>
+    </w:p>
+    <w:tbl>
+      <w:tblPr>
+        <w:tblStyle w:val="TableGrid"/>
+        <w:tblW w:type="auto" w:w="0"/>
+        <w:tblLook w:firstColumn="1" w:firstRow="1" w:lastColumn="0" w:lastRow="0" w:noHBand="0" w:noVBand="1" w:val="04A0"/>
+      </w:tblPr>
+      <w:tblGrid>
+        <w:gridCol w:w="9072"/>
+      </w:tblGrid>
+      <w:tr>
+        <w:tc>
+          <w:tcPr>
+            <w:tcW w:type="dxa" w:w="9072"/>
+            <w:shd w:val="clear" w:color="auto" w:fill="F8FAFC"/>
+            <w:tcBorders>
+              <w:top w:val="none" w:sz="6" w:color="auto"/>
+              <w:bottom w:val="none" w:sz="6" w:color="auto"/>
+              <w:left w:val="single" w:sz="12" w:color="003B71"/>
+              <w:right w:val="none" w:sz="6" w:color="auto"/>
+            </w:tcBorders>
+          </w:tcPr>
+          <w:p>
+            <w:pPr>
+              <w:spacing w:before="60" w:after="60"/>
+              <w:ind w:left="142"/>
+            </w:pPr>
+            <w:r>
+              <w:rPr>
+                <w:rFonts w:ascii="Calibri" w:hAnsi="Calibri"/>
+                <w:b/>
+                <w:i w:val="0"/>
+                <w:color w:val="003B71"/>
+                <w:sz w:val="17"/>
+              </w:rPr>
+              <w:t xml:space="preserve">Strategy  </w:t>
+            </w:r>
+            <w:r>
+              <w:rPr>
+                <w:rFonts w:ascii="Calibri" w:hAnsi="Calibri"/>
+                <w:b w:val="0"/>
+                <w:i w:val="0"/>
+                <w:color w:val="334155"/>
+                <w:sz w:val="17"/>
+              </w:rPr>
+              <w:t>Team Business Development &amp; Oncology phối hợp đánh giá khả năng mở rộng danh mục sang nhóm hormone therapy ung thư vú (aromatase inhibitors/anti-estrogens); đồng thời team Marketing có thể tăng cường định vị LARRIVEY trong các hội thảo ung thư để duy trì hiện diện thương hiệu trong phân khúc này. Đề xuất báo cáo đánh giá cơ hội lên BOD trong Q3/2025.</w:t>
+            </w:r>
+          </w:p>
+        </w:tc>
+      </w:tr>
+    </w:tbl>
+    <w:p>
+      <w:pPr>
+        <w:spacing w:before="40" w:after="120"/>
+      </w:pPr>
+    </w:p>
+    <w:tbl>
+      <w:tblPr>
+        <w:tblStyle w:val="TableGrid"/>
+        <w:tblW w:type="auto" w:w="0"/>
+        <w:jc w:val="left"/>
+        <w:tblLook w:firstColumn="1" w:firstRow="1" w:lastColumn="0" w:lastRow="0" w:noHBand="0" w:noVBand="1" w:val="04A0"/>
+      </w:tblPr>
+      <w:tblGrid>
+        <w:gridCol w:w="4536"/>
+        <w:gridCol w:w="4536"/>
+      </w:tblGrid>
+      <w:tr>
+        <w:tc>
+          <w:tcPr>
+            <w:tcW w:type="dxa" w:w="1984"/>
+            <w:shd w:val="clear" w:color="auto" w:fill="EEF2FF"/>
+            <w:tcBorders>
+              <w:top w:val="none" w:sz="6" w:color="auto"/>
+              <w:bottom w:val="none" w:sz="6" w:color="auto"/>
+              <w:left w:val="none" w:sz="6" w:color="auto"/>
+              <w:right w:val="none" w:sz="6" w:color="auto"/>
+            </w:tcBorders>
+          </w:tcPr>
+          <w:p>
+            <w:pPr>
+              <w:spacing w:before="80" w:after="80"/>
+              <w:ind w:left="85"/>
+            </w:pPr>
+            <w:r>
+              <w:rPr>
+                <w:rFonts w:ascii="Calibri" w:hAnsi="Calibri"/>
+                <w:b/>
+                <w:i w:val="0"/>
+                <w:color w:val="4338CA"/>
+                <w:sz w:val="15"/>
+              </w:rPr>
               <w:t>VIETNAMPLUS – SỨC KHỎE</w:t>
             </w:r>
           </w:p>
@@ -2527,7 +3431,7 @@
                 <w:color w:val="003B71"/>
                 <w:sz w:val="17"/>
               </w:rPr>
-              <w:t>Empagliflozin</w:t>
+              <w:t>EIMLER-10</w:t>
             </w:r>
           </w:p>
         </w:tc>
@@ -2548,7 +3452,7 @@
                 <w:color w:val="374151"/>
                 <w:sz w:val="17"/>
               </w:rPr>
-              <w:t>Tiểu đường / Suy tim</w:t>
+              <w:t>Empagliflozin 10mg</w:t>
             </w:r>
           </w:p>
         </w:tc>
@@ -2569,14 +3473,14 @@
                 <w:color w:val="374151"/>
                 <w:sz w:val="17"/>
               </w:rPr>
-              <w:t>Cơ hội cao</w:t>
+              <w:t>597,000đ/hộp</w:t>
             </w:r>
           </w:p>
         </w:tc>
         <w:tc>
           <w:tcPr>
             <w:tcW w:type="dxa" w:w="1247"/>
-            <w:shd w:val="clear" w:color="auto" w:fill="EFF6FF"/>
+            <w:shd w:val="clear" w:color="auto" w:fill="E7F9EE"/>
           </w:tcPr>
           <w:p>
             <w:pPr>
@@ -2588,10 +3492,10 @@
                 <w:rFonts w:ascii="Calibri" w:hAnsi="Calibri"/>
                 <w:b/>
                 <w:i w:val="0"/>
-                <w:color w:val="0056D2"/>
+                <w:color w:val="166534"/>
                 <w:sz w:val="17"/>
               </w:rPr>
-              <w:t>Ưu tiên thầu Nhóm 1</w:t>
+              <w:t>Cơ hội cao</w:t>
             </w:r>
           </w:p>
         </w:tc>
@@ -2612,6 +3516,7 @@
                 <w:color w:val="374151"/>
                 <w:sz w:val="17"/>
               </w:rPr>
+              <w:t>Ưu tiên thầu Nhóm 1 – đấu thầu TT 2026</w:t>
             </w:r>
           </w:p>
         </w:tc>
@@ -2634,7 +3539,7 @@
                 <w:color w:val="003B71"/>
                 <w:sz w:val="17"/>
               </w:rPr>
-              <w:t>Tadalafil</w:t>
+              <w:t>ZLATKO-50</w:t>
             </w:r>
           </w:p>
         </w:tc>
@@ -2655,7 +3560,7 @@
                 <w:color w:val="374151"/>
                 <w:sz w:val="17"/>
               </w:rPr>
-              <w:t>Nam khoa</w:t>
+              <w:t>Sitagliptin 50mg</w:t>
             </w:r>
           </w:p>
         </w:tc>
@@ -2676,14 +3581,14 @@
                 <w:color w:val="374151"/>
                 <w:sz w:val="17"/>
               </w:rPr>
-              <w:t>Cạnh tranh</w:t>
+              <w:t>217,500đ/hộp</w:t>
             </w:r>
           </w:p>
         </w:tc>
         <w:tc>
           <w:tcPr>
             <w:tcW w:type="dxa" w:w="1247"/>
-            <w:shd w:val="clear" w:color="auto" w:fill="EFF6FF"/>
+            <w:shd w:val="clear" w:color="auto" w:fill="FFF7ED"/>
           </w:tcPr>
           <w:p>
             <w:pPr>
@@ -2695,10 +3600,10 @@
                 <w:rFonts w:ascii="Calibri" w:hAnsi="Calibri"/>
                 <w:b/>
                 <w:i w:val="0"/>
-                <w:color w:val="0056D2"/>
+                <w:color w:val="D97706"/>
                 <w:sz w:val="17"/>
               </w:rPr>
-              <w:t>Theo dõi giá Sun Pharma</w:t>
+              <w:t>Cạnh tranh</w:t>
             </w:r>
           </w:p>
         </w:tc>
@@ -2719,6 +3624,7 @@
                 <w:color w:val="374151"/>
                 <w:sz w:val="17"/>
               </w:rPr>
+              <w:t>Theo dõi DPP-4 generic cạnh tranh</w:t>
             </w:r>
           </w:p>
         </w:tc>
@@ -2741,7 +3647,7 @@
                 <w:color w:val="003B71"/>
                 <w:sz w:val="17"/>
               </w:rPr>
-              <w:t>Dapoxetine</w:t>
+              <w:t>JANUS-60</w:t>
             </w:r>
           </w:p>
         </w:tc>
@@ -2762,7 +3668,7 @@
                 <w:color w:val="374151"/>
                 <w:sz w:val="17"/>
               </w:rPr>
-              <w:t>Nam khoa</w:t>
+              <w:t>Dapoxetine 60mg</w:t>
             </w:r>
           </w:p>
         </w:tc>
@@ -2783,7 +3689,7 @@
                 <w:color w:val="374151"/>
                 <w:sz w:val="17"/>
               </w:rPr>
-              <w:t>Ổn định</w:t>
+              <w:t>720,000đ/hộp</w:t>
             </w:r>
           </w:p>
         </w:tc>
@@ -2805,7 +3711,7 @@
                 <w:color w:val="0056D2"/>
                 <w:sz w:val="17"/>
               </w:rPr>
-              <w:t>Kiểm tra Long Châu listing</w:t>
+              <w:t>Ổn định</w:t>
             </w:r>
           </w:p>
         </w:tc>
@@ -2826,6 +3732,7 @@
                 <w:color w:val="374151"/>
                 <w:sz w:val="17"/>
               </w:rPr>
+              <w:t>Kiểm tra listing Long Châu / Pharmacity</w:t>
             </w:r>
           </w:p>
         </w:tc>
@@ -2848,7 +3755,7 @@
                 <w:color w:val="003B71"/>
                 <w:sz w:val="17"/>
               </w:rPr>
-              <w:t>Cytisine</w:t>
+              <w:t>TADALAFIL 20MG</w:t>
             </w:r>
           </w:p>
         </w:tc>
@@ -2869,7 +3776,7 @@
                 <w:color w:val="374151"/>
                 <w:sz w:val="17"/>
               </w:rPr>
-              <w:t>Cai thuốc lá</w:t>
+              <w:t>Tadalafil 20mg</w:t>
             </w:r>
           </w:p>
         </w:tc>
@@ -2890,14 +3797,14 @@
                 <w:color w:val="374151"/>
                 <w:sz w:val="17"/>
               </w:rPr>
-              <w:t>Pre-launch</w:t>
+              <w:t>42,000đ/viên</w:t>
             </w:r>
           </w:p>
         </w:tc>
         <w:tc>
           <w:tcPr>
             <w:tcW w:type="dxa" w:w="1247"/>
-            <w:shd w:val="clear" w:color="auto" w:fill="EFF6FF"/>
+            <w:shd w:val="clear" w:color="auto" w:fill="FFF7ED"/>
           </w:tcPr>
           <w:p>
             <w:pPr>
@@ -2909,10 +3816,10 @@
                 <w:rFonts w:ascii="Calibri" w:hAnsi="Calibri"/>
                 <w:b/>
                 <w:i w:val="0"/>
-                <w:color w:val="0056D2"/>
+                <w:color w:val="D97706"/>
                 <w:sz w:val="17"/>
               </w:rPr>
-              <w:t>Q4/2026 – Cơ hội vàng</w:t>
+              <w:t>Cạnh tranh</w:t>
             </w:r>
           </w:p>
         </w:tc>
@@ -2933,6 +3840,7 @@
                 <w:color w:val="374151"/>
                 <w:sz w:val="17"/>
               </w:rPr>
+              <w:t>Theo dõi giá Sun Pharma, Cipla generic</w:t>
             </w:r>
           </w:p>
         </w:tc>
@@ -2955,7 +3863,7 @@
                 <w:color w:val="003B71"/>
                 <w:sz w:val="17"/>
               </w:rPr>
-              <w:t>Metilone</w:t>
+              <w:t>DRYCHES</w:t>
             </w:r>
           </w:p>
         </w:tc>
@@ -2976,7 +3884,7 @@
                 <w:color w:val="374151"/>
                 <w:sz w:val="17"/>
               </w:rPr>
-              <w:t>Kháng viêm</w:t>
+              <w:t>Dutasteride 0.5mg</w:t>
             </w:r>
           </w:p>
         </w:tc>
@@ -2997,7 +3905,7 @@
                 <w:color w:val="374151"/>
                 <w:sz w:val="17"/>
               </w:rPr>
-              <w:t>Ổn định</w:t>
+              <w:t>378,000đ/hộp</w:t>
             </w:r>
           </w:p>
         </w:tc>
@@ -3019,7 +3927,7 @@
                 <w:color w:val="0056D2"/>
                 <w:sz w:val="17"/>
               </w:rPr>
-              <w:t>Duy trì kênh ETC</w:t>
+              <w:t>Cơ hội</w:t>
             </w:r>
           </w:p>
         </w:tc>
@@ -3040,6 +3948,1411 @@
                 <w:color w:val="374151"/>
                 <w:sz w:val="17"/>
               </w:rPr>
+              <w:t>BPH – thị trường còn ít cạnh tranh</w:t>
+            </w:r>
+          </w:p>
+        </w:tc>
+      </w:tr>
+      <w:tr>
+        <w:tc>
+          <w:tcPr>
+            <w:tcW w:type="dxa" w:w="1701"/>
+          </w:tcPr>
+          <w:p>
+            <w:pPr>
+              <w:spacing w:before="60" w:after="60"/>
+              <w:ind w:left="85"/>
+            </w:pPr>
+            <w:r>
+              <w:rPr>
+                <w:rFonts w:ascii="Calibri" w:hAnsi="Calibri"/>
+                <w:b/>
+                <w:i w:val="0"/>
+                <w:color w:val="003B71"/>
+                <w:sz w:val="17"/>
+              </w:rPr>
+              <w:t>PECHAUNOX 4/10</w:t>
+            </w:r>
+          </w:p>
+        </w:tc>
+        <w:tc>
+          <w:tcPr>
+            <w:tcW w:type="dxa" w:w="2381"/>
+          </w:tcPr>
+          <w:p>
+            <w:pPr>
+              <w:spacing w:before="60" w:after="60"/>
+              <w:ind w:left="85"/>
+            </w:pPr>
+            <w:r>
+              <w:rPr>
+                <w:rFonts w:ascii="Calibri" w:hAnsi="Calibri"/>
+                <w:b w:val="0"/>
+                <w:i w:val="0"/>
+                <w:color w:val="374151"/>
+                <w:sz w:val="17"/>
+              </w:rPr>
+              <w:t>Perindopril + Amlodipin</w:t>
+            </w:r>
+          </w:p>
+        </w:tc>
+        <w:tc>
+          <w:tcPr>
+            <w:tcW w:type="dxa" w:w="1134"/>
+          </w:tcPr>
+          <w:p>
+            <w:pPr>
+              <w:spacing w:before="60" w:after="60"/>
+              <w:ind w:left="85"/>
+            </w:pPr>
+            <w:r>
+              <w:rPr>
+                <w:rFonts w:ascii="Calibri" w:hAnsi="Calibri"/>
+                <w:b w:val="0"/>
+                <w:i w:val="0"/>
+                <w:color w:val="374151"/>
+                <w:sz w:val="17"/>
+              </w:rPr>
+              <w:t>182,070đ/hộp</w:t>
+            </w:r>
+          </w:p>
+        </w:tc>
+        <w:tc>
+          <w:tcPr>
+            <w:tcW w:type="dxa" w:w="1247"/>
+            <w:shd w:val="clear" w:color="auto" w:fill="EFF6FF"/>
+          </w:tcPr>
+          <w:p>
+            <w:pPr>
+              <w:spacing w:before="60" w:after="60"/>
+              <w:ind w:left="85"/>
+            </w:pPr>
+            <w:r>
+              <w:rPr>
+                <w:rFonts w:ascii="Calibri" w:hAnsi="Calibri"/>
+                <w:b/>
+                <w:i w:val="0"/>
+                <w:color w:val="0056D2"/>
+                <w:sz w:val="17"/>
+              </w:rPr>
+              <w:t>Ổn định</w:t>
+            </w:r>
+          </w:p>
+        </w:tc>
+        <w:tc>
+          <w:tcPr>
+            <w:tcW w:type="dxa" w:w="2608"/>
+          </w:tcPr>
+          <w:p>
+            <w:pPr>
+              <w:spacing w:before="60" w:after="60"/>
+              <w:ind w:left="85"/>
+            </w:pPr>
+            <w:r>
+              <w:rPr>
+                <w:rFonts w:ascii="Calibri" w:hAnsi="Calibri"/>
+                <w:b w:val="0"/>
+                <w:i w:val="0"/>
+                <w:color w:val="374151"/>
+                <w:sz w:val="17"/>
+              </w:rPr>
+              <w:t>Combo cạnh tranh – theo dõi generic Amlodipine</w:t>
+            </w:r>
+          </w:p>
+        </w:tc>
+      </w:tr>
+      <w:tr>
+        <w:tc>
+          <w:tcPr>
+            <w:tcW w:type="dxa" w:w="1701"/>
+          </w:tcPr>
+          <w:p>
+            <w:pPr>
+              <w:spacing w:before="60" w:after="60"/>
+              <w:ind w:left="85"/>
+            </w:pPr>
+            <w:r>
+              <w:rPr>
+                <w:rFonts w:ascii="Calibri" w:hAnsi="Calibri"/>
+                <w:b/>
+                <w:i w:val="0"/>
+                <w:color w:val="003B71"/>
+                <w:sz w:val="17"/>
+              </w:rPr>
+              <w:t>RAVASTEL-20</w:t>
+            </w:r>
+          </w:p>
+        </w:tc>
+        <w:tc>
+          <w:tcPr>
+            <w:tcW w:type="dxa" w:w="2381"/>
+          </w:tcPr>
+          <w:p>
+            <w:pPr>
+              <w:spacing w:before="60" w:after="60"/>
+              <w:ind w:left="85"/>
+            </w:pPr>
+            <w:r>
+              <w:rPr>
+                <w:rFonts w:ascii="Calibri" w:hAnsi="Calibri"/>
+                <w:b w:val="0"/>
+                <w:i w:val="0"/>
+                <w:color w:val="374151"/>
+                <w:sz w:val="17"/>
+              </w:rPr>
+              <w:t>Rosuvastatin 20mg</w:t>
+            </w:r>
+          </w:p>
+        </w:tc>
+        <w:tc>
+          <w:tcPr>
+            <w:tcW w:type="dxa" w:w="1134"/>
+          </w:tcPr>
+          <w:p>
+            <w:pPr>
+              <w:spacing w:before="60" w:after="60"/>
+              <w:ind w:left="85"/>
+            </w:pPr>
+            <w:r>
+              <w:rPr>
+                <w:rFonts w:ascii="Calibri" w:hAnsi="Calibri"/>
+                <w:b w:val="0"/>
+                <w:i w:val="0"/>
+                <w:color w:val="374151"/>
+                <w:sz w:val="17"/>
+              </w:rPr>
+              <w:t>47,250đ/hộp</w:t>
+            </w:r>
+          </w:p>
+        </w:tc>
+        <w:tc>
+          <w:tcPr>
+            <w:tcW w:type="dxa" w:w="1247"/>
+            <w:shd w:val="clear" w:color="auto" w:fill="FFF7ED"/>
+          </w:tcPr>
+          <w:p>
+            <w:pPr>
+              <w:spacing w:before="60" w:after="60"/>
+              <w:ind w:left="85"/>
+            </w:pPr>
+            <w:r>
+              <w:rPr>
+                <w:rFonts w:ascii="Calibri" w:hAnsi="Calibri"/>
+                <w:b/>
+                <w:i w:val="0"/>
+                <w:color w:val="D97706"/>
+                <w:sz w:val="17"/>
+              </w:rPr>
+              <w:t>Cạnh tranh</w:t>
+            </w:r>
+          </w:p>
+        </w:tc>
+        <w:tc>
+          <w:tcPr>
+            <w:tcW w:type="dxa" w:w="2608"/>
+          </w:tcPr>
+          <w:p>
+            <w:pPr>
+              <w:spacing w:before="60" w:after="60"/>
+              <w:ind w:left="85"/>
+            </w:pPr>
+            <w:r>
+              <w:rPr>
+                <w:rFonts w:ascii="Calibri" w:hAnsi="Calibri"/>
+                <w:b w:val="0"/>
+                <w:i w:val="0"/>
+                <w:color w:val="374151"/>
+                <w:sz w:val="17"/>
+              </w:rPr>
+              <w:t>Statin – cạnh tranh cao với Atorvastatin generic</w:t>
+            </w:r>
+          </w:p>
+        </w:tc>
+      </w:tr>
+      <w:tr>
+        <w:tc>
+          <w:tcPr>
+            <w:tcW w:type="dxa" w:w="1701"/>
+          </w:tcPr>
+          <w:p>
+            <w:pPr>
+              <w:spacing w:before="60" w:after="60"/>
+              <w:ind w:left="85"/>
+            </w:pPr>
+            <w:r>
+              <w:rPr>
+                <w:rFonts w:ascii="Calibri" w:hAnsi="Calibri"/>
+                <w:b/>
+                <w:i w:val="0"/>
+                <w:color w:val="003B71"/>
+                <w:sz w:val="17"/>
+              </w:rPr>
+              <w:t>TABAREX-160</w:t>
+            </w:r>
+          </w:p>
+        </w:tc>
+        <w:tc>
+          <w:tcPr>
+            <w:tcW w:type="dxa" w:w="2381"/>
+          </w:tcPr>
+          <w:p>
+            <w:pPr>
+              <w:spacing w:before="60" w:after="60"/>
+              <w:ind w:left="85"/>
+            </w:pPr>
+            <w:r>
+              <w:rPr>
+                <w:rFonts w:ascii="Calibri" w:hAnsi="Calibri"/>
+                <w:b w:val="0"/>
+                <w:i w:val="0"/>
+                <w:color w:val="374151"/>
+                <w:sz w:val="17"/>
+              </w:rPr>
+              <w:t>Valsartan 160mg</w:t>
+            </w:r>
+          </w:p>
+        </w:tc>
+        <w:tc>
+          <w:tcPr>
+            <w:tcW w:type="dxa" w:w="1134"/>
+          </w:tcPr>
+          <w:p>
+            <w:pPr>
+              <w:spacing w:before="60" w:after="60"/>
+              <w:ind w:left="85"/>
+            </w:pPr>
+            <w:r>
+              <w:rPr>
+                <w:rFonts w:ascii="Calibri" w:hAnsi="Calibri"/>
+                <w:b w:val="0"/>
+                <w:i w:val="0"/>
+                <w:color w:val="374151"/>
+                <w:sz w:val="17"/>
+              </w:rPr>
+              <w:t>163,800đ/hộp</w:t>
+            </w:r>
+          </w:p>
+        </w:tc>
+        <w:tc>
+          <w:tcPr>
+            <w:tcW w:type="dxa" w:w="1247"/>
+            <w:shd w:val="clear" w:color="auto" w:fill="EFF6FF"/>
+          </w:tcPr>
+          <w:p>
+            <w:pPr>
+              <w:spacing w:before="60" w:after="60"/>
+              <w:ind w:left="85"/>
+            </w:pPr>
+            <w:r>
+              <w:rPr>
+                <w:rFonts w:ascii="Calibri" w:hAnsi="Calibri"/>
+                <w:b/>
+                <w:i w:val="0"/>
+                <w:color w:val="0056D2"/>
+                <w:sz w:val="17"/>
+              </w:rPr>
+              <w:t>Ổn định</w:t>
+            </w:r>
+          </w:p>
+        </w:tc>
+        <w:tc>
+          <w:tcPr>
+            <w:tcW w:type="dxa" w:w="2608"/>
+          </w:tcPr>
+          <w:p>
+            <w:pPr>
+              <w:spacing w:before="60" w:after="60"/>
+              <w:ind w:left="85"/>
+            </w:pPr>
+            <w:r>
+              <w:rPr>
+                <w:rFonts w:ascii="Calibri" w:hAnsi="Calibri"/>
+                <w:b w:val="0"/>
+                <w:i w:val="0"/>
+                <w:color w:val="374151"/>
+                <w:sz w:val="17"/>
+              </w:rPr>
+              <w:t>Duy trì kênh OTC &amp; ETC tuyến tỉnh</w:t>
+            </w:r>
+          </w:p>
+        </w:tc>
+      </w:tr>
+      <w:tr>
+        <w:tc>
+          <w:tcPr>
+            <w:tcW w:type="dxa" w:w="1701"/>
+          </w:tcPr>
+          <w:p>
+            <w:pPr>
+              <w:spacing w:before="60" w:after="60"/>
+              <w:ind w:left="85"/>
+            </w:pPr>
+            <w:r>
+              <w:rPr>
+                <w:rFonts w:ascii="Calibri" w:hAnsi="Calibri"/>
+                <w:b/>
+                <w:i w:val="0"/>
+                <w:color w:val="003B71"/>
+                <w:sz w:val="17"/>
+              </w:rPr>
+              <w:t>HATLOP-150</w:t>
+            </w:r>
+          </w:p>
+        </w:tc>
+        <w:tc>
+          <w:tcPr>
+            <w:tcW w:type="dxa" w:w="2381"/>
+          </w:tcPr>
+          <w:p>
+            <w:pPr>
+              <w:spacing w:before="60" w:after="60"/>
+              <w:ind w:left="85"/>
+            </w:pPr>
+            <w:r>
+              <w:rPr>
+                <w:rFonts w:ascii="Calibri" w:hAnsi="Calibri"/>
+                <w:b w:val="0"/>
+                <w:i w:val="0"/>
+                <w:color w:val="374151"/>
+                <w:sz w:val="17"/>
+              </w:rPr>
+              <w:t>Irbesartan 150mg</w:t>
+            </w:r>
+          </w:p>
+        </w:tc>
+        <w:tc>
+          <w:tcPr>
+            <w:tcW w:type="dxa" w:w="1134"/>
+          </w:tcPr>
+          <w:p>
+            <w:pPr>
+              <w:spacing w:before="60" w:after="60"/>
+              <w:ind w:left="85"/>
+            </w:pPr>
+            <w:r>
+              <w:rPr>
+                <w:rFonts w:ascii="Calibri" w:hAnsi="Calibri"/>
+                <w:b w:val="0"/>
+                <w:i w:val="0"/>
+                <w:color w:val="374151"/>
+                <w:sz w:val="17"/>
+              </w:rPr>
+              <w:t>210,000đ/hộp</w:t>
+            </w:r>
+          </w:p>
+        </w:tc>
+        <w:tc>
+          <w:tcPr>
+            <w:tcW w:type="dxa" w:w="1247"/>
+            <w:shd w:val="clear" w:color="auto" w:fill="EFF6FF"/>
+          </w:tcPr>
+          <w:p>
+            <w:pPr>
+              <w:spacing w:before="60" w:after="60"/>
+              <w:ind w:left="85"/>
+            </w:pPr>
+            <w:r>
+              <w:rPr>
+                <w:rFonts w:ascii="Calibri" w:hAnsi="Calibri"/>
+                <w:b/>
+                <w:i w:val="0"/>
+                <w:color w:val="0056D2"/>
+                <w:sz w:val="17"/>
+              </w:rPr>
+              <w:t>Ổn định</w:t>
+            </w:r>
+          </w:p>
+        </w:tc>
+        <w:tc>
+          <w:tcPr>
+            <w:tcW w:type="dxa" w:w="2608"/>
+          </w:tcPr>
+          <w:p>
+            <w:pPr>
+              <w:spacing w:before="60" w:after="60"/>
+              <w:ind w:left="85"/>
+            </w:pPr>
+            <w:r>
+              <w:rPr>
+                <w:rFonts w:ascii="Calibri" w:hAnsi="Calibri"/>
+                <w:b w:val="0"/>
+                <w:i w:val="0"/>
+                <w:color w:val="374151"/>
+                <w:sz w:val="17"/>
+              </w:rPr>
+              <w:t>Duy trì thầu bệnh viện tuyến tỉnh</w:t>
+            </w:r>
+          </w:p>
+        </w:tc>
+      </w:tr>
+      <w:tr>
+        <w:tc>
+          <w:tcPr>
+            <w:tcW w:type="dxa" w:w="1701"/>
+          </w:tcPr>
+          <w:p>
+            <w:pPr>
+              <w:spacing w:before="60" w:after="60"/>
+              <w:ind w:left="85"/>
+            </w:pPr>
+            <w:r>
+              <w:rPr>
+                <w:rFonts w:ascii="Calibri" w:hAnsi="Calibri"/>
+                <w:b/>
+                <w:i w:val="0"/>
+                <w:color w:val="003B71"/>
+                <w:sz w:val="17"/>
+              </w:rPr>
+              <w:t>ZABALES</w:t>
+            </w:r>
+          </w:p>
+        </w:tc>
+        <w:tc>
+          <w:tcPr>
+            <w:tcW w:type="dxa" w:w="2381"/>
+          </w:tcPr>
+          <w:p>
+            <w:pPr>
+              <w:spacing w:before="60" w:after="60"/>
+              <w:ind w:left="85"/>
+            </w:pPr>
+            <w:r>
+              <w:rPr>
+                <w:rFonts w:ascii="Calibri" w:hAnsi="Calibri"/>
+                <w:b w:val="0"/>
+                <w:i w:val="0"/>
+                <w:color w:val="374151"/>
+                <w:sz w:val="17"/>
+              </w:rPr>
+              <w:t>Clopidogrel 75mg</w:t>
+            </w:r>
+          </w:p>
+        </w:tc>
+        <w:tc>
+          <w:tcPr>
+            <w:tcW w:type="dxa" w:w="1134"/>
+          </w:tcPr>
+          <w:p>
+            <w:pPr>
+              <w:spacing w:before="60" w:after="60"/>
+              <w:ind w:left="85"/>
+            </w:pPr>
+            <w:r>
+              <w:rPr>
+                <w:rFonts w:ascii="Calibri" w:hAnsi="Calibri"/>
+                <w:b w:val="0"/>
+                <w:i w:val="0"/>
+                <w:color w:val="374151"/>
+                <w:sz w:val="17"/>
+              </w:rPr>
+              <w:t>31,920đ/hộp</w:t>
+            </w:r>
+          </w:p>
+        </w:tc>
+        <w:tc>
+          <w:tcPr>
+            <w:tcW w:type="dxa" w:w="1247"/>
+            <w:shd w:val="clear" w:color="auto" w:fill="FFF7ED"/>
+          </w:tcPr>
+          <w:p>
+            <w:pPr>
+              <w:spacing w:before="60" w:after="60"/>
+              <w:ind w:left="85"/>
+            </w:pPr>
+            <w:r>
+              <w:rPr>
+                <w:rFonts w:ascii="Calibri" w:hAnsi="Calibri"/>
+                <w:b/>
+                <w:i w:val="0"/>
+                <w:color w:val="D97706"/>
+                <w:sz w:val="17"/>
+              </w:rPr>
+              <w:t>Cạnh tranh</w:t>
+            </w:r>
+          </w:p>
+        </w:tc>
+        <w:tc>
+          <w:tcPr>
+            <w:tcW w:type="dxa" w:w="2608"/>
+          </w:tcPr>
+          <w:p>
+            <w:pPr>
+              <w:spacing w:before="60" w:after="60"/>
+              <w:ind w:left="85"/>
+            </w:pPr>
+            <w:r>
+              <w:rPr>
+                <w:rFonts w:ascii="Calibri" w:hAnsi="Calibri"/>
+                <w:b w:val="0"/>
+                <w:i w:val="0"/>
+                <w:color w:val="374151"/>
+                <w:sz w:val="17"/>
+              </w:rPr>
+              <w:t>Cạnh tranh cao – cần bảo vệ giá thầu</w:t>
+            </w:r>
+          </w:p>
+        </w:tc>
+      </w:tr>
+      <w:tr>
+        <w:tc>
+          <w:tcPr>
+            <w:tcW w:type="dxa" w:w="1701"/>
+          </w:tcPr>
+          <w:p>
+            <w:pPr>
+              <w:spacing w:before="60" w:after="60"/>
+              <w:ind w:left="85"/>
+            </w:pPr>
+            <w:r>
+              <w:rPr>
+                <w:rFonts w:ascii="Calibri" w:hAnsi="Calibri"/>
+                <w:b/>
+                <w:i w:val="0"/>
+                <w:color w:val="003B71"/>
+                <w:sz w:val="17"/>
+              </w:rPr>
+              <w:t>MAGRAX</w:t>
+            </w:r>
+          </w:p>
+        </w:tc>
+        <w:tc>
+          <w:tcPr>
+            <w:tcW w:type="dxa" w:w="2381"/>
+          </w:tcPr>
+          <w:p>
+            <w:pPr>
+              <w:spacing w:before="60" w:after="60"/>
+              <w:ind w:left="85"/>
+            </w:pPr>
+            <w:r>
+              <w:rPr>
+                <w:rFonts w:ascii="Calibri" w:hAnsi="Calibri"/>
+                <w:b w:val="0"/>
+                <w:i w:val="0"/>
+                <w:color w:val="374151"/>
+                <w:sz w:val="17"/>
+              </w:rPr>
+              <w:t>Etoricoxib 90mg</w:t>
+            </w:r>
+          </w:p>
+        </w:tc>
+        <w:tc>
+          <w:tcPr>
+            <w:tcW w:type="dxa" w:w="1134"/>
+          </w:tcPr>
+          <w:p>
+            <w:pPr>
+              <w:spacing w:before="60" w:after="60"/>
+              <w:ind w:left="85"/>
+            </w:pPr>
+            <w:r>
+              <w:rPr>
+                <w:rFonts w:ascii="Calibri" w:hAnsi="Calibri"/>
+                <w:b w:val="0"/>
+                <w:i w:val="0"/>
+                <w:color w:val="374151"/>
+                <w:sz w:val="17"/>
+              </w:rPr>
+              <w:t>215,000đ/hộp</w:t>
+            </w:r>
+          </w:p>
+        </w:tc>
+        <w:tc>
+          <w:tcPr>
+            <w:tcW w:type="dxa" w:w="1247"/>
+            <w:shd w:val="clear" w:color="auto" w:fill="EFF6FF"/>
+          </w:tcPr>
+          <w:p>
+            <w:pPr>
+              <w:spacing w:before="60" w:after="60"/>
+              <w:ind w:left="85"/>
+            </w:pPr>
+            <w:r>
+              <w:rPr>
+                <w:rFonts w:ascii="Calibri" w:hAnsi="Calibri"/>
+                <w:b/>
+                <w:i w:val="0"/>
+                <w:color w:val="0056D2"/>
+                <w:sz w:val="17"/>
+              </w:rPr>
+              <w:t>Ổn định</w:t>
+            </w:r>
+          </w:p>
+        </w:tc>
+        <w:tc>
+          <w:tcPr>
+            <w:tcW w:type="dxa" w:w="2608"/>
+          </w:tcPr>
+          <w:p>
+            <w:pPr>
+              <w:spacing w:before="60" w:after="60"/>
+              <w:ind w:left="85"/>
+            </w:pPr>
+            <w:r>
+              <w:rPr>
+                <w:rFonts w:ascii="Calibri" w:hAnsi="Calibri"/>
+                <w:b w:val="0"/>
+                <w:i w:val="0"/>
+                <w:color w:val="374151"/>
+                <w:sz w:val="17"/>
+              </w:rPr>
+              <w:t>COX-2 – theo dõi xu hướng điều trị Gout</w:t>
+            </w:r>
+          </w:p>
+        </w:tc>
+      </w:tr>
+      <w:tr>
+        <w:tc>
+          <w:tcPr>
+            <w:tcW w:type="dxa" w:w="1701"/>
+          </w:tcPr>
+          <w:p>
+            <w:pPr>
+              <w:spacing w:before="60" w:after="60"/>
+              <w:ind w:left="85"/>
+            </w:pPr>
+            <w:r>
+              <w:rPr>
+                <w:rFonts w:ascii="Calibri" w:hAnsi="Calibri"/>
+                <w:b/>
+                <w:i w:val="0"/>
+                <w:color w:val="003B71"/>
+                <w:sz w:val="17"/>
+              </w:rPr>
+              <w:t>ZENTOGOUT-40</w:t>
+            </w:r>
+          </w:p>
+        </w:tc>
+        <w:tc>
+          <w:tcPr>
+            <w:tcW w:type="dxa" w:w="2381"/>
+          </w:tcPr>
+          <w:p>
+            <w:pPr>
+              <w:spacing w:before="60" w:after="60"/>
+              <w:ind w:left="85"/>
+            </w:pPr>
+            <w:r>
+              <w:rPr>
+                <w:rFonts w:ascii="Calibri" w:hAnsi="Calibri"/>
+                <w:b w:val="0"/>
+                <w:i w:val="0"/>
+                <w:color w:val="374151"/>
+                <w:sz w:val="17"/>
+              </w:rPr>
+              <w:t>Febuxostat 40mg</w:t>
+            </w:r>
+          </w:p>
+        </w:tc>
+        <w:tc>
+          <w:tcPr>
+            <w:tcW w:type="dxa" w:w="1134"/>
+          </w:tcPr>
+          <w:p>
+            <w:pPr>
+              <w:spacing w:before="60" w:after="60"/>
+              <w:ind w:left="85"/>
+            </w:pPr>
+            <w:r>
+              <w:rPr>
+                <w:rFonts w:ascii="Calibri" w:hAnsi="Calibri"/>
+                <w:b w:val="0"/>
+                <w:i w:val="0"/>
+                <w:color w:val="374151"/>
+                <w:sz w:val="17"/>
+              </w:rPr>
+              <w:t>240,000đ/hộp</w:t>
+            </w:r>
+          </w:p>
+        </w:tc>
+        <w:tc>
+          <w:tcPr>
+            <w:tcW w:type="dxa" w:w="1247"/>
+            <w:shd w:val="clear" w:color="auto" w:fill="EFF6FF"/>
+          </w:tcPr>
+          <w:p>
+            <w:pPr>
+              <w:spacing w:before="60" w:after="60"/>
+              <w:ind w:left="85"/>
+            </w:pPr>
+            <w:r>
+              <w:rPr>
+                <w:rFonts w:ascii="Calibri" w:hAnsi="Calibri"/>
+                <w:b/>
+                <w:i w:val="0"/>
+                <w:color w:val="0056D2"/>
+                <w:sz w:val="17"/>
+              </w:rPr>
+              <w:t>Cơ hội</w:t>
+            </w:r>
+          </w:p>
+        </w:tc>
+        <w:tc>
+          <w:tcPr>
+            <w:tcW w:type="dxa" w:w="2608"/>
+          </w:tcPr>
+          <w:p>
+            <w:pPr>
+              <w:spacing w:before="60" w:after="60"/>
+              <w:ind w:left="85"/>
+            </w:pPr>
+            <w:r>
+              <w:rPr>
+                <w:rFonts w:ascii="Calibri" w:hAnsi="Calibri"/>
+                <w:b w:val="0"/>
+                <w:i w:val="0"/>
+                <w:color w:val="374151"/>
+                <w:sz w:val="17"/>
+              </w:rPr>
+              <w:t>Thay thế Allopurinol – đang tăng trưởng</w:t>
+            </w:r>
+          </w:p>
+        </w:tc>
+      </w:tr>
+      <w:tr>
+        <w:tc>
+          <w:tcPr>
+            <w:tcW w:type="dxa" w:w="1701"/>
+          </w:tcPr>
+          <w:p>
+            <w:pPr>
+              <w:spacing w:before="60" w:after="60"/>
+              <w:ind w:left="85"/>
+            </w:pPr>
+            <w:r>
+              <w:rPr>
+                <w:rFonts w:ascii="Calibri" w:hAnsi="Calibri"/>
+                <w:b/>
+                <w:i w:val="0"/>
+                <w:color w:val="003B71"/>
+                <w:sz w:val="17"/>
+              </w:rPr>
+              <w:t>JIRACEK</w:t>
+            </w:r>
+          </w:p>
+        </w:tc>
+        <w:tc>
+          <w:tcPr>
+            <w:tcW w:type="dxa" w:w="2381"/>
+          </w:tcPr>
+          <w:p>
+            <w:pPr>
+              <w:spacing w:before="60" w:after="60"/>
+              <w:ind w:left="85"/>
+            </w:pPr>
+            <w:r>
+              <w:rPr>
+                <w:rFonts w:ascii="Calibri" w:hAnsi="Calibri"/>
+                <w:b w:val="0"/>
+                <w:i w:val="0"/>
+                <w:color w:val="374151"/>
+                <w:sz w:val="17"/>
+              </w:rPr>
+              <w:t>Esomeprazole 40mg</w:t>
+            </w:r>
+          </w:p>
+        </w:tc>
+        <w:tc>
+          <w:tcPr>
+            <w:tcW w:type="dxa" w:w="1134"/>
+          </w:tcPr>
+          <w:p>
+            <w:pPr>
+              <w:spacing w:before="60" w:after="60"/>
+              <w:ind w:left="85"/>
+            </w:pPr>
+            <w:r>
+              <w:rPr>
+                <w:rFonts w:ascii="Calibri" w:hAnsi="Calibri"/>
+                <w:b w:val="0"/>
+                <w:i w:val="0"/>
+                <w:color w:val="374151"/>
+                <w:sz w:val="17"/>
+              </w:rPr>
+              <w:t>89,600đ/hộp</w:t>
+            </w:r>
+          </w:p>
+        </w:tc>
+        <w:tc>
+          <w:tcPr>
+            <w:tcW w:type="dxa" w:w="1247"/>
+            <w:shd w:val="clear" w:color="auto" w:fill="FFF7ED"/>
+          </w:tcPr>
+          <w:p>
+            <w:pPr>
+              <w:spacing w:before="60" w:after="60"/>
+              <w:ind w:left="85"/>
+            </w:pPr>
+            <w:r>
+              <w:rPr>
+                <w:rFonts w:ascii="Calibri" w:hAnsi="Calibri"/>
+                <w:b/>
+                <w:i w:val="0"/>
+                <w:color w:val="D97706"/>
+                <w:sz w:val="17"/>
+              </w:rPr>
+              <w:t>Cạnh tranh</w:t>
+            </w:r>
+          </w:p>
+        </w:tc>
+        <w:tc>
+          <w:tcPr>
+            <w:tcW w:type="dxa" w:w="2608"/>
+          </w:tcPr>
+          <w:p>
+            <w:pPr>
+              <w:spacing w:before="60" w:after="60"/>
+              <w:ind w:left="85"/>
+            </w:pPr>
+            <w:r>
+              <w:rPr>
+                <w:rFonts w:ascii="Calibri" w:hAnsi="Calibri"/>
+                <w:b w:val="0"/>
+                <w:i w:val="0"/>
+                <w:color w:val="374151"/>
+                <w:sz w:val="17"/>
+              </w:rPr>
+              <w:t>PPI – thị trường cạnh tranh, bảo vệ ETC</w:t>
+            </w:r>
+          </w:p>
+        </w:tc>
+      </w:tr>
+      <w:tr>
+        <w:tc>
+          <w:tcPr>
+            <w:tcW w:type="dxa" w:w="1701"/>
+          </w:tcPr>
+          <w:p>
+            <w:pPr>
+              <w:spacing w:before="60" w:after="60"/>
+              <w:ind w:left="85"/>
+            </w:pPr>
+            <w:r>
+              <w:rPr>
+                <w:rFonts w:ascii="Calibri" w:hAnsi="Calibri"/>
+                <w:b/>
+                <w:i w:val="0"/>
+                <w:color w:val="003B71"/>
+                <w:sz w:val="17"/>
+              </w:rPr>
+              <w:t>SERNAL-4</w:t>
+            </w:r>
+          </w:p>
+        </w:tc>
+        <w:tc>
+          <w:tcPr>
+            <w:tcW w:type="dxa" w:w="2381"/>
+          </w:tcPr>
+          <w:p>
+            <w:pPr>
+              <w:spacing w:before="60" w:after="60"/>
+              <w:ind w:left="85"/>
+            </w:pPr>
+            <w:r>
+              <w:rPr>
+                <w:rFonts w:ascii="Calibri" w:hAnsi="Calibri"/>
+                <w:b w:val="0"/>
+                <w:i w:val="0"/>
+                <w:color w:val="374151"/>
+                <w:sz w:val="17"/>
+              </w:rPr>
+              <w:t>Risperidone 4mg</w:t>
+            </w:r>
+          </w:p>
+        </w:tc>
+        <w:tc>
+          <w:tcPr>
+            <w:tcW w:type="dxa" w:w="1134"/>
+          </w:tcPr>
+          <w:p>
+            <w:pPr>
+              <w:spacing w:before="60" w:after="60"/>
+              <w:ind w:left="85"/>
+            </w:pPr>
+            <w:r>
+              <w:rPr>
+                <w:rFonts w:ascii="Calibri" w:hAnsi="Calibri"/>
+                <w:b w:val="0"/>
+                <w:i w:val="0"/>
+                <w:color w:val="374151"/>
+                <w:sz w:val="17"/>
+              </w:rPr>
+              <w:t>315,000đ/hộp</w:t>
+            </w:r>
+          </w:p>
+        </w:tc>
+        <w:tc>
+          <w:tcPr>
+            <w:tcW w:type="dxa" w:w="1247"/>
+            <w:shd w:val="clear" w:color="auto" w:fill="EFF6FF"/>
+          </w:tcPr>
+          <w:p>
+            <w:pPr>
+              <w:spacing w:before="60" w:after="60"/>
+              <w:ind w:left="85"/>
+            </w:pPr>
+            <w:r>
+              <w:rPr>
+                <w:rFonts w:ascii="Calibri" w:hAnsi="Calibri"/>
+                <w:b/>
+                <w:i w:val="0"/>
+                <w:color w:val="0056D2"/>
+                <w:sz w:val="17"/>
+              </w:rPr>
+              <w:t>Ổn định</w:t>
+            </w:r>
+          </w:p>
+        </w:tc>
+        <w:tc>
+          <w:tcPr>
+            <w:tcW w:type="dxa" w:w="2608"/>
+          </w:tcPr>
+          <w:p>
+            <w:pPr>
+              <w:spacing w:before="60" w:after="60"/>
+              <w:ind w:left="85"/>
+            </w:pPr>
+            <w:r>
+              <w:rPr>
+                <w:rFonts w:ascii="Calibri" w:hAnsi="Calibri"/>
+                <w:b w:val="0"/>
+                <w:i w:val="0"/>
+                <w:color w:val="374151"/>
+                <w:sz w:val="17"/>
+              </w:rPr>
+              <w:t>Duy trì kênh ETC bệnh viện chuyên khoa</w:t>
+            </w:r>
+          </w:p>
+        </w:tc>
+      </w:tr>
+      <w:tr>
+        <w:tc>
+          <w:tcPr>
+            <w:tcW w:type="dxa" w:w="1701"/>
+          </w:tcPr>
+          <w:p>
+            <w:pPr>
+              <w:spacing w:before="60" w:after="60"/>
+              <w:ind w:left="85"/>
+            </w:pPr>
+            <w:r>
+              <w:rPr>
+                <w:rFonts w:ascii="Calibri" w:hAnsi="Calibri"/>
+                <w:b/>
+                <w:i w:val="0"/>
+                <w:color w:val="003B71"/>
+                <w:sz w:val="17"/>
+              </w:rPr>
+              <w:t>LAFAXOR</w:t>
+            </w:r>
+          </w:p>
+        </w:tc>
+        <w:tc>
+          <w:tcPr>
+            <w:tcW w:type="dxa" w:w="2381"/>
+          </w:tcPr>
+          <w:p>
+            <w:pPr>
+              <w:spacing w:before="60" w:after="60"/>
+              <w:ind w:left="85"/>
+            </w:pPr>
+            <w:r>
+              <w:rPr>
+                <w:rFonts w:ascii="Calibri" w:hAnsi="Calibri"/>
+                <w:b w:val="0"/>
+                <w:i w:val="0"/>
+                <w:color w:val="374151"/>
+                <w:sz w:val="17"/>
+              </w:rPr>
+              <w:t>Venlafaxine</w:t>
+            </w:r>
+          </w:p>
+        </w:tc>
+        <w:tc>
+          <w:tcPr>
+            <w:tcW w:type="dxa" w:w="1134"/>
+          </w:tcPr>
+          <w:p>
+            <w:pPr>
+              <w:spacing w:before="60" w:after="60"/>
+              <w:ind w:left="85"/>
+            </w:pPr>
+            <w:r>
+              <w:rPr>
+                <w:rFonts w:ascii="Calibri" w:hAnsi="Calibri"/>
+                <w:b w:val="0"/>
+                <w:i w:val="0"/>
+                <w:color w:val="374151"/>
+                <w:sz w:val="17"/>
+              </w:rPr>
+              <w:t>159,000đ/hộp</w:t>
+            </w:r>
+          </w:p>
+        </w:tc>
+        <w:tc>
+          <w:tcPr>
+            <w:tcW w:type="dxa" w:w="1247"/>
+            <w:shd w:val="clear" w:color="auto" w:fill="EFF6FF"/>
+          </w:tcPr>
+          <w:p>
+            <w:pPr>
+              <w:spacing w:before="60" w:after="60"/>
+              <w:ind w:left="85"/>
+            </w:pPr>
+            <w:r>
+              <w:rPr>
+                <w:rFonts w:ascii="Calibri" w:hAnsi="Calibri"/>
+                <w:b/>
+                <w:i w:val="0"/>
+                <w:color w:val="0056D2"/>
+                <w:sz w:val="17"/>
+              </w:rPr>
+              <w:t>Ổn định</w:t>
+            </w:r>
+          </w:p>
+        </w:tc>
+        <w:tc>
+          <w:tcPr>
+            <w:tcW w:type="dxa" w:w="2608"/>
+          </w:tcPr>
+          <w:p>
+            <w:pPr>
+              <w:spacing w:before="60" w:after="60"/>
+              <w:ind w:left="85"/>
+            </w:pPr>
+            <w:r>
+              <w:rPr>
+                <w:rFonts w:ascii="Calibri" w:hAnsi="Calibri"/>
+                <w:b w:val="0"/>
+                <w:i w:val="0"/>
+                <w:color w:val="374151"/>
+                <w:sz w:val="17"/>
+              </w:rPr>
+              <w:t>Kênh phòng khám tư nhân – tiềm năng tăng</w:t>
+            </w:r>
+          </w:p>
+        </w:tc>
+      </w:tr>
+      <w:tr>
+        <w:tc>
+          <w:tcPr>
+            <w:tcW w:type="dxa" w:w="1701"/>
+          </w:tcPr>
+          <w:p>
+            <w:pPr>
+              <w:spacing w:before="60" w:after="60"/>
+              <w:ind w:left="85"/>
+            </w:pPr>
+            <w:r>
+              <w:rPr>
+                <w:rFonts w:ascii="Calibri" w:hAnsi="Calibri"/>
+                <w:b/>
+                <w:i w:val="0"/>
+                <w:color w:val="003B71"/>
+                <w:sz w:val="17"/>
+              </w:rPr>
+              <w:t>HYYR</w:t>
+            </w:r>
+          </w:p>
+        </w:tc>
+        <w:tc>
+          <w:tcPr>
+            <w:tcW w:type="dxa" w:w="2381"/>
+          </w:tcPr>
+          <w:p>
+            <w:pPr>
+              <w:spacing w:before="60" w:after="60"/>
+              <w:ind w:left="85"/>
+            </w:pPr>
+            <w:r>
+              <w:rPr>
+                <w:rFonts w:ascii="Calibri" w:hAnsi="Calibri"/>
+                <w:b w:val="0"/>
+                <w:i w:val="0"/>
+                <w:color w:val="374151"/>
+                <w:sz w:val="17"/>
+              </w:rPr>
+              <w:t>Erlotinib</w:t>
+            </w:r>
+          </w:p>
+        </w:tc>
+        <w:tc>
+          <w:tcPr>
+            <w:tcW w:type="dxa" w:w="1134"/>
+          </w:tcPr>
+          <w:p>
+            <w:pPr>
+              <w:spacing w:before="60" w:after="60"/>
+              <w:ind w:left="85"/>
+            </w:pPr>
+            <w:r>
+              <w:rPr>
+                <w:rFonts w:ascii="Calibri" w:hAnsi="Calibri"/>
+                <w:b w:val="0"/>
+                <w:i w:val="0"/>
+                <w:color w:val="374151"/>
+                <w:sz w:val="17"/>
+              </w:rPr>
+              <w:t>1,500,000đ/hộp</w:t>
+            </w:r>
+          </w:p>
+        </w:tc>
+        <w:tc>
+          <w:tcPr>
+            <w:tcW w:type="dxa" w:w="1247"/>
+            <w:shd w:val="clear" w:color="auto" w:fill="E7F9EE"/>
+          </w:tcPr>
+          <w:p>
+            <w:pPr>
+              <w:spacing w:before="60" w:after="60"/>
+              <w:ind w:left="85"/>
+            </w:pPr>
+            <w:r>
+              <w:rPr>
+                <w:rFonts w:ascii="Calibri" w:hAnsi="Calibri"/>
+                <w:b/>
+                <w:i w:val="0"/>
+                <w:color w:val="166534"/>
+                <w:sz w:val="17"/>
+              </w:rPr>
+              <w:t>Cơ hội cao</w:t>
+            </w:r>
+          </w:p>
+        </w:tc>
+        <w:tc>
+          <w:tcPr>
+            <w:tcW w:type="dxa" w:w="2608"/>
+          </w:tcPr>
+          <w:p>
+            <w:pPr>
+              <w:spacing w:before="60" w:after="60"/>
+              <w:ind w:left="85"/>
+            </w:pPr>
+            <w:r>
+              <w:rPr>
+                <w:rFonts w:ascii="Calibri" w:hAnsi="Calibri"/>
+                <w:b w:val="0"/>
+                <w:i w:val="0"/>
+                <w:color w:val="374151"/>
+                <w:sz w:val="17"/>
+              </w:rPr>
+              <w:t>Thuốc đặc trị – ưu tiên thầu bệnh viện ung bướu</w:t>
+            </w:r>
+          </w:p>
+        </w:tc>
+      </w:tr>
+      <w:tr>
+        <w:tc>
+          <w:tcPr>
+            <w:tcW w:type="dxa" w:w="1701"/>
+          </w:tcPr>
+          <w:p>
+            <w:pPr>
+              <w:spacing w:before="60" w:after="60"/>
+              <w:ind w:left="85"/>
+            </w:pPr>
+            <w:r>
+              <w:rPr>
+                <w:rFonts w:ascii="Calibri" w:hAnsi="Calibri"/>
+                <w:b/>
+                <w:i w:val="0"/>
+                <w:color w:val="003B71"/>
+                <w:sz w:val="17"/>
+              </w:rPr>
+              <w:t>LARRIVEY</w:t>
+            </w:r>
+          </w:p>
+        </w:tc>
+        <w:tc>
+          <w:tcPr>
+            <w:tcW w:type="dxa" w:w="2381"/>
+          </w:tcPr>
+          <w:p>
+            <w:pPr>
+              <w:spacing w:before="60" w:after="60"/>
+              <w:ind w:left="85"/>
+            </w:pPr>
+            <w:r>
+              <w:rPr>
+                <w:rFonts w:ascii="Calibri" w:hAnsi="Calibri"/>
+                <w:b w:val="0"/>
+                <w:i w:val="0"/>
+                <w:color w:val="374151"/>
+                <w:sz w:val="17"/>
+              </w:rPr>
+              <w:t>Bicalutamide</w:t>
+            </w:r>
+          </w:p>
+        </w:tc>
+        <w:tc>
+          <w:tcPr>
+            <w:tcW w:type="dxa" w:w="1134"/>
+          </w:tcPr>
+          <w:p>
+            <w:pPr>
+              <w:spacing w:before="60" w:after="60"/>
+              <w:ind w:left="85"/>
+            </w:pPr>
+            <w:r>
+              <w:rPr>
+                <w:rFonts w:ascii="Calibri" w:hAnsi="Calibri"/>
+                <w:b w:val="0"/>
+                <w:i w:val="0"/>
+                <w:color w:val="374151"/>
+                <w:sz w:val="17"/>
+              </w:rPr>
+              <w:t>823,200đ/hộp</w:t>
+            </w:r>
+          </w:p>
+        </w:tc>
+        <w:tc>
+          <w:tcPr>
+            <w:tcW w:type="dxa" w:w="1247"/>
+            <w:shd w:val="clear" w:color="auto" w:fill="EFF6FF"/>
+          </w:tcPr>
+          <w:p>
+            <w:pPr>
+              <w:spacing w:before="60" w:after="60"/>
+              <w:ind w:left="85"/>
+            </w:pPr>
+            <w:r>
+              <w:rPr>
+                <w:rFonts w:ascii="Calibri" w:hAnsi="Calibri"/>
+                <w:b/>
+                <w:i w:val="0"/>
+                <w:color w:val="0056D2"/>
+                <w:sz w:val="17"/>
+              </w:rPr>
+              <w:t>Ổn định</w:t>
+            </w:r>
+          </w:p>
+        </w:tc>
+        <w:tc>
+          <w:tcPr>
+            <w:tcW w:type="dxa" w:w="2608"/>
+          </w:tcPr>
+          <w:p>
+            <w:pPr>
+              <w:spacing w:before="60" w:after="60"/>
+              <w:ind w:left="85"/>
+            </w:pPr>
+            <w:r>
+              <w:rPr>
+                <w:rFonts w:ascii="Calibri" w:hAnsi="Calibri"/>
+                <w:b w:val="0"/>
+                <w:i w:val="0"/>
+                <w:color w:val="374151"/>
+                <w:sz w:val="17"/>
+              </w:rPr>
+              <w:t>Theo dõi phác đồ bệnh viện – biên lợi nhuận cao</w:t>
+            </w:r>
+          </w:p>
+        </w:tc>
+      </w:tr>
+      <w:tr>
+        <w:tc>
+          <w:tcPr>
+            <w:tcW w:type="dxa" w:w="1701"/>
+          </w:tcPr>
+          <w:p>
+            <w:pPr>
+              <w:spacing w:before="60" w:after="60"/>
+              <w:ind w:left="85"/>
+            </w:pPr>
+            <w:r>
+              <w:rPr>
+                <w:rFonts w:ascii="Calibri" w:hAnsi="Calibri"/>
+                <w:b/>
+                <w:i w:val="0"/>
+                <w:color w:val="003B71"/>
+                <w:sz w:val="17"/>
+              </w:rPr>
+              <w:t>METILONE-4</w:t>
+            </w:r>
+          </w:p>
+        </w:tc>
+        <w:tc>
+          <w:tcPr>
+            <w:tcW w:type="dxa" w:w="2381"/>
+          </w:tcPr>
+          <w:p>
+            <w:pPr>
+              <w:spacing w:before="60" w:after="60"/>
+              <w:ind w:left="85"/>
+            </w:pPr>
+            <w:r>
+              <w:rPr>
+                <w:rFonts w:ascii="Calibri" w:hAnsi="Calibri"/>
+                <w:b w:val="0"/>
+                <w:i w:val="0"/>
+                <w:color w:val="374151"/>
+                <w:sz w:val="17"/>
+              </w:rPr>
+              <w:t>Methylprednisolone 4mg</w:t>
+            </w:r>
+          </w:p>
+        </w:tc>
+        <w:tc>
+          <w:tcPr>
+            <w:tcW w:type="dxa" w:w="1134"/>
+          </w:tcPr>
+          <w:p>
+            <w:pPr>
+              <w:spacing w:before="60" w:after="60"/>
+              <w:ind w:left="85"/>
+            </w:pPr>
+            <w:r>
+              <w:rPr>
+                <w:rFonts w:ascii="Calibri" w:hAnsi="Calibri"/>
+                <w:b w:val="0"/>
+                <w:i w:val="0"/>
+                <w:color w:val="374151"/>
+                <w:sz w:val="17"/>
+              </w:rPr>
+              <w:t>74,000đ/hộp</w:t>
+            </w:r>
+          </w:p>
+        </w:tc>
+        <w:tc>
+          <w:tcPr>
+            <w:tcW w:type="dxa" w:w="1247"/>
+            <w:shd w:val="clear" w:color="auto" w:fill="EFF6FF"/>
+          </w:tcPr>
+          <w:p>
+            <w:pPr>
+              <w:spacing w:before="60" w:after="60"/>
+              <w:ind w:left="85"/>
+            </w:pPr>
+            <w:r>
+              <w:rPr>
+                <w:rFonts w:ascii="Calibri" w:hAnsi="Calibri"/>
+                <w:b/>
+                <w:i w:val="0"/>
+                <w:color w:val="0056D2"/>
+                <w:sz w:val="17"/>
+              </w:rPr>
+              <w:t>Ổn định</w:t>
+            </w:r>
+          </w:p>
+        </w:tc>
+        <w:tc>
+          <w:tcPr>
+            <w:tcW w:type="dxa" w:w="2608"/>
+          </w:tcPr>
+          <w:p>
+            <w:pPr>
+              <w:spacing w:before="60" w:after="60"/>
+              <w:ind w:left="85"/>
+            </w:pPr>
+            <w:r>
+              <w:rPr>
+                <w:rFonts w:ascii="Calibri" w:hAnsi="Calibri"/>
+                <w:b w:val="0"/>
+                <w:i w:val="0"/>
+                <w:color w:val="374151"/>
+                <w:sz w:val="17"/>
+              </w:rPr>
+              <w:t>Duy trì kênh ETC – theo dõi thầu TT Corticoid</w:t>
             </w:r>
           </w:p>
         </w:tc>
@@ -3343,7 +5656,7 @@
                 <w:color w:val="111827"/>
                 <w:sz w:val="18"/>
               </w:rPr>
-              <w:t>Triển khai chiến dịch marketing combo "Active 50+" cho canxi, vitamin D, omega-3</w:t>
+              <w:t>Phát triển tài liệu KOL/CME "can thiệp sớm 40+" cho RAVASTEL, EIMLER-10, PECHAUNOX, ZENTOGOUT</w:t>
             </w:r>
           </w:p>
         </w:tc>
@@ -3371,7 +5684,7 @@
                 <w:color w:val="003B71"/>
                 <w:sz w:val="17"/>
               </w:rPr>
-              <w:t>Marketing</w:t>
+              <w:t>Marketing &amp; Medical Affairs</w:t>
             </w:r>
           </w:p>
         </w:tc>
@@ -3399,7 +5712,7 @@
                 <w:color w:val="6B7280"/>
                 <w:sz w:val="17"/>
               </w:rPr>
-              <w:t>Xu hướng dinh dưỡng người cao tuổi 50+</w:t>
+              <w:t>Lão hóa tăng tốc 44 &amp; 60 tuổi (Stanford)</w:t>
             </w:r>
           </w:p>
         </w:tc>
@@ -3478,7 +5791,7 @@
                 <w:color w:val="111827"/>
                 <w:sz w:val="18"/>
               </w:rPr>
-              <w:t>Tăng cường Medical Rep tại bệnh viện nhi với kháng sinh và acyclovir mùa thủy đậu</w:t>
+              <w:t>Xây dựng gói listing peri-operative (JIRACEK, PECHAUNOX, ZABALES) tại Tâm Anh, Vinmec, FV</w:t>
             </w:r>
           </w:p>
         </w:tc>
@@ -3506,7 +5819,7 @@
                 <w:color w:val="003B71"/>
                 <w:sz w:val="17"/>
               </w:rPr>
-              <w:t>Sales</w:t>
+              <w:t>Medical Affairs &amp; ETC Sales</w:t>
             </w:r>
           </w:p>
         </w:tc>
@@ -3534,7 +5847,7 @@
                 <w:color w:val="6B7280"/>
                 <w:sz w:val="17"/>
               </w:rPr>
-              <w:t>Biến chứng thủy đậu nghiêm trọng ở trẻ em</w:t>
+              <w:t>Ung thư đại tràng ~17.000 ca/năm, BV tư nâng cấp</w:t>
             </w:r>
           </w:p>
         </w:tc>
@@ -3613,7 +5926,7 @@
                 <w:color w:val="111827"/>
                 <w:sz w:val="18"/>
               </w:rPr>
-              <w:t>Phát hành tài liệu KOL về phác đồ xử lý biến chứng thủy đậu cho bác sĩ nhi</w:t>
+              <w:t>Rà soát &amp; triển khai tài liệu HYYR chỉ định ung thư tụy tại BV K, Chợ Rẫy, Ung bướu TP.HCM</w:t>
             </w:r>
           </w:p>
         </w:tc>
@@ -3641,7 +5954,7 @@
                 <w:color w:val="003B71"/>
                 <w:sz w:val="17"/>
               </w:rPr>
-              <w:t>Marketing</w:t>
+              <w:t>Oncology &amp; Medical Affairs</w:t>
             </w:r>
           </w:p>
         </w:tc>
@@ -3669,142 +5982,7 @@
                 <w:color w:val="6B7280"/>
                 <w:sz w:val="17"/>
               </w:rPr>
-              <w:t>Biến chứng thủy đậu nghiêm trọng ở trẻ em</w:t>
-            </w:r>
-          </w:p>
-        </w:tc>
-        <w:tc>
-          <w:tcPr>
-            <w:tcW w:type="dxa" w:w="1644"/>
-            <w:shd w:val="clear" w:color="auto" w:fill="FEF3C7"/>
-            <w:tcBorders>
-              <w:top w:val="none" w:sz="6" w:color="auto"/>
-              <w:bottom w:val="none" w:sz="6" w:color="auto"/>
-              <w:left w:val="none" w:sz="6" w:color="auto"/>
-              <w:right w:val="none" w:sz="6" w:color="auto"/>
-            </w:tcBorders>
-          </w:tcPr>
-          <w:p>
-            <w:pPr>
-              <w:spacing w:before="80" w:after="80"/>
-              <w:jc w:val="center"/>
-            </w:pPr>
-            <w:r>
-              <w:rPr>
-                <w:rFonts w:ascii="Calibri" w:hAnsi="Calibri"/>
-                <w:b/>
-                <w:i w:val="0"/>
-                <w:color w:val="D97706"/>
-                <w:sz w:val="17"/>
-              </w:rPr>
-              <w:t>🟡 Trung</w:t>
-            </w:r>
-          </w:p>
-        </w:tc>
-      </w:tr>
-      <w:tr>
-        <w:tc>
-          <w:tcPr>
-            <w:tcW w:type="dxa" w:w="454"/>
-            <w:shd w:val="clear" w:color="auto" w:fill="FEF3C7"/>
-            <w:tcBorders>
-              <w:top w:val="none" w:sz="6" w:color="auto"/>
-              <w:bottom w:val="none" w:sz="6" w:color="auto"/>
-              <w:left w:val="none" w:sz="6" w:color="auto"/>
-              <w:right w:val="none" w:sz="6" w:color="auto"/>
-            </w:tcBorders>
-          </w:tcPr>
-          <w:p>
-            <w:pPr>
-              <w:spacing w:before="100" w:after="100"/>
-              <w:jc w:val="center"/>
-            </w:pPr>
-            <w:r>
-              <w:t>🟡</w:t>
-            </w:r>
-          </w:p>
-        </w:tc>
-        <w:tc>
-          <w:tcPr>
-            <w:tcW w:type="dxa" w:w="4422"/>
-            <w:shd w:val="clear" w:color="auto" w:fill="FAFBFF"/>
-            <w:tcBorders>
-              <w:top w:val="none" w:sz="6" w:color="auto"/>
-              <w:bottom w:val="none" w:sz="6" w:color="auto"/>
-              <w:left w:val="none" w:sz="6" w:color="auto"/>
-              <w:right w:val="none" w:sz="6" w:color="auto"/>
-            </w:tcBorders>
-          </w:tcPr>
-          <w:p>
-            <w:pPr>
-              <w:spacing w:before="80" w:after="80"/>
-              <w:ind w:left="85"/>
-            </w:pPr>
-            <w:r>
-              <w:rPr>
-                <w:rFonts w:ascii="Calibri" w:hAnsi="Calibri"/>
-                <w:b/>
-                <w:i w:val="0"/>
-                <w:color w:val="111827"/>
-                <w:sz w:val="18"/>
-              </w:rPr>
-              <w:t>Soạn và phân phối tài liệu "Dùng thuốc chống đông an toàn" qua nhà thuốc và bác sĩ</w:t>
-            </w:r>
-          </w:p>
-        </w:tc>
-        <w:tc>
-          <w:tcPr>
-            <w:tcW w:type="dxa" w:w="1417"/>
-            <w:shd w:val="clear" w:color="auto" w:fill="FAFBFF"/>
-            <w:tcBorders>
-              <w:top w:val="none" w:sz="6" w:color="auto"/>
-              <w:bottom w:val="none" w:sz="6" w:color="auto"/>
-              <w:left w:val="none" w:sz="6" w:color="auto"/>
-              <w:right w:val="none" w:sz="6" w:color="auto"/>
-            </w:tcBorders>
-          </w:tcPr>
-          <w:p>
-            <w:pPr>
-              <w:spacing w:before="80" w:after="80"/>
-              <w:jc w:val="center"/>
-            </w:pPr>
-            <w:r>
-              <w:rPr>
-                <w:rFonts w:ascii="Calibri" w:hAnsi="Calibri"/>
-                <w:b w:val="0"/>
-                <w:i w:val="0"/>
-                <w:color w:val="003B71"/>
-                <w:sz w:val="17"/>
-              </w:rPr>
-              <w:t>Marketing</w:t>
-            </w:r>
-          </w:p>
-        </w:tc>
-        <w:tc>
-          <w:tcPr>
-            <w:tcW w:type="dxa" w:w="1134"/>
-            <w:shd w:val="clear" w:color="auto" w:fill="FAFBFF"/>
-            <w:tcBorders>
-              <w:top w:val="none" w:sz="6" w:color="auto"/>
-              <w:bottom w:val="none" w:sz="6" w:color="auto"/>
-              <w:left w:val="none" w:sz="6" w:color="auto"/>
-              <w:right w:val="none" w:sz="6" w:color="auto"/>
-            </w:tcBorders>
-          </w:tcPr>
-          <w:p>
-            <w:pPr>
-              <w:spacing w:before="80" w:after="80"/>
-              <w:jc w:val="center"/>
-            </w:pPr>
-            <w:r>
-              <w:rPr>
-                <w:rFonts w:ascii="Calibri" w:hAnsi="Calibri"/>
-                <w:b w:val="0"/>
-                <w:i w:val="0"/>
-                <w:color w:val="6B7280"/>
-                <w:sz w:val="17"/>
-              </w:rPr>
-              <w:t>Tương tác TPCN – thuốc chống đông máu</w:t>
+              <w:t>Nhận thức ung thư tụy tăng (VnExpress)</w:t>
             </w:r>
           </w:p>
         </w:tc>
@@ -3862,7 +6040,7 @@
         <w:tc>
           <w:tcPr>
             <w:tcW w:type="dxa" w:w="4422"/>
-            <w:shd w:val="clear" w:color="auto" w:fill="FFFFFF"/>
+            <w:shd w:val="clear" w:color="auto" w:fill="FAFBFF"/>
             <w:tcBorders>
               <w:top w:val="none" w:sz="6" w:color="auto"/>
               <w:bottom w:val="none" w:sz="6" w:color="auto"/>
@@ -3883,14 +6061,14 @@
                 <w:color w:val="111827"/>
                 <w:sz w:val="18"/>
               </w:rPr>
-              <w:t>&lt;span class="</w:t>
+              <w:t>Đánh giá khả năng mở rộng danh mục hormone therapy ung thư vú; báo cáo BOD Q3/</w:t>
             </w:r>
           </w:p>
         </w:tc>
         <w:tc>
           <w:tcPr>
             <w:tcW w:type="dxa" w:w="1417"/>
-            <w:shd w:val="clear" w:color="auto" w:fill="FFFFFF"/>
+            <w:shd w:val="clear" w:color="auto" w:fill="FAFBFF"/>
             <w:tcBorders>
               <w:top w:val="none" w:sz="6" w:color="auto"/>
               <w:bottom w:val="none" w:sz="6" w:color="auto"/>
@@ -3917,7 +6095,7 @@
         <w:tc>
           <w:tcPr>
             <w:tcW w:type="dxa" w:w="1134"/>
-            <w:shd w:val="clear" w:color="auto" w:fill="FFFFFF"/>
+            <w:shd w:val="clear" w:color="auto" w:fill="FAFBFF"/>
             <w:tcBorders>
               <w:top w:val="none" w:sz="6" w:color="auto"/>
               <w:bottom w:val="none" w:sz="6" w:color="auto"/>

</xml_diff>

<commit_message>
Update report_vi.docx 2026-05-13 10:44
</commit_message>
<xml_diff>
--- a/report_vi.docx
+++ b/report_vi.docx
@@ -338,7 +338,7 @@
                 <w:color w:val="111827"/>
                 <w:sz w:val="20"/>
               </w:rPr>
-              <w:t>Tuần 11–17/05/2026: Bằng chứng khoa học về lão hóa tăng tốc và làn sóng ung thư ngày càng trẻ hóa xác nhận nhu cầu dài hạn cho toàn bộ danh mục bệnh mạn tính và ung thư của Davipharm, mở cơ hội listing tại kênh bệnh viện tư chuyên sâu.</w:t>
+              <w:t>Tuần 11–17/05/2026 không có tín hiệu reg-policy hay đấu thầu trực tiếp, song ba xu hướng dịch tễ (tiểu đường, ung thư, tâm thần) củng cố cơ sở nhu cầu dài hạn cho danh mục ETC cốt lõi của Davipharm.</w:t>
             </w:r>
           </w:p>
         </w:tc>
@@ -406,7 +406,7 @@
                 <w:color w:val="111827"/>
                 <w:sz w:val="17"/>
               </w:rPr>
-              <w:t>▸  Lão hóa tăng tốc ở 44 &amp; 60:Dữ liệu Stanford xác nhận hai phân khúc bệnh nhân ưu tiên (40–50 và 60+) — nền tảng khoa học mạnh để Marketing định vị "can thiệp sớm" cho RAVASTEL, EIMLER-10, PECHAUNOX và ZENTOGOUT.</w:t>
+              <w:t>▸  Tiểu đường:Truyền thông đại chúng đang nâng cao nhận thức về biến chứng ĐTĐ type 2, củng cố nhu cầu thị trường bền vững cho EIMLER-10 (Empagliflozin) và ZLATKO (Sitagliptin) trong kênh ETC.</w:t>
             </w:r>
           </w:p>
           <w:p>
@@ -422,7 +422,7 @@
                 <w:color w:val="111827"/>
                 <w:sz w:val="17"/>
               </w:rPr>
-              <w:t>▸  Ung thư đại tràng — ~17.000 ca/năm:Bệnh nhân đa bệnh lý (tim mạch, tiêu hóa, huyết khối) tại bệnh viện tư lớn mở cơ hội cross-listing cho JIRACEK, PECHAUNOX và ZABALES trong phác đồ hỗ trợ peri-operative.</w:t>
+              <w:t>▸  Ung thư:Xu hướng tầm soát ung thư tăng và gánh nặng chi phí điều trị tại tuyến tỉnh nhấn mạnh tầm quan trọng chiến lược của việc đưa HYYR (Erlotinib) và LARRIVEY (Bicalutamide) vào danh mục BHYT chu kỳ thầu tới.</w:t>
             </w:r>
           </w:p>
           <w:p>
@@ -438,7 +438,7 @@
                 <w:color w:val="111827"/>
                 <w:sz w:val="17"/>
               </w:rPr>
-              <w:t>▸  Khoảng trống danh mục ung thư vú:Thị trường hormone therapy ung thư vú đang mở rộng nhưng Davipharm chưa có sản phẩm phù hợp — cần đánh giá M&amp;A/in-licensing aromatase inhibitors hoặc anti-estrogens.</w:t>
+              <w:t>▸  Tâm thần:Xu hướng lạm dụng chất kích thần trong cộng đồng là tín hiệu dài hạn cho tăng trưởng bệnh nhân tâm thần — cơ hội mở rộng SERNAL (Risperidone) và LAFAXOR (Venlafaxine) tại bệnh viện tâm thần và khoa tâm thần đa khoa.</w:t>
             </w:r>
           </w:p>
           <w:p>
@@ -454,7 +454,7 @@
                 <w:color w:val="111827"/>
                 <w:sz w:val="17"/>
               </w:rPr>
-              <w:t>▸  P1Marketing &amp; Medical Affairs triển khai chương trình KOL/CME khai thác dữ liệu Stanford</w:t>
+              <w:t>▸  P1ETC/Tender Team: xác nhận HYYR và LARRIVEY nằm trong hồ sơ đăng ký danh mục BHYT và chuẩn bị hồ sơ thầu chu kỳ tới — ư</w:t>
             </w:r>
           </w:p>
         </w:tc>
@@ -498,7 +498,7 @@
                 <w:color w:val="0056D2"/>
                 <w:sz w:val="17"/>
               </w:rPr>
-              <w:t>→  P1Marketing &amp; Medical Affairs triển khai chương trình KOL/CME khai thác dữ liệu Stanford</w:t>
+              <w:t>→  P1ETC/Tender Team: xác nhận HYYR và LARRIVEY nằm trong hồ sơ đăng ký danh mục BHYT và chuẩn bị hồ sơ thầu chu kỳ tới — ư</w:t>
             </w:r>
           </w:p>
         </w:tc>
@@ -830,7 +830,7 @@
                 <w:color w:val="166534"/>
                 <w:sz w:val="22"/>
               </w:rPr>
-              <w:t>4</w:t>
+              <w:t>1</w:t>
             </w:r>
           </w:p>
         </w:tc>
@@ -858,7 +858,7 @@
                 <w:color w:val="374151"/>
                 <w:sz w:val="22"/>
               </w:rPr>
-              <w:t>5</w:t>
+              <w:t>9</w:t>
             </w:r>
           </w:p>
         </w:tc>
@@ -1873,6 +1873,1098 @@
                 <w:color w:val="4338CA"/>
                 <w:sz w:val="15"/>
               </w:rPr>
+              <w:t>VNEXPRESS – SỨC KHỎE</w:t>
+            </w:r>
+          </w:p>
+        </w:tc>
+        <w:tc>
+          <w:tcPr>
+            <w:tcW w:type="dxa" w:w="4536"/>
+            <w:tcBorders>
+              <w:top w:val="none" w:sz="6" w:color="auto"/>
+              <w:bottom w:val="none" w:sz="6" w:color="auto"/>
+              <w:left w:val="none" w:sz="6" w:color="auto"/>
+              <w:right w:val="none" w:sz="6" w:color="auto"/>
+            </w:tcBorders>
+          </w:tcPr>
+          <w:p>
+            <w:pPr>
+              <w:spacing w:before="60" w:after="60"/>
+              <w:ind w:left="113"/>
+            </w:pPr>
+            <w:r>
+              <w:rPr>
+                <w:rFonts w:ascii="Calibri" w:hAnsi="Calibri"/>
+                <w:b/>
+                <w:i w:val="0"/>
+                <w:color w:val="111827"/>
+                <w:sz w:val="21"/>
+              </w:rPr>
+              <w:t>Bộ Y tế hỗ trợ gần 6 tỷ đồng thuốc men, thiết bị y tế cho quân dân Trường Sa</w:t>
+            </w:r>
+          </w:p>
+        </w:tc>
+      </w:tr>
+    </w:tbl>
+    <w:p>
+      <w:pPr>
+        <w:spacing w:before="40" w:after="40"/>
+        <w:ind w:left="170"/>
+      </w:pPr>
+      <w:r>
+        <w:rPr>
+          <w:rFonts w:ascii="Calibri" w:hAnsi="Calibri"/>
+          <w:b w:val="0"/>
+          <w:i/>
+          <w:color w:val="6B7280"/>
+          <w:sz w:val="18"/>
+        </w:rPr>
+        <w:t>Bộ Y tế trao tặng thiết bị y tế, thuốc men và nhu yếu phẩm trị giá gần 6 tỷ đồng cho 7 đảo và Nhà giàn DK1/2 tại Trường Sa, trong đó 3,3 tỷ đồng dành cho thiết bị và vật tư y tế. Đây là hoạt động nhân đạo/quốc phòng đặc thù, không liên quan trực tiếp đến kênh đấu thầu ETC thương mại mà Davipharm đang tham gia.</w:t>
+      </w:r>
+    </w:p>
+    <w:p>
+      <w:pPr>
+        <w:spacing w:before="20" w:after="40"/>
+        <w:ind w:left="170"/>
+      </w:pPr>
+      <w:r>
+        <w:rPr>
+          <w:rFonts w:ascii="Calibri" w:hAnsi="Calibri"/>
+          <w:b/>
+          <w:i w:val="0"/>
+          <w:color w:val="374151"/>
+          <w:sz w:val="17"/>
+        </w:rPr>
+        <w:t>⚪ Tin không tác động trực tiếp đến doanh thu hoặc danh mục đấu thầu của Davipharm; theo dõi nếu Bộ Y tế mở rộng chương trình hỗ trợ thuốc quốc phòng thành cơ chế mua sắm tập trung có cạnh tranh.</w:t>
+      </w:r>
+    </w:p>
+    <w:tbl>
+      <w:tblPr>
+        <w:tblStyle w:val="TableGrid"/>
+        <w:tblW w:type="auto" w:w="0"/>
+        <w:tblLook w:firstColumn="1" w:firstRow="1" w:lastColumn="0" w:lastRow="0" w:noHBand="0" w:noVBand="1" w:val="04A0"/>
+      </w:tblPr>
+      <w:tblGrid>
+        <w:gridCol w:w="9072"/>
+      </w:tblGrid>
+      <w:tr>
+        <w:tc>
+          <w:tcPr>
+            <w:tcW w:type="dxa" w:w="9072"/>
+            <w:shd w:val="clear" w:color="auto" w:fill="F8FAFC"/>
+            <w:tcBorders>
+              <w:top w:val="none" w:sz="6" w:color="auto"/>
+              <w:bottom w:val="none" w:sz="6" w:color="auto"/>
+              <w:left w:val="single" w:sz="12" w:color="003B71"/>
+              <w:right w:val="none" w:sz="6" w:color="auto"/>
+            </w:tcBorders>
+          </w:tcPr>
+          <w:p>
+            <w:pPr>
+              <w:spacing w:before="60" w:after="60"/>
+              <w:ind w:left="142"/>
+            </w:pPr>
+            <w:r>
+              <w:rPr>
+                <w:rFonts w:ascii="Calibri" w:hAnsi="Calibri"/>
+                <w:b/>
+                <w:i w:val="0"/>
+                <w:color w:val="003B71"/>
+                <w:sz w:val="17"/>
+              </w:rPr>
+              <w:t xml:space="preserve">Strategy  </w:t>
+            </w:r>
+            <w:r>
+              <w:rPr>
+                <w:rFonts w:ascii="Calibri" w:hAnsi="Calibri"/>
+                <w:b w:val="0"/>
+                <w:i w:val="0"/>
+                <w:color w:val="334155"/>
+                <w:sz w:val="17"/>
+              </w:rPr>
+              <w:t>Không cần hành động tức thời. BD/Tender team có thể lưu ý kênh cung ứng thuốc cho hệ thống quân y (Bộ Quốc phòng) như một cơ hội dài hạn tiềm năng, đặc biệt với các sản phẩm thiết yếu như METILONE-4 (Methylprednisolone) hoặc kháng sinh — nhưng cần xác minh quy trình mua sắm riêng của quân đội trước khi triển khai.</w:t>
+            </w:r>
+          </w:p>
+        </w:tc>
+      </w:tr>
+    </w:tbl>
+    <w:p>
+      <w:pPr>
+        <w:spacing w:before="40" w:after="120"/>
+      </w:pPr>
+    </w:p>
+    <w:tbl>
+      <w:tblPr>
+        <w:tblStyle w:val="TableGrid"/>
+        <w:tblW w:type="auto" w:w="0"/>
+        <w:jc w:val="left"/>
+        <w:tblLook w:firstColumn="1" w:firstRow="1" w:lastColumn="0" w:lastRow="0" w:noHBand="0" w:noVBand="1" w:val="04A0"/>
+      </w:tblPr>
+      <w:tblGrid>
+        <w:gridCol w:w="4536"/>
+        <w:gridCol w:w="4536"/>
+      </w:tblGrid>
+      <w:tr>
+        <w:tc>
+          <w:tcPr>
+            <w:tcW w:type="dxa" w:w="1984"/>
+            <w:shd w:val="clear" w:color="auto" w:fill="EEF2FF"/>
+            <w:tcBorders>
+              <w:top w:val="none" w:sz="6" w:color="auto"/>
+              <w:bottom w:val="none" w:sz="6" w:color="auto"/>
+              <w:left w:val="none" w:sz="6" w:color="auto"/>
+              <w:right w:val="none" w:sz="6" w:color="auto"/>
+            </w:tcBorders>
+          </w:tcPr>
+          <w:p>
+            <w:pPr>
+              <w:spacing w:before="80" w:after="80"/>
+              <w:ind w:left="85"/>
+            </w:pPr>
+            <w:r>
+              <w:rPr>
+                <w:rFonts w:ascii="Calibri" w:hAnsi="Calibri"/>
+                <w:b/>
+                <w:i w:val="0"/>
+                <w:color w:val="4338CA"/>
+                <w:sz w:val="15"/>
+              </w:rPr>
+              <w:t>VNEXPRESS – SỨC KHỎE</w:t>
+            </w:r>
+          </w:p>
+        </w:tc>
+        <w:tc>
+          <w:tcPr>
+            <w:tcW w:type="dxa" w:w="4536"/>
+            <w:tcBorders>
+              <w:top w:val="none" w:sz="6" w:color="auto"/>
+              <w:bottom w:val="none" w:sz="6" w:color="auto"/>
+              <w:left w:val="none" w:sz="6" w:color="auto"/>
+              <w:right w:val="none" w:sz="6" w:color="auto"/>
+            </w:tcBorders>
+          </w:tcPr>
+          <w:p>
+            <w:pPr>
+              <w:spacing w:before="60" w:after="60"/>
+              <w:ind w:left="113"/>
+            </w:pPr>
+            <w:r>
+              <w:rPr>
+                <w:rFonts w:ascii="Calibri" w:hAnsi="Calibri"/>
+                <w:b/>
+                <w:i w:val="0"/>
+                <w:color w:val="111827"/>
+                <w:sz w:val="21"/>
+              </w:rPr>
+              <w:t>Combo 3 ma túy tổng hợp gây tổn thương thần kinh nghiêm trọng — cảnh báo lạm dụng Ketamine, MDMA, Methamphetamine</w:t>
+            </w:r>
+          </w:p>
+        </w:tc>
+      </w:tr>
+    </w:tbl>
+    <w:p>
+      <w:pPr>
+        <w:spacing w:before="40" w:after="40"/>
+        <w:ind w:left="170"/>
+      </w:pPr>
+      <w:r>
+        <w:rPr>
+          <w:rFonts w:ascii="Calibri" w:hAnsi="Calibri"/>
+          <w:b w:val="0"/>
+          <w:i/>
+          <w:color w:val="6B7280"/>
+          <w:sz w:val="18"/>
+        </w:rPr>
+        <w:t>Vụ bắt giữ ca sĩ Miu Lê dương tính đồng thời với Methamphetamine, MDMA và Ketamine làm dấy lên cảnh báo y tế về hậu quả tổn thương thần kinh trung ương, trầm cảm và rối loạn tâm thần kéo dài do lạm dụng chất kích thần. Bài viết không đề cập đến sản phẩm dược phẩm generic hay chính sách đấu thầu, song gián tiếp phản ánh nhu cầu điều trị rối loạn tâm thần (trầm cảm, lo âu, rối loạn hành vi) có thể tăng theo xu hướng lạm dụng chất kích thần trong cộng đồng.</w:t>
+      </w:r>
+    </w:p>
+    <w:p>
+      <w:pPr>
+        <w:spacing w:before="20" w:after="40"/>
+        <w:ind w:left="170"/>
+      </w:pPr>
+      <w:r>
+        <w:rPr>
+          <w:rFonts w:ascii="Calibri" w:hAnsi="Calibri"/>
+          <w:b/>
+          <w:i w:val="0"/>
+          <w:color w:val="374151"/>
+          <w:sz w:val="17"/>
+        </w:rPr>
+        <w:t>📊 Tác động gián tiếp, không ảnh hưởng trực tiếp đến doanh thu hay đấu thầu; theo dõi xu hướng gia tăng bệnh nhân tâm thần để đánh giá tiềm năng dài hạn cho SERNAL (Risperidone) và LAFAXOR (Venlafaxine) trong kênh ETC.</w:t>
+      </w:r>
+    </w:p>
+    <w:tbl>
+      <w:tblPr>
+        <w:tblStyle w:val="TableGrid"/>
+        <w:tblW w:type="auto" w:w="0"/>
+        <w:tblLook w:firstColumn="1" w:firstRow="1" w:lastColumn="0" w:lastRow="0" w:noHBand="0" w:noVBand="1" w:val="04A0"/>
+      </w:tblPr>
+      <w:tblGrid>
+        <w:gridCol w:w="9072"/>
+      </w:tblGrid>
+      <w:tr>
+        <w:tc>
+          <w:tcPr>
+            <w:tcW w:type="dxa" w:w="9072"/>
+            <w:shd w:val="clear" w:color="auto" w:fill="F8FAFC"/>
+            <w:tcBorders>
+              <w:top w:val="none" w:sz="6" w:color="auto"/>
+              <w:bottom w:val="none" w:sz="6" w:color="auto"/>
+              <w:left w:val="single" w:sz="12" w:color="003B71"/>
+              <w:right w:val="none" w:sz="6" w:color="auto"/>
+            </w:tcBorders>
+          </w:tcPr>
+          <w:p>
+            <w:pPr>
+              <w:spacing w:before="60" w:after="60"/>
+              <w:ind w:left="142"/>
+            </w:pPr>
+            <w:r>
+              <w:rPr>
+                <w:rFonts w:ascii="Calibri" w:hAnsi="Calibri"/>
+                <w:b/>
+                <w:i w:val="0"/>
+                <w:color w:val="003B71"/>
+                <w:sz w:val="17"/>
+              </w:rPr>
+              <w:t xml:space="preserve">Strategy  </w:t>
+            </w:r>
+            <w:r>
+              <w:rPr>
+                <w:rFonts w:ascii="Calibri" w:hAnsi="Calibri"/>
+                <w:b w:val="0"/>
+                <w:i w:val="0"/>
+                <w:color w:val="334155"/>
+                <w:sz w:val="17"/>
+              </w:rPr>
+              <w:t>Team Marketing &amp; Medical Affairs theo dõi dữ liệu dịch tễ về rối loạn tâm thần liên quan lạm dụng chất kích thần; đánh giá cơ hội mở rộng danh mục SERNAL và LAFAXOR tại các bệnh viện tâm thần/khoa tâm thần bệnh viện đa khoa trong chu kỳ thầu tiếp theo (dự kiến 2025–2026).</w:t>
+            </w:r>
+          </w:p>
+        </w:tc>
+      </w:tr>
+    </w:tbl>
+    <w:p>
+      <w:pPr>
+        <w:spacing w:before="40" w:after="120"/>
+      </w:pPr>
+    </w:p>
+    <w:tbl>
+      <w:tblPr>
+        <w:tblStyle w:val="TableGrid"/>
+        <w:tblW w:type="auto" w:w="0"/>
+        <w:jc w:val="left"/>
+        <w:tblLook w:firstColumn="1" w:firstRow="1" w:lastColumn="0" w:lastRow="0" w:noHBand="0" w:noVBand="1" w:val="04A0"/>
+      </w:tblPr>
+      <w:tblGrid>
+        <w:gridCol w:w="4536"/>
+        <w:gridCol w:w="4536"/>
+      </w:tblGrid>
+      <w:tr>
+        <w:tc>
+          <w:tcPr>
+            <w:tcW w:type="dxa" w:w="1984"/>
+            <w:shd w:val="clear" w:color="auto" w:fill="EEF2FF"/>
+            <w:tcBorders>
+              <w:top w:val="none" w:sz="6" w:color="auto"/>
+              <w:bottom w:val="none" w:sz="6" w:color="auto"/>
+              <w:left w:val="none" w:sz="6" w:color="auto"/>
+              <w:right w:val="none" w:sz="6" w:color="auto"/>
+            </w:tcBorders>
+          </w:tcPr>
+          <w:p>
+            <w:pPr>
+              <w:spacing w:before="80" w:after="80"/>
+              <w:ind w:left="85"/>
+            </w:pPr>
+            <w:r>
+              <w:rPr>
+                <w:rFonts w:ascii="Calibri" w:hAnsi="Calibri"/>
+                <w:b/>
+                <w:i w:val="0"/>
+                <w:color w:val="4338CA"/>
+                <w:sz w:val="15"/>
+              </w:rPr>
+              <w:t>VNEXPRESS – SỨC KHỎE</w:t>
+            </w:r>
+          </w:p>
+        </w:tc>
+        <w:tc>
+          <w:tcPr>
+            <w:tcW w:type="dxa" w:w="4536"/>
+            <w:tcBorders>
+              <w:top w:val="none" w:sz="6" w:color="auto"/>
+              <w:bottom w:val="none" w:sz="6" w:color="auto"/>
+              <w:left w:val="none" w:sz="6" w:color="auto"/>
+              <w:right w:val="none" w:sz="6" w:color="auto"/>
+            </w:tcBorders>
+          </w:tcPr>
+          <w:p>
+            <w:pPr>
+              <w:spacing w:before="60" w:after="60"/>
+              <w:ind w:left="113"/>
+            </w:pPr>
+            <w:r>
+              <w:rPr>
+                <w:rFonts w:ascii="Calibri" w:hAnsi="Calibri"/>
+                <w:b/>
+                <w:i w:val="0"/>
+                <w:color w:val="111827"/>
+                <w:sz w:val="21"/>
+              </w:rPr>
+              <w:t>Lính Anh nhảy dù cứu bệnh nhân nghi nhiễm Hantavirus trên đảo hẻo lánh</w:t>
+            </w:r>
+          </w:p>
+        </w:tc>
+      </w:tr>
+    </w:tbl>
+    <w:p>
+      <w:pPr>
+        <w:spacing w:before="40" w:after="40"/>
+        <w:ind w:left="170"/>
+      </w:pPr>
+      <w:r>
+        <w:rPr>
+          <w:rFonts w:ascii="Calibri" w:hAnsi="Calibri"/>
+          <w:b w:val="0"/>
+          <w:i/>
+          <w:color w:val="6B7280"/>
+          <w:sz w:val="18"/>
+        </w:rPr>
+        <w:t>Quân đội Anh triển khai chiến dịch nhảy dù khẩn cấp đến đảo Tristan da Cunha để cứu chữa ca nghi nhiễm Hantavirus chủng Andes — chủng có khả năng lây người-người — từ tàu MV Hondius, khiến 3 người tử vong. Đây là sự kiện y tế quốc tế không liên quan trực tiếp đến thị trường dược phẩm Việt Nam hay danh mục sản phẩm của Davipharm.</w:t>
+      </w:r>
+    </w:p>
+    <w:p>
+      <w:pPr>
+        <w:spacing w:before="20" w:after="40"/>
+        <w:ind w:left="170"/>
+      </w:pPr>
+      <w:r>
+        <w:rPr>
+          <w:rFonts w:ascii="Calibri" w:hAnsi="Calibri"/>
+          <w:b/>
+          <w:i w:val="0"/>
+          <w:color w:val="374151"/>
+          <w:sz w:val="17"/>
+        </w:rPr>
+        <w:t>⚪ Không có tác động trực tiếp đến Davipharm — bài tin tức y tế quốc tế nằm ngoài phạm vi danh mục sản phẩm và thị trường mục tiêu của công ty.</w:t>
+      </w:r>
+    </w:p>
+    <w:tbl>
+      <w:tblPr>
+        <w:tblStyle w:val="TableGrid"/>
+        <w:tblW w:type="auto" w:w="0"/>
+        <w:tblLook w:firstColumn="1" w:firstRow="1" w:lastColumn="0" w:lastRow="0" w:noHBand="0" w:noVBand="1" w:val="04A0"/>
+      </w:tblPr>
+      <w:tblGrid>
+        <w:gridCol w:w="9072"/>
+      </w:tblGrid>
+      <w:tr>
+        <w:tc>
+          <w:tcPr>
+            <w:tcW w:type="dxa" w:w="9072"/>
+            <w:shd w:val="clear" w:color="auto" w:fill="F8FAFC"/>
+            <w:tcBorders>
+              <w:top w:val="none" w:sz="6" w:color="auto"/>
+              <w:bottom w:val="none" w:sz="6" w:color="auto"/>
+              <w:left w:val="single" w:sz="12" w:color="003B71"/>
+              <w:right w:val="none" w:sz="6" w:color="auto"/>
+            </w:tcBorders>
+          </w:tcPr>
+          <w:p>
+            <w:pPr>
+              <w:spacing w:before="60" w:after="60"/>
+              <w:ind w:left="142"/>
+            </w:pPr>
+            <w:r>
+              <w:rPr>
+                <w:rFonts w:ascii="Calibri" w:hAnsi="Calibri"/>
+                <w:b/>
+                <w:i w:val="0"/>
+                <w:color w:val="003B71"/>
+                <w:sz w:val="17"/>
+              </w:rPr>
+              <w:t xml:space="preserve">Strategy  </w:t>
+            </w:r>
+            <w:r>
+              <w:rPr>
+                <w:rFonts w:ascii="Calibri" w:hAnsi="Calibri"/>
+                <w:b w:val="0"/>
+                <w:i w:val="0"/>
+                <w:color w:val="334155"/>
+                <w:sz w:val="17"/>
+              </w:rPr>
+              <w:t>Không cần hành động. BOD có thể lưu ý theo dõi nếu WHO/Bộ Y tế Việt Nam phát cảnh báo dịch tễ Hantavirus tại Việt Nam, nhưng hiện tại chưa có sản phẩm nào trong danh mục Davipharm liên quan đến điều trị virus này.</w:t>
+            </w:r>
+          </w:p>
+        </w:tc>
+      </w:tr>
+    </w:tbl>
+    <w:p>
+      <w:pPr>
+        <w:spacing w:before="40" w:after="120"/>
+      </w:pPr>
+    </w:p>
+    <w:tbl>
+      <w:tblPr>
+        <w:tblStyle w:val="TableGrid"/>
+        <w:tblW w:type="auto" w:w="0"/>
+        <w:jc w:val="left"/>
+        <w:tblLook w:firstColumn="1" w:firstRow="1" w:lastColumn="0" w:lastRow="0" w:noHBand="0" w:noVBand="1" w:val="04A0"/>
+      </w:tblPr>
+      <w:tblGrid>
+        <w:gridCol w:w="4536"/>
+        <w:gridCol w:w="4536"/>
+      </w:tblGrid>
+      <w:tr>
+        <w:tc>
+          <w:tcPr>
+            <w:tcW w:type="dxa" w:w="1984"/>
+            <w:shd w:val="clear" w:color="auto" w:fill="EEF2FF"/>
+            <w:tcBorders>
+              <w:top w:val="none" w:sz="6" w:color="auto"/>
+              <w:bottom w:val="none" w:sz="6" w:color="auto"/>
+              <w:left w:val="none" w:sz="6" w:color="auto"/>
+              <w:right w:val="none" w:sz="6" w:color="auto"/>
+            </w:tcBorders>
+          </w:tcPr>
+          <w:p>
+            <w:pPr>
+              <w:spacing w:before="80" w:after="80"/>
+              <w:ind w:left="85"/>
+            </w:pPr>
+            <w:r>
+              <w:rPr>
+                <w:rFonts w:ascii="Calibri" w:hAnsi="Calibri"/>
+                <w:b/>
+                <w:i w:val="0"/>
+                <w:color w:val="4338CA"/>
+                <w:sz w:val="15"/>
+              </w:rPr>
+              <w:t>VNEXPRESS – SỨC KHỎE</w:t>
+            </w:r>
+          </w:p>
+        </w:tc>
+        <w:tc>
+          <w:tcPr>
+            <w:tcW w:type="dxa" w:w="4536"/>
+            <w:tcBorders>
+              <w:top w:val="none" w:sz="6" w:color="auto"/>
+              <w:bottom w:val="none" w:sz="6" w:color="auto"/>
+              <w:left w:val="none" w:sz="6" w:color="auto"/>
+              <w:right w:val="none" w:sz="6" w:color="auto"/>
+            </w:tcBorders>
+          </w:tcPr>
+          <w:p>
+            <w:pPr>
+              <w:spacing w:before="60" w:after="60"/>
+              <w:ind w:left="113"/>
+            </w:pPr>
+            <w:r>
+              <w:rPr>
+                <w:rFonts w:ascii="Calibri" w:hAnsi="Calibri"/>
+                <w:b/>
+                <w:i w:val="0"/>
+                <w:color w:val="111827"/>
+                <w:sz w:val="21"/>
+              </w:rPr>
+              <w:t>Cảnh báo ung thư đại trực tràng từ thực phẩm siêu chế biến — Xu hướng tầm soát &amp; nhu cầu điều trị ung thư tăng</w:t>
+            </w:r>
+          </w:p>
+        </w:tc>
+      </w:tr>
+    </w:tbl>
+    <w:p>
+      <w:pPr>
+        <w:spacing w:before="40" w:after="40"/>
+        <w:ind w:left="170"/>
+      </w:pPr>
+      <w:r>
+        <w:rPr>
+          <w:rFonts w:ascii="Calibri" w:hAnsi="Calibri"/>
+          <w:b w:val="0"/>
+          <w:i/>
+          <w:color w:val="6B7280"/>
+          <w:sz w:val="18"/>
+        </w:rPr>
+        <w:t>Nghiên cứu đăng trên JAMA Oncology xác nhận tiêu thụ thực phẩm siêu chế biến cao làm tăng rõ rệt nguy cơ polyp tuyến tiền ung thư đại trực tràng, thúc đẩy xu hướng tầm soát và điều trị ung thư sớm hơn tại Việt Nam. Xu hướng này có thể mở rộng thị trường cho nhóm sản phẩm ung thư high-value ETC của Davipharm, đặc biệt HYYR (Erlotinib) và LARRIVEY (Bicalutamide) trong kênh bệnh viện.</w:t>
+      </w:r>
+    </w:p>
+    <w:p>
+      <w:pPr>
+        <w:spacing w:before="20" w:after="40"/>
+        <w:ind w:left="170"/>
+      </w:pPr>
+      <w:r>
+        <w:rPr>
+          <w:rFonts w:ascii="Calibri" w:hAnsi="Calibri"/>
+          <w:b/>
+          <w:i w:val="0"/>
+          <w:color w:val="374151"/>
+          <w:sz w:val="17"/>
+        </w:rPr>
+        <w:t>📊 Tín hiệu dài hạn: nhu cầu điều trị ung thư tăng có lợi cho danh mục ETC cao cấp nhưng tác động trực tiếp đến doanh thu ngắn hạn là chưa rõ ràng.</w:t>
+      </w:r>
+    </w:p>
+    <w:tbl>
+      <w:tblPr>
+        <w:tblStyle w:val="TableGrid"/>
+        <w:tblW w:type="auto" w:w="0"/>
+        <w:tblLook w:firstColumn="1" w:firstRow="1" w:lastColumn="0" w:lastRow="0" w:noHBand="0" w:noVBand="1" w:val="04A0"/>
+      </w:tblPr>
+      <w:tblGrid>
+        <w:gridCol w:w="9072"/>
+      </w:tblGrid>
+      <w:tr>
+        <w:tc>
+          <w:tcPr>
+            <w:tcW w:type="dxa" w:w="9072"/>
+            <w:shd w:val="clear" w:color="auto" w:fill="F8FAFC"/>
+            <w:tcBorders>
+              <w:top w:val="none" w:sz="6" w:color="auto"/>
+              <w:bottom w:val="none" w:sz="6" w:color="auto"/>
+              <w:left w:val="single" w:sz="12" w:color="003B71"/>
+              <w:right w:val="none" w:sz="6" w:color="auto"/>
+            </w:tcBorders>
+          </w:tcPr>
+          <w:p>
+            <w:pPr>
+              <w:spacing w:before="60" w:after="60"/>
+              <w:ind w:left="142"/>
+            </w:pPr>
+            <w:r>
+              <w:rPr>
+                <w:rFonts w:ascii="Calibri" w:hAnsi="Calibri"/>
+                <w:b/>
+                <w:i w:val="0"/>
+                <w:color w:val="003B71"/>
+                <w:sz w:val="17"/>
+              </w:rPr>
+              <w:t xml:space="preserve">Strategy  </w:t>
+            </w:r>
+            <w:r>
+              <w:rPr>
+                <w:rFonts w:ascii="Calibri" w:hAnsi="Calibri"/>
+                <w:b w:val="0"/>
+                <w:i w:val="0"/>
+                <w:color w:val="334155"/>
+                <w:sz w:val="17"/>
+              </w:rPr>
+              <w:t>Team Marketing ETC phối hợp với Medical Affairs theo dõi số liệu tầm soát ung thư đại trực tràng tại các bệnh viện trọng điểm; đánh giá tiềm năng mở rộng danh mục HYYR và LARRIVEY trong chu kỳ đấu thầu tiếp theo (Q3/2025).</w:t>
+            </w:r>
+          </w:p>
+        </w:tc>
+      </w:tr>
+    </w:tbl>
+    <w:p>
+      <w:pPr>
+        <w:spacing w:before="40" w:after="120"/>
+      </w:pPr>
+    </w:p>
+    <w:tbl>
+      <w:tblPr>
+        <w:tblStyle w:val="TableGrid"/>
+        <w:tblW w:type="auto" w:w="0"/>
+        <w:jc w:val="left"/>
+        <w:tblLook w:firstColumn="1" w:firstRow="1" w:lastColumn="0" w:lastRow="0" w:noHBand="0" w:noVBand="1" w:val="04A0"/>
+      </w:tblPr>
+      <w:tblGrid>
+        <w:gridCol w:w="4536"/>
+        <w:gridCol w:w="4536"/>
+      </w:tblGrid>
+      <w:tr>
+        <w:tc>
+          <w:tcPr>
+            <w:tcW w:type="dxa" w:w="1984"/>
+            <w:shd w:val="clear" w:color="auto" w:fill="EEF2FF"/>
+            <w:tcBorders>
+              <w:top w:val="none" w:sz="6" w:color="auto"/>
+              <w:bottom w:val="none" w:sz="6" w:color="auto"/>
+              <w:left w:val="none" w:sz="6" w:color="auto"/>
+              <w:right w:val="none" w:sz="6" w:color="auto"/>
+            </w:tcBorders>
+          </w:tcPr>
+          <w:p>
+            <w:pPr>
+              <w:spacing w:before="80" w:after="80"/>
+              <w:ind w:left="85"/>
+            </w:pPr>
+            <w:r>
+              <w:rPr>
+                <w:rFonts w:ascii="Calibri" w:hAnsi="Calibri"/>
+                <w:b/>
+                <w:i w:val="0"/>
+                <w:color w:val="4338CA"/>
+                <w:sz w:val="15"/>
+              </w:rPr>
+              <w:t>VNEXPRESS – SỨC KHỎE</w:t>
+            </w:r>
+          </w:p>
+        </w:tc>
+        <w:tc>
+          <w:tcPr>
+            <w:tcW w:type="dxa" w:w="4536"/>
+            <w:tcBorders>
+              <w:top w:val="none" w:sz="6" w:color="auto"/>
+              <w:bottom w:val="none" w:sz="6" w:color="auto"/>
+              <w:left w:val="none" w:sz="6" w:color="auto"/>
+              <w:right w:val="none" w:sz="6" w:color="auto"/>
+            </w:tcBorders>
+          </w:tcPr>
+          <w:p>
+            <w:pPr>
+              <w:spacing w:before="60" w:after="60"/>
+              <w:ind w:left="113"/>
+            </w:pPr>
+            <w:r>
+              <w:rPr>
+                <w:rFonts w:ascii="Calibri" w:hAnsi="Calibri"/>
+                <w:b/>
+                <w:i w:val="0"/>
+                <w:color w:val="111827"/>
+                <w:sz w:val="21"/>
+              </w:rPr>
+              <w:t>Xu hướng kiểm soát huyết áp bằng thực phẩm tự nhiên (củ dền) — tín hiệu cạnh tranh nhẹ với nhóm thuốc tim mạch</w:t>
+            </w:r>
+          </w:p>
+        </w:tc>
+      </w:tr>
+    </w:tbl>
+    <w:p>
+      <w:pPr>
+        <w:spacing w:before="40" w:after="40"/>
+        <w:ind w:left="170"/>
+      </w:pPr>
+      <w:r>
+        <w:rPr>
+          <w:rFonts w:ascii="Calibri" w:hAnsi="Calibri"/>
+          <w:b w:val="0"/>
+          <w:i/>
+          <w:color w:val="6B7280"/>
+          <w:sz w:val="18"/>
+        </w:rPr>
+        <w:t>Truyền thông y tế phổ thông đang quảng bá mạnh việc hạ huyết áp bằng nước ép củ dền (giảm ~8/4 mmHg) thay thế dùng thuốc, tạo tâm lý "không cần thuốc" trong nhóm bệnh nhân tăng huyết áp nhẹ — phân khúc khách hàng tiềm năng của PECHAUNOX (Perindopril+Amlodipin), TABAREX (Valsartan) và HATLOP (Irbesartan). Tuy nhiên, đây là thông tin từ kênh truyền thông quốc tế, chưa phản ánh thay đổi hành vi kê đơn tại Việt Nam.</w:t>
+      </w:r>
+    </w:p>
+    <w:p>
+      <w:pPr>
+        <w:spacing w:before="20" w:after="40"/>
+        <w:ind w:left="170"/>
+      </w:pPr>
+      <w:r>
+        <w:rPr>
+          <w:rFonts w:ascii="Calibri" w:hAnsi="Calibri"/>
+          <w:b/>
+          <w:i w:val="0"/>
+          <w:color w:val="374151"/>
+          <w:sz w:val="17"/>
+        </w:rPr>
+        <w:t>⚠️ Rủi ro dài hạn thấp — xu hướng "thực phẩm thay thuốc" có thể làm chậm nhận thuốc mới ở bệnh nhân THA nhẹ, nhưng chưa đủ để tác động đến doanh thu ETC kênh bệnh viện của Davipharm trong ngắn hạn.</w:t>
+      </w:r>
+    </w:p>
+    <w:tbl>
+      <w:tblPr>
+        <w:tblStyle w:val="TableGrid"/>
+        <w:tblW w:type="auto" w:w="0"/>
+        <w:tblLook w:firstColumn="1" w:firstRow="1" w:lastColumn="0" w:lastRow="0" w:noHBand="0" w:noVBand="1" w:val="04A0"/>
+      </w:tblPr>
+      <w:tblGrid>
+        <w:gridCol w:w="9072"/>
+      </w:tblGrid>
+      <w:tr>
+        <w:tc>
+          <w:tcPr>
+            <w:tcW w:type="dxa" w:w="9072"/>
+            <w:shd w:val="clear" w:color="auto" w:fill="F8FAFC"/>
+            <w:tcBorders>
+              <w:top w:val="none" w:sz="6" w:color="auto"/>
+              <w:bottom w:val="none" w:sz="6" w:color="auto"/>
+              <w:left w:val="single" w:sz="12" w:color="003B71"/>
+              <w:right w:val="none" w:sz="6" w:color="auto"/>
+            </w:tcBorders>
+          </w:tcPr>
+          <w:p>
+            <w:pPr>
+              <w:spacing w:before="60" w:after="60"/>
+              <w:ind w:left="142"/>
+            </w:pPr>
+            <w:r>
+              <w:rPr>
+                <w:rFonts w:ascii="Calibri" w:hAnsi="Calibri"/>
+                <w:b/>
+                <w:i w:val="0"/>
+                <w:color w:val="003B71"/>
+                <w:sz w:val="17"/>
+              </w:rPr>
+              <w:t xml:space="preserve">Strategy  </w:t>
+            </w:r>
+            <w:r>
+              <w:rPr>
+                <w:rFonts w:ascii="Calibri" w:hAnsi="Calibri"/>
+                <w:b w:val="0"/>
+                <w:i w:val="0"/>
+                <w:color w:val="334155"/>
+                <w:sz w:val="17"/>
+              </w:rPr>
+              <w:t>Team Marketing (tim mạch) theo dõi tần suất nội dung "hạ huyết áp không dùng thuốc" trên mạng xã hội Việt Nam; nếu xu hướng tăng mạnh trong Q3/2025, phối hợp Medical Affairs chuẩn bị tài liệu giáo dục HCP nhấn mạnh vai trò không thể thay thế của thuốc (PECHAUNOX, TABAREX) trong THA độ 2 trở lên và bệnh nhân có bệnh đồng mắc.</w:t>
+            </w:r>
+          </w:p>
+        </w:tc>
+      </w:tr>
+    </w:tbl>
+    <w:p>
+      <w:pPr>
+        <w:spacing w:before="40" w:after="120"/>
+      </w:pPr>
+    </w:p>
+    <w:tbl>
+      <w:tblPr>
+        <w:tblStyle w:val="TableGrid"/>
+        <w:tblW w:type="auto" w:w="0"/>
+        <w:jc w:val="left"/>
+        <w:tblLook w:firstColumn="1" w:firstRow="1" w:lastColumn="0" w:lastRow="0" w:noHBand="0" w:noVBand="1" w:val="04A0"/>
+      </w:tblPr>
+      <w:tblGrid>
+        <w:gridCol w:w="4536"/>
+        <w:gridCol w:w="4536"/>
+      </w:tblGrid>
+      <w:tr>
+        <w:tc>
+          <w:tcPr>
+            <w:tcW w:type="dxa" w:w="1984"/>
+            <w:shd w:val="clear" w:color="auto" w:fill="EEF2FF"/>
+            <w:tcBorders>
+              <w:top w:val="none" w:sz="6" w:color="auto"/>
+              <w:bottom w:val="none" w:sz="6" w:color="auto"/>
+              <w:left w:val="none" w:sz="6" w:color="auto"/>
+              <w:right w:val="none" w:sz="6" w:color="auto"/>
+            </w:tcBorders>
+          </w:tcPr>
+          <w:p>
+            <w:pPr>
+              <w:spacing w:before="80" w:after="80"/>
+              <w:ind w:left="85"/>
+            </w:pPr>
+            <w:r>
+              <w:rPr>
+                <w:rFonts w:ascii="Calibri" w:hAnsi="Calibri"/>
+                <w:b/>
+                <w:i w:val="0"/>
+                <w:color w:val="4338CA"/>
+                <w:sz w:val="15"/>
+              </w:rPr>
+              <w:t>VNEXPRESS – SỨC KHỎE</w:t>
+            </w:r>
+          </w:p>
+        </w:tc>
+        <w:tc>
+          <w:tcPr>
+            <w:tcW w:type="dxa" w:w="4536"/>
+            <w:tcBorders>
+              <w:top w:val="none" w:sz="6" w:color="auto"/>
+              <w:bottom w:val="none" w:sz="6" w:color="auto"/>
+              <w:left w:val="none" w:sz="6" w:color="auto"/>
+              <w:right w:val="none" w:sz="6" w:color="auto"/>
+            </w:tcBorders>
+          </w:tcPr>
+          <w:p>
+            <w:pPr>
+              <w:spacing w:before="60" w:after="60"/>
+              <w:ind w:left="113"/>
+            </w:pPr>
+            <w:r>
+              <w:rPr>
+                <w:rFonts w:ascii="Calibri" w:hAnsi="Calibri"/>
+                <w:b/>
+                <w:i w:val="0"/>
+                <w:color w:val="111827"/>
+                <w:sz w:val="21"/>
+              </w:rPr>
+              <w:t>Ung thư u nguyên bào thần kinh trẻ em: Gánh nặng chi phí ghép tế bào gốc và khoảng trống hỗ trợ điều trị</w:t>
+            </w:r>
+          </w:p>
+        </w:tc>
+      </w:tr>
+    </w:tbl>
+    <w:p>
+      <w:pPr>
+        <w:spacing w:before="40" w:after="40"/>
+        <w:ind w:left="170"/>
+      </w:pPr>
+      <w:r>
+        <w:rPr>
+          <w:rFonts w:ascii="Calibri" w:hAnsi="Calibri"/>
+          <w:b w:val="0"/>
+          <w:i/>
+          <w:color w:val="6B7280"/>
+          <w:sz w:val="18"/>
+        </w:rPr>
+        <w:t>Bài viết mô tả hành trình điều trị u nguyên bào thần kinh ở trẻ em tại Bệnh viện Trung ương Huế, với chi phí ghép tế bào gốc lên tới 200–300 triệu đồng — vượt xa khả năng tài chính của phần lớn bệnh nhân nghèo. Đối với Davipharm, bài phản ánh bối cảnh ung thư nhi khoa (đặc biệt phác đồ hóa trị đa chu kỳ) là phân khúc ETC có nhu cầu thực tế cao nhưng phụ thuộc lớn vào thanh toán BHYT và quỹ hỗ trợ xã hội.</w:t>
+      </w:r>
+    </w:p>
+    <w:p>
+      <w:pPr>
+        <w:spacing w:before="20" w:after="40"/>
+        <w:ind w:left="170"/>
+      </w:pPr>
+      <w:r>
+        <w:rPr>
+          <w:rFonts w:ascii="Calibri" w:hAnsi="Calibri"/>
+          <w:b/>
+          <w:i w:val="0"/>
+          <w:color w:val="374151"/>
+          <w:sz w:val="17"/>
+        </w:rPr>
+        <w:t>➖ Bài không tác động trực tiếp đến danh mục Davipharm; tuy nhiên là tín hiệu theo dõi về nhu cầu điều trị hỗ trợ ung thư (supportive care) — phân khúc liên quan gián tiếp đến HYYR (Erlotinib) và LARRIVEY (Bicalutamide) trong kênh ETC bệnh viện tuyến tỉnh.</w:t>
+      </w:r>
+    </w:p>
+    <w:tbl>
+      <w:tblPr>
+        <w:tblStyle w:val="TableGrid"/>
+        <w:tblW w:type="auto" w:w="0"/>
+        <w:tblLook w:firstColumn="1" w:firstRow="1" w:lastColumn="0" w:lastRow="0" w:noHBand="0" w:noVBand="1" w:val="04A0"/>
+      </w:tblPr>
+      <w:tblGrid>
+        <w:gridCol w:w="9072"/>
+      </w:tblGrid>
+      <w:tr>
+        <w:tc>
+          <w:tcPr>
+            <w:tcW w:type="dxa" w:w="9072"/>
+            <w:shd w:val="clear" w:color="auto" w:fill="F8FAFC"/>
+            <w:tcBorders>
+              <w:top w:val="none" w:sz="6" w:color="auto"/>
+              <w:bottom w:val="none" w:sz="6" w:color="auto"/>
+              <w:left w:val="single" w:sz="12" w:color="003B71"/>
+              <w:right w:val="none" w:sz="6" w:color="auto"/>
+            </w:tcBorders>
+          </w:tcPr>
+          <w:p>
+            <w:pPr>
+              <w:spacing w:before="60" w:after="60"/>
+              <w:ind w:left="142"/>
+            </w:pPr>
+            <w:r>
+              <w:rPr>
+                <w:rFonts w:ascii="Calibri" w:hAnsi="Calibri"/>
+                <w:b/>
+                <w:i w:val="0"/>
+                <w:color w:val="003B71"/>
+                <w:sz w:val="17"/>
+              </w:rPr>
+              <w:t xml:space="preserve">Strategy  </w:t>
+            </w:r>
+            <w:r>
+              <w:rPr>
+                <w:rFonts w:ascii="Calibri" w:hAnsi="Calibri"/>
+                <w:b w:val="0"/>
+                <w:i w:val="0"/>
+                <w:color w:val="334155"/>
+                <w:sz w:val="17"/>
+              </w:rPr>
+              <w:t>Team ETC/Ung thư theo dõi tín hiệu này như bối cảnh thị trường: nhu cầu điều trị ung thư nhi và ung thư giai đoạn muộn tại tuyến tỉnh đang tăng nhưng bị giới hạn bởi thanh toán BHYT — đây là lý do ưu tiên đảm bảo HYYR và LARRIVEY nằm trong danh mục BHYT đầu thầu chu kỳ tới. Không cần hành động khẩn cấp; cập nhật vào báo cáo market landscape quý tiếp theo.</w:t>
+            </w:r>
+          </w:p>
+        </w:tc>
+      </w:tr>
+    </w:tbl>
+    <w:p>
+      <w:pPr>
+        <w:spacing w:before="40" w:after="120"/>
+      </w:pPr>
+    </w:p>
+    <w:tbl>
+      <w:tblPr>
+        <w:tblStyle w:val="TableGrid"/>
+        <w:tblW w:type="auto" w:w="0"/>
+        <w:jc w:val="left"/>
+        <w:tblLook w:firstColumn="1" w:firstRow="1" w:lastColumn="0" w:lastRow="0" w:noHBand="0" w:noVBand="1" w:val="04A0"/>
+      </w:tblPr>
+      <w:tblGrid>
+        <w:gridCol w:w="4536"/>
+        <w:gridCol w:w="4536"/>
+      </w:tblGrid>
+      <w:tr>
+        <w:tc>
+          <w:tcPr>
+            <w:tcW w:type="dxa" w:w="1984"/>
+            <w:shd w:val="clear" w:color="auto" w:fill="EEF2FF"/>
+            <w:tcBorders>
+              <w:top w:val="none" w:sz="6" w:color="auto"/>
+              <w:bottom w:val="none" w:sz="6" w:color="auto"/>
+              <w:left w:val="none" w:sz="6" w:color="auto"/>
+              <w:right w:val="none" w:sz="6" w:color="auto"/>
+            </w:tcBorders>
+          </w:tcPr>
+          <w:p>
+            <w:pPr>
+              <w:spacing w:before="80" w:after="80"/>
+              <w:ind w:left="85"/>
+            </w:pPr>
+            <w:r>
+              <w:rPr>
+                <w:rFonts w:ascii="Calibri" w:hAnsi="Calibri"/>
+                <w:b/>
+                <w:i w:val="0"/>
+                <w:color w:val="4338CA"/>
+                <w:sz w:val="15"/>
+              </w:rPr>
+              <w:t>VNEXPRESS – SỨC KHỎE</w:t>
+            </w:r>
+          </w:p>
+        </w:tc>
+        <w:tc>
+          <w:tcPr>
+            <w:tcW w:type="dxa" w:w="4536"/>
+            <w:tcBorders>
+              <w:top w:val="none" w:sz="6" w:color="auto"/>
+              <w:bottom w:val="none" w:sz="6" w:color="auto"/>
+              <w:left w:val="none" w:sz="6" w:color="auto"/>
+              <w:right w:val="none" w:sz="6" w:color="auto"/>
+            </w:tcBorders>
+          </w:tcPr>
+          <w:p>
+            <w:pPr>
+              <w:spacing w:before="60" w:after="60"/>
+              <w:ind w:left="113"/>
+            </w:pPr>
+            <w:r>
+              <w:rPr>
+                <w:rFonts w:ascii="Calibri" w:hAnsi="Calibri"/>
+                <w:b/>
+                <w:i w:val="0"/>
+                <w:color w:val="111827"/>
+                <w:sz w:val="21"/>
+              </w:rPr>
+              <w:t>Mẹo ngủ ngon cho bệnh nhân tiểu đường type 2: Tín hiệu nhu cầu bệnh nhân với EIMLER-10, ZLATKO</w:t>
+            </w:r>
+          </w:p>
+        </w:tc>
+      </w:tr>
+    </w:tbl>
+    <w:p>
+      <w:pPr>
+        <w:spacing w:before="40" w:after="40"/>
+        <w:ind w:left="170"/>
+      </w:pPr>
+      <w:r>
+        <w:rPr>
+          <w:rFonts w:ascii="Calibri" w:hAnsi="Calibri"/>
+          <w:b w:val="0"/>
+          <w:i/>
+          <w:color w:val="6B7280"/>
+          <w:sz w:val="18"/>
+        </w:rPr>
+        <w:t>Bài viết trên VnExpress phổ biến rộng rãi các biến chứng tiểu đường type 2 (thần kinh ngoại biên, ngưng thở khi ngủ) và tầm quan trọng của kiểm soát đường huyết, gián tiếp gia tăng nhận thức về điều trị dược phẩm trong nhóm bệnh nhân này. Điều này củng cố nhu cầu thị trường cho các sản phẩm kiểm soát đường huyết như EIMLER-10 (Empagliflozin) và ZLATKO (Sitagliptin) của Davipharm.</w:t>
+      </w:r>
+    </w:p>
+    <w:p>
+      <w:pPr>
+        <w:spacing w:before="20" w:after="40"/>
+        <w:ind w:left="170"/>
+      </w:pPr>
+      <w:r>
+        <w:rPr>
+          <w:rFonts w:ascii="Calibri" w:hAnsi="Calibri"/>
+          <w:b/>
+          <w:i w:val="0"/>
+          <w:color w:val="374151"/>
+          <w:sz w:val="17"/>
+        </w:rPr>
+        <w:t>📊 Tín hiệu trung tính — bài mang tính giáo dục sức khỏe, không tác động trực tiếp đến doanh thu ETC nhưng phản ánh mức độ quan tâm ngày càng tăng của bệnh nhân tiểu đường type 2, nhóm mục tiêu cốt lõi của EIMLER-10 và ZLATKO.</w:t>
+      </w:r>
+    </w:p>
+    <w:tbl>
+      <w:tblPr>
+        <w:tblStyle w:val="TableGrid"/>
+        <w:tblW w:type="auto" w:w="0"/>
+        <w:tblLook w:firstColumn="1" w:firstRow="1" w:lastColumn="0" w:lastRow="0" w:noHBand="0" w:noVBand="1" w:val="04A0"/>
+      </w:tblPr>
+      <w:tblGrid>
+        <w:gridCol w:w="9072"/>
+      </w:tblGrid>
+      <w:tr>
+        <w:tc>
+          <w:tcPr>
+            <w:tcW w:type="dxa" w:w="9072"/>
+            <w:shd w:val="clear" w:color="auto" w:fill="F8FAFC"/>
+            <w:tcBorders>
+              <w:top w:val="none" w:sz="6" w:color="auto"/>
+              <w:bottom w:val="none" w:sz="6" w:color="auto"/>
+              <w:left w:val="single" w:sz="12" w:color="003B71"/>
+              <w:right w:val="none" w:sz="6" w:color="auto"/>
+            </w:tcBorders>
+          </w:tcPr>
+          <w:p>
+            <w:pPr>
+              <w:spacing w:before="60" w:after="60"/>
+              <w:ind w:left="142"/>
+            </w:pPr>
+            <w:r>
+              <w:rPr>
+                <w:rFonts w:ascii="Calibri" w:hAnsi="Calibri"/>
+                <w:b/>
+                <w:i w:val="0"/>
+                <w:color w:val="003B71"/>
+                <w:sz w:val="17"/>
+              </w:rPr>
+              <w:t xml:space="preserve">Strategy  </w:t>
+            </w:r>
+            <w:r>
+              <w:rPr>
+                <w:rFonts w:ascii="Calibri" w:hAnsi="Calibri"/>
+                <w:b w:val="0"/>
+                <w:i w:val="0"/>
+                <w:color w:val="334155"/>
+                <w:sz w:val="17"/>
+              </w:rPr>
+              <w:t>Marketing Team nên tận dụng xu hướng truyền thông sức khỏe về biến chứng tiểu đường để hỗ trợ tài liệu detail cho EIMLER-10 và ZLATKO, đặc biệt nhấn mạnh lợi ích kiểm soát đường huyết bền vững cho bác sĩ kê đơn tuyến cơ sở trong vòng Q3/2025.</w:t>
+            </w:r>
+          </w:p>
+        </w:tc>
+      </w:tr>
+    </w:tbl>
+    <w:p>
+      <w:pPr>
+        <w:spacing w:before="40" w:after="120"/>
+      </w:pPr>
+    </w:p>
+    <w:tbl>
+      <w:tblPr>
+        <w:tblStyle w:val="TableGrid"/>
+        <w:tblW w:type="auto" w:w="0"/>
+        <w:jc w:val="left"/>
+        <w:tblLook w:firstColumn="1" w:firstRow="1" w:lastColumn="0" w:lastRow="0" w:noHBand="0" w:noVBand="1" w:val="04A0"/>
+      </w:tblPr>
+      <w:tblGrid>
+        <w:gridCol w:w="4536"/>
+        <w:gridCol w:w="4536"/>
+      </w:tblGrid>
+      <w:tr>
+        <w:tc>
+          <w:tcPr>
+            <w:tcW w:type="dxa" w:w="1984"/>
+            <w:shd w:val="clear" w:color="auto" w:fill="EEF2FF"/>
+            <w:tcBorders>
+              <w:top w:val="none" w:sz="6" w:color="auto"/>
+              <w:bottom w:val="none" w:sz="6" w:color="auto"/>
+              <w:left w:val="none" w:sz="6" w:color="auto"/>
+              <w:right w:val="none" w:sz="6" w:color="auto"/>
+            </w:tcBorders>
+          </w:tcPr>
+          <w:p>
+            <w:pPr>
+              <w:spacing w:before="80" w:after="80"/>
+              <w:ind w:left="85"/>
+            </w:pPr>
+            <w:r>
+              <w:rPr>
+                <w:rFonts w:ascii="Calibri" w:hAnsi="Calibri"/>
+                <w:b/>
+                <w:i w:val="0"/>
+                <w:color w:val="4338CA"/>
+                <w:sz w:val="15"/>
+              </w:rPr>
               <w:t>SK&amp;ĐS – DƯỢC MỸ PHẨM</w:t>
             </w:r>
           </w:p>
@@ -2295,942 +3387,6 @@
                 <w:sz w:val="17"/>
               </w:rPr>
               <w:t>Marketing &amp; Medical Affairs team cần phát triển tài liệu KOL/CME khai thác dữ liệu Stanford này để định vị chiến lược "can thiệp sớm ở mốc 40+" — ưu tiên RAVASTEL (kiểm soát LDL), EIMLER-10 (bảo vệ thận/tim), ZENTOGOUT (kiểm soát uric acid) và PECHAUNOX (huyết áp) trong Q3/2025; đồng thời phối hợp Sales team mở rộng detailing tại phân khúc phòng khám nội tiết và tim mạch cho nhóm bệnh nhân 40–65 tuổi.</w:t>
-            </w:r>
-          </w:p>
-        </w:tc>
-      </w:tr>
-    </w:tbl>
-    <w:p>
-      <w:pPr>
-        <w:spacing w:before="40" w:after="120"/>
-      </w:pPr>
-    </w:p>
-    <w:tbl>
-      <w:tblPr>
-        <w:tblStyle w:val="TableGrid"/>
-        <w:tblW w:type="auto" w:w="0"/>
-        <w:jc w:val="left"/>
-        <w:tblLook w:firstColumn="1" w:firstRow="1" w:lastColumn="0" w:lastRow="0" w:noHBand="0" w:noVBand="1" w:val="04A0"/>
-      </w:tblPr>
-      <w:tblGrid>
-        <w:gridCol w:w="4536"/>
-        <w:gridCol w:w="4536"/>
-      </w:tblGrid>
-      <w:tr>
-        <w:tc>
-          <w:tcPr>
-            <w:tcW w:type="dxa" w:w="1984"/>
-            <w:shd w:val="clear" w:color="auto" w:fill="EEF2FF"/>
-            <w:tcBorders>
-              <w:top w:val="none" w:sz="6" w:color="auto"/>
-              <w:bottom w:val="none" w:sz="6" w:color="auto"/>
-              <w:left w:val="none" w:sz="6" w:color="auto"/>
-              <w:right w:val="none" w:sz="6" w:color="auto"/>
-            </w:tcBorders>
-          </w:tcPr>
-          <w:p>
-            <w:pPr>
-              <w:spacing w:before="80" w:after="80"/>
-              <w:ind w:left="85"/>
-            </w:pPr>
-            <w:r>
-              <w:rPr>
-                <w:rFonts w:ascii="Calibri" w:hAnsi="Calibri"/>
-                <w:b/>
-                <w:i w:val="0"/>
-                <w:color w:val="4338CA"/>
-                <w:sz w:val="15"/>
-              </w:rPr>
-              <w:t>VNEXPRESS – SỨC KHỎE</w:t>
-            </w:r>
-          </w:p>
-        </w:tc>
-        <w:tc>
-          <w:tcPr>
-            <w:tcW w:type="dxa" w:w="4536"/>
-            <w:tcBorders>
-              <w:top w:val="none" w:sz="6" w:color="auto"/>
-              <w:bottom w:val="none" w:sz="6" w:color="auto"/>
-              <w:left w:val="none" w:sz="6" w:color="auto"/>
-              <w:right w:val="none" w:sz="6" w:color="auto"/>
-            </w:tcBorders>
-          </w:tcPr>
-          <w:p>
-            <w:pPr>
-              <w:spacing w:before="60" w:after="60"/>
-              <w:ind w:left="113"/>
-            </w:pPr>
-            <w:r>
-              <w:rPr>
-                <w:rFonts w:ascii="Calibri" w:hAnsi="Calibri"/>
-                <w:b/>
-                <w:i w:val="0"/>
-                <w:color w:val="111827"/>
-                <w:sz w:val="21"/>
-              </w:rPr>
-              <w:t>Tổng quan ung thư tụy: Cơ hội cho danh mục ung thư Davipharm (HYYR – Erlotinib)</w:t>
-            </w:r>
-          </w:p>
-        </w:tc>
-      </w:tr>
-    </w:tbl>
-    <w:p>
-      <w:pPr>
-        <w:spacing w:before="40" w:after="40"/>
-        <w:ind w:left="170"/>
-      </w:pPr>
-      <w:r>
-        <w:rPr>
-          <w:rFonts w:ascii="Calibri" w:hAnsi="Calibri"/>
-          <w:b w:val="0"/>
-          <w:i/>
-          <w:color w:val="6B7280"/>
-          <w:sz w:val="18"/>
-        </w:rPr>
-        <w:t>Bài cẩm nang của VnExpress phổ biến kiến thức về ung thư tụy — loại ung thư có tiên lượng xấu, ít triệu chứng sớm và nhu cầu điều trị ung thư tiêu hóa ngày càng tăng tại Việt Nam. Mặc dù Erlotinib (HYYR) có chỉ định trong ung thư phổi và tụy, nội dung này phản ánh xu hướng nâng cao nhận thức bệnh lý ung thư đường tiêu hóa — phân khúc mà danh mục ung thư Davipharm có thể khai thác.</w:t>
-      </w:r>
-    </w:p>
-    <w:p>
-      <w:pPr>
-        <w:spacing w:before="20" w:after="40"/>
-        <w:ind w:left="170"/>
-      </w:pPr>
-      <w:r>
-        <w:rPr>
-          <w:rFonts w:ascii="Calibri" w:hAnsi="Calibri"/>
-          <w:b/>
-          <w:i w:val="0"/>
-          <w:color w:val="374151"/>
-          <w:sz w:val="17"/>
-        </w:rPr>
-        <w:t>📊 Tín hiệu nhận thức thị trường ở mức nền — chưa tạo tác động doanh số ngay, nhưng là cơ sở để team Oncology xây dựng nội dung truyền thông khoa học cho HYYR trong chỉ định ung thư tụy.</w:t>
-      </w:r>
-    </w:p>
-    <w:tbl>
-      <w:tblPr>
-        <w:tblStyle w:val="TableGrid"/>
-        <w:tblW w:type="auto" w:w="0"/>
-        <w:tblLook w:firstColumn="1" w:firstRow="1" w:lastColumn="0" w:lastRow="0" w:noHBand="0" w:noVBand="1" w:val="04A0"/>
-      </w:tblPr>
-      <w:tblGrid>
-        <w:gridCol w:w="9072"/>
-      </w:tblGrid>
-      <w:tr>
-        <w:tc>
-          <w:tcPr>
-            <w:tcW w:type="dxa" w:w="9072"/>
-            <w:shd w:val="clear" w:color="auto" w:fill="F8FAFC"/>
-            <w:tcBorders>
-              <w:top w:val="none" w:sz="6" w:color="auto"/>
-              <w:bottom w:val="none" w:sz="6" w:color="auto"/>
-              <w:left w:val="single" w:sz="12" w:color="003B71"/>
-              <w:right w:val="none" w:sz="6" w:color="auto"/>
-            </w:tcBorders>
-          </w:tcPr>
-          <w:p>
-            <w:pPr>
-              <w:spacing w:before="60" w:after="60"/>
-              <w:ind w:left="142"/>
-            </w:pPr>
-            <w:r>
-              <w:rPr>
-                <w:rFonts w:ascii="Calibri" w:hAnsi="Calibri"/>
-                <w:b/>
-                <w:i w:val="0"/>
-                <w:color w:val="003B71"/>
-                <w:sz w:val="17"/>
-              </w:rPr>
-              <w:t xml:space="preserve">Strategy  </w:t>
-            </w:r>
-            <w:r>
-              <w:rPr>
-                <w:rFonts w:ascii="Calibri" w:hAnsi="Calibri"/>
-                <w:b w:val="0"/>
-                <w:i w:val="0"/>
-                <w:color w:val="334155"/>
-                <w:sz w:val="17"/>
-              </w:rPr>
-              <w:t>Team Oncology phối hợp với Medical Affairs rà soát hồ sơ chỉ định của HYYR (Erlotinib) trong ung thư tụy giai đoạn tiến triển; xây dựng tài liệu hỗ trợ KOL/bác sĩ ung bướu tại các bệnh viện tuyến trung ương (K, Chợ Rẫy, Ung bướu TP.HCM) trong Q3/2025.</w:t>
-            </w:r>
-          </w:p>
-        </w:tc>
-      </w:tr>
-    </w:tbl>
-    <w:p>
-      <w:pPr>
-        <w:spacing w:before="40" w:after="120"/>
-      </w:pPr>
-    </w:p>
-    <w:tbl>
-      <w:tblPr>
-        <w:tblStyle w:val="TableGrid"/>
-        <w:tblW w:type="auto" w:w="0"/>
-        <w:jc w:val="left"/>
-        <w:tblLook w:firstColumn="1" w:firstRow="1" w:lastColumn="0" w:lastRow="0" w:noHBand="0" w:noVBand="1" w:val="04A0"/>
-      </w:tblPr>
-      <w:tblGrid>
-        <w:gridCol w:w="4536"/>
-        <w:gridCol w:w="4536"/>
-      </w:tblGrid>
-      <w:tr>
-        <w:tc>
-          <w:tcPr>
-            <w:tcW w:type="dxa" w:w="1984"/>
-            <w:shd w:val="clear" w:color="auto" w:fill="EEF2FF"/>
-            <w:tcBorders>
-              <w:top w:val="none" w:sz="6" w:color="auto"/>
-              <w:bottom w:val="none" w:sz="6" w:color="auto"/>
-              <w:left w:val="none" w:sz="6" w:color="auto"/>
-              <w:right w:val="none" w:sz="6" w:color="auto"/>
-            </w:tcBorders>
-          </w:tcPr>
-          <w:p>
-            <w:pPr>
-              <w:spacing w:before="80" w:after="80"/>
-              <w:ind w:left="85"/>
-            </w:pPr>
-            <w:r>
-              <w:rPr>
-                <w:rFonts w:ascii="Calibri" w:hAnsi="Calibri"/>
-                <w:b/>
-                <w:i w:val="0"/>
-                <w:color w:val="4338CA"/>
-                <w:sz w:val="15"/>
-              </w:rPr>
-              <w:t>VNEXPRESS – SỨC KHỎE</w:t>
-            </w:r>
-          </w:p>
-        </w:tc>
-        <w:tc>
-          <w:tcPr>
-            <w:tcW w:type="dxa" w:w="4536"/>
-            <w:tcBorders>
-              <w:top w:val="none" w:sz="6" w:color="auto"/>
-              <w:bottom w:val="none" w:sz="6" w:color="auto"/>
-              <w:left w:val="none" w:sz="6" w:color="auto"/>
-              <w:right w:val="none" w:sz="6" w:color="auto"/>
-            </w:tcBorders>
-          </w:tcPr>
-          <w:p>
-            <w:pPr>
-              <w:spacing w:before="60" w:after="60"/>
-              <w:ind w:left="113"/>
-            </w:pPr>
-            <w:r>
-              <w:rPr>
-                <w:rFonts w:ascii="Calibri" w:hAnsi="Calibri"/>
-                <w:b/>
-                <w:i w:val="0"/>
-                <w:color w:val="111827"/>
-                <w:sz w:val="21"/>
-              </w:rPr>
-              <w:t>Ung thư đại tràng: ~17.000 ca mắc mới/năm tại Việt Nam — cơ hội thị trường cho phác đồ hỗ trợ điều trị</w:t>
-            </w:r>
-          </w:p>
-        </w:tc>
-      </w:tr>
-    </w:tbl>
-    <w:p>
-      <w:pPr>
-        <w:spacing w:before="40" w:after="40"/>
-        <w:ind w:left="170"/>
-      </w:pPr>
-      <w:r>
-        <w:rPr>
-          <w:rFonts w:ascii="Calibri" w:hAnsi="Calibri"/>
-          <w:b w:val="0"/>
-          <w:i/>
-          <w:color w:val="6B7280"/>
-          <w:sz w:val="18"/>
-        </w:rPr>
-        <w:t>Bệnh viện Tâm Anh ứng dụng robot Da Vinci Xi trong phẫu thuật ung thư đại tràng, phản ánh xu hướng nâng cấp năng lực điều trị ung thư tiêu hóa tại các bệnh viện tư lớn; theo Globocan 2022, Việt Nam ghi nhận 16.000–17.000 ca ung thư đại trực tràng mới và hơn 8.400 ca tử vong mỗi năm. Đây là phân khúc bệnh nhân nặng, đa bệnh lý (tim mạch, huyết khối, tiêu hóa) — tạo nhu cầu cao cho các thuốc hỗ trợ trước/sau phẫu thuật từ danh mục Davipharm.</w:t>
-      </w:r>
-    </w:p>
-    <w:p>
-      <w:pPr>
-        <w:spacing w:before="20" w:after="40"/>
-        <w:ind w:left="170"/>
-      </w:pPr>
-      <w:r>
-        <w:rPr>
-          <w:rFonts w:ascii="Calibri" w:hAnsi="Calibri"/>
-          <w:b/>
-          <w:i w:val="0"/>
-          <w:color w:val="166534"/>
-          <w:sz w:val="17"/>
-        </w:rPr>
-        <w:t>🟢 Nhóm bệnh nhân ung thư đại tràng đa bệnh lý mở cơ hội listing bổ sung cho JIRACEK (Esomeprazole), PECHAUNOX (Perindopril+Amlodipin), ZABALES (Clopidogrel) và LARRIVEY (Bicalutamide) tại kênh bệnh viện tư chuyên sâu.</w:t>
-      </w:r>
-    </w:p>
-    <w:tbl>
-      <w:tblPr>
-        <w:tblStyle w:val="TableGrid"/>
-        <w:tblW w:type="auto" w:w="0"/>
-        <w:tblLook w:firstColumn="1" w:firstRow="1" w:lastColumn="0" w:lastRow="0" w:noHBand="0" w:noVBand="1" w:val="04A0"/>
-      </w:tblPr>
-      <w:tblGrid>
-        <w:gridCol w:w="9072"/>
-      </w:tblGrid>
-      <w:tr>
-        <w:tc>
-          <w:tcPr>
-            <w:tcW w:type="dxa" w:w="9072"/>
-            <w:shd w:val="clear" w:color="auto" w:fill="F8FAFC"/>
-            <w:tcBorders>
-              <w:top w:val="none" w:sz="6" w:color="auto"/>
-              <w:bottom w:val="none" w:sz="6" w:color="auto"/>
-              <w:left w:val="single" w:sz="12" w:color="003B71"/>
-              <w:right w:val="none" w:sz="6" w:color="auto"/>
-            </w:tcBorders>
-          </w:tcPr>
-          <w:p>
-            <w:pPr>
-              <w:spacing w:before="60" w:after="60"/>
-              <w:ind w:left="142"/>
-            </w:pPr>
-            <w:r>
-              <w:rPr>
-                <w:rFonts w:ascii="Calibri" w:hAnsi="Calibri"/>
-                <w:b/>
-                <w:i w:val="0"/>
-                <w:color w:val="003B71"/>
-                <w:sz w:val="17"/>
-              </w:rPr>
-              <w:t xml:space="preserve">Strategy  </w:t>
-            </w:r>
-            <w:r>
-              <w:rPr>
-                <w:rFonts w:ascii="Calibri" w:hAnsi="Calibri"/>
-                <w:b w:val="0"/>
-                <w:i w:val="0"/>
-                <w:color w:val="334155"/>
-                <w:sz w:val="17"/>
-              </w:rPr>
-              <w:t>Team Medical Affairs phối hợp với team ETC Sales xây dựng gói tài liệu khoa học nhắm vào phác đồ hỗ trợ peri-operative tại các bệnh viện tư có khoa ung bướu–ngoại tiêu hóa (Tâm Anh, Vinmec, FV), ưu tiên JIRACEK (bảo vệ niêm mạc sau phẫu thuật), PECHAUNOX/ZABALES (kiểm soát tim mạch–huyết khối đồng mắc) — đề xuất kế hoạch listing Q3/2025.</w:t>
-            </w:r>
-          </w:p>
-        </w:tc>
-      </w:tr>
-    </w:tbl>
-    <w:p>
-      <w:pPr>
-        <w:spacing w:before="40" w:after="120"/>
-      </w:pPr>
-    </w:p>
-    <w:tbl>
-      <w:tblPr>
-        <w:tblStyle w:val="TableGrid"/>
-        <w:tblW w:type="auto" w:w="0"/>
-        <w:jc w:val="left"/>
-        <w:tblLook w:firstColumn="1" w:firstRow="1" w:lastColumn="0" w:lastRow="0" w:noHBand="0" w:noVBand="1" w:val="04A0"/>
-      </w:tblPr>
-      <w:tblGrid>
-        <w:gridCol w:w="4536"/>
-        <w:gridCol w:w="4536"/>
-      </w:tblGrid>
-      <w:tr>
-        <w:tc>
-          <w:tcPr>
-            <w:tcW w:type="dxa" w:w="1984"/>
-            <w:shd w:val="clear" w:color="auto" w:fill="EEF2FF"/>
-            <w:tcBorders>
-              <w:top w:val="none" w:sz="6" w:color="auto"/>
-              <w:bottom w:val="none" w:sz="6" w:color="auto"/>
-              <w:left w:val="none" w:sz="6" w:color="auto"/>
-              <w:right w:val="none" w:sz="6" w:color="auto"/>
-            </w:tcBorders>
-          </w:tcPr>
-          <w:p>
-            <w:pPr>
-              <w:spacing w:before="80" w:after="80"/>
-              <w:ind w:left="85"/>
-            </w:pPr>
-            <w:r>
-              <w:rPr>
-                <w:rFonts w:ascii="Calibri" w:hAnsi="Calibri"/>
-                <w:b/>
-                <w:i w:val="0"/>
-                <w:color w:val="4338CA"/>
-                <w:sz w:val="15"/>
-              </w:rPr>
-              <w:t>VNEXPRESS – SỨC KHỎE</w:t>
-            </w:r>
-          </w:p>
-        </w:tc>
-        <w:tc>
-          <w:tcPr>
-            <w:tcW w:type="dxa" w:w="4536"/>
-            <w:tcBorders>
-              <w:top w:val="none" w:sz="6" w:color="auto"/>
-              <w:bottom w:val="none" w:sz="6" w:color="auto"/>
-              <w:left w:val="none" w:sz="6" w:color="auto"/>
-              <w:right w:val="none" w:sz="6" w:color="auto"/>
-            </w:tcBorders>
-          </w:tcPr>
-          <w:p>
-            <w:pPr>
-              <w:spacing w:before="60" w:after="60"/>
-              <w:ind w:left="113"/>
-            </w:pPr>
-            <w:r>
-              <w:rPr>
-                <w:rFonts w:ascii="Calibri" w:hAnsi="Calibri"/>
-                <w:b/>
-                <w:i w:val="0"/>
-                <w:color w:val="111827"/>
-                <w:sz w:val="21"/>
-              </w:rPr>
-              <w:t>Xu hướng trẻ hóa ung thư vú &amp; phác đồ đa mô thức: Cơ hội cho LARRIVEY (Bicalutamide) và danh mục ung thư</w:t>
-            </w:r>
-          </w:p>
-        </w:tc>
-      </w:tr>
-    </w:tbl>
-    <w:p>
-      <w:pPr>
-        <w:spacing w:before="40" w:after="40"/>
-        <w:ind w:left="170"/>
-      </w:pPr>
-      <w:r>
-        <w:rPr>
-          <w:rFonts w:ascii="Calibri" w:hAnsi="Calibri"/>
-          <w:b w:val="0"/>
-          <w:i/>
-          <w:color w:val="6B7280"/>
-          <w:sz w:val="18"/>
-        </w:rPr>
-        <w:t>Bài viết từ chuyên gia BV Tâm Anh xác nhận ung thư vú có xu hướng trẻ hóa và điều trị đa mô thức (xạ trị, hóa trị, nội tiết) ngày càng phổ biến, kéo dài 5–10 năm; nhu cầu thuốc điều trị ung thư nội tiết tố tăng bền vững. Davipharm hiện có LARRIVEY (Bicalutamide) trong danh mục ung thư nhưng chưa có sản phẩm trực tiếp trong phân khúc ung thư vú nội tiết dương tính — đây là khoảng trống cần đánh giá.</w:t>
-      </w:r>
-    </w:p>
-    <w:p>
-      <w:pPr>
-        <w:spacing w:before="20" w:after="40"/>
-        <w:ind w:left="170"/>
-      </w:pPr>
-      <w:r>
-        <w:rPr>
-          <w:rFonts w:ascii="Calibri" w:hAnsi="Calibri"/>
-          <w:b/>
-          <w:i w:val="0"/>
-          <w:color w:val="374151"/>
-          <w:sz w:val="17"/>
-        </w:rPr>
-        <w:t>🔍 Tín hiệu theo dõi: thị trường ung thư vú nội tiết dương tính đang mở rộng nhưng Davipharm chưa có sản phẩm phù hợp để khai thác trực tiếp phân khúc này.</w:t>
-      </w:r>
-    </w:p>
-    <w:tbl>
-      <w:tblPr>
-        <w:tblStyle w:val="TableGrid"/>
-        <w:tblW w:type="auto" w:w="0"/>
-        <w:tblLook w:firstColumn="1" w:firstRow="1" w:lastColumn="0" w:lastRow="0" w:noHBand="0" w:noVBand="1" w:val="04A0"/>
-      </w:tblPr>
-      <w:tblGrid>
-        <w:gridCol w:w="9072"/>
-      </w:tblGrid>
-      <w:tr>
-        <w:tc>
-          <w:tcPr>
-            <w:tcW w:type="dxa" w:w="9072"/>
-            <w:shd w:val="clear" w:color="auto" w:fill="F8FAFC"/>
-            <w:tcBorders>
-              <w:top w:val="none" w:sz="6" w:color="auto"/>
-              <w:bottom w:val="none" w:sz="6" w:color="auto"/>
-              <w:left w:val="single" w:sz="12" w:color="003B71"/>
-              <w:right w:val="none" w:sz="6" w:color="auto"/>
-            </w:tcBorders>
-          </w:tcPr>
-          <w:p>
-            <w:pPr>
-              <w:spacing w:before="60" w:after="60"/>
-              <w:ind w:left="142"/>
-            </w:pPr>
-            <w:r>
-              <w:rPr>
-                <w:rFonts w:ascii="Calibri" w:hAnsi="Calibri"/>
-                <w:b/>
-                <w:i w:val="0"/>
-                <w:color w:val="003B71"/>
-                <w:sz w:val="17"/>
-              </w:rPr>
-              <w:t xml:space="preserve">Strategy  </w:t>
-            </w:r>
-            <w:r>
-              <w:rPr>
-                <w:rFonts w:ascii="Calibri" w:hAnsi="Calibri"/>
-                <w:b w:val="0"/>
-                <w:i w:val="0"/>
-                <w:color w:val="334155"/>
-                <w:sz w:val="17"/>
-              </w:rPr>
-              <w:t>Team Business Development &amp; Oncology phối hợp đánh giá khả năng mở rộng danh mục sang nhóm hormone therapy ung thư vú (aromatase inhibitors/anti-estrogens); đồng thời team Marketing có thể tăng cường định vị LARRIVEY trong các hội thảo ung thư để duy trì hiện diện thương hiệu trong phân khúc này. Đề xuất báo cáo đánh giá cơ hội lên BOD trong Q3/2025.</w:t>
-            </w:r>
-          </w:p>
-        </w:tc>
-      </w:tr>
-    </w:tbl>
-    <w:p>
-      <w:pPr>
-        <w:spacing w:before="40" w:after="120"/>
-      </w:pPr>
-    </w:p>
-    <w:tbl>
-      <w:tblPr>
-        <w:tblStyle w:val="TableGrid"/>
-        <w:tblW w:type="auto" w:w="0"/>
-        <w:jc w:val="left"/>
-        <w:tblLook w:firstColumn="1" w:firstRow="1" w:lastColumn="0" w:lastRow="0" w:noHBand="0" w:noVBand="1" w:val="04A0"/>
-      </w:tblPr>
-      <w:tblGrid>
-        <w:gridCol w:w="4536"/>
-        <w:gridCol w:w="4536"/>
-      </w:tblGrid>
-      <w:tr>
-        <w:tc>
-          <w:tcPr>
-            <w:tcW w:type="dxa" w:w="1984"/>
-            <w:shd w:val="clear" w:color="auto" w:fill="EEF2FF"/>
-            <w:tcBorders>
-              <w:top w:val="none" w:sz="6" w:color="auto"/>
-              <w:bottom w:val="none" w:sz="6" w:color="auto"/>
-              <w:left w:val="none" w:sz="6" w:color="auto"/>
-              <w:right w:val="none" w:sz="6" w:color="auto"/>
-            </w:tcBorders>
-          </w:tcPr>
-          <w:p>
-            <w:pPr>
-              <w:spacing w:before="80" w:after="80"/>
-              <w:ind w:left="85"/>
-            </w:pPr>
-            <w:r>
-              <w:rPr>
-                <w:rFonts w:ascii="Calibri" w:hAnsi="Calibri"/>
-                <w:b/>
-                <w:i w:val="0"/>
-                <w:color w:val="4338CA"/>
-                <w:sz w:val="15"/>
-              </w:rPr>
-              <w:t>VIETNAMPLUS – SỨC KHỎE</w:t>
-            </w:r>
-          </w:p>
-        </w:tc>
-        <w:tc>
-          <w:tcPr>
-            <w:tcW w:type="dxa" w:w="4536"/>
-            <w:tcBorders>
-              <w:top w:val="none" w:sz="6" w:color="auto"/>
-              <w:bottom w:val="none" w:sz="6" w:color="auto"/>
-              <w:left w:val="none" w:sz="6" w:color="auto"/>
-              <w:right w:val="none" w:sz="6" w:color="auto"/>
-            </w:tcBorders>
-          </w:tcPr>
-          <w:p>
-            <w:pPr>
-              <w:spacing w:before="60" w:after="60"/>
-              <w:ind w:left="113"/>
-            </w:pPr>
-            <w:r>
-              <w:rPr>
-                <w:rFonts w:ascii="Calibri" w:hAnsi="Calibri"/>
-                <w:b/>
-                <w:i w:val="0"/>
-                <w:color w:val="111827"/>
-                <w:sz w:val="21"/>
-              </w:rPr>
-              <w:t>Tin tức địa chính trị quốc tế — Không liên quan đến ngành dược Việt Nam</w:t>
-            </w:r>
-          </w:p>
-        </w:tc>
-      </w:tr>
-    </w:tbl>
-    <w:p>
-      <w:pPr>
-        <w:spacing w:before="40" w:after="40"/>
-        <w:ind w:left="170"/>
-      </w:pPr>
-      <w:r>
-        <w:rPr>
-          <w:rFonts w:ascii="Calibri" w:hAnsi="Calibri"/>
-          <w:b w:val="0"/>
-          <w:i/>
-          <w:color w:val="6B7280"/>
-          <w:sz w:val="18"/>
-        </w:rPr>
-        <w:t>Bài báo đề cập đến tranh chấp địa chính trị giữa Mỹ, NATO và Greenland — hoàn toàn nằm ngoài phạm vi thị trường dược phẩm Việt Nam. Nội dung không cung cấp tín hiệu thị trường nào có giá trị cho hoạt động kinh doanh của Davipharm.</w:t>
-      </w:r>
-    </w:p>
-    <w:p>
-      <w:pPr>
-        <w:spacing w:before="20" w:after="40"/>
-        <w:ind w:left="170"/>
-      </w:pPr>
-      <w:r>
-        <w:rPr>
-          <w:rFonts w:ascii="Calibri" w:hAnsi="Calibri"/>
-          <w:b/>
-          <w:i w:val="0"/>
-          <w:color w:val="374151"/>
-          <w:sz w:val="17"/>
-        </w:rPr>
-        <w:t>⚪ Không có tác động trực tiếp đến Davipharm — tin này không thuộc phạm vi theo dõi market intelligence dược phẩm.</w:t>
-      </w:r>
-    </w:p>
-    <w:tbl>
-      <w:tblPr>
-        <w:tblStyle w:val="TableGrid"/>
-        <w:tblW w:type="auto" w:w="0"/>
-        <w:tblLook w:firstColumn="1" w:firstRow="1" w:lastColumn="0" w:lastRow="0" w:noHBand="0" w:noVBand="1" w:val="04A0"/>
-      </w:tblPr>
-      <w:tblGrid>
-        <w:gridCol w:w="9072"/>
-      </w:tblGrid>
-      <w:tr>
-        <w:tc>
-          <w:tcPr>
-            <w:tcW w:type="dxa" w:w="9072"/>
-            <w:shd w:val="clear" w:color="auto" w:fill="F8FAFC"/>
-            <w:tcBorders>
-              <w:top w:val="none" w:sz="6" w:color="auto"/>
-              <w:bottom w:val="none" w:sz="6" w:color="auto"/>
-              <w:left w:val="single" w:sz="12" w:color="003B71"/>
-              <w:right w:val="none" w:sz="6" w:color="auto"/>
-            </w:tcBorders>
-          </w:tcPr>
-          <w:p>
-            <w:pPr>
-              <w:spacing w:before="60" w:after="60"/>
-              <w:ind w:left="142"/>
-            </w:pPr>
-            <w:r>
-              <w:rPr>
-                <w:rFonts w:ascii="Calibri" w:hAnsi="Calibri"/>
-                <w:b/>
-                <w:i w:val="0"/>
-                <w:color w:val="003B71"/>
-                <w:sz w:val="17"/>
-              </w:rPr>
-              <w:t xml:space="preserve">Strategy  </w:t>
-            </w:r>
-            <w:r>
-              <w:rPr>
-                <w:rFonts w:ascii="Calibri" w:hAnsi="Calibri"/>
-                <w:b w:val="0"/>
-                <w:i w:val="0"/>
-                <w:color w:val="334155"/>
-                <w:sz w:val="17"/>
-              </w:rPr>
-              <w:t>Đề xuất lọc nguồn tin: cần cấu hình lại bộ lọc keyword để loại bỏ các bài địa chính trị không liên quan, tối ưu hóa chất lượng báo cáo BOD. Không có hành động chiến lược nào cần thiết từ bài viết này.</w:t>
-            </w:r>
-          </w:p>
-        </w:tc>
-      </w:tr>
-    </w:tbl>
-    <w:p>
-      <w:pPr>
-        <w:spacing w:before="40" w:after="120"/>
-      </w:pPr>
-    </w:p>
-    <w:tbl>
-      <w:tblPr>
-        <w:tblStyle w:val="TableGrid"/>
-        <w:tblW w:type="auto" w:w="0"/>
-        <w:jc w:val="left"/>
-        <w:tblLook w:firstColumn="1" w:firstRow="1" w:lastColumn="0" w:lastRow="0" w:noHBand="0" w:noVBand="1" w:val="04A0"/>
-      </w:tblPr>
-      <w:tblGrid>
-        <w:gridCol w:w="4536"/>
-        <w:gridCol w:w="4536"/>
-      </w:tblGrid>
-      <w:tr>
-        <w:tc>
-          <w:tcPr>
-            <w:tcW w:type="dxa" w:w="1984"/>
-            <w:shd w:val="clear" w:color="auto" w:fill="EEF2FF"/>
-            <w:tcBorders>
-              <w:top w:val="none" w:sz="6" w:color="auto"/>
-              <w:bottom w:val="none" w:sz="6" w:color="auto"/>
-              <w:left w:val="none" w:sz="6" w:color="auto"/>
-              <w:right w:val="none" w:sz="6" w:color="auto"/>
-            </w:tcBorders>
-          </w:tcPr>
-          <w:p>
-            <w:pPr>
-              <w:spacing w:before="80" w:after="80"/>
-              <w:ind w:left="85"/>
-            </w:pPr>
-            <w:r>
-              <w:rPr>
-                <w:rFonts w:ascii="Calibri" w:hAnsi="Calibri"/>
-                <w:b/>
-                <w:i w:val="0"/>
-                <w:color w:val="4338CA"/>
-                <w:sz w:val="15"/>
-              </w:rPr>
-              <w:t>VIETNAMPLUS – SỨC KHỎE</w:t>
-            </w:r>
-          </w:p>
-        </w:tc>
-        <w:tc>
-          <w:tcPr>
-            <w:tcW w:type="dxa" w:w="4536"/>
-            <w:tcBorders>
-              <w:top w:val="none" w:sz="6" w:color="auto"/>
-              <w:bottom w:val="none" w:sz="6" w:color="auto"/>
-              <w:left w:val="none" w:sz="6" w:color="auto"/>
-              <w:right w:val="none" w:sz="6" w:color="auto"/>
-            </w:tcBorders>
-          </w:tcPr>
-          <w:p>
-            <w:pPr>
-              <w:spacing w:before="60" w:after="60"/>
-              <w:ind w:left="113"/>
-            </w:pPr>
-            <w:r>
-              <w:rPr>
-                <w:rFonts w:ascii="Calibri" w:hAnsi="Calibri"/>
-                <w:b/>
-                <w:i w:val="0"/>
-                <w:color w:val="111827"/>
-                <w:sz w:val="21"/>
-              </w:rPr>
-              <w:t>Rau Diếp Cá: Xu Hướng Dược Liệu Tự Nhiên Từ Vườn Nhà</w:t>
-            </w:r>
-          </w:p>
-        </w:tc>
-      </w:tr>
-    </w:tbl>
-    <w:p>
-      <w:pPr>
-        <w:spacing w:before="40" w:after="40"/>
-        <w:ind w:left="170"/>
-      </w:pPr>
-      <w:r>
-        <w:rPr>
-          <w:rFonts w:ascii="Calibri" w:hAnsi="Calibri"/>
-          <w:b w:val="0"/>
-          <w:i/>
-          <w:color w:val="6B7280"/>
-          <w:sz w:val="18"/>
-        </w:rPr>
-        <w:t>Rau diếp cá đang được truyền thông y tế chủ lưu quảng bá rộng rãi nhờ các công dụng chăm sóc da và sức khỏe, phản ánh xu hướng tiêu dùng nghiêng về thảo dược tự nhiên bản địa. Xu hướng này tạo nền tảng thị trường thuận lợi cho các sản phẩm OTC/thực phẩm chức năng có nguồn gốc thảo dược Việt.</w:t>
-      </w:r>
-    </w:p>
-    <w:p>
-      <w:pPr>
-        <w:spacing w:before="20" w:after="40"/>
-        <w:ind w:left="170"/>
-      </w:pPr>
-      <w:r>
-        <w:rPr>
-          <w:rFonts w:ascii="Calibri" w:hAnsi="Calibri"/>
-          <w:b/>
-          <w:i w:val="0"/>
-          <w:color w:val="166534"/>
-          <w:sz w:val="17"/>
-        </w:rPr>
-        <w:t>🌿 Tín hiệu tích cực nhẹ — truyền thông đại chúng đang "làm ấm" thị trường cho dòng sản phẩm thảo dược nội địa mà Davipharm có thể khai thác.</w:t>
-      </w:r>
-    </w:p>
-    <w:tbl>
-      <w:tblPr>
-        <w:tblStyle w:val="TableGrid"/>
-        <w:tblW w:type="auto" w:w="0"/>
-        <w:tblLook w:firstColumn="1" w:firstRow="1" w:lastColumn="0" w:lastRow="0" w:noHBand="0" w:noVBand="1" w:val="04A0"/>
-      </w:tblPr>
-      <w:tblGrid>
-        <w:gridCol w:w="9072"/>
-      </w:tblGrid>
-      <w:tr>
-        <w:tc>
-          <w:tcPr>
-            <w:tcW w:type="dxa" w:w="9072"/>
-            <w:shd w:val="clear" w:color="auto" w:fill="F8FAFC"/>
-            <w:tcBorders>
-              <w:top w:val="none" w:sz="6" w:color="auto"/>
-              <w:bottom w:val="none" w:sz="6" w:color="auto"/>
-              <w:left w:val="single" w:sz="12" w:color="003B71"/>
-              <w:right w:val="none" w:sz="6" w:color="auto"/>
-            </w:tcBorders>
-          </w:tcPr>
-          <w:p>
-            <w:pPr>
-              <w:spacing w:before="60" w:after="60"/>
-              <w:ind w:left="142"/>
-            </w:pPr>
-            <w:r>
-              <w:rPr>
-                <w:rFonts w:ascii="Calibri" w:hAnsi="Calibri"/>
-                <w:b/>
-                <w:i w:val="0"/>
-                <w:color w:val="003B71"/>
-                <w:sz w:val="17"/>
-              </w:rPr>
-              <w:t xml:space="preserve">Strategy  </w:t>
-            </w:r>
-            <w:r>
-              <w:rPr>
-                <w:rFonts w:ascii="Calibri" w:hAnsi="Calibri"/>
-                <w:b w:val="0"/>
-                <w:i w:val="0"/>
-                <w:color w:val="334155"/>
-                <w:sz w:val="17"/>
-              </w:rPr>
-              <w:t>Đánh giá khả năng phát triển hoặc repositioning dòng sản phẩm OTC/thực phẩm chức năng có chiết xuất diếp cá (kháng viêm, hỗ trợ da liễu), tận dụng nguồn nguyên liệu nội địa chi phí thấp và sóng truyền thông hiện tại. Ưu tiên kênh chuỗi nhà thuốc (Long Châu, Pharmacity) để tiếp cận nhóm người tiêu dùng quan tâm đến sản phẩm tự nhiên.</w:t>
-            </w:r>
-          </w:p>
-        </w:tc>
-      </w:tr>
-    </w:tbl>
-    <w:p>
-      <w:pPr>
-        <w:spacing w:before="40" w:after="120"/>
-      </w:pPr>
-    </w:p>
-    <w:tbl>
-      <w:tblPr>
-        <w:tblStyle w:val="TableGrid"/>
-        <w:tblW w:type="auto" w:w="0"/>
-        <w:jc w:val="left"/>
-        <w:tblLook w:firstColumn="1" w:firstRow="1" w:lastColumn="0" w:lastRow="0" w:noHBand="0" w:noVBand="1" w:val="04A0"/>
-      </w:tblPr>
-      <w:tblGrid>
-        <w:gridCol w:w="4536"/>
-        <w:gridCol w:w="4536"/>
-      </w:tblGrid>
-      <w:tr>
-        <w:tc>
-          <w:tcPr>
-            <w:tcW w:type="dxa" w:w="1984"/>
-            <w:shd w:val="clear" w:color="auto" w:fill="EEF2FF"/>
-            <w:tcBorders>
-              <w:top w:val="none" w:sz="6" w:color="auto"/>
-              <w:bottom w:val="none" w:sz="6" w:color="auto"/>
-              <w:left w:val="none" w:sz="6" w:color="auto"/>
-              <w:right w:val="none" w:sz="6" w:color="auto"/>
-            </w:tcBorders>
-          </w:tcPr>
-          <w:p>
-            <w:pPr>
-              <w:spacing w:before="80" w:after="80"/>
-              <w:ind w:left="85"/>
-            </w:pPr>
-            <w:r>
-              <w:rPr>
-                <w:rFonts w:ascii="Calibri" w:hAnsi="Calibri"/>
-                <w:b/>
-                <w:i w:val="0"/>
-                <w:color w:val="4338CA"/>
-                <w:sz w:val="15"/>
-              </w:rPr>
-              <w:t>VIETNAMPLUS – SỨC KHỎE</w:t>
-            </w:r>
-          </w:p>
-        </w:tc>
-        <w:tc>
-          <w:tcPr>
-            <w:tcW w:type="dxa" w:w="4536"/>
-            <w:tcBorders>
-              <w:top w:val="none" w:sz="6" w:color="auto"/>
-              <w:bottom w:val="none" w:sz="6" w:color="auto"/>
-              <w:left w:val="none" w:sz="6" w:color="auto"/>
-              <w:right w:val="none" w:sz="6" w:color="auto"/>
-            </w:tcBorders>
-          </w:tcPr>
-          <w:p>
-            <w:pPr>
-              <w:spacing w:before="60" w:after="60"/>
-              <w:ind w:left="113"/>
-            </w:pPr>
-            <w:r>
-              <w:rPr>
-                <w:rFonts w:ascii="Calibri" w:hAnsi="Calibri"/>
-                <w:b/>
-                <w:i w:val="0"/>
-                <w:color w:val="111827"/>
-                <w:sz w:val="21"/>
-              </w:rPr>
-              <w:t>Thuốc chống co giật Levetiracetam có tiềm năng ngăn ngừa Alzheimer</w:t>
-            </w:r>
-          </w:p>
-        </w:tc>
-      </w:tr>
-    </w:tbl>
-    <w:p>
-      <w:pPr>
-        <w:spacing w:before="40" w:after="40"/>
-        <w:ind w:left="170"/>
-      </w:pPr>
-      <w:r>
-        <w:rPr>
-          <w:rFonts w:ascii="Calibri" w:hAnsi="Calibri"/>
-          <w:b w:val="0"/>
-          <w:i/>
-          <w:color w:val="6B7280"/>
-          <w:sz w:val="18"/>
-        </w:rPr>
-        <w:t>Các nhà khoa học Mỹ phát hiện Levetiracetam — thuốc chống co giật đã có mặt lâu trên thị trường — có khả năng ức chế hình thành amyloid-beta 42, protein chủ chốt trong cơ chế bệnh sinh Alzheimer. Phát hiện này mở ra tiềm năng tái định vị (drug repurposing) một phân tử generic đã được chứng minh an toàn cho chỉ định mới có giá trị cao.</w:t>
-      </w:r>
-    </w:p>
-    <w:p>
-      <w:pPr>
-        <w:spacing w:before="20" w:after="40"/>
-        <w:ind w:left="170"/>
-      </w:pPr>
-      <w:r>
-        <w:rPr>
-          <w:rFonts w:ascii="Calibri" w:hAnsi="Calibri"/>
-          <w:b/>
-          <w:i w:val="0"/>
-          <w:color w:val="166534"/>
-          <w:sz w:val="17"/>
-        </w:rPr>
-        <w:t>🟢 Cơ hội tái định vị sản phẩm generic Levetiracetam sang phân khúc thần kinh cao cấp nếu Davipharm đang hoặc có kế hoạch sản xuất hoạt chất này.</w:t>
-      </w:r>
-    </w:p>
-    <w:tbl>
-      <w:tblPr>
-        <w:tblStyle w:val="TableGrid"/>
-        <w:tblW w:type="auto" w:w="0"/>
-        <w:tblLook w:firstColumn="1" w:firstRow="1" w:lastColumn="0" w:lastRow="0" w:noHBand="0" w:noVBand="1" w:val="04A0"/>
-      </w:tblPr>
-      <w:tblGrid>
-        <w:gridCol w:w="9072"/>
-      </w:tblGrid>
-      <w:tr>
-        <w:tc>
-          <w:tcPr>
-            <w:tcW w:type="dxa" w:w="9072"/>
-            <w:shd w:val="clear" w:color="auto" w:fill="F8FAFC"/>
-            <w:tcBorders>
-              <w:top w:val="none" w:sz="6" w:color="auto"/>
-              <w:bottom w:val="none" w:sz="6" w:color="auto"/>
-              <w:left w:val="single" w:sz="12" w:color="003B71"/>
-              <w:right w:val="none" w:sz="6" w:color="auto"/>
-            </w:tcBorders>
-          </w:tcPr>
-          <w:p>
-            <w:pPr>
-              <w:spacing w:before="60" w:after="60"/>
-              <w:ind w:left="142"/>
-            </w:pPr>
-            <w:r>
-              <w:rPr>
-                <w:rFonts w:ascii="Calibri" w:hAnsi="Calibri"/>
-                <w:b/>
-                <w:i w:val="0"/>
-                <w:color w:val="003B71"/>
-                <w:sz w:val="17"/>
-              </w:rPr>
-              <w:t xml:space="preserve">Strategy  </w:t>
-            </w:r>
-            <w:r>
-              <w:rPr>
-                <w:rFonts w:ascii="Calibri" w:hAnsi="Calibri"/>
-                <w:b w:val="0"/>
-                <w:i w:val="0"/>
-                <w:color w:val="334155"/>
-                <w:sz w:val="17"/>
-              </w:rPr>
-              <w:t>Rà soát ngay danh mục R&amp;D/sản xuất: nếu Levetiracetam đã có hoặc khả thi về nguyên liệu, ưu tiên theo dõi các thử nghiệm lâm sàng giai đoạn tiếp theo để chuẩn bị hồ sơ đăng ký chỉ định bổ sung, đón đầu nhu cầu từ kênh bệnh viện chuyên khoa thần kinh và chuỗi nhà thuốc cao cấp.</w:t>
             </w:r>
           </w:p>
         </w:tc>
@@ -5656,7 +5812,7 @@
                 <w:color w:val="111827"/>
                 <w:sz w:val="18"/>
               </w:rPr>
-              <w:t>Phát triển tài liệu KOL/CME "can thiệp sớm 40+" cho RAVASTEL, EIMLER-10, PECHAUNOX, ZENTOGOUT</w:t>
+              <w:t>Chuẩn bị hồ sơ đấu thầu đưa HYYR và LARRIVEY vào danh mục BHYT chu kỳ tới</w:t>
             </w:r>
           </w:p>
         </w:tc>
@@ -5684,7 +5840,7 @@
                 <w:color w:val="003B71"/>
                 <w:sz w:val="17"/>
               </w:rPr>
-              <w:t>Marketing &amp; Medical Affairs</w:t>
+              <w:t>Marketing / RA</w:t>
             </w:r>
           </w:p>
         </w:tc>
@@ -5712,142 +5868,7 @@
                 <w:color w:val="6B7280"/>
                 <w:sz w:val="17"/>
               </w:rPr>
-              <w:t>Lão hóa tăng tốc 44 &amp; 60 tuổi (Stanford)</w:t>
-            </w:r>
-          </w:p>
-        </w:tc>
-        <w:tc>
-          <w:tcPr>
-            <w:tcW w:type="dxa" w:w="1644"/>
-            <w:shd w:val="clear" w:color="auto" w:fill="FEE2E2"/>
-            <w:tcBorders>
-              <w:top w:val="none" w:sz="6" w:color="auto"/>
-              <w:bottom w:val="none" w:sz="6" w:color="auto"/>
-              <w:left w:val="none" w:sz="6" w:color="auto"/>
-              <w:right w:val="none" w:sz="6" w:color="auto"/>
-            </w:tcBorders>
-          </w:tcPr>
-          <w:p>
-            <w:pPr>
-              <w:spacing w:before="80" w:after="80"/>
-              <w:jc w:val="center"/>
-            </w:pPr>
-            <w:r>
-              <w:rPr>
-                <w:rFonts w:ascii="Calibri" w:hAnsi="Calibri"/>
-                <w:b/>
-                <w:i w:val="0"/>
-                <w:color w:val="EF4444"/>
-                <w:sz w:val="17"/>
-              </w:rPr>
-              <w:t>🔴 Cao</w:t>
-            </w:r>
-          </w:p>
-        </w:tc>
-      </w:tr>
-      <w:tr>
-        <w:tc>
-          <w:tcPr>
-            <w:tcW w:type="dxa" w:w="454"/>
-            <w:shd w:val="clear" w:color="auto" w:fill="FEE2E2"/>
-            <w:tcBorders>
-              <w:top w:val="none" w:sz="6" w:color="auto"/>
-              <w:bottom w:val="none" w:sz="6" w:color="auto"/>
-              <w:left w:val="none" w:sz="6" w:color="auto"/>
-              <w:right w:val="none" w:sz="6" w:color="auto"/>
-            </w:tcBorders>
-          </w:tcPr>
-          <w:p>
-            <w:pPr>
-              <w:spacing w:before="100" w:after="100"/>
-              <w:jc w:val="center"/>
-            </w:pPr>
-            <w:r>
-              <w:t>🔴</w:t>
-            </w:r>
-          </w:p>
-        </w:tc>
-        <w:tc>
-          <w:tcPr>
-            <w:tcW w:type="dxa" w:w="4422"/>
-            <w:shd w:val="clear" w:color="auto" w:fill="FAFBFF"/>
-            <w:tcBorders>
-              <w:top w:val="none" w:sz="6" w:color="auto"/>
-              <w:bottom w:val="none" w:sz="6" w:color="auto"/>
-              <w:left w:val="none" w:sz="6" w:color="auto"/>
-              <w:right w:val="none" w:sz="6" w:color="auto"/>
-            </w:tcBorders>
-          </w:tcPr>
-          <w:p>
-            <w:pPr>
-              <w:spacing w:before="80" w:after="80"/>
-              <w:ind w:left="85"/>
-            </w:pPr>
-            <w:r>
-              <w:rPr>
-                <w:rFonts w:ascii="Calibri" w:hAnsi="Calibri"/>
-                <w:b/>
-                <w:i w:val="0"/>
-                <w:color w:val="111827"/>
-                <w:sz w:val="18"/>
-              </w:rPr>
-              <w:t>Xây dựng gói listing peri-operative (JIRACEK, PECHAUNOX, ZABALES) tại Tâm Anh, Vinmec, FV</w:t>
-            </w:r>
-          </w:p>
-        </w:tc>
-        <w:tc>
-          <w:tcPr>
-            <w:tcW w:type="dxa" w:w="1417"/>
-            <w:shd w:val="clear" w:color="auto" w:fill="FAFBFF"/>
-            <w:tcBorders>
-              <w:top w:val="none" w:sz="6" w:color="auto"/>
-              <w:bottom w:val="none" w:sz="6" w:color="auto"/>
-              <w:left w:val="none" w:sz="6" w:color="auto"/>
-              <w:right w:val="none" w:sz="6" w:color="auto"/>
-            </w:tcBorders>
-          </w:tcPr>
-          <w:p>
-            <w:pPr>
-              <w:spacing w:before="80" w:after="80"/>
-              <w:jc w:val="center"/>
-            </w:pPr>
-            <w:r>
-              <w:rPr>
-                <w:rFonts w:ascii="Calibri" w:hAnsi="Calibri"/>
-                <w:b w:val="0"/>
-                <w:i w:val="0"/>
-                <w:color w:val="003B71"/>
-                <w:sz w:val="17"/>
-              </w:rPr>
-              <w:t>Medical Affairs &amp; ETC Sales</w:t>
-            </w:r>
-          </w:p>
-        </w:tc>
-        <w:tc>
-          <w:tcPr>
-            <w:tcW w:type="dxa" w:w="1134"/>
-            <w:shd w:val="clear" w:color="auto" w:fill="FAFBFF"/>
-            <w:tcBorders>
-              <w:top w:val="none" w:sz="6" w:color="auto"/>
-              <w:bottom w:val="none" w:sz="6" w:color="auto"/>
-              <w:left w:val="none" w:sz="6" w:color="auto"/>
-              <w:right w:val="none" w:sz="6" w:color="auto"/>
-            </w:tcBorders>
-          </w:tcPr>
-          <w:p>
-            <w:pPr>
-              <w:spacing w:before="80" w:after="80"/>
-              <w:jc w:val="center"/>
-            </w:pPr>
-            <w:r>
-              <w:rPr>
-                <w:rFonts w:ascii="Calibri" w:hAnsi="Calibri"/>
-                <w:b w:val="0"/>
-                <w:i w:val="0"/>
-                <w:color w:val="6B7280"/>
-                <w:sz w:val="17"/>
-              </w:rPr>
-              <w:t>Ung thư đại tràng ~17.000 ca/năm, BV tư nâng cấp</w:t>
+              <w:t>Xu hướng tầm soát ung thư &amp; nhu cầu ung thư tuyến tỉnh tăng</w:t>
             </w:r>
           </w:p>
         </w:tc>
@@ -5905,6 +5926,141 @@
         <w:tc>
           <w:tcPr>
             <w:tcW w:type="dxa" w:w="4422"/>
+            <w:shd w:val="clear" w:color="auto" w:fill="FAFBFF"/>
+            <w:tcBorders>
+              <w:top w:val="none" w:sz="6" w:color="auto"/>
+              <w:bottom w:val="none" w:sz="6" w:color="auto"/>
+              <w:left w:val="none" w:sz="6" w:color="auto"/>
+              <w:right w:val="none" w:sz="6" w:color="auto"/>
+            </w:tcBorders>
+          </w:tcPr>
+          <w:p>
+            <w:pPr>
+              <w:spacing w:before="80" w:after="80"/>
+              <w:ind w:left="85"/>
+            </w:pPr>
+            <w:r>
+              <w:rPr>
+                <w:rFonts w:ascii="Calibri" w:hAnsi="Calibri"/>
+                <w:b/>
+                <w:i w:val="0"/>
+                <w:color w:val="111827"/>
+                <w:sz w:val="18"/>
+              </w:rPr>
+              <w:t>Cập nhật tài liệu detail EIMLER-10 &amp; ZLATKO cho bác sĩ tuyến cơ sở trước Q3/2025</w:t>
+            </w:r>
+          </w:p>
+        </w:tc>
+        <w:tc>
+          <w:tcPr>
+            <w:tcW w:type="dxa" w:w="1417"/>
+            <w:shd w:val="clear" w:color="auto" w:fill="FAFBFF"/>
+            <w:tcBorders>
+              <w:top w:val="none" w:sz="6" w:color="auto"/>
+              <w:bottom w:val="none" w:sz="6" w:color="auto"/>
+              <w:left w:val="none" w:sz="6" w:color="auto"/>
+              <w:right w:val="none" w:sz="6" w:color="auto"/>
+            </w:tcBorders>
+          </w:tcPr>
+          <w:p>
+            <w:pPr>
+              <w:spacing w:before="80" w:after="80"/>
+              <w:jc w:val="center"/>
+            </w:pPr>
+            <w:r>
+              <w:rPr>
+                <w:rFonts w:ascii="Calibri" w:hAnsi="Calibri"/>
+                <w:b w:val="0"/>
+                <w:i w:val="0"/>
+                <w:color w:val="003B71"/>
+                <w:sz w:val="17"/>
+              </w:rPr>
+              <w:t>Marketing</w:t>
+            </w:r>
+          </w:p>
+        </w:tc>
+        <w:tc>
+          <w:tcPr>
+            <w:tcW w:type="dxa" w:w="1134"/>
+            <w:shd w:val="clear" w:color="auto" w:fill="FAFBFF"/>
+            <w:tcBorders>
+              <w:top w:val="none" w:sz="6" w:color="auto"/>
+              <w:bottom w:val="none" w:sz="6" w:color="auto"/>
+              <w:left w:val="none" w:sz="6" w:color="auto"/>
+              <w:right w:val="none" w:sz="6" w:color="auto"/>
+            </w:tcBorders>
+          </w:tcPr>
+          <w:p>
+            <w:pPr>
+              <w:spacing w:before="80" w:after="80"/>
+              <w:jc w:val="center"/>
+            </w:pPr>
+            <w:r>
+              <w:rPr>
+                <w:rFonts w:ascii="Calibri" w:hAnsi="Calibri"/>
+                <w:b w:val="0"/>
+                <w:i w:val="0"/>
+                <w:color w:val="6B7280"/>
+                <w:sz w:val="17"/>
+              </w:rPr>
+              <w:t>Nhận thức biến chứng tiểu đường type 2 tăng trên truyền thông</w:t>
+            </w:r>
+          </w:p>
+        </w:tc>
+        <w:tc>
+          <w:tcPr>
+            <w:tcW w:type="dxa" w:w="1644"/>
+            <w:shd w:val="clear" w:color="auto" w:fill="FEF3C7"/>
+            <w:tcBorders>
+              <w:top w:val="none" w:sz="6" w:color="auto"/>
+              <w:bottom w:val="none" w:sz="6" w:color="auto"/>
+              <w:left w:val="none" w:sz="6" w:color="auto"/>
+              <w:right w:val="none" w:sz="6" w:color="auto"/>
+            </w:tcBorders>
+          </w:tcPr>
+          <w:p>
+            <w:pPr>
+              <w:spacing w:before="80" w:after="80"/>
+              <w:jc w:val="center"/>
+            </w:pPr>
+            <w:r>
+              <w:rPr>
+                <w:rFonts w:ascii="Calibri" w:hAnsi="Calibri"/>
+                <w:b/>
+                <w:i w:val="0"/>
+                <w:color w:val="D97706"/>
+                <w:sz w:val="17"/>
+              </w:rPr>
+              <w:t>🟡 Trung</w:t>
+            </w:r>
+          </w:p>
+        </w:tc>
+      </w:tr>
+      <w:tr>
+        <w:tc>
+          <w:tcPr>
+            <w:tcW w:type="dxa" w:w="454"/>
+            <w:shd w:val="clear" w:color="auto" w:fill="FEF3C7"/>
+            <w:tcBorders>
+              <w:top w:val="none" w:sz="6" w:color="auto"/>
+              <w:bottom w:val="none" w:sz="6" w:color="auto"/>
+              <w:left w:val="none" w:sz="6" w:color="auto"/>
+              <w:right w:val="none" w:sz="6" w:color="auto"/>
+            </w:tcBorders>
+          </w:tcPr>
+          <w:p>
+            <w:pPr>
+              <w:spacing w:before="100" w:after="100"/>
+              <w:jc w:val="center"/>
+            </w:pPr>
+            <w:r>
+              <w:t>🟡</w:t>
+            </w:r>
+          </w:p>
+        </w:tc>
+        <w:tc>
+          <w:tcPr>
+            <w:tcW w:type="dxa" w:w="4422"/>
             <w:shd w:val="clear" w:color="auto" w:fill="FFFFFF"/>
             <w:tcBorders>
               <w:top w:val="none" w:sz="6" w:color="auto"/>
@@ -5926,7 +6082,7 @@
                 <w:color w:val="111827"/>
                 <w:sz w:val="18"/>
               </w:rPr>
-              <w:t>Rà soát &amp; triển khai tài liệu HYYR chỉ định ung thư tụy tại BV K, Chợ Rẫy, Ung bướu TP.HCM</w:t>
+              <w:t>Theo dõi nội dung "hạ huyết áp không dùng thuốc" mạng xã hội; chuẩn bị tài liệu HCP cho PECHAUNOX, TABAREX</w:t>
             </w:r>
           </w:p>
         </w:tc>
@@ -5954,7 +6110,7 @@
                 <w:color w:val="003B71"/>
                 <w:sz w:val="17"/>
               </w:rPr>
-              <w:t>Oncology &amp; Medical Affairs</w:t>
+              <w:t>Marketing</w:t>
             </w:r>
           </w:p>
         </w:tc>
@@ -5982,7 +6138,7 @@
                 <w:color w:val="6B7280"/>
                 <w:sz w:val="17"/>
               </w:rPr>
-              <w:t>Nhận thức ung thư tụy tăng (VnExpress)</w:t>
+              <w:t>Xu hướng củ dền thay thuốc hạ huyết áp</w:t>
             </w:r>
           </w:p>
         </w:tc>
@@ -6061,7 +6217,7 @@
                 <w:color w:val="111827"/>
                 <w:sz w:val="18"/>
               </w:rPr>
-              <w:t>Đánh giá khả năng mở rộng danh mục hormone therapy ung thư vú; báo cáo BOD Q3/</w:t>
+              <w:t>Khảo sát nhu cầu &amp; quy trình mua sắm quân y Bộ Quốc phòng cho METILONE-4</w:t>
             </w:r>
           </w:p>
         </w:tc>
@@ -6089,6 +6245,7 @@
                 <w:color w:val="003B71"/>
                 <w:sz w:val="17"/>
               </w:rPr>
+              <w:t>Strategy / Sales</w:t>
             </w:r>
           </w:p>
         </w:tc>

</xml_diff>

<commit_message>
Update report_vi.docx 2026-05-13 11:20
</commit_message>
<xml_diff>
--- a/report_vi.docx
+++ b/report_vi.docx
@@ -338,7 +338,7 @@
                 <w:color w:val="111827"/>
                 <w:sz w:val="20"/>
               </w:rPr>
-              <w:t>Tuần 11–17/05/2026 không có tín hiệu reg-policy hay đấu thầu trực tiếp, song ba xu hướng dịch tễ (tiểu đường, ung thư, tâm thần) củng cố cơ sở nhu cầu dài hạn cho danh mục ETC cốt lõi của Davipharm.</w:t>
+              <w:t>Tuần 11–17/05/2026 không phát sinh sự kiện pháp lý hay đấu thầu trực tiếp, nhưng đề xuất nâng cấp cơ sở 2 Bạch Mai &amp; Việt Đức là tín hiệu mở rộng ETC quan trọng nhất cần Davipharm hành động sớm.</w:t>
             </w:r>
           </w:p>
         </w:tc>
@@ -406,7 +406,7 @@
                 <w:color w:val="111827"/>
                 <w:sz w:val="17"/>
               </w:rPr>
-              <w:t>▸  Tiểu đường:Truyền thông đại chúng đang nâng cao nhận thức về biến chứng ĐTĐ type 2, củng cố nhu cầu thị trường bền vững cho EIMLER-10 (Empagliflozin) và ZLATKO (Sitagliptin) trong kênh ETC.</w:t>
+              <w:t>▸  ETC mở rộng – Bạch Mai 2 &amp; Việt Đức 2:Nếu đề xuất được thông qua, hai đơn vị mua sắm độc lập mới tại Hà Nam và Ninh Bình sẽ mở chu kỳ thầu đầu tiên — cơ hội trực tiếp cho RAVASTEL, EIMLER-10, PECHAUNOX và HYYR.</w:t>
             </w:r>
           </w:p>
           <w:p>
@@ -422,7 +422,7 @@
                 <w:color w:val="111827"/>
                 <w:sz w:val="17"/>
               </w:rPr>
-              <w:t>▸  Ung thư:Xu hướng tầm soát ung thư tăng và gánh nặng chi phí điều trị tại tuyến tỉnh nhấn mạnh tầm quan trọng chiến lược của việc đưa HYYR (Erlotinib) và LARRIVEY (Bicalutamide) vào danh mục BHYT chu kỳ thầu tới.</w:t>
+              <w:t>▸  Ung thư – Tầm soát sớm:Xu hướng phẫu thuật triệt căn ung thư giai đoạn sớm có thể dần thu hẹp nhóm bệnh nhân cần thuốc nhắm đích, tác động dài hạn đến vị thế thầu của HYYR và LARRIVEY tại bệnh viện tuyến đầu.</w:t>
             </w:r>
           </w:p>
           <w:p>
@@ -438,23 +438,7 @@
                 <w:color w:val="111827"/>
                 <w:sz w:val="17"/>
               </w:rPr>
-              <w:t>▸  Tâm thần:Xu hướng lạm dụng chất kích thần trong cộng đồng là tín hiệu dài hạn cho tăng trưởng bệnh nhân tâm thần — cơ hội mở rộng SERNAL (Risperidone) và LAFAXOR (Venlafaxine) tại bệnh viện tâm thần và khoa tâm thần đa khoa.</w:t>
-            </w:r>
-          </w:p>
-          <w:p>
-            <w:pPr>
-              <w:spacing w:before="20" w:after="60"/>
-              <w:ind w:left="142"/>
-            </w:pPr>
-            <w:r>
-              <w:rPr>
-                <w:rFonts w:ascii="Calibri" w:hAnsi="Calibri"/>
-                <w:b w:val="0"/>
-                <w:i w:val="0"/>
-                <w:color w:val="111827"/>
-                <w:sz w:val="17"/>
-              </w:rPr>
-              <w:t>▸  P1ETC/Tender Team: xác nhận HYYR và LARRIVEY nằm trong hồ sơ đăng ký danh mục BHYT và chuẩn bị hồ sơ thầu chu kỳ tới — ư</w:t>
+              <w:t>▸  OTC – Chi tiêu tự nguyện tăng:Dữ liệu du lịch y tế TP.HCM (3.500 tỉ đồng) xác nhận xu hướng vĩ mô người tiêu dùng sẵn chi tiêu ngoài BHYT, hỗ trợ luận điểm đầu tư kênh phòng khám tư cho nhóm Nam khoa (JANUS, TADALAFIL 20MG, DRYCHES).</w:t>
             </w:r>
           </w:p>
         </w:tc>
@@ -483,22 +467,6 @@
                 <w:sz w:val="17"/>
               </w:rPr>
               <w:t>⚡  HÀNH ĐỘNG ƯU TIÊN</w:t>
-            </w:r>
-          </w:p>
-          <w:p>
-            <w:pPr>
-              <w:spacing w:before="20" w:after="60"/>
-              <w:ind w:left="142"/>
-            </w:pPr>
-            <w:r>
-              <w:rPr>
-                <w:rFonts w:ascii="Calibri" w:hAnsi="Calibri"/>
-                <w:b w:val="0"/>
-                <w:i w:val="0"/>
-                <w:color w:val="0056D2"/>
-                <w:sz w:val="17"/>
-              </w:rPr>
-              <w:t>→  P1ETC/Tender Team: xác nhận HYYR và LARRIVEY nằm trong hồ sơ đăng ký danh mục BHYT và chuẩn bị hồ sơ thầu chu kỳ tới — ư</w:t>
             </w:r>
           </w:p>
         </w:tc>
@@ -1873,6 +1841,786 @@
                 <w:color w:val="4338CA"/>
                 <w:sz w:val="15"/>
               </w:rPr>
+              <w:t>SK&amp;ĐS – CHÍNH SÁCH Y TẾ</w:t>
+            </w:r>
+          </w:p>
+        </w:tc>
+        <w:tc>
+          <w:tcPr>
+            <w:tcW w:type="dxa" w:w="4536"/>
+            <w:tcBorders>
+              <w:top w:val="none" w:sz="6" w:color="auto"/>
+              <w:bottom w:val="none" w:sz="6" w:color="auto"/>
+              <w:left w:val="none" w:sz="6" w:color="auto"/>
+              <w:right w:val="none" w:sz="6" w:color="auto"/>
+            </w:tcBorders>
+          </w:tcPr>
+          <w:p>
+            <w:pPr>
+              <w:spacing w:before="60" w:after="60"/>
+              <w:ind w:left="113"/>
+            </w:pPr>
+            <w:r>
+              <w:rPr>
+                <w:rFonts w:ascii="Calibri" w:hAnsi="Calibri"/>
+                <w:b/>
+                <w:i w:val="0"/>
+                <w:color w:val="111827"/>
+                <w:sz w:val="21"/>
+              </w:rPr>
+              <w:t>Đảm bảo chất lượng thuốc, mỹ phẩm, thực phẩm vì sức khỏe cộng đồng</w:t>
+            </w:r>
+          </w:p>
+        </w:tc>
+      </w:tr>
+    </w:tbl>
+    <w:p>
+      <w:pPr>
+        <w:spacing w:before="40" w:after="40"/>
+        <w:ind w:left="170"/>
+      </w:pPr>
+      <w:r>
+        <w:rPr>
+          <w:rFonts w:ascii="Calibri" w:hAnsi="Calibri"/>
+          <w:b w:val="0"/>
+          <w:i/>
+          <w:color w:val="6B7280"/>
+          <w:sz w:val="18"/>
+        </w:rPr>
+        <w:t>Bài viết đề cập định hướng chung về đảm bảo chất lượng thuốc, mỹ phẩm và thực phẩm chức năng tại Việt Nam, không có văn bản pháp quy cụ thể hay kết quả đấu thầu nào được ban hành. Nội dung mang tính tổng quan truyền thông, không tác động trực tiếp đến danh mục sản phẩm hay hoạt động đấu thầu của Davipharm trong ngắn hạn.</w:t>
+      </w:r>
+    </w:p>
+    <w:p>
+      <w:pPr>
+        <w:spacing w:before="20" w:after="40"/>
+        <w:ind w:left="170"/>
+      </w:pPr>
+      <w:r>
+        <w:rPr>
+          <w:rFonts w:ascii="Calibri" w:hAnsi="Calibri"/>
+          <w:b/>
+          <w:i w:val="0"/>
+          <w:color w:val="374151"/>
+          <w:sz w:val="17"/>
+        </w:rPr>
+        <w:t>⚪ Tín hiệu trung lập — không có sự kiện quy định hoặc thầu cụ thể tác động đến sản phẩm Davipharm; theo dõi nếu xu hướng kiểm soát chất lượng được cụ thể hóa thành văn bản.</w:t>
+      </w:r>
+    </w:p>
+    <w:tbl>
+      <w:tblPr>
+        <w:tblStyle w:val="TableGrid"/>
+        <w:tblW w:type="auto" w:w="0"/>
+        <w:tblLook w:firstColumn="1" w:firstRow="1" w:lastColumn="0" w:lastRow="0" w:noHBand="0" w:noVBand="1" w:val="04A0"/>
+      </w:tblPr>
+      <w:tblGrid>
+        <w:gridCol w:w="9072"/>
+      </w:tblGrid>
+      <w:tr>
+        <w:tc>
+          <w:tcPr>
+            <w:tcW w:type="dxa" w:w="9072"/>
+            <w:shd w:val="clear" w:color="auto" w:fill="F8FAFC"/>
+            <w:tcBorders>
+              <w:top w:val="none" w:sz="6" w:color="auto"/>
+              <w:bottom w:val="none" w:sz="6" w:color="auto"/>
+              <w:left w:val="single" w:sz="12" w:color="003B71"/>
+              <w:right w:val="none" w:sz="6" w:color="auto"/>
+            </w:tcBorders>
+          </w:tcPr>
+          <w:p>
+            <w:pPr>
+              <w:spacing w:before="60" w:after="60"/>
+              <w:ind w:left="142"/>
+            </w:pPr>
+            <w:r>
+              <w:rPr>
+                <w:rFonts w:ascii="Calibri" w:hAnsi="Calibri"/>
+                <w:b/>
+                <w:i w:val="0"/>
+                <w:color w:val="003B71"/>
+                <w:sz w:val="17"/>
+              </w:rPr>
+              <w:t xml:space="preserve">Strategy  </w:t>
+            </w:r>
+            <w:r>
+              <w:rPr>
+                <w:rFonts w:ascii="Calibri" w:hAnsi="Calibri"/>
+                <w:b w:val="0"/>
+                <w:i w:val="0"/>
+                <w:color w:val="334155"/>
+                <w:sz w:val="17"/>
+              </w:rPr>
+              <w:t>Team Regulatory Affairs theo dõi các diễn biến tiếp theo từ Cục Quản lý Dược để phát hiện sớm nếu định hướng này chuyển thành thông tư/nghị định ảnh hưởng đến điều kiện lưu hành hoặc GMP của toàn danh mục; không cần hành động khẩn cấp tại thời điểm này.</w:t>
+            </w:r>
+          </w:p>
+        </w:tc>
+      </w:tr>
+    </w:tbl>
+    <w:p>
+      <w:pPr>
+        <w:spacing w:before="40" w:after="120"/>
+      </w:pPr>
+    </w:p>
+    <w:tbl>
+      <w:tblPr>
+        <w:tblStyle w:val="TableGrid"/>
+        <w:tblW w:type="auto" w:w="0"/>
+        <w:jc w:val="left"/>
+        <w:tblLook w:firstColumn="1" w:firstRow="1" w:lastColumn="0" w:lastRow="0" w:noHBand="0" w:noVBand="1" w:val="04A0"/>
+      </w:tblPr>
+      <w:tblGrid>
+        <w:gridCol w:w="4536"/>
+        <w:gridCol w:w="4536"/>
+      </w:tblGrid>
+      <w:tr>
+        <w:tc>
+          <w:tcPr>
+            <w:tcW w:type="dxa" w:w="1984"/>
+            <w:shd w:val="clear" w:color="auto" w:fill="EEF2FF"/>
+            <w:tcBorders>
+              <w:top w:val="none" w:sz="6" w:color="auto"/>
+              <w:bottom w:val="none" w:sz="6" w:color="auto"/>
+              <w:left w:val="none" w:sz="6" w:color="auto"/>
+              <w:right w:val="none" w:sz="6" w:color="auto"/>
+            </w:tcBorders>
+          </w:tcPr>
+          <w:p>
+            <w:pPr>
+              <w:spacing w:before="80" w:after="80"/>
+              <w:ind w:left="85"/>
+            </w:pPr>
+            <w:r>
+              <w:rPr>
+                <w:rFonts w:ascii="Calibri" w:hAnsi="Calibri"/>
+                <w:b/>
+                <w:i w:val="0"/>
+                <w:color w:val="4338CA"/>
+                <w:sz w:val="15"/>
+              </w:rPr>
+              <w:t>VNEXPRESS – SỨC KHỎE</w:t>
+            </w:r>
+          </w:p>
+        </w:tc>
+        <w:tc>
+          <w:tcPr>
+            <w:tcW w:type="dxa" w:w="4536"/>
+            <w:tcBorders>
+              <w:top w:val="none" w:sz="6" w:color="auto"/>
+              <w:bottom w:val="none" w:sz="6" w:color="auto"/>
+              <w:left w:val="none" w:sz="6" w:color="auto"/>
+              <w:right w:val="none" w:sz="6" w:color="auto"/>
+            </w:tcBorders>
+          </w:tcPr>
+          <w:p>
+            <w:pPr>
+              <w:spacing w:before="60" w:after="60"/>
+              <w:ind w:left="113"/>
+            </w:pPr>
+            <w:r>
+              <w:rPr>
+                <w:rFonts w:ascii="Calibri" w:hAnsi="Calibri"/>
+                <w:b/>
+                <w:i w:val="0"/>
+                <w:color w:val="111827"/>
+                <w:sz w:val="21"/>
+              </w:rPr>
+              <w:t>Chuẩn bị sức khỏe du lịch hè vùng xa: tín hiệu nhu cầu OTC mùa hè</w:t>
+            </w:r>
+          </w:p>
+        </w:tc>
+      </w:tr>
+    </w:tbl>
+    <w:p>
+      <w:pPr>
+        <w:spacing w:before="40" w:after="40"/>
+        <w:ind w:left="170"/>
+      </w:pPr>
+      <w:r>
+        <w:rPr>
+          <w:rFonts w:ascii="Calibri" w:hAnsi="Calibri"/>
+          <w:b w:val="0"/>
+          <w:i/>
+          <w:color w:val="6B7280"/>
+          <w:sz w:val="18"/>
+        </w:rPr>
+        <w:t>Bài viết từ VNVC khuyến nghị người đi du lịch hè vùng xa chuẩn bị túi thuốc cơ bản (hạ sốt, tiêu hóa, sát khuẩn) và vaccine, phản ánh nhu cầu tiêu dùng OTC theo mùa hè tăng cao. Tác động trực tiếp đến Davipharm rất hạn chế do danh mục không có sản phẩm OTC travel-health chủ lực; bài viết không đề cập đến kênh ETC hay đấu thầu.</w:t>
+      </w:r>
+    </w:p>
+    <w:p>
+      <w:pPr>
+        <w:spacing w:before="20" w:after="40"/>
+        <w:ind w:left="170"/>
+      </w:pPr>
+      <w:r>
+        <w:rPr>
+          <w:rFonts w:ascii="Calibri" w:hAnsi="Calibri"/>
+          <w:b/>
+          <w:i w:val="0"/>
+          <w:color w:val="374151"/>
+          <w:sz w:val="17"/>
+        </w:rPr>
+        <w:t>➖ Tin không liên quan trực tiếp đến danh mục ETC hay sản phẩm chiến lược của Davipharm; không phát sinh cơ hội hay rủi ro rõ ràng trong kỳ ngắn hạn.</w:t>
+      </w:r>
+    </w:p>
+    <w:tbl>
+      <w:tblPr>
+        <w:tblStyle w:val="TableGrid"/>
+        <w:tblW w:type="auto" w:w="0"/>
+        <w:tblLook w:firstColumn="1" w:firstRow="1" w:lastColumn="0" w:lastRow="0" w:noHBand="0" w:noVBand="1" w:val="04A0"/>
+      </w:tblPr>
+      <w:tblGrid>
+        <w:gridCol w:w="9072"/>
+      </w:tblGrid>
+      <w:tr>
+        <w:tc>
+          <w:tcPr>
+            <w:tcW w:type="dxa" w:w="9072"/>
+            <w:shd w:val="clear" w:color="auto" w:fill="F8FAFC"/>
+            <w:tcBorders>
+              <w:top w:val="none" w:sz="6" w:color="auto"/>
+              <w:bottom w:val="none" w:sz="6" w:color="auto"/>
+              <w:left w:val="single" w:sz="12" w:color="003B71"/>
+              <w:right w:val="none" w:sz="6" w:color="auto"/>
+            </w:tcBorders>
+          </w:tcPr>
+          <w:p>
+            <w:pPr>
+              <w:spacing w:before="60" w:after="60"/>
+              <w:ind w:left="142"/>
+            </w:pPr>
+            <w:r>
+              <w:rPr>
+                <w:rFonts w:ascii="Calibri" w:hAnsi="Calibri"/>
+                <w:b/>
+                <w:i w:val="0"/>
+                <w:color w:val="003B71"/>
+                <w:sz w:val="17"/>
+              </w:rPr>
+              <w:t xml:space="preserve">Strategy  </w:t>
+            </w:r>
+            <w:r>
+              <w:rPr>
+                <w:rFonts w:ascii="Calibri" w:hAnsi="Calibri"/>
+                <w:b w:val="0"/>
+                <w:i w:val="0"/>
+                <w:color w:val="334155"/>
+                <w:sz w:val="17"/>
+              </w:rPr>
+              <w:t>Không cần hành động ưu tiên. Marketing team có thể ghi nhận như tín hiệu nền về nhu cầu OTC mùa hè, tuy nhiên không cần phân bổ nguồn lực do Davipharm chưa có sản phẩm tiêu hóa/hạ sốt OTC định vị phân khúc travel-health.</w:t>
+            </w:r>
+          </w:p>
+        </w:tc>
+      </w:tr>
+    </w:tbl>
+    <w:p>
+      <w:pPr>
+        <w:spacing w:before="40" w:after="120"/>
+      </w:pPr>
+    </w:p>
+    <w:tbl>
+      <w:tblPr>
+        <w:tblStyle w:val="TableGrid"/>
+        <w:tblW w:type="auto" w:w="0"/>
+        <w:jc w:val="left"/>
+        <w:tblLook w:firstColumn="1" w:firstRow="1" w:lastColumn="0" w:lastRow="0" w:noHBand="0" w:noVBand="1" w:val="04A0"/>
+      </w:tblPr>
+      <w:tblGrid>
+        <w:gridCol w:w="4536"/>
+        <w:gridCol w:w="4536"/>
+      </w:tblGrid>
+      <w:tr>
+        <w:tc>
+          <w:tcPr>
+            <w:tcW w:type="dxa" w:w="1984"/>
+            <w:shd w:val="clear" w:color="auto" w:fill="EEF2FF"/>
+            <w:tcBorders>
+              <w:top w:val="none" w:sz="6" w:color="auto"/>
+              <w:bottom w:val="none" w:sz="6" w:color="auto"/>
+              <w:left w:val="none" w:sz="6" w:color="auto"/>
+              <w:right w:val="none" w:sz="6" w:color="auto"/>
+            </w:tcBorders>
+          </w:tcPr>
+          <w:p>
+            <w:pPr>
+              <w:spacing w:before="80" w:after="80"/>
+              <w:ind w:left="85"/>
+            </w:pPr>
+            <w:r>
+              <w:rPr>
+                <w:rFonts w:ascii="Calibri" w:hAnsi="Calibri"/>
+                <w:b/>
+                <w:i w:val="0"/>
+                <w:color w:val="4338CA"/>
+                <w:sz w:val="15"/>
+              </w:rPr>
+              <w:t>VNEXPRESS – SỨC KHỎE</w:t>
+            </w:r>
+          </w:p>
+        </w:tc>
+        <w:tc>
+          <w:tcPr>
+            <w:tcW w:type="dxa" w:w="4536"/>
+            <w:tcBorders>
+              <w:top w:val="none" w:sz="6" w:color="auto"/>
+              <w:bottom w:val="none" w:sz="6" w:color="auto"/>
+              <w:left w:val="none" w:sz="6" w:color="auto"/>
+              <w:right w:val="none" w:sz="6" w:color="auto"/>
+            </w:tcBorders>
+          </w:tcPr>
+          <w:p>
+            <w:pPr>
+              <w:spacing w:before="60" w:after="60"/>
+              <w:ind w:left="113"/>
+            </w:pPr>
+            <w:r>
+              <w:rPr>
+                <w:rFonts w:ascii="Calibri" w:hAnsi="Calibri"/>
+                <w:b/>
+                <w:i w:val="0"/>
+                <w:color w:val="111827"/>
+                <w:sz w:val="21"/>
+              </w:rPr>
+              <w:t>Phẫu thuật nội soi cắt thực quản triệt căn ung thư giai đoạn sớm tại Tâm Anh</w:t>
+            </w:r>
+          </w:p>
+        </w:tc>
+      </w:tr>
+    </w:tbl>
+    <w:p>
+      <w:pPr>
+        <w:spacing w:before="40" w:after="40"/>
+        <w:ind w:left="170"/>
+      </w:pPr>
+      <w:r>
+        <w:rPr>
+          <w:rFonts w:ascii="Calibri" w:hAnsi="Calibri"/>
+          <w:b w:val="0"/>
+          <w:i/>
+          <w:color w:val="6B7280"/>
+          <w:sz w:val="18"/>
+        </w:rPr>
+        <w:t>Bệnh viện Tâm Anh Hà Nội thực hiện thành công phẫu thuật nội soi cắt toàn bộ thực quản cho bệnh nhân ung thư giai đoạn sớm (cT1bN0M0), bệnh nhân không cần hóa xạ trị bổ trợ sau mổ. Bài viết phản ánh xu hướng phát hiện ung thư sớm qua tầm soát định kỳ, có thể làm tăng tỷ lệ ca phẫu thuật triệt căn nhưng giảm nhu cầu điều trị hóa-xạ đa mô thức — phân khúc liên quan đến HYYR (Erlotinib) và LARRIVEY (Bicalutamide) của Davipharm.</w:t>
+      </w:r>
+    </w:p>
+    <w:p>
+      <w:pPr>
+        <w:spacing w:before="20" w:after="40"/>
+        <w:ind w:left="170"/>
+      </w:pPr>
+      <w:r>
+        <w:rPr>
+          <w:rFonts w:ascii="Calibri" w:hAnsi="Calibri"/>
+          <w:b/>
+          <w:i w:val="0"/>
+          <w:color w:val="374151"/>
+          <w:sz w:val="17"/>
+        </w:rPr>
+        <w:t>⚪ Tín hiệu theo dõi: xu hướng phát hiện ung thư sớm có thể giảm nhóm bệnh nhân dùng thuốc nhắm đích — không tác động trực tiếp đến doanh thu Davipharm trong ngắn hạn, nhưng cần theo dõi dịch chuyển mô hình điều trị ung thư tại kênh ETC bệnh viện tuyến đầu.</w:t>
+      </w:r>
+    </w:p>
+    <w:tbl>
+      <w:tblPr>
+        <w:tblStyle w:val="TableGrid"/>
+        <w:tblW w:type="auto" w:w="0"/>
+        <w:tblLook w:firstColumn="1" w:firstRow="1" w:lastColumn="0" w:lastRow="0" w:noHBand="0" w:noVBand="1" w:val="04A0"/>
+      </w:tblPr>
+      <w:tblGrid>
+        <w:gridCol w:w="9072"/>
+      </w:tblGrid>
+      <w:tr>
+        <w:tc>
+          <w:tcPr>
+            <w:tcW w:type="dxa" w:w="9072"/>
+            <w:shd w:val="clear" w:color="auto" w:fill="F8FAFC"/>
+            <w:tcBorders>
+              <w:top w:val="none" w:sz="6" w:color="auto"/>
+              <w:bottom w:val="none" w:sz="6" w:color="auto"/>
+              <w:left w:val="single" w:sz="12" w:color="003B71"/>
+              <w:right w:val="none" w:sz="6" w:color="auto"/>
+            </w:tcBorders>
+          </w:tcPr>
+          <w:p>
+            <w:pPr>
+              <w:spacing w:before="60" w:after="60"/>
+              <w:ind w:left="142"/>
+            </w:pPr>
+            <w:r>
+              <w:rPr>
+                <w:rFonts w:ascii="Calibri" w:hAnsi="Calibri"/>
+                <w:b/>
+                <w:i w:val="0"/>
+                <w:color w:val="003B71"/>
+                <w:sz w:val="17"/>
+              </w:rPr>
+              <w:t xml:space="preserve">Strategy  </w:t>
+            </w:r>
+            <w:r>
+              <w:rPr>
+                <w:rFonts w:ascii="Calibri" w:hAnsi="Calibri"/>
+                <w:b w:val="0"/>
+                <w:i w:val="0"/>
+                <w:color w:val="334155"/>
+                <w:sz w:val="17"/>
+              </w:rPr>
+              <w:t>Team Ung thư (Oncology) theo dõi tỷ lệ ca phẫu thuật triệt căn vs. điều trị hệ thống tại các bệnh viện tuyến trên (Tâm Anh, Bạch Mai, Chợ Rẫy) để đánh giá tác động dài hạn đến vị thế thầu của HYYR và LARRIVEY; không cần hành động khẩn trong Q này.</w:t>
+            </w:r>
+          </w:p>
+        </w:tc>
+      </w:tr>
+    </w:tbl>
+    <w:p>
+      <w:pPr>
+        <w:spacing w:before="40" w:after="120"/>
+      </w:pPr>
+    </w:p>
+    <w:tbl>
+      <w:tblPr>
+        <w:tblStyle w:val="TableGrid"/>
+        <w:tblW w:type="auto" w:w="0"/>
+        <w:jc w:val="left"/>
+        <w:tblLook w:firstColumn="1" w:firstRow="1" w:lastColumn="0" w:lastRow="0" w:noHBand="0" w:noVBand="1" w:val="04A0"/>
+      </w:tblPr>
+      <w:tblGrid>
+        <w:gridCol w:w="4536"/>
+        <w:gridCol w:w="4536"/>
+      </w:tblGrid>
+      <w:tr>
+        <w:tc>
+          <w:tcPr>
+            <w:tcW w:type="dxa" w:w="1984"/>
+            <w:shd w:val="clear" w:color="auto" w:fill="EEF2FF"/>
+            <w:tcBorders>
+              <w:top w:val="none" w:sz="6" w:color="auto"/>
+              <w:bottom w:val="none" w:sz="6" w:color="auto"/>
+              <w:left w:val="none" w:sz="6" w:color="auto"/>
+              <w:right w:val="none" w:sz="6" w:color="auto"/>
+            </w:tcBorders>
+          </w:tcPr>
+          <w:p>
+            <w:pPr>
+              <w:spacing w:before="80" w:after="80"/>
+              <w:ind w:left="85"/>
+            </w:pPr>
+            <w:r>
+              <w:rPr>
+                <w:rFonts w:ascii="Calibri" w:hAnsi="Calibri"/>
+                <w:b/>
+                <w:i w:val="0"/>
+                <w:color w:val="4338CA"/>
+                <w:sz w:val="15"/>
+              </w:rPr>
+              <w:t>TUỔI TRẺ – SỨC KHỎE</w:t>
+            </w:r>
+          </w:p>
+        </w:tc>
+        <w:tc>
+          <w:tcPr>
+            <w:tcW w:type="dxa" w:w="4536"/>
+            <w:tcBorders>
+              <w:top w:val="none" w:sz="6" w:color="auto"/>
+              <w:bottom w:val="none" w:sz="6" w:color="auto"/>
+              <w:left w:val="none" w:sz="6" w:color="auto"/>
+              <w:right w:val="none" w:sz="6" w:color="auto"/>
+            </w:tcBorders>
+          </w:tcPr>
+          <w:p>
+            <w:pPr>
+              <w:spacing w:before="60" w:after="60"/>
+              <w:ind w:left="113"/>
+            </w:pPr>
+            <w:r>
+              <w:rPr>
+                <w:rFonts w:ascii="Calibri" w:hAnsi="Calibri"/>
+                <w:b/>
+                <w:i w:val="0"/>
+                <w:color w:val="111827"/>
+                <w:sz w:val="21"/>
+              </w:rPr>
+              <w:t>Bộ Y tế đề xuất cơ sở 2 Bạch Mai, Việt Đức áp dụng giá dịch vụ y tế ngang cơ sở chính</w:t>
+            </w:r>
+          </w:p>
+        </w:tc>
+      </w:tr>
+    </w:tbl>
+    <w:p>
+      <w:pPr>
+        <w:spacing w:before="40" w:after="40"/>
+        <w:ind w:left="170"/>
+      </w:pPr>
+      <w:r>
+        <w:rPr>
+          <w:rFonts w:ascii="Calibri" w:hAnsi="Calibri"/>
+          <w:b w:val="0"/>
+          <w:i/>
+          <w:color w:val="6B7280"/>
+          <w:sz w:val="18"/>
+        </w:rPr>
+        <w:t>Bộ Y tế đề xuất cho phép cơ sở 2 của Bạch Mai và Việt Đức áp dụng mức giá dịch vụ y tế tương đương cơ sở chính, nhằm tăng khả năng thu hút bệnh nhân và tự chủ tài chính cho hai bệnh viện tuyến trung ương lớn nhất miền Bắc. Nếu được thông qua, lượng bệnh nhân điều trị nội trú tại hai cơ sở này sẽ tăng, mở rộng thị trường tiêu thụ ETC cho các nhóm thuốc tim mạch, đái tháo đường và ung thư của Davipharm.</w:t>
+      </w:r>
+    </w:p>
+    <w:p>
+      <w:pPr>
+        <w:spacing w:before="20" w:after="40"/>
+        <w:ind w:left="170"/>
+      </w:pPr>
+      <w:r>
+        <w:rPr>
+          <w:rFonts w:ascii="Calibri" w:hAnsi="Calibri"/>
+          <w:b/>
+          <w:i w:val="0"/>
+          <w:color w:val="166534"/>
+          <w:sz w:val="17"/>
+        </w:rPr>
+        <w:t>📈 Cơ hội mở rộng thị trường ETC: hai cơ sở 2 vận hành đầy đủ đồng nghĩa thêm 2 đơn vị mua sắm độc lập — tiềm năng đưa RAVASTEL, EIMLER-10, HYYR, PECHAUNOX vào danh mục thầu mới.</w:t>
+      </w:r>
+    </w:p>
+    <w:tbl>
+      <w:tblPr>
+        <w:tblStyle w:val="TableGrid"/>
+        <w:tblW w:type="auto" w:w="0"/>
+        <w:tblLook w:firstColumn="1" w:firstRow="1" w:lastColumn="0" w:lastRow="0" w:noHBand="0" w:noVBand="1" w:val="04A0"/>
+      </w:tblPr>
+      <w:tblGrid>
+        <w:gridCol w:w="9072"/>
+      </w:tblGrid>
+      <w:tr>
+        <w:tc>
+          <w:tcPr>
+            <w:tcW w:type="dxa" w:w="9072"/>
+            <w:shd w:val="clear" w:color="auto" w:fill="F8FAFC"/>
+            <w:tcBorders>
+              <w:top w:val="none" w:sz="6" w:color="auto"/>
+              <w:bottom w:val="none" w:sz="6" w:color="auto"/>
+              <w:left w:val="single" w:sz="12" w:color="003B71"/>
+              <w:right w:val="none" w:sz="6" w:color="auto"/>
+            </w:tcBorders>
+          </w:tcPr>
+          <w:p>
+            <w:pPr>
+              <w:spacing w:before="60" w:after="60"/>
+              <w:ind w:left="142"/>
+            </w:pPr>
+            <w:r>
+              <w:rPr>
+                <w:rFonts w:ascii="Calibri" w:hAnsi="Calibri"/>
+                <w:b/>
+                <w:i w:val="0"/>
+                <w:color w:val="003B71"/>
+                <w:sz w:val="17"/>
+              </w:rPr>
+              <w:t xml:space="preserve">Strategy  </w:t>
+            </w:r>
+            <w:r>
+              <w:rPr>
+                <w:rFonts w:ascii="Calibri" w:hAnsi="Calibri"/>
+                <w:b w:val="0"/>
+                <w:i w:val="0"/>
+                <w:color w:val="334155"/>
+                <w:sz w:val="17"/>
+              </w:rPr>
+              <w:t>Team Sales ETC miền Bắc cần theo dõi tiến độ phê duyệt đề xuất và chủ động tiếp cận Ban Dược — Vật tư y tế của cơ sở 2 Bạch Mai (Hà Nam) và Việt Đức (Ninh Bình) ngay khi có quyết định chính thức, ưu tiên đăng ký danh mục cho RAVASTEL, EIMLER-10, PECHAUNOX và HYYR trong chu kỳ thầu đầu tiên của các đơn vị này.</w:t>
+            </w:r>
+          </w:p>
+        </w:tc>
+      </w:tr>
+    </w:tbl>
+    <w:p>
+      <w:pPr>
+        <w:spacing w:before="40" w:after="120"/>
+      </w:pPr>
+    </w:p>
+    <w:tbl>
+      <w:tblPr>
+        <w:tblStyle w:val="TableGrid"/>
+        <w:tblW w:type="auto" w:w="0"/>
+        <w:jc w:val="left"/>
+        <w:tblLook w:firstColumn="1" w:firstRow="1" w:lastColumn="0" w:lastRow="0" w:noHBand="0" w:noVBand="1" w:val="04A0"/>
+      </w:tblPr>
+      <w:tblGrid>
+        <w:gridCol w:w="4536"/>
+        <w:gridCol w:w="4536"/>
+      </w:tblGrid>
+      <w:tr>
+        <w:tc>
+          <w:tcPr>
+            <w:tcW w:type="dxa" w:w="1984"/>
+            <w:shd w:val="clear" w:color="auto" w:fill="EEF2FF"/>
+            <w:tcBorders>
+              <w:top w:val="none" w:sz="6" w:color="auto"/>
+              <w:bottom w:val="none" w:sz="6" w:color="auto"/>
+              <w:left w:val="none" w:sz="6" w:color="auto"/>
+              <w:right w:val="none" w:sz="6" w:color="auto"/>
+            </w:tcBorders>
+          </w:tcPr>
+          <w:p>
+            <w:pPr>
+              <w:spacing w:before="80" w:after="80"/>
+              <w:ind w:left="85"/>
+            </w:pPr>
+            <w:r>
+              <w:rPr>
+                <w:rFonts w:ascii="Calibri" w:hAnsi="Calibri"/>
+                <w:b/>
+                <w:i w:val="0"/>
+                <w:color w:val="4338CA"/>
+                <w:sz w:val="15"/>
+              </w:rPr>
+              <w:t>TUỔI TRẺ – SỨC KHỎE</w:t>
+            </w:r>
+          </w:p>
+        </w:tc>
+        <w:tc>
+          <w:tcPr>
+            <w:tcW w:type="dxa" w:w="4536"/>
+            <w:tcBorders>
+              <w:top w:val="none" w:sz="6" w:color="auto"/>
+              <w:bottom w:val="none" w:sz="6" w:color="auto"/>
+              <w:left w:val="none" w:sz="6" w:color="auto"/>
+              <w:right w:val="none" w:sz="6" w:color="auto"/>
+            </w:tcBorders>
+          </w:tcPr>
+          <w:p>
+            <w:pPr>
+              <w:spacing w:before="60" w:after="60"/>
+              <w:ind w:left="113"/>
+            </w:pPr>
+            <w:r>
+              <w:rPr>
+                <w:rFonts w:ascii="Calibri" w:hAnsi="Calibri"/>
+                <w:b/>
+                <w:i w:val="0"/>
+                <w:color w:val="111827"/>
+                <w:sz w:val="21"/>
+              </w:rPr>
+              <w:t>TP.HCM thu 3.500 tỉ đồng từ du lịch chăm sóc răng miệng — tín hiệu từ thị trường y tế tự nguyện</w:t>
+            </w:r>
+          </w:p>
+        </w:tc>
+      </w:tr>
+    </w:tbl>
+    <w:p>
+      <w:pPr>
+        <w:spacing w:before="40" w:after="40"/>
+        <w:ind w:left="170"/>
+      </w:pPr>
+      <w:r>
+        <w:rPr>
+          <w:rFonts w:ascii="Calibri" w:hAnsi="Calibri"/>
+          <w:b w:val="0"/>
+          <w:i/>
+          <w:color w:val="6B7280"/>
+          <w:sz w:val="18"/>
+        </w:rPr>
+        <w:t>TP.HCM ghi nhận doanh thu 3.500 tỉ đồng từ dịch vụ "du lịch làm răng", phản ánh xu hướng người tiêu dùng sẵn sàng chi trả cao cho dịch vụ y tế tự nguyện ngoài hệ thống BHYT. Xu hướng này không trực tiếp tác động đến danh mục ETC của Davipharm, nhưng cho thấy tiềm năng mở rộng kênh OTC/phòng khám tư cho các sản phẩm không kê đơn.</w:t>
+      </w:r>
+    </w:p>
+    <w:p>
+      <w:pPr>
+        <w:spacing w:before="20" w:after="40"/>
+        <w:ind w:left="170"/>
+      </w:pPr>
+      <w:r>
+        <w:rPr>
+          <w:rFonts w:ascii="Calibri" w:hAnsi="Calibri"/>
+          <w:b/>
+          <w:i w:val="0"/>
+          <w:color w:val="374151"/>
+          <w:sz w:val="17"/>
+        </w:rPr>
+        <w:t>📊 Không liên quan trực tiếp đến danh mục Davipharm; tín hiệu vĩ mô cho thấy sức chi tiêu y tế tự nguyện tăng, có thể khai thác gián tiếp qua kênh OTC (JANUS, TADALAFIL 20MG, DRYCHES).</w:t>
+      </w:r>
+    </w:p>
+    <w:tbl>
+      <w:tblPr>
+        <w:tblStyle w:val="TableGrid"/>
+        <w:tblW w:type="auto" w:w="0"/>
+        <w:tblLook w:firstColumn="1" w:firstRow="1" w:lastColumn="0" w:lastRow="0" w:noHBand="0" w:noVBand="1" w:val="04A0"/>
+      </w:tblPr>
+      <w:tblGrid>
+        <w:gridCol w:w="9072"/>
+      </w:tblGrid>
+      <w:tr>
+        <w:tc>
+          <w:tcPr>
+            <w:tcW w:type="dxa" w:w="9072"/>
+            <w:shd w:val="clear" w:color="auto" w:fill="F8FAFC"/>
+            <w:tcBorders>
+              <w:top w:val="none" w:sz="6" w:color="auto"/>
+              <w:bottom w:val="none" w:sz="6" w:color="auto"/>
+              <w:left w:val="single" w:sz="12" w:color="003B71"/>
+              <w:right w:val="none" w:sz="6" w:color="auto"/>
+            </w:tcBorders>
+          </w:tcPr>
+          <w:p>
+            <w:pPr>
+              <w:spacing w:before="60" w:after="60"/>
+              <w:ind w:left="142"/>
+            </w:pPr>
+            <w:r>
+              <w:rPr>
+                <w:rFonts w:ascii="Calibri" w:hAnsi="Calibri"/>
+                <w:b/>
+                <w:i w:val="0"/>
+                <w:color w:val="003B71"/>
+                <w:sz w:val="17"/>
+              </w:rPr>
+              <w:t xml:space="preserve">Strategy  </w:t>
+            </w:r>
+            <w:r>
+              <w:rPr>
+                <w:rFonts w:ascii="Calibri" w:hAnsi="Calibri"/>
+                <w:b w:val="0"/>
+                <w:i w:val="0"/>
+                <w:color w:val="334155"/>
+                <w:sz w:val="17"/>
+              </w:rPr>
+              <w:t>Team Marketing OTC có thể tham chiếu xu hướng chi tiêu y tế tự nguyện này để củng cố luận điểm đầu tư vào kênh phòng khám tư và nhà thuốc cao cấp cho nhóm sản phẩm Nam khoa (JANUS, TADALAFIL 20MG, DRYCHES) trong kế hoạch H2/2025. Không cần hành động khẩn cấp — theo dõi định kỳ.</w:t>
+            </w:r>
+          </w:p>
+        </w:tc>
+      </w:tr>
+    </w:tbl>
+    <w:p>
+      <w:pPr>
+        <w:spacing w:before="40" w:after="120"/>
+      </w:pPr>
+    </w:p>
+    <w:tbl>
+      <w:tblPr>
+        <w:tblStyle w:val="TableGrid"/>
+        <w:tblW w:type="auto" w:w="0"/>
+        <w:jc w:val="left"/>
+        <w:tblLook w:firstColumn="1" w:firstRow="1" w:lastColumn="0" w:lastRow="0" w:noHBand="0" w:noVBand="1" w:val="04A0"/>
+      </w:tblPr>
+      <w:tblGrid>
+        <w:gridCol w:w="4536"/>
+        <w:gridCol w:w="4536"/>
+      </w:tblGrid>
+      <w:tr>
+        <w:tc>
+          <w:tcPr>
+            <w:tcW w:type="dxa" w:w="1984"/>
+            <w:shd w:val="clear" w:color="auto" w:fill="EEF2FF"/>
+            <w:tcBorders>
+              <w:top w:val="none" w:sz="6" w:color="auto"/>
+              <w:bottom w:val="none" w:sz="6" w:color="auto"/>
+              <w:left w:val="none" w:sz="6" w:color="auto"/>
+              <w:right w:val="none" w:sz="6" w:color="auto"/>
+            </w:tcBorders>
+          </w:tcPr>
+          <w:p>
+            <w:pPr>
+              <w:spacing w:before="80" w:after="80"/>
+              <w:ind w:left="85"/>
+            </w:pPr>
+            <w:r>
+              <w:rPr>
+                <w:rFonts w:ascii="Calibri" w:hAnsi="Calibri"/>
+                <w:b/>
+                <w:i w:val="0"/>
+                <w:color w:val="4338CA"/>
+                <w:sz w:val="15"/>
+              </w:rPr>
               <w:t>VNEXPRESS – SỨC KHỎE</w:t>
             </w:r>
           </w:p>
@@ -2607,786 +3355,6 @@
                 <w:sz w:val="17"/>
               </w:rPr>
               <w:t>Team Marketing (tim mạch) theo dõi tần suất nội dung "hạ huyết áp không dùng thuốc" trên mạng xã hội Việt Nam; nếu xu hướng tăng mạnh trong Q3/2025, phối hợp Medical Affairs chuẩn bị tài liệu giáo dục HCP nhấn mạnh vai trò không thể thay thế của thuốc (PECHAUNOX, TABAREX) trong THA độ 2 trở lên và bệnh nhân có bệnh đồng mắc.</w:t>
-            </w:r>
-          </w:p>
-        </w:tc>
-      </w:tr>
-    </w:tbl>
-    <w:p>
-      <w:pPr>
-        <w:spacing w:before="40" w:after="120"/>
-      </w:pPr>
-    </w:p>
-    <w:tbl>
-      <w:tblPr>
-        <w:tblStyle w:val="TableGrid"/>
-        <w:tblW w:type="auto" w:w="0"/>
-        <w:jc w:val="left"/>
-        <w:tblLook w:firstColumn="1" w:firstRow="1" w:lastColumn="0" w:lastRow="0" w:noHBand="0" w:noVBand="1" w:val="04A0"/>
-      </w:tblPr>
-      <w:tblGrid>
-        <w:gridCol w:w="4536"/>
-        <w:gridCol w:w="4536"/>
-      </w:tblGrid>
-      <w:tr>
-        <w:tc>
-          <w:tcPr>
-            <w:tcW w:type="dxa" w:w="1984"/>
-            <w:shd w:val="clear" w:color="auto" w:fill="EEF2FF"/>
-            <w:tcBorders>
-              <w:top w:val="none" w:sz="6" w:color="auto"/>
-              <w:bottom w:val="none" w:sz="6" w:color="auto"/>
-              <w:left w:val="none" w:sz="6" w:color="auto"/>
-              <w:right w:val="none" w:sz="6" w:color="auto"/>
-            </w:tcBorders>
-          </w:tcPr>
-          <w:p>
-            <w:pPr>
-              <w:spacing w:before="80" w:after="80"/>
-              <w:ind w:left="85"/>
-            </w:pPr>
-            <w:r>
-              <w:rPr>
-                <w:rFonts w:ascii="Calibri" w:hAnsi="Calibri"/>
-                <w:b/>
-                <w:i w:val="0"/>
-                <w:color w:val="4338CA"/>
-                <w:sz w:val="15"/>
-              </w:rPr>
-              <w:t>VNEXPRESS – SỨC KHỎE</w:t>
-            </w:r>
-          </w:p>
-        </w:tc>
-        <w:tc>
-          <w:tcPr>
-            <w:tcW w:type="dxa" w:w="4536"/>
-            <w:tcBorders>
-              <w:top w:val="none" w:sz="6" w:color="auto"/>
-              <w:bottom w:val="none" w:sz="6" w:color="auto"/>
-              <w:left w:val="none" w:sz="6" w:color="auto"/>
-              <w:right w:val="none" w:sz="6" w:color="auto"/>
-            </w:tcBorders>
-          </w:tcPr>
-          <w:p>
-            <w:pPr>
-              <w:spacing w:before="60" w:after="60"/>
-              <w:ind w:left="113"/>
-            </w:pPr>
-            <w:r>
-              <w:rPr>
-                <w:rFonts w:ascii="Calibri" w:hAnsi="Calibri"/>
-                <w:b/>
-                <w:i w:val="0"/>
-                <w:color w:val="111827"/>
-                <w:sz w:val="21"/>
-              </w:rPr>
-              <w:t>Ung thư u nguyên bào thần kinh trẻ em: Gánh nặng chi phí ghép tế bào gốc và khoảng trống hỗ trợ điều trị</w:t>
-            </w:r>
-          </w:p>
-        </w:tc>
-      </w:tr>
-    </w:tbl>
-    <w:p>
-      <w:pPr>
-        <w:spacing w:before="40" w:after="40"/>
-        <w:ind w:left="170"/>
-      </w:pPr>
-      <w:r>
-        <w:rPr>
-          <w:rFonts w:ascii="Calibri" w:hAnsi="Calibri"/>
-          <w:b w:val="0"/>
-          <w:i/>
-          <w:color w:val="6B7280"/>
-          <w:sz w:val="18"/>
-        </w:rPr>
-        <w:t>Bài viết mô tả hành trình điều trị u nguyên bào thần kinh ở trẻ em tại Bệnh viện Trung ương Huế, với chi phí ghép tế bào gốc lên tới 200–300 triệu đồng — vượt xa khả năng tài chính của phần lớn bệnh nhân nghèo. Đối với Davipharm, bài phản ánh bối cảnh ung thư nhi khoa (đặc biệt phác đồ hóa trị đa chu kỳ) là phân khúc ETC có nhu cầu thực tế cao nhưng phụ thuộc lớn vào thanh toán BHYT và quỹ hỗ trợ xã hội.</w:t>
-      </w:r>
-    </w:p>
-    <w:p>
-      <w:pPr>
-        <w:spacing w:before="20" w:after="40"/>
-        <w:ind w:left="170"/>
-      </w:pPr>
-      <w:r>
-        <w:rPr>
-          <w:rFonts w:ascii="Calibri" w:hAnsi="Calibri"/>
-          <w:b/>
-          <w:i w:val="0"/>
-          <w:color w:val="374151"/>
-          <w:sz w:val="17"/>
-        </w:rPr>
-        <w:t>➖ Bài không tác động trực tiếp đến danh mục Davipharm; tuy nhiên là tín hiệu theo dõi về nhu cầu điều trị hỗ trợ ung thư (supportive care) — phân khúc liên quan gián tiếp đến HYYR (Erlotinib) và LARRIVEY (Bicalutamide) trong kênh ETC bệnh viện tuyến tỉnh.</w:t>
-      </w:r>
-    </w:p>
-    <w:tbl>
-      <w:tblPr>
-        <w:tblStyle w:val="TableGrid"/>
-        <w:tblW w:type="auto" w:w="0"/>
-        <w:tblLook w:firstColumn="1" w:firstRow="1" w:lastColumn="0" w:lastRow="0" w:noHBand="0" w:noVBand="1" w:val="04A0"/>
-      </w:tblPr>
-      <w:tblGrid>
-        <w:gridCol w:w="9072"/>
-      </w:tblGrid>
-      <w:tr>
-        <w:tc>
-          <w:tcPr>
-            <w:tcW w:type="dxa" w:w="9072"/>
-            <w:shd w:val="clear" w:color="auto" w:fill="F8FAFC"/>
-            <w:tcBorders>
-              <w:top w:val="none" w:sz="6" w:color="auto"/>
-              <w:bottom w:val="none" w:sz="6" w:color="auto"/>
-              <w:left w:val="single" w:sz="12" w:color="003B71"/>
-              <w:right w:val="none" w:sz="6" w:color="auto"/>
-            </w:tcBorders>
-          </w:tcPr>
-          <w:p>
-            <w:pPr>
-              <w:spacing w:before="60" w:after="60"/>
-              <w:ind w:left="142"/>
-            </w:pPr>
-            <w:r>
-              <w:rPr>
-                <w:rFonts w:ascii="Calibri" w:hAnsi="Calibri"/>
-                <w:b/>
-                <w:i w:val="0"/>
-                <w:color w:val="003B71"/>
-                <w:sz w:val="17"/>
-              </w:rPr>
-              <w:t xml:space="preserve">Strategy  </w:t>
-            </w:r>
-            <w:r>
-              <w:rPr>
-                <w:rFonts w:ascii="Calibri" w:hAnsi="Calibri"/>
-                <w:b w:val="0"/>
-                <w:i w:val="0"/>
-                <w:color w:val="334155"/>
-                <w:sz w:val="17"/>
-              </w:rPr>
-              <w:t>Team ETC/Ung thư theo dõi tín hiệu này như bối cảnh thị trường: nhu cầu điều trị ung thư nhi và ung thư giai đoạn muộn tại tuyến tỉnh đang tăng nhưng bị giới hạn bởi thanh toán BHYT — đây là lý do ưu tiên đảm bảo HYYR và LARRIVEY nằm trong danh mục BHYT đầu thầu chu kỳ tới. Không cần hành động khẩn cấp; cập nhật vào báo cáo market landscape quý tiếp theo.</w:t>
-            </w:r>
-          </w:p>
-        </w:tc>
-      </w:tr>
-    </w:tbl>
-    <w:p>
-      <w:pPr>
-        <w:spacing w:before="40" w:after="120"/>
-      </w:pPr>
-    </w:p>
-    <w:tbl>
-      <w:tblPr>
-        <w:tblStyle w:val="TableGrid"/>
-        <w:tblW w:type="auto" w:w="0"/>
-        <w:jc w:val="left"/>
-        <w:tblLook w:firstColumn="1" w:firstRow="1" w:lastColumn="0" w:lastRow="0" w:noHBand="0" w:noVBand="1" w:val="04A0"/>
-      </w:tblPr>
-      <w:tblGrid>
-        <w:gridCol w:w="4536"/>
-        <w:gridCol w:w="4536"/>
-      </w:tblGrid>
-      <w:tr>
-        <w:tc>
-          <w:tcPr>
-            <w:tcW w:type="dxa" w:w="1984"/>
-            <w:shd w:val="clear" w:color="auto" w:fill="EEF2FF"/>
-            <w:tcBorders>
-              <w:top w:val="none" w:sz="6" w:color="auto"/>
-              <w:bottom w:val="none" w:sz="6" w:color="auto"/>
-              <w:left w:val="none" w:sz="6" w:color="auto"/>
-              <w:right w:val="none" w:sz="6" w:color="auto"/>
-            </w:tcBorders>
-          </w:tcPr>
-          <w:p>
-            <w:pPr>
-              <w:spacing w:before="80" w:after="80"/>
-              <w:ind w:left="85"/>
-            </w:pPr>
-            <w:r>
-              <w:rPr>
-                <w:rFonts w:ascii="Calibri" w:hAnsi="Calibri"/>
-                <w:b/>
-                <w:i w:val="0"/>
-                <w:color w:val="4338CA"/>
-                <w:sz w:val="15"/>
-              </w:rPr>
-              <w:t>VNEXPRESS – SỨC KHỎE</w:t>
-            </w:r>
-          </w:p>
-        </w:tc>
-        <w:tc>
-          <w:tcPr>
-            <w:tcW w:type="dxa" w:w="4536"/>
-            <w:tcBorders>
-              <w:top w:val="none" w:sz="6" w:color="auto"/>
-              <w:bottom w:val="none" w:sz="6" w:color="auto"/>
-              <w:left w:val="none" w:sz="6" w:color="auto"/>
-              <w:right w:val="none" w:sz="6" w:color="auto"/>
-            </w:tcBorders>
-          </w:tcPr>
-          <w:p>
-            <w:pPr>
-              <w:spacing w:before="60" w:after="60"/>
-              <w:ind w:left="113"/>
-            </w:pPr>
-            <w:r>
-              <w:rPr>
-                <w:rFonts w:ascii="Calibri" w:hAnsi="Calibri"/>
-                <w:b/>
-                <w:i w:val="0"/>
-                <w:color w:val="111827"/>
-                <w:sz w:val="21"/>
-              </w:rPr>
-              <w:t>Mẹo ngủ ngon cho bệnh nhân tiểu đường type 2: Tín hiệu nhu cầu bệnh nhân với EIMLER-10, ZLATKO</w:t>
-            </w:r>
-          </w:p>
-        </w:tc>
-      </w:tr>
-    </w:tbl>
-    <w:p>
-      <w:pPr>
-        <w:spacing w:before="40" w:after="40"/>
-        <w:ind w:left="170"/>
-      </w:pPr>
-      <w:r>
-        <w:rPr>
-          <w:rFonts w:ascii="Calibri" w:hAnsi="Calibri"/>
-          <w:b w:val="0"/>
-          <w:i/>
-          <w:color w:val="6B7280"/>
-          <w:sz w:val="18"/>
-        </w:rPr>
-        <w:t>Bài viết trên VnExpress phổ biến rộng rãi các biến chứng tiểu đường type 2 (thần kinh ngoại biên, ngưng thở khi ngủ) và tầm quan trọng của kiểm soát đường huyết, gián tiếp gia tăng nhận thức về điều trị dược phẩm trong nhóm bệnh nhân này. Điều này củng cố nhu cầu thị trường cho các sản phẩm kiểm soát đường huyết như EIMLER-10 (Empagliflozin) và ZLATKO (Sitagliptin) của Davipharm.</w:t>
-      </w:r>
-    </w:p>
-    <w:p>
-      <w:pPr>
-        <w:spacing w:before="20" w:after="40"/>
-        <w:ind w:left="170"/>
-      </w:pPr>
-      <w:r>
-        <w:rPr>
-          <w:rFonts w:ascii="Calibri" w:hAnsi="Calibri"/>
-          <w:b/>
-          <w:i w:val="0"/>
-          <w:color w:val="374151"/>
-          <w:sz w:val="17"/>
-        </w:rPr>
-        <w:t>📊 Tín hiệu trung tính — bài mang tính giáo dục sức khỏe, không tác động trực tiếp đến doanh thu ETC nhưng phản ánh mức độ quan tâm ngày càng tăng của bệnh nhân tiểu đường type 2, nhóm mục tiêu cốt lõi của EIMLER-10 và ZLATKO.</w:t>
-      </w:r>
-    </w:p>
-    <w:tbl>
-      <w:tblPr>
-        <w:tblStyle w:val="TableGrid"/>
-        <w:tblW w:type="auto" w:w="0"/>
-        <w:tblLook w:firstColumn="1" w:firstRow="1" w:lastColumn="0" w:lastRow="0" w:noHBand="0" w:noVBand="1" w:val="04A0"/>
-      </w:tblPr>
-      <w:tblGrid>
-        <w:gridCol w:w="9072"/>
-      </w:tblGrid>
-      <w:tr>
-        <w:tc>
-          <w:tcPr>
-            <w:tcW w:type="dxa" w:w="9072"/>
-            <w:shd w:val="clear" w:color="auto" w:fill="F8FAFC"/>
-            <w:tcBorders>
-              <w:top w:val="none" w:sz="6" w:color="auto"/>
-              <w:bottom w:val="none" w:sz="6" w:color="auto"/>
-              <w:left w:val="single" w:sz="12" w:color="003B71"/>
-              <w:right w:val="none" w:sz="6" w:color="auto"/>
-            </w:tcBorders>
-          </w:tcPr>
-          <w:p>
-            <w:pPr>
-              <w:spacing w:before="60" w:after="60"/>
-              <w:ind w:left="142"/>
-            </w:pPr>
-            <w:r>
-              <w:rPr>
-                <w:rFonts w:ascii="Calibri" w:hAnsi="Calibri"/>
-                <w:b/>
-                <w:i w:val="0"/>
-                <w:color w:val="003B71"/>
-                <w:sz w:val="17"/>
-              </w:rPr>
-              <w:t xml:space="preserve">Strategy  </w:t>
-            </w:r>
-            <w:r>
-              <w:rPr>
-                <w:rFonts w:ascii="Calibri" w:hAnsi="Calibri"/>
-                <w:b w:val="0"/>
-                <w:i w:val="0"/>
-                <w:color w:val="334155"/>
-                <w:sz w:val="17"/>
-              </w:rPr>
-              <w:t>Marketing Team nên tận dụng xu hướng truyền thông sức khỏe về biến chứng tiểu đường để hỗ trợ tài liệu detail cho EIMLER-10 và ZLATKO, đặc biệt nhấn mạnh lợi ích kiểm soát đường huyết bền vững cho bác sĩ kê đơn tuyến cơ sở trong vòng Q3/2025.</w:t>
-            </w:r>
-          </w:p>
-        </w:tc>
-      </w:tr>
-    </w:tbl>
-    <w:p>
-      <w:pPr>
-        <w:spacing w:before="40" w:after="120"/>
-      </w:pPr>
-    </w:p>
-    <w:tbl>
-      <w:tblPr>
-        <w:tblStyle w:val="TableGrid"/>
-        <w:tblW w:type="auto" w:w="0"/>
-        <w:jc w:val="left"/>
-        <w:tblLook w:firstColumn="1" w:firstRow="1" w:lastColumn="0" w:lastRow="0" w:noHBand="0" w:noVBand="1" w:val="04A0"/>
-      </w:tblPr>
-      <w:tblGrid>
-        <w:gridCol w:w="4536"/>
-        <w:gridCol w:w="4536"/>
-      </w:tblGrid>
-      <w:tr>
-        <w:tc>
-          <w:tcPr>
-            <w:tcW w:type="dxa" w:w="1984"/>
-            <w:shd w:val="clear" w:color="auto" w:fill="EEF2FF"/>
-            <w:tcBorders>
-              <w:top w:val="none" w:sz="6" w:color="auto"/>
-              <w:bottom w:val="none" w:sz="6" w:color="auto"/>
-              <w:left w:val="none" w:sz="6" w:color="auto"/>
-              <w:right w:val="none" w:sz="6" w:color="auto"/>
-            </w:tcBorders>
-          </w:tcPr>
-          <w:p>
-            <w:pPr>
-              <w:spacing w:before="80" w:after="80"/>
-              <w:ind w:left="85"/>
-            </w:pPr>
-            <w:r>
-              <w:rPr>
-                <w:rFonts w:ascii="Calibri" w:hAnsi="Calibri"/>
-                <w:b/>
-                <w:i w:val="0"/>
-                <w:color w:val="4338CA"/>
-                <w:sz w:val="15"/>
-              </w:rPr>
-              <w:t>SK&amp;ĐS – DƯỢC MỸ PHẨM</w:t>
-            </w:r>
-          </w:p>
-        </w:tc>
-        <w:tc>
-          <w:tcPr>
-            <w:tcW w:type="dxa" w:w="4536"/>
-            <w:tcBorders>
-              <w:top w:val="none" w:sz="6" w:color="auto"/>
-              <w:bottom w:val="none" w:sz="6" w:color="auto"/>
-              <w:left w:val="none" w:sz="6" w:color="auto"/>
-              <w:right w:val="none" w:sz="6" w:color="auto"/>
-            </w:tcBorders>
-          </w:tcPr>
-          <w:p>
-            <w:pPr>
-              <w:spacing w:before="60" w:after="60"/>
-              <w:ind w:left="113"/>
-            </w:pPr>
-            <w:r>
-              <w:rPr>
-                <w:rFonts w:ascii="Calibri" w:hAnsi="Calibri"/>
-                <w:b/>
-                <w:i w:val="0"/>
-                <w:color w:val="111827"/>
-                <w:sz w:val="21"/>
-              </w:rPr>
-              <w:t>Bổ nhiệm Cục trưởng Cục An toàn Thực phẩm — Thay đổi nhân sự lãnh đạo quản lý ATTP</w:t>
-            </w:r>
-          </w:p>
-        </w:tc>
-      </w:tr>
-    </w:tbl>
-    <w:p>
-      <w:pPr>
-        <w:spacing w:before="40" w:after="40"/>
-        <w:ind w:left="170"/>
-      </w:pPr>
-      <w:r>
-        <w:rPr>
-          <w:rFonts w:ascii="Calibri" w:hAnsi="Calibri"/>
-          <w:b w:val="0"/>
-          <w:i/>
-          <w:color w:val="6B7280"/>
-          <w:sz w:val="18"/>
-        </w:rPr>
-        <w:t>Bộ trưởng Bộ Y tế Đào Hồng Lan trao quyết định bổ nhiệm Cục trưởng Cục An toàn Thực phẩm (VFA) — cơ quan quản lý thực phẩm chức năng, mỹ phẩm và một số sản phẩm y tế liên quan. Sự thay đổi nhân sự này có thể ảnh hưởng đến định hướng chính sách kiểm soát quảng cáo, cấp phép sản phẩm TPCN và mỹ phẩm trong thời gian tới.</w:t>
-      </w:r>
-    </w:p>
-    <w:p>
-      <w:pPr>
-        <w:spacing w:before="20" w:after="40"/>
-        <w:ind w:left="170"/>
-      </w:pPr>
-      <w:r>
-        <w:rPr>
-          <w:rFonts w:ascii="Calibri" w:hAnsi="Calibri"/>
-          <w:b/>
-          <w:i w:val="0"/>
-          <w:color w:val="374151"/>
-          <w:sz w:val="17"/>
-        </w:rPr>
-        <w:t>👀 Tác động gián tiếp — VFA không quản lý thuốc kê đơn của Davipharm, nhưng cần theo dõi nếu có thay đổi chính sách liên quan đến quảng cáo hoặc phân loại sản phẩm.</w:t>
-      </w:r>
-    </w:p>
-    <w:tbl>
-      <w:tblPr>
-        <w:tblStyle w:val="TableGrid"/>
-        <w:tblW w:type="auto" w:w="0"/>
-        <w:tblLook w:firstColumn="1" w:firstRow="1" w:lastColumn="0" w:lastRow="0" w:noHBand="0" w:noVBand="1" w:val="04A0"/>
-      </w:tblPr>
-      <w:tblGrid>
-        <w:gridCol w:w="9072"/>
-      </w:tblGrid>
-      <w:tr>
-        <w:tc>
-          <w:tcPr>
-            <w:tcW w:type="dxa" w:w="9072"/>
-            <w:shd w:val="clear" w:color="auto" w:fill="F8FAFC"/>
-            <w:tcBorders>
-              <w:top w:val="none" w:sz="6" w:color="auto"/>
-              <w:bottom w:val="none" w:sz="6" w:color="auto"/>
-              <w:left w:val="single" w:sz="12" w:color="003B71"/>
-              <w:right w:val="none" w:sz="6" w:color="auto"/>
-            </w:tcBorders>
-          </w:tcPr>
-          <w:p>
-            <w:pPr>
-              <w:spacing w:before="60" w:after="60"/>
-              <w:ind w:left="142"/>
-            </w:pPr>
-            <w:r>
-              <w:rPr>
-                <w:rFonts w:ascii="Calibri" w:hAnsi="Calibri"/>
-                <w:b/>
-                <w:i w:val="0"/>
-                <w:color w:val="003B71"/>
-                <w:sz w:val="17"/>
-              </w:rPr>
-              <w:t xml:space="preserve">Strategy  </w:t>
-            </w:r>
-            <w:r>
-              <w:rPr>
-                <w:rFonts w:ascii="Calibri" w:hAnsi="Calibri"/>
-                <w:b w:val="0"/>
-                <w:i w:val="0"/>
-                <w:color w:val="334155"/>
-                <w:sz w:val="17"/>
-              </w:rPr>
-              <w:t>Regulatory Affairs Team theo dõi định hướng mới của Cục trưởng VFA trong Q2/2025, đặc biệt nếu Davipharm có kế hoạch mở rộng sang phân khúc thực phẩm chức năng hoặc OTC liên quan đến ATTP; không cần hành động khẩn.</w:t>
-            </w:r>
-          </w:p>
-        </w:tc>
-      </w:tr>
-    </w:tbl>
-    <w:p>
-      <w:pPr>
-        <w:spacing w:before="40" w:after="120"/>
-      </w:pPr>
-    </w:p>
-    <w:tbl>
-      <w:tblPr>
-        <w:tblStyle w:val="TableGrid"/>
-        <w:tblW w:type="auto" w:w="0"/>
-        <w:jc w:val="left"/>
-        <w:tblLook w:firstColumn="1" w:firstRow="1" w:lastColumn="0" w:lastRow="0" w:noHBand="0" w:noVBand="1" w:val="04A0"/>
-      </w:tblPr>
-      <w:tblGrid>
-        <w:gridCol w:w="4536"/>
-        <w:gridCol w:w="4536"/>
-      </w:tblGrid>
-      <w:tr>
-        <w:tc>
-          <w:tcPr>
-            <w:tcW w:type="dxa" w:w="1984"/>
-            <w:shd w:val="clear" w:color="auto" w:fill="EEF2FF"/>
-            <w:tcBorders>
-              <w:top w:val="none" w:sz="6" w:color="auto"/>
-              <w:bottom w:val="none" w:sz="6" w:color="auto"/>
-              <w:left w:val="none" w:sz="6" w:color="auto"/>
-              <w:right w:val="none" w:sz="6" w:color="auto"/>
-            </w:tcBorders>
-          </w:tcPr>
-          <w:p>
-            <w:pPr>
-              <w:spacing w:before="80" w:after="80"/>
-              <w:ind w:left="85"/>
-            </w:pPr>
-            <w:r>
-              <w:rPr>
-                <w:rFonts w:ascii="Calibri" w:hAnsi="Calibri"/>
-                <w:b/>
-                <w:i w:val="0"/>
-                <w:color w:val="4338CA"/>
-                <w:sz w:val="15"/>
-              </w:rPr>
-              <w:t>SK&amp;ĐS – DƯỢC MỸ PHẨM</w:t>
-            </w:r>
-          </w:p>
-        </w:tc>
-        <w:tc>
-          <w:tcPr>
-            <w:tcW w:type="dxa" w:w="4536"/>
-            <w:tcBorders>
-              <w:top w:val="none" w:sz="6" w:color="auto"/>
-              <w:bottom w:val="none" w:sz="6" w:color="auto"/>
-              <w:left w:val="none" w:sz="6" w:color="auto"/>
-              <w:right w:val="none" w:sz="6" w:color="auto"/>
-            </w:tcBorders>
-          </w:tcPr>
-          <w:p>
-            <w:pPr>
-              <w:spacing w:before="60" w:after="60"/>
-              <w:ind w:left="113"/>
-            </w:pPr>
-            <w:r>
-              <w:rPr>
-                <w:rFonts w:ascii="Calibri" w:hAnsi="Calibri"/>
-                <w:b/>
-                <w:i w:val="0"/>
-                <w:color w:val="111827"/>
-                <w:sz w:val="21"/>
-              </w:rPr>
-              <w:t>Trẻ em mắc ung thư giai đoạn cuối do lạm dụng trà sữa — cảnh báo về lối sống và bệnh không lây nhiễm</w:t>
-            </w:r>
-          </w:p>
-        </w:tc>
-      </w:tr>
-    </w:tbl>
-    <w:p>
-      <w:pPr>
-        <w:spacing w:before="40" w:after="40"/>
-        <w:ind w:left="170"/>
-      </w:pPr>
-      <w:r>
-        <w:rPr>
-          <w:rFonts w:ascii="Calibri" w:hAnsi="Calibri"/>
-          <w:b w:val="0"/>
-          <w:i/>
-          <w:color w:val="6B7280"/>
-          <w:sz w:val="18"/>
-        </w:rPr>
-        <w:t>Một bé trai 12 tuổi tại Việt Nam được chẩn đoán ung thư giai đoạn cuối sau thời gian dài uống trà sữa thay nước lọc, làm dấy lên lo ngại công cộng về thói quen dinh dưỡng và nguy cơ bệnh không lây nhiễm ở giới trẻ. Bài viết không liên quan trực tiếp đến danh mục sản phẩm Davipharm nhưng phản ánh xu hướng gia tăng nhận thức về ung thư và nhu cầu điều trị ung thư tại Việt Nam.</w:t>
-      </w:r>
-    </w:p>
-    <w:p>
-      <w:pPr>
-        <w:spacing w:before="20" w:after="40"/>
-        <w:ind w:left="170"/>
-      </w:pPr>
-      <w:r>
-        <w:rPr>
-          <w:rFonts w:ascii="Calibri" w:hAnsi="Calibri"/>
-          <w:b/>
-          <w:i w:val="0"/>
-          <w:color w:val="374151"/>
-          <w:sz w:val="17"/>
-        </w:rPr>
-        <w:t>📊 Tin có tác động gián tiếp — xu hướng nhận thức ung thư tăng có thể hỗ trợ nhu cầu thị trường cho HYYR (Erlotinib) và LARRIVEY (Bicalutamide), nhưng chưa tạo tác động kinh doanh ngắn hạn rõ ràng.</w:t>
-      </w:r>
-    </w:p>
-    <w:tbl>
-      <w:tblPr>
-        <w:tblStyle w:val="TableGrid"/>
-        <w:tblW w:type="auto" w:w="0"/>
-        <w:tblLook w:firstColumn="1" w:firstRow="1" w:lastColumn="0" w:lastRow="0" w:noHBand="0" w:noVBand="1" w:val="04A0"/>
-      </w:tblPr>
-      <w:tblGrid>
-        <w:gridCol w:w="9072"/>
-      </w:tblGrid>
-      <w:tr>
-        <w:tc>
-          <w:tcPr>
-            <w:tcW w:type="dxa" w:w="9072"/>
-            <w:shd w:val="clear" w:color="auto" w:fill="F8FAFC"/>
-            <w:tcBorders>
-              <w:top w:val="none" w:sz="6" w:color="auto"/>
-              <w:bottom w:val="none" w:sz="6" w:color="auto"/>
-              <w:left w:val="single" w:sz="12" w:color="003B71"/>
-              <w:right w:val="none" w:sz="6" w:color="auto"/>
-            </w:tcBorders>
-          </w:tcPr>
-          <w:p>
-            <w:pPr>
-              <w:spacing w:before="60" w:after="60"/>
-              <w:ind w:left="142"/>
-            </w:pPr>
-            <w:r>
-              <w:rPr>
-                <w:rFonts w:ascii="Calibri" w:hAnsi="Calibri"/>
-                <w:b/>
-                <w:i w:val="0"/>
-                <w:color w:val="003B71"/>
-                <w:sz w:val="17"/>
-              </w:rPr>
-              <w:t xml:space="preserve">Strategy  </w:t>
-            </w:r>
-            <w:r>
-              <w:rPr>
-                <w:rFonts w:ascii="Calibri" w:hAnsi="Calibri"/>
-                <w:b w:val="0"/>
-                <w:i w:val="0"/>
-                <w:color w:val="334155"/>
-                <w:sz w:val="17"/>
-              </w:rPr>
-              <w:t>Team Oncology theo dõi xu hướng truyền thông về ung thư để xây dựng tài liệu giáo dục HCP (healthcare professional) liên quan đến HYYR và LARRIVEY; không cần hành động khẩn cấp, ưu tiên thấp trong chu kỳ báo cáo này.</w:t>
-            </w:r>
-          </w:p>
-        </w:tc>
-      </w:tr>
-    </w:tbl>
-    <w:p>
-      <w:pPr>
-        <w:spacing w:before="40" w:after="120"/>
-      </w:pPr>
-    </w:p>
-    <w:tbl>
-      <w:tblPr>
-        <w:tblStyle w:val="TableGrid"/>
-        <w:tblW w:type="auto" w:w="0"/>
-        <w:jc w:val="left"/>
-        <w:tblLook w:firstColumn="1" w:firstRow="1" w:lastColumn="0" w:lastRow="0" w:noHBand="0" w:noVBand="1" w:val="04A0"/>
-      </w:tblPr>
-      <w:tblGrid>
-        <w:gridCol w:w="4536"/>
-        <w:gridCol w:w="4536"/>
-      </w:tblGrid>
-      <w:tr>
-        <w:tc>
-          <w:tcPr>
-            <w:tcW w:type="dxa" w:w="1984"/>
-            <w:shd w:val="clear" w:color="auto" w:fill="EEF2FF"/>
-            <w:tcBorders>
-              <w:top w:val="none" w:sz="6" w:color="auto"/>
-              <w:bottom w:val="none" w:sz="6" w:color="auto"/>
-              <w:left w:val="none" w:sz="6" w:color="auto"/>
-              <w:right w:val="none" w:sz="6" w:color="auto"/>
-            </w:tcBorders>
-          </w:tcPr>
-          <w:p>
-            <w:pPr>
-              <w:spacing w:before="80" w:after="80"/>
-              <w:ind w:left="85"/>
-            </w:pPr>
-            <w:r>
-              <w:rPr>
-                <w:rFonts w:ascii="Calibri" w:hAnsi="Calibri"/>
-                <w:b/>
-                <w:i w:val="0"/>
-                <w:color w:val="4338CA"/>
-                <w:sz w:val="15"/>
-              </w:rPr>
-              <w:t>VNEXPRESS – SỨC KHỎE</w:t>
-            </w:r>
-          </w:p>
-        </w:tc>
-        <w:tc>
-          <w:tcPr>
-            <w:tcW w:type="dxa" w:w="4536"/>
-            <w:tcBorders>
-              <w:top w:val="none" w:sz="6" w:color="auto"/>
-              <w:bottom w:val="none" w:sz="6" w:color="auto"/>
-              <w:left w:val="none" w:sz="6" w:color="auto"/>
-              <w:right w:val="none" w:sz="6" w:color="auto"/>
-            </w:tcBorders>
-          </w:tcPr>
-          <w:p>
-            <w:pPr>
-              <w:spacing w:before="60" w:after="60"/>
-              <w:ind w:left="113"/>
-            </w:pPr>
-            <w:r>
-              <w:rPr>
-                <w:rFonts w:ascii="Calibri" w:hAnsi="Calibri"/>
-                <w:b/>
-                <w:i w:val="0"/>
-                <w:color w:val="111827"/>
-                <w:sz w:val="21"/>
-              </w:rPr>
-              <w:t>Lão hóa tăng tốc ở mốc 44 &amp; 60 tuổi — Cơ hội mở rộng danh mục tim mạch, đái tháo đường, gout</w:t>
-            </w:r>
-          </w:p>
-        </w:tc>
-      </w:tr>
-    </w:tbl>
-    <w:p>
-      <w:pPr>
-        <w:spacing w:before="40" w:after="40"/>
-        <w:ind w:left="170"/>
-      </w:pPr>
-      <w:r>
-        <w:rPr>
-          <w:rFonts w:ascii="Calibri" w:hAnsi="Calibri"/>
-          <w:b w:val="0"/>
-          <w:i/>
-          <w:color w:val="6B7280"/>
-          <w:sz w:val="18"/>
-        </w:rPr>
-        <w:t>Nghiên cứu Stanford xác nhận lão hóa tăng tốc đột ngột ở tuổi ~44 (chuyển hóa, viêm nền, nội tiết) và ~60 (tim mạch, thận, glucose), tạo ra hai "điểm nóng" bệnh mạn tính rõ ràng theo độ tuổi. Điều này trực tiếp củng cố nhu cầu dài hạn cho các nhóm thuốc cốt lõi của Davipharm gồm tim mạch (PECHAUNOX, RAVASTEL, ZABALES), đái tháo đường (EIMLER-10, ZLATKO), gout (ZENTOGOUT, MAGRAX) và giảm đau (COXTONE).</w:t>
-      </w:r>
-    </w:p>
-    <w:p>
-      <w:pPr>
-        <w:spacing w:before="20" w:after="40"/>
-        <w:ind w:left="170"/>
-      </w:pPr>
-      <w:r>
-        <w:rPr>
-          <w:rFonts w:ascii="Calibri" w:hAnsi="Calibri"/>
-          <w:b/>
-          <w:i w:val="0"/>
-          <w:color w:val="166534"/>
-          <w:sz w:val="17"/>
-        </w:rPr>
-        <w:t>🟢 Bằng chứng khoa học quốc tế xác nhận hai phân khúc bệnh nhân trọng điểm (40–50 và 60+) — cơ sở để Marketing team xây dựng thông điệp "phòng ngừa chủ động" cho toàn bộ danh mục bệnh mạn tính của Davipharm.</w:t>
-      </w:r>
-    </w:p>
-    <w:tbl>
-      <w:tblPr>
-        <w:tblStyle w:val="TableGrid"/>
-        <w:tblW w:type="auto" w:w="0"/>
-        <w:tblLook w:firstColumn="1" w:firstRow="1" w:lastColumn="0" w:lastRow="0" w:noHBand="0" w:noVBand="1" w:val="04A0"/>
-      </w:tblPr>
-      <w:tblGrid>
-        <w:gridCol w:w="9072"/>
-      </w:tblGrid>
-      <w:tr>
-        <w:tc>
-          <w:tcPr>
-            <w:tcW w:type="dxa" w:w="9072"/>
-            <w:shd w:val="clear" w:color="auto" w:fill="F8FAFC"/>
-            <w:tcBorders>
-              <w:top w:val="none" w:sz="6" w:color="auto"/>
-              <w:bottom w:val="none" w:sz="6" w:color="auto"/>
-              <w:left w:val="single" w:sz="12" w:color="003B71"/>
-              <w:right w:val="none" w:sz="6" w:color="auto"/>
-            </w:tcBorders>
-          </w:tcPr>
-          <w:p>
-            <w:pPr>
-              <w:spacing w:before="60" w:after="60"/>
-              <w:ind w:left="142"/>
-            </w:pPr>
-            <w:r>
-              <w:rPr>
-                <w:rFonts w:ascii="Calibri" w:hAnsi="Calibri"/>
-                <w:b/>
-                <w:i w:val="0"/>
-                <w:color w:val="003B71"/>
-                <w:sz w:val="17"/>
-              </w:rPr>
-              <w:t xml:space="preserve">Strategy  </w:t>
-            </w:r>
-            <w:r>
-              <w:rPr>
-                <w:rFonts w:ascii="Calibri" w:hAnsi="Calibri"/>
-                <w:b w:val="0"/>
-                <w:i w:val="0"/>
-                <w:color w:val="334155"/>
-                <w:sz w:val="17"/>
-              </w:rPr>
-              <w:t>Marketing &amp; Medical Affairs team cần phát triển tài liệu KOL/CME khai thác dữ liệu Stanford này để định vị chiến lược "can thiệp sớm ở mốc 40+" — ưu tiên RAVASTEL (kiểm soát LDL), EIMLER-10 (bảo vệ thận/tim), ZENTOGOUT (kiểm soát uric acid) và PECHAUNOX (huyết áp) trong Q3/2025; đồng thời phối hợp Sales team mở rộng detailing tại phân khúc phòng khám nội tiết và tim mạch cho nhóm bệnh nhân 40–65 tuổi.</w:t>
             </w:r>
           </w:p>
         </w:tc>
@@ -5812,7 +5780,7 @@
                 <w:color w:val="111827"/>
                 <w:sz w:val="18"/>
               </w:rPr>
-              <w:t>Chuẩn bị hồ sơ đấu thầu đưa HYYR và LARRIVEY vào danh mục BHYT chu kỳ tới</w:t>
+              <w:t>Theo dõi phê duyệt cơ sở 2 Bạch Mai/Việt Đức; chuẩn bị hồ sơ thầu RAVASTEL, EIMLER-10, PECHAUNOX, HYYR</w:t>
             </w:r>
           </w:p>
         </w:tc>
@@ -5840,7 +5808,7 @@
                 <w:color w:val="003B71"/>
                 <w:sz w:val="17"/>
               </w:rPr>
-              <w:t>Marketing / RA</w:t>
+              <w:t>Sales ETC</w:t>
             </w:r>
           </w:p>
         </w:tc>
@@ -5868,7 +5836,142 @@
                 <w:color w:val="6B7280"/>
                 <w:sz w:val="17"/>
               </w:rPr>
-              <w:t>Xu hướng tầm soát ung thư &amp; nhu cầu ung thư tuyến tỉnh tăng</w:t>
+              <w:t>Cơ sở 2 Bạch Mai &amp; Việt Đức — đơn vị mua sắm mới</w:t>
+            </w:r>
+          </w:p>
+        </w:tc>
+        <w:tc>
+          <w:tcPr>
+            <w:tcW w:type="dxa" w:w="1644"/>
+            <w:shd w:val="clear" w:color="auto" w:fill="FEE2E2"/>
+            <w:tcBorders>
+              <w:top w:val="none" w:sz="6" w:color="auto"/>
+              <w:bottom w:val="none" w:sz="6" w:color="auto"/>
+              <w:left w:val="none" w:sz="6" w:color="auto"/>
+              <w:right w:val="none" w:sz="6" w:color="auto"/>
+            </w:tcBorders>
+          </w:tcPr>
+          <w:p>
+            <w:pPr>
+              <w:spacing w:before="80" w:after="80"/>
+              <w:jc w:val="center"/>
+            </w:pPr>
+            <w:r>
+              <w:rPr>
+                <w:rFonts w:ascii="Calibri" w:hAnsi="Calibri"/>
+                <w:b/>
+                <w:i w:val="0"/>
+                <w:color w:val="EF4444"/>
+                <w:sz w:val="17"/>
+              </w:rPr>
+              <w:t>🔴 Cao</w:t>
+            </w:r>
+          </w:p>
+        </w:tc>
+      </w:tr>
+      <w:tr>
+        <w:tc>
+          <w:tcPr>
+            <w:tcW w:type="dxa" w:w="454"/>
+            <w:shd w:val="clear" w:color="auto" w:fill="FEE2E2"/>
+            <w:tcBorders>
+              <w:top w:val="none" w:sz="6" w:color="auto"/>
+              <w:bottom w:val="none" w:sz="6" w:color="auto"/>
+              <w:left w:val="none" w:sz="6" w:color="auto"/>
+              <w:right w:val="none" w:sz="6" w:color="auto"/>
+            </w:tcBorders>
+          </w:tcPr>
+          <w:p>
+            <w:pPr>
+              <w:spacing w:before="100" w:after="100"/>
+              <w:jc w:val="center"/>
+            </w:pPr>
+            <w:r>
+              <w:t>🔴</w:t>
+            </w:r>
+          </w:p>
+        </w:tc>
+        <w:tc>
+          <w:tcPr>
+            <w:tcW w:type="dxa" w:w="4422"/>
+            <w:shd w:val="clear" w:color="auto" w:fill="FAFBFF"/>
+            <w:tcBorders>
+              <w:top w:val="none" w:sz="6" w:color="auto"/>
+              <w:bottom w:val="none" w:sz="6" w:color="auto"/>
+              <w:left w:val="none" w:sz="6" w:color="auto"/>
+              <w:right w:val="none" w:sz="6" w:color="auto"/>
+            </w:tcBorders>
+          </w:tcPr>
+          <w:p>
+            <w:pPr>
+              <w:spacing w:before="80" w:after="80"/>
+              <w:ind w:left="85"/>
+            </w:pPr>
+            <w:r>
+              <w:rPr>
+                <w:rFonts w:ascii="Calibri" w:hAnsi="Calibri"/>
+                <w:b/>
+                <w:i w:val="0"/>
+                <w:color w:val="111827"/>
+                <w:sz w:val="18"/>
+              </w:rPr>
+              <w:t>Tiếp cận Ban Dược cơ sở 2 Bạch Mai (Hà Nam) và Việt Đức (Ninh Bình) để đăng ký danh mục HYYR, LARRIVEY</w:t>
+            </w:r>
+          </w:p>
+        </w:tc>
+        <w:tc>
+          <w:tcPr>
+            <w:tcW w:type="dxa" w:w="1417"/>
+            <w:shd w:val="clear" w:color="auto" w:fill="FAFBFF"/>
+            <w:tcBorders>
+              <w:top w:val="none" w:sz="6" w:color="auto"/>
+              <w:bottom w:val="none" w:sz="6" w:color="auto"/>
+              <w:left w:val="none" w:sz="6" w:color="auto"/>
+              <w:right w:val="none" w:sz="6" w:color="auto"/>
+            </w:tcBorders>
+          </w:tcPr>
+          <w:p>
+            <w:pPr>
+              <w:spacing w:before="80" w:after="80"/>
+              <w:jc w:val="center"/>
+            </w:pPr>
+            <w:r>
+              <w:rPr>
+                <w:rFonts w:ascii="Calibri" w:hAnsi="Calibri"/>
+                <w:b w:val="0"/>
+                <w:i w:val="0"/>
+                <w:color w:val="003B71"/>
+                <w:sz w:val="17"/>
+              </w:rPr>
+              <w:t>Sales ETC</w:t>
+            </w:r>
+          </w:p>
+        </w:tc>
+        <w:tc>
+          <w:tcPr>
+            <w:tcW w:type="dxa" w:w="1134"/>
+            <w:shd w:val="clear" w:color="auto" w:fill="FAFBFF"/>
+            <w:tcBorders>
+              <w:top w:val="none" w:sz="6" w:color="auto"/>
+              <w:bottom w:val="none" w:sz="6" w:color="auto"/>
+              <w:left w:val="none" w:sz="6" w:color="auto"/>
+              <w:right w:val="none" w:sz="6" w:color="auto"/>
+            </w:tcBorders>
+          </w:tcPr>
+          <w:p>
+            <w:pPr>
+              <w:spacing w:before="80" w:after="80"/>
+              <w:jc w:val="center"/>
+            </w:pPr>
+            <w:r>
+              <w:rPr>
+                <w:rFonts w:ascii="Calibri" w:hAnsi="Calibri"/>
+                <w:b w:val="0"/>
+                <w:i w:val="0"/>
+                <w:color w:val="6B7280"/>
+                <w:sz w:val="17"/>
+              </w:rPr>
+              <w:t>Mở rộng ETC ung thư — bệnh viện tuyến trung ương phía Bắc</w:t>
             </w:r>
           </w:p>
         </w:tc>
@@ -5926,141 +6029,6 @@
         <w:tc>
           <w:tcPr>
             <w:tcW w:type="dxa" w:w="4422"/>
-            <w:shd w:val="clear" w:color="auto" w:fill="FAFBFF"/>
-            <w:tcBorders>
-              <w:top w:val="none" w:sz="6" w:color="auto"/>
-              <w:bottom w:val="none" w:sz="6" w:color="auto"/>
-              <w:left w:val="none" w:sz="6" w:color="auto"/>
-              <w:right w:val="none" w:sz="6" w:color="auto"/>
-            </w:tcBorders>
-          </w:tcPr>
-          <w:p>
-            <w:pPr>
-              <w:spacing w:before="80" w:after="80"/>
-              <w:ind w:left="85"/>
-            </w:pPr>
-            <w:r>
-              <w:rPr>
-                <w:rFonts w:ascii="Calibri" w:hAnsi="Calibri"/>
-                <w:b/>
-                <w:i w:val="0"/>
-                <w:color w:val="111827"/>
-                <w:sz w:val="18"/>
-              </w:rPr>
-              <w:t>Cập nhật tài liệu detail EIMLER-10 &amp; ZLATKO cho bác sĩ tuyến cơ sở trước Q3/2025</w:t>
-            </w:r>
-          </w:p>
-        </w:tc>
-        <w:tc>
-          <w:tcPr>
-            <w:tcW w:type="dxa" w:w="1417"/>
-            <w:shd w:val="clear" w:color="auto" w:fill="FAFBFF"/>
-            <w:tcBorders>
-              <w:top w:val="none" w:sz="6" w:color="auto"/>
-              <w:bottom w:val="none" w:sz="6" w:color="auto"/>
-              <w:left w:val="none" w:sz="6" w:color="auto"/>
-              <w:right w:val="none" w:sz="6" w:color="auto"/>
-            </w:tcBorders>
-          </w:tcPr>
-          <w:p>
-            <w:pPr>
-              <w:spacing w:before="80" w:after="80"/>
-              <w:jc w:val="center"/>
-            </w:pPr>
-            <w:r>
-              <w:rPr>
-                <w:rFonts w:ascii="Calibri" w:hAnsi="Calibri"/>
-                <w:b w:val="0"/>
-                <w:i w:val="0"/>
-                <w:color w:val="003B71"/>
-                <w:sz w:val="17"/>
-              </w:rPr>
-              <w:t>Marketing</w:t>
-            </w:r>
-          </w:p>
-        </w:tc>
-        <w:tc>
-          <w:tcPr>
-            <w:tcW w:type="dxa" w:w="1134"/>
-            <w:shd w:val="clear" w:color="auto" w:fill="FAFBFF"/>
-            <w:tcBorders>
-              <w:top w:val="none" w:sz="6" w:color="auto"/>
-              <w:bottom w:val="none" w:sz="6" w:color="auto"/>
-              <w:left w:val="none" w:sz="6" w:color="auto"/>
-              <w:right w:val="none" w:sz="6" w:color="auto"/>
-            </w:tcBorders>
-          </w:tcPr>
-          <w:p>
-            <w:pPr>
-              <w:spacing w:before="80" w:after="80"/>
-              <w:jc w:val="center"/>
-            </w:pPr>
-            <w:r>
-              <w:rPr>
-                <w:rFonts w:ascii="Calibri" w:hAnsi="Calibri"/>
-                <w:b w:val="0"/>
-                <w:i w:val="0"/>
-                <w:color w:val="6B7280"/>
-                <w:sz w:val="17"/>
-              </w:rPr>
-              <w:t>Nhận thức biến chứng tiểu đường type 2 tăng trên truyền thông</w:t>
-            </w:r>
-          </w:p>
-        </w:tc>
-        <w:tc>
-          <w:tcPr>
-            <w:tcW w:type="dxa" w:w="1644"/>
-            <w:shd w:val="clear" w:color="auto" w:fill="FEF3C7"/>
-            <w:tcBorders>
-              <w:top w:val="none" w:sz="6" w:color="auto"/>
-              <w:bottom w:val="none" w:sz="6" w:color="auto"/>
-              <w:left w:val="none" w:sz="6" w:color="auto"/>
-              <w:right w:val="none" w:sz="6" w:color="auto"/>
-            </w:tcBorders>
-          </w:tcPr>
-          <w:p>
-            <w:pPr>
-              <w:spacing w:before="80" w:after="80"/>
-              <w:jc w:val="center"/>
-            </w:pPr>
-            <w:r>
-              <w:rPr>
-                <w:rFonts w:ascii="Calibri" w:hAnsi="Calibri"/>
-                <w:b/>
-                <w:i w:val="0"/>
-                <w:color w:val="D97706"/>
-                <w:sz w:val="17"/>
-              </w:rPr>
-              <w:t>🟡 Trung</w:t>
-            </w:r>
-          </w:p>
-        </w:tc>
-      </w:tr>
-      <w:tr>
-        <w:tc>
-          <w:tcPr>
-            <w:tcW w:type="dxa" w:w="454"/>
-            <w:shd w:val="clear" w:color="auto" w:fill="FEF3C7"/>
-            <w:tcBorders>
-              <w:top w:val="none" w:sz="6" w:color="auto"/>
-              <w:bottom w:val="none" w:sz="6" w:color="auto"/>
-              <w:left w:val="none" w:sz="6" w:color="auto"/>
-              <w:right w:val="none" w:sz="6" w:color="auto"/>
-            </w:tcBorders>
-          </w:tcPr>
-          <w:p>
-            <w:pPr>
-              <w:spacing w:before="100" w:after="100"/>
-              <w:jc w:val="center"/>
-            </w:pPr>
-            <w:r>
-              <w:t>🟡</w:t>
-            </w:r>
-          </w:p>
-        </w:tc>
-        <w:tc>
-          <w:tcPr>
-            <w:tcW w:type="dxa" w:w="4422"/>
             <w:shd w:val="clear" w:color="auto" w:fill="FFFFFF"/>
             <w:tcBorders>
               <w:top w:val="none" w:sz="6" w:color="auto"/>
@@ -6082,7 +6050,7 @@
                 <w:color w:val="111827"/>
                 <w:sz w:val="18"/>
               </w:rPr>
-              <w:t>Theo dõi nội dung "hạ huyết áp không dùng thuốc" mạng xã hội; chuẩn bị tài liệu HCP cho PECHAUNOX, TABAREX</w:t>
+              <w:t>Theo dõi dịch chuyển mô hình điều trị ung thư thực quản sớm; đánh giá tác động dài hạn đến thầu HYYR</w:t>
             </w:r>
           </w:p>
         </w:tc>
@@ -6110,7 +6078,7 @@
                 <w:color w:val="003B71"/>
                 <w:sz w:val="17"/>
               </w:rPr>
-              <w:t>Marketing</w:t>
+              <w:t>Strategy</w:t>
             </w:r>
           </w:p>
         </w:tc>
@@ -6138,7 +6106,7 @@
                 <w:color w:val="6B7280"/>
                 <w:sz w:val="17"/>
               </w:rPr>
-              <w:t>Xu hướng củ dền thay thuốc hạ huyết áp</w:t>
+              <w:t>Xu hướng phẫu thuật triệt căn ung thư sớm — giảm bệnh nhân dùng nhắm đích</w:t>
             </w:r>
           </w:p>
         </w:tc>
@@ -6217,7 +6185,7 @@
                 <w:color w:val="111827"/>
                 <w:sz w:val="18"/>
               </w:rPr>
-              <w:t>Khảo sát nhu cầu &amp; quy trình mua sắm quân y Bộ Quốc phòng cho METILONE-4</w:t>
+              <w:t>&lt;span class="vi-</w:t>
             </w:r>
           </w:p>
         </w:tc>
@@ -6245,7 +6213,6 @@
                 <w:color w:val="003B71"/>
                 <w:sz w:val="17"/>
               </w:rPr>
-              <w:t>Strategy / Sales</w:t>
             </w:r>
           </w:p>
         </w:tc>

</xml_diff>

<commit_message>
Update report_vi.docx 2026-05-13 11:33
</commit_message>
<xml_diff>
--- a/report_vi.docx
+++ b/report_vi.docx
@@ -338,7 +338,7 @@
                 <w:color w:val="111827"/>
                 <w:sz w:val="20"/>
               </w:rPr>
-              <w:t>Tuần 11–17/05/2026 không phát sinh sự kiện pháp lý hay đấu thầu trực tiếp, nhưng đề xuất nâng cấp cơ sở 2 Bạch Mai &amp; Việt Đức là tín hiệu mở rộng ETC quan trọng nhất cần Davipharm hành động sớm.</w:t>
+              <w:t>Tuần 11–17/05/2026: Làn sóng mở rộng hạ tầng y tế (200+ bệnh viện vệ tinh, chính sách tầm soát toàn dân, BV Thống Nhất lão khoa) tạo cơ hội tăng volume đấu thầu ETC cho danh mục tim mạch–đái tháo đường của Davipharm trong các chu kỳ thầu tới.</w:t>
             </w:r>
           </w:p>
         </w:tc>
@@ -406,7 +406,7 @@
                 <w:color w:val="111827"/>
                 <w:sz w:val="17"/>
               </w:rPr>
-              <w:t>▸  ETC mở rộng – Bạch Mai 2 &amp; Việt Đức 2:Nếu đề xuất được thông qua, hai đơn vị mua sắm độc lập mới tại Hà Nam và Ninh Bình sẽ mở chu kỳ thầu đầu tiên — cơ hội trực tiếp cho RAVASTEL, EIMLER-10, PECHAUNOX và HYYR.</w:t>
+              <w:t>▸  Hạ tầng ETC mở rộng:200+ bệnh viện vệ tinh mới = 200+ điểm thầu tiềm năng cho PECHAUNOX, RAVASTEL, TABAREX, ZABALES, JIRACEK tại tuyến tỉnh/huyện.</w:t>
             </w:r>
           </w:p>
           <w:p>
@@ -422,7 +422,7 @@
                 <w:color w:val="111827"/>
                 <w:sz w:val="17"/>
               </w:rPr>
-              <w:t>▸  Ung thư – Tầm soát sớm:Xu hướng phẫu thuật triệt căn ung thư giai đoạn sớm có thể dần thu hẹp nhóm bệnh nhân cần thuốc nhắm đích, tác động dài hạn đến vị thế thầu của HYYR và LARRIVEY tại bệnh viện tuyến đầu.</w:t>
+              <w:t>▸  Phễu bệnh nhân mãn tính:Chính sách khám sức khỏe miễn phí toàn dân + sàng lọc khu công nghiệp phía Bắc sẽ gia tăng bệnh nhân THA, rối loạn lipid, ĐTĐ type 2 mới được chẩn đoán — trực tiếp mở rộng thị trường cho RAVASTEL, EIMLER-10, ZLATKO, PECHAUNOX dài hạn.</w:t>
             </w:r>
           </w:p>
           <w:p>
@@ -438,7 +438,23 @@
                 <w:color w:val="111827"/>
                 <w:sz w:val="17"/>
               </w:rPr>
-              <w:t>▸  OTC – Chi tiêu tự nguyện tăng:Dữ liệu du lịch y tế TP.HCM (3.500 tỉ đồng) xác nhận xu hướng vĩ mô người tiêu dùng sẵn chi tiêu ngoài BHYT, hỗ trợ luận điểm đầu tư kênh phòng khám tư cho nhóm Nam khoa (JANUS, TADALAFIL 20MG, DRYCHES).</w:t>
+              <w:t>▸  Ung thư phổi &amp; lão khoa:Tầm soát NSCLC mở rộng hỗ trợ volume HYYR (Erlotinib); BV Thống Nhất chuyển hướng lão khoa là cơ hội market access ưu tiên tại TP.HCM cho nhóm tim mạch–ĐTĐ.</w:t>
+            </w:r>
+          </w:p>
+          <w:p>
+            <w:pPr>
+              <w:spacing w:before="20" w:after="60"/>
+              <w:ind w:left="142"/>
+            </w:pPr>
+            <w:r>
+              <w:rPr>
+                <w:rFonts w:ascii="Calibri" w:hAnsi="Calibri"/>
+                <w:b w:val="0"/>
+                <w:i w:val="0"/>
+                <w:color w:val="111827"/>
+                <w:sz w:val="17"/>
+              </w:rPr>
+              <w:t>▸  P1BD &amp;</w:t>
             </w:r>
           </w:p>
         </w:tc>
@@ -467,6 +483,22 @@
                 <w:sz w:val="17"/>
               </w:rPr>
               <w:t>⚡  HÀNH ĐỘNG ƯU TIÊN</w:t>
+            </w:r>
+          </w:p>
+          <w:p>
+            <w:pPr>
+              <w:spacing w:before="20" w:after="60"/>
+              <w:ind w:left="142"/>
+            </w:pPr>
+            <w:r>
+              <w:rPr>
+                <w:rFonts w:ascii="Calibri" w:hAnsi="Calibri"/>
+                <w:b w:val="0"/>
+                <w:i w:val="0"/>
+                <w:color w:val="0056D2"/>
+                <w:sz w:val="17"/>
+              </w:rPr>
+              <w:t>→  P1BD &amp;</w:t>
             </w:r>
           </w:p>
         </w:tc>
@@ -663,7 +695,7 @@
         <w:tc>
           <w:tcPr>
             <w:tcW w:type="dxa" w:w="1701"/>
-            <w:shd w:val="clear" w:color="auto" w:fill="DCFCE7"/>
+            <w:shd w:val="clear" w:color="auto" w:fill="E9FBF0"/>
             <w:tcBorders>
               <w:top w:val="none" w:sz="6" w:color="auto"/>
               <w:bottom w:val="none" w:sz="6" w:color="auto"/>
@@ -679,19 +711,19 @@
             <w:r>
               <w:rPr>
                 <w:rFonts w:ascii="Calibri" w:hAnsi="Calibri"/>
-                <w:b/>
+                <w:b w:val="0"/>
                 <w:i w:val="0"/>
-                <w:color w:val="166534"/>
+                <w:color w:val="CCCCCC"/>
                 <w:sz w:val="22"/>
               </w:rPr>
-              <w:t>4</w:t>
+              <w:t>—</w:t>
             </w:r>
           </w:p>
         </w:tc>
         <w:tc>
           <w:tcPr>
             <w:tcW w:type="dxa" w:w="1984"/>
-            <w:shd w:val="clear" w:color="auto" w:fill="F3F4F6"/>
+            <w:shd w:val="clear" w:color="auto" w:fill="F9FAFB"/>
             <w:tcBorders>
               <w:top w:val="none" w:sz="6" w:color="auto"/>
               <w:bottom w:val="none" w:sz="6" w:color="auto"/>
@@ -707,12 +739,12 @@
             <w:r>
               <w:rPr>
                 <w:rFonts w:ascii="Calibri" w:hAnsi="Calibri"/>
-                <w:b/>
+                <w:b w:val="0"/>
                 <w:i w:val="0"/>
-                <w:color w:val="374151"/>
+                <w:color w:val="CCCCCC"/>
                 <w:sz w:val="22"/>
               </w:rPr>
-              <w:t>1</w:t>
+              <w:t>—</w:t>
             </w:r>
           </w:p>
         </w:tc>
@@ -798,7 +830,7 @@
                 <w:color w:val="166534"/>
                 <w:sz w:val="22"/>
               </w:rPr>
-              <w:t>1</w:t>
+              <w:t>5</w:t>
             </w:r>
           </w:p>
         </w:tc>
@@ -826,7 +858,7 @@
                 <w:color w:val="374151"/>
                 <w:sz w:val="22"/>
               </w:rPr>
-              <w:t>9</w:t>
+              <w:t>5</w:t>
             </w:r>
           </w:p>
         </w:tc>
@@ -1002,786 +1034,6 @@
         <w:t>CHÍNH SÁCH &amp; PHÁP LÝ</w:t>
       </w:r>
     </w:p>
-    <w:tbl>
-      <w:tblPr>
-        <w:tblStyle w:val="TableGrid"/>
-        <w:tblW w:type="auto" w:w="0"/>
-        <w:jc w:val="left"/>
-        <w:tblLook w:firstColumn="1" w:firstRow="1" w:lastColumn="0" w:lastRow="0" w:noHBand="0" w:noVBand="1" w:val="04A0"/>
-      </w:tblPr>
-      <w:tblGrid>
-        <w:gridCol w:w="4536"/>
-        <w:gridCol w:w="4536"/>
-      </w:tblGrid>
-      <w:tr>
-        <w:tc>
-          <w:tcPr>
-            <w:tcW w:type="dxa" w:w="1984"/>
-            <w:shd w:val="clear" w:color="auto" w:fill="EEF2FF"/>
-            <w:tcBorders>
-              <w:top w:val="none" w:sz="6" w:color="auto"/>
-              <w:bottom w:val="none" w:sz="6" w:color="auto"/>
-              <w:left w:val="none" w:sz="6" w:color="auto"/>
-              <w:right w:val="none" w:sz="6" w:color="auto"/>
-            </w:tcBorders>
-          </w:tcPr>
-          <w:p>
-            <w:pPr>
-              <w:spacing w:before="80" w:after="80"/>
-              <w:ind w:left="85"/>
-            </w:pPr>
-            <w:r>
-              <w:rPr>
-                <w:rFonts w:ascii="Calibri" w:hAnsi="Calibri"/>
-                <w:b/>
-                <w:i w:val="0"/>
-                <w:color w:val="4338CA"/>
-                <w:sz w:val="15"/>
-              </w:rPr>
-              <w:t>SK&amp;ĐS – DƯỢC MỸ PHẨM</w:t>
-            </w:r>
-          </w:p>
-        </w:tc>
-        <w:tc>
-          <w:tcPr>
-            <w:tcW w:type="dxa" w:w="4536"/>
-            <w:tcBorders>
-              <w:top w:val="none" w:sz="6" w:color="auto"/>
-              <w:bottom w:val="none" w:sz="6" w:color="auto"/>
-              <w:left w:val="none" w:sz="6" w:color="auto"/>
-              <w:right w:val="none" w:sz="6" w:color="auto"/>
-            </w:tcBorders>
-          </w:tcPr>
-          <w:p>
-            <w:pPr>
-              <w:spacing w:before="60" w:after="60"/>
-              <w:ind w:left="113"/>
-            </w:pPr>
-            <w:r>
-              <w:rPr>
-                <w:rFonts w:ascii="Calibri" w:hAnsi="Calibri"/>
-                <w:b/>
-                <w:i w:val="0"/>
-                <w:color w:val="111827"/>
-                <w:sz w:val="21"/>
-              </w:rPr>
-              <w:t>Bệnh viện S.I.S Cần Thơ được hướng dẫn xử lý nước thải y tế</w:t>
-            </w:r>
-          </w:p>
-        </w:tc>
-      </w:tr>
-    </w:tbl>
-    <w:p>
-      <w:pPr>
-        <w:spacing w:before="40" w:after="40"/>
-        <w:ind w:left="170"/>
-      </w:pPr>
-      <w:r>
-        <w:rPr>
-          <w:rFonts w:ascii="Calibri" w:hAnsi="Calibri"/>
-          <w:b w:val="0"/>
-          <w:i/>
-          <w:color w:val="6B7280"/>
-          <w:sz w:val="18"/>
-        </w:rPr>
-        <w:t>Bài báo phản ánh hoạt động tuân thủ môi trường tại bệnh viện tư nhân S.I.S Cần Thơ liên quan đến thu gom và xử lý nước thải y tế — không liên quan trực tiếp đến ngành dược phẩm hay thị trường phân phối thuốc. Nội dung bài mang tính thông tin địa phương, không có dữ liệu thị trường có giá trị phân tích.</w:t>
-      </w:r>
-    </w:p>
-    <w:p>
-      <w:pPr>
-        <w:spacing w:before="20" w:after="40"/>
-        <w:ind w:left="170"/>
-      </w:pPr>
-      <w:r>
-        <w:rPr>
-          <w:rFonts w:ascii="Calibri" w:hAnsi="Calibri"/>
-          <w:b/>
-          <w:i w:val="0"/>
-          <w:color w:val="374151"/>
-          <w:sz w:val="17"/>
-        </w:rPr>
-        <w:t>⚪ Tin tức không có tác động đến hoạt động kinh doanh hoặc chiến lược của Davipharm.</w:t>
-      </w:r>
-    </w:p>
-    <w:tbl>
-      <w:tblPr>
-        <w:tblStyle w:val="TableGrid"/>
-        <w:tblW w:type="auto" w:w="0"/>
-        <w:tblLook w:firstColumn="1" w:firstRow="1" w:lastColumn="0" w:lastRow="0" w:noHBand="0" w:noVBand="1" w:val="04A0"/>
-      </w:tblPr>
-      <w:tblGrid>
-        <w:gridCol w:w="9072"/>
-      </w:tblGrid>
-      <w:tr>
-        <w:tc>
-          <w:tcPr>
-            <w:tcW w:type="dxa" w:w="9072"/>
-            <w:shd w:val="clear" w:color="auto" w:fill="F8FAFC"/>
-            <w:tcBorders>
-              <w:top w:val="none" w:sz="6" w:color="auto"/>
-              <w:bottom w:val="none" w:sz="6" w:color="auto"/>
-              <w:left w:val="single" w:sz="12" w:color="003B71"/>
-              <w:right w:val="none" w:sz="6" w:color="auto"/>
-            </w:tcBorders>
-          </w:tcPr>
-          <w:p>
-            <w:pPr>
-              <w:spacing w:before="60" w:after="60"/>
-              <w:ind w:left="142"/>
-            </w:pPr>
-            <w:r>
-              <w:rPr>
-                <w:rFonts w:ascii="Calibri" w:hAnsi="Calibri"/>
-                <w:b/>
-                <w:i w:val="0"/>
-                <w:color w:val="003B71"/>
-                <w:sz w:val="17"/>
-              </w:rPr>
-              <w:t xml:space="preserve">Strategy  </w:t>
-            </w:r>
-            <w:r>
-              <w:rPr>
-                <w:rFonts w:ascii="Calibri" w:hAnsi="Calibri"/>
-                <w:b w:val="0"/>
-                <w:i w:val="0"/>
-                <w:color w:val="334155"/>
-                <w:sz w:val="17"/>
-              </w:rPr>
-              <w:t>Không có hành động cần thiết — bài báo nằm ngoài phạm vi theo dõi chiến lược dược phẩm; khuyến nghị loại khỏi bộ lọc tin tức BOD để tối ưu thời gian phân tích.</w:t>
-            </w:r>
-          </w:p>
-        </w:tc>
-      </w:tr>
-    </w:tbl>
-    <w:p>
-      <w:pPr>
-        <w:spacing w:before="40" w:after="120"/>
-      </w:pPr>
-    </w:p>
-    <w:tbl>
-      <w:tblPr>
-        <w:tblStyle w:val="TableGrid"/>
-        <w:tblW w:type="auto" w:w="0"/>
-        <w:jc w:val="left"/>
-        <w:tblLook w:firstColumn="1" w:firstRow="1" w:lastColumn="0" w:lastRow="0" w:noHBand="0" w:noVBand="1" w:val="04A0"/>
-      </w:tblPr>
-      <w:tblGrid>
-        <w:gridCol w:w="4536"/>
-        <w:gridCol w:w="4536"/>
-      </w:tblGrid>
-      <w:tr>
-        <w:tc>
-          <w:tcPr>
-            <w:tcW w:type="dxa" w:w="1984"/>
-            <w:shd w:val="clear" w:color="auto" w:fill="EEF2FF"/>
-            <w:tcBorders>
-              <w:top w:val="none" w:sz="6" w:color="auto"/>
-              <w:bottom w:val="none" w:sz="6" w:color="auto"/>
-              <w:left w:val="none" w:sz="6" w:color="auto"/>
-              <w:right w:val="none" w:sz="6" w:color="auto"/>
-            </w:tcBorders>
-          </w:tcPr>
-          <w:p>
-            <w:pPr>
-              <w:spacing w:before="80" w:after="80"/>
-              <w:ind w:left="85"/>
-            </w:pPr>
-            <w:r>
-              <w:rPr>
-                <w:rFonts w:ascii="Calibri" w:hAnsi="Calibri"/>
-                <w:b/>
-                <w:i w:val="0"/>
-                <w:color w:val="4338CA"/>
-                <w:sz w:val="15"/>
-              </w:rPr>
-              <w:t>SK&amp;ĐS – DƯỢC MỸ PHẨM</w:t>
-            </w:r>
-          </w:p>
-        </w:tc>
-        <w:tc>
-          <w:tcPr>
-            <w:tcW w:type="dxa" w:w="4536"/>
-            <w:tcBorders>
-              <w:top w:val="none" w:sz="6" w:color="auto"/>
-              <w:bottom w:val="none" w:sz="6" w:color="auto"/>
-              <w:left w:val="none" w:sz="6" w:color="auto"/>
-              <w:right w:val="none" w:sz="6" w:color="auto"/>
-            </w:tcBorders>
-          </w:tcPr>
-          <w:p>
-            <w:pPr>
-              <w:spacing w:before="60" w:after="60"/>
-              <w:ind w:left="113"/>
-            </w:pPr>
-            <w:r>
-              <w:rPr>
-                <w:rFonts w:ascii="Calibri" w:hAnsi="Calibri"/>
-                <w:b/>
-                <w:i w:val="0"/>
-                <w:color w:val="111827"/>
-                <w:sz w:val="21"/>
-              </w:rPr>
-              <w:t>5 nhóm thực phẩm thiết yếu trong dinh dưỡng sau tuổi 50</w:t>
-            </w:r>
-          </w:p>
-        </w:tc>
-      </w:tr>
-    </w:tbl>
-    <w:p>
-      <w:pPr>
-        <w:spacing w:before="40" w:after="40"/>
-        <w:ind w:left="170"/>
-      </w:pPr>
-      <w:r>
-        <w:rPr>
-          <w:rFonts w:ascii="Calibri" w:hAnsi="Calibri"/>
-          <w:b w:val="0"/>
-          <w:i/>
-          <w:color w:val="6B7280"/>
-          <w:sz w:val="18"/>
-        </w:rPr>
-        <w:t>Truyền thông y tế đang đẩy mạnh nội dung dinh dưỡng cho người cao tuổi, phản ánh nhu cầu ngày càng tăng của nhóm dân số trên 50 tuổi tại Việt Nam. Xu hướng này tạo ra không gian thị trường rõ ràng cho các sản phẩm thực phẩm chức năng bổ sung vi chất, canxi, vitamin D và omega-3.</w:t>
-      </w:r>
-    </w:p>
-    <w:p>
-      <w:pPr>
-        <w:spacing w:before="20" w:after="40"/>
-        <w:ind w:left="170"/>
-      </w:pPr>
-      <w:r>
-        <w:rPr>
-          <w:rFonts w:ascii="Calibri" w:hAnsi="Calibri"/>
-          <w:b/>
-          <w:i w:val="0"/>
-          <w:color w:val="166534"/>
-          <w:sz w:val="17"/>
-        </w:rPr>
-        <w:t>📈 Nội dung truyền thông y tế về dinh dưỡng người cao tuổi gia tăng — cơ hội mở rộng danh mục TPCN cho phân khúc 50+ của Davipharm.</w:t>
-      </w:r>
-    </w:p>
-    <w:tbl>
-      <w:tblPr>
-        <w:tblStyle w:val="TableGrid"/>
-        <w:tblW w:type="auto" w:w="0"/>
-        <w:tblLook w:firstColumn="1" w:firstRow="1" w:lastColumn="0" w:lastRow="0" w:noHBand="0" w:noVBand="1" w:val="04A0"/>
-      </w:tblPr>
-      <w:tblGrid>
-        <w:gridCol w:w="9072"/>
-      </w:tblGrid>
-      <w:tr>
-        <w:tc>
-          <w:tcPr>
-            <w:tcW w:type="dxa" w:w="9072"/>
-            <w:shd w:val="clear" w:color="auto" w:fill="F8FAFC"/>
-            <w:tcBorders>
-              <w:top w:val="none" w:sz="6" w:color="auto"/>
-              <w:bottom w:val="none" w:sz="6" w:color="auto"/>
-              <w:left w:val="single" w:sz="12" w:color="003B71"/>
-              <w:right w:val="none" w:sz="6" w:color="auto"/>
-            </w:tcBorders>
-          </w:tcPr>
-          <w:p>
-            <w:pPr>
-              <w:spacing w:before="60" w:after="60"/>
-              <w:ind w:left="142"/>
-            </w:pPr>
-            <w:r>
-              <w:rPr>
-                <w:rFonts w:ascii="Calibri" w:hAnsi="Calibri"/>
-                <w:b/>
-                <w:i w:val="0"/>
-                <w:color w:val="003B71"/>
-                <w:sz w:val="17"/>
-              </w:rPr>
-              <w:t xml:space="preserve">Strategy  </w:t>
-            </w:r>
-            <w:r>
-              <w:rPr>
-                <w:rFonts w:ascii="Calibri" w:hAnsi="Calibri"/>
-                <w:b w:val="0"/>
-                <w:i w:val="0"/>
-                <w:color w:val="334155"/>
-                <w:sz w:val="17"/>
-              </w:rPr>
-              <w:t>Tận dụng xu hướng truyền thông này để đẩy mạnh marketing cho các sản phẩm canxi, vitamin D tổng hợp và omega-3 hiện có, đồng thời xem xét phát triển combo dinh dưỡng "Active 50+" nhằm chiếm lĩnh phân khúc người cao tuổi đang tăng trưởng nhanh.</w:t>
-            </w:r>
-          </w:p>
-        </w:tc>
-      </w:tr>
-    </w:tbl>
-    <w:p>
-      <w:pPr>
-        <w:spacing w:before="40" w:after="120"/>
-      </w:pPr>
-    </w:p>
-    <w:tbl>
-      <w:tblPr>
-        <w:tblStyle w:val="TableGrid"/>
-        <w:tblW w:type="auto" w:w="0"/>
-        <w:jc w:val="left"/>
-        <w:tblLook w:firstColumn="1" w:firstRow="1" w:lastColumn="0" w:lastRow="0" w:noHBand="0" w:noVBand="1" w:val="04A0"/>
-      </w:tblPr>
-      <w:tblGrid>
-        <w:gridCol w:w="4536"/>
-        <w:gridCol w:w="4536"/>
-      </w:tblGrid>
-      <w:tr>
-        <w:tc>
-          <w:tcPr>
-            <w:tcW w:type="dxa" w:w="1984"/>
-            <w:shd w:val="clear" w:color="auto" w:fill="EEF2FF"/>
-            <w:tcBorders>
-              <w:top w:val="none" w:sz="6" w:color="auto"/>
-              <w:bottom w:val="none" w:sz="6" w:color="auto"/>
-              <w:left w:val="none" w:sz="6" w:color="auto"/>
-              <w:right w:val="none" w:sz="6" w:color="auto"/>
-            </w:tcBorders>
-          </w:tcPr>
-          <w:p>
-            <w:pPr>
-              <w:spacing w:before="80" w:after="80"/>
-              <w:ind w:left="85"/>
-            </w:pPr>
-            <w:r>
-              <w:rPr>
-                <w:rFonts w:ascii="Calibri" w:hAnsi="Calibri"/>
-                <w:b/>
-                <w:i w:val="0"/>
-                <w:color w:val="4338CA"/>
-                <w:sz w:val="15"/>
-              </w:rPr>
-              <w:t>SK&amp;ĐS – DƯỢC MỸ PHẨM</w:t>
-            </w:r>
-          </w:p>
-        </w:tc>
-        <w:tc>
-          <w:tcPr>
-            <w:tcW w:type="dxa" w:w="4536"/>
-            <w:tcBorders>
-              <w:top w:val="none" w:sz="6" w:color="auto"/>
-              <w:bottom w:val="none" w:sz="6" w:color="auto"/>
-              <w:left w:val="none" w:sz="6" w:color="auto"/>
-              <w:right w:val="none" w:sz="6" w:color="auto"/>
-            </w:tcBorders>
-          </w:tcPr>
-          <w:p>
-            <w:pPr>
-              <w:spacing w:before="60" w:after="60"/>
-              <w:ind w:left="113"/>
-            </w:pPr>
-            <w:r>
-              <w:rPr>
-                <w:rFonts w:ascii="Calibri" w:hAnsi="Calibri"/>
-                <w:b/>
-                <w:i w:val="0"/>
-                <w:color w:val="111827"/>
-                <w:sz w:val="21"/>
-              </w:rPr>
-              <w:t>11 thực phẩm chức năng cần tránh khi dùng thuốc chống đông máu</w:t>
-            </w:r>
-          </w:p>
-        </w:tc>
-      </w:tr>
-    </w:tbl>
-    <w:p>
-      <w:pPr>
-        <w:spacing w:before="40" w:after="40"/>
-        <w:ind w:left="170"/>
-      </w:pPr>
-      <w:r>
-        <w:rPr>
-          <w:rFonts w:ascii="Calibri" w:hAnsi="Calibri"/>
-          <w:b w:val="0"/>
-          <w:i/>
-          <w:color w:val="6B7280"/>
-          <w:sz w:val="18"/>
-        </w:rPr>
-        <w:t>Báo SK&amp;ĐS cảnh báo 11 nhóm thực phẩm chức năng (TPCN) có tương tác nguy hiểm với thuốc chống đông, làm tăng nguy cơ chảy máu hoặc đông máu bất thường. Thông tin này xuất hiện trong bối cảnh thị trường TPCN Việt Nam tăng trưởng mạnh nhưng nhận thức về tương tác thuốc-TPCN còn thấp.</w:t>
-      </w:r>
-    </w:p>
-    <w:p>
-      <w:pPr>
-        <w:spacing w:before="20" w:after="40"/>
-        <w:ind w:left="170"/>
-      </w:pPr>
-      <w:r>
-        <w:rPr>
-          <w:rFonts w:ascii="Calibri" w:hAnsi="Calibri"/>
-          <w:b/>
-          <w:i w:val="0"/>
-          <w:color w:val="166534"/>
-          <w:sz w:val="17"/>
-        </w:rPr>
-        <w:t>💡 Cơ hội định vị Davipharm như chuyên gia an toàn dùng thuốc — lợi thế truyền thông B2B và B2C trong phân khúc tim mạch.</w:t>
-      </w:r>
-    </w:p>
-    <w:tbl>
-      <w:tblPr>
-        <w:tblStyle w:val="TableGrid"/>
-        <w:tblW w:type="auto" w:w="0"/>
-        <w:tblLook w:firstColumn="1" w:firstRow="1" w:lastColumn="0" w:lastRow="0" w:noHBand="0" w:noVBand="1" w:val="04A0"/>
-      </w:tblPr>
-      <w:tblGrid>
-        <w:gridCol w:w="9072"/>
-      </w:tblGrid>
-      <w:tr>
-        <w:tc>
-          <w:tcPr>
-            <w:tcW w:type="dxa" w:w="9072"/>
-            <w:shd w:val="clear" w:color="auto" w:fill="F8FAFC"/>
-            <w:tcBorders>
-              <w:top w:val="none" w:sz="6" w:color="auto"/>
-              <w:bottom w:val="none" w:sz="6" w:color="auto"/>
-              <w:left w:val="single" w:sz="12" w:color="003B71"/>
-              <w:right w:val="none" w:sz="6" w:color="auto"/>
-            </w:tcBorders>
-          </w:tcPr>
-          <w:p>
-            <w:pPr>
-              <w:spacing w:before="60" w:after="60"/>
-              <w:ind w:left="142"/>
-            </w:pPr>
-            <w:r>
-              <w:rPr>
-                <w:rFonts w:ascii="Calibri" w:hAnsi="Calibri"/>
-                <w:b/>
-                <w:i w:val="0"/>
-                <w:color w:val="003B71"/>
-                <w:sz w:val="17"/>
-              </w:rPr>
-              <w:t xml:space="preserve">Strategy  </w:t>
-            </w:r>
-            <w:r>
-              <w:rPr>
-                <w:rFonts w:ascii="Calibri" w:hAnsi="Calibri"/>
-                <w:b w:val="0"/>
-                <w:i w:val="0"/>
-                <w:color w:val="334155"/>
-                <w:sz w:val="17"/>
-              </w:rPr>
-              <w:t>Phát triển tài liệu tư vấn "Hướng dẫn dùng thuốc chống đông an toàn" phân phối qua nhà thuốc và bác sĩ kê toa — tăng nhận diện thương hiệu trong phân khúc tim mạch và củng cố quan hệ với kênh ETC/OTC. Đồng thời, rà soát danh mục TPCN/OTC hiện có để đảm bảo nhãn sản phẩm cảnh báo đầy đủ tương tác thuốc, giảm thiểu rủi ro pháp lý.</w:t>
-            </w:r>
-          </w:p>
-        </w:tc>
-      </w:tr>
-    </w:tbl>
-    <w:p>
-      <w:pPr>
-        <w:spacing w:before="40" w:after="120"/>
-      </w:pPr>
-    </w:p>
-    <w:tbl>
-      <w:tblPr>
-        <w:tblStyle w:val="TableGrid"/>
-        <w:tblW w:type="auto" w:w="0"/>
-        <w:jc w:val="left"/>
-        <w:tblLook w:firstColumn="1" w:firstRow="1" w:lastColumn="0" w:lastRow="0" w:noHBand="0" w:noVBand="1" w:val="04A0"/>
-      </w:tblPr>
-      <w:tblGrid>
-        <w:gridCol w:w="4536"/>
-        <w:gridCol w:w="4536"/>
-      </w:tblGrid>
-      <w:tr>
-        <w:tc>
-          <w:tcPr>
-            <w:tcW w:type="dxa" w:w="1984"/>
-            <w:shd w:val="clear" w:color="auto" w:fill="EEF2FF"/>
-            <w:tcBorders>
-              <w:top w:val="none" w:sz="6" w:color="auto"/>
-              <w:bottom w:val="none" w:sz="6" w:color="auto"/>
-              <w:left w:val="none" w:sz="6" w:color="auto"/>
-              <w:right w:val="none" w:sz="6" w:color="auto"/>
-            </w:tcBorders>
-          </w:tcPr>
-          <w:p>
-            <w:pPr>
-              <w:spacing w:before="80" w:after="80"/>
-              <w:ind w:left="85"/>
-            </w:pPr>
-            <w:r>
-              <w:rPr>
-                <w:rFonts w:ascii="Calibri" w:hAnsi="Calibri"/>
-                <w:b/>
-                <w:i w:val="0"/>
-                <w:color w:val="4338CA"/>
-                <w:sz w:val="15"/>
-              </w:rPr>
-              <w:t>SK&amp;ĐS – DƯỢC MỸ PHẨM</w:t>
-            </w:r>
-          </w:p>
-        </w:tc>
-        <w:tc>
-          <w:tcPr>
-            <w:tcW w:type="dxa" w:w="4536"/>
-            <w:tcBorders>
-              <w:top w:val="none" w:sz="6" w:color="auto"/>
-              <w:bottom w:val="none" w:sz="6" w:color="auto"/>
-              <w:left w:val="none" w:sz="6" w:color="auto"/>
-              <w:right w:val="none" w:sz="6" w:color="auto"/>
-            </w:tcBorders>
-          </w:tcPr>
-          <w:p>
-            <w:pPr>
-              <w:spacing w:before="60" w:after="60"/>
-              <w:ind w:left="113"/>
-            </w:pPr>
-            <w:r>
-              <w:rPr>
-                <w:rFonts w:ascii="Calibri" w:hAnsi="Calibri"/>
-                <w:b/>
-                <w:i w:val="0"/>
-                <w:color w:val="111827"/>
-                <w:sz w:val="21"/>
-              </w:rPr>
-              <w:t>Biến chứng thủy đậu nghiêm trọng: Trẻ 6 tuổi nhiễm khuẩn huyết, thở máy nguy kịch</w:t>
-            </w:r>
-          </w:p>
-        </w:tc>
-      </w:tr>
-    </w:tbl>
-    <w:p>
-      <w:pPr>
-        <w:spacing w:before="40" w:after="40"/>
-        <w:ind w:left="170"/>
-      </w:pPr>
-      <w:r>
-        <w:rPr>
-          <w:rFonts w:ascii="Calibri" w:hAnsi="Calibri"/>
-          <w:b w:val="0"/>
-          <w:i/>
-          <w:color w:val="6B7280"/>
-          <w:sz w:val="18"/>
-        </w:rPr>
-        <w:t>Trường hợp trẻ 6 tuổi biến chứng nhiễm khuẩn huyết do thủy đậu gây chú ý dư luận, làm tăng nhận thức cộng đồng về nguy cơ bội nhiễm vi khuẩn sau nhiễm virus. Nhu cầu kháng sinh điều trị nhiễm khuẩn thứ phát và thuốc kháng virus tại các cơ sở nhi khoa dự kiến gia tăng trong mùa dịch thủy đậu.</w:t>
-      </w:r>
-    </w:p>
-    <w:p>
-      <w:pPr>
-        <w:spacing w:before="20" w:after="40"/>
-        <w:ind w:left="170"/>
-      </w:pPr>
-      <w:r>
-        <w:rPr>
-          <w:rFonts w:ascii="Calibri" w:hAnsi="Calibri"/>
-          <w:b/>
-          <w:i w:val="0"/>
-          <w:color w:val="166534"/>
-          <w:sz w:val="17"/>
-        </w:rPr>
-        <w:t>📈 Cơ hội tăng trưởng ngắn hạn cho danh mục kháng sinh nhi khoa và thuốc hỗ trợ điều trị biến chứng thủy đậu của Davipharm.</w:t>
-      </w:r>
-    </w:p>
-    <w:tbl>
-      <w:tblPr>
-        <w:tblStyle w:val="TableGrid"/>
-        <w:tblW w:type="auto" w:w="0"/>
-        <w:tblLook w:firstColumn="1" w:firstRow="1" w:lastColumn="0" w:lastRow="0" w:noHBand="0" w:noVBand="1" w:val="04A0"/>
-      </w:tblPr>
-      <w:tblGrid>
-        <w:gridCol w:w="9072"/>
-      </w:tblGrid>
-      <w:tr>
-        <w:tc>
-          <w:tcPr>
-            <w:tcW w:type="dxa" w:w="9072"/>
-            <w:shd w:val="clear" w:color="auto" w:fill="F8FAFC"/>
-            <w:tcBorders>
-              <w:top w:val="none" w:sz="6" w:color="auto"/>
-              <w:bottom w:val="none" w:sz="6" w:color="auto"/>
-              <w:left w:val="single" w:sz="12" w:color="003B71"/>
-              <w:right w:val="none" w:sz="6" w:color="auto"/>
-            </w:tcBorders>
-          </w:tcPr>
-          <w:p>
-            <w:pPr>
-              <w:spacing w:before="60" w:after="60"/>
-              <w:ind w:left="142"/>
-            </w:pPr>
-            <w:r>
-              <w:rPr>
-                <w:rFonts w:ascii="Calibri" w:hAnsi="Calibri"/>
-                <w:b/>
-                <w:i w:val="0"/>
-                <w:color w:val="003B71"/>
-                <w:sz w:val="17"/>
-              </w:rPr>
-              <w:t xml:space="preserve">Strategy  </w:t>
-            </w:r>
-            <w:r>
-              <w:rPr>
-                <w:rFonts w:ascii="Calibri" w:hAnsi="Calibri"/>
-                <w:b w:val="0"/>
-                <w:i w:val="0"/>
-                <w:color w:val="334155"/>
-                <w:sz w:val="17"/>
-              </w:rPr>
-              <w:t>Đẩy mạnh hoạt động Medical Rep tại các bệnh viện nhi và phòng khám nhi khoa với danh mục kháng sinh phổ rộng (amoxicillin-clavulanate, cephalosporin) và acyclovir — nhấn mạnh vai trò điều trị sớm để ngăn biến chứng. Cân nhắc phát hành tài liệu KOL/y văn hỗ trợ bác sĩ nhi về phác đồ xử lý biến chứng thủy đậu nhằm tăng nhận diện thương hiệu Davipharm trong phân khúc này.</w:t>
-            </w:r>
-          </w:p>
-        </w:tc>
-      </w:tr>
-    </w:tbl>
-    <w:p>
-      <w:pPr>
-        <w:spacing w:before="40" w:after="120"/>
-      </w:pPr>
-    </w:p>
-    <w:tbl>
-      <w:tblPr>
-        <w:tblStyle w:val="TableGrid"/>
-        <w:tblW w:type="auto" w:w="0"/>
-        <w:jc w:val="left"/>
-        <w:tblLook w:firstColumn="1" w:firstRow="1" w:lastColumn="0" w:lastRow="0" w:noHBand="0" w:noVBand="1" w:val="04A0"/>
-      </w:tblPr>
-      <w:tblGrid>
-        <w:gridCol w:w="4536"/>
-        <w:gridCol w:w="4536"/>
-      </w:tblGrid>
-      <w:tr>
-        <w:tc>
-          <w:tcPr>
-            <w:tcW w:type="dxa" w:w="1984"/>
-            <w:shd w:val="clear" w:color="auto" w:fill="EEF2FF"/>
-            <w:tcBorders>
-              <w:top w:val="none" w:sz="6" w:color="auto"/>
-              <w:bottom w:val="none" w:sz="6" w:color="auto"/>
-              <w:left w:val="none" w:sz="6" w:color="auto"/>
-              <w:right w:val="none" w:sz="6" w:color="auto"/>
-            </w:tcBorders>
-          </w:tcPr>
-          <w:p>
-            <w:pPr>
-              <w:spacing w:before="80" w:after="80"/>
-              <w:ind w:left="85"/>
-            </w:pPr>
-            <w:r>
-              <w:rPr>
-                <w:rFonts w:ascii="Calibri" w:hAnsi="Calibri"/>
-                <w:b/>
-                <w:i w:val="0"/>
-                <w:color w:val="4338CA"/>
-                <w:sz w:val="15"/>
-              </w:rPr>
-              <w:t>NHÂN DÂN – XÃ HỘI</w:t>
-            </w:r>
-          </w:p>
-        </w:tc>
-        <w:tc>
-          <w:tcPr>
-            <w:tcW w:type="dxa" w:w="4536"/>
-            <w:tcBorders>
-              <w:top w:val="none" w:sz="6" w:color="auto"/>
-              <w:bottom w:val="none" w:sz="6" w:color="auto"/>
-              <w:left w:val="none" w:sz="6" w:color="auto"/>
-              <w:right w:val="none" w:sz="6" w:color="auto"/>
-            </w:tcBorders>
-          </w:tcPr>
-          <w:p>
-            <w:pPr>
-              <w:spacing w:before="60" w:after="60"/>
-              <w:ind w:left="113"/>
-            </w:pPr>
-            <w:r>
-              <w:rPr>
-                <w:rFonts w:ascii="Calibri" w:hAnsi="Calibri"/>
-                <w:b/>
-                <w:i w:val="0"/>
-                <w:color w:val="111827"/>
-                <w:sz w:val="21"/>
-              </w:rPr>
-              <w:t>Kỹ thuật mổ nội soi tuyến giáp "Dr Lương" thu hút bệnh nhân &amp; bác sĩ quốc tế đến Việt Nam</w:t>
-            </w:r>
-          </w:p>
-        </w:tc>
-      </w:tr>
-    </w:tbl>
-    <w:p>
-      <w:pPr>
-        <w:spacing w:before="40" w:after="40"/>
-        <w:ind w:left="170"/>
-      </w:pPr>
-      <w:r>
-        <w:rPr>
-          <w:rFonts w:ascii="Calibri" w:hAnsi="Calibri"/>
-          <w:b w:val="0"/>
-          <w:i/>
-          <w:color w:val="6B7280"/>
-          <w:sz w:val="18"/>
-        </w:rPr>
-        <w:t>Phương pháp mổ nội soi tuyến giáp "Dr Lương" của Việt Nam đang thu hút bệnh nhân từ Philippines và bác sĩ từ Azerbaijan, Ấn Độ đến học hỏi, khẳng định vị thế trung tâm y tế chất lượng cao trong khu vực. Xu hướng du lịch y tế quốc tế vào Việt Nam mở ra nhu cầu gia tăng đối với dược phẩm hậu phẫu và thuốc đặc trị tuyến giáp tại các bệnh viện tuyến đầu.</w:t>
-      </w:r>
-    </w:p>
-    <w:p>
-      <w:pPr>
-        <w:spacing w:before="20" w:after="40"/>
-        <w:ind w:left="170"/>
-      </w:pPr>
-      <w:r>
-        <w:rPr>
-          <w:rFonts w:ascii="Calibri" w:hAnsi="Calibri"/>
-          <w:b/>
-          <w:i w:val="0"/>
-          <w:color w:val="166534"/>
-          <w:sz w:val="17"/>
-        </w:rPr>
-        <w:t>🟢 Tín hiệu tích cực gián tiếp — du lịch y tế tăng trưởng thúc đẩy nhu cầu dược phẩm hậu phẫu tuyến giáp tại bệnh viện đối tác.</w:t>
-      </w:r>
-    </w:p>
-    <w:tbl>
-      <w:tblPr>
-        <w:tblStyle w:val="TableGrid"/>
-        <w:tblW w:type="auto" w:w="0"/>
-        <w:tblLook w:firstColumn="1" w:firstRow="1" w:lastColumn="0" w:lastRow="0" w:noHBand="0" w:noVBand="1" w:val="04A0"/>
-      </w:tblPr>
-      <w:tblGrid>
-        <w:gridCol w:w="9072"/>
-      </w:tblGrid>
-      <w:tr>
-        <w:tc>
-          <w:tcPr>
-            <w:tcW w:type="dxa" w:w="9072"/>
-            <w:shd w:val="clear" w:color="auto" w:fill="F8FAFC"/>
-            <w:tcBorders>
-              <w:top w:val="none" w:sz="6" w:color="auto"/>
-              <w:bottom w:val="none" w:sz="6" w:color="auto"/>
-              <w:left w:val="single" w:sz="12" w:color="003B71"/>
-              <w:right w:val="none" w:sz="6" w:color="auto"/>
-            </w:tcBorders>
-          </w:tcPr>
-          <w:p>
-            <w:pPr>
-              <w:spacing w:before="60" w:after="60"/>
-              <w:ind w:left="142"/>
-            </w:pPr>
-            <w:r>
-              <w:rPr>
-                <w:rFonts w:ascii="Calibri" w:hAnsi="Calibri"/>
-                <w:b/>
-                <w:i w:val="0"/>
-                <w:color w:val="003B71"/>
-                <w:sz w:val="17"/>
-              </w:rPr>
-              <w:t xml:space="preserve">Strategy  </w:t>
-            </w:r>
-            <w:r>
-              <w:rPr>
-                <w:rFonts w:ascii="Calibri" w:hAnsi="Calibri"/>
-                <w:b w:val="0"/>
-                <w:i w:val="0"/>
-                <w:color w:val="334155"/>
-                <w:sz w:val="17"/>
-              </w:rPr>
-              <w:t>Davipharm nên chủ động tiếp cận các bệnh viện chuyên sâu thực hiện kỹ thuật "Dr Lương" (như BV Nội tiết TW, BV Bạch Mai) để đưa thuốc levothyroxine, canxi và kháng sinh hậu phẫu vào danh mục ưu tiên đấu thầu. Đây là cơ hội xây dựng quan hệ đối tác bệnh viện dài hạn, đặc biệt khi lượng bệnh nhân quốc tế gia tăng sẽ nâng cao tiêu chuẩn thuốc được chỉ định.</w:t>
-            </w:r>
-          </w:p>
-        </w:tc>
-      </w:tr>
-    </w:tbl>
-    <w:p>
-      <w:pPr>
-        <w:spacing w:before="40" w:after="120"/>
-      </w:pPr>
-    </w:p>
     <w:p>
       <w:r>
         <w:br w:type="page"/>
@@ -1841,7 +1093,7 @@
                 <w:color w:val="4338CA"/>
                 <w:sz w:val="15"/>
               </w:rPr>
-              <w:t>SK&amp;ĐS – CHÍNH SÁCH Y TẾ</w:t>
+              <w:t>TUỔI TRẺ – SỨC KHỎE</w:t>
             </w:r>
           </w:p>
         </w:tc>
@@ -1868,7 +1120,7 @@
                 <w:color w:val="111827"/>
                 <w:sz w:val="21"/>
               </w:rPr>
-              <w:t>Đảm bảo chất lượng thuốc, mỹ phẩm, thực phẩm vì sức khỏe cộng đồng</w:t>
+              <w:t>Bệnh viện tỉnh Khánh Hòa thiếu phòng điều trị — 3 tháng chưa tìm được giải pháp</w:t>
             </w:r>
           </w:p>
         </w:tc>
@@ -1887,7 +1139,7 @@
           <w:color w:val="6B7280"/>
           <w:sz w:val="18"/>
         </w:rPr>
-        <w:t>Bài viết đề cập định hướng chung về đảm bảo chất lượng thuốc, mỹ phẩm và thực phẩm chức năng tại Việt Nam, không có văn bản pháp quy cụ thể hay kết quả đấu thầu nào được ban hành. Nội dung mang tính tổng quan truyền thông, không tác động trực tiếp đến danh mục sản phẩm hay hoạt động đấu thầu của Davipharm trong ngắn hạn.</w:t>
+        <w:t>Bệnh viện tỉnh Khánh Hòa đang đối mặt với tình trạng thiếu phòng điều trị kéo dài trên 3 tháng chưa có phương án khắc phục rõ ràng, phản ánh áp lực hạ tầng y tế tại tuyến tỉnh. Tình trạng này có thể kéo theo gián đoạn hoạt động khám chữa bệnh và ảnh hưởng gián tiếp đến khả năng thực hiện hợp đồng/giải ngân thuốc ETC tại địa bàn.</w:t>
       </w:r>
     </w:p>
     <w:p>
@@ -1903,7 +1155,7 @@
           <w:color w:val="374151"/>
           <w:sz w:val="17"/>
         </w:rPr>
-        <w:t>⚪ Tín hiệu trung lập — không có sự kiện quy định hoặc thầu cụ thể tác động đến sản phẩm Davipharm; theo dõi nếu xu hướng kiểm soát chất lượng được cụ thể hóa thành văn bản.</w:t>
+        <w:t>⚠️ Tác động hạn chế nhưng cần theo dõi: gián đoạn hạ tầng bệnh viện tỉnh có thể làm chậm giải ngân hợp đồng ETC cho các sản phẩm tim mạch, đái tháo đường của Davipharm tại Khánh Hòa.</w:t>
       </w:r>
     </w:p>
     <w:tbl>
@@ -1950,319 +1202,7 @@
                 <w:color w:val="334155"/>
                 <w:sz w:val="17"/>
               </w:rPr>
-              <w:t>Team Regulatory Affairs theo dõi các diễn biến tiếp theo từ Cục Quản lý Dược để phát hiện sớm nếu định hướng này chuyển thành thông tư/nghị định ảnh hưởng đến điều kiện lưu hành hoặc GMP của toàn danh mục; không cần hành động khẩn cấp tại thời điểm này.</w:t>
-            </w:r>
-          </w:p>
-        </w:tc>
-      </w:tr>
-    </w:tbl>
-    <w:p>
-      <w:pPr>
-        <w:spacing w:before="40" w:after="120"/>
-      </w:pPr>
-    </w:p>
-    <w:tbl>
-      <w:tblPr>
-        <w:tblStyle w:val="TableGrid"/>
-        <w:tblW w:type="auto" w:w="0"/>
-        <w:jc w:val="left"/>
-        <w:tblLook w:firstColumn="1" w:firstRow="1" w:lastColumn="0" w:lastRow="0" w:noHBand="0" w:noVBand="1" w:val="04A0"/>
-      </w:tblPr>
-      <w:tblGrid>
-        <w:gridCol w:w="4536"/>
-        <w:gridCol w:w="4536"/>
-      </w:tblGrid>
-      <w:tr>
-        <w:tc>
-          <w:tcPr>
-            <w:tcW w:type="dxa" w:w="1984"/>
-            <w:shd w:val="clear" w:color="auto" w:fill="EEF2FF"/>
-            <w:tcBorders>
-              <w:top w:val="none" w:sz="6" w:color="auto"/>
-              <w:bottom w:val="none" w:sz="6" w:color="auto"/>
-              <w:left w:val="none" w:sz="6" w:color="auto"/>
-              <w:right w:val="none" w:sz="6" w:color="auto"/>
-            </w:tcBorders>
-          </w:tcPr>
-          <w:p>
-            <w:pPr>
-              <w:spacing w:before="80" w:after="80"/>
-              <w:ind w:left="85"/>
-            </w:pPr>
-            <w:r>
-              <w:rPr>
-                <w:rFonts w:ascii="Calibri" w:hAnsi="Calibri"/>
-                <w:b/>
-                <w:i w:val="0"/>
-                <w:color w:val="4338CA"/>
-                <w:sz w:val="15"/>
-              </w:rPr>
-              <w:t>VNEXPRESS – SỨC KHỎE</w:t>
-            </w:r>
-          </w:p>
-        </w:tc>
-        <w:tc>
-          <w:tcPr>
-            <w:tcW w:type="dxa" w:w="4536"/>
-            <w:tcBorders>
-              <w:top w:val="none" w:sz="6" w:color="auto"/>
-              <w:bottom w:val="none" w:sz="6" w:color="auto"/>
-              <w:left w:val="none" w:sz="6" w:color="auto"/>
-              <w:right w:val="none" w:sz="6" w:color="auto"/>
-            </w:tcBorders>
-          </w:tcPr>
-          <w:p>
-            <w:pPr>
-              <w:spacing w:before="60" w:after="60"/>
-              <w:ind w:left="113"/>
-            </w:pPr>
-            <w:r>
-              <w:rPr>
-                <w:rFonts w:ascii="Calibri" w:hAnsi="Calibri"/>
-                <w:b/>
-                <w:i w:val="0"/>
-                <w:color w:val="111827"/>
-                <w:sz w:val="21"/>
-              </w:rPr>
-              <w:t>Chuẩn bị sức khỏe du lịch hè vùng xa: tín hiệu nhu cầu OTC mùa hè</w:t>
-            </w:r>
-          </w:p>
-        </w:tc>
-      </w:tr>
-    </w:tbl>
-    <w:p>
-      <w:pPr>
-        <w:spacing w:before="40" w:after="40"/>
-        <w:ind w:left="170"/>
-      </w:pPr>
-      <w:r>
-        <w:rPr>
-          <w:rFonts w:ascii="Calibri" w:hAnsi="Calibri"/>
-          <w:b w:val="0"/>
-          <w:i/>
-          <w:color w:val="6B7280"/>
-          <w:sz w:val="18"/>
-        </w:rPr>
-        <w:t>Bài viết từ VNVC khuyến nghị người đi du lịch hè vùng xa chuẩn bị túi thuốc cơ bản (hạ sốt, tiêu hóa, sát khuẩn) và vaccine, phản ánh nhu cầu tiêu dùng OTC theo mùa hè tăng cao. Tác động trực tiếp đến Davipharm rất hạn chế do danh mục không có sản phẩm OTC travel-health chủ lực; bài viết không đề cập đến kênh ETC hay đấu thầu.</w:t>
-      </w:r>
-    </w:p>
-    <w:p>
-      <w:pPr>
-        <w:spacing w:before="20" w:after="40"/>
-        <w:ind w:left="170"/>
-      </w:pPr>
-      <w:r>
-        <w:rPr>
-          <w:rFonts w:ascii="Calibri" w:hAnsi="Calibri"/>
-          <w:b/>
-          <w:i w:val="0"/>
-          <w:color w:val="374151"/>
-          <w:sz w:val="17"/>
-        </w:rPr>
-        <w:t>➖ Tin không liên quan trực tiếp đến danh mục ETC hay sản phẩm chiến lược của Davipharm; không phát sinh cơ hội hay rủi ro rõ ràng trong kỳ ngắn hạn.</w:t>
-      </w:r>
-    </w:p>
-    <w:tbl>
-      <w:tblPr>
-        <w:tblStyle w:val="TableGrid"/>
-        <w:tblW w:type="auto" w:w="0"/>
-        <w:tblLook w:firstColumn="1" w:firstRow="1" w:lastColumn="0" w:lastRow="0" w:noHBand="0" w:noVBand="1" w:val="04A0"/>
-      </w:tblPr>
-      <w:tblGrid>
-        <w:gridCol w:w="9072"/>
-      </w:tblGrid>
-      <w:tr>
-        <w:tc>
-          <w:tcPr>
-            <w:tcW w:type="dxa" w:w="9072"/>
-            <w:shd w:val="clear" w:color="auto" w:fill="F8FAFC"/>
-            <w:tcBorders>
-              <w:top w:val="none" w:sz="6" w:color="auto"/>
-              <w:bottom w:val="none" w:sz="6" w:color="auto"/>
-              <w:left w:val="single" w:sz="12" w:color="003B71"/>
-              <w:right w:val="none" w:sz="6" w:color="auto"/>
-            </w:tcBorders>
-          </w:tcPr>
-          <w:p>
-            <w:pPr>
-              <w:spacing w:before="60" w:after="60"/>
-              <w:ind w:left="142"/>
-            </w:pPr>
-            <w:r>
-              <w:rPr>
-                <w:rFonts w:ascii="Calibri" w:hAnsi="Calibri"/>
-                <w:b/>
-                <w:i w:val="0"/>
-                <w:color w:val="003B71"/>
-                <w:sz w:val="17"/>
-              </w:rPr>
-              <w:t xml:space="preserve">Strategy  </w:t>
-            </w:r>
-            <w:r>
-              <w:rPr>
-                <w:rFonts w:ascii="Calibri" w:hAnsi="Calibri"/>
-                <w:b w:val="0"/>
-                <w:i w:val="0"/>
-                <w:color w:val="334155"/>
-                <w:sz w:val="17"/>
-              </w:rPr>
-              <w:t>Không cần hành động ưu tiên. Marketing team có thể ghi nhận như tín hiệu nền về nhu cầu OTC mùa hè, tuy nhiên không cần phân bổ nguồn lực do Davipharm chưa có sản phẩm tiêu hóa/hạ sốt OTC định vị phân khúc travel-health.</w:t>
-            </w:r>
-          </w:p>
-        </w:tc>
-      </w:tr>
-    </w:tbl>
-    <w:p>
-      <w:pPr>
-        <w:spacing w:before="40" w:after="120"/>
-      </w:pPr>
-    </w:p>
-    <w:tbl>
-      <w:tblPr>
-        <w:tblStyle w:val="TableGrid"/>
-        <w:tblW w:type="auto" w:w="0"/>
-        <w:jc w:val="left"/>
-        <w:tblLook w:firstColumn="1" w:firstRow="1" w:lastColumn="0" w:lastRow="0" w:noHBand="0" w:noVBand="1" w:val="04A0"/>
-      </w:tblPr>
-      <w:tblGrid>
-        <w:gridCol w:w="4536"/>
-        <w:gridCol w:w="4536"/>
-      </w:tblGrid>
-      <w:tr>
-        <w:tc>
-          <w:tcPr>
-            <w:tcW w:type="dxa" w:w="1984"/>
-            <w:shd w:val="clear" w:color="auto" w:fill="EEF2FF"/>
-            <w:tcBorders>
-              <w:top w:val="none" w:sz="6" w:color="auto"/>
-              <w:bottom w:val="none" w:sz="6" w:color="auto"/>
-              <w:left w:val="none" w:sz="6" w:color="auto"/>
-              <w:right w:val="none" w:sz="6" w:color="auto"/>
-            </w:tcBorders>
-          </w:tcPr>
-          <w:p>
-            <w:pPr>
-              <w:spacing w:before="80" w:after="80"/>
-              <w:ind w:left="85"/>
-            </w:pPr>
-            <w:r>
-              <w:rPr>
-                <w:rFonts w:ascii="Calibri" w:hAnsi="Calibri"/>
-                <w:b/>
-                <w:i w:val="0"/>
-                <w:color w:val="4338CA"/>
-                <w:sz w:val="15"/>
-              </w:rPr>
-              <w:t>VNEXPRESS – SỨC KHỎE</w:t>
-            </w:r>
-          </w:p>
-        </w:tc>
-        <w:tc>
-          <w:tcPr>
-            <w:tcW w:type="dxa" w:w="4536"/>
-            <w:tcBorders>
-              <w:top w:val="none" w:sz="6" w:color="auto"/>
-              <w:bottom w:val="none" w:sz="6" w:color="auto"/>
-              <w:left w:val="none" w:sz="6" w:color="auto"/>
-              <w:right w:val="none" w:sz="6" w:color="auto"/>
-            </w:tcBorders>
-          </w:tcPr>
-          <w:p>
-            <w:pPr>
-              <w:spacing w:before="60" w:after="60"/>
-              <w:ind w:left="113"/>
-            </w:pPr>
-            <w:r>
-              <w:rPr>
-                <w:rFonts w:ascii="Calibri" w:hAnsi="Calibri"/>
-                <w:b/>
-                <w:i w:val="0"/>
-                <w:color w:val="111827"/>
-                <w:sz w:val="21"/>
-              </w:rPr>
-              <w:t>Phẫu thuật nội soi cắt thực quản triệt căn ung thư giai đoạn sớm tại Tâm Anh</w:t>
-            </w:r>
-          </w:p>
-        </w:tc>
-      </w:tr>
-    </w:tbl>
-    <w:p>
-      <w:pPr>
-        <w:spacing w:before="40" w:after="40"/>
-        <w:ind w:left="170"/>
-      </w:pPr>
-      <w:r>
-        <w:rPr>
-          <w:rFonts w:ascii="Calibri" w:hAnsi="Calibri"/>
-          <w:b w:val="0"/>
-          <w:i/>
-          <w:color w:val="6B7280"/>
-          <w:sz w:val="18"/>
-        </w:rPr>
-        <w:t>Bệnh viện Tâm Anh Hà Nội thực hiện thành công phẫu thuật nội soi cắt toàn bộ thực quản cho bệnh nhân ung thư giai đoạn sớm (cT1bN0M0), bệnh nhân không cần hóa xạ trị bổ trợ sau mổ. Bài viết phản ánh xu hướng phát hiện ung thư sớm qua tầm soát định kỳ, có thể làm tăng tỷ lệ ca phẫu thuật triệt căn nhưng giảm nhu cầu điều trị hóa-xạ đa mô thức — phân khúc liên quan đến HYYR (Erlotinib) và LARRIVEY (Bicalutamide) của Davipharm.</w:t>
-      </w:r>
-    </w:p>
-    <w:p>
-      <w:pPr>
-        <w:spacing w:before="20" w:after="40"/>
-        <w:ind w:left="170"/>
-      </w:pPr>
-      <w:r>
-        <w:rPr>
-          <w:rFonts w:ascii="Calibri" w:hAnsi="Calibri"/>
-          <w:b/>
-          <w:i w:val="0"/>
-          <w:color w:val="374151"/>
-          <w:sz w:val="17"/>
-        </w:rPr>
-        <w:t>⚪ Tín hiệu theo dõi: xu hướng phát hiện ung thư sớm có thể giảm nhóm bệnh nhân dùng thuốc nhắm đích — không tác động trực tiếp đến doanh thu Davipharm trong ngắn hạn, nhưng cần theo dõi dịch chuyển mô hình điều trị ung thư tại kênh ETC bệnh viện tuyến đầu.</w:t>
-      </w:r>
-    </w:p>
-    <w:tbl>
-      <w:tblPr>
-        <w:tblStyle w:val="TableGrid"/>
-        <w:tblW w:type="auto" w:w="0"/>
-        <w:tblLook w:firstColumn="1" w:firstRow="1" w:lastColumn="0" w:lastRow="0" w:noHBand="0" w:noVBand="1" w:val="04A0"/>
-      </w:tblPr>
-      <w:tblGrid>
-        <w:gridCol w:w="9072"/>
-      </w:tblGrid>
-      <w:tr>
-        <w:tc>
-          <w:tcPr>
-            <w:tcW w:type="dxa" w:w="9072"/>
-            <w:shd w:val="clear" w:color="auto" w:fill="F8FAFC"/>
-            <w:tcBorders>
-              <w:top w:val="none" w:sz="6" w:color="auto"/>
-              <w:bottom w:val="none" w:sz="6" w:color="auto"/>
-              <w:left w:val="single" w:sz="12" w:color="003B71"/>
-              <w:right w:val="none" w:sz="6" w:color="auto"/>
-            </w:tcBorders>
-          </w:tcPr>
-          <w:p>
-            <w:pPr>
-              <w:spacing w:before="60" w:after="60"/>
-              <w:ind w:left="142"/>
-            </w:pPr>
-            <w:r>
-              <w:rPr>
-                <w:rFonts w:ascii="Calibri" w:hAnsi="Calibri"/>
-                <w:b/>
-                <w:i w:val="0"/>
-                <w:color w:val="003B71"/>
-                <w:sz w:val="17"/>
-              </w:rPr>
-              <w:t xml:space="preserve">Strategy  </w:t>
-            </w:r>
-            <w:r>
-              <w:rPr>
-                <w:rFonts w:ascii="Calibri" w:hAnsi="Calibri"/>
-                <w:b w:val="0"/>
-                <w:i w:val="0"/>
-                <w:color w:val="334155"/>
-                <w:sz w:val="17"/>
-              </w:rPr>
-              <w:t>Team Ung thư (Oncology) theo dõi tỷ lệ ca phẫu thuật triệt căn vs. điều trị hệ thống tại các bệnh viện tuyến trên (Tâm Anh, Bạch Mai, Chợ Rẫy) để đánh giá tác động dài hạn đến vị thế thầu của HYYR và LARRIVEY; không cần hành động khẩn trong Q này.</w:t>
+              <w:t>Team Sales ETC miền Trung rà soát trạng thái hợp đồng và tiến độ giải ngân tại Bệnh viện tỉnh Khánh Hòa trong tháng 5–6/2026, đặc biệt với các sản phẩm PECHAUNOX, RAVASTEL, EIMLER-10; nếu phát hiện rủi ro tồn kho ứ đọng hoặc chậm thanh toán cần báo cáo sớm lên cấp quản lý vùng.</w:t>
             </w:r>
           </w:p>
         </w:tc>
@@ -2336,7 +1276,7 @@
                 <w:color w:val="111827"/>
                 <w:sz w:val="21"/>
               </w:rPr>
-              <w:t>Bộ Y tế đề xuất cơ sở 2 Bạch Mai, Việt Đức áp dụng giá dịch vụ y tế ngang cơ sở chính</w:t>
+              <w:t>Bộ Y tế cam kết hoàn thiện chế độ đãi ngộ cho y bác sĩ vùng biển đảo</w:t>
             </w:r>
           </w:p>
         </w:tc>
@@ -2355,7 +1295,7 @@
           <w:color w:val="6B7280"/>
           <w:sz w:val="18"/>
         </w:rPr>
-        <w:t>Bộ Y tế đề xuất cho phép cơ sở 2 của Bạch Mai và Việt Đức áp dụng mức giá dịch vụ y tế tương đương cơ sở chính, nhằm tăng khả năng thu hút bệnh nhân và tự chủ tài chính cho hai bệnh viện tuyến trung ương lớn nhất miền Bắc. Nếu được thông qua, lượng bệnh nhân điều trị nội trú tại hai cơ sở này sẽ tăng, mở rộng thị trường tiêu thụ ETC cho các nhóm thuốc tim mạch, đái tháo đường và ung thư của Davipharm.</w:t>
+        <w:t>Thứ trưởng Bộ Y tế cho biết sẽ tham mưu hoàn thiện chính sách đãi ngộ đặc thù cho y bác sĩ công tác tại vùng biển đảo, nhằm thu hút và giữ chân nhân lực y tế tuyến xa. Đây là chính sách nhân sự ngành y tế, không ảnh hưởng trực tiếp đến hoạt động đấu thầu hay danh mục sản phẩm của Davipharm.</w:t>
       </w:r>
     </w:p>
     <w:p>
@@ -2368,10 +1308,10 @@
           <w:rFonts w:ascii="Calibri" w:hAnsi="Calibri"/>
           <w:b/>
           <w:i w:val="0"/>
-          <w:color w:val="166534"/>
+          <w:color w:val="374151"/>
           <w:sz w:val="17"/>
         </w:rPr>
-        <w:t>📈 Cơ hội mở rộng thị trường ETC: hai cơ sở 2 vận hành đầy đủ đồng nghĩa thêm 2 đơn vị mua sắm độc lập — tiềm năng đưa RAVASTEL, EIMLER-10, HYYR, PECHAUNOX vào danh mục thầu mới.</w:t>
+        <w:t>➖ Tin không liên quan trực tiếp đến Davipharm — không có tác động đến doanh thu ETC hay danh mục generic.</w:t>
       </w:r>
     </w:p>
     <w:tbl>
@@ -2418,7 +1358,7 @@
                 <w:color w:val="334155"/>
                 <w:sz w:val="17"/>
               </w:rPr>
-              <w:t>Team Sales ETC miền Bắc cần theo dõi tiến độ phê duyệt đề xuất và chủ động tiếp cận Ban Dược — Vật tư y tế của cơ sở 2 Bạch Mai (Hà Nam) và Việt Đức (Ninh Bình) ngay khi có quyết định chính thức, ưu tiên đăng ký danh mục cho RAVASTEL, EIMLER-10, PECHAUNOX và HYYR trong chu kỳ thầu đầu tiên của các đơn vị này.</w:t>
+              <w:t>Không cần hành động ưu tiên; Market Intelligence team lưu hồ sơ theo dõi chính sách y tế vùng sâu/xa nếu xuất hiện cơ hội mở rộng kênh phân phối tuyến huyện/đảo trong tương lai.</w:t>
             </w:r>
           </w:p>
         </w:tc>
@@ -2492,7 +1432,7 @@
                 <w:color w:val="111827"/>
                 <w:sz w:val="21"/>
               </w:rPr>
-              <w:t>TP.HCM thu 3.500 tỉ đồng từ du lịch chăm sóc răng miệng — tín hiệu từ thị trường y tế tự nguyện</w:t>
+              <w:t>Khám sức khỏe miễn phí hằng năm toàn dân: Cơ hội mở rộng nhu cầu điều trị tim mạch, đái tháo đường</w:t>
             </w:r>
           </w:p>
         </w:tc>
@@ -2511,7 +1451,7 @@
           <w:color w:val="6B7280"/>
           <w:sz w:val="18"/>
         </w:rPr>
-        <w:t>TP.HCM ghi nhận doanh thu 3.500 tỉ đồng từ dịch vụ "du lịch làm răng", phản ánh xu hướng người tiêu dùng sẵn sàng chi trả cao cho dịch vụ y tế tự nguyện ngoài hệ thống BHYT. Xu hướng này không trực tiếp tác động đến danh mục ETC của Davipharm, nhưng cho thấy tiềm năng mở rộng kênh OTC/phòng khám tư cho các sản phẩm không kê đơn.</w:t>
+        <w:t>Chính sách khám sức khỏe miễn phí hằng năm cho người dân dự kiến sẽ gia tăng đáng kể tỷ lệ phát hiện sớm các bệnh mãn tính như tim mạch, tăng huyết áp, đái tháo đường và rối loạn lipid máu. Điều này có thể tạo ra làn sóng bệnh nhân mới được chẩn đoán và kê đơn, thúc đẩy nhu cầu dài hạn đối với danh mục tim mạch–chuyển hóa của Davipharm gồm RAVASTEL (Rosuvastatin), PECHAUNOX (Perindopril+Amlodipin), HATLOP (Irbesartan), TABAREX (Valsartan) và EIMLER-10 (Empagliflozin).</w:t>
       </w:r>
     </w:p>
     <w:p>
@@ -2524,10 +1464,10 @@
           <w:rFonts w:ascii="Calibri" w:hAnsi="Calibri"/>
           <w:b/>
           <w:i w:val="0"/>
-          <w:color w:val="374151"/>
+          <w:color w:val="166534"/>
           <w:sz w:val="17"/>
         </w:rPr>
-        <w:t>📊 Không liên quan trực tiếp đến danh mục Davipharm; tín hiệu vĩ mô cho thấy sức chi tiêu y tế tự nguyện tăng, có thể khai thác gián tiếp qua kênh OTC (JANUS, TADALAFIL 20MG, DRYCHES).</w:t>
+        <w:t>📈 Cơ hội trung–dài hạn: chính sách tầm soát toàn dân sẽ mở rộng phễu bệnh nhân mãn tính, trực tiếp hỗ trợ tăng trưởng khối lượng đấu thầu ETC cho nhóm tim mạch và đái tháo đường của Davipharm.</w:t>
       </w:r>
     </w:p>
     <w:tbl>
@@ -2574,7 +1514,7 @@
                 <w:color w:val="334155"/>
                 <w:sz w:val="17"/>
               </w:rPr>
-              <w:t>Team Marketing OTC có thể tham chiếu xu hướng chi tiêu y tế tự nguyện này để củng cố luận điểm đầu tư vào kênh phòng khám tư và nhà thuốc cao cấp cho nhóm sản phẩm Nam khoa (JANUS, TADALAFIL 20MG, DRYCHES) trong kế hoạch H2/2025. Không cần hành động khẩn cấp — theo dõi định kỳ.</w:t>
+              <w:t>Marketing &amp; Medical Affairs cần theo dõi phác đồ điều trị được khuyến nghị trong chương trình khám sức khỏe định kỳ (đặc biệt screening lipid, HbA1c, huyết áp) để định vị sớm RAVASTEL, EIMLER-10, ZLATKO (Sitagliptin) và PECHAUNOX trong các tài liệu hỗ trợ bác sĩ; đồng thời phối hợp với Business Development đánh giá khả năng tăng công suất dự phòng cho chu kỳ thầu tiếp theo.</w:t>
             </w:r>
           </w:p>
         </w:tc>
@@ -2621,7 +1561,7 @@
                 <w:color w:val="4338CA"/>
                 <w:sz w:val="15"/>
               </w:rPr>
-              <w:t>VNEXPRESS – SỨC KHỎE</w:t>
+              <w:t>TUỔI TRẺ – SỨC KHỎE</w:t>
             </w:r>
           </w:p>
         </w:tc>
@@ -2648,7 +1588,7 @@
                 <w:color w:val="111827"/>
                 <w:sz w:val="21"/>
               </w:rPr>
-              <w:t>Bộ Y tế hỗ trợ gần 6 tỷ đồng thuốc men, thiết bị y tế cho quân dân Trường Sa</w:t>
+              <w:t>35.000 ca biến chứng thẩm mỹ/năm — Cảnh báo từ spa "chui" ngoài tầm kiểm soát y tế</w:t>
             </w:r>
           </w:p>
         </w:tc>
@@ -2667,7 +1607,7 @@
           <w:color w:val="6B7280"/>
           <w:sz w:val="18"/>
         </w:rPr>
-        <w:t>Bộ Y tế trao tặng thiết bị y tế, thuốc men và nhu yếu phẩm trị giá gần 6 tỷ đồng cho 7 đảo và Nhà giàn DK1/2 tại Trường Sa, trong đó 3,3 tỷ đồng dành cho thiết bị và vật tư y tế. Đây là hoạt động nhân đạo/quốc phòng đặc thù, không liên quan trực tiếp đến kênh đấu thầu ETC thương mại mà Davipharm đang tham gia.</w:t>
+        <w:t>Việt Nam ghi nhận khoảng 35.000 ca biến chứng thẩm mỹ mỗi năm, phần lớn xuất phát từ các cơ sở spa không phép, phản ánh nhu cầu điều trị hậu phẫu và xử lý biến chứng (viêm, nhiễm trùng, đau) ngày càng tăng trong hệ thống bệnh viện. Tác động trực tiếp đến Davipharm còn hạn chế, nhưng đây là tín hiệu về nhu cầu tiềm năng với nhóm thuốc kháng viêm–giảm đau và kháng sinh dùng trong điều trị biến chứng.</w:t>
       </w:r>
     </w:p>
     <w:p>
@@ -2683,7 +1623,7 @@
           <w:color w:val="374151"/>
           <w:sz w:val="17"/>
         </w:rPr>
-        <w:t>⚪ Tin không tác động trực tiếp đến doanh thu hoặc danh mục đấu thầu của Davipharm; theo dõi nếu Bộ Y tế mở rộng chương trình hỗ trợ thuốc quốc phòng thành cơ chế mua sắm tập trung có cạnh tranh.</w:t>
+        <w:t>🔎 Tín hiệu thị trường yếu — nhu cầu điều trị biến chứng thẩm mỹ có thể hỗ trợ nhẹ cho MAGRAX (Etoricoxib) và METILONE-4 (Methylprednisolone) tại kênh bệnh viện, nhưng chưa đủ để thay đổi chiến lược ngắn hạn.</w:t>
       </w:r>
     </w:p>
     <w:tbl>
@@ -2730,7 +1670,7 @@
                 <w:color w:val="334155"/>
                 <w:sz w:val="17"/>
               </w:rPr>
-              <w:t>Không cần hành động tức thời. BD/Tender team có thể lưu ý kênh cung ứng thuốc cho hệ thống quân y (Bộ Quốc phòng) như một cơ hội dài hạn tiềm năng, đặc biệt với các sản phẩm thiết yếu như METILONE-4 (Methylprednisolone) hoặc kháng sinh — nhưng cần xác minh quy trình mua sắm riêng của quân đội trước khi triển khai.</w:t>
+              <w:t>Team Marketing ETC theo dõi xu hướng điều trị biến chứng hậu thẩm mỹ (viêm, đau) tại các bệnh viện da liễu và phẫu thuật thẩm mỹ — đánh giá khả năng đưa MAGRAX và METILONE-4 vào danh mục thầu tại phân khúc này trong chu kỳ thầu tiếp theo.</w:t>
             </w:r>
           </w:p>
         </w:tc>
@@ -2777,7 +1717,7 @@
                 <w:color w:val="4338CA"/>
                 <w:sz w:val="15"/>
               </w:rPr>
-              <w:t>VNEXPRESS – SỨC KHỎE</w:t>
+              <w:t>TUỔI TRẺ – SỨC KHỎE</w:t>
             </w:r>
           </w:p>
         </w:tc>
@@ -2804,7 +1744,7 @@
                 <w:color w:val="111827"/>
                 <w:sz w:val="21"/>
               </w:rPr>
-              <w:t>Combo 3 ma túy tổng hợp gây tổn thương thần kinh nghiêm trọng — cảnh báo lạm dụng Ketamine, MDMA, Methamphetamine</w:t>
+              <w:t>Hàng nghìn công nhân tại khu công nghiệp phía Bắc được khám sức khỏe miễn phí</w:t>
             </w:r>
           </w:p>
         </w:tc>
@@ -2823,7 +1763,7 @@
           <w:color w:val="6B7280"/>
           <w:sz w:val="18"/>
         </w:rPr>
-        <w:t>Vụ bắt giữ ca sĩ Miu Lê dương tính đồng thời với Methamphetamine, MDMA và Ketamine làm dấy lên cảnh báo y tế về hậu quả tổn thương thần kinh trung ương, trầm cảm và rối loạn tâm thần kéo dài do lạm dụng chất kích thần. Bài viết không đề cập đến sản phẩm dược phẩm generic hay chính sách đấu thầu, song gián tiếp phản ánh nhu cầu điều trị rối loạn tâm thần (trầm cảm, lo âu, rối loạn hành vi) có thể tăng theo xu hướng lạm dụng chất kích thần trong cộng đồng.</w:t>
+        <w:t>Chương trình khám sức khỏe miễn phí quy mô lớn cho công nhân tại các khu công nghiệp phía Bắc phản ánh xu hướng mở rộng chăm sóc sức khỏe cơ bản cho lực lượng lao động công nghiệp — phân khúc dân số đông nhưng ít tiếp cận y tế chính thức. Hoạt động này có thể thúc đẩy nhu cầu phát hiện và điều trị các bệnh mãn tính phổ biến (tim mạch, đái tháo đường, rối loạn tiêu hóa) vốn là thế mạnh danh mục của Davipharm.</w:t>
       </w:r>
     </w:p>
     <w:p>
@@ -2839,7 +1779,7 @@
           <w:color w:val="374151"/>
           <w:sz w:val="17"/>
         </w:rPr>
-        <w:t>📊 Tác động gián tiếp, không ảnh hưởng trực tiếp đến doanh thu hay đấu thầu; theo dõi xu hướng gia tăng bệnh nhân tâm thần để đánh giá tiềm năng dài hạn cho SERNAL (Risperidone) và LAFAXOR (Venlafaxine) trong kênh ETC.</w:t>
+        <w:t>📊 Tín hiệu thị trường yếu — tiềm năng tăng nhu cầu dài hạn cho RAVASTEL, EIMLER-10, JIRACEK nhưng chưa có tác động trực tiếp đến đấu thầu hoặc doanh thu ngắn hạn.</w:t>
       </w:r>
     </w:p>
     <w:tbl>
@@ -2886,7 +1826,7 @@
                 <w:color w:val="334155"/>
                 <w:sz w:val="17"/>
               </w:rPr>
-              <w:t>Team Marketing &amp; Medical Affairs theo dõi dữ liệu dịch tễ về rối loạn tâm thần liên quan lạm dụng chất kích thần; đánh giá cơ hội mở rộng danh mục SERNAL và LAFAXOR tại các bệnh viện tâm thần/khoa tâm thần bệnh viện đa khoa trong chu kỳ thầu tiếp theo (dự kiến 2025–2026).</w:t>
+              <w:t>Team Marketing &amp; Medical Affairs theo dõi tần suất và quy mô các chương trình khám sàng lọc tại khu công nghiệp để đánh giá khả năng hợp tác CSR/giới thiệu sản phẩm (RAVASTEL – Rosuvastatin, EIMLER-10 – Empagliflozin) tới bác sĩ phụ trách; không cần hành động khẩn cấp trong Q3/2025.</w:t>
             </w:r>
           </w:p>
         </w:tc>
@@ -2933,7 +1873,7 @@
                 <w:color w:val="4338CA"/>
                 <w:sz w:val="15"/>
               </w:rPr>
-              <w:t>VNEXPRESS – SỨC KHỎE</w:t>
+              <w:t>TUỔI TRẺ – SỨC KHỎE</w:t>
             </w:r>
           </w:p>
         </w:tc>
@@ -2960,7 +1900,7 @@
                 <w:color w:val="111827"/>
                 <w:sz w:val="21"/>
               </w:rPr>
-              <w:t>Lính Anh nhảy dù cứu bệnh nhân nghi nhiễm Hantavirus trên đảo hẻo lánh</w:t>
+              <w:t>Sàng lọc ung thư phổi sớm: Xu hướng chẩn đoán mở rộng thị trường điều trị đích</w:t>
             </w:r>
           </w:p>
         </w:tc>
@@ -2979,7 +1919,7 @@
           <w:color w:val="6B7280"/>
           <w:sz w:val="18"/>
         </w:rPr>
-        <w:t>Quân đội Anh triển khai chiến dịch nhảy dù khẩn cấp đến đảo Tristan da Cunha để cứu chữa ca nghi nhiễm Hantavirus chủng Andes — chủng có khả năng lây người-người — từ tàu MV Hondius, khiến 3 người tử vong. Đây là sự kiện y tế quốc tế không liên quan trực tiếp đến thị trường dược phẩm Việt Nam hay danh mục sản phẩm của Davipharm.</w:t>
+        <w:t>Bài viết giới thiệu phương pháp sàng lọc và phát hiện ung thư phổi từ giai đoạn rất sớm, phản ánh xu hướng đẩy mạnh tầm soát ung thư tại Việt Nam. Việc phát hiện sớm ung thư phổi gia tăng sẽ mở rộng nhóm bệnh nhân có thể tiếp cận điều trị đích như Erlotinib — hoạt chất của HYYR (Davipharm).</w:t>
       </w:r>
     </w:p>
     <w:p>
@@ -2992,10 +1932,10 @@
           <w:rFonts w:ascii="Calibri" w:hAnsi="Calibri"/>
           <w:b/>
           <w:i w:val="0"/>
-          <w:color w:val="374151"/>
+          <w:color w:val="166534"/>
           <w:sz w:val="17"/>
         </w:rPr>
-        <w:t>⚪ Không có tác động trực tiếp đến Davipharm — bài tin tức y tế quốc tế nằm ngoài phạm vi danh mục sản phẩm và thị trường mục tiêu của công ty.</w:t>
+        <w:t>📈 Tầm soát ung thư phổi mở rộng → gia tăng bệnh nhân NSCLC điều trị đích → cơ hội tăng khối lượng đấu thầu HYYR (Erlotinib) tại kênh ETC bệnh viện.</w:t>
       </w:r>
     </w:p>
     <w:tbl>
@@ -3042,7 +1982,7 @@
                 <w:color w:val="334155"/>
                 <w:sz w:val="17"/>
               </w:rPr>
-              <w:t>Không cần hành động. BOD có thể lưu ý theo dõi nếu WHO/Bộ Y tế Việt Nam phát cảnh báo dịch tễ Hantavirus tại Việt Nam, nhưng hiện tại chưa có sản phẩm nào trong danh mục Davipharm liên quan đến điều trị virus này.</w:t>
+              <w:t>Team Medical Affairs &amp; Marketing Ung thư cần chuẩn bị tài liệu khoa học hỗ trợ HYYR (Erlotinib) liên kết với xu hướng phát hiện sớm NSCLC; phối hợp với team Đấu thầu rà soát danh mục bệnh viện tuyến tỉnh/trung ương có khả năng mở gói thầu thuốc ung thư phổi trong chu kỳ 2025–2026.</w:t>
             </w:r>
           </w:p>
         </w:tc>
@@ -3089,7 +2029,7 @@
                 <w:color w:val="4338CA"/>
                 <w:sz w:val="15"/>
               </w:rPr>
-              <w:t>VNEXPRESS – SỨC KHỎE</w:t>
+              <w:t>TUỔI TRẺ – SỨC KHỎE</w:t>
             </w:r>
           </w:p>
         </w:tc>
@@ -3116,7 +2056,7 @@
                 <w:color w:val="111827"/>
                 <w:sz w:val="21"/>
               </w:rPr>
-              <w:t>Cảnh báo ung thư đại trực tràng từ thực phẩm siêu chế biến — Xu hướng tầm soát &amp; nhu cầu điều trị ung thư tăng</w:t>
+              <w:t>Mở rộng ít nhất 200 bệnh viện vệ tinh toàn quốc — cơ hội mở rộng kênh ETC tuyến dưới</w:t>
             </w:r>
           </w:p>
         </w:tc>
@@ -3135,7 +2075,7 @@
           <w:color w:val="6B7280"/>
           <w:sz w:val="18"/>
         </w:rPr>
-        <w:t>Nghiên cứu đăng trên JAMA Oncology xác nhận tiêu thụ thực phẩm siêu chế biến cao làm tăng rõ rệt nguy cơ polyp tuyến tiền ung thư đại trực tràng, thúc đẩy xu hướng tầm soát và điều trị ung thư sớm hơn tại Việt Nam. Xu hướng này có thể mở rộng thị trường cho nhóm sản phẩm ung thư high-value ETC của Davipharm, đặc biệt HYYR (Erlotinib) và LARRIVEY (Bicalutamide) trong kênh bệnh viện.</w:t>
+        <w:t>Chính phủ thúc đẩy mở rộng mạng lưới bệnh viện vệ tinh thêm tối thiểu 200 cơ sở trên toàn quốc, tăng cường năng lực khám chữa bệnh tuyến tỉnh/huyện. Điều này trực tiếp mở rộng số lượng cơ sở y tế tham gia đấu thầu thuốc, đặc biệt có lợi cho danh mục tim mạch (PECHAUNOX, RAVASTEL, TABAREX, ZABALES) và tiêu hóa (JIRACEK) vốn có nhu cầu cao ở tuyến cơ sở.</w:t>
       </w:r>
     </w:p>
     <w:p>
@@ -3148,10 +2088,10 @@
           <w:rFonts w:ascii="Calibri" w:hAnsi="Calibri"/>
           <w:b/>
           <w:i w:val="0"/>
-          <w:color w:val="374151"/>
+          <w:color w:val="166534"/>
           <w:sz w:val="17"/>
         </w:rPr>
-        <w:t>📊 Tín hiệu dài hạn: nhu cầu điều trị ung thư tăng có lợi cho danh mục ETC cao cấp nhưng tác động trực tiếp đến doanh thu ngắn hạn là chưa rõ ràng.</w:t>
+        <w:t>🟢 Cơ hội tăng volume đấu thầu ETC địa phương — 200+ điểm thầu mới tiềm năng cho các sản phẩm tim mạch và tiêu hóa của Davipharm.</w:t>
       </w:r>
     </w:p>
     <w:tbl>
@@ -3198,7 +2138,7 @@
                 <w:color w:val="334155"/>
                 <w:sz w:val="17"/>
               </w:rPr>
-              <w:t>Team Marketing ETC phối hợp với Medical Affairs theo dõi số liệu tầm soát ung thư đại trực tràng tại các bệnh viện trọng điểm; đánh giá tiềm năng mở rộng danh mục HYYR và LARRIVEY trong chu kỳ đấu thầu tiếp theo (Q3/2025).</w:t>
+              <w:t>Team Business Development &amp; Tender phối hợp với Medical Affairs lập danh sách các bệnh viện vệ tinh mới được công nhận, ưu tiên tiếp cận sớm cho PECHAUNOX, RAVASTEL và JIRACEK trước khi chu kỳ thầu địa phương tiếp theo mở (Q3–Q4/2025); đồng thời chuẩn bị hồ sơ năng lực GMP/BE để đáp ứng yêu cầu xét duyệt nhà thầu của các cơ sở mới.</w:t>
             </w:r>
           </w:p>
         </w:tc>
@@ -3245,7 +2185,7 @@
                 <w:color w:val="4338CA"/>
                 <w:sz w:val="15"/>
               </w:rPr>
-              <w:t>VNEXPRESS – SỨC KHỎE</w:t>
+              <w:t>TUỔI TRẺ – SỨC KHỎE</w:t>
             </w:r>
           </w:p>
         </w:tc>
@@ -3272,7 +2212,7 @@
                 <w:color w:val="111827"/>
                 <w:sz w:val="21"/>
               </w:rPr>
-              <w:t>Xu hướng kiểm soát huyết áp bằng thực phẩm tự nhiên (củ dền) — tín hiệu cạnh tranh nhẹ với nhóm thuốc tim mạch</w:t>
+              <w:t>Xu hướng điều trị tăng huyết áp: Kiểm soát toàn diện vượt ra ngoài hạn chế muối</w:t>
             </w:r>
           </w:p>
         </w:tc>
@@ -3291,7 +2231,7 @@
           <w:color w:val="6B7280"/>
           <w:sz w:val="18"/>
         </w:rPr>
-        <w:t>Truyền thông y tế phổ thông đang quảng bá mạnh việc hạ huyết áp bằng nước ép củ dền (giảm ~8/4 mmHg) thay thế dùng thuốc, tạo tâm lý "không cần thuốc" trong nhóm bệnh nhân tăng huyết áp nhẹ — phân khúc khách hàng tiềm năng của PECHAUNOX (Perindopril+Amlodipin), TABAREX (Valsartan) và HATLOP (Irbesartan). Tuy nhiên, đây là thông tin từ kênh truyền thông quốc tế, chưa phản ánh thay đổi hành vi kê đơn tại Việt Nam.</w:t>
+        <w:t>Truyền thông sức khỏe đại chúng đang nhấn mạnh kiểm soát huyết áp toàn diện (chế độ ăn, vận động, stress) thay vì chỉ giảm muối, phản ánh xu hướng bệnh nhân tăng huyết áp ngày càng nhận thức cao hơn về điều trị lâu dài. Điều này gián tiếp thúc đẩy nhu cầu dùng thuốc kiểm soát huyết áp bền vững trong nhóm bệnh nhân mãn tính — phân khúc cốt lõi của PECHAUNOX (Perindopril+Amlodipin), TABAREX (Valsartan), HATLOP (Irbesartan).</w:t>
       </w:r>
     </w:p>
     <w:p>
@@ -3304,10 +2244,10 @@
           <w:rFonts w:ascii="Calibri" w:hAnsi="Calibri"/>
           <w:b/>
           <w:i w:val="0"/>
-          <w:color w:val="374151"/>
+          <w:color w:val="166534"/>
           <w:sz w:val="17"/>
         </w:rPr>
-        <w:t>⚠️ Rủi ro dài hạn thấp — xu hướng "thực phẩm thay thuốc" có thể làm chậm nhận thuốc mới ở bệnh nhân THA nhẹ, nhưng chưa đủ để tác động đến doanh thu ETC kênh bệnh viện của Davipharm trong ngắn hạn.</w:t>
+        <w:t>📈 Nhận thức điều trị tăng huyết áp dài hạn gia tăng củng cố nhu cầu ổn định cho danh mục tim mạch Davipharm, đặc biệt PECHAUNOX và TABAREX trong kênh ETC.</w:t>
       </w:r>
     </w:p>
     <w:tbl>
@@ -3354,7 +2294,319 @@
                 <w:color w:val="334155"/>
                 <w:sz w:val="17"/>
               </w:rPr>
-              <w:t>Team Marketing (tim mạch) theo dõi tần suất nội dung "hạ huyết áp không dùng thuốc" trên mạng xã hội Việt Nam; nếu xu hướng tăng mạnh trong Q3/2025, phối hợp Medical Affairs chuẩn bị tài liệu giáo dục HCP nhấn mạnh vai trò không thể thay thế của thuốc (PECHAUNOX, TABAREX) trong THA độ 2 trở lên và bệnh nhân có bệnh đồng mắc.</w:t>
+              <w:t>Team Marketing có thể khai thác nội dung truyền thông này để xây dựng tài liệu hỗ trợ trình dược viên (MSL/MR) tại bệnh viện, nhấn mạnh vai trò tuân thủ điều trị thuốc hạ áp phối hợp (PECHAUNOX) bên cạnh thay đổi lối sống — đặc biệt hữu ích trong chu kỳ chuẩn bị thầu ETC tiếp theo.</w:t>
+            </w:r>
+          </w:p>
+        </w:tc>
+      </w:tr>
+    </w:tbl>
+    <w:p>
+      <w:pPr>
+        <w:spacing w:before="40" w:after="120"/>
+      </w:pPr>
+    </w:p>
+    <w:tbl>
+      <w:tblPr>
+        <w:tblStyle w:val="TableGrid"/>
+        <w:tblW w:type="auto" w:w="0"/>
+        <w:jc w:val="left"/>
+        <w:tblLook w:firstColumn="1" w:firstRow="1" w:lastColumn="0" w:lastRow="0" w:noHBand="0" w:noVBand="1" w:val="04A0"/>
+      </w:tblPr>
+      <w:tblGrid>
+        <w:gridCol w:w="4536"/>
+        <w:gridCol w:w="4536"/>
+      </w:tblGrid>
+      <w:tr>
+        <w:tc>
+          <w:tcPr>
+            <w:tcW w:type="dxa" w:w="1984"/>
+            <w:shd w:val="clear" w:color="auto" w:fill="EEF2FF"/>
+            <w:tcBorders>
+              <w:top w:val="none" w:sz="6" w:color="auto"/>
+              <w:bottom w:val="none" w:sz="6" w:color="auto"/>
+              <w:left w:val="none" w:sz="6" w:color="auto"/>
+              <w:right w:val="none" w:sz="6" w:color="auto"/>
+            </w:tcBorders>
+          </w:tcPr>
+          <w:p>
+            <w:pPr>
+              <w:spacing w:before="80" w:after="80"/>
+              <w:ind w:left="85"/>
+            </w:pPr>
+            <w:r>
+              <w:rPr>
+                <w:rFonts w:ascii="Calibri" w:hAnsi="Calibri"/>
+                <w:b/>
+                <w:i w:val="0"/>
+                <w:color w:val="4338CA"/>
+                <w:sz w:val="15"/>
+              </w:rPr>
+              <w:t>TUỔI TRẺ – SỨC KHỎE</w:t>
+            </w:r>
+          </w:p>
+        </w:tc>
+        <w:tc>
+          <w:tcPr>
+            <w:tcW w:type="dxa" w:w="4536"/>
+            <w:tcBorders>
+              <w:top w:val="none" w:sz="6" w:color="auto"/>
+              <w:bottom w:val="none" w:sz="6" w:color="auto"/>
+              <w:left w:val="none" w:sz="6" w:color="auto"/>
+              <w:right w:val="none" w:sz="6" w:color="auto"/>
+            </w:tcBorders>
+          </w:tcPr>
+          <w:p>
+            <w:pPr>
+              <w:spacing w:before="60" w:after="60"/>
+              <w:ind w:left="113"/>
+            </w:pPr>
+            <w:r>
+              <w:rPr>
+                <w:rFonts w:ascii="Calibri" w:hAnsi="Calibri"/>
+                <w:b/>
+                <w:i w:val="0"/>
+                <w:color w:val="111827"/>
+                <w:sz w:val="21"/>
+              </w:rPr>
+              <w:t>BV Thống Nhất phát triển thành Trung tâm Lão khoa hàng đầu — Cơ hội mở rộng danh mục tim mạch &amp; đái tháo đường</w:t>
+            </w:r>
+          </w:p>
+        </w:tc>
+      </w:tr>
+    </w:tbl>
+    <w:p>
+      <w:pPr>
+        <w:spacing w:before="40" w:after="40"/>
+        <w:ind w:left="170"/>
+      </w:pPr>
+      <w:r>
+        <w:rPr>
+          <w:rFonts w:ascii="Calibri" w:hAnsi="Calibri"/>
+          <w:b w:val="0"/>
+          <w:i/>
+          <w:color w:val="6B7280"/>
+          <w:sz w:val="18"/>
+        </w:rPr>
+        <w:t>Bệnh viện Thống Nhất (TP.HCM) đang định vị trở thành trung tâm lão khoa hàng đầu, đồng nghĩa với việc gia tăng nhu cầu điều trị dài hạn các bệnh lý mạn tính phổ biến ở người cao tuổi như tim mạch, tăng huyết áp, đái tháo đường type 2 và rối loạn lipid máu. Đây là tín hiệu tích cực cho danh mục ETC của Davipharm, đặc biệt các sản phẩm PECHAUNOX (Perindopril+Amlodipin), RAVASTEL (Rosuvastatin), TABAREX (Valsartan), HATLOP (Irbesartan) và EIMLER-10 (Empagliflozin).</w:t>
+      </w:r>
+    </w:p>
+    <w:p>
+      <w:pPr>
+        <w:spacing w:before="20" w:after="40"/>
+        <w:ind w:left="170"/>
+      </w:pPr>
+      <w:r>
+        <w:rPr>
+          <w:rFonts w:ascii="Calibri" w:hAnsi="Calibri"/>
+          <w:b/>
+          <w:i w:val="0"/>
+          <w:color w:val="166534"/>
+          <w:sz w:val="17"/>
+        </w:rPr>
+        <w:t>🟢 Sự phát triển của BV Thống Nhất thành trung tâm lão khoa mở ra cơ hội gia tăng đấu thầu và tiêu thụ dài hạn cho nhóm tim mạch–đái tháo đường của Davipharm tại TP.HCM.</w:t>
+      </w:r>
+    </w:p>
+    <w:tbl>
+      <w:tblPr>
+        <w:tblStyle w:val="TableGrid"/>
+        <w:tblW w:type="auto" w:w="0"/>
+        <w:tblLook w:firstColumn="1" w:firstRow="1" w:lastColumn="0" w:lastRow="0" w:noHBand="0" w:noVBand="1" w:val="04A0"/>
+      </w:tblPr>
+      <w:tblGrid>
+        <w:gridCol w:w="9072"/>
+      </w:tblGrid>
+      <w:tr>
+        <w:tc>
+          <w:tcPr>
+            <w:tcW w:type="dxa" w:w="9072"/>
+            <w:shd w:val="clear" w:color="auto" w:fill="F8FAFC"/>
+            <w:tcBorders>
+              <w:top w:val="none" w:sz="6" w:color="auto"/>
+              <w:bottom w:val="none" w:sz="6" w:color="auto"/>
+              <w:left w:val="single" w:sz="12" w:color="003B71"/>
+              <w:right w:val="none" w:sz="6" w:color="auto"/>
+            </w:tcBorders>
+          </w:tcPr>
+          <w:p>
+            <w:pPr>
+              <w:spacing w:before="60" w:after="60"/>
+              <w:ind w:left="142"/>
+            </w:pPr>
+            <w:r>
+              <w:rPr>
+                <w:rFonts w:ascii="Calibri" w:hAnsi="Calibri"/>
+                <w:b/>
+                <w:i w:val="0"/>
+                <w:color w:val="003B71"/>
+                <w:sz w:val="17"/>
+              </w:rPr>
+              <w:t xml:space="preserve">Strategy  </w:t>
+            </w:r>
+            <w:r>
+              <w:rPr>
+                <w:rFonts w:ascii="Calibri" w:hAnsi="Calibri"/>
+                <w:b w:val="0"/>
+                <w:i w:val="0"/>
+                <w:color w:val="334155"/>
+                <w:sz w:val="17"/>
+              </w:rPr>
+              <w:t>Team Sales ETC &amp; Market Access cần ưu tiên tiếp cận hội đồng thuốc BV Thống Nhất trong chu kỳ thầu tiếp theo, đặc biệt đẩy mạnh hồ sơ năng lực cho PECHAUNOX, RAVASTEL, EIMLER-10 và ZLATKO (Sitagliptin) nhắm vào phác đồ điều trị bệnh nhân lão khoa mạn tính — khuyến nghị lên kế hoạch trong Q3/2025.</w:t>
+            </w:r>
+          </w:p>
+        </w:tc>
+      </w:tr>
+    </w:tbl>
+    <w:p>
+      <w:pPr>
+        <w:spacing w:before="40" w:after="120"/>
+      </w:pPr>
+    </w:p>
+    <w:tbl>
+      <w:tblPr>
+        <w:tblStyle w:val="TableGrid"/>
+        <w:tblW w:type="auto" w:w="0"/>
+        <w:jc w:val="left"/>
+        <w:tblLook w:firstColumn="1" w:firstRow="1" w:lastColumn="0" w:lastRow="0" w:noHBand="0" w:noVBand="1" w:val="04A0"/>
+      </w:tblPr>
+      <w:tblGrid>
+        <w:gridCol w:w="4536"/>
+        <w:gridCol w:w="4536"/>
+      </w:tblGrid>
+      <w:tr>
+        <w:tc>
+          <w:tcPr>
+            <w:tcW w:type="dxa" w:w="1984"/>
+            <w:shd w:val="clear" w:color="auto" w:fill="EEF2FF"/>
+            <w:tcBorders>
+              <w:top w:val="none" w:sz="6" w:color="auto"/>
+              <w:bottom w:val="none" w:sz="6" w:color="auto"/>
+              <w:left w:val="none" w:sz="6" w:color="auto"/>
+              <w:right w:val="none" w:sz="6" w:color="auto"/>
+            </w:tcBorders>
+          </w:tcPr>
+          <w:p>
+            <w:pPr>
+              <w:spacing w:before="80" w:after="80"/>
+              <w:ind w:left="85"/>
+            </w:pPr>
+            <w:r>
+              <w:rPr>
+                <w:rFonts w:ascii="Calibri" w:hAnsi="Calibri"/>
+                <w:b/>
+                <w:i w:val="0"/>
+                <w:color w:val="4338CA"/>
+                <w:sz w:val="15"/>
+              </w:rPr>
+              <w:t>TUỔI TRẺ – SỨC KHỎE</w:t>
+            </w:r>
+          </w:p>
+        </w:tc>
+        <w:tc>
+          <w:tcPr>
+            <w:tcW w:type="dxa" w:w="4536"/>
+            <w:tcBorders>
+              <w:top w:val="none" w:sz="6" w:color="auto"/>
+              <w:bottom w:val="none" w:sz="6" w:color="auto"/>
+              <w:left w:val="none" w:sz="6" w:color="auto"/>
+              <w:right w:val="none" w:sz="6" w:color="auto"/>
+            </w:tcBorders>
+          </w:tcPr>
+          <w:p>
+            <w:pPr>
+              <w:spacing w:before="60" w:after="60"/>
+              <w:ind w:left="113"/>
+            </w:pPr>
+            <w:r>
+              <w:rPr>
+                <w:rFonts w:ascii="Calibri" w:hAnsi="Calibri"/>
+                <w:b/>
+                <w:i w:val="0"/>
+                <w:color w:val="111827"/>
+                <w:sz w:val="21"/>
+              </w:rPr>
+              <w:t>Hơn 18.000 ca tay chân miệng tại phía Nam — Bùng phát dịch mùa hè 2026</w:t>
+            </w:r>
+          </w:p>
+        </w:tc>
+      </w:tr>
+    </w:tbl>
+    <w:p>
+      <w:pPr>
+        <w:spacing w:before="40" w:after="40"/>
+        <w:ind w:left="170"/>
+      </w:pPr>
+      <w:r>
+        <w:rPr>
+          <w:rFonts w:ascii="Calibri" w:hAnsi="Calibri"/>
+          <w:b w:val="0"/>
+          <w:i/>
+          <w:color w:val="6B7280"/>
+          <w:sz w:val="18"/>
+        </w:rPr>
+        <w:t>Miền Nam ghi nhận hơn 18.000 ca tay chân miệng, chuyên gia đánh giá triển vọng vắc xin mới trong bối cảnh dịch leo thang. Davipharm không có sản phẩm điều trị đặc hiệu tay chân miệng, song bùng phát dịch nhi khoa có thể tăng nhu cầu hỗ trợ điều trị triệu chứng (giảm đau, hạ sốt) tại bệnh viện.</w:t>
+      </w:r>
+    </w:p>
+    <w:p>
+      <w:pPr>
+        <w:spacing w:before="20" w:after="40"/>
+        <w:ind w:left="170"/>
+      </w:pPr>
+      <w:r>
+        <w:rPr>
+          <w:rFonts w:ascii="Calibri" w:hAnsi="Calibri"/>
+          <w:b/>
+          <w:i w:val="0"/>
+          <w:color w:val="374151"/>
+          <w:sz w:val="17"/>
+        </w:rPr>
+        <w:t>📊 Tác động gián tiếp, không đáng kể đến danh mục hiện tại của Davipharm — không có hoạt chất nào trong portfolio trực tiếp phục vụ điều trị tay chân miệng.</w:t>
+      </w:r>
+    </w:p>
+    <w:tbl>
+      <w:tblPr>
+        <w:tblStyle w:val="TableGrid"/>
+        <w:tblW w:type="auto" w:w="0"/>
+        <w:tblLook w:firstColumn="1" w:firstRow="1" w:lastColumn="0" w:lastRow="0" w:noHBand="0" w:noVBand="1" w:val="04A0"/>
+      </w:tblPr>
+      <w:tblGrid>
+        <w:gridCol w:w="9072"/>
+      </w:tblGrid>
+      <w:tr>
+        <w:tc>
+          <w:tcPr>
+            <w:tcW w:type="dxa" w:w="9072"/>
+            <w:shd w:val="clear" w:color="auto" w:fill="F8FAFC"/>
+            <w:tcBorders>
+              <w:top w:val="none" w:sz="6" w:color="auto"/>
+              <w:bottom w:val="none" w:sz="6" w:color="auto"/>
+              <w:left w:val="single" w:sz="12" w:color="003B71"/>
+              <w:right w:val="none" w:sz="6" w:color="auto"/>
+            </w:tcBorders>
+          </w:tcPr>
+          <w:p>
+            <w:pPr>
+              <w:spacing w:before="60" w:after="60"/>
+              <w:ind w:left="142"/>
+            </w:pPr>
+            <w:r>
+              <w:rPr>
+                <w:rFonts w:ascii="Calibri" w:hAnsi="Calibri"/>
+                <w:b/>
+                <w:i w:val="0"/>
+                <w:color w:val="003B71"/>
+                <w:sz w:val="17"/>
+              </w:rPr>
+              <w:t xml:space="preserve">Strategy  </w:t>
+            </w:r>
+            <w:r>
+              <w:rPr>
+                <w:rFonts w:ascii="Calibri" w:hAnsi="Calibri"/>
+                <w:b w:val="0"/>
+                <w:i w:val="0"/>
+                <w:color w:val="334155"/>
+                <w:sz w:val="17"/>
+              </w:rPr>
+              <w:t>Không cần hành động ưu tiên; Medical Affairs có thể theo dõi xu hướng dịch nhi khoa như tín hiệu nền để đánh giá cơ hội mở rộng danh mục nhi khoa trong dài hạn.</w:t>
             </w:r>
           </w:p>
         </w:tc>
@@ -5780,7 +5032,7 @@
                 <w:color w:val="111827"/>
                 <w:sz w:val="18"/>
               </w:rPr>
-              <w:t>Theo dõi phê duyệt cơ sở 2 Bạch Mai/Việt Đức; chuẩn bị hồ sơ thầu RAVASTEL, EIMLER-10, PECHAUNOX, HYYR</w:t>
+              <w:t>Lập danh sách 200+ bệnh viện vệ tinh mới, nộp hồ sơ thầu PECHAUNOX, RAVASTEL, JIRACEK trước Q3/2026</w:t>
             </w:r>
           </w:p>
         </w:tc>
@@ -5808,7 +5060,7 @@
                 <w:color w:val="003B71"/>
                 <w:sz w:val="17"/>
               </w:rPr>
-              <w:t>Sales ETC</w:t>
+              <w:t>Sales / RA</w:t>
             </w:r>
           </w:p>
         </w:tc>
@@ -5836,7 +5088,7 @@
                 <w:color w:val="6B7280"/>
                 <w:sz w:val="17"/>
               </w:rPr>
-              <w:t>Cơ sở 2 Bạch Mai &amp; Việt Đức — đơn vị mua sắm mới</w:t>
+              <w:t>Mở rộng 200 bệnh viện vệ tinh</w:t>
             </w:r>
           </w:p>
         </w:tc>
@@ -5915,7 +5167,7 @@
                 <w:color w:val="111827"/>
                 <w:sz w:val="18"/>
               </w:rPr>
-              <w:t>Tiếp cận Ban Dược cơ sở 2 Bạch Mai (Hà Nam) và Việt Đức (Ninh Bình) để đăng ký danh mục HYYR, LARRIVEY</w:t>
+              <w:t>Ưu tiên tiếp cận hội đồng thuốc BV Thống Nhất cho PECHAUNOX, RAVASTEL, EIMLER-10, ZLATKO trong chu kỳ thầu tới</w:t>
             </w:r>
           </w:p>
         </w:tc>
@@ -5943,7 +5195,7 @@
                 <w:color w:val="003B71"/>
                 <w:sz w:val="17"/>
               </w:rPr>
-              <w:t>Sales ETC</w:t>
+              <w:t>Sales / Marketing</w:t>
             </w:r>
           </w:p>
         </w:tc>
@@ -5971,7 +5223,7 @@
                 <w:color w:val="6B7280"/>
                 <w:sz w:val="17"/>
               </w:rPr>
-              <w:t>Mở rộng ETC ung thư — bệnh viện tuyến trung ương phía Bắc</w:t>
+              <w:t>BV Thống Nhất — trung tâm lão khoa</w:t>
             </w:r>
           </w:p>
         </w:tc>
@@ -6050,7 +5302,7 @@
                 <w:color w:val="111827"/>
                 <w:sz w:val="18"/>
               </w:rPr>
-              <w:t>Theo dõi dịch chuyển mô hình điều trị ung thư thực quản sớm; đánh giá tác động dài hạn đến thầu HYYR</w:t>
+              <w:t>Xây dựng tài liệu khoa học định vị HYYR (Erlotinib) cho bệnh nhân NSCLC phát hiện sớm; rà soát gói thầu ung thư phổi 2026</w:t>
             </w:r>
           </w:p>
         </w:tc>
@@ -6078,7 +5330,7 @@
                 <w:color w:val="003B71"/>
                 <w:sz w:val="17"/>
               </w:rPr>
-              <w:t>Strategy</w:t>
+              <w:t>Marketing / RA</w:t>
             </w:r>
           </w:p>
         </w:tc>
@@ -6106,7 +5358,7 @@
                 <w:color w:val="6B7280"/>
                 <w:sz w:val="17"/>
               </w:rPr>
-              <w:t>Xu hướng phẫu thuật triệt căn ung thư sớm — giảm bệnh nhân dùng nhắm đích</w:t>
+              <w:t>Tầm soát ung thư phổi sớm</w:t>
             </w:r>
           </w:p>
         </w:tc>
@@ -6185,7 +5437,7 @@
                 <w:color w:val="111827"/>
                 <w:sz w:val="18"/>
               </w:rPr>
-              <w:t>&lt;span class="vi-</w:t>
+              <w:t>Chuẩn bị tài liệu MSL/MR nhấn mạnh tuân thủ điều trị dài hạn PECHAUNOX, RAVASTEL, EIMLER-10 phục</w:t>
             </w:r>
           </w:p>
         </w:tc>

</xml_diff>

<commit_message>
Update report_vi.docx 2026-05-13 12:30
</commit_message>
<xml_diff>
--- a/report_vi.docx
+++ b/report_vi.docx
@@ -338,7 +338,7 @@
                 <w:color w:val="111827"/>
                 <w:sz w:val="20"/>
               </w:rPr>
-              <w:t>Tuần 11–17/05/2026: Làn sóng mở rộng hạ tầng y tế (200+ bệnh viện vệ tinh, chính sách tầm soát toàn dân, BV Thống Nhất lão khoa) tạo cơ hội tăng volume đấu thầu ETC cho danh mục tim mạch–đái tháo đường của Davipharm trong các chu kỳ thầu tới.</w:t>
+              <w:t>Tuần 11–17/05/2026: Chính sách khám sức khỏe định kỳ miễn phí toàn dân của Bộ Y tế tạo cú hích lớn nhất cho danh mục tim mạch và đái tháo đường của Davipharm, đúng thời điểm Ngày Tăng huyết áp Thế giới 17/5 và chu kỳ thầu địa phương cận kề.</w:t>
             </w:r>
           </w:p>
         </w:tc>
@@ -406,7 +406,7 @@
                 <w:color w:val="111827"/>
                 <w:sz w:val="17"/>
               </w:rPr>
-              <w:t>▸  Hạ tầng ETC mở rộng:200+ bệnh viện vệ tinh mới = 200+ điểm thầu tiềm năng cho PECHAUNOX, RAVASTEL, TABAREX, ZABALES, JIRACEK tại tuyến tỉnh/huyện.</w:t>
+              <w:t>▸  Sàng lọc toàn dân:Chính sách khám định kỳ miễn phí sẽ mở rộng đáng kể pool bệnh nhân tăng huyết áp, rối loạn lipid máu và tiểu đường — hưởng lợi trực tiếp PECHAUNOX, RAVASTEL, TABAREX, EIMLER-10, ZLATKO tại kênh ETC tuyến huyện/xã.</w:t>
             </w:r>
           </w:p>
           <w:p>
@@ -422,7 +422,7 @@
                 <w:color w:val="111827"/>
                 <w:sz w:val="17"/>
               </w:rPr>
-              <w:t>▸  Phễu bệnh nhân mãn tính:Chính sách khám sức khỏe miễn phí toàn dân + sàng lọc khu công nghiệp phía Bắc sẽ gia tăng bệnh nhân THA, rối loạn lipid, ĐTĐ type 2 mới được chẩn đoán — trực tiếp mở rộng thị trường cho RAVASTEL, EIMLER-10, ZLATKO, PECHAUNOX dài hạn.</w:t>
+              <w:t>▸  Tim mạch — nhu cầu nền vững:25–30% người Việt mắc tăng huyết áp còn bỏ sót và xu hướng trẻ hóa bệnh xương khớp củng cố luận điểm thầu cho PECHAUNOX/HATLOP/TABAREX và MAGRAX trong chu kỳ 2026–2027.</w:t>
             </w:r>
           </w:p>
           <w:p>
@@ -438,23 +438,7 @@
                 <w:color w:val="111827"/>
                 <w:sz w:val="17"/>
               </w:rPr>
-              <w:t>▸  Ung thư phổi &amp; lão khoa:Tầm soát NSCLC mở rộng hỗ trợ volume HYYR (Erlotinib); BV Thống Nhất chuyển hướng lão khoa là cơ hội market access ưu tiên tại TP.HCM cho nhóm tim mạch–ĐTĐ.</w:t>
-            </w:r>
-          </w:p>
-          <w:p>
-            <w:pPr>
-              <w:spacing w:before="20" w:after="60"/>
-              <w:ind w:left="142"/>
-            </w:pPr>
-            <w:r>
-              <w:rPr>
-                <w:rFonts w:ascii="Calibri" w:hAnsi="Calibri"/>
-                <w:b w:val="0"/>
-                <w:i w:val="0"/>
-                <w:color w:val="111827"/>
-                <w:sz w:val="17"/>
-              </w:rPr>
-              <w:t>▸  P1BD &amp;</w:t>
+              <w:t>▸  Tiêu hóa &amp; Ung thư — tín hiệu dài hạn:Nhận thức HP/ung thư dạ dày tăng và mở rộng nội soi tiên tiến tại kênh tư tạo lực đẩy gián tiếp cho JIRACEK, MARTAZ và pipeline oncology HYYR/LARRIVEY, nhưng tác động ngắn hạn còn hạn chế.</w:t>
             </w:r>
           </w:p>
         </w:tc>
@@ -483,22 +467,6 @@
                 <w:sz w:val="17"/>
               </w:rPr>
               <w:t>⚡  HÀNH ĐỘNG ƯU TIÊN</w:t>
-            </w:r>
-          </w:p>
-          <w:p>
-            <w:pPr>
-              <w:spacing w:before="20" w:after="60"/>
-              <w:ind w:left="142"/>
-            </w:pPr>
-            <w:r>
-              <w:rPr>
-                <w:rFonts w:ascii="Calibri" w:hAnsi="Calibri"/>
-                <w:b w:val="0"/>
-                <w:i w:val="0"/>
-                <w:color w:val="0056D2"/>
-                <w:sz w:val="17"/>
-              </w:rPr>
-              <w:t>→  P1BD &amp;</w:t>
             </w:r>
           </w:p>
         </w:tc>
@@ -830,7 +798,7 @@
                 <w:color w:val="166534"/>
                 <w:sz w:val="22"/>
               </w:rPr>
-              <w:t>5</w:t>
+              <w:t>4</w:t>
             </w:r>
           </w:p>
         </w:tc>
@@ -858,7 +826,7 @@
                 <w:color w:val="374151"/>
                 <w:sz w:val="22"/>
               </w:rPr>
-              <w:t>5</w:t>
+              <w:t>6</w:t>
             </w:r>
           </w:p>
         </w:tc>
@@ -1093,7 +1061,7 @@
                 <w:color w:val="4338CA"/>
                 <w:sz w:val="15"/>
               </w:rPr>
-              <w:t>TUỔI TRẺ – SỨC KHỎE</w:t>
+              <w:t>DÂN TRÍ – SỨC KHỎE</w:t>
             </w:r>
           </w:p>
         </w:tc>
@@ -1120,7 +1088,7 @@
                 <w:color w:val="111827"/>
                 <w:sz w:val="21"/>
               </w:rPr>
-              <w:t>Bệnh viện tỉnh Khánh Hòa thiếu phòng điều trị — 3 tháng chưa tìm được giải pháp</w:t>
+              <w:t>Nhận thức ung thư dạ dày tăng — cơ hội cho nhóm thuốc tiêu hóa Davipharm (Esomeprazole, Rabeprazole)</w:t>
             </w:r>
           </w:p>
         </w:tc>
@@ -1139,7 +1107,7 @@
           <w:color w:val="6B7280"/>
           <w:sz w:val="18"/>
         </w:rPr>
-        <w:t>Bệnh viện tỉnh Khánh Hòa đang đối mặt với tình trạng thiếu phòng điều trị kéo dài trên 3 tháng chưa có phương án khắc phục rõ ràng, phản ánh áp lực hạ tầng y tế tại tuyến tỉnh. Tình trạng này có thể kéo theo gián đoạn hoạt động khám chữa bệnh và ảnh hưởng gián tiếp đến khả năng thực hiện hợp đồng/giải ngân thuốc ETC tại địa bàn.</w:t>
+        <w:t>Bài viết từ chuyên gia Bệnh viện Bạch Mai nhấn mạnh mối liên hệ giữa nhiễm HP, viêm dạ dày mạn và nguy cơ ung thư dạ dày, khuyến nghị nội soi sớm — phản ánh xu hướng tăng cầu điều trị tiêu hóa tại kênh bệnh viện. Xu hướng này có thể thúc đẩy tăng sử dụng nhóm thuốc ức chế bơm proton (PPI) trong phác đồ diệt HP và điều trị viêm loét dạ dày, có lợi cho JIRACEK (Esomeprazole) và MARTAZ (Rabeprazole) của Davipharm.</w:t>
       </w:r>
     </w:p>
     <w:p>
@@ -1152,10 +1120,10 @@
           <w:rFonts w:ascii="Calibri" w:hAnsi="Calibri"/>
           <w:b/>
           <w:i w:val="0"/>
-          <w:color w:val="374151"/>
+          <w:color w:val="166534"/>
           <w:sz w:val="17"/>
         </w:rPr>
-        <w:t>⚠️ Tác động hạn chế nhưng cần theo dõi: gián đoạn hạ tầng bệnh viện tỉnh có thể làm chậm giải ngân hợp đồng ETC cho các sản phẩm tim mạch, đái tháo đường của Davipharm tại Khánh Hòa.</w:t>
+        <w:t>📈 Nhận thức HP/ung thư dạ dày tăng cao tạo lực đẩy gián tiếp cho JIRACEK và MARTAZ trong đấu thầu và kê đơn tại bệnh viện tuyến trung ương và tỉnh.</w:t>
       </w:r>
     </w:p>
     <w:tbl>
@@ -1202,7 +1170,7 @@
                 <w:color w:val="334155"/>
                 <w:sz w:val="17"/>
               </w:rPr>
-              <w:t>Team Sales ETC miền Trung rà soát trạng thái hợp đồng và tiến độ giải ngân tại Bệnh viện tỉnh Khánh Hòa trong tháng 5–6/2026, đặc biệt với các sản phẩm PECHAUNOX, RAVASTEL, EIMLER-10; nếu phát hiện rủi ro tồn kho ứ đọng hoặc chậm thanh toán cần báo cáo sớm lên cấp quản lý vùng.</w:t>
+              <w:t>Team Marketing ETC phối hợp Medical Affairs cập nhật tài liệu khoa học về vai trò PPI trong phác đồ diệt HP (triple/quadruple therapy) và trình bày tại hội nghị tiêu hóa Q3/2026; ưu tiên đẩy JIRACEK vào danh mục đấu thầu bệnh viện tuyến trung ương (Bạch Mai, Chợ Rẫy) trong chu kỳ thầu 2026–2027.</w:t>
             </w:r>
           </w:p>
         </w:tc>
@@ -1249,7 +1217,7 @@
                 <w:color w:val="4338CA"/>
                 <w:sz w:val="15"/>
               </w:rPr>
-              <w:t>TUỔI TRẺ – SỨC KHỎE</w:t>
+              <w:t>DÂN TRÍ – SỨC KHỎE</w:t>
             </w:r>
           </w:p>
         </w:tc>
@@ -1276,7 +1244,7 @@
                 <w:color w:val="111827"/>
                 <w:sz w:val="21"/>
               </w:rPr>
-              <w:t>Bộ Y tế cam kết hoàn thiện chế độ đãi ngộ cho y bác sĩ vùng biển đảo</w:t>
+              <w:t>Xác ve sầu (thuyền thoái) bị tạm giữ tại Lạng Sơn — Tín hiệu về nguồn cung dược liệu y học cổ truyền</w:t>
             </w:r>
           </w:p>
         </w:tc>
@@ -1295,7 +1263,7 @@
           <w:color w:val="6B7280"/>
           <w:sz w:val="18"/>
         </w:rPr>
-        <w:t>Thứ trưởng Bộ Y tế cho biết sẽ tham mưu hoàn thiện chính sách đãi ngộ đặc thù cho y bác sĩ công tác tại vùng biển đảo, nhằm thu hút và giữ chân nhân lực y tế tuyến xa. Đây là chính sách nhân sự ngành y tế, không ảnh hưởng trực tiếp đến hoạt động đấu thầu hay danh mục sản phẩm của Davipharm.</w:t>
+        <w:t>Vụ tạm giữ 80kg xác ve sầu khô tại Lạng Sơn cho thấy hoạt động thu gom dược liệu y học cổ truyền từ Trung Quốc đang diễn ra mạnh nhưng thiếu kiểm soát giấy tờ nguồn gốc. Bài viết thuộc phân khúc Đông dược/dược liệu thô, không liên quan trực tiếp đến danh mục generic tân dược của Davipharm.</w:t>
       </w:r>
     </w:p>
     <w:p>
@@ -1311,7 +1279,7 @@
           <w:color w:val="374151"/>
           <w:sz w:val="17"/>
         </w:rPr>
-        <w:t>➖ Tin không liên quan trực tiếp đến Davipharm — không có tác động đến doanh thu ETC hay danh mục generic.</w:t>
+        <w:t>⚪ Không có tác động trực tiếp đến sản phẩm hay hoạt động đấu thầu của Davipharm — theo dõi thụ động.</w:t>
       </w:r>
     </w:p>
     <w:tbl>
@@ -1358,7 +1326,7 @@
                 <w:color w:val="334155"/>
                 <w:sz w:val="17"/>
               </w:rPr>
-              <w:t>Không cần hành động ưu tiên; Market Intelligence team lưu hồ sơ theo dõi chính sách y tế vùng sâu/xa nếu xuất hiện cơ hội mở rộng kênh phân phối tuyến huyện/đảo trong tương lai.</w:t>
+              <w:t>Không cần hành động. Bài không liên quan đến danh mục tim mạch, đái tháo đường, giảm đau hay bất kỳ hoạt chất nào của Davipharm; Market Intelligence ghi nhận và đóng hồ sơ.</w:t>
             </w:r>
           </w:p>
         </w:tc>
@@ -1405,7 +1373,7 @@
                 <w:color w:val="4338CA"/>
                 <w:sz w:val="15"/>
               </w:rPr>
-              <w:t>TUỔI TRẺ – SỨC KHỎE</w:t>
+              <w:t>DÂN TRÍ – SỨC KHỎE</w:t>
             </w:r>
           </w:p>
         </w:tc>
@@ -1432,7 +1400,7 @@
                 <w:color w:val="111827"/>
                 <w:sz w:val="21"/>
               </w:rPr>
-              <w:t>Khám sức khỏe miễn phí hằng năm toàn dân: Cơ hội mở rộng nhu cầu điều trị tim mạch, đái tháo đường</w:t>
+              <w:t>Ngộ độc Lidocaine sau hút mỡ tại phòng khám — áp lực siết chặt quản lý thẩm mỹ xâm lấn</w:t>
             </w:r>
           </w:p>
         </w:tc>
@@ -1451,7 +1419,7 @@
           <w:color w:val="6B7280"/>
           <w:sz w:val="18"/>
         </w:rPr>
-        <w:t>Chính sách khám sức khỏe miễn phí hằng năm cho người dân dự kiến sẽ gia tăng đáng kể tỷ lệ phát hiện sớm các bệnh mãn tính như tim mạch, tăng huyết áp, đái tháo đường và rối loạn lipid máu. Điều này có thể tạo ra làn sóng bệnh nhân mới được chẩn đoán và kê đơn, thúc đẩy nhu cầu dài hạn đối với danh mục tim mạch–chuyển hóa của Davipharm gồm RAVASTEL (Rosuvastatin), PECHAUNOX (Perindopril+Amlodipin), HATLOP (Irbesartan), TABAREX (Valsartan) và EIMLER-10 (Empagliflozin).</w:t>
+        <w:t>Một phụ nữ 53 tuổi ngộ độc Lidocaine nguy kịch sau hút mỡ tại phòng khám TPHCM, phản ánh thực trạng 25.000–35.000 ca biến chứng thẩm mỹ/năm tại Việt Nam từ các cơ sở không phép. Sự kiện này thúc đẩy xu hướng tăng cường chế tài và giám sát phòng khám thẩm mỹ, có thể ảnh hưởng gián tiếp đến nhu cầu thuốc an thần/kiểm soát co giật trong bối cảnh ICU gia tăng tải.</w:t>
       </w:r>
     </w:p>
     <w:p>
@@ -1464,10 +1432,10 @@
           <w:rFonts w:ascii="Calibri" w:hAnsi="Calibri"/>
           <w:b/>
           <w:i w:val="0"/>
-          <w:color w:val="166534"/>
+          <w:color w:val="374151"/>
           <w:sz w:val="17"/>
         </w:rPr>
-        <w:t>📈 Cơ hội trung–dài hạn: chính sách tầm soát toàn dân sẽ mở rộng phễu bệnh nhân mãn tính, trực tiếp hỗ trợ tăng trưởng khối lượng đấu thầu ETC cho nhóm tim mạch và đái tháo đường của Davipharm.</w:t>
+        <w:t>🔍 Tác động gián tiếp và thấp đối với Davipharm — không có sản phẩm nào trong danh mục bị ảnh hưởng trực tiếp, nhưng cần theo dõi nếu xu hướng siết phòng khám dẫn đến thay đổi kênh ETC nhóm thuốc tâm thần/an thần (SERNAL – Risperidone, LAFAXOR – Venlafaxine).</w:t>
       </w:r>
     </w:p>
     <w:tbl>
@@ -1514,7 +1482,7 @@
                 <w:color w:val="334155"/>
                 <w:sz w:val="17"/>
               </w:rPr>
-              <w:t>Marketing &amp; Medical Affairs cần theo dõi phác đồ điều trị được khuyến nghị trong chương trình khám sức khỏe định kỳ (đặc biệt screening lipid, HbA1c, huyết áp) để định vị sớm RAVASTEL, EIMLER-10, ZLATKO (Sitagliptin) và PECHAUNOX trong các tài liệu hỗ trợ bác sĩ; đồng thời phối hợp với Business Development đánh giá khả năng tăng công suất dự phòng cho chu kỳ thầu tiếp theo.</w:t>
+              <w:t>Medical Affairs theo dõi diễn biến chính sách siết phòng khám thẩm mỹ trong Q2–Q3/2026; đánh giá xem liệu làn sóng thanh tra có mở rộng sang phòng khám đa khoa — ảnh hưởng đến kênh phân phối OTC/ETC cho SERNAL và LAFAXOR hay không.</w:t>
             </w:r>
           </w:p>
         </w:tc>
@@ -1561,7 +1529,7 @@
                 <w:color w:val="4338CA"/>
                 <w:sz w:val="15"/>
               </w:rPr>
-              <w:t>TUỔI TRẺ – SỨC KHỎE</w:t>
+              <w:t>DÂN TRÍ – SỨC KHỎE</w:t>
             </w:r>
           </w:p>
         </w:tc>
@@ -1588,7 +1556,7 @@
                 <w:color w:val="111827"/>
                 <w:sz w:val="21"/>
               </w:rPr>
-              <w:t>35.000 ca biến chứng thẩm mỹ/năm — Cảnh báo từ spa "chui" ngoài tầm kiểm soát y tế</w:t>
+              <w:t>Piperin từ hạt tiêu: tác dụng hỗ trợ giảm mỡ, tim mạch và lưu ý tương tác thuốc</w:t>
             </w:r>
           </w:p>
         </w:tc>
@@ -1607,7 +1575,7 @@
           <w:color w:val="6B7280"/>
           <w:sz w:val="18"/>
         </w:rPr>
-        <w:t>Việt Nam ghi nhận khoảng 35.000 ca biến chứng thẩm mỹ mỗi năm, phần lớn xuất phát từ các cơ sở spa không phép, phản ánh nhu cầu điều trị hậu phẫu và xử lý biến chứng (viêm, nhiễm trùng, đau) ngày càng tăng trong hệ thống bệnh viện. Tác động trực tiếp đến Davipharm còn hạn chế, nhưng đây là tín hiệu về nhu cầu tiềm năng với nhóm thuốc kháng viêm–giảm đau và kháng sinh dùng trong điều trị biến chứng.</w:t>
+        <w:t>Bài báo đại chúng phổ biến thông tin về piperin trong hạt tiêu giúp giảm LDL, tăng HDL và hỗ trợ chuyển hóa mỡ — đồng thời cảnh báo piperin có thể ảnh hưởng chuyển hóa thuốc và quá trình đông máu khi dùng liều cao. Thông tin này gián tiếp củng cố nhận thức người dùng về quản lý mỡ máu và tim mạch qua chế độ ăn, có thể ảnh hưởng đến hành vi điều trị bằng thuốc kê đơn như Rosuvastatin (RAVASTEL) và Etoricoxib (MAGRAX).</w:t>
       </w:r>
     </w:p>
     <w:p>
@@ -1623,7 +1591,7 @@
           <w:color w:val="374151"/>
           <w:sz w:val="17"/>
         </w:rPr>
-        <w:t>🔎 Tín hiệu thị trường yếu — nhu cầu điều trị biến chứng thẩm mỹ có thể hỗ trợ nhẹ cho MAGRAX (Etoricoxib) và METILONE-4 (Methylprednisolone) tại kênh bệnh viện, nhưng chưa đủ để thay đổi chiến lược ngắn hạn.</w:t>
+        <w:t>⚪ Tác động hạn chế đến doanh thu ngắn hạn, nhưng xu hướng tự điều trị bằng thực phẩm tự nhiên cần được Marketing theo dõi trong dài hạn, đặc biệt với phân khúc bệnh nhân mỡ máu OTC/ETC.</w:t>
       </w:r>
     </w:p>
     <w:tbl>
@@ -1670,7 +1638,7 @@
                 <w:color w:val="334155"/>
                 <w:sz w:val="17"/>
               </w:rPr>
-              <w:t>Team Marketing ETC theo dõi xu hướng điều trị biến chứng hậu thẩm mỹ (viêm, đau) tại các bệnh viện da liễu và phẫu thuật thẩm mỹ — đánh giá khả năng đưa MAGRAX và METILONE-4 vào danh mục thầu tại phân khúc này trong chu kỳ thầu tiếp theo.</w:t>
+              <w:t>Team Marketing nên theo dõi xu hướng truyền thông "thực phẩm thay thuốc" để chuẩn bị tài liệu giáo dục HCP nhấn mạnh vai trò không thể thay thế của Rosuvastatin (RAVASTEL) trong kiểm soát LDL theo guideline; lưu ý tương tác piperin–thuốc kê đơn có thể được khai thác trong MedEd cho bác sĩ kê MAGRAX (Etoricoxib) và ZABALES (Clopidogrel).</w:t>
             </w:r>
           </w:p>
         </w:tc>
@@ -1717,7 +1685,7 @@
                 <w:color w:val="4338CA"/>
                 <w:sz w:val="15"/>
               </w:rPr>
-              <w:t>TUỔI TRẺ – SỨC KHỎE</w:t>
+              <w:t>DÂN TRÍ – SỨC KHỎE</w:t>
             </w:r>
           </w:p>
         </w:tc>
@@ -1744,7 +1712,7 @@
                 <w:color w:val="111827"/>
                 <w:sz w:val="21"/>
               </w:rPr>
-              <w:t>Hàng nghìn công nhân tại khu công nghiệp phía Bắc được khám sức khỏe miễn phí</w:t>
+              <w:t>Bộ Y tế ban hành hướng dẫn khám sức khỏe định kỳ miễn phí toàn dân từ 2026 — cơ hội sàng lọc bệnh tim mạch, tiểu đường</w:t>
             </w:r>
           </w:p>
         </w:tc>
@@ -1763,7 +1731,7 @@
           <w:color w:val="6B7280"/>
           <w:sz w:val="18"/>
         </w:rPr>
-        <w:t>Chương trình khám sức khỏe miễn phí quy mô lớn cho công nhân tại các khu công nghiệp phía Bắc phản ánh xu hướng mở rộng chăm sóc sức khỏe cơ bản cho lực lượng lao động công nghiệp — phân khúc dân số đông nhưng ít tiếp cận y tế chính thức. Hoạt động này có thể thúc đẩy nhu cầu phát hiện và điều trị các bệnh mãn tính phổ biến (tim mạch, đái tháo đường, rối loạn tiêu hóa) vốn là thế mạnh danh mục của Davipharm.</w:t>
+        <w:t>Bộ Y tế ban hành hướng dẫn khám sức khỏe định kỳ miễn phí ít nhất 1 lần/năm cho người từ 18 tuổi, bao gồm xét nghiệm đường máu, huyết áp và chụp X-quang tim phổi — trực tiếp tạo làn sóng phát hiện sớm bệnh tăng huyết áp, rối loạn lipid máu và tiểu đường. Chính sách này dự kiến gia tăng đáng kể số bệnh nhân mới được chẩn đoán và đưa vào điều trị, mở rộng thị trường cho các nhóm thuốc tim mạch (Perindopril+Amlodipin, Rosuvastatin, Valsartan) và đái tháo đường (Empagliflozin, Sitagliptin) của Davipharm.</w:t>
       </w:r>
     </w:p>
     <w:p>
@@ -1776,10 +1744,10 @@
           <w:rFonts w:ascii="Calibri" w:hAnsi="Calibri"/>
           <w:b/>
           <w:i w:val="0"/>
-          <w:color w:val="374151"/>
+          <w:color w:val="166534"/>
           <w:sz w:val="17"/>
         </w:rPr>
-        <w:t>📊 Tín hiệu thị trường yếu — tiềm năng tăng nhu cầu dài hạn cho RAVASTEL, EIMLER-10, JIRACEK nhưng chưa có tác động trực tiếp đến đấu thầu hoặc doanh thu ngắn hạn.</w:t>
+        <w:t>🟢 Cơ hội trung-dài hạn rõ ràng: hàng triệu bệnh nhân mới được sàng lọc sẽ gia tăng nhu cầu điều trị bằng PECHAUNOX, RAVASTEL, TABAREX, EIMLER-10 và ZLATKO qua kênh ETC.</w:t>
       </w:r>
     </w:p>
     <w:tbl>
@@ -1826,7 +1794,7 @@
                 <w:color w:val="334155"/>
                 <w:sz w:val="17"/>
               </w:rPr>
-              <w:t>Team Marketing &amp; Medical Affairs theo dõi tần suất và quy mô các chương trình khám sàng lọc tại khu công nghiệp để đánh giá khả năng hợp tác CSR/giới thiệu sản phẩm (RAVASTEL – Rosuvastatin, EIMLER-10 – Empagliflozin) tới bác sĩ phụ trách; không cần hành động khẩn cấp trong Q3/2025.</w:t>
+              <w:t>Marketing &amp; Medical Affairs cần theo dõi sát lộ trình ban hành Nghị định hướng dẫn Luật Phòng bệnh (hiện chưa ban hành) để dự báo thời điểm chính sách có hiệu lực và chuẩn bị tài liệu y khoa (detailing) cho bác sĩ tuyến cơ sở về PECHAUNOX, RAVASTEL, EIMLER-10 ngay khi làn sóng sàng lọc triển khai. Business Development cần đánh giá khả năng mở rộng danh mục vào gói thầu BHYT tuyến huyện/xã song song với đợt khám sàng lọc đại trà, dự kiến Q3-Q4/2026.&lt;/p</w:t>
             </w:r>
           </w:p>
         </w:tc>
@@ -1873,7 +1841,7 @@
                 <w:color w:val="4338CA"/>
                 <w:sz w:val="15"/>
               </w:rPr>
-              <w:t>TUỔI TRẺ – SỨC KHỎE</w:t>
+              <w:t>DÂN TRÍ – SỨC KHỎE</w:t>
             </w:r>
           </w:p>
         </w:tc>
@@ -1900,7 +1868,7 @@
                 <w:color w:val="111827"/>
                 <w:sz w:val="21"/>
               </w:rPr>
-              <w:t>Sàng lọc ung thư phổi sớm: Xu hướng chẩn đoán mở rộng thị trường điều trị đích</w:t>
+              <w:t>90% người dân Việt gặp vấn đề răng miệng — Tín hiệu thị trường ngoài danh mục Davipharm</w:t>
             </w:r>
           </w:p>
         </w:tc>
@@ -1919,7 +1887,7 @@
           <w:color w:val="6B7280"/>
           <w:sz w:val="18"/>
         </w:rPr>
-        <w:t>Bài viết giới thiệu phương pháp sàng lọc và phát hiện ung thư phổi từ giai đoạn rất sớm, phản ánh xu hướng đẩy mạnh tầm soát ung thư tại Việt Nam. Việc phát hiện sớm ung thư phổi gia tăng sẽ mở rộng nhóm bệnh nhân có thể tiếp cận điều trị đích như Erlotinib — hoạt chất của HYYR (Davipharm).</w:t>
+        <w:t>Hội nghị Nha khoa Châu Á-Thái Bình Dương lần thứ 47 tại Hà Nội công bố tỷ lệ bệnh răng miệng ở mức báo động: 90% dân số có vấn đề, 60% người trưởng thành bị viêm lợi/quanh răng, 79% người cao tuổi mất răng. Danh mục Davipharm hiện không có sản phẩm nào trong phân khúc nha khoa/kháng khuẩn miệng, nên tín hiệu thị trường này không tạo tác động doanh thu trực tiếp.</w:t>
       </w:r>
     </w:p>
     <w:p>
@@ -1932,10 +1900,10 @@
           <w:rFonts w:ascii="Calibri" w:hAnsi="Calibri"/>
           <w:b/>
           <w:i w:val="0"/>
-          <w:color w:val="166534"/>
+          <w:color w:val="374151"/>
           <w:sz w:val="17"/>
         </w:rPr>
-        <w:t>📈 Tầm soát ung thư phổi mở rộng → gia tăng bệnh nhân NSCLC điều trị đích → cơ hội tăng khối lượng đấu thầu HYYR (Erlotinib) tại kênh ETC bệnh viện.</w:t>
+        <w:t>➖ Thông tin nền về gánh nặng bệnh tật; không có sản phẩm Davipharm nào được hưởng lợi trực tiếp trong ngắn hạn.</w:t>
       </w:r>
     </w:p>
     <w:tbl>
@@ -1982,7 +1950,7 @@
                 <w:color w:val="334155"/>
                 <w:sz w:val="17"/>
               </w:rPr>
-              <w:t>Team Medical Affairs &amp; Marketing Ung thư cần chuẩn bị tài liệu khoa học hỗ trợ HYYR (Erlotinib) liên kết với xu hướng phát hiện sớm NSCLC; phối hợp với team Đấu thầu rà soát danh mục bệnh viện tuyến tỉnh/trung ương có khả năng mở gói thầu thuốc ung thư phổi trong chu kỳ 2025–2026.</w:t>
+              <w:t>Không cần hành động ưu tiên. Business Development có thể ghi nhận như tín hiệu dài hạn nếu Davipharm cân nhắc mở rộng danh mục sang kháng sinh/kháng viêm dạng bào chế chuyên dụng cho nha khoa (ví dụ: Metronidazole, Amoxicillin đóng gói nha khoa) trong chu kỳ pipeline 3–5 năm tới.</w:t>
             </w:r>
           </w:p>
         </w:tc>
@@ -2029,7 +1997,7 @@
                 <w:color w:val="4338CA"/>
                 <w:sz w:val="15"/>
               </w:rPr>
-              <w:t>TUỔI TRẺ – SỨC KHỎE</w:t>
+              <w:t>DÂN TRÍ – SỨC KHỎE</w:t>
             </w:r>
           </w:p>
         </w:tc>
@@ -2056,7 +2024,7 @@
                 <w:color w:val="111827"/>
                 <w:sz w:val="21"/>
               </w:rPr>
-              <w:t>Mở rộng ít nhất 200 bệnh viện vệ tinh toàn quốc — cơ hội mở rộng kênh ETC tuyến dưới</w:t>
+              <w:t>Bộ Y tế đề xuất chính sách đãi ngộ đặc thù cho y tế biển đảo Trường Sa</w:t>
             </w:r>
           </w:p>
         </w:tc>
@@ -2075,7 +2043,7 @@
           <w:color w:val="6B7280"/>
           <w:sz w:val="18"/>
         </w:rPr>
-        <w:t>Chính phủ thúc đẩy mở rộng mạng lưới bệnh viện vệ tinh thêm tối thiểu 200 cơ sở trên toàn quốc, tăng cường năng lực khám chữa bệnh tuyến tỉnh/huyện. Điều này trực tiếp mở rộng số lượng cơ sở y tế tham gia đấu thầu thuốc, đặc biệt có lợi cho danh mục tim mạch (PECHAUNOX, RAVASTEL, TABAREX, ZABALES) và tiêu hóa (JIRACEK) vốn có nhu cầu cao ở tuyến cơ sở.</w:t>
+        <w:t>Bộ Y tế sẽ tham mưu Chính phủ hoàn thiện khung pháp lý về chế độ đãi ngộ đặc thù cho y tế hải đảo sau chuyến thị sát Trường Sa (4–10/5), đồng thời hỗ trợ thiết bị y tế và cơ số thuốc trị giá ~3,3 tỷ đồng cho các đảo. Đây là tín hiệu cho thấy Nhà nước đang đầu tư mở rộng năng lực y tế tuyến cơ sở vùng xa, song không trực tiếp liên quan đến cơ chế đấu thầu hay danh mục thuốc ETC.</w:t>
       </w:r>
     </w:p>
     <w:p>
@@ -2088,10 +2056,10 @@
           <w:rFonts w:ascii="Calibri" w:hAnsi="Calibri"/>
           <w:b/>
           <w:i w:val="0"/>
-          <w:color w:val="166534"/>
+          <w:color w:val="374151"/>
           <w:sz w:val="17"/>
         </w:rPr>
-        <w:t>🟢 Cơ hội tăng volume đấu thầu ETC địa phương — 200+ điểm thầu mới tiềm năng cho các sản phẩm tim mạch và tiêu hóa của Davipharm.</w:t>
+        <w:t>➖ Không có tác động trực tiếp đến doanh thu hay danh mục ETC của Davipharm; y tế biển đảo do quân y (Bộ Quốc phòng) quản lý, nằm ngoài kênh đấu thầu dân sự.</w:t>
       </w:r>
     </w:p>
     <w:tbl>
@@ -2138,7 +2106,7 @@
                 <w:color w:val="334155"/>
                 <w:sz w:val="17"/>
               </w:rPr>
-              <w:t>Team Business Development &amp; Tender phối hợp với Medical Affairs lập danh sách các bệnh viện vệ tinh mới được công nhận, ưu tiên tiếp cận sớm cho PECHAUNOX, RAVASTEL và JIRACEK trước khi chu kỳ thầu địa phương tiếp theo mở (Q3–Q4/2025); đồng thời chuẩn bị hồ sơ năng lực GMP/BE để đáp ứng yêu cầu xét duyệt nhà thầu của các cơ sở mới.</w:t>
+              <w:t>Không cần hành động tức thời; team Government Affairs có thể theo dõi khung pháp lý đãi ngộ y tế hải đảo để đánh giá xem có mở ra kênh cung ứng thuốc thiết yếu (generic cơ bản) cho Bộ Quốc phòng trong dài hạn hay không.</w:t>
             </w:r>
           </w:p>
         </w:tc>
@@ -2185,7 +2153,7 @@
                 <w:color w:val="4338CA"/>
                 <w:sz w:val="15"/>
               </w:rPr>
-              <w:t>TUỔI TRẺ – SỨC KHỎE</w:t>
+              <w:t>DÂN TRÍ – SỨC KHỎE</w:t>
             </w:r>
           </w:p>
         </w:tc>
@@ -2212,7 +2180,7 @@
                 <w:color w:val="111827"/>
                 <w:sz w:val="21"/>
               </w:rPr>
-              <w:t>Xu hướng điều trị tăng huyết áp: Kiểm soát toàn diện vượt ra ngoài hạn chế muối</w:t>
+              <w:t>Tăng huyết áp bỏ sót ở hàng triệu người Việt — Cơ hội cho danh mục tim mạch Davipharm</w:t>
             </w:r>
           </w:p>
         </w:tc>
@@ -2231,7 +2199,7 @@
           <w:color w:val="6B7280"/>
           <w:sz w:val="18"/>
         </w:rPr>
-        <w:t>Truyền thông sức khỏe đại chúng đang nhấn mạnh kiểm soát huyết áp toàn diện (chế độ ăn, vận động, stress) thay vì chỉ giảm muối, phản ánh xu hướng bệnh nhân tăng huyết áp ngày càng nhận thức cao hơn về điều trị lâu dài. Điều này gián tiếp thúc đẩy nhu cầu dùng thuốc kiểm soát huyết áp bền vững trong nhóm bệnh nhân mãn tính — phân khúc cốt lõi của PECHAUNOX (Perindopril+Amlodipin), TABAREX (Valsartan), HATLOP (Irbesartan).</w:t>
+        <w:t>25–30% người trưởng thành Việt Nam (hàng chục triệu người) mắc tăng huyết áp nhưng tỷ lệ chẩn đoán và tuân thủ điều trị vẫn thấp, xu hướng trẻ hóa bệnh đang mở rộng pool bệnh nhân dài hạn. Điều này trực tiếp hỗ trợ nhu cầu thị trường cho PECHAUNOX (Perindopril+Amlodipin) và TABAREX/HATLOP (Valsartan/Irbesartan) — các sản phẩm phối hợp liều cố định đang được khuyến khích trong điều trị chuẩn hóa.</w:t>
       </w:r>
     </w:p>
     <w:p>
@@ -2247,7 +2215,7 @@
           <w:color w:val="166534"/>
           <w:sz w:val="17"/>
         </w:rPr>
-        <w:t>📈 Nhận thức điều trị tăng huyết áp dài hạn gia tăng củng cố nhu cầu ổn định cho danh mục tim mạch Davipharm, đặc biệt PECHAUNOX và TABAREX trong kênh ETC.</w:t>
+        <w:t>🟢 Nhu cầu điều trị tăng huyết áp dài hạn và xu hướng dùng thuốc phối hợp liều cố định tạo cơ hội mở rộng thị phần ETC/OTC cho PECHAUNOX, TABAREX và HATLOP.</w:t>
       </w:r>
     </w:p>
     <w:tbl>
@@ -2294,7 +2262,7 @@
                 <w:color w:val="334155"/>
                 <w:sz w:val="17"/>
               </w:rPr>
-              <w:t>Team Marketing có thể khai thác nội dung truyền thông này để xây dựng tài liệu hỗ trợ trình dược viên (MSL/MR) tại bệnh viện, nhấn mạnh vai trò tuân thủ điều trị thuốc hạ áp phối hợp (PECHAUNOX) bên cạnh thay đổi lối sống — đặc biệt hữu ích trong chu kỳ chuẩn bị thầu ETC tiếp theo.</w:t>
+              <w:t>Team Marketing &amp; Medical Affairs cần tận dụng Ngày Tăng huyết áp Thế giới 17/5 để đẩy mạnh hoạt động medical education tại bệnh viện, nhấn mạnh lợi ích tuân thủ điều trị với thuốc phối hợp (PECHAUNOX, TABAREX, HATLOP); đồng thời Team Sales ETC ưu tiên tiếp cận các cơ sở y tế ban đầu — nơi tầm soát và kê đơn lần đầu cho bệnh nhân chưa được chẩn đoán, trước chu kỳ đấu thầu địa phương tiếp theo.</w:t>
             </w:r>
           </w:p>
         </w:tc>
@@ -2341,7 +2309,7 @@
                 <w:color w:val="4338CA"/>
                 <w:sz w:val="15"/>
               </w:rPr>
-              <w:t>TUỔI TRẺ – SỨC KHỎE</w:t>
+              <w:t>DÂN TRÍ – SỨC KHỎE</w:t>
             </w:r>
           </w:p>
         </w:tc>
@@ -2368,7 +2336,7 @@
                 <w:color w:val="111827"/>
                 <w:sz w:val="21"/>
               </w:rPr>
-              <w:t>BV Thống Nhất phát triển thành Trung tâm Lão khoa hàng đầu — Cơ hội mở rộng danh mục tim mạch &amp; đái tháo đường</w:t>
+              <w:t>Xu hướng bệnh cơ xương khớp trẻ hóa &amp; Y học tái tạo — cơ hội cho Etoricoxib (MAGRAX)</w:t>
             </w:r>
           </w:p>
         </w:tc>
@@ -2387,7 +2355,7 @@
           <w:color w:val="6B7280"/>
           <w:sz w:val="18"/>
         </w:rPr>
-        <w:t>Bệnh viện Thống Nhất (TP.HCM) đang định vị trở thành trung tâm lão khoa hàng đầu, đồng nghĩa với việc gia tăng nhu cầu điều trị dài hạn các bệnh lý mạn tính phổ biến ở người cao tuổi như tim mạch, tăng huyết áp, đái tháo đường type 2 và rối loạn lipid máu. Đây là tín hiệu tích cực cho danh mục ETC của Davipharm, đặc biệt các sản phẩm PECHAUNOX (Perindopril+Amlodipin), RAVASTEL (Rosuvastatin), TABAREX (Valsartan), HATLOP (Irbesartan) và EIMLER-10 (Empagliflozin).</w:t>
+        <w:t>Tọa đàm tại BV Hồng Ngọc (Dân Trí, 12/05/2026) ghi nhận bệnh thoái hóa khớp đang trẻ hóa nhanh — nhóm ngoài 30 tuổi ngày càng phổ biến — và cảnh báo tình trạng tự mua thuốc giảm đau, chống viêm không kê đơn kéo dài. Đây mở rộng pool bệnh nhân tiềm năng cho MAGRAX (Etoricoxib), đồng thời xu hướng giảm phụ thuộc NSAID truyền thống tạo lợi thế cho Etoricoxib là COX-2 chọn lọc có profil an toàn tiêu hóa tốt hơn.</w:t>
       </w:r>
     </w:p>
     <w:p>
@@ -2403,7 +2371,7 @@
           <w:color w:val="166534"/>
           <w:sz w:val="17"/>
         </w:rPr>
-        <w:t>🟢 Sự phát triển của BV Thống Nhất thành trung tâm lão khoa mở ra cơ hội gia tăng đấu thầu và tiêu thụ dài hạn cho nhóm tim mạch–đái tháo đường của Davipharm tại TP.HCM.</w:t>
+        <w:t>🟢 Cơ hội: nhu cầu điều trị xương khớp mở rộng sang nhóm tuổi trẻ hơn củng cố luận điểm thầu và detailing cho MAGRAX (Etoricoxib) tại các khoa Cơ xương khớp, Nội tổng quát bệnh viện tuyến quận/huyện và bệnh viện tư.</w:t>
       </w:r>
     </w:p>
     <w:tbl>
@@ -2450,7 +2418,7 @@
                 <w:color w:val="334155"/>
                 <w:sz w:val="17"/>
               </w:rPr>
-              <w:t>Team Sales ETC &amp; Market Access cần ưu tiên tiếp cận hội đồng thuốc BV Thống Nhất trong chu kỳ thầu tiếp theo, đặc biệt đẩy mạnh hồ sơ năng lực cho PECHAUNOX, RAVASTEL, EIMLER-10 và ZLATKO (Sitagliptin) nhắm vào phác đồ điều trị bệnh nhân lão khoa mạn tính — khuyến nghị lên kế hoạch trong Q3/2025.</w:t>
+              <w:t>Marketing &amp; Medical Affairs cập nhật messaging cho MAGRAX nhấn mạnh profil an toàn COX-2 so với NSAID không chọn lọc, nhắm vào nhóm bệnh nhân trẻ tuổi hoạt động thể thao; Sales team ETC ưu tiên detailing tại BV có khoa Cơ xương khớp và phòng khám thể thao trong Q3/2026, trước chu kỳ thầu địa phương cuối năm.</w:t>
             </w:r>
           </w:p>
         </w:tc>
@@ -2497,7 +2465,7 @@
                 <w:color w:val="4338CA"/>
                 <w:sz w:val="15"/>
               </w:rPr>
-              <w:t>TUỔI TRẺ – SỨC KHỎE</w:t>
+              <w:t>DÂN TRÍ – SỨC KHỎE</w:t>
             </w:r>
           </w:p>
         </w:tc>
@@ -2524,7 +2492,7 @@
                 <w:color w:val="111827"/>
                 <w:sz w:val="21"/>
               </w:rPr>
-              <w:t>Hơn 18.000 ca tay chân miệng tại phía Nam — Bùng phát dịch mùa hè 2026</w:t>
+              <w:t>Xu hướng nội soi phóng đại cấp độ tế bào trong tầm soát ung thư tiêu hóa tại Việt Nam</w:t>
             </w:r>
           </w:p>
         </w:tc>
@@ -2543,7 +2511,7 @@
           <w:color w:val="6B7280"/>
           <w:sz w:val="18"/>
         </w:rPr>
-        <w:t>Miền Nam ghi nhận hơn 18.000 ca tay chân miệng, chuyên gia đánh giá triển vọng vắc xin mới trong bối cảnh dịch leo thang. Davipharm không có sản phẩm điều trị đặc hiệu tay chân miệng, song bùng phát dịch nhi khoa có thể tăng nhu cầu hỗ trợ điều trị triệu chứng (giảm đau, hạ sốt) tại bệnh viện.</w:t>
+        <w:t>Công nghệ nội soi Endocyto 520x (Olympus) đang được triển khai tại Thu Cúc TCI, cho phép phát hiện tổn thương ung thư tiêu hóa ở cấp độ tế bào — đánh dấu sự chuyển dịch sang chẩn đoán sớm chuyên sâu tại kênh bệnh viện tư. Xu hướng này gián tiếp thúc đẩy nhu cầu điều trị ung thư đường tiêu hóa, mở rộng thị trường tiềm năng cho danh mục ung thư của Davipharm (HYYR – Erlotinib, LARRIVEY – Bicalutamide) tại kênh ETC.</w:t>
       </w:r>
     </w:p>
     <w:p>
@@ -2559,7 +2527,7 @@
           <w:color w:val="374151"/>
           <w:sz w:val="17"/>
         </w:rPr>
-        <w:t>📊 Tác động gián tiếp, không đáng kể đến danh mục hiện tại của Davipharm — không có hoạt chất nào trong portfolio trực tiếp phục vụ điều trị tay chân miệng.</w:t>
+        <w:t>📡 Tín hiệu dài hạn tích cực: phát hiện sớm ung thư tiêu hóa nhiều hơn có thể làm tăng pool bệnh nhân cho HYYR và LARRIVEY, nhưng tác động ngắn hạn lên doanh thu ETC còn hạn chế.</w:t>
       </w:r>
     </w:p>
     <w:tbl>
@@ -2606,7 +2574,7 @@
                 <w:color w:val="334155"/>
                 <w:sz w:val="17"/>
               </w:rPr>
-              <w:t>Không cần hành động ưu tiên; Medical Affairs có thể theo dõi xu hướng dịch nhi khoa như tín hiệu nền để đánh giá cơ hội mở rộng danh mục nhi khoa trong dài hạn.</w:t>
+              <w:t>Team Medical Affairs phối hợp với team ETC Sales theo dõi sự mở rộng của mạng lưới nội soi tiên tiến (Thu Cúc TCI và tương đương) để định vị HYYR (Erlotinib) và LARRIVEY (Bicalutamide) trong danh mục điều trị sớm tại các bệnh viện/phòng khám tư áp dụng công nghệ tầm soát mới; đánh giá cơ hội listing sản phẩm trong chu kỳ thầu tiếp theo.</w:t>
             </w:r>
           </w:p>
         </w:tc>
@@ -5032,7 +5000,7 @@
                 <w:color w:val="111827"/>
                 <w:sz w:val="18"/>
               </w:rPr>
-              <w:t>Lập danh sách 200+ bệnh viện vệ tinh mới, nộp hồ sơ thầu PECHAUNOX, RAVASTEL, JIRACEK trước Q3/2026</w:t>
+              <w:t>Chuẩn bị hồ sơ thầu PECHAUNOX, TABAREX, EIMLER-10, ZLATKO cho gói BHYT tuyến huyện/xã Q3–Q4/2026 theo làn sóng khám sàng lọc miễn phí Bộ Y tế</w:t>
             </w:r>
           </w:p>
         </w:tc>
@@ -5060,7 +5028,7 @@
                 <w:color w:val="003B71"/>
                 <w:sz w:val="17"/>
               </w:rPr>
-              <w:t>Sales / RA</w:t>
+              <w:t>Sales / Strategy</w:t>
             </w:r>
           </w:p>
         </w:tc>
@@ -5088,7 +5056,7 @@
                 <w:color w:val="6B7280"/>
                 <w:sz w:val="17"/>
               </w:rPr>
-              <w:t>Mở rộng 200 bệnh viện vệ tinh</w:t>
+              <w:t>Chính sách khám sức khỏe định kỳ miễn phí toàn dân 2026</w:t>
             </w:r>
           </w:p>
         </w:tc>
@@ -5167,7 +5135,7 @@
                 <w:color w:val="111827"/>
                 <w:sz w:val="18"/>
               </w:rPr>
-              <w:t>Ưu tiên tiếp cận hội đồng thuốc BV Thống Nhất cho PECHAUNOX, RAVASTEL, EIMLER-10, ZLATKO trong chu kỳ thầu tới</w:t>
+              <w:t>Kích hoạt Medical Education cho PECHAUNOX, HATLOP tại cơ sở y tế ban đầu nhân Ngày Tăng huyết áp Thế giới 17/5</w:t>
             </w:r>
           </w:p>
         </w:tc>
@@ -5195,7 +5163,7 @@
                 <w:color w:val="003B71"/>
                 <w:sz w:val="17"/>
               </w:rPr>
-              <w:t>Sales / Marketing</w:t>
+              <w:t>Marketing / Sales</w:t>
             </w:r>
           </w:p>
         </w:tc>
@@ -5223,7 +5191,7 @@
                 <w:color w:val="6B7280"/>
                 <w:sz w:val="17"/>
               </w:rPr>
-              <w:t>BV Thống Nhất — trung tâm lão khoa</w:t>
+              <w:t>Tăng huyết áp bỏ sót hàng triệu người Việt</w:t>
             </w:r>
           </w:p>
         </w:tc>
@@ -5302,7 +5270,7 @@
                 <w:color w:val="111827"/>
                 <w:sz w:val="18"/>
               </w:rPr>
-              <w:t>Xây dựng tài liệu khoa học định vị HYYR (Erlotinib) cho bệnh nhân NSCLC phát hiện sớm; rà soát gói thầu ung thư phổi 2026</w:t>
+              <w:t>Cập nhật messaging MAGRAX (Etoricoxib) — COX-2 vs NSAID — detailing khoa Cơ xương khớp trước thầu cuối năm Q3/2026</w:t>
             </w:r>
           </w:p>
         </w:tc>
@@ -5330,7 +5298,7 @@
                 <w:color w:val="003B71"/>
                 <w:sz w:val="17"/>
               </w:rPr>
-              <w:t>Marketing / RA</w:t>
+              <w:t>Marketing / Sales</w:t>
             </w:r>
           </w:p>
         </w:tc>
@@ -5358,7 +5326,7 @@
                 <w:color w:val="6B7280"/>
                 <w:sz w:val="17"/>
               </w:rPr>
-              <w:t>Tầm soát ung thư phổi sớm</w:t>
+              <w:t>Bệnh cơ xương khớp trẻ hóa — xu hướng COX-2 chọn lọc</w:t>
             </w:r>
           </w:p>
         </w:tc>
@@ -5395,7 +5363,7 @@
         <w:tc>
           <w:tcPr>
             <w:tcW w:type="dxa" w:w="454"/>
-            <w:shd w:val="clear" w:color="auto" w:fill="DCFCE7"/>
+            <w:shd w:val="clear" w:color="auto" w:fill="FEF3C7"/>
             <w:tcBorders>
               <w:top w:val="none" w:sz="6" w:color="auto"/>
               <w:bottom w:val="none" w:sz="6" w:color="auto"/>
@@ -5409,7 +5377,7 @@
               <w:jc w:val="center"/>
             </w:pPr>
             <w:r>
-              <w:t>🟢</w:t>
+              <w:t>🟡</w:t>
             </w:r>
           </w:p>
         </w:tc>
@@ -5437,7 +5405,7 @@
                 <w:color w:val="111827"/>
                 <w:sz w:val="18"/>
               </w:rPr>
-              <w:t>Chuẩn bị tài liệu MSL/MR nhấn mạnh tuân thủ điều trị dài hạn PECHAUNOX, RAVASTEL, EIMLER-10 phục</w:t>
+              <w:t>Xây dựng tài liệu Medical Affairs về vai trò PPI trong phác đồ diệt HP — đẩy JIRACEK vào danh mục thầu Bạch Mai, Chợ Rẫy 2026–2027</w:t>
             </w:r>
           </w:p>
         </w:tc>
@@ -5465,6 +5433,7 @@
                 <w:color w:val="003B71"/>
                 <w:sz w:val="17"/>
               </w:rPr>
+              <w:t>Marketing / Sales</w:t>
             </w:r>
           </w:p>
         </w:tc>
@@ -5492,13 +5461,14 @@
                 <w:color w:val="6B7280"/>
                 <w:sz w:val="17"/>
               </w:rPr>
+              <w:t>Nhận thức HP/ung thư dạ dày tăng — cơ hội PPI</w:t>
             </w:r>
           </w:p>
         </w:tc>
         <w:tc>
           <w:tcPr>
             <w:tcW w:type="dxa" w:w="1644"/>
-            <w:shd w:val="clear" w:color="auto" w:fill="DCFCE7"/>
+            <w:shd w:val="clear" w:color="auto" w:fill="FEF3C7"/>
             <w:tcBorders>
               <w:top w:val="none" w:sz="6" w:color="auto"/>
               <w:bottom w:val="none" w:sz="6" w:color="auto"/>
@@ -5516,9 +5486,10 @@
                 <w:rFonts w:ascii="Calibri" w:hAnsi="Calibri"/>
                 <w:b/>
                 <w:i w:val="0"/>
-                <w:color w:val="22C55E"/>
+                <w:color w:val="D97706"/>
                 <w:sz w:val="17"/>
               </w:rPr>
+              <w:t>🟡 Trung</w:t>
             </w:r>
           </w:p>
         </w:tc>

</xml_diff>

<commit_message>
Update report_vi.docx 2026-05-13 12:31
</commit_message>
<xml_diff>
--- a/report_vi.docx
+++ b/report_vi.docx
@@ -338,7 +338,7 @@
                 <w:color w:val="111827"/>
                 <w:sz w:val="20"/>
               </w:rPr>
-              <w:t>Tuần 11–17/05/2026: Chính sách khám sức khỏe định kỳ miễn phí toàn dân của Bộ Y tế tạo cú hích lớn nhất cho danh mục tim mạch và đái tháo đường của Davipharm, đúng thời điểm Ngày Tăng huyết áp Thế giới 17/5 và chu kỳ thầu địa phương cận kề.</w:t>
+              <w:t>Tuần 11–17/05/2026: Chính sách khám sức khỏe định kỳ miễn phí toàn dân và làn sóng nhận thức bệnh mạn tính tạo ra tailwind dài hạn mạnh nhất từ trước đến nay cho danh mục tim mạch–đái tháo đường–tiêu hóa–ung thư của Davipharm — không có rủi ro pháp lý trực tiếp trong tuần.</w:t>
             </w:r>
           </w:p>
         </w:tc>
@@ -406,7 +406,7 @@
                 <w:color w:val="111827"/>
                 <w:sz w:val="17"/>
               </w:rPr>
-              <w:t>▸  Sàng lọc toàn dân:Chính sách khám định kỳ miễn phí sẽ mở rộng đáng kể pool bệnh nhân tăng huyết áp, rối loạn lipid máu và tiểu đường — hưởng lợi trực tiếp PECHAUNOX, RAVASTEL, TABAREX, EIMLER-10, ZLATKO tại kênh ETC tuyến huyện/xã.</w:t>
+              <w:t>▸  Sàng lọc toàn dân (MoH):Chính sách khám miễn phí 1 lần/năm từ 2026 sẽ mở rộng đáng kể phễu bệnh nhân mới cho RAVASTEL, EIMLER-10, ZLATKO, PECHAUNOX, TABAREX và HATLOP — tác động lớn nhất đến volume ETC tuyến huyện.</w:t>
             </w:r>
           </w:p>
           <w:p>
@@ -422,7 +422,7 @@
                 <w:color w:val="111827"/>
                 <w:sz w:val="17"/>
               </w:rPr>
-              <w:t>▸  Tim mạch — nhu cầu nền vững:25–30% người Việt mắc tăng huyết áp còn bỏ sót và xu hướng trẻ hóa bệnh xương khớp củng cố luận điểm thầu cho PECHAUNOX/HATLOP/TABAREX và MAGRAX trong chu kỳ 2026–2027.</w:t>
+              <w:t>▸  Tăng huyết áp bỏ sót:25–30% người Việt mắc THA chưa được kiểm soát và xu hướng trẻ hóa củng cố vị thế PECHAUNOX (FDC) như lựa chọn ưu tiên trước chu kỳ thầu tiếp theo.</w:t>
             </w:r>
           </w:p>
           <w:p>
@@ -438,7 +438,7 @@
                 <w:color w:val="111827"/>
                 <w:sz w:val="17"/>
               </w:rPr>
-              <w:t>▸  Tiêu hóa &amp; Ung thư — tín hiệu dài hạn:Nhận thức HP/ung thư dạ dày tăng và mở rộng nội soi tiên tiến tại kênh tư tạo lực đẩy gián tiếp cho JIRACEK, MARTAZ và pipeline oncology HYYR/LARRIVEY, nhưng tác động ngắn hạn còn hạn chế.</w:t>
+              <w:t>▸  Ung thư tiêu hóa + HP:Nội soi siêu phóng đại mở rộng và nhận thức HP/ung thư dạ dày tăng đồng thời thúc đẩy nhu cầu trung hạn cho cả HYYR/LARRIVEY (ung thư) lẫn JIRACEK/MARTAZ (PPI), đặc biệt tại bệnh viện tuyến trung ương.</w:t>
             </w:r>
           </w:p>
         </w:tc>
@@ -1088,7 +1088,7 @@
                 <w:color w:val="111827"/>
                 <w:sz w:val="21"/>
               </w:rPr>
-              <w:t>Nhận thức ung thư dạ dày tăng — cơ hội cho nhóm thuốc tiêu hóa Davipharm (Esomeprazole, Rabeprazole)</w:t>
+              <w:t>Nhận thức về ung thư dạ dày &amp; HP tăng cao — Tín hiệu cho nhóm thuốc tiêu hóa (Esomeprazole, Rabeprazole)</w:t>
             </w:r>
           </w:p>
         </w:tc>
@@ -1107,7 +1107,7 @@
           <w:color w:val="6B7280"/>
           <w:sz w:val="18"/>
         </w:rPr>
-        <w:t>Bài viết từ chuyên gia Bệnh viện Bạch Mai nhấn mạnh mối liên hệ giữa nhiễm HP, viêm dạ dày mạn và nguy cơ ung thư dạ dày, khuyến nghị nội soi sớm — phản ánh xu hướng tăng cầu điều trị tiêu hóa tại kênh bệnh viện. Xu hướng này có thể thúc đẩy tăng sử dụng nhóm thuốc ức chế bơm proton (PPI) trong phác đồ diệt HP và điều trị viêm loét dạ dày, có lợi cho JIRACEK (Esomeprazole) và MARTAZ (Rabeprazole) của Davipharm.</w:t>
+        <w:t>Bài tư vấn y tế trên Dân Trí (Bệnh viện Bạch Mai) nhấn mạnh vai trò của vi khuẩn HP trong chuỗi tiến triển viêm dạ dày → ung thư, đồng thời khuyến nghị nội soi sớm và kiểm soát bệnh lý tiêu hóa mạn tính — phản ánh xu hướng gia tăng nhu cầu điều trị PPI dài hạn tại Việt Nam. Đây là tín hiệu thị trường thuận lợi cho JIRACEK (Esomeprazole) và MARTAZ (Rabeprazole) trong phân khúc bệnh nhân có bệnh lý dạ dày mạn tính tại kênh ETC và OPD.</w:t>
       </w:r>
     </w:p>
     <w:p>
@@ -1123,7 +1123,7 @@
           <w:color w:val="166534"/>
           <w:sz w:val="17"/>
         </w:rPr>
-        <w:t>📈 Nhận thức HP/ung thư dạ dày tăng cao tạo lực đẩy gián tiếp cho JIRACEK và MARTAZ trong đấu thầu và kê đơn tại bệnh viện tuyến trung ương và tỉnh.</w:t>
+        <w:t>📈 Nhận thức HP &amp; ung thư dạ dày tăng thúc đẩy nhu cầu PPI dài hạn — cơ hội tăng trưởng kê đơn cho JIRACEK và MARTAZ tại bệnh viện tuyến trung ương và tỉnh.</w:t>
       </w:r>
     </w:p>
     <w:tbl>
@@ -1170,7 +1170,7 @@
                 <w:color w:val="334155"/>
                 <w:sz w:val="17"/>
               </w:rPr>
-              <w:t>Team Marketing ETC phối hợp Medical Affairs cập nhật tài liệu khoa học về vai trò PPI trong phác đồ diệt HP (triple/quadruple therapy) và trình bày tại hội nghị tiêu hóa Q3/2026; ưu tiên đẩy JIRACEK vào danh mục đấu thầu bệnh viện tuyến trung ương (Bạch Mai, Chợ Rẫy) trong chu kỳ thầu 2026–2027.</w:t>
+              <w:t>Medical Team phối hợp với Sales ETC chuẩn bị tài liệu detailing nhấn mạnh vai trò PPI trong phác đồ diệt HP (phối hợp kháng sinh + PPI) và dự phòng tái phát loét; ưu tiên tiếp cận các khoa Tiêu hóa–Gan mật tại bệnh viện tuyến trung ương (Bạch Mai, Chợ Rẫy, Huế) trong Q2–Q3/2026 để định vị JIRACEK và MARTAZ trước chu kỳ thầu tiếp theo.</w:t>
             </w:r>
           </w:p>
         </w:tc>
@@ -1244,7 +1244,7 @@
                 <w:color w:val="111827"/>
                 <w:sz w:val="21"/>
               </w:rPr>
-              <w:t>Xác ve sầu (thuyền thoái) bị tạm giữ tại Lạng Sơn — Tín hiệu về nguồn cung dược liệu y học cổ truyền</w:t>
+              <w:t>Xác ve sầu (thuyền thoái) bị tạm giữ tại Lạng Sơn — Tín hiệu thị trường dược liệu cổ truyền</w:t>
             </w:r>
           </w:p>
         </w:tc>
@@ -1263,7 +1263,7 @@
           <w:color w:val="6B7280"/>
           <w:sz w:val="18"/>
         </w:rPr>
-        <w:t>Vụ tạm giữ 80kg xác ve sầu khô tại Lạng Sơn cho thấy hoạt động thu gom dược liệu y học cổ truyền từ Trung Quốc đang diễn ra mạnh nhưng thiếu kiểm soát giấy tờ nguồn gốc. Bài viết thuộc phân khúc Đông dược/dược liệu thô, không liên quan trực tiếp đến danh mục generic tân dược của Davipharm.</w:t>
+        <w:t>Quản lý thị trường Lạng Sơn tạm giữ 80kg xác ve sầu khô do không có giấy tờ nguồn gốc, phản ánh nhu cầu nguyên liệu y học cổ truyền đang tăng mạnh với giá thu mua 1,2–1,7 triệu đồng/kg. Bài viết thuộc phân khúc dược liệu cổ truyền/YHCT, không liên quan trực tiếp đến danh mục generic tân dược của Davipharm.</w:t>
       </w:r>
     </w:p>
     <w:p>
@@ -1279,7 +1279,7 @@
           <w:color w:val="374151"/>
           <w:sz w:val="17"/>
         </w:rPr>
-        <w:t>⚪ Không có tác động trực tiếp đến sản phẩm hay hoạt động đấu thầu của Davipharm — theo dõi thụ động.</w:t>
+        <w:t>⚪ Không có tác động trực tiếp đến Davipharm — bài nằm ngoài vùng cạnh tranh của danh mục generic tân dược hiện tại.</w:t>
       </w:r>
     </w:p>
     <w:tbl>
@@ -1326,7 +1326,7 @@
                 <w:color w:val="334155"/>
                 <w:sz w:val="17"/>
               </w:rPr>
-              <w:t>Không cần hành động. Bài không liên quan đến danh mục tim mạch, đái tháo đường, giảm đau hay bất kỳ hoạt chất nào của Davipharm; Market Intelligence ghi nhận và đóng hồ sơ.</w:t>
+              <w:t>Không cần hành động. Market Intelligence team lưu hồ sơ như tham chiếu nền về xu hướng tiêu dùng YHCT tại Việt Nam; không ưu tiên theo dõi thêm.</w:t>
             </w:r>
           </w:p>
         </w:tc>
@@ -1400,7 +1400,7 @@
                 <w:color w:val="111827"/>
                 <w:sz w:val="21"/>
               </w:rPr>
-              <w:t>Ngộ độc Lidocaine sau hút mỡ tại phòng khám — áp lực siết chặt quản lý thẩm mỹ xâm lấn</w:t>
+              <w:t>Ngộ độc Lidocaine sau hút mỡ tại phòng khám TPHCM — áp lực siết chặt quản lý cơ sở thẩm mỹ "chui"</w:t>
             </w:r>
           </w:p>
         </w:tc>
@@ -1419,7 +1419,7 @@
           <w:color w:val="6B7280"/>
           <w:sz w:val="18"/>
         </w:rPr>
-        <w:t>Một phụ nữ 53 tuổi ngộ độc Lidocaine nguy kịch sau hút mỡ tại phòng khám TPHCM, phản ánh thực trạng 25.000–35.000 ca biến chứng thẩm mỹ/năm tại Việt Nam từ các cơ sở không phép. Sự kiện này thúc đẩy xu hướng tăng cường chế tài và giám sát phòng khám thẩm mỹ, có thể ảnh hưởng gián tiếp đến nhu cầu thuốc an thần/kiểm soát co giật trong bối cảnh ICU gia tăng tải.</w:t>
+        <w:t>Một phụ nữ 53 tuổi hôn mê nặng sau hút mỡ tại phòng khám TPHCM do ngộ độc Lidocaine, sự việc được báo cáo lên Sở Y tế; hội thảo an toàn thẩm mỹ ngày 12/5 ghi nhận 25.000–35.000 ca biến chứng/năm và kêu gọi tăng chế tài với cơ sở vi phạm. Đây không phải sản phẩm Davipharm gây ra sự cố, nhưng làn sóng thanh tra sắp tới có thể thắt chặt điều kiện kê đơn/sử dụng các thuốc gây tê-giảm đau tại cơ sở ngoại trú — phân khúc liên quan đến MAGRAX (Etoricoxib) và METILONE-4 (Methylprednisolone) trong phác đồ hậu phẫu thuật thẩm mỹ.</w:t>
       </w:r>
     </w:p>
     <w:p>
@@ -1435,7 +1435,7 @@
           <w:color w:val="374151"/>
           <w:sz w:val="17"/>
         </w:rPr>
-        <w:t>🔍 Tác động gián tiếp và thấp đối với Davipharm — không có sản phẩm nào trong danh mục bị ảnh hưởng trực tiếp, nhưng cần theo dõi nếu xu hướng siết phòng khám dẫn đến thay đổi kênh ETC nhóm thuốc tâm thần/an thần (SERNAL – Risperidone, LAFAXOR – Venlafaxine).</w:t>
+        <w:t>⚠️ Tác động gián tiếp, mức độ thấp: xu hướng siết quản lý phòng khám thẩm mỹ tư nhân có thể làm giảm lượng kê đơn MAGRAX/METILONE-4 tại kênh OPD thẩm mỹ nếu nhiều cơ sở bị đình chỉ hoạt động.</w:t>
       </w:r>
     </w:p>
     <w:tbl>
@@ -1482,7 +1482,7 @@
                 <w:color w:val="334155"/>
                 <w:sz w:val="17"/>
               </w:rPr>
-              <w:t>Medical Affairs theo dõi diễn biến chính sách siết phòng khám thẩm mỹ trong Q2–Q3/2026; đánh giá xem liệu làn sóng thanh tra có mở rộng sang phòng khám đa khoa — ảnh hưởng đến kênh phân phối OTC/ETC cho SERNAL và LAFAXOR hay không.</w:t>
+              <w:t>Team Medical Affairs theo dõi diễn biến chính sách từ Sở Y tế TPHCM và Bộ Y tế liên quan đến quản lý cơ sở thẩm mỹ trong Q2/2026; nếu có nghị định/thông tư siết điều kiện hoạt động phòng khám, Sales team cần đánh giá lại dự báo doanh thu MAGRAX và METILONE-4 tại kênh phòng kh</w:t>
             </w:r>
           </w:p>
         </w:tc>
@@ -1556,7 +1556,7 @@
                 <w:color w:val="111827"/>
                 <w:sz w:val="21"/>
               </w:rPr>
-              <w:t>Piperin từ hạt tiêu: tác dụng hỗ trợ giảm mỡ, tim mạch và lưu ý tương tác thuốc</w:t>
+              <w:t>Piperin trong hạt tiêu: tác dụng hỗ trợ tim mạch, chuyển hóa mỡ và lưu ý tương tác thuốc</w:t>
             </w:r>
           </w:p>
         </w:tc>
@@ -1575,7 +1575,7 @@
           <w:color w:val="6B7280"/>
           <w:sz w:val="18"/>
         </w:rPr>
-        <w:t>Bài báo đại chúng phổ biến thông tin về piperin trong hạt tiêu giúp giảm LDL, tăng HDL và hỗ trợ chuyển hóa mỡ — đồng thời cảnh báo piperin có thể ảnh hưởng chuyển hóa thuốc và quá trình đông máu khi dùng liều cao. Thông tin này gián tiếp củng cố nhận thức người dùng về quản lý mỡ máu và tim mạch qua chế độ ăn, có thể ảnh hưởng đến hành vi điều trị bằng thuốc kê đơn như Rosuvastatin (RAVASTEL) và Etoricoxib (MAGRAX).</w:t>
+        <w:t>Bài viết khoa học phổ thông ghi nhận piperin trong hạt tiêu có khả năng cải thiện lipid máu (giảm LDL, tăng HDL) và hỗ trợ chuyển hóa năng lượng, song cảnh báo piperin có thể ảnh hưởng chuyển hóa thuốc qua gan và quá trình đông máu — đặc biệt quan trọng với bệnh nhân dùng thuốc chống đông hoặc thuốc tim mạch dài hạn. Thông tin này không tác động trực tiếp đến hoạt động đấu thầu của Davipharm, nhưng phản ánh xu hướng người dùng quan tâm đến giải pháp hỗ trợ tim mạch–lipid tự nhiên song song với dược phẩm.</w:t>
       </w:r>
     </w:p>
     <w:p>
@@ -1591,7 +1591,7 @@
           <w:color w:val="374151"/>
           <w:sz w:val="17"/>
         </w:rPr>
-        <w:t>⚪ Tác động hạn chế đến doanh thu ngắn hạn, nhưng xu hướng tự điều trị bằng thực phẩm tự nhiên cần được Marketing theo dõi trong dài hạn, đặc biệt với phân khúc bệnh nhân mỡ máu OTC/ETC.</w:t>
+        <w:t>➖ Tác động trực tiếp đến Davipharm không đáng kể; tuy nhiên cảnh báo tương tác piperin–thuốc tim mạch có thể được khai thác trong nội dung y tế hỗ trợ bán hàng cho RAVASTEL (Rosuvastatin) và ZABALES (Clopidogrel).</w:t>
       </w:r>
     </w:p>
     <w:tbl>
@@ -1638,7 +1638,7 @@
                 <w:color w:val="334155"/>
                 <w:sz w:val="17"/>
               </w:rPr>
-              <w:t>Team Marketing nên theo dõi xu hướng truyền thông "thực phẩm thay thuốc" để chuẩn bị tài liệu giáo dục HCP nhấn mạnh vai trò không thể thay thế của Rosuvastatin (RAVASTEL) trong kiểm soát LDL theo guideline; lưu ý tương tác piperin–thuốc kê đơn có thể được khai thác trong MedEd cho bác sĩ kê MAGRAX (Etoricoxib) và ZABALES (Clopidogrel).</w:t>
+              <w:t>Team Medical Affairs có thể tích hợp thông tin tương tác piperin vào tài liệu đào tạo trình dược viên cho nhóm tim mạch (RAVASTEL, ZABALES, PECHAUNOX) nhằm củng cố lập luận về tầm quan trọng của thuốc kê đơn kiểm soát lipid so với giải pháp tự nhiên; thực hiện trong vòng 1 tháng như nội dung bổ trợ định kỳ.</w:t>
             </w:r>
           </w:p>
         </w:tc>
@@ -1712,7 +1712,7 @@
                 <w:color w:val="111827"/>
                 <w:sz w:val="21"/>
               </w:rPr>
-              <w:t>Bộ Y tế ban hành hướng dẫn khám sức khỏe định kỳ miễn phí toàn dân từ 2026 — cơ hội sàng lọc bệnh tim mạch, tiểu đường</w:t>
+              <w:t>Bộ Y tế ban hành hướng dẫn khám sức khỏe định kỳ miễn phí toàn dân từ 2026 — cơ hội sàng lọc bệnh mạn tính</w:t>
             </w:r>
           </w:p>
         </w:tc>
@@ -1731,7 +1731,7 @@
           <w:color w:val="6B7280"/>
           <w:sz w:val="18"/>
         </w:rPr>
-        <w:t>Bộ Y tế ban hành hướng dẫn khám sức khỏe định kỳ miễn phí ít nhất 1 lần/năm cho người từ 18 tuổi, bao gồm xét nghiệm đường máu, huyết áp và chụp X-quang tim phổi — trực tiếp tạo làn sóng phát hiện sớm bệnh tăng huyết áp, rối loạn lipid máu và tiểu đường. Chính sách này dự kiến gia tăng đáng kể số bệnh nhân mới được chẩn đoán và đưa vào điều trị, mở rộng thị trường cho các nhóm thuốc tim mạch (Perindopril+Amlodipin, Rosuvastatin, Valsartan) và đái tháo đường (Empagliflozin, Sitagliptin) của Davipharm.</w:t>
+        <w:t>Bộ Y tế ban hành hướng dẫn khám sức khỏe định kỳ miễn phí ít nhất 1 lần/năm cho toàn dân từ 18 tuổi, bao gồm xét nghiệm đường máu, sinh hóa tim mạch và chụp X-quang — gói cơ bản đủ để sàng lọc tiểu đường và tim mạch ở quy mô dân số. Chính sách này kỳ vọng gia tăng đáng kể số ca phát hiện mới cao huyết áp, rối loạn lipid máu và đái tháo đường — các chỉ định điều trị trực tiếp của RAVASTEL (Rosuvastatin), EIMLER-10 (Empagliflozin), ZLATKO (Sitagliptin), PECHAUNOX, TABAREX, HATLOP.</w:t>
       </w:r>
     </w:p>
     <w:p>
@@ -1747,7 +1747,7 @@
           <w:color w:val="166534"/>
           <w:sz w:val="17"/>
         </w:rPr>
-        <w:t>🟢 Cơ hội trung-dài hạn rõ ràng: hàng triệu bệnh nhân mới được sàng lọc sẽ gia tăng nhu cầu điều trị bằng PECHAUNOX, RAVASTEL, TABAREX, EIMLER-10 và ZLATKO qua kênh ETC.</w:t>
+        <w:t>🟢 Sàng lọc đại trà sẽ mở rộng phễu bệnh nhân mới cho nhóm tim mạch và đái tháo đường — tác động thuận chiều lên nhu cầu dài hạn với RAVASTEL, EIMLER-10, ZLATKO, PECHAUNOX trong kênh ETC.</w:t>
       </w:r>
     </w:p>
     <w:tbl>
@@ -1794,7 +1794,7 @@
                 <w:color w:val="334155"/>
                 <w:sz w:val="17"/>
               </w:rPr>
-              <w:t>Marketing &amp; Medical Affairs cần theo dõi sát lộ trình ban hành Nghị định hướng dẫn Luật Phòng bệnh (hiện chưa ban hành) để dự báo thời điểm chính sách có hiệu lực và chuẩn bị tài liệu y khoa (detailing) cho bác sĩ tuyến cơ sở về PECHAUNOX, RAVASTEL, EIMLER-10 ngay khi làn sóng sàng lọc triển khai. Business Development cần đánh giá khả năng mở rộng danh mục vào gói thầu BHYT tuyến huyện/xã song song với đợt khám sàng lọc đại trà, dự kiến Q3-Q4/2026.&lt;/p</w:t>
+              <w:t>Team Marketing &amp; Medical Affairs cần theo dõi lộ trình ban hành Nghị định hướng dẫn Luật Phòng bệnh (dự kiến 2026) để xác định thời điểm chính sách có hiệu lực thực tế; đồng thời chuẩn bị tài liệu y khoa hỗ trợ kê đơn sau sàng lọc cho RAVASTEL, EIMLER-10 và ZLATKO, ưu tiên tuyến huyện — nơi sẽ tiếp nhận lượng lớn ca chẩn đoán mới.</w:t>
             </w:r>
           </w:p>
         </w:tc>
@@ -1868,7 +1868,7 @@
                 <w:color w:val="111827"/>
                 <w:sz w:val="21"/>
               </w:rPr>
-              <w:t>90% người dân Việt gặp vấn đề răng miệng — Tín hiệu thị trường ngoài danh mục Davipharm</w:t>
+              <w:t>90% người dân Việt có vấn đề răng miệng — Thị trường nha khoa mở rộng, không liên quan danh mục Davipharm</w:t>
             </w:r>
           </w:p>
         </w:tc>
@@ -1887,7 +1887,7 @@
           <w:color w:val="6B7280"/>
           <w:sz w:val="18"/>
         </w:rPr>
-        <w:t>Hội nghị Nha khoa Châu Á-Thái Bình Dương lần thứ 47 tại Hà Nội công bố tỷ lệ bệnh răng miệng ở mức báo động: 90% dân số có vấn đề, 60% người trưởng thành bị viêm lợi/quanh răng, 79% người cao tuổi mất răng. Danh mục Davipharm hiện không có sản phẩm nào trong phân khúc nha khoa/kháng khuẩn miệng, nên tín hiệu thị trường này không tạo tác động doanh thu trực tiếp.</w:t>
+        <w:t>Hội nghị Nha khoa Châu Á–Thái Bình Dương lần thứ 47 tại Hà Nội công bố 90% người dân Việt có vấn đề răng miệng, Bộ Y tế định hướng đẩy mạnh dự phòng và điều trị chuyên sâu trong lĩnh vực nha khoa. Davipharm hiện không có sản phẩm nào trong danh mục răng–hàm–mặt, nên sự kiện này không tạo tác động trực tiếp đến doanh thu hay hoạt động đấu thầu.</w:t>
       </w:r>
     </w:p>
     <w:p>
@@ -1903,7 +1903,7 @@
           <w:color w:val="374151"/>
           <w:sz w:val="17"/>
         </w:rPr>
-        <w:t>➖ Thông tin nền về gánh nặng bệnh tật; không có sản phẩm Davipharm nào được hưởng lợi trực tiếp trong ngắn hạn.</w:t>
+        <w:t>⚪ Không liên quan đến danh mục chiến lược của Davipharm — theo dõi thụ động, không cần hành động ưu tiên.</w:t>
       </w:r>
     </w:p>
     <w:tbl>
@@ -1950,7 +1950,7 @@
                 <w:color w:val="334155"/>
                 <w:sz w:val="17"/>
               </w:rPr>
-              <w:t>Không cần hành động ưu tiên. Business Development có thể ghi nhận như tín hiệu dài hạn nếu Davipharm cân nhắc mở rộng danh mục sang kháng sinh/kháng viêm dạng bào chế chuyên dụng cho nha khoa (ví dụ: Metronidazole, Amoxicillin đóng gói nha khoa) trong chu kỳ pipeline 3–5 năm tới.</w:t>
+              <w:t>Không có hành động ngắn hạn cần thiết; Business Development có thể ghi nhận xu hướng mở rộng thị trường nha khoa như tín hiệu dài hạn nếu công ty cân nhắc mở rộng danh mục OTC chăm sóc miệng trong tương lai.</w:t>
             </w:r>
           </w:p>
         </w:tc>
@@ -2024,7 +2024,7 @@
                 <w:color w:val="111827"/>
                 <w:sz w:val="21"/>
               </w:rPr>
-              <w:t>Bộ Y tế đề xuất chính sách đãi ngộ đặc thù cho y tế biển đảo Trường Sa</w:t>
+              <w:t>Bộ Y tế đề xuất đãi ngộ đặc thù cho y tế tuyến đảo — Tín hiệu củng cố y tế cơ sở vùng xa</w:t>
             </w:r>
           </w:p>
         </w:tc>
@@ -2043,7 +2043,7 @@
           <w:color w:val="6B7280"/>
           <w:sz w:val="18"/>
         </w:rPr>
-        <w:t>Bộ Y tế sẽ tham mưu Chính phủ hoàn thiện khung pháp lý về chế độ đãi ngộ đặc thù cho y tế hải đảo sau chuyến thị sát Trường Sa (4–10/5), đồng thời hỗ trợ thiết bị y tế và cơ số thuốc trị giá ~3,3 tỷ đồng cho các đảo. Đây là tín hiệu cho thấy Nhà nước đang đầu tư mở rộng năng lực y tế tuyến cơ sở vùng xa, song không trực tiếp liên quan đến cơ chế đấu thầu hay danh mục thuốc ETC.</w:t>
+        <w:t>Thứ trưởng Bộ Y tế Trần Văn Thuấn công bố kế hoạch tham mưu Chính phủ hoàn thiện khung pháp lý đãi ngộ đặc thù cho y tế hải đảo sau chuyến khảo sát Trường Sa (4–10/5/2026), đồng thời hỗ trợ 3,3 tỷ đồng thiết bị y tế và cơ số thuốc cho 7 đảo. Tin tức này phản ánh định hướng tăng cường năng lực y tế cơ sở vùng xa, không tác động trực tiếp đến danh mục ETC hay đấu thầu của Davipharm.</w:t>
       </w:r>
     </w:p>
     <w:p>
@@ -2059,7 +2059,7 @@
           <w:color w:val="374151"/>
           <w:sz w:val="17"/>
         </w:rPr>
-        <w:t>➖ Không có tác động trực tiếp đến doanh thu hay danh mục ETC của Davipharm; y tế biển đảo do quân y (Bộ Quốc phòng) quản lý, nằm ngoài kênh đấu thầu dân sự.</w:t>
+        <w:t>➖ Bài không liên quan trực tiếp đến sản phẩm hay kênh phân phối của Davipharm; không phát sinh cơ hội hay rủi ro tức thời.</w:t>
       </w:r>
     </w:p>
     <w:tbl>
@@ -2106,7 +2106,7 @@
                 <w:color w:val="334155"/>
                 <w:sz w:val="17"/>
               </w:rPr>
-              <w:t>Không cần hành động tức thời; team Government Affairs có thể theo dõi khung pháp lý đãi ngộ y tế hải đảo để đánh giá xem có mở ra kênh cung ứng thuốc thiết yếu (generic cơ bản) cho Bộ Quốc phòng trong dài hạn hay không.</w:t>
+              <w:t>Không cần hành động ưu tiên. Team Government Affairs có thể theo dõi động thái hoàn thiện khung pháp lý đãi ngộ y tế đảo — nếu dẫn đến mở rộng danh mục thuốc cấp phát tuyến cơ sở (bao gồm tim mạch, đái tháo đường), cân nhắc đăng ký sản phẩm như RAVASTEL, ZLATKO vào các gói cung ứng thuốc quốc phòng/đặc thù trong tương lai.</w:t>
             </w:r>
           </w:p>
         </w:tc>
@@ -2180,7 +2180,7 @@
                 <w:color w:val="111827"/>
                 <w:sz w:val="21"/>
               </w:rPr>
-              <w:t>Tăng huyết áp bỏ sót ở hàng triệu người Việt — Cơ hội cho danh mục tim mạch Davipharm</w:t>
+              <w:t>Tăng huyết áp bỏ sót ở hàng triệu người Việt — Cơ hội mở rộng thị trường thuốc tim mạch (Perindopril+Amlodipin, Valsartan, Irbesartan)</w:t>
             </w:r>
           </w:p>
         </w:tc>
@@ -2199,7 +2199,7 @@
           <w:color w:val="6B7280"/>
           <w:sz w:val="18"/>
         </w:rPr>
-        <w:t>25–30% người trưởng thành Việt Nam (hàng chục triệu người) mắc tăng huyết áp nhưng tỷ lệ chẩn đoán và tuân thủ điều trị vẫn thấp, xu hướng trẻ hóa bệnh đang mở rộng pool bệnh nhân dài hạn. Điều này trực tiếp hỗ trợ nhu cầu thị trường cho PECHAUNOX (Perindopril+Amlodipin) và TABAREX/HATLOP (Valsartan/Irbesartan) — các sản phẩm phối hợp liều cố định đang được khuyến khích trong điều trị chuẩn hóa.</w:t>
+        <w:t>Chuyên gia Hội Tim mạch học Việt Nam cảnh báo 25–30% người trưởng thành Việt Nam mắc tăng huyết áp nhưng tỷ lệ chẩn đoán và kiểm soát đạt mục tiêu vẫn thấp, xu hướng bệnh ngày càng trẻ hóa và nhu cầu thuốc phối hợp liều cố định tăng cao. Đây là tín hiệu tăng trưởng dài hạn trực tiếp cho nhóm sản phẩm PECHAUNOX (Perindopril+Amlodipin), TABAREX (Valsartan) và HATLOP (Irbesartan) của Davipharm tại cả kênh ETC lẫn OTC.</w:t>
       </w:r>
     </w:p>
     <w:p>
@@ -2215,7 +2215,7 @@
           <w:color w:val="166534"/>
           <w:sz w:val="17"/>
         </w:rPr>
-        <w:t>🟢 Nhu cầu điều trị tăng huyết áp dài hạn và xu hướng dùng thuốc phối hợp liều cố định tạo cơ hội mở rộng thị phần ETC/OTC cho PECHAUNOX, TABAREX và HATLOP.</w:t>
+        <w:t>📈 Cơ hội tăng trưởng rõ ràng: pool bệnh nhân tăng huyết áp chưa được điều trị còn rất lớn, thuốc phối hợp liều cố định (PECHAUNOX) được chuyên gia khuyến nghị là hướng điều trị ưu tiên — trực tiếp hỗ trợ positioning và tăng volume đấu thầu ETC chu kỳ tới.</w:t>
       </w:r>
     </w:p>
     <w:tbl>
@@ -2262,7 +2262,7 @@
                 <w:color w:val="334155"/>
                 <w:sz w:val="17"/>
               </w:rPr>
-              <w:t>Team Marketing &amp; Medical Affairs cần tận dụng Ngày Tăng huyết áp Thế giới 17/5 để đẩy mạnh hoạt động medical education tại bệnh viện, nhấn mạnh lợi ích tuân thủ điều trị với thuốc phối hợp (PECHAUNOX, TABAREX, HATLOP); đồng thời Team Sales ETC ưu tiên tiếp cận các cơ sở y tế ban đầu — nơi tầm soát và kê đơn lần đầu cho bệnh nhân chưa được chẩn đoán, trước chu kỳ đấu thầu địa phương tiếp theo.</w:t>
+              <w:t>Team Marketing Tim mạch phối hợp cùng Medical Affairs triển khai ngay tài liệu định vị PECHAUNOX như lựa chọn phối hợp liều cố định ưu tiên (Perindopril+Amlodipin), tận dụng thông điệp "tuân thủ điều trị — ít viên hơn, hiệu quả hơn" xung quanh Ngày Tăng huyết áp thế giới 17/5; đồng thời Sales ETC ưu tiên đẩy TABAREX và HATLOP vào danh mục quản lý bệnh mạn tính tại các bệnh viện tuyến tỉnh trước chu kỳ đấu thầu tiếp theo.</w:t>
             </w:r>
           </w:p>
         </w:tc>
@@ -2336,7 +2336,7 @@
                 <w:color w:val="111827"/>
                 <w:sz w:val="21"/>
               </w:rPr>
-              <w:t>Xu hướng bệnh cơ xương khớp trẻ hóa &amp; Y học tái tạo — cơ hội cho Etoricoxib (MAGRAX)</w:t>
+              <w:t>Bệnh cơ xương khớp trẻ hóa nhanh — xu hướng Y học tái tạo thay thế thuốc giảm đau dài hạn</w:t>
             </w:r>
           </w:p>
         </w:tc>
@@ -2355,7 +2355,7 @@
           <w:color w:val="6B7280"/>
           <w:sz w:val="18"/>
         </w:rPr>
-        <w:t>Tọa đàm tại BV Hồng Ngọc (Dân Trí, 12/05/2026) ghi nhận bệnh thoái hóa khớp đang trẻ hóa nhanh — nhóm ngoài 30 tuổi ngày càng phổ biến — và cảnh báo tình trạng tự mua thuốc giảm đau, chống viêm không kê đơn kéo dài. Đây mở rộng pool bệnh nhân tiềm năng cho MAGRAX (Etoricoxib), đồng thời xu hướng giảm phụ thuộc NSAID truyền thống tạo lợi thế cho Etoricoxib là COX-2 chọn lọc có profil an toàn tiêu hóa tốt hơn.</w:t>
+        <w:t>Tọa đàm do Dân Trí &amp; BV Hồng Ngọc tổ chức ghi nhận xu hướng thoái hóa khớp trẻ hóa rõ rệt (người ngoài 30 tuổi), kèm cảnh báo nguy cơ từ thói quen tự mua thuốc chống viêm/giảm đau kéo dài không kê đơn. Xu hướng Y học tái tạo được đẩy mạnh như giải pháp thay thế, có thể tác động đến nhu cầu sử dụng Etoricoxib (MAGRAX) trong phác đồ quản lý đau mạn tính cơ xương khớp.</w:t>
       </w:r>
     </w:p>
     <w:p>
@@ -2368,10 +2368,10 @@
           <w:rFonts w:ascii="Calibri" w:hAnsi="Calibri"/>
           <w:b/>
           <w:i w:val="0"/>
-          <w:color w:val="166534"/>
+          <w:color w:val="374151"/>
           <w:sz w:val="17"/>
         </w:rPr>
-        <w:t>🟢 Cơ hội: nhu cầu điều trị xương khớp mở rộng sang nhóm tuổi trẻ hơn củng cố luận điểm thầu và detailing cho MAGRAX (Etoricoxib) tại các khoa Cơ xương khớp, Nội tổng quát bệnh viện tuyến quận/huyện và bệnh viện tư.</w:t>
+        <w:t>⚖️ Tín hiệu trung tính: tệp bệnh nhân xương khớp mở rộng là cơ hội tăng trưởng cho MAGRAX, nhưng áp lực từ Y học tái tạo và cảnh báo dùng thuốc dài hạn có thể kiềm chế tăng trưởng kênh OTC/ETC.</w:t>
       </w:r>
     </w:p>
     <w:tbl>
@@ -2418,7 +2418,7 @@
                 <w:color w:val="334155"/>
                 <w:sz w:val="17"/>
               </w:rPr>
-              <w:t>Marketing &amp; Medical Affairs cập nhật messaging cho MAGRAX nhấn mạnh profil an toàn COX-2 so với NSAID không chọn lọc, nhắm vào nhóm bệnh nhân trẻ tuổi hoạt động thể thao; Sales team ETC ưu tiên detailing tại BV có khoa Cơ xương khớp và phòng khám thể thao trong Q3/2026, trước chu kỳ thầu địa phương cuối năm.</w:t>
+              <w:t>Marketing &amp; Medical Affairs cần cập nhật positioning cho MAGRAX (Etoricoxib) theo hướng "quản lý đau giai đoạn cấp/bán cấp" — bổ sung dữ liệu an toàn tim mạch và GI so với NSAIDs thế hệ cũ để biện hộ cho kê đơn hợp lý trong bối cảnh Y học tái tạo lên ngôi; xem xét tài liệu detail cho bác sĩ chuyên khoa cơ xương khớp trong vòng Q3/2026.</w:t>
             </w:r>
           </w:p>
         </w:tc>
@@ -2492,7 +2492,7 @@
                 <w:color w:val="111827"/>
                 <w:sz w:val="21"/>
               </w:rPr>
-              <w:t>Xu hướng nội soi phóng đại cấp độ tế bào trong tầm soát ung thư tiêu hóa tại Việt Nam</w:t>
+              <w:t>Xu hướng nội soi siêu phóng đại phát hiện sớm ung thư tiêu hóa: Tín hiệu tăng nhu cầu điều trị</w:t>
             </w:r>
           </w:p>
         </w:tc>
@@ -2511,7 +2511,7 @@
           <w:color w:val="6B7280"/>
           <w:sz w:val="18"/>
         </w:rPr>
-        <w:t>Công nghệ nội soi Endocyto 520x (Olympus) đang được triển khai tại Thu Cúc TCI, cho phép phát hiện tổn thương ung thư tiêu hóa ở cấp độ tế bào — đánh dấu sự chuyển dịch sang chẩn đoán sớm chuyên sâu tại kênh bệnh viện tư. Xu hướng này gián tiếp thúc đẩy nhu cầu điều trị ung thư đường tiêu hóa, mở rộng thị trường tiềm năng cho danh mục ung thư của Davipharm (HYYR – Erlotinib, LARRIVEY – Bicalutamide) tại kênh ETC.</w:t>
+        <w:t>Công nghệ nội soi Endocyto 520x (Olympus) triển khai tại Thu Cúc TCI cho phép phát hiện ung thư tiêu hóa ở cấp độ tế bào, báo hiệu tỷ lệ phát hiện sớm ung thư đường tiêu hóa tại Việt Nam sẽ tăng đáng kể trong các năm tới. Việc chẩn đoán sớm hơn sẽ kéo theo gia tăng số bệnh nhân bước vào giai đoạn điều trị bằng thuốc kê đơn, trực tiếp mở rộng thị trường ETC cho các sản phẩm ung thư của Davipharm.</w:t>
       </w:r>
     </w:p>
     <w:p>
@@ -2524,10 +2524,10 @@
           <w:rFonts w:ascii="Calibri" w:hAnsi="Calibri"/>
           <w:b/>
           <w:i w:val="0"/>
-          <w:color w:val="374151"/>
+          <w:color w:val="166534"/>
           <w:sz w:val="17"/>
         </w:rPr>
-        <w:t>📡 Tín hiệu dài hạn tích cực: phát hiện sớm ung thư tiêu hóa nhiều hơn có thể làm tăng pool bệnh nhân cho HYYR và LARRIVEY, nhưng tác động ngắn hạn lên doanh thu ETC còn hạn chế.</w:t>
+        <w:t>📈 Cơ hội trung hạn: gia tăng bệnh nhân ung thư tiêu hóa được chẩn đoán sớm sẽ thúc đẩy nhu cầu điều trị, tạo điều kiện mở rộng thị phần ETC cho HYYR (Erlotinib) và LARRIVEY (Bicalutamide) trong các gói thầu bệnh viện.</w:t>
       </w:r>
     </w:p>
     <w:tbl>
@@ -2574,7 +2574,7 @@
                 <w:color w:val="334155"/>
                 <w:sz w:val="17"/>
               </w:rPr>
-              <w:t>Team Medical Affairs phối hợp với team ETC Sales theo dõi sự mở rộng của mạng lưới nội soi tiên tiến (Thu Cúc TCI và tương đương) để định vị HYYR (Erlotinib) và LARRIVEY (Bicalutamide) trong danh mục điều trị sớm tại các bệnh viện/phòng khám tư áp dụng công nghệ tầm soát mới; đánh giá cơ hội listing sản phẩm trong chu kỳ thầu tiếp theo.</w:t>
+              <w:t>Team Marketing ETC phối hợp với Medical Affairs theo dõi sự mở rộng của công nghệ nội soi siêu phóng đại sang các bệnh viện tuyến tỉnh trong 12 tháng tới, chuẩn bị tài liệu MSL và đề xuất đưa HYYR, LARRIVEY vào danh mục thuốc ung thư tiêu hóa tại các cơ sở y tế có triển khai nội soi tiên tiến; ưu tiên các bệnh viện trong hệ thống TCI và bệnh viện ung bướu tỉnh.</w:t>
             </w:r>
           </w:p>
         </w:tc>
@@ -5000,7 +5000,7 @@
                 <w:color w:val="111827"/>
                 <w:sz w:val="18"/>
               </w:rPr>
-              <w:t>Chuẩn bị hồ sơ thầu PECHAUNOX, TABAREX, EIMLER-10, ZLATKO cho gói BHYT tuyến huyện/xã Q3–Q4/2026 theo làn sóng khám sàng lọc miễn phí Bộ Y tế</w:t>
+              <w:t>Chuẩn bị tài liệu kê đơn RAVASTEL, EIMLER-10, ZLATKO cho bệnh nhân sau sàng lọc định kỳ miễn phí — ưu tiên tuyến huyện trước chu kỳ thầu</w:t>
             </w:r>
           </w:p>
         </w:tc>
@@ -5028,7 +5028,7 @@
                 <w:color w:val="003B71"/>
                 <w:sz w:val="17"/>
               </w:rPr>
-              <w:t>Sales / Strategy</w:t>
+              <w:t>Marketing / Medical Affairs</w:t>
             </w:r>
           </w:p>
         </w:tc>
@@ -5056,7 +5056,7 @@
                 <w:color w:val="6B7280"/>
                 <w:sz w:val="17"/>
               </w:rPr>
-              <w:t>Chính sách khám sức khỏe định kỳ miễn phí toàn dân 2026</w:t>
+              <w:t>Khám sức khỏe định kỳ miễn phí toàn dân — mở rộng phễu bệnh nhân mạn tính</w:t>
             </w:r>
           </w:p>
         </w:tc>
@@ -5135,7 +5135,7 @@
                 <w:color w:val="111827"/>
                 <w:sz w:val="18"/>
               </w:rPr>
-              <w:t>Kích hoạt Medical Education cho PECHAUNOX, HATLOP tại cơ sở y tế ban đầu nhân Ngày Tăng huyết áp Thế giới 17/5</w:t>
+              <w:t>Triển khai detailing PECHAUNOX (Perindopril+Amlodipin) nhân Ngày Tăng huyết áp 17/5 — thông điệp FDC tuân thủ điều trị tại bệnh viện tỉnh</w:t>
             </w:r>
           </w:p>
         </w:tc>
@@ -5163,7 +5163,7 @@
                 <w:color w:val="003B71"/>
                 <w:sz w:val="17"/>
               </w:rPr>
-              <w:t>Marketing / Sales</w:t>
+              <w:t>Sales / Marketing</w:t>
             </w:r>
           </w:p>
         </w:tc>
@@ -5191,7 +5191,7 @@
                 <w:color w:val="6B7280"/>
                 <w:sz w:val="17"/>
               </w:rPr>
-              <w:t>Tăng huyết áp bỏ sót hàng triệu người Việt</w:t>
+              <w:t>Tăng huyết áp bỏ sót hàng triệu người Việt — cơ hội FDC và đấu thầu ETC</w:t>
             </w:r>
           </w:p>
         </w:tc>
@@ -5270,7 +5270,7 @@
                 <w:color w:val="111827"/>
                 <w:sz w:val="18"/>
               </w:rPr>
-              <w:t>Cập nhật messaging MAGRAX (Etoricoxib) — COX-2 vs NSAID — detailing khoa Cơ xương khớp trước thầu cuối năm Q3/2026</w:t>
+              <w:t>Detailing JIRACEK, MARTAZ tại khoa Tiêu hóa Bạch Mai, Chợ Rẫy — nhấn mạnh vai trò PPI trong phác đồ diệt HP trước thầu Q3/2026</w:t>
             </w:r>
           </w:p>
         </w:tc>
@@ -5298,7 +5298,7 @@
                 <w:color w:val="003B71"/>
                 <w:sz w:val="17"/>
               </w:rPr>
-              <w:t>Marketing / Sales</w:t>
+              <w:t>Sales / Medical Affairs</w:t>
             </w:r>
           </w:p>
         </w:tc>
@@ -5326,142 +5326,7 @@
                 <w:color w:val="6B7280"/>
                 <w:sz w:val="17"/>
               </w:rPr>
-              <w:t>Bệnh cơ xương khớp trẻ hóa — xu hướng COX-2 chọn lọc</w:t>
-            </w:r>
-          </w:p>
-        </w:tc>
-        <w:tc>
-          <w:tcPr>
-            <w:tcW w:type="dxa" w:w="1644"/>
-            <w:shd w:val="clear" w:color="auto" w:fill="FEF3C7"/>
-            <w:tcBorders>
-              <w:top w:val="none" w:sz="6" w:color="auto"/>
-              <w:bottom w:val="none" w:sz="6" w:color="auto"/>
-              <w:left w:val="none" w:sz="6" w:color="auto"/>
-              <w:right w:val="none" w:sz="6" w:color="auto"/>
-            </w:tcBorders>
-          </w:tcPr>
-          <w:p>
-            <w:pPr>
-              <w:spacing w:before="80" w:after="80"/>
-              <w:jc w:val="center"/>
-            </w:pPr>
-            <w:r>
-              <w:rPr>
-                <w:rFonts w:ascii="Calibri" w:hAnsi="Calibri"/>
-                <w:b/>
-                <w:i w:val="0"/>
-                <w:color w:val="D97706"/>
-                <w:sz w:val="17"/>
-              </w:rPr>
-              <w:t>🟡 Trung</w:t>
-            </w:r>
-          </w:p>
-        </w:tc>
-      </w:tr>
-      <w:tr>
-        <w:tc>
-          <w:tcPr>
-            <w:tcW w:type="dxa" w:w="454"/>
-            <w:shd w:val="clear" w:color="auto" w:fill="FEF3C7"/>
-            <w:tcBorders>
-              <w:top w:val="none" w:sz="6" w:color="auto"/>
-              <w:bottom w:val="none" w:sz="6" w:color="auto"/>
-              <w:left w:val="none" w:sz="6" w:color="auto"/>
-              <w:right w:val="none" w:sz="6" w:color="auto"/>
-            </w:tcBorders>
-          </w:tcPr>
-          <w:p>
-            <w:pPr>
-              <w:spacing w:before="100" w:after="100"/>
-              <w:jc w:val="center"/>
-            </w:pPr>
-            <w:r>
-              <w:t>🟡</w:t>
-            </w:r>
-          </w:p>
-        </w:tc>
-        <w:tc>
-          <w:tcPr>
-            <w:tcW w:type="dxa" w:w="4422"/>
-            <w:shd w:val="clear" w:color="auto" w:fill="FAFBFF"/>
-            <w:tcBorders>
-              <w:top w:val="none" w:sz="6" w:color="auto"/>
-              <w:bottom w:val="none" w:sz="6" w:color="auto"/>
-              <w:left w:val="none" w:sz="6" w:color="auto"/>
-              <w:right w:val="none" w:sz="6" w:color="auto"/>
-            </w:tcBorders>
-          </w:tcPr>
-          <w:p>
-            <w:pPr>
-              <w:spacing w:before="80" w:after="80"/>
-              <w:ind w:left="85"/>
-            </w:pPr>
-            <w:r>
-              <w:rPr>
-                <w:rFonts w:ascii="Calibri" w:hAnsi="Calibri"/>
-                <w:b/>
-                <w:i w:val="0"/>
-                <w:color w:val="111827"/>
-                <w:sz w:val="18"/>
-              </w:rPr>
-              <w:t>Xây dựng tài liệu Medical Affairs về vai trò PPI trong phác đồ diệt HP — đẩy JIRACEK vào danh mục thầu Bạch Mai, Chợ Rẫy 2026–2027</w:t>
-            </w:r>
-          </w:p>
-        </w:tc>
-        <w:tc>
-          <w:tcPr>
-            <w:tcW w:type="dxa" w:w="1417"/>
-            <w:shd w:val="clear" w:color="auto" w:fill="FAFBFF"/>
-            <w:tcBorders>
-              <w:top w:val="none" w:sz="6" w:color="auto"/>
-              <w:bottom w:val="none" w:sz="6" w:color="auto"/>
-              <w:left w:val="none" w:sz="6" w:color="auto"/>
-              <w:right w:val="none" w:sz="6" w:color="auto"/>
-            </w:tcBorders>
-          </w:tcPr>
-          <w:p>
-            <w:pPr>
-              <w:spacing w:before="80" w:after="80"/>
-              <w:jc w:val="center"/>
-            </w:pPr>
-            <w:r>
-              <w:rPr>
-                <w:rFonts w:ascii="Calibri" w:hAnsi="Calibri"/>
-                <w:b w:val="0"/>
-                <w:i w:val="0"/>
-                <w:color w:val="003B71"/>
-                <w:sz w:val="17"/>
-              </w:rPr>
-              <w:t>Marketing / Sales</w:t>
-            </w:r>
-          </w:p>
-        </w:tc>
-        <w:tc>
-          <w:tcPr>
-            <w:tcW w:type="dxa" w:w="1134"/>
-            <w:shd w:val="clear" w:color="auto" w:fill="FAFBFF"/>
-            <w:tcBorders>
-              <w:top w:val="none" w:sz="6" w:color="auto"/>
-              <w:bottom w:val="none" w:sz="6" w:color="auto"/>
-              <w:left w:val="none" w:sz="6" w:color="auto"/>
-              <w:right w:val="none" w:sz="6" w:color="auto"/>
-            </w:tcBorders>
-          </w:tcPr>
-          <w:p>
-            <w:pPr>
-              <w:spacing w:before="80" w:after="80"/>
-              <w:jc w:val="center"/>
-            </w:pPr>
-            <w:r>
-              <w:rPr>
-                <w:rFonts w:ascii="Calibri" w:hAnsi="Calibri"/>
-                <w:b w:val="0"/>
-                <w:i w:val="0"/>
-                <w:color w:val="6B7280"/>
-                <w:sz w:val="17"/>
-              </w:rPr>
-              <w:t>Nhận thức HP/ung thư dạ dày tăng — cơ hội PPI</w:t>
+              <w:t>Nhận thức HP &amp; ung thư dạ dày tăng — nhu cầu PPI dài hạn kênh ETC</w:t>
             </w:r>
           </w:p>
         </w:tc>

</xml_diff>

<commit_message>
Update report_vi.docx 2026-05-16 22:04
</commit_message>
<xml_diff>
--- a/report_vi.docx
+++ b/report_vi.docx
@@ -201,7 +201,7 @@
                 <w:color w:val="111827"/>
                 <w:sz w:val="19"/>
               </w:rPr>
-              <w:t>12/05 – 18/05/2026</w:t>
+              <w:t>09/05 – 16/05/2026</w:t>
             </w:r>
           </w:p>
         </w:tc>
@@ -258,7 +258,7 @@
                 <w:color w:val="111827"/>
                 <w:sz w:val="19"/>
               </w:rPr>
-              <w:t>13/05/2026</w:t>
+              <w:t>16/05/2026</w:t>
             </w:r>
           </w:p>
         </w:tc>
@@ -303,52 +303,6 @@
         <w:t>TÓM TẮT ĐIỀU HÀNH</w:t>
       </w:r>
     </w:p>
-    <w:tbl>
-      <w:tblPr>
-        <w:tblStyle w:val="TableGrid"/>
-        <w:tblW w:type="auto" w:w="0"/>
-        <w:jc w:val="left"/>
-        <w:tblLook w:firstColumn="1" w:firstRow="1" w:lastColumn="0" w:lastRow="0" w:noHBand="0" w:noVBand="1" w:val="04A0"/>
-      </w:tblPr>
-      <w:tblGrid>
-        <w:gridCol w:w="9072"/>
-      </w:tblGrid>
-      <w:tr>
-        <w:tc>
-          <w:tcPr>
-            <w:tcW w:type="dxa" w:w="9071"/>
-            <w:shd w:val="clear" w:color="auto" w:fill="EFF6FF"/>
-            <w:tcBorders>
-              <w:top w:val="none" w:sz="6" w:color="auto"/>
-              <w:bottom w:val="none" w:sz="6" w:color="auto"/>
-              <w:left w:val="single" w:sz="18" w:color="0056D2"/>
-              <w:right w:val="none" w:sz="6" w:color="auto"/>
-            </w:tcBorders>
-          </w:tcPr>
-          <w:p>
-            <w:pPr>
-              <w:spacing w:before="80" w:after="80"/>
-              <w:ind w:left="170"/>
-            </w:pPr>
-            <w:r>
-              <w:rPr>
-                <w:rFonts w:ascii="Calibri" w:hAnsi="Calibri"/>
-                <w:b/>
-                <w:i w:val="0"/>
-                <w:color w:val="111827"/>
-                <w:sz w:val="20"/>
-              </w:rPr>
-              <w:t>Tuần 11–17/05/2026: Chính sách khám sức khỏe định kỳ miễn phí toàn dân và làn sóng nhận thức bệnh mạn tính tạo ra tailwind dài hạn mạnh nhất từ trước đến nay cho danh mục tim mạch–đái tháo đường–tiêu hóa–ung thư của Davipharm — không có rủi ro pháp lý trực tiếp trong tuần.</w:t>
-            </w:r>
-          </w:p>
-        </w:tc>
-      </w:tr>
-    </w:tbl>
-    <w:p>
-      <w:pPr>
-        <w:spacing w:before="80"/>
-      </w:pPr>
-    </w:p>
     <w:p>
       <w:pPr>
         <w:spacing w:after="80"/>
@@ -391,54 +345,6 @@
                 <w:sz w:val="17"/>
               </w:rPr>
               <w:t>💡  INSIGHTS TUẦN NÀY</w:t>
-            </w:r>
-          </w:p>
-          <w:p>
-            <w:pPr>
-              <w:spacing w:before="20" w:after="60"/>
-              <w:ind w:left="142"/>
-            </w:pPr>
-            <w:r>
-              <w:rPr>
-                <w:rFonts w:ascii="Calibri" w:hAnsi="Calibri"/>
-                <w:b w:val="0"/>
-                <w:i w:val="0"/>
-                <w:color w:val="111827"/>
-                <w:sz w:val="17"/>
-              </w:rPr>
-              <w:t>▸  Sàng lọc toàn dân (MoH):Chính sách khám miễn phí 1 lần/năm từ 2026 sẽ mở rộng đáng kể phễu bệnh nhân mới cho RAVASTEL, EIMLER-10, ZLATKO, PECHAUNOX, TABAREX và HATLOP — tác động lớn nhất đến volume ETC tuyến huyện.</w:t>
-            </w:r>
-          </w:p>
-          <w:p>
-            <w:pPr>
-              <w:spacing w:before="20" w:after="60"/>
-              <w:ind w:left="142"/>
-            </w:pPr>
-            <w:r>
-              <w:rPr>
-                <w:rFonts w:ascii="Calibri" w:hAnsi="Calibri"/>
-                <w:b w:val="0"/>
-                <w:i w:val="0"/>
-                <w:color w:val="111827"/>
-                <w:sz w:val="17"/>
-              </w:rPr>
-              <w:t>▸  Tăng huyết áp bỏ sót:25–30% người Việt mắc THA chưa được kiểm soát và xu hướng trẻ hóa củng cố vị thế PECHAUNOX (FDC) như lựa chọn ưu tiên trước chu kỳ thầu tiếp theo.</w:t>
-            </w:r>
-          </w:p>
-          <w:p>
-            <w:pPr>
-              <w:spacing w:before="20" w:after="60"/>
-              <w:ind w:left="142"/>
-            </w:pPr>
-            <w:r>
-              <w:rPr>
-                <w:rFonts w:ascii="Calibri" w:hAnsi="Calibri"/>
-                <w:b w:val="0"/>
-                <w:i w:val="0"/>
-                <w:color w:val="111827"/>
-                <w:sz w:val="17"/>
-              </w:rPr>
-              <w:t>▸  Ung thư tiêu hóa + HP:Nội soi siêu phóng đại mở rộng và nhận thức HP/ung thư dạ dày tăng đồng thời thúc đẩy nhu cầu trung hạn cho cả HYYR/LARRIVEY (ung thư) lẫn JIRACEK/MARTAZ (PPI), đặc biệt tại bệnh viện tuyến trung ương.</w:t>
             </w:r>
           </w:p>
         </w:tc>
@@ -777,7 +683,7 @@
         <w:tc>
           <w:tcPr>
             <w:tcW w:type="dxa" w:w="1701"/>
-            <w:shd w:val="clear" w:color="auto" w:fill="DCFCE7"/>
+            <w:shd w:val="clear" w:color="auto" w:fill="E9FBF0"/>
             <w:tcBorders>
               <w:top w:val="none" w:sz="6" w:color="auto"/>
               <w:bottom w:val="none" w:sz="6" w:color="auto"/>
@@ -793,19 +699,19 @@
             <w:r>
               <w:rPr>
                 <w:rFonts w:ascii="Calibri" w:hAnsi="Calibri"/>
-                <w:b/>
+                <w:b w:val="0"/>
                 <w:i w:val="0"/>
-                <w:color w:val="166534"/>
+                <w:color w:val="CCCCCC"/>
                 <w:sz w:val="22"/>
               </w:rPr>
-              <w:t>4</w:t>
+              <w:t>—</w:t>
             </w:r>
           </w:p>
         </w:tc>
         <w:tc>
           <w:tcPr>
             <w:tcW w:type="dxa" w:w="1984"/>
-            <w:shd w:val="clear" w:color="auto" w:fill="F3F4F6"/>
+            <w:shd w:val="clear" w:color="auto" w:fill="F9FAFB"/>
             <w:tcBorders>
               <w:top w:val="none" w:sz="6" w:color="auto"/>
               <w:bottom w:val="none" w:sz="6" w:color="auto"/>
@@ -821,12 +727,12 @@
             <w:r>
               <w:rPr>
                 <w:rFonts w:ascii="Calibri" w:hAnsi="Calibri"/>
-                <w:b/>
+                <w:b w:val="0"/>
                 <w:i w:val="0"/>
-                <w:color w:val="374151"/>
+                <w:color w:val="CCCCCC"/>
                 <w:sz w:val="22"/>
               </w:rPr>
-              <w:t>6</w:t>
+              <w:t>—</w:t>
             </w:r>
           </w:p>
         </w:tc>
@@ -1025,1566 +931,6 @@
         <w:t>TIN NGÀNH DƯỢC</w:t>
       </w:r>
     </w:p>
-    <w:tbl>
-      <w:tblPr>
-        <w:tblStyle w:val="TableGrid"/>
-        <w:tblW w:type="auto" w:w="0"/>
-        <w:jc w:val="left"/>
-        <w:tblLook w:firstColumn="1" w:firstRow="1" w:lastColumn="0" w:lastRow="0" w:noHBand="0" w:noVBand="1" w:val="04A0"/>
-      </w:tblPr>
-      <w:tblGrid>
-        <w:gridCol w:w="4536"/>
-        <w:gridCol w:w="4536"/>
-      </w:tblGrid>
-      <w:tr>
-        <w:tc>
-          <w:tcPr>
-            <w:tcW w:type="dxa" w:w="1984"/>
-            <w:shd w:val="clear" w:color="auto" w:fill="EEF2FF"/>
-            <w:tcBorders>
-              <w:top w:val="none" w:sz="6" w:color="auto"/>
-              <w:bottom w:val="none" w:sz="6" w:color="auto"/>
-              <w:left w:val="none" w:sz="6" w:color="auto"/>
-              <w:right w:val="none" w:sz="6" w:color="auto"/>
-            </w:tcBorders>
-          </w:tcPr>
-          <w:p>
-            <w:pPr>
-              <w:spacing w:before="80" w:after="80"/>
-              <w:ind w:left="85"/>
-            </w:pPr>
-            <w:r>
-              <w:rPr>
-                <w:rFonts w:ascii="Calibri" w:hAnsi="Calibri"/>
-                <w:b/>
-                <w:i w:val="0"/>
-                <w:color w:val="4338CA"/>
-                <w:sz w:val="15"/>
-              </w:rPr>
-              <w:t>DÂN TRÍ – SỨC KHỎE</w:t>
-            </w:r>
-          </w:p>
-        </w:tc>
-        <w:tc>
-          <w:tcPr>
-            <w:tcW w:type="dxa" w:w="4536"/>
-            <w:tcBorders>
-              <w:top w:val="none" w:sz="6" w:color="auto"/>
-              <w:bottom w:val="none" w:sz="6" w:color="auto"/>
-              <w:left w:val="none" w:sz="6" w:color="auto"/>
-              <w:right w:val="none" w:sz="6" w:color="auto"/>
-            </w:tcBorders>
-          </w:tcPr>
-          <w:p>
-            <w:pPr>
-              <w:spacing w:before="60" w:after="60"/>
-              <w:ind w:left="113"/>
-            </w:pPr>
-            <w:r>
-              <w:rPr>
-                <w:rFonts w:ascii="Calibri" w:hAnsi="Calibri"/>
-                <w:b/>
-                <w:i w:val="0"/>
-                <w:color w:val="111827"/>
-                <w:sz w:val="21"/>
-              </w:rPr>
-              <w:t>Nhận thức về ung thư dạ dày &amp; HP tăng cao — Tín hiệu cho nhóm thuốc tiêu hóa (Esomeprazole, Rabeprazole)</w:t>
-            </w:r>
-          </w:p>
-        </w:tc>
-      </w:tr>
-    </w:tbl>
-    <w:p>
-      <w:pPr>
-        <w:spacing w:before="40" w:after="40"/>
-        <w:ind w:left="170"/>
-      </w:pPr>
-      <w:r>
-        <w:rPr>
-          <w:rFonts w:ascii="Calibri" w:hAnsi="Calibri"/>
-          <w:b w:val="0"/>
-          <w:i/>
-          <w:color w:val="6B7280"/>
-          <w:sz w:val="18"/>
-        </w:rPr>
-        <w:t>Bài tư vấn y tế trên Dân Trí (Bệnh viện Bạch Mai) nhấn mạnh vai trò của vi khuẩn HP trong chuỗi tiến triển viêm dạ dày → ung thư, đồng thời khuyến nghị nội soi sớm và kiểm soát bệnh lý tiêu hóa mạn tính — phản ánh xu hướng gia tăng nhu cầu điều trị PPI dài hạn tại Việt Nam. Đây là tín hiệu thị trường thuận lợi cho JIRACEK (Esomeprazole) và MARTAZ (Rabeprazole) trong phân khúc bệnh nhân có bệnh lý dạ dày mạn tính tại kênh ETC và OPD.</w:t>
-      </w:r>
-    </w:p>
-    <w:p>
-      <w:pPr>
-        <w:spacing w:before="20" w:after="40"/>
-        <w:ind w:left="170"/>
-      </w:pPr>
-      <w:r>
-        <w:rPr>
-          <w:rFonts w:ascii="Calibri" w:hAnsi="Calibri"/>
-          <w:b/>
-          <w:i w:val="0"/>
-          <w:color w:val="166534"/>
-          <w:sz w:val="17"/>
-        </w:rPr>
-        <w:t>📈 Nhận thức HP &amp; ung thư dạ dày tăng thúc đẩy nhu cầu PPI dài hạn — cơ hội tăng trưởng kê đơn cho JIRACEK và MARTAZ tại bệnh viện tuyến trung ương và tỉnh.</w:t>
-      </w:r>
-    </w:p>
-    <w:tbl>
-      <w:tblPr>
-        <w:tblStyle w:val="TableGrid"/>
-        <w:tblW w:type="auto" w:w="0"/>
-        <w:tblLook w:firstColumn="1" w:firstRow="1" w:lastColumn="0" w:lastRow="0" w:noHBand="0" w:noVBand="1" w:val="04A0"/>
-      </w:tblPr>
-      <w:tblGrid>
-        <w:gridCol w:w="9072"/>
-      </w:tblGrid>
-      <w:tr>
-        <w:tc>
-          <w:tcPr>
-            <w:tcW w:type="dxa" w:w="9072"/>
-            <w:shd w:val="clear" w:color="auto" w:fill="F8FAFC"/>
-            <w:tcBorders>
-              <w:top w:val="none" w:sz="6" w:color="auto"/>
-              <w:bottom w:val="none" w:sz="6" w:color="auto"/>
-              <w:left w:val="single" w:sz="12" w:color="003B71"/>
-              <w:right w:val="none" w:sz="6" w:color="auto"/>
-            </w:tcBorders>
-          </w:tcPr>
-          <w:p>
-            <w:pPr>
-              <w:spacing w:before="60" w:after="60"/>
-              <w:ind w:left="142"/>
-            </w:pPr>
-            <w:r>
-              <w:rPr>
-                <w:rFonts w:ascii="Calibri" w:hAnsi="Calibri"/>
-                <w:b/>
-                <w:i w:val="0"/>
-                <w:color w:val="003B71"/>
-                <w:sz w:val="17"/>
-              </w:rPr>
-              <w:t xml:space="preserve">Strategy  </w:t>
-            </w:r>
-            <w:r>
-              <w:rPr>
-                <w:rFonts w:ascii="Calibri" w:hAnsi="Calibri"/>
-                <w:b w:val="0"/>
-                <w:i w:val="0"/>
-                <w:color w:val="334155"/>
-                <w:sz w:val="17"/>
-              </w:rPr>
-              <w:t>Medical Team phối hợp với Sales ETC chuẩn bị tài liệu detailing nhấn mạnh vai trò PPI trong phác đồ diệt HP (phối hợp kháng sinh + PPI) và dự phòng tái phát loét; ưu tiên tiếp cận các khoa Tiêu hóa–Gan mật tại bệnh viện tuyến trung ương (Bạch Mai, Chợ Rẫy, Huế) trong Q2–Q3/2026 để định vị JIRACEK và MARTAZ trước chu kỳ thầu tiếp theo.</w:t>
-            </w:r>
-          </w:p>
-        </w:tc>
-      </w:tr>
-    </w:tbl>
-    <w:p>
-      <w:pPr>
-        <w:spacing w:before="40" w:after="120"/>
-      </w:pPr>
-    </w:p>
-    <w:tbl>
-      <w:tblPr>
-        <w:tblStyle w:val="TableGrid"/>
-        <w:tblW w:type="auto" w:w="0"/>
-        <w:jc w:val="left"/>
-        <w:tblLook w:firstColumn="1" w:firstRow="1" w:lastColumn="0" w:lastRow="0" w:noHBand="0" w:noVBand="1" w:val="04A0"/>
-      </w:tblPr>
-      <w:tblGrid>
-        <w:gridCol w:w="4536"/>
-        <w:gridCol w:w="4536"/>
-      </w:tblGrid>
-      <w:tr>
-        <w:tc>
-          <w:tcPr>
-            <w:tcW w:type="dxa" w:w="1984"/>
-            <w:shd w:val="clear" w:color="auto" w:fill="EEF2FF"/>
-            <w:tcBorders>
-              <w:top w:val="none" w:sz="6" w:color="auto"/>
-              <w:bottom w:val="none" w:sz="6" w:color="auto"/>
-              <w:left w:val="none" w:sz="6" w:color="auto"/>
-              <w:right w:val="none" w:sz="6" w:color="auto"/>
-            </w:tcBorders>
-          </w:tcPr>
-          <w:p>
-            <w:pPr>
-              <w:spacing w:before="80" w:after="80"/>
-              <w:ind w:left="85"/>
-            </w:pPr>
-            <w:r>
-              <w:rPr>
-                <w:rFonts w:ascii="Calibri" w:hAnsi="Calibri"/>
-                <w:b/>
-                <w:i w:val="0"/>
-                <w:color w:val="4338CA"/>
-                <w:sz w:val="15"/>
-              </w:rPr>
-              <w:t>DÂN TRÍ – SỨC KHỎE</w:t>
-            </w:r>
-          </w:p>
-        </w:tc>
-        <w:tc>
-          <w:tcPr>
-            <w:tcW w:type="dxa" w:w="4536"/>
-            <w:tcBorders>
-              <w:top w:val="none" w:sz="6" w:color="auto"/>
-              <w:bottom w:val="none" w:sz="6" w:color="auto"/>
-              <w:left w:val="none" w:sz="6" w:color="auto"/>
-              <w:right w:val="none" w:sz="6" w:color="auto"/>
-            </w:tcBorders>
-          </w:tcPr>
-          <w:p>
-            <w:pPr>
-              <w:spacing w:before="60" w:after="60"/>
-              <w:ind w:left="113"/>
-            </w:pPr>
-            <w:r>
-              <w:rPr>
-                <w:rFonts w:ascii="Calibri" w:hAnsi="Calibri"/>
-                <w:b/>
-                <w:i w:val="0"/>
-                <w:color w:val="111827"/>
-                <w:sz w:val="21"/>
-              </w:rPr>
-              <w:t>Xác ve sầu (thuyền thoái) bị tạm giữ tại Lạng Sơn — Tín hiệu thị trường dược liệu cổ truyền</w:t>
-            </w:r>
-          </w:p>
-        </w:tc>
-      </w:tr>
-    </w:tbl>
-    <w:p>
-      <w:pPr>
-        <w:spacing w:before="40" w:after="40"/>
-        <w:ind w:left="170"/>
-      </w:pPr>
-      <w:r>
-        <w:rPr>
-          <w:rFonts w:ascii="Calibri" w:hAnsi="Calibri"/>
-          <w:b w:val="0"/>
-          <w:i/>
-          <w:color w:val="6B7280"/>
-          <w:sz w:val="18"/>
-        </w:rPr>
-        <w:t>Quản lý thị trường Lạng Sơn tạm giữ 80kg xác ve sầu khô do không có giấy tờ nguồn gốc, phản ánh nhu cầu nguyên liệu y học cổ truyền đang tăng mạnh với giá thu mua 1,2–1,7 triệu đồng/kg. Bài viết thuộc phân khúc dược liệu cổ truyền/YHCT, không liên quan trực tiếp đến danh mục generic tân dược của Davipharm.</w:t>
-      </w:r>
-    </w:p>
-    <w:p>
-      <w:pPr>
-        <w:spacing w:before="20" w:after="40"/>
-        <w:ind w:left="170"/>
-      </w:pPr>
-      <w:r>
-        <w:rPr>
-          <w:rFonts w:ascii="Calibri" w:hAnsi="Calibri"/>
-          <w:b/>
-          <w:i w:val="0"/>
-          <w:color w:val="374151"/>
-          <w:sz w:val="17"/>
-        </w:rPr>
-        <w:t>⚪ Không có tác động trực tiếp đến Davipharm — bài nằm ngoài vùng cạnh tranh của danh mục generic tân dược hiện tại.</w:t>
-      </w:r>
-    </w:p>
-    <w:tbl>
-      <w:tblPr>
-        <w:tblStyle w:val="TableGrid"/>
-        <w:tblW w:type="auto" w:w="0"/>
-        <w:tblLook w:firstColumn="1" w:firstRow="1" w:lastColumn="0" w:lastRow="0" w:noHBand="0" w:noVBand="1" w:val="04A0"/>
-      </w:tblPr>
-      <w:tblGrid>
-        <w:gridCol w:w="9072"/>
-      </w:tblGrid>
-      <w:tr>
-        <w:tc>
-          <w:tcPr>
-            <w:tcW w:type="dxa" w:w="9072"/>
-            <w:shd w:val="clear" w:color="auto" w:fill="F8FAFC"/>
-            <w:tcBorders>
-              <w:top w:val="none" w:sz="6" w:color="auto"/>
-              <w:bottom w:val="none" w:sz="6" w:color="auto"/>
-              <w:left w:val="single" w:sz="12" w:color="003B71"/>
-              <w:right w:val="none" w:sz="6" w:color="auto"/>
-            </w:tcBorders>
-          </w:tcPr>
-          <w:p>
-            <w:pPr>
-              <w:spacing w:before="60" w:after="60"/>
-              <w:ind w:left="142"/>
-            </w:pPr>
-            <w:r>
-              <w:rPr>
-                <w:rFonts w:ascii="Calibri" w:hAnsi="Calibri"/>
-                <w:b/>
-                <w:i w:val="0"/>
-                <w:color w:val="003B71"/>
-                <w:sz w:val="17"/>
-              </w:rPr>
-              <w:t xml:space="preserve">Strategy  </w:t>
-            </w:r>
-            <w:r>
-              <w:rPr>
-                <w:rFonts w:ascii="Calibri" w:hAnsi="Calibri"/>
-                <w:b w:val="0"/>
-                <w:i w:val="0"/>
-                <w:color w:val="334155"/>
-                <w:sz w:val="17"/>
-              </w:rPr>
-              <w:t>Không cần hành động. Market Intelligence team lưu hồ sơ như tham chiếu nền về xu hướng tiêu dùng YHCT tại Việt Nam; không ưu tiên theo dõi thêm.</w:t>
-            </w:r>
-          </w:p>
-        </w:tc>
-      </w:tr>
-    </w:tbl>
-    <w:p>
-      <w:pPr>
-        <w:spacing w:before="40" w:after="120"/>
-      </w:pPr>
-    </w:p>
-    <w:tbl>
-      <w:tblPr>
-        <w:tblStyle w:val="TableGrid"/>
-        <w:tblW w:type="auto" w:w="0"/>
-        <w:jc w:val="left"/>
-        <w:tblLook w:firstColumn="1" w:firstRow="1" w:lastColumn="0" w:lastRow="0" w:noHBand="0" w:noVBand="1" w:val="04A0"/>
-      </w:tblPr>
-      <w:tblGrid>
-        <w:gridCol w:w="4536"/>
-        <w:gridCol w:w="4536"/>
-      </w:tblGrid>
-      <w:tr>
-        <w:tc>
-          <w:tcPr>
-            <w:tcW w:type="dxa" w:w="1984"/>
-            <w:shd w:val="clear" w:color="auto" w:fill="EEF2FF"/>
-            <w:tcBorders>
-              <w:top w:val="none" w:sz="6" w:color="auto"/>
-              <w:bottom w:val="none" w:sz="6" w:color="auto"/>
-              <w:left w:val="none" w:sz="6" w:color="auto"/>
-              <w:right w:val="none" w:sz="6" w:color="auto"/>
-            </w:tcBorders>
-          </w:tcPr>
-          <w:p>
-            <w:pPr>
-              <w:spacing w:before="80" w:after="80"/>
-              <w:ind w:left="85"/>
-            </w:pPr>
-            <w:r>
-              <w:rPr>
-                <w:rFonts w:ascii="Calibri" w:hAnsi="Calibri"/>
-                <w:b/>
-                <w:i w:val="0"/>
-                <w:color w:val="4338CA"/>
-                <w:sz w:val="15"/>
-              </w:rPr>
-              <w:t>DÂN TRÍ – SỨC KHỎE</w:t>
-            </w:r>
-          </w:p>
-        </w:tc>
-        <w:tc>
-          <w:tcPr>
-            <w:tcW w:type="dxa" w:w="4536"/>
-            <w:tcBorders>
-              <w:top w:val="none" w:sz="6" w:color="auto"/>
-              <w:bottom w:val="none" w:sz="6" w:color="auto"/>
-              <w:left w:val="none" w:sz="6" w:color="auto"/>
-              <w:right w:val="none" w:sz="6" w:color="auto"/>
-            </w:tcBorders>
-          </w:tcPr>
-          <w:p>
-            <w:pPr>
-              <w:spacing w:before="60" w:after="60"/>
-              <w:ind w:left="113"/>
-            </w:pPr>
-            <w:r>
-              <w:rPr>
-                <w:rFonts w:ascii="Calibri" w:hAnsi="Calibri"/>
-                <w:b/>
-                <w:i w:val="0"/>
-                <w:color w:val="111827"/>
-                <w:sz w:val="21"/>
-              </w:rPr>
-              <w:t>Ngộ độc Lidocaine sau hút mỡ tại phòng khám TPHCM — áp lực siết chặt quản lý cơ sở thẩm mỹ "chui"</w:t>
-            </w:r>
-          </w:p>
-        </w:tc>
-      </w:tr>
-    </w:tbl>
-    <w:p>
-      <w:pPr>
-        <w:spacing w:before="40" w:after="40"/>
-        <w:ind w:left="170"/>
-      </w:pPr>
-      <w:r>
-        <w:rPr>
-          <w:rFonts w:ascii="Calibri" w:hAnsi="Calibri"/>
-          <w:b w:val="0"/>
-          <w:i/>
-          <w:color w:val="6B7280"/>
-          <w:sz w:val="18"/>
-        </w:rPr>
-        <w:t>Một phụ nữ 53 tuổi hôn mê nặng sau hút mỡ tại phòng khám TPHCM do ngộ độc Lidocaine, sự việc được báo cáo lên Sở Y tế; hội thảo an toàn thẩm mỹ ngày 12/5 ghi nhận 25.000–35.000 ca biến chứng/năm và kêu gọi tăng chế tài với cơ sở vi phạm. Đây không phải sản phẩm Davipharm gây ra sự cố, nhưng làn sóng thanh tra sắp tới có thể thắt chặt điều kiện kê đơn/sử dụng các thuốc gây tê-giảm đau tại cơ sở ngoại trú — phân khúc liên quan đến MAGRAX (Etoricoxib) và METILONE-4 (Methylprednisolone) trong phác đồ hậu phẫu thuật thẩm mỹ.</w:t>
-      </w:r>
-    </w:p>
-    <w:p>
-      <w:pPr>
-        <w:spacing w:before="20" w:after="40"/>
-        <w:ind w:left="170"/>
-      </w:pPr>
-      <w:r>
-        <w:rPr>
-          <w:rFonts w:ascii="Calibri" w:hAnsi="Calibri"/>
-          <w:b/>
-          <w:i w:val="0"/>
-          <w:color w:val="374151"/>
-          <w:sz w:val="17"/>
-        </w:rPr>
-        <w:t>⚠️ Tác động gián tiếp, mức độ thấp: xu hướng siết quản lý phòng khám thẩm mỹ tư nhân có thể làm giảm lượng kê đơn MAGRAX/METILONE-4 tại kênh OPD thẩm mỹ nếu nhiều cơ sở bị đình chỉ hoạt động.</w:t>
-      </w:r>
-    </w:p>
-    <w:tbl>
-      <w:tblPr>
-        <w:tblStyle w:val="TableGrid"/>
-        <w:tblW w:type="auto" w:w="0"/>
-        <w:tblLook w:firstColumn="1" w:firstRow="1" w:lastColumn="0" w:lastRow="0" w:noHBand="0" w:noVBand="1" w:val="04A0"/>
-      </w:tblPr>
-      <w:tblGrid>
-        <w:gridCol w:w="9072"/>
-      </w:tblGrid>
-      <w:tr>
-        <w:tc>
-          <w:tcPr>
-            <w:tcW w:type="dxa" w:w="9072"/>
-            <w:shd w:val="clear" w:color="auto" w:fill="F8FAFC"/>
-            <w:tcBorders>
-              <w:top w:val="none" w:sz="6" w:color="auto"/>
-              <w:bottom w:val="none" w:sz="6" w:color="auto"/>
-              <w:left w:val="single" w:sz="12" w:color="003B71"/>
-              <w:right w:val="none" w:sz="6" w:color="auto"/>
-            </w:tcBorders>
-          </w:tcPr>
-          <w:p>
-            <w:pPr>
-              <w:spacing w:before="60" w:after="60"/>
-              <w:ind w:left="142"/>
-            </w:pPr>
-            <w:r>
-              <w:rPr>
-                <w:rFonts w:ascii="Calibri" w:hAnsi="Calibri"/>
-                <w:b/>
-                <w:i w:val="0"/>
-                <w:color w:val="003B71"/>
-                <w:sz w:val="17"/>
-              </w:rPr>
-              <w:t xml:space="preserve">Strategy  </w:t>
-            </w:r>
-            <w:r>
-              <w:rPr>
-                <w:rFonts w:ascii="Calibri" w:hAnsi="Calibri"/>
-                <w:b w:val="0"/>
-                <w:i w:val="0"/>
-                <w:color w:val="334155"/>
-                <w:sz w:val="17"/>
-              </w:rPr>
-              <w:t>Team Medical Affairs theo dõi diễn biến chính sách từ Sở Y tế TPHCM và Bộ Y tế liên quan đến quản lý cơ sở thẩm mỹ trong Q2/2026; nếu có nghị định/thông tư siết điều kiện hoạt động phòng khám, Sales team cần đánh giá lại dự báo doanh thu MAGRAX và METILONE-4 tại kênh phòng kh</w:t>
-            </w:r>
-          </w:p>
-        </w:tc>
-      </w:tr>
-    </w:tbl>
-    <w:p>
-      <w:pPr>
-        <w:spacing w:before="40" w:after="120"/>
-      </w:pPr>
-    </w:p>
-    <w:tbl>
-      <w:tblPr>
-        <w:tblStyle w:val="TableGrid"/>
-        <w:tblW w:type="auto" w:w="0"/>
-        <w:jc w:val="left"/>
-        <w:tblLook w:firstColumn="1" w:firstRow="1" w:lastColumn="0" w:lastRow="0" w:noHBand="0" w:noVBand="1" w:val="04A0"/>
-      </w:tblPr>
-      <w:tblGrid>
-        <w:gridCol w:w="4536"/>
-        <w:gridCol w:w="4536"/>
-      </w:tblGrid>
-      <w:tr>
-        <w:tc>
-          <w:tcPr>
-            <w:tcW w:type="dxa" w:w="1984"/>
-            <w:shd w:val="clear" w:color="auto" w:fill="EEF2FF"/>
-            <w:tcBorders>
-              <w:top w:val="none" w:sz="6" w:color="auto"/>
-              <w:bottom w:val="none" w:sz="6" w:color="auto"/>
-              <w:left w:val="none" w:sz="6" w:color="auto"/>
-              <w:right w:val="none" w:sz="6" w:color="auto"/>
-            </w:tcBorders>
-          </w:tcPr>
-          <w:p>
-            <w:pPr>
-              <w:spacing w:before="80" w:after="80"/>
-              <w:ind w:left="85"/>
-            </w:pPr>
-            <w:r>
-              <w:rPr>
-                <w:rFonts w:ascii="Calibri" w:hAnsi="Calibri"/>
-                <w:b/>
-                <w:i w:val="0"/>
-                <w:color w:val="4338CA"/>
-                <w:sz w:val="15"/>
-              </w:rPr>
-              <w:t>DÂN TRÍ – SỨC KHỎE</w:t>
-            </w:r>
-          </w:p>
-        </w:tc>
-        <w:tc>
-          <w:tcPr>
-            <w:tcW w:type="dxa" w:w="4536"/>
-            <w:tcBorders>
-              <w:top w:val="none" w:sz="6" w:color="auto"/>
-              <w:bottom w:val="none" w:sz="6" w:color="auto"/>
-              <w:left w:val="none" w:sz="6" w:color="auto"/>
-              <w:right w:val="none" w:sz="6" w:color="auto"/>
-            </w:tcBorders>
-          </w:tcPr>
-          <w:p>
-            <w:pPr>
-              <w:spacing w:before="60" w:after="60"/>
-              <w:ind w:left="113"/>
-            </w:pPr>
-            <w:r>
-              <w:rPr>
-                <w:rFonts w:ascii="Calibri" w:hAnsi="Calibri"/>
-                <w:b/>
-                <w:i w:val="0"/>
-                <w:color w:val="111827"/>
-                <w:sz w:val="21"/>
-              </w:rPr>
-              <w:t>Piperin trong hạt tiêu: tác dụng hỗ trợ tim mạch, chuyển hóa mỡ và lưu ý tương tác thuốc</w:t>
-            </w:r>
-          </w:p>
-        </w:tc>
-      </w:tr>
-    </w:tbl>
-    <w:p>
-      <w:pPr>
-        <w:spacing w:before="40" w:after="40"/>
-        <w:ind w:left="170"/>
-      </w:pPr>
-      <w:r>
-        <w:rPr>
-          <w:rFonts w:ascii="Calibri" w:hAnsi="Calibri"/>
-          <w:b w:val="0"/>
-          <w:i/>
-          <w:color w:val="6B7280"/>
-          <w:sz w:val="18"/>
-        </w:rPr>
-        <w:t>Bài viết khoa học phổ thông ghi nhận piperin trong hạt tiêu có khả năng cải thiện lipid máu (giảm LDL, tăng HDL) và hỗ trợ chuyển hóa năng lượng, song cảnh báo piperin có thể ảnh hưởng chuyển hóa thuốc qua gan và quá trình đông máu — đặc biệt quan trọng với bệnh nhân dùng thuốc chống đông hoặc thuốc tim mạch dài hạn. Thông tin này không tác động trực tiếp đến hoạt động đấu thầu của Davipharm, nhưng phản ánh xu hướng người dùng quan tâm đến giải pháp hỗ trợ tim mạch–lipid tự nhiên song song với dược phẩm.</w:t>
-      </w:r>
-    </w:p>
-    <w:p>
-      <w:pPr>
-        <w:spacing w:before="20" w:after="40"/>
-        <w:ind w:left="170"/>
-      </w:pPr>
-      <w:r>
-        <w:rPr>
-          <w:rFonts w:ascii="Calibri" w:hAnsi="Calibri"/>
-          <w:b/>
-          <w:i w:val="0"/>
-          <w:color w:val="374151"/>
-          <w:sz w:val="17"/>
-        </w:rPr>
-        <w:t>➖ Tác động trực tiếp đến Davipharm không đáng kể; tuy nhiên cảnh báo tương tác piperin–thuốc tim mạch có thể được khai thác trong nội dung y tế hỗ trợ bán hàng cho RAVASTEL (Rosuvastatin) và ZABALES (Clopidogrel).</w:t>
-      </w:r>
-    </w:p>
-    <w:tbl>
-      <w:tblPr>
-        <w:tblStyle w:val="TableGrid"/>
-        <w:tblW w:type="auto" w:w="0"/>
-        <w:tblLook w:firstColumn="1" w:firstRow="1" w:lastColumn="0" w:lastRow="0" w:noHBand="0" w:noVBand="1" w:val="04A0"/>
-      </w:tblPr>
-      <w:tblGrid>
-        <w:gridCol w:w="9072"/>
-      </w:tblGrid>
-      <w:tr>
-        <w:tc>
-          <w:tcPr>
-            <w:tcW w:type="dxa" w:w="9072"/>
-            <w:shd w:val="clear" w:color="auto" w:fill="F8FAFC"/>
-            <w:tcBorders>
-              <w:top w:val="none" w:sz="6" w:color="auto"/>
-              <w:bottom w:val="none" w:sz="6" w:color="auto"/>
-              <w:left w:val="single" w:sz="12" w:color="003B71"/>
-              <w:right w:val="none" w:sz="6" w:color="auto"/>
-            </w:tcBorders>
-          </w:tcPr>
-          <w:p>
-            <w:pPr>
-              <w:spacing w:before="60" w:after="60"/>
-              <w:ind w:left="142"/>
-            </w:pPr>
-            <w:r>
-              <w:rPr>
-                <w:rFonts w:ascii="Calibri" w:hAnsi="Calibri"/>
-                <w:b/>
-                <w:i w:val="0"/>
-                <w:color w:val="003B71"/>
-                <w:sz w:val="17"/>
-              </w:rPr>
-              <w:t xml:space="preserve">Strategy  </w:t>
-            </w:r>
-            <w:r>
-              <w:rPr>
-                <w:rFonts w:ascii="Calibri" w:hAnsi="Calibri"/>
-                <w:b w:val="0"/>
-                <w:i w:val="0"/>
-                <w:color w:val="334155"/>
-                <w:sz w:val="17"/>
-              </w:rPr>
-              <w:t>Team Medical Affairs có thể tích hợp thông tin tương tác piperin vào tài liệu đào tạo trình dược viên cho nhóm tim mạch (RAVASTEL, ZABALES, PECHAUNOX) nhằm củng cố lập luận về tầm quan trọng của thuốc kê đơn kiểm soát lipid so với giải pháp tự nhiên; thực hiện trong vòng 1 tháng như nội dung bổ trợ định kỳ.</w:t>
-            </w:r>
-          </w:p>
-        </w:tc>
-      </w:tr>
-    </w:tbl>
-    <w:p>
-      <w:pPr>
-        <w:spacing w:before="40" w:after="120"/>
-      </w:pPr>
-    </w:p>
-    <w:tbl>
-      <w:tblPr>
-        <w:tblStyle w:val="TableGrid"/>
-        <w:tblW w:type="auto" w:w="0"/>
-        <w:jc w:val="left"/>
-        <w:tblLook w:firstColumn="1" w:firstRow="1" w:lastColumn="0" w:lastRow="0" w:noHBand="0" w:noVBand="1" w:val="04A0"/>
-      </w:tblPr>
-      <w:tblGrid>
-        <w:gridCol w:w="4536"/>
-        <w:gridCol w:w="4536"/>
-      </w:tblGrid>
-      <w:tr>
-        <w:tc>
-          <w:tcPr>
-            <w:tcW w:type="dxa" w:w="1984"/>
-            <w:shd w:val="clear" w:color="auto" w:fill="EEF2FF"/>
-            <w:tcBorders>
-              <w:top w:val="none" w:sz="6" w:color="auto"/>
-              <w:bottom w:val="none" w:sz="6" w:color="auto"/>
-              <w:left w:val="none" w:sz="6" w:color="auto"/>
-              <w:right w:val="none" w:sz="6" w:color="auto"/>
-            </w:tcBorders>
-          </w:tcPr>
-          <w:p>
-            <w:pPr>
-              <w:spacing w:before="80" w:after="80"/>
-              <w:ind w:left="85"/>
-            </w:pPr>
-            <w:r>
-              <w:rPr>
-                <w:rFonts w:ascii="Calibri" w:hAnsi="Calibri"/>
-                <w:b/>
-                <w:i w:val="0"/>
-                <w:color w:val="4338CA"/>
-                <w:sz w:val="15"/>
-              </w:rPr>
-              <w:t>DÂN TRÍ – SỨC KHỎE</w:t>
-            </w:r>
-          </w:p>
-        </w:tc>
-        <w:tc>
-          <w:tcPr>
-            <w:tcW w:type="dxa" w:w="4536"/>
-            <w:tcBorders>
-              <w:top w:val="none" w:sz="6" w:color="auto"/>
-              <w:bottom w:val="none" w:sz="6" w:color="auto"/>
-              <w:left w:val="none" w:sz="6" w:color="auto"/>
-              <w:right w:val="none" w:sz="6" w:color="auto"/>
-            </w:tcBorders>
-          </w:tcPr>
-          <w:p>
-            <w:pPr>
-              <w:spacing w:before="60" w:after="60"/>
-              <w:ind w:left="113"/>
-            </w:pPr>
-            <w:r>
-              <w:rPr>
-                <w:rFonts w:ascii="Calibri" w:hAnsi="Calibri"/>
-                <w:b/>
-                <w:i w:val="0"/>
-                <w:color w:val="111827"/>
-                <w:sz w:val="21"/>
-              </w:rPr>
-              <w:t>Bộ Y tế ban hành hướng dẫn khám sức khỏe định kỳ miễn phí toàn dân từ 2026 — cơ hội sàng lọc bệnh mạn tính</w:t>
-            </w:r>
-          </w:p>
-        </w:tc>
-      </w:tr>
-    </w:tbl>
-    <w:p>
-      <w:pPr>
-        <w:spacing w:before="40" w:after="40"/>
-        <w:ind w:left="170"/>
-      </w:pPr>
-      <w:r>
-        <w:rPr>
-          <w:rFonts w:ascii="Calibri" w:hAnsi="Calibri"/>
-          <w:b w:val="0"/>
-          <w:i/>
-          <w:color w:val="6B7280"/>
-          <w:sz w:val="18"/>
-        </w:rPr>
-        <w:t>Bộ Y tế ban hành hướng dẫn khám sức khỏe định kỳ miễn phí ít nhất 1 lần/năm cho toàn dân từ 18 tuổi, bao gồm xét nghiệm đường máu, sinh hóa tim mạch và chụp X-quang — gói cơ bản đủ để sàng lọc tiểu đường và tim mạch ở quy mô dân số. Chính sách này kỳ vọng gia tăng đáng kể số ca phát hiện mới cao huyết áp, rối loạn lipid máu và đái tháo đường — các chỉ định điều trị trực tiếp của RAVASTEL (Rosuvastatin), EIMLER-10 (Empagliflozin), ZLATKO (Sitagliptin), PECHAUNOX, TABAREX, HATLOP.</w:t>
-      </w:r>
-    </w:p>
-    <w:p>
-      <w:pPr>
-        <w:spacing w:before="20" w:after="40"/>
-        <w:ind w:left="170"/>
-      </w:pPr>
-      <w:r>
-        <w:rPr>
-          <w:rFonts w:ascii="Calibri" w:hAnsi="Calibri"/>
-          <w:b/>
-          <w:i w:val="0"/>
-          <w:color w:val="166534"/>
-          <w:sz w:val="17"/>
-        </w:rPr>
-        <w:t>🟢 Sàng lọc đại trà sẽ mở rộng phễu bệnh nhân mới cho nhóm tim mạch và đái tháo đường — tác động thuận chiều lên nhu cầu dài hạn với RAVASTEL, EIMLER-10, ZLATKO, PECHAUNOX trong kênh ETC.</w:t>
-      </w:r>
-    </w:p>
-    <w:tbl>
-      <w:tblPr>
-        <w:tblStyle w:val="TableGrid"/>
-        <w:tblW w:type="auto" w:w="0"/>
-        <w:tblLook w:firstColumn="1" w:firstRow="1" w:lastColumn="0" w:lastRow="0" w:noHBand="0" w:noVBand="1" w:val="04A0"/>
-      </w:tblPr>
-      <w:tblGrid>
-        <w:gridCol w:w="9072"/>
-      </w:tblGrid>
-      <w:tr>
-        <w:tc>
-          <w:tcPr>
-            <w:tcW w:type="dxa" w:w="9072"/>
-            <w:shd w:val="clear" w:color="auto" w:fill="F8FAFC"/>
-            <w:tcBorders>
-              <w:top w:val="none" w:sz="6" w:color="auto"/>
-              <w:bottom w:val="none" w:sz="6" w:color="auto"/>
-              <w:left w:val="single" w:sz="12" w:color="003B71"/>
-              <w:right w:val="none" w:sz="6" w:color="auto"/>
-            </w:tcBorders>
-          </w:tcPr>
-          <w:p>
-            <w:pPr>
-              <w:spacing w:before="60" w:after="60"/>
-              <w:ind w:left="142"/>
-            </w:pPr>
-            <w:r>
-              <w:rPr>
-                <w:rFonts w:ascii="Calibri" w:hAnsi="Calibri"/>
-                <w:b/>
-                <w:i w:val="0"/>
-                <w:color w:val="003B71"/>
-                <w:sz w:val="17"/>
-              </w:rPr>
-              <w:t xml:space="preserve">Strategy  </w:t>
-            </w:r>
-            <w:r>
-              <w:rPr>
-                <w:rFonts w:ascii="Calibri" w:hAnsi="Calibri"/>
-                <w:b w:val="0"/>
-                <w:i w:val="0"/>
-                <w:color w:val="334155"/>
-                <w:sz w:val="17"/>
-              </w:rPr>
-              <w:t>Team Marketing &amp; Medical Affairs cần theo dõi lộ trình ban hành Nghị định hướng dẫn Luật Phòng bệnh (dự kiến 2026) để xác định thời điểm chính sách có hiệu lực thực tế; đồng thời chuẩn bị tài liệu y khoa hỗ trợ kê đơn sau sàng lọc cho RAVASTEL, EIMLER-10 và ZLATKO, ưu tiên tuyến huyện — nơi sẽ tiếp nhận lượng lớn ca chẩn đoán mới.</w:t>
-            </w:r>
-          </w:p>
-        </w:tc>
-      </w:tr>
-    </w:tbl>
-    <w:p>
-      <w:pPr>
-        <w:spacing w:before="40" w:after="120"/>
-      </w:pPr>
-    </w:p>
-    <w:tbl>
-      <w:tblPr>
-        <w:tblStyle w:val="TableGrid"/>
-        <w:tblW w:type="auto" w:w="0"/>
-        <w:jc w:val="left"/>
-        <w:tblLook w:firstColumn="1" w:firstRow="1" w:lastColumn="0" w:lastRow="0" w:noHBand="0" w:noVBand="1" w:val="04A0"/>
-      </w:tblPr>
-      <w:tblGrid>
-        <w:gridCol w:w="4536"/>
-        <w:gridCol w:w="4536"/>
-      </w:tblGrid>
-      <w:tr>
-        <w:tc>
-          <w:tcPr>
-            <w:tcW w:type="dxa" w:w="1984"/>
-            <w:shd w:val="clear" w:color="auto" w:fill="EEF2FF"/>
-            <w:tcBorders>
-              <w:top w:val="none" w:sz="6" w:color="auto"/>
-              <w:bottom w:val="none" w:sz="6" w:color="auto"/>
-              <w:left w:val="none" w:sz="6" w:color="auto"/>
-              <w:right w:val="none" w:sz="6" w:color="auto"/>
-            </w:tcBorders>
-          </w:tcPr>
-          <w:p>
-            <w:pPr>
-              <w:spacing w:before="80" w:after="80"/>
-              <w:ind w:left="85"/>
-            </w:pPr>
-            <w:r>
-              <w:rPr>
-                <w:rFonts w:ascii="Calibri" w:hAnsi="Calibri"/>
-                <w:b/>
-                <w:i w:val="0"/>
-                <w:color w:val="4338CA"/>
-                <w:sz w:val="15"/>
-              </w:rPr>
-              <w:t>DÂN TRÍ – SỨC KHỎE</w:t>
-            </w:r>
-          </w:p>
-        </w:tc>
-        <w:tc>
-          <w:tcPr>
-            <w:tcW w:type="dxa" w:w="4536"/>
-            <w:tcBorders>
-              <w:top w:val="none" w:sz="6" w:color="auto"/>
-              <w:bottom w:val="none" w:sz="6" w:color="auto"/>
-              <w:left w:val="none" w:sz="6" w:color="auto"/>
-              <w:right w:val="none" w:sz="6" w:color="auto"/>
-            </w:tcBorders>
-          </w:tcPr>
-          <w:p>
-            <w:pPr>
-              <w:spacing w:before="60" w:after="60"/>
-              <w:ind w:left="113"/>
-            </w:pPr>
-            <w:r>
-              <w:rPr>
-                <w:rFonts w:ascii="Calibri" w:hAnsi="Calibri"/>
-                <w:b/>
-                <w:i w:val="0"/>
-                <w:color w:val="111827"/>
-                <w:sz w:val="21"/>
-              </w:rPr>
-              <w:t>90% người dân Việt có vấn đề răng miệng — Thị trường nha khoa mở rộng, không liên quan danh mục Davipharm</w:t>
-            </w:r>
-          </w:p>
-        </w:tc>
-      </w:tr>
-    </w:tbl>
-    <w:p>
-      <w:pPr>
-        <w:spacing w:before="40" w:after="40"/>
-        <w:ind w:left="170"/>
-      </w:pPr>
-      <w:r>
-        <w:rPr>
-          <w:rFonts w:ascii="Calibri" w:hAnsi="Calibri"/>
-          <w:b w:val="0"/>
-          <w:i/>
-          <w:color w:val="6B7280"/>
-          <w:sz w:val="18"/>
-        </w:rPr>
-        <w:t>Hội nghị Nha khoa Châu Á–Thái Bình Dương lần thứ 47 tại Hà Nội công bố 90% người dân Việt có vấn đề răng miệng, Bộ Y tế định hướng đẩy mạnh dự phòng và điều trị chuyên sâu trong lĩnh vực nha khoa. Davipharm hiện không có sản phẩm nào trong danh mục răng–hàm–mặt, nên sự kiện này không tạo tác động trực tiếp đến doanh thu hay hoạt động đấu thầu.</w:t>
-      </w:r>
-    </w:p>
-    <w:p>
-      <w:pPr>
-        <w:spacing w:before="20" w:after="40"/>
-        <w:ind w:left="170"/>
-      </w:pPr>
-      <w:r>
-        <w:rPr>
-          <w:rFonts w:ascii="Calibri" w:hAnsi="Calibri"/>
-          <w:b/>
-          <w:i w:val="0"/>
-          <w:color w:val="374151"/>
-          <w:sz w:val="17"/>
-        </w:rPr>
-        <w:t>⚪ Không liên quan đến danh mục chiến lược của Davipharm — theo dõi thụ động, không cần hành động ưu tiên.</w:t>
-      </w:r>
-    </w:p>
-    <w:tbl>
-      <w:tblPr>
-        <w:tblStyle w:val="TableGrid"/>
-        <w:tblW w:type="auto" w:w="0"/>
-        <w:tblLook w:firstColumn="1" w:firstRow="1" w:lastColumn="0" w:lastRow="0" w:noHBand="0" w:noVBand="1" w:val="04A0"/>
-      </w:tblPr>
-      <w:tblGrid>
-        <w:gridCol w:w="9072"/>
-      </w:tblGrid>
-      <w:tr>
-        <w:tc>
-          <w:tcPr>
-            <w:tcW w:type="dxa" w:w="9072"/>
-            <w:shd w:val="clear" w:color="auto" w:fill="F8FAFC"/>
-            <w:tcBorders>
-              <w:top w:val="none" w:sz="6" w:color="auto"/>
-              <w:bottom w:val="none" w:sz="6" w:color="auto"/>
-              <w:left w:val="single" w:sz="12" w:color="003B71"/>
-              <w:right w:val="none" w:sz="6" w:color="auto"/>
-            </w:tcBorders>
-          </w:tcPr>
-          <w:p>
-            <w:pPr>
-              <w:spacing w:before="60" w:after="60"/>
-              <w:ind w:left="142"/>
-            </w:pPr>
-            <w:r>
-              <w:rPr>
-                <w:rFonts w:ascii="Calibri" w:hAnsi="Calibri"/>
-                <w:b/>
-                <w:i w:val="0"/>
-                <w:color w:val="003B71"/>
-                <w:sz w:val="17"/>
-              </w:rPr>
-              <w:t xml:space="preserve">Strategy  </w:t>
-            </w:r>
-            <w:r>
-              <w:rPr>
-                <w:rFonts w:ascii="Calibri" w:hAnsi="Calibri"/>
-                <w:b w:val="0"/>
-                <w:i w:val="0"/>
-                <w:color w:val="334155"/>
-                <w:sz w:val="17"/>
-              </w:rPr>
-              <w:t>Không có hành động ngắn hạn cần thiết; Business Development có thể ghi nhận xu hướng mở rộng thị trường nha khoa như tín hiệu dài hạn nếu công ty cân nhắc mở rộng danh mục OTC chăm sóc miệng trong tương lai.</w:t>
-            </w:r>
-          </w:p>
-        </w:tc>
-      </w:tr>
-    </w:tbl>
-    <w:p>
-      <w:pPr>
-        <w:spacing w:before="40" w:after="120"/>
-      </w:pPr>
-    </w:p>
-    <w:tbl>
-      <w:tblPr>
-        <w:tblStyle w:val="TableGrid"/>
-        <w:tblW w:type="auto" w:w="0"/>
-        <w:jc w:val="left"/>
-        <w:tblLook w:firstColumn="1" w:firstRow="1" w:lastColumn="0" w:lastRow="0" w:noHBand="0" w:noVBand="1" w:val="04A0"/>
-      </w:tblPr>
-      <w:tblGrid>
-        <w:gridCol w:w="4536"/>
-        <w:gridCol w:w="4536"/>
-      </w:tblGrid>
-      <w:tr>
-        <w:tc>
-          <w:tcPr>
-            <w:tcW w:type="dxa" w:w="1984"/>
-            <w:shd w:val="clear" w:color="auto" w:fill="EEF2FF"/>
-            <w:tcBorders>
-              <w:top w:val="none" w:sz="6" w:color="auto"/>
-              <w:bottom w:val="none" w:sz="6" w:color="auto"/>
-              <w:left w:val="none" w:sz="6" w:color="auto"/>
-              <w:right w:val="none" w:sz="6" w:color="auto"/>
-            </w:tcBorders>
-          </w:tcPr>
-          <w:p>
-            <w:pPr>
-              <w:spacing w:before="80" w:after="80"/>
-              <w:ind w:left="85"/>
-            </w:pPr>
-            <w:r>
-              <w:rPr>
-                <w:rFonts w:ascii="Calibri" w:hAnsi="Calibri"/>
-                <w:b/>
-                <w:i w:val="0"/>
-                <w:color w:val="4338CA"/>
-                <w:sz w:val="15"/>
-              </w:rPr>
-              <w:t>DÂN TRÍ – SỨC KHỎE</w:t>
-            </w:r>
-          </w:p>
-        </w:tc>
-        <w:tc>
-          <w:tcPr>
-            <w:tcW w:type="dxa" w:w="4536"/>
-            <w:tcBorders>
-              <w:top w:val="none" w:sz="6" w:color="auto"/>
-              <w:bottom w:val="none" w:sz="6" w:color="auto"/>
-              <w:left w:val="none" w:sz="6" w:color="auto"/>
-              <w:right w:val="none" w:sz="6" w:color="auto"/>
-            </w:tcBorders>
-          </w:tcPr>
-          <w:p>
-            <w:pPr>
-              <w:spacing w:before="60" w:after="60"/>
-              <w:ind w:left="113"/>
-            </w:pPr>
-            <w:r>
-              <w:rPr>
-                <w:rFonts w:ascii="Calibri" w:hAnsi="Calibri"/>
-                <w:b/>
-                <w:i w:val="0"/>
-                <w:color w:val="111827"/>
-                <w:sz w:val="21"/>
-              </w:rPr>
-              <w:t>Bộ Y tế đề xuất đãi ngộ đặc thù cho y tế tuyến đảo — Tín hiệu củng cố y tế cơ sở vùng xa</w:t>
-            </w:r>
-          </w:p>
-        </w:tc>
-      </w:tr>
-    </w:tbl>
-    <w:p>
-      <w:pPr>
-        <w:spacing w:before="40" w:after="40"/>
-        <w:ind w:left="170"/>
-      </w:pPr>
-      <w:r>
-        <w:rPr>
-          <w:rFonts w:ascii="Calibri" w:hAnsi="Calibri"/>
-          <w:b w:val="0"/>
-          <w:i/>
-          <w:color w:val="6B7280"/>
-          <w:sz w:val="18"/>
-        </w:rPr>
-        <w:t>Thứ trưởng Bộ Y tế Trần Văn Thuấn công bố kế hoạch tham mưu Chính phủ hoàn thiện khung pháp lý đãi ngộ đặc thù cho y tế hải đảo sau chuyến khảo sát Trường Sa (4–10/5/2026), đồng thời hỗ trợ 3,3 tỷ đồng thiết bị y tế và cơ số thuốc cho 7 đảo. Tin tức này phản ánh định hướng tăng cường năng lực y tế cơ sở vùng xa, không tác động trực tiếp đến danh mục ETC hay đấu thầu của Davipharm.</w:t>
-      </w:r>
-    </w:p>
-    <w:p>
-      <w:pPr>
-        <w:spacing w:before="20" w:after="40"/>
-        <w:ind w:left="170"/>
-      </w:pPr>
-      <w:r>
-        <w:rPr>
-          <w:rFonts w:ascii="Calibri" w:hAnsi="Calibri"/>
-          <w:b/>
-          <w:i w:val="0"/>
-          <w:color w:val="374151"/>
-          <w:sz w:val="17"/>
-        </w:rPr>
-        <w:t>➖ Bài không liên quan trực tiếp đến sản phẩm hay kênh phân phối của Davipharm; không phát sinh cơ hội hay rủi ro tức thời.</w:t>
-      </w:r>
-    </w:p>
-    <w:tbl>
-      <w:tblPr>
-        <w:tblStyle w:val="TableGrid"/>
-        <w:tblW w:type="auto" w:w="0"/>
-        <w:tblLook w:firstColumn="1" w:firstRow="1" w:lastColumn="0" w:lastRow="0" w:noHBand="0" w:noVBand="1" w:val="04A0"/>
-      </w:tblPr>
-      <w:tblGrid>
-        <w:gridCol w:w="9072"/>
-      </w:tblGrid>
-      <w:tr>
-        <w:tc>
-          <w:tcPr>
-            <w:tcW w:type="dxa" w:w="9072"/>
-            <w:shd w:val="clear" w:color="auto" w:fill="F8FAFC"/>
-            <w:tcBorders>
-              <w:top w:val="none" w:sz="6" w:color="auto"/>
-              <w:bottom w:val="none" w:sz="6" w:color="auto"/>
-              <w:left w:val="single" w:sz="12" w:color="003B71"/>
-              <w:right w:val="none" w:sz="6" w:color="auto"/>
-            </w:tcBorders>
-          </w:tcPr>
-          <w:p>
-            <w:pPr>
-              <w:spacing w:before="60" w:after="60"/>
-              <w:ind w:left="142"/>
-            </w:pPr>
-            <w:r>
-              <w:rPr>
-                <w:rFonts w:ascii="Calibri" w:hAnsi="Calibri"/>
-                <w:b/>
-                <w:i w:val="0"/>
-                <w:color w:val="003B71"/>
-                <w:sz w:val="17"/>
-              </w:rPr>
-              <w:t xml:space="preserve">Strategy  </w:t>
-            </w:r>
-            <w:r>
-              <w:rPr>
-                <w:rFonts w:ascii="Calibri" w:hAnsi="Calibri"/>
-                <w:b w:val="0"/>
-                <w:i w:val="0"/>
-                <w:color w:val="334155"/>
-                <w:sz w:val="17"/>
-              </w:rPr>
-              <w:t>Không cần hành động ưu tiên. Team Government Affairs có thể theo dõi động thái hoàn thiện khung pháp lý đãi ngộ y tế đảo — nếu dẫn đến mở rộng danh mục thuốc cấp phát tuyến cơ sở (bao gồm tim mạch, đái tháo đường), cân nhắc đăng ký sản phẩm như RAVASTEL, ZLATKO vào các gói cung ứng thuốc quốc phòng/đặc thù trong tương lai.</w:t>
-            </w:r>
-          </w:p>
-        </w:tc>
-      </w:tr>
-    </w:tbl>
-    <w:p>
-      <w:pPr>
-        <w:spacing w:before="40" w:after="120"/>
-      </w:pPr>
-    </w:p>
-    <w:tbl>
-      <w:tblPr>
-        <w:tblStyle w:val="TableGrid"/>
-        <w:tblW w:type="auto" w:w="0"/>
-        <w:jc w:val="left"/>
-        <w:tblLook w:firstColumn="1" w:firstRow="1" w:lastColumn="0" w:lastRow="0" w:noHBand="0" w:noVBand="1" w:val="04A0"/>
-      </w:tblPr>
-      <w:tblGrid>
-        <w:gridCol w:w="4536"/>
-        <w:gridCol w:w="4536"/>
-      </w:tblGrid>
-      <w:tr>
-        <w:tc>
-          <w:tcPr>
-            <w:tcW w:type="dxa" w:w="1984"/>
-            <w:shd w:val="clear" w:color="auto" w:fill="EEF2FF"/>
-            <w:tcBorders>
-              <w:top w:val="none" w:sz="6" w:color="auto"/>
-              <w:bottom w:val="none" w:sz="6" w:color="auto"/>
-              <w:left w:val="none" w:sz="6" w:color="auto"/>
-              <w:right w:val="none" w:sz="6" w:color="auto"/>
-            </w:tcBorders>
-          </w:tcPr>
-          <w:p>
-            <w:pPr>
-              <w:spacing w:before="80" w:after="80"/>
-              <w:ind w:left="85"/>
-            </w:pPr>
-            <w:r>
-              <w:rPr>
-                <w:rFonts w:ascii="Calibri" w:hAnsi="Calibri"/>
-                <w:b/>
-                <w:i w:val="0"/>
-                <w:color w:val="4338CA"/>
-                <w:sz w:val="15"/>
-              </w:rPr>
-              <w:t>DÂN TRÍ – SỨC KHỎE</w:t>
-            </w:r>
-          </w:p>
-        </w:tc>
-        <w:tc>
-          <w:tcPr>
-            <w:tcW w:type="dxa" w:w="4536"/>
-            <w:tcBorders>
-              <w:top w:val="none" w:sz="6" w:color="auto"/>
-              <w:bottom w:val="none" w:sz="6" w:color="auto"/>
-              <w:left w:val="none" w:sz="6" w:color="auto"/>
-              <w:right w:val="none" w:sz="6" w:color="auto"/>
-            </w:tcBorders>
-          </w:tcPr>
-          <w:p>
-            <w:pPr>
-              <w:spacing w:before="60" w:after="60"/>
-              <w:ind w:left="113"/>
-            </w:pPr>
-            <w:r>
-              <w:rPr>
-                <w:rFonts w:ascii="Calibri" w:hAnsi="Calibri"/>
-                <w:b/>
-                <w:i w:val="0"/>
-                <w:color w:val="111827"/>
-                <w:sz w:val="21"/>
-              </w:rPr>
-              <w:t>Tăng huyết áp bỏ sót ở hàng triệu người Việt — Cơ hội mở rộng thị trường thuốc tim mạch (Perindopril+Amlodipin, Valsartan, Irbesartan)</w:t>
-            </w:r>
-          </w:p>
-        </w:tc>
-      </w:tr>
-    </w:tbl>
-    <w:p>
-      <w:pPr>
-        <w:spacing w:before="40" w:after="40"/>
-        <w:ind w:left="170"/>
-      </w:pPr>
-      <w:r>
-        <w:rPr>
-          <w:rFonts w:ascii="Calibri" w:hAnsi="Calibri"/>
-          <w:b w:val="0"/>
-          <w:i/>
-          <w:color w:val="6B7280"/>
-          <w:sz w:val="18"/>
-        </w:rPr>
-        <w:t>Chuyên gia Hội Tim mạch học Việt Nam cảnh báo 25–30% người trưởng thành Việt Nam mắc tăng huyết áp nhưng tỷ lệ chẩn đoán và kiểm soát đạt mục tiêu vẫn thấp, xu hướng bệnh ngày càng trẻ hóa và nhu cầu thuốc phối hợp liều cố định tăng cao. Đây là tín hiệu tăng trưởng dài hạn trực tiếp cho nhóm sản phẩm PECHAUNOX (Perindopril+Amlodipin), TABAREX (Valsartan) và HATLOP (Irbesartan) của Davipharm tại cả kênh ETC lẫn OTC.</w:t>
-      </w:r>
-    </w:p>
-    <w:p>
-      <w:pPr>
-        <w:spacing w:before="20" w:after="40"/>
-        <w:ind w:left="170"/>
-      </w:pPr>
-      <w:r>
-        <w:rPr>
-          <w:rFonts w:ascii="Calibri" w:hAnsi="Calibri"/>
-          <w:b/>
-          <w:i w:val="0"/>
-          <w:color w:val="166534"/>
-          <w:sz w:val="17"/>
-        </w:rPr>
-        <w:t>📈 Cơ hội tăng trưởng rõ ràng: pool bệnh nhân tăng huyết áp chưa được điều trị còn rất lớn, thuốc phối hợp liều cố định (PECHAUNOX) được chuyên gia khuyến nghị là hướng điều trị ưu tiên — trực tiếp hỗ trợ positioning và tăng volume đấu thầu ETC chu kỳ tới.</w:t>
-      </w:r>
-    </w:p>
-    <w:tbl>
-      <w:tblPr>
-        <w:tblStyle w:val="TableGrid"/>
-        <w:tblW w:type="auto" w:w="0"/>
-        <w:tblLook w:firstColumn="1" w:firstRow="1" w:lastColumn="0" w:lastRow="0" w:noHBand="0" w:noVBand="1" w:val="04A0"/>
-      </w:tblPr>
-      <w:tblGrid>
-        <w:gridCol w:w="9072"/>
-      </w:tblGrid>
-      <w:tr>
-        <w:tc>
-          <w:tcPr>
-            <w:tcW w:type="dxa" w:w="9072"/>
-            <w:shd w:val="clear" w:color="auto" w:fill="F8FAFC"/>
-            <w:tcBorders>
-              <w:top w:val="none" w:sz="6" w:color="auto"/>
-              <w:bottom w:val="none" w:sz="6" w:color="auto"/>
-              <w:left w:val="single" w:sz="12" w:color="003B71"/>
-              <w:right w:val="none" w:sz="6" w:color="auto"/>
-            </w:tcBorders>
-          </w:tcPr>
-          <w:p>
-            <w:pPr>
-              <w:spacing w:before="60" w:after="60"/>
-              <w:ind w:left="142"/>
-            </w:pPr>
-            <w:r>
-              <w:rPr>
-                <w:rFonts w:ascii="Calibri" w:hAnsi="Calibri"/>
-                <w:b/>
-                <w:i w:val="0"/>
-                <w:color w:val="003B71"/>
-                <w:sz w:val="17"/>
-              </w:rPr>
-              <w:t xml:space="preserve">Strategy  </w:t>
-            </w:r>
-            <w:r>
-              <w:rPr>
-                <w:rFonts w:ascii="Calibri" w:hAnsi="Calibri"/>
-                <w:b w:val="0"/>
-                <w:i w:val="0"/>
-                <w:color w:val="334155"/>
-                <w:sz w:val="17"/>
-              </w:rPr>
-              <w:t>Team Marketing Tim mạch phối hợp cùng Medical Affairs triển khai ngay tài liệu định vị PECHAUNOX như lựa chọn phối hợp liều cố định ưu tiên (Perindopril+Amlodipin), tận dụng thông điệp "tuân thủ điều trị — ít viên hơn, hiệu quả hơn" xung quanh Ngày Tăng huyết áp thế giới 17/5; đồng thời Sales ETC ưu tiên đẩy TABAREX và HATLOP vào danh mục quản lý bệnh mạn tính tại các bệnh viện tuyến tỉnh trước chu kỳ đấu thầu tiếp theo.</w:t>
-            </w:r>
-          </w:p>
-        </w:tc>
-      </w:tr>
-    </w:tbl>
-    <w:p>
-      <w:pPr>
-        <w:spacing w:before="40" w:after="120"/>
-      </w:pPr>
-    </w:p>
-    <w:tbl>
-      <w:tblPr>
-        <w:tblStyle w:val="TableGrid"/>
-        <w:tblW w:type="auto" w:w="0"/>
-        <w:jc w:val="left"/>
-        <w:tblLook w:firstColumn="1" w:firstRow="1" w:lastColumn="0" w:lastRow="0" w:noHBand="0" w:noVBand="1" w:val="04A0"/>
-      </w:tblPr>
-      <w:tblGrid>
-        <w:gridCol w:w="4536"/>
-        <w:gridCol w:w="4536"/>
-      </w:tblGrid>
-      <w:tr>
-        <w:tc>
-          <w:tcPr>
-            <w:tcW w:type="dxa" w:w="1984"/>
-            <w:shd w:val="clear" w:color="auto" w:fill="EEF2FF"/>
-            <w:tcBorders>
-              <w:top w:val="none" w:sz="6" w:color="auto"/>
-              <w:bottom w:val="none" w:sz="6" w:color="auto"/>
-              <w:left w:val="none" w:sz="6" w:color="auto"/>
-              <w:right w:val="none" w:sz="6" w:color="auto"/>
-            </w:tcBorders>
-          </w:tcPr>
-          <w:p>
-            <w:pPr>
-              <w:spacing w:before="80" w:after="80"/>
-              <w:ind w:left="85"/>
-            </w:pPr>
-            <w:r>
-              <w:rPr>
-                <w:rFonts w:ascii="Calibri" w:hAnsi="Calibri"/>
-                <w:b/>
-                <w:i w:val="0"/>
-                <w:color w:val="4338CA"/>
-                <w:sz w:val="15"/>
-              </w:rPr>
-              <w:t>DÂN TRÍ – SỨC KHỎE</w:t>
-            </w:r>
-          </w:p>
-        </w:tc>
-        <w:tc>
-          <w:tcPr>
-            <w:tcW w:type="dxa" w:w="4536"/>
-            <w:tcBorders>
-              <w:top w:val="none" w:sz="6" w:color="auto"/>
-              <w:bottom w:val="none" w:sz="6" w:color="auto"/>
-              <w:left w:val="none" w:sz="6" w:color="auto"/>
-              <w:right w:val="none" w:sz="6" w:color="auto"/>
-            </w:tcBorders>
-          </w:tcPr>
-          <w:p>
-            <w:pPr>
-              <w:spacing w:before="60" w:after="60"/>
-              <w:ind w:left="113"/>
-            </w:pPr>
-            <w:r>
-              <w:rPr>
-                <w:rFonts w:ascii="Calibri" w:hAnsi="Calibri"/>
-                <w:b/>
-                <w:i w:val="0"/>
-                <w:color w:val="111827"/>
-                <w:sz w:val="21"/>
-              </w:rPr>
-              <w:t>Bệnh cơ xương khớp trẻ hóa nhanh — xu hướng Y học tái tạo thay thế thuốc giảm đau dài hạn</w:t>
-            </w:r>
-          </w:p>
-        </w:tc>
-      </w:tr>
-    </w:tbl>
-    <w:p>
-      <w:pPr>
-        <w:spacing w:before="40" w:after="40"/>
-        <w:ind w:left="170"/>
-      </w:pPr>
-      <w:r>
-        <w:rPr>
-          <w:rFonts w:ascii="Calibri" w:hAnsi="Calibri"/>
-          <w:b w:val="0"/>
-          <w:i/>
-          <w:color w:val="6B7280"/>
-          <w:sz w:val="18"/>
-        </w:rPr>
-        <w:t>Tọa đàm do Dân Trí &amp; BV Hồng Ngọc tổ chức ghi nhận xu hướng thoái hóa khớp trẻ hóa rõ rệt (người ngoài 30 tuổi), kèm cảnh báo nguy cơ từ thói quen tự mua thuốc chống viêm/giảm đau kéo dài không kê đơn. Xu hướng Y học tái tạo được đẩy mạnh như giải pháp thay thế, có thể tác động đến nhu cầu sử dụng Etoricoxib (MAGRAX) trong phác đồ quản lý đau mạn tính cơ xương khớp.</w:t>
-      </w:r>
-    </w:p>
-    <w:p>
-      <w:pPr>
-        <w:spacing w:before="20" w:after="40"/>
-        <w:ind w:left="170"/>
-      </w:pPr>
-      <w:r>
-        <w:rPr>
-          <w:rFonts w:ascii="Calibri" w:hAnsi="Calibri"/>
-          <w:b/>
-          <w:i w:val="0"/>
-          <w:color w:val="374151"/>
-          <w:sz w:val="17"/>
-        </w:rPr>
-        <w:t>⚖️ Tín hiệu trung tính: tệp bệnh nhân xương khớp mở rộng là cơ hội tăng trưởng cho MAGRAX, nhưng áp lực từ Y học tái tạo và cảnh báo dùng thuốc dài hạn có thể kiềm chế tăng trưởng kênh OTC/ETC.</w:t>
-      </w:r>
-    </w:p>
-    <w:tbl>
-      <w:tblPr>
-        <w:tblStyle w:val="TableGrid"/>
-        <w:tblW w:type="auto" w:w="0"/>
-        <w:tblLook w:firstColumn="1" w:firstRow="1" w:lastColumn="0" w:lastRow="0" w:noHBand="0" w:noVBand="1" w:val="04A0"/>
-      </w:tblPr>
-      <w:tblGrid>
-        <w:gridCol w:w="9072"/>
-      </w:tblGrid>
-      <w:tr>
-        <w:tc>
-          <w:tcPr>
-            <w:tcW w:type="dxa" w:w="9072"/>
-            <w:shd w:val="clear" w:color="auto" w:fill="F8FAFC"/>
-            <w:tcBorders>
-              <w:top w:val="none" w:sz="6" w:color="auto"/>
-              <w:bottom w:val="none" w:sz="6" w:color="auto"/>
-              <w:left w:val="single" w:sz="12" w:color="003B71"/>
-              <w:right w:val="none" w:sz="6" w:color="auto"/>
-            </w:tcBorders>
-          </w:tcPr>
-          <w:p>
-            <w:pPr>
-              <w:spacing w:before="60" w:after="60"/>
-              <w:ind w:left="142"/>
-            </w:pPr>
-            <w:r>
-              <w:rPr>
-                <w:rFonts w:ascii="Calibri" w:hAnsi="Calibri"/>
-                <w:b/>
-                <w:i w:val="0"/>
-                <w:color w:val="003B71"/>
-                <w:sz w:val="17"/>
-              </w:rPr>
-              <w:t xml:space="preserve">Strategy  </w:t>
-            </w:r>
-            <w:r>
-              <w:rPr>
-                <w:rFonts w:ascii="Calibri" w:hAnsi="Calibri"/>
-                <w:b w:val="0"/>
-                <w:i w:val="0"/>
-                <w:color w:val="334155"/>
-                <w:sz w:val="17"/>
-              </w:rPr>
-              <w:t>Marketing &amp; Medical Affairs cần cập nhật positioning cho MAGRAX (Etoricoxib) theo hướng "quản lý đau giai đoạn cấp/bán cấp" — bổ sung dữ liệu an toàn tim mạch và GI so với NSAIDs thế hệ cũ để biện hộ cho kê đơn hợp lý trong bối cảnh Y học tái tạo lên ngôi; xem xét tài liệu detail cho bác sĩ chuyên khoa cơ xương khớp trong vòng Q3/2026.</w:t>
-            </w:r>
-          </w:p>
-        </w:tc>
-      </w:tr>
-    </w:tbl>
-    <w:p>
-      <w:pPr>
-        <w:spacing w:before="40" w:after="120"/>
-      </w:pPr>
-    </w:p>
-    <w:tbl>
-      <w:tblPr>
-        <w:tblStyle w:val="TableGrid"/>
-        <w:tblW w:type="auto" w:w="0"/>
-        <w:jc w:val="left"/>
-        <w:tblLook w:firstColumn="1" w:firstRow="1" w:lastColumn="0" w:lastRow="0" w:noHBand="0" w:noVBand="1" w:val="04A0"/>
-      </w:tblPr>
-      <w:tblGrid>
-        <w:gridCol w:w="4536"/>
-        <w:gridCol w:w="4536"/>
-      </w:tblGrid>
-      <w:tr>
-        <w:tc>
-          <w:tcPr>
-            <w:tcW w:type="dxa" w:w="1984"/>
-            <w:shd w:val="clear" w:color="auto" w:fill="EEF2FF"/>
-            <w:tcBorders>
-              <w:top w:val="none" w:sz="6" w:color="auto"/>
-              <w:bottom w:val="none" w:sz="6" w:color="auto"/>
-              <w:left w:val="none" w:sz="6" w:color="auto"/>
-              <w:right w:val="none" w:sz="6" w:color="auto"/>
-            </w:tcBorders>
-          </w:tcPr>
-          <w:p>
-            <w:pPr>
-              <w:spacing w:before="80" w:after="80"/>
-              <w:ind w:left="85"/>
-            </w:pPr>
-            <w:r>
-              <w:rPr>
-                <w:rFonts w:ascii="Calibri" w:hAnsi="Calibri"/>
-                <w:b/>
-                <w:i w:val="0"/>
-                <w:color w:val="4338CA"/>
-                <w:sz w:val="15"/>
-              </w:rPr>
-              <w:t>DÂN TRÍ – SỨC KHỎE</w:t>
-            </w:r>
-          </w:p>
-        </w:tc>
-        <w:tc>
-          <w:tcPr>
-            <w:tcW w:type="dxa" w:w="4536"/>
-            <w:tcBorders>
-              <w:top w:val="none" w:sz="6" w:color="auto"/>
-              <w:bottom w:val="none" w:sz="6" w:color="auto"/>
-              <w:left w:val="none" w:sz="6" w:color="auto"/>
-              <w:right w:val="none" w:sz="6" w:color="auto"/>
-            </w:tcBorders>
-          </w:tcPr>
-          <w:p>
-            <w:pPr>
-              <w:spacing w:before="60" w:after="60"/>
-              <w:ind w:left="113"/>
-            </w:pPr>
-            <w:r>
-              <w:rPr>
-                <w:rFonts w:ascii="Calibri" w:hAnsi="Calibri"/>
-                <w:b/>
-                <w:i w:val="0"/>
-                <w:color w:val="111827"/>
-                <w:sz w:val="21"/>
-              </w:rPr>
-              <w:t>Xu hướng nội soi siêu phóng đại phát hiện sớm ung thư tiêu hóa: Tín hiệu tăng nhu cầu điều trị</w:t>
-            </w:r>
-          </w:p>
-        </w:tc>
-      </w:tr>
-    </w:tbl>
-    <w:p>
-      <w:pPr>
-        <w:spacing w:before="40" w:after="40"/>
-        <w:ind w:left="170"/>
-      </w:pPr>
-      <w:r>
-        <w:rPr>
-          <w:rFonts w:ascii="Calibri" w:hAnsi="Calibri"/>
-          <w:b w:val="0"/>
-          <w:i/>
-          <w:color w:val="6B7280"/>
-          <w:sz w:val="18"/>
-        </w:rPr>
-        <w:t>Công nghệ nội soi Endocyto 520x (Olympus) triển khai tại Thu Cúc TCI cho phép phát hiện ung thư tiêu hóa ở cấp độ tế bào, báo hiệu tỷ lệ phát hiện sớm ung thư đường tiêu hóa tại Việt Nam sẽ tăng đáng kể trong các năm tới. Việc chẩn đoán sớm hơn sẽ kéo theo gia tăng số bệnh nhân bước vào giai đoạn điều trị bằng thuốc kê đơn, trực tiếp mở rộng thị trường ETC cho các sản phẩm ung thư của Davipharm.</w:t>
-      </w:r>
-    </w:p>
-    <w:p>
-      <w:pPr>
-        <w:spacing w:before="20" w:after="40"/>
-        <w:ind w:left="170"/>
-      </w:pPr>
-      <w:r>
-        <w:rPr>
-          <w:rFonts w:ascii="Calibri" w:hAnsi="Calibri"/>
-          <w:b/>
-          <w:i w:val="0"/>
-          <w:color w:val="166534"/>
-          <w:sz w:val="17"/>
-        </w:rPr>
-        <w:t>📈 Cơ hội trung hạn: gia tăng bệnh nhân ung thư tiêu hóa được chẩn đoán sớm sẽ thúc đẩy nhu cầu điều trị, tạo điều kiện mở rộng thị phần ETC cho HYYR (Erlotinib) và LARRIVEY (Bicalutamide) trong các gói thầu bệnh viện.</w:t>
-      </w:r>
-    </w:p>
-    <w:tbl>
-      <w:tblPr>
-        <w:tblStyle w:val="TableGrid"/>
-        <w:tblW w:type="auto" w:w="0"/>
-        <w:tblLook w:firstColumn="1" w:firstRow="1" w:lastColumn="0" w:lastRow="0" w:noHBand="0" w:noVBand="1" w:val="04A0"/>
-      </w:tblPr>
-      <w:tblGrid>
-        <w:gridCol w:w="9072"/>
-      </w:tblGrid>
-      <w:tr>
-        <w:tc>
-          <w:tcPr>
-            <w:tcW w:type="dxa" w:w="9072"/>
-            <w:shd w:val="clear" w:color="auto" w:fill="F8FAFC"/>
-            <w:tcBorders>
-              <w:top w:val="none" w:sz="6" w:color="auto"/>
-              <w:bottom w:val="none" w:sz="6" w:color="auto"/>
-              <w:left w:val="single" w:sz="12" w:color="003B71"/>
-              <w:right w:val="none" w:sz="6" w:color="auto"/>
-            </w:tcBorders>
-          </w:tcPr>
-          <w:p>
-            <w:pPr>
-              <w:spacing w:before="60" w:after="60"/>
-              <w:ind w:left="142"/>
-            </w:pPr>
-            <w:r>
-              <w:rPr>
-                <w:rFonts w:ascii="Calibri" w:hAnsi="Calibri"/>
-                <w:b/>
-                <w:i w:val="0"/>
-                <w:color w:val="003B71"/>
-                <w:sz w:val="17"/>
-              </w:rPr>
-              <w:t xml:space="preserve">Strategy  </w:t>
-            </w:r>
-            <w:r>
-              <w:rPr>
-                <w:rFonts w:ascii="Calibri" w:hAnsi="Calibri"/>
-                <w:b w:val="0"/>
-                <w:i w:val="0"/>
-                <w:color w:val="334155"/>
-                <w:sz w:val="17"/>
-              </w:rPr>
-              <w:t>Team Marketing ETC phối hợp với Medical Affairs theo dõi sự mở rộng của công nghệ nội soi siêu phóng đại sang các bệnh viện tuyến tỉnh trong 12 tháng tới, chuẩn bị tài liệu MSL và đề xuất đưa HYYR, LARRIVEY vào danh mục thuốc ung thư tiêu hóa tại các cơ sở y tế có triển khai nội soi tiên tiến; ưu tiên các bệnh viện trong hệ thống TCI và bệnh viện ung bướu tỉnh.</w:t>
-            </w:r>
-          </w:p>
-        </w:tc>
-      </w:tr>
-    </w:tbl>
-    <w:p>
-      <w:pPr>
-        <w:spacing w:before="40" w:after="120"/>
-      </w:pPr>
-    </w:p>
     <w:p>
       <w:r>
         <w:br w:type="page"/>
@@ -2757,1950 +1103,6 @@
           </w:p>
         </w:tc>
       </w:tr>
-      <w:tr>
-        <w:tc>
-          <w:tcPr>
-            <w:tcW w:type="dxa" w:w="1701"/>
-          </w:tcPr>
-          <w:p>
-            <w:pPr>
-              <w:spacing w:before="60" w:after="60"/>
-              <w:ind w:left="85"/>
-            </w:pPr>
-            <w:r>
-              <w:rPr>
-                <w:rFonts w:ascii="Calibri" w:hAnsi="Calibri"/>
-                <w:b/>
-                <w:i w:val="0"/>
-                <w:color w:val="003B71"/>
-                <w:sz w:val="17"/>
-              </w:rPr>
-              <w:t>EIMLER-10</w:t>
-            </w:r>
-          </w:p>
-        </w:tc>
-        <w:tc>
-          <w:tcPr>
-            <w:tcW w:type="dxa" w:w="2381"/>
-          </w:tcPr>
-          <w:p>
-            <w:pPr>
-              <w:spacing w:before="60" w:after="60"/>
-              <w:ind w:left="85"/>
-            </w:pPr>
-            <w:r>
-              <w:rPr>
-                <w:rFonts w:ascii="Calibri" w:hAnsi="Calibri"/>
-                <w:b w:val="0"/>
-                <w:i w:val="0"/>
-                <w:color w:val="374151"/>
-                <w:sz w:val="17"/>
-              </w:rPr>
-              <w:t>Empagliflozin 10mg</w:t>
-            </w:r>
-          </w:p>
-        </w:tc>
-        <w:tc>
-          <w:tcPr>
-            <w:tcW w:type="dxa" w:w="1134"/>
-          </w:tcPr>
-          <w:p>
-            <w:pPr>
-              <w:spacing w:before="60" w:after="60"/>
-              <w:ind w:left="85"/>
-            </w:pPr>
-            <w:r>
-              <w:rPr>
-                <w:rFonts w:ascii="Calibri" w:hAnsi="Calibri"/>
-                <w:b w:val="0"/>
-                <w:i w:val="0"/>
-                <w:color w:val="374151"/>
-                <w:sz w:val="17"/>
-              </w:rPr>
-              <w:t>597,000đ/hộp</w:t>
-            </w:r>
-          </w:p>
-        </w:tc>
-        <w:tc>
-          <w:tcPr>
-            <w:tcW w:type="dxa" w:w="1247"/>
-            <w:shd w:val="clear" w:color="auto" w:fill="E7F9EE"/>
-          </w:tcPr>
-          <w:p>
-            <w:pPr>
-              <w:spacing w:before="60" w:after="60"/>
-              <w:ind w:left="85"/>
-            </w:pPr>
-            <w:r>
-              <w:rPr>
-                <w:rFonts w:ascii="Calibri" w:hAnsi="Calibri"/>
-                <w:b/>
-                <w:i w:val="0"/>
-                <w:color w:val="166534"/>
-                <w:sz w:val="17"/>
-              </w:rPr>
-              <w:t>Cơ hội cao</w:t>
-            </w:r>
-          </w:p>
-        </w:tc>
-        <w:tc>
-          <w:tcPr>
-            <w:tcW w:type="dxa" w:w="2608"/>
-          </w:tcPr>
-          <w:p>
-            <w:pPr>
-              <w:spacing w:before="60" w:after="60"/>
-              <w:ind w:left="85"/>
-            </w:pPr>
-            <w:r>
-              <w:rPr>
-                <w:rFonts w:ascii="Calibri" w:hAnsi="Calibri"/>
-                <w:b w:val="0"/>
-                <w:i w:val="0"/>
-                <w:color w:val="374151"/>
-                <w:sz w:val="17"/>
-              </w:rPr>
-              <w:t>Ưu tiên thầu Nhóm 1 – đấu thầu TT 2026</w:t>
-            </w:r>
-          </w:p>
-        </w:tc>
-      </w:tr>
-      <w:tr>
-        <w:tc>
-          <w:tcPr>
-            <w:tcW w:type="dxa" w:w="1701"/>
-          </w:tcPr>
-          <w:p>
-            <w:pPr>
-              <w:spacing w:before="60" w:after="60"/>
-              <w:ind w:left="85"/>
-            </w:pPr>
-            <w:r>
-              <w:rPr>
-                <w:rFonts w:ascii="Calibri" w:hAnsi="Calibri"/>
-                <w:b/>
-                <w:i w:val="0"/>
-                <w:color w:val="003B71"/>
-                <w:sz w:val="17"/>
-              </w:rPr>
-              <w:t>ZLATKO-50</w:t>
-            </w:r>
-          </w:p>
-        </w:tc>
-        <w:tc>
-          <w:tcPr>
-            <w:tcW w:type="dxa" w:w="2381"/>
-          </w:tcPr>
-          <w:p>
-            <w:pPr>
-              <w:spacing w:before="60" w:after="60"/>
-              <w:ind w:left="85"/>
-            </w:pPr>
-            <w:r>
-              <w:rPr>
-                <w:rFonts w:ascii="Calibri" w:hAnsi="Calibri"/>
-                <w:b w:val="0"/>
-                <w:i w:val="0"/>
-                <w:color w:val="374151"/>
-                <w:sz w:val="17"/>
-              </w:rPr>
-              <w:t>Sitagliptin 50mg</w:t>
-            </w:r>
-          </w:p>
-        </w:tc>
-        <w:tc>
-          <w:tcPr>
-            <w:tcW w:type="dxa" w:w="1134"/>
-          </w:tcPr>
-          <w:p>
-            <w:pPr>
-              <w:spacing w:before="60" w:after="60"/>
-              <w:ind w:left="85"/>
-            </w:pPr>
-            <w:r>
-              <w:rPr>
-                <w:rFonts w:ascii="Calibri" w:hAnsi="Calibri"/>
-                <w:b w:val="0"/>
-                <w:i w:val="0"/>
-                <w:color w:val="374151"/>
-                <w:sz w:val="17"/>
-              </w:rPr>
-              <w:t>217,500đ/hộp</w:t>
-            </w:r>
-          </w:p>
-        </w:tc>
-        <w:tc>
-          <w:tcPr>
-            <w:tcW w:type="dxa" w:w="1247"/>
-            <w:shd w:val="clear" w:color="auto" w:fill="FFF7ED"/>
-          </w:tcPr>
-          <w:p>
-            <w:pPr>
-              <w:spacing w:before="60" w:after="60"/>
-              <w:ind w:left="85"/>
-            </w:pPr>
-            <w:r>
-              <w:rPr>
-                <w:rFonts w:ascii="Calibri" w:hAnsi="Calibri"/>
-                <w:b/>
-                <w:i w:val="0"/>
-                <w:color w:val="D97706"/>
-                <w:sz w:val="17"/>
-              </w:rPr>
-              <w:t>Cạnh tranh</w:t>
-            </w:r>
-          </w:p>
-        </w:tc>
-        <w:tc>
-          <w:tcPr>
-            <w:tcW w:type="dxa" w:w="2608"/>
-          </w:tcPr>
-          <w:p>
-            <w:pPr>
-              <w:spacing w:before="60" w:after="60"/>
-              <w:ind w:left="85"/>
-            </w:pPr>
-            <w:r>
-              <w:rPr>
-                <w:rFonts w:ascii="Calibri" w:hAnsi="Calibri"/>
-                <w:b w:val="0"/>
-                <w:i w:val="0"/>
-                <w:color w:val="374151"/>
-                <w:sz w:val="17"/>
-              </w:rPr>
-              <w:t>Theo dõi DPP-4 generic cạnh tranh</w:t>
-            </w:r>
-          </w:p>
-        </w:tc>
-      </w:tr>
-      <w:tr>
-        <w:tc>
-          <w:tcPr>
-            <w:tcW w:type="dxa" w:w="1701"/>
-          </w:tcPr>
-          <w:p>
-            <w:pPr>
-              <w:spacing w:before="60" w:after="60"/>
-              <w:ind w:left="85"/>
-            </w:pPr>
-            <w:r>
-              <w:rPr>
-                <w:rFonts w:ascii="Calibri" w:hAnsi="Calibri"/>
-                <w:b/>
-                <w:i w:val="0"/>
-                <w:color w:val="003B71"/>
-                <w:sz w:val="17"/>
-              </w:rPr>
-              <w:t>JANUS-60</w:t>
-            </w:r>
-          </w:p>
-        </w:tc>
-        <w:tc>
-          <w:tcPr>
-            <w:tcW w:type="dxa" w:w="2381"/>
-          </w:tcPr>
-          <w:p>
-            <w:pPr>
-              <w:spacing w:before="60" w:after="60"/>
-              <w:ind w:left="85"/>
-            </w:pPr>
-            <w:r>
-              <w:rPr>
-                <w:rFonts w:ascii="Calibri" w:hAnsi="Calibri"/>
-                <w:b w:val="0"/>
-                <w:i w:val="0"/>
-                <w:color w:val="374151"/>
-                <w:sz w:val="17"/>
-              </w:rPr>
-              <w:t>Dapoxetine 60mg</w:t>
-            </w:r>
-          </w:p>
-        </w:tc>
-        <w:tc>
-          <w:tcPr>
-            <w:tcW w:type="dxa" w:w="1134"/>
-          </w:tcPr>
-          <w:p>
-            <w:pPr>
-              <w:spacing w:before="60" w:after="60"/>
-              <w:ind w:left="85"/>
-            </w:pPr>
-            <w:r>
-              <w:rPr>
-                <w:rFonts w:ascii="Calibri" w:hAnsi="Calibri"/>
-                <w:b w:val="0"/>
-                <w:i w:val="0"/>
-                <w:color w:val="374151"/>
-                <w:sz w:val="17"/>
-              </w:rPr>
-              <w:t>720,000đ/hộp</w:t>
-            </w:r>
-          </w:p>
-        </w:tc>
-        <w:tc>
-          <w:tcPr>
-            <w:tcW w:type="dxa" w:w="1247"/>
-            <w:shd w:val="clear" w:color="auto" w:fill="EFF6FF"/>
-          </w:tcPr>
-          <w:p>
-            <w:pPr>
-              <w:spacing w:before="60" w:after="60"/>
-              <w:ind w:left="85"/>
-            </w:pPr>
-            <w:r>
-              <w:rPr>
-                <w:rFonts w:ascii="Calibri" w:hAnsi="Calibri"/>
-                <w:b/>
-                <w:i w:val="0"/>
-                <w:color w:val="0056D2"/>
-                <w:sz w:val="17"/>
-              </w:rPr>
-              <w:t>Ổn định</w:t>
-            </w:r>
-          </w:p>
-        </w:tc>
-        <w:tc>
-          <w:tcPr>
-            <w:tcW w:type="dxa" w:w="2608"/>
-          </w:tcPr>
-          <w:p>
-            <w:pPr>
-              <w:spacing w:before="60" w:after="60"/>
-              <w:ind w:left="85"/>
-            </w:pPr>
-            <w:r>
-              <w:rPr>
-                <w:rFonts w:ascii="Calibri" w:hAnsi="Calibri"/>
-                <w:b w:val="0"/>
-                <w:i w:val="0"/>
-                <w:color w:val="374151"/>
-                <w:sz w:val="17"/>
-              </w:rPr>
-              <w:t>Kiểm tra listing Long Châu / Pharmacity</w:t>
-            </w:r>
-          </w:p>
-        </w:tc>
-      </w:tr>
-      <w:tr>
-        <w:tc>
-          <w:tcPr>
-            <w:tcW w:type="dxa" w:w="1701"/>
-          </w:tcPr>
-          <w:p>
-            <w:pPr>
-              <w:spacing w:before="60" w:after="60"/>
-              <w:ind w:left="85"/>
-            </w:pPr>
-            <w:r>
-              <w:rPr>
-                <w:rFonts w:ascii="Calibri" w:hAnsi="Calibri"/>
-                <w:b/>
-                <w:i w:val="0"/>
-                <w:color w:val="003B71"/>
-                <w:sz w:val="17"/>
-              </w:rPr>
-              <w:t>TADALAFIL 20MG</w:t>
-            </w:r>
-          </w:p>
-        </w:tc>
-        <w:tc>
-          <w:tcPr>
-            <w:tcW w:type="dxa" w:w="2381"/>
-          </w:tcPr>
-          <w:p>
-            <w:pPr>
-              <w:spacing w:before="60" w:after="60"/>
-              <w:ind w:left="85"/>
-            </w:pPr>
-            <w:r>
-              <w:rPr>
-                <w:rFonts w:ascii="Calibri" w:hAnsi="Calibri"/>
-                <w:b w:val="0"/>
-                <w:i w:val="0"/>
-                <w:color w:val="374151"/>
-                <w:sz w:val="17"/>
-              </w:rPr>
-              <w:t>Tadalafil 20mg</w:t>
-            </w:r>
-          </w:p>
-        </w:tc>
-        <w:tc>
-          <w:tcPr>
-            <w:tcW w:type="dxa" w:w="1134"/>
-          </w:tcPr>
-          <w:p>
-            <w:pPr>
-              <w:spacing w:before="60" w:after="60"/>
-              <w:ind w:left="85"/>
-            </w:pPr>
-            <w:r>
-              <w:rPr>
-                <w:rFonts w:ascii="Calibri" w:hAnsi="Calibri"/>
-                <w:b w:val="0"/>
-                <w:i w:val="0"/>
-                <w:color w:val="374151"/>
-                <w:sz w:val="17"/>
-              </w:rPr>
-              <w:t>42,000đ/viên</w:t>
-            </w:r>
-          </w:p>
-        </w:tc>
-        <w:tc>
-          <w:tcPr>
-            <w:tcW w:type="dxa" w:w="1247"/>
-            <w:shd w:val="clear" w:color="auto" w:fill="FFF7ED"/>
-          </w:tcPr>
-          <w:p>
-            <w:pPr>
-              <w:spacing w:before="60" w:after="60"/>
-              <w:ind w:left="85"/>
-            </w:pPr>
-            <w:r>
-              <w:rPr>
-                <w:rFonts w:ascii="Calibri" w:hAnsi="Calibri"/>
-                <w:b/>
-                <w:i w:val="0"/>
-                <w:color w:val="D97706"/>
-                <w:sz w:val="17"/>
-              </w:rPr>
-              <w:t>Cạnh tranh</w:t>
-            </w:r>
-          </w:p>
-        </w:tc>
-        <w:tc>
-          <w:tcPr>
-            <w:tcW w:type="dxa" w:w="2608"/>
-          </w:tcPr>
-          <w:p>
-            <w:pPr>
-              <w:spacing w:before="60" w:after="60"/>
-              <w:ind w:left="85"/>
-            </w:pPr>
-            <w:r>
-              <w:rPr>
-                <w:rFonts w:ascii="Calibri" w:hAnsi="Calibri"/>
-                <w:b w:val="0"/>
-                <w:i w:val="0"/>
-                <w:color w:val="374151"/>
-                <w:sz w:val="17"/>
-              </w:rPr>
-              <w:t>Theo dõi giá Sun Pharma, Cipla generic</w:t>
-            </w:r>
-          </w:p>
-        </w:tc>
-      </w:tr>
-      <w:tr>
-        <w:tc>
-          <w:tcPr>
-            <w:tcW w:type="dxa" w:w="1701"/>
-          </w:tcPr>
-          <w:p>
-            <w:pPr>
-              <w:spacing w:before="60" w:after="60"/>
-              <w:ind w:left="85"/>
-            </w:pPr>
-            <w:r>
-              <w:rPr>
-                <w:rFonts w:ascii="Calibri" w:hAnsi="Calibri"/>
-                <w:b/>
-                <w:i w:val="0"/>
-                <w:color w:val="003B71"/>
-                <w:sz w:val="17"/>
-              </w:rPr>
-              <w:t>DRYCHES</w:t>
-            </w:r>
-          </w:p>
-        </w:tc>
-        <w:tc>
-          <w:tcPr>
-            <w:tcW w:type="dxa" w:w="2381"/>
-          </w:tcPr>
-          <w:p>
-            <w:pPr>
-              <w:spacing w:before="60" w:after="60"/>
-              <w:ind w:left="85"/>
-            </w:pPr>
-            <w:r>
-              <w:rPr>
-                <w:rFonts w:ascii="Calibri" w:hAnsi="Calibri"/>
-                <w:b w:val="0"/>
-                <w:i w:val="0"/>
-                <w:color w:val="374151"/>
-                <w:sz w:val="17"/>
-              </w:rPr>
-              <w:t>Dutasteride 0.5mg</w:t>
-            </w:r>
-          </w:p>
-        </w:tc>
-        <w:tc>
-          <w:tcPr>
-            <w:tcW w:type="dxa" w:w="1134"/>
-          </w:tcPr>
-          <w:p>
-            <w:pPr>
-              <w:spacing w:before="60" w:after="60"/>
-              <w:ind w:left="85"/>
-            </w:pPr>
-            <w:r>
-              <w:rPr>
-                <w:rFonts w:ascii="Calibri" w:hAnsi="Calibri"/>
-                <w:b w:val="0"/>
-                <w:i w:val="0"/>
-                <w:color w:val="374151"/>
-                <w:sz w:val="17"/>
-              </w:rPr>
-              <w:t>378,000đ/hộp</w:t>
-            </w:r>
-          </w:p>
-        </w:tc>
-        <w:tc>
-          <w:tcPr>
-            <w:tcW w:type="dxa" w:w="1247"/>
-            <w:shd w:val="clear" w:color="auto" w:fill="EFF6FF"/>
-          </w:tcPr>
-          <w:p>
-            <w:pPr>
-              <w:spacing w:before="60" w:after="60"/>
-              <w:ind w:left="85"/>
-            </w:pPr>
-            <w:r>
-              <w:rPr>
-                <w:rFonts w:ascii="Calibri" w:hAnsi="Calibri"/>
-                <w:b/>
-                <w:i w:val="0"/>
-                <w:color w:val="0056D2"/>
-                <w:sz w:val="17"/>
-              </w:rPr>
-              <w:t>Cơ hội</w:t>
-            </w:r>
-          </w:p>
-        </w:tc>
-        <w:tc>
-          <w:tcPr>
-            <w:tcW w:type="dxa" w:w="2608"/>
-          </w:tcPr>
-          <w:p>
-            <w:pPr>
-              <w:spacing w:before="60" w:after="60"/>
-              <w:ind w:left="85"/>
-            </w:pPr>
-            <w:r>
-              <w:rPr>
-                <w:rFonts w:ascii="Calibri" w:hAnsi="Calibri"/>
-                <w:b w:val="0"/>
-                <w:i w:val="0"/>
-                <w:color w:val="374151"/>
-                <w:sz w:val="17"/>
-              </w:rPr>
-              <w:t>BPH – thị trường còn ít cạnh tranh</w:t>
-            </w:r>
-          </w:p>
-        </w:tc>
-      </w:tr>
-      <w:tr>
-        <w:tc>
-          <w:tcPr>
-            <w:tcW w:type="dxa" w:w="1701"/>
-          </w:tcPr>
-          <w:p>
-            <w:pPr>
-              <w:spacing w:before="60" w:after="60"/>
-              <w:ind w:left="85"/>
-            </w:pPr>
-            <w:r>
-              <w:rPr>
-                <w:rFonts w:ascii="Calibri" w:hAnsi="Calibri"/>
-                <w:b/>
-                <w:i w:val="0"/>
-                <w:color w:val="003B71"/>
-                <w:sz w:val="17"/>
-              </w:rPr>
-              <w:t>PECHAUNOX 4/10</w:t>
-            </w:r>
-          </w:p>
-        </w:tc>
-        <w:tc>
-          <w:tcPr>
-            <w:tcW w:type="dxa" w:w="2381"/>
-          </w:tcPr>
-          <w:p>
-            <w:pPr>
-              <w:spacing w:before="60" w:after="60"/>
-              <w:ind w:left="85"/>
-            </w:pPr>
-            <w:r>
-              <w:rPr>
-                <w:rFonts w:ascii="Calibri" w:hAnsi="Calibri"/>
-                <w:b w:val="0"/>
-                <w:i w:val="0"/>
-                <w:color w:val="374151"/>
-                <w:sz w:val="17"/>
-              </w:rPr>
-              <w:t>Perindopril + Amlodipin</w:t>
-            </w:r>
-          </w:p>
-        </w:tc>
-        <w:tc>
-          <w:tcPr>
-            <w:tcW w:type="dxa" w:w="1134"/>
-          </w:tcPr>
-          <w:p>
-            <w:pPr>
-              <w:spacing w:before="60" w:after="60"/>
-              <w:ind w:left="85"/>
-            </w:pPr>
-            <w:r>
-              <w:rPr>
-                <w:rFonts w:ascii="Calibri" w:hAnsi="Calibri"/>
-                <w:b w:val="0"/>
-                <w:i w:val="0"/>
-                <w:color w:val="374151"/>
-                <w:sz w:val="17"/>
-              </w:rPr>
-              <w:t>182,070đ/hộp</w:t>
-            </w:r>
-          </w:p>
-        </w:tc>
-        <w:tc>
-          <w:tcPr>
-            <w:tcW w:type="dxa" w:w="1247"/>
-            <w:shd w:val="clear" w:color="auto" w:fill="EFF6FF"/>
-          </w:tcPr>
-          <w:p>
-            <w:pPr>
-              <w:spacing w:before="60" w:after="60"/>
-              <w:ind w:left="85"/>
-            </w:pPr>
-            <w:r>
-              <w:rPr>
-                <w:rFonts w:ascii="Calibri" w:hAnsi="Calibri"/>
-                <w:b/>
-                <w:i w:val="0"/>
-                <w:color w:val="0056D2"/>
-                <w:sz w:val="17"/>
-              </w:rPr>
-              <w:t>Ổn định</w:t>
-            </w:r>
-          </w:p>
-        </w:tc>
-        <w:tc>
-          <w:tcPr>
-            <w:tcW w:type="dxa" w:w="2608"/>
-          </w:tcPr>
-          <w:p>
-            <w:pPr>
-              <w:spacing w:before="60" w:after="60"/>
-              <w:ind w:left="85"/>
-            </w:pPr>
-            <w:r>
-              <w:rPr>
-                <w:rFonts w:ascii="Calibri" w:hAnsi="Calibri"/>
-                <w:b w:val="0"/>
-                <w:i w:val="0"/>
-                <w:color w:val="374151"/>
-                <w:sz w:val="17"/>
-              </w:rPr>
-              <w:t>Combo cạnh tranh – theo dõi generic Amlodipine</w:t>
-            </w:r>
-          </w:p>
-        </w:tc>
-      </w:tr>
-      <w:tr>
-        <w:tc>
-          <w:tcPr>
-            <w:tcW w:type="dxa" w:w="1701"/>
-          </w:tcPr>
-          <w:p>
-            <w:pPr>
-              <w:spacing w:before="60" w:after="60"/>
-              <w:ind w:left="85"/>
-            </w:pPr>
-            <w:r>
-              <w:rPr>
-                <w:rFonts w:ascii="Calibri" w:hAnsi="Calibri"/>
-                <w:b/>
-                <w:i w:val="0"/>
-                <w:color w:val="003B71"/>
-                <w:sz w:val="17"/>
-              </w:rPr>
-              <w:t>RAVASTEL-20</w:t>
-            </w:r>
-          </w:p>
-        </w:tc>
-        <w:tc>
-          <w:tcPr>
-            <w:tcW w:type="dxa" w:w="2381"/>
-          </w:tcPr>
-          <w:p>
-            <w:pPr>
-              <w:spacing w:before="60" w:after="60"/>
-              <w:ind w:left="85"/>
-            </w:pPr>
-            <w:r>
-              <w:rPr>
-                <w:rFonts w:ascii="Calibri" w:hAnsi="Calibri"/>
-                <w:b w:val="0"/>
-                <w:i w:val="0"/>
-                <w:color w:val="374151"/>
-                <w:sz w:val="17"/>
-              </w:rPr>
-              <w:t>Rosuvastatin 20mg</w:t>
-            </w:r>
-          </w:p>
-        </w:tc>
-        <w:tc>
-          <w:tcPr>
-            <w:tcW w:type="dxa" w:w="1134"/>
-          </w:tcPr>
-          <w:p>
-            <w:pPr>
-              <w:spacing w:before="60" w:after="60"/>
-              <w:ind w:left="85"/>
-            </w:pPr>
-            <w:r>
-              <w:rPr>
-                <w:rFonts w:ascii="Calibri" w:hAnsi="Calibri"/>
-                <w:b w:val="0"/>
-                <w:i w:val="0"/>
-                <w:color w:val="374151"/>
-                <w:sz w:val="17"/>
-              </w:rPr>
-              <w:t>47,250đ/hộp</w:t>
-            </w:r>
-          </w:p>
-        </w:tc>
-        <w:tc>
-          <w:tcPr>
-            <w:tcW w:type="dxa" w:w="1247"/>
-            <w:shd w:val="clear" w:color="auto" w:fill="FFF7ED"/>
-          </w:tcPr>
-          <w:p>
-            <w:pPr>
-              <w:spacing w:before="60" w:after="60"/>
-              <w:ind w:left="85"/>
-            </w:pPr>
-            <w:r>
-              <w:rPr>
-                <w:rFonts w:ascii="Calibri" w:hAnsi="Calibri"/>
-                <w:b/>
-                <w:i w:val="0"/>
-                <w:color w:val="D97706"/>
-                <w:sz w:val="17"/>
-              </w:rPr>
-              <w:t>Cạnh tranh</w:t>
-            </w:r>
-          </w:p>
-        </w:tc>
-        <w:tc>
-          <w:tcPr>
-            <w:tcW w:type="dxa" w:w="2608"/>
-          </w:tcPr>
-          <w:p>
-            <w:pPr>
-              <w:spacing w:before="60" w:after="60"/>
-              <w:ind w:left="85"/>
-            </w:pPr>
-            <w:r>
-              <w:rPr>
-                <w:rFonts w:ascii="Calibri" w:hAnsi="Calibri"/>
-                <w:b w:val="0"/>
-                <w:i w:val="0"/>
-                <w:color w:val="374151"/>
-                <w:sz w:val="17"/>
-              </w:rPr>
-              <w:t>Statin – cạnh tranh cao với Atorvastatin generic</w:t>
-            </w:r>
-          </w:p>
-        </w:tc>
-      </w:tr>
-      <w:tr>
-        <w:tc>
-          <w:tcPr>
-            <w:tcW w:type="dxa" w:w="1701"/>
-          </w:tcPr>
-          <w:p>
-            <w:pPr>
-              <w:spacing w:before="60" w:after="60"/>
-              <w:ind w:left="85"/>
-            </w:pPr>
-            <w:r>
-              <w:rPr>
-                <w:rFonts w:ascii="Calibri" w:hAnsi="Calibri"/>
-                <w:b/>
-                <w:i w:val="0"/>
-                <w:color w:val="003B71"/>
-                <w:sz w:val="17"/>
-              </w:rPr>
-              <w:t>TABAREX-160</w:t>
-            </w:r>
-          </w:p>
-        </w:tc>
-        <w:tc>
-          <w:tcPr>
-            <w:tcW w:type="dxa" w:w="2381"/>
-          </w:tcPr>
-          <w:p>
-            <w:pPr>
-              <w:spacing w:before="60" w:after="60"/>
-              <w:ind w:left="85"/>
-            </w:pPr>
-            <w:r>
-              <w:rPr>
-                <w:rFonts w:ascii="Calibri" w:hAnsi="Calibri"/>
-                <w:b w:val="0"/>
-                <w:i w:val="0"/>
-                <w:color w:val="374151"/>
-                <w:sz w:val="17"/>
-              </w:rPr>
-              <w:t>Valsartan 160mg</w:t>
-            </w:r>
-          </w:p>
-        </w:tc>
-        <w:tc>
-          <w:tcPr>
-            <w:tcW w:type="dxa" w:w="1134"/>
-          </w:tcPr>
-          <w:p>
-            <w:pPr>
-              <w:spacing w:before="60" w:after="60"/>
-              <w:ind w:left="85"/>
-            </w:pPr>
-            <w:r>
-              <w:rPr>
-                <w:rFonts w:ascii="Calibri" w:hAnsi="Calibri"/>
-                <w:b w:val="0"/>
-                <w:i w:val="0"/>
-                <w:color w:val="374151"/>
-                <w:sz w:val="17"/>
-              </w:rPr>
-              <w:t>163,800đ/hộp</w:t>
-            </w:r>
-          </w:p>
-        </w:tc>
-        <w:tc>
-          <w:tcPr>
-            <w:tcW w:type="dxa" w:w="1247"/>
-            <w:shd w:val="clear" w:color="auto" w:fill="EFF6FF"/>
-          </w:tcPr>
-          <w:p>
-            <w:pPr>
-              <w:spacing w:before="60" w:after="60"/>
-              <w:ind w:left="85"/>
-            </w:pPr>
-            <w:r>
-              <w:rPr>
-                <w:rFonts w:ascii="Calibri" w:hAnsi="Calibri"/>
-                <w:b/>
-                <w:i w:val="0"/>
-                <w:color w:val="0056D2"/>
-                <w:sz w:val="17"/>
-              </w:rPr>
-              <w:t>Ổn định</w:t>
-            </w:r>
-          </w:p>
-        </w:tc>
-        <w:tc>
-          <w:tcPr>
-            <w:tcW w:type="dxa" w:w="2608"/>
-          </w:tcPr>
-          <w:p>
-            <w:pPr>
-              <w:spacing w:before="60" w:after="60"/>
-              <w:ind w:left="85"/>
-            </w:pPr>
-            <w:r>
-              <w:rPr>
-                <w:rFonts w:ascii="Calibri" w:hAnsi="Calibri"/>
-                <w:b w:val="0"/>
-                <w:i w:val="0"/>
-                <w:color w:val="374151"/>
-                <w:sz w:val="17"/>
-              </w:rPr>
-              <w:t>Duy trì kênh OTC &amp; ETC tuyến tỉnh</w:t>
-            </w:r>
-          </w:p>
-        </w:tc>
-      </w:tr>
-      <w:tr>
-        <w:tc>
-          <w:tcPr>
-            <w:tcW w:type="dxa" w:w="1701"/>
-          </w:tcPr>
-          <w:p>
-            <w:pPr>
-              <w:spacing w:before="60" w:after="60"/>
-              <w:ind w:left="85"/>
-            </w:pPr>
-            <w:r>
-              <w:rPr>
-                <w:rFonts w:ascii="Calibri" w:hAnsi="Calibri"/>
-                <w:b/>
-                <w:i w:val="0"/>
-                <w:color w:val="003B71"/>
-                <w:sz w:val="17"/>
-              </w:rPr>
-              <w:t>HATLOP-150</w:t>
-            </w:r>
-          </w:p>
-        </w:tc>
-        <w:tc>
-          <w:tcPr>
-            <w:tcW w:type="dxa" w:w="2381"/>
-          </w:tcPr>
-          <w:p>
-            <w:pPr>
-              <w:spacing w:before="60" w:after="60"/>
-              <w:ind w:left="85"/>
-            </w:pPr>
-            <w:r>
-              <w:rPr>
-                <w:rFonts w:ascii="Calibri" w:hAnsi="Calibri"/>
-                <w:b w:val="0"/>
-                <w:i w:val="0"/>
-                <w:color w:val="374151"/>
-                <w:sz w:val="17"/>
-              </w:rPr>
-              <w:t>Irbesartan 150mg</w:t>
-            </w:r>
-          </w:p>
-        </w:tc>
-        <w:tc>
-          <w:tcPr>
-            <w:tcW w:type="dxa" w:w="1134"/>
-          </w:tcPr>
-          <w:p>
-            <w:pPr>
-              <w:spacing w:before="60" w:after="60"/>
-              <w:ind w:left="85"/>
-            </w:pPr>
-            <w:r>
-              <w:rPr>
-                <w:rFonts w:ascii="Calibri" w:hAnsi="Calibri"/>
-                <w:b w:val="0"/>
-                <w:i w:val="0"/>
-                <w:color w:val="374151"/>
-                <w:sz w:val="17"/>
-              </w:rPr>
-              <w:t>210,000đ/hộp</w:t>
-            </w:r>
-          </w:p>
-        </w:tc>
-        <w:tc>
-          <w:tcPr>
-            <w:tcW w:type="dxa" w:w="1247"/>
-            <w:shd w:val="clear" w:color="auto" w:fill="EFF6FF"/>
-          </w:tcPr>
-          <w:p>
-            <w:pPr>
-              <w:spacing w:before="60" w:after="60"/>
-              <w:ind w:left="85"/>
-            </w:pPr>
-            <w:r>
-              <w:rPr>
-                <w:rFonts w:ascii="Calibri" w:hAnsi="Calibri"/>
-                <w:b/>
-                <w:i w:val="0"/>
-                <w:color w:val="0056D2"/>
-                <w:sz w:val="17"/>
-              </w:rPr>
-              <w:t>Ổn định</w:t>
-            </w:r>
-          </w:p>
-        </w:tc>
-        <w:tc>
-          <w:tcPr>
-            <w:tcW w:type="dxa" w:w="2608"/>
-          </w:tcPr>
-          <w:p>
-            <w:pPr>
-              <w:spacing w:before="60" w:after="60"/>
-              <w:ind w:left="85"/>
-            </w:pPr>
-            <w:r>
-              <w:rPr>
-                <w:rFonts w:ascii="Calibri" w:hAnsi="Calibri"/>
-                <w:b w:val="0"/>
-                <w:i w:val="0"/>
-                <w:color w:val="374151"/>
-                <w:sz w:val="17"/>
-              </w:rPr>
-              <w:t>Duy trì thầu bệnh viện tuyến tỉnh</w:t>
-            </w:r>
-          </w:p>
-        </w:tc>
-      </w:tr>
-      <w:tr>
-        <w:tc>
-          <w:tcPr>
-            <w:tcW w:type="dxa" w:w="1701"/>
-          </w:tcPr>
-          <w:p>
-            <w:pPr>
-              <w:spacing w:before="60" w:after="60"/>
-              <w:ind w:left="85"/>
-            </w:pPr>
-            <w:r>
-              <w:rPr>
-                <w:rFonts w:ascii="Calibri" w:hAnsi="Calibri"/>
-                <w:b/>
-                <w:i w:val="0"/>
-                <w:color w:val="003B71"/>
-                <w:sz w:val="17"/>
-              </w:rPr>
-              <w:t>ZABALES</w:t>
-            </w:r>
-          </w:p>
-        </w:tc>
-        <w:tc>
-          <w:tcPr>
-            <w:tcW w:type="dxa" w:w="2381"/>
-          </w:tcPr>
-          <w:p>
-            <w:pPr>
-              <w:spacing w:before="60" w:after="60"/>
-              <w:ind w:left="85"/>
-            </w:pPr>
-            <w:r>
-              <w:rPr>
-                <w:rFonts w:ascii="Calibri" w:hAnsi="Calibri"/>
-                <w:b w:val="0"/>
-                <w:i w:val="0"/>
-                <w:color w:val="374151"/>
-                <w:sz w:val="17"/>
-              </w:rPr>
-              <w:t>Clopidogrel 75mg</w:t>
-            </w:r>
-          </w:p>
-        </w:tc>
-        <w:tc>
-          <w:tcPr>
-            <w:tcW w:type="dxa" w:w="1134"/>
-          </w:tcPr>
-          <w:p>
-            <w:pPr>
-              <w:spacing w:before="60" w:after="60"/>
-              <w:ind w:left="85"/>
-            </w:pPr>
-            <w:r>
-              <w:rPr>
-                <w:rFonts w:ascii="Calibri" w:hAnsi="Calibri"/>
-                <w:b w:val="0"/>
-                <w:i w:val="0"/>
-                <w:color w:val="374151"/>
-                <w:sz w:val="17"/>
-              </w:rPr>
-              <w:t>31,920đ/hộp</w:t>
-            </w:r>
-          </w:p>
-        </w:tc>
-        <w:tc>
-          <w:tcPr>
-            <w:tcW w:type="dxa" w:w="1247"/>
-            <w:shd w:val="clear" w:color="auto" w:fill="FFF7ED"/>
-          </w:tcPr>
-          <w:p>
-            <w:pPr>
-              <w:spacing w:before="60" w:after="60"/>
-              <w:ind w:left="85"/>
-            </w:pPr>
-            <w:r>
-              <w:rPr>
-                <w:rFonts w:ascii="Calibri" w:hAnsi="Calibri"/>
-                <w:b/>
-                <w:i w:val="0"/>
-                <w:color w:val="D97706"/>
-                <w:sz w:val="17"/>
-              </w:rPr>
-              <w:t>Cạnh tranh</w:t>
-            </w:r>
-          </w:p>
-        </w:tc>
-        <w:tc>
-          <w:tcPr>
-            <w:tcW w:type="dxa" w:w="2608"/>
-          </w:tcPr>
-          <w:p>
-            <w:pPr>
-              <w:spacing w:before="60" w:after="60"/>
-              <w:ind w:left="85"/>
-            </w:pPr>
-            <w:r>
-              <w:rPr>
-                <w:rFonts w:ascii="Calibri" w:hAnsi="Calibri"/>
-                <w:b w:val="0"/>
-                <w:i w:val="0"/>
-                <w:color w:val="374151"/>
-                <w:sz w:val="17"/>
-              </w:rPr>
-              <w:t>Cạnh tranh cao – cần bảo vệ giá thầu</w:t>
-            </w:r>
-          </w:p>
-        </w:tc>
-      </w:tr>
-      <w:tr>
-        <w:tc>
-          <w:tcPr>
-            <w:tcW w:type="dxa" w:w="1701"/>
-          </w:tcPr>
-          <w:p>
-            <w:pPr>
-              <w:spacing w:before="60" w:after="60"/>
-              <w:ind w:left="85"/>
-            </w:pPr>
-            <w:r>
-              <w:rPr>
-                <w:rFonts w:ascii="Calibri" w:hAnsi="Calibri"/>
-                <w:b/>
-                <w:i w:val="0"/>
-                <w:color w:val="003B71"/>
-                <w:sz w:val="17"/>
-              </w:rPr>
-              <w:t>MAGRAX</w:t>
-            </w:r>
-          </w:p>
-        </w:tc>
-        <w:tc>
-          <w:tcPr>
-            <w:tcW w:type="dxa" w:w="2381"/>
-          </w:tcPr>
-          <w:p>
-            <w:pPr>
-              <w:spacing w:before="60" w:after="60"/>
-              <w:ind w:left="85"/>
-            </w:pPr>
-            <w:r>
-              <w:rPr>
-                <w:rFonts w:ascii="Calibri" w:hAnsi="Calibri"/>
-                <w:b w:val="0"/>
-                <w:i w:val="0"/>
-                <w:color w:val="374151"/>
-                <w:sz w:val="17"/>
-              </w:rPr>
-              <w:t>Etoricoxib 90mg</w:t>
-            </w:r>
-          </w:p>
-        </w:tc>
-        <w:tc>
-          <w:tcPr>
-            <w:tcW w:type="dxa" w:w="1134"/>
-          </w:tcPr>
-          <w:p>
-            <w:pPr>
-              <w:spacing w:before="60" w:after="60"/>
-              <w:ind w:left="85"/>
-            </w:pPr>
-            <w:r>
-              <w:rPr>
-                <w:rFonts w:ascii="Calibri" w:hAnsi="Calibri"/>
-                <w:b w:val="0"/>
-                <w:i w:val="0"/>
-                <w:color w:val="374151"/>
-                <w:sz w:val="17"/>
-              </w:rPr>
-              <w:t>215,000đ/hộp</w:t>
-            </w:r>
-          </w:p>
-        </w:tc>
-        <w:tc>
-          <w:tcPr>
-            <w:tcW w:type="dxa" w:w="1247"/>
-            <w:shd w:val="clear" w:color="auto" w:fill="EFF6FF"/>
-          </w:tcPr>
-          <w:p>
-            <w:pPr>
-              <w:spacing w:before="60" w:after="60"/>
-              <w:ind w:left="85"/>
-            </w:pPr>
-            <w:r>
-              <w:rPr>
-                <w:rFonts w:ascii="Calibri" w:hAnsi="Calibri"/>
-                <w:b/>
-                <w:i w:val="0"/>
-                <w:color w:val="0056D2"/>
-                <w:sz w:val="17"/>
-              </w:rPr>
-              <w:t>Ổn định</w:t>
-            </w:r>
-          </w:p>
-        </w:tc>
-        <w:tc>
-          <w:tcPr>
-            <w:tcW w:type="dxa" w:w="2608"/>
-          </w:tcPr>
-          <w:p>
-            <w:pPr>
-              <w:spacing w:before="60" w:after="60"/>
-              <w:ind w:left="85"/>
-            </w:pPr>
-            <w:r>
-              <w:rPr>
-                <w:rFonts w:ascii="Calibri" w:hAnsi="Calibri"/>
-                <w:b w:val="0"/>
-                <w:i w:val="0"/>
-                <w:color w:val="374151"/>
-                <w:sz w:val="17"/>
-              </w:rPr>
-              <w:t>COX-2 – theo dõi xu hướng điều trị Gout</w:t>
-            </w:r>
-          </w:p>
-        </w:tc>
-      </w:tr>
-      <w:tr>
-        <w:tc>
-          <w:tcPr>
-            <w:tcW w:type="dxa" w:w="1701"/>
-          </w:tcPr>
-          <w:p>
-            <w:pPr>
-              <w:spacing w:before="60" w:after="60"/>
-              <w:ind w:left="85"/>
-            </w:pPr>
-            <w:r>
-              <w:rPr>
-                <w:rFonts w:ascii="Calibri" w:hAnsi="Calibri"/>
-                <w:b/>
-                <w:i w:val="0"/>
-                <w:color w:val="003B71"/>
-                <w:sz w:val="17"/>
-              </w:rPr>
-              <w:t>ZENTOGOUT-40</w:t>
-            </w:r>
-          </w:p>
-        </w:tc>
-        <w:tc>
-          <w:tcPr>
-            <w:tcW w:type="dxa" w:w="2381"/>
-          </w:tcPr>
-          <w:p>
-            <w:pPr>
-              <w:spacing w:before="60" w:after="60"/>
-              <w:ind w:left="85"/>
-            </w:pPr>
-            <w:r>
-              <w:rPr>
-                <w:rFonts w:ascii="Calibri" w:hAnsi="Calibri"/>
-                <w:b w:val="0"/>
-                <w:i w:val="0"/>
-                <w:color w:val="374151"/>
-                <w:sz w:val="17"/>
-              </w:rPr>
-              <w:t>Febuxostat 40mg</w:t>
-            </w:r>
-          </w:p>
-        </w:tc>
-        <w:tc>
-          <w:tcPr>
-            <w:tcW w:type="dxa" w:w="1134"/>
-          </w:tcPr>
-          <w:p>
-            <w:pPr>
-              <w:spacing w:before="60" w:after="60"/>
-              <w:ind w:left="85"/>
-            </w:pPr>
-            <w:r>
-              <w:rPr>
-                <w:rFonts w:ascii="Calibri" w:hAnsi="Calibri"/>
-                <w:b w:val="0"/>
-                <w:i w:val="0"/>
-                <w:color w:val="374151"/>
-                <w:sz w:val="17"/>
-              </w:rPr>
-              <w:t>240,000đ/hộp</w:t>
-            </w:r>
-          </w:p>
-        </w:tc>
-        <w:tc>
-          <w:tcPr>
-            <w:tcW w:type="dxa" w:w="1247"/>
-            <w:shd w:val="clear" w:color="auto" w:fill="EFF6FF"/>
-          </w:tcPr>
-          <w:p>
-            <w:pPr>
-              <w:spacing w:before="60" w:after="60"/>
-              <w:ind w:left="85"/>
-            </w:pPr>
-            <w:r>
-              <w:rPr>
-                <w:rFonts w:ascii="Calibri" w:hAnsi="Calibri"/>
-                <w:b/>
-                <w:i w:val="0"/>
-                <w:color w:val="0056D2"/>
-                <w:sz w:val="17"/>
-              </w:rPr>
-              <w:t>Cơ hội</w:t>
-            </w:r>
-          </w:p>
-        </w:tc>
-        <w:tc>
-          <w:tcPr>
-            <w:tcW w:type="dxa" w:w="2608"/>
-          </w:tcPr>
-          <w:p>
-            <w:pPr>
-              <w:spacing w:before="60" w:after="60"/>
-              <w:ind w:left="85"/>
-            </w:pPr>
-            <w:r>
-              <w:rPr>
-                <w:rFonts w:ascii="Calibri" w:hAnsi="Calibri"/>
-                <w:b w:val="0"/>
-                <w:i w:val="0"/>
-                <w:color w:val="374151"/>
-                <w:sz w:val="17"/>
-              </w:rPr>
-              <w:t>Thay thế Allopurinol – đang tăng trưởng</w:t>
-            </w:r>
-          </w:p>
-        </w:tc>
-      </w:tr>
-      <w:tr>
-        <w:tc>
-          <w:tcPr>
-            <w:tcW w:type="dxa" w:w="1701"/>
-          </w:tcPr>
-          <w:p>
-            <w:pPr>
-              <w:spacing w:before="60" w:after="60"/>
-              <w:ind w:left="85"/>
-            </w:pPr>
-            <w:r>
-              <w:rPr>
-                <w:rFonts w:ascii="Calibri" w:hAnsi="Calibri"/>
-                <w:b/>
-                <w:i w:val="0"/>
-                <w:color w:val="003B71"/>
-                <w:sz w:val="17"/>
-              </w:rPr>
-              <w:t>JIRACEK</w:t>
-            </w:r>
-          </w:p>
-        </w:tc>
-        <w:tc>
-          <w:tcPr>
-            <w:tcW w:type="dxa" w:w="2381"/>
-          </w:tcPr>
-          <w:p>
-            <w:pPr>
-              <w:spacing w:before="60" w:after="60"/>
-              <w:ind w:left="85"/>
-            </w:pPr>
-            <w:r>
-              <w:rPr>
-                <w:rFonts w:ascii="Calibri" w:hAnsi="Calibri"/>
-                <w:b w:val="0"/>
-                <w:i w:val="0"/>
-                <w:color w:val="374151"/>
-                <w:sz w:val="17"/>
-              </w:rPr>
-              <w:t>Esomeprazole 40mg</w:t>
-            </w:r>
-          </w:p>
-        </w:tc>
-        <w:tc>
-          <w:tcPr>
-            <w:tcW w:type="dxa" w:w="1134"/>
-          </w:tcPr>
-          <w:p>
-            <w:pPr>
-              <w:spacing w:before="60" w:after="60"/>
-              <w:ind w:left="85"/>
-            </w:pPr>
-            <w:r>
-              <w:rPr>
-                <w:rFonts w:ascii="Calibri" w:hAnsi="Calibri"/>
-                <w:b w:val="0"/>
-                <w:i w:val="0"/>
-                <w:color w:val="374151"/>
-                <w:sz w:val="17"/>
-              </w:rPr>
-              <w:t>89,600đ/hộp</w:t>
-            </w:r>
-          </w:p>
-        </w:tc>
-        <w:tc>
-          <w:tcPr>
-            <w:tcW w:type="dxa" w:w="1247"/>
-            <w:shd w:val="clear" w:color="auto" w:fill="FFF7ED"/>
-          </w:tcPr>
-          <w:p>
-            <w:pPr>
-              <w:spacing w:before="60" w:after="60"/>
-              <w:ind w:left="85"/>
-            </w:pPr>
-            <w:r>
-              <w:rPr>
-                <w:rFonts w:ascii="Calibri" w:hAnsi="Calibri"/>
-                <w:b/>
-                <w:i w:val="0"/>
-                <w:color w:val="D97706"/>
-                <w:sz w:val="17"/>
-              </w:rPr>
-              <w:t>Cạnh tranh</w:t>
-            </w:r>
-          </w:p>
-        </w:tc>
-        <w:tc>
-          <w:tcPr>
-            <w:tcW w:type="dxa" w:w="2608"/>
-          </w:tcPr>
-          <w:p>
-            <w:pPr>
-              <w:spacing w:before="60" w:after="60"/>
-              <w:ind w:left="85"/>
-            </w:pPr>
-            <w:r>
-              <w:rPr>
-                <w:rFonts w:ascii="Calibri" w:hAnsi="Calibri"/>
-                <w:b w:val="0"/>
-                <w:i w:val="0"/>
-                <w:color w:val="374151"/>
-                <w:sz w:val="17"/>
-              </w:rPr>
-              <w:t>PPI – thị trường cạnh tranh, bảo vệ ETC</w:t>
-            </w:r>
-          </w:p>
-        </w:tc>
-      </w:tr>
-      <w:tr>
-        <w:tc>
-          <w:tcPr>
-            <w:tcW w:type="dxa" w:w="1701"/>
-          </w:tcPr>
-          <w:p>
-            <w:pPr>
-              <w:spacing w:before="60" w:after="60"/>
-              <w:ind w:left="85"/>
-            </w:pPr>
-            <w:r>
-              <w:rPr>
-                <w:rFonts w:ascii="Calibri" w:hAnsi="Calibri"/>
-                <w:b/>
-                <w:i w:val="0"/>
-                <w:color w:val="003B71"/>
-                <w:sz w:val="17"/>
-              </w:rPr>
-              <w:t>SERNAL-4</w:t>
-            </w:r>
-          </w:p>
-        </w:tc>
-        <w:tc>
-          <w:tcPr>
-            <w:tcW w:type="dxa" w:w="2381"/>
-          </w:tcPr>
-          <w:p>
-            <w:pPr>
-              <w:spacing w:before="60" w:after="60"/>
-              <w:ind w:left="85"/>
-            </w:pPr>
-            <w:r>
-              <w:rPr>
-                <w:rFonts w:ascii="Calibri" w:hAnsi="Calibri"/>
-                <w:b w:val="0"/>
-                <w:i w:val="0"/>
-                <w:color w:val="374151"/>
-                <w:sz w:val="17"/>
-              </w:rPr>
-              <w:t>Risperidone 4mg</w:t>
-            </w:r>
-          </w:p>
-        </w:tc>
-        <w:tc>
-          <w:tcPr>
-            <w:tcW w:type="dxa" w:w="1134"/>
-          </w:tcPr>
-          <w:p>
-            <w:pPr>
-              <w:spacing w:before="60" w:after="60"/>
-              <w:ind w:left="85"/>
-            </w:pPr>
-            <w:r>
-              <w:rPr>
-                <w:rFonts w:ascii="Calibri" w:hAnsi="Calibri"/>
-                <w:b w:val="0"/>
-                <w:i w:val="0"/>
-                <w:color w:val="374151"/>
-                <w:sz w:val="17"/>
-              </w:rPr>
-              <w:t>315,000đ/hộp</w:t>
-            </w:r>
-          </w:p>
-        </w:tc>
-        <w:tc>
-          <w:tcPr>
-            <w:tcW w:type="dxa" w:w="1247"/>
-            <w:shd w:val="clear" w:color="auto" w:fill="EFF6FF"/>
-          </w:tcPr>
-          <w:p>
-            <w:pPr>
-              <w:spacing w:before="60" w:after="60"/>
-              <w:ind w:left="85"/>
-            </w:pPr>
-            <w:r>
-              <w:rPr>
-                <w:rFonts w:ascii="Calibri" w:hAnsi="Calibri"/>
-                <w:b/>
-                <w:i w:val="0"/>
-                <w:color w:val="0056D2"/>
-                <w:sz w:val="17"/>
-              </w:rPr>
-              <w:t>Ổn định</w:t>
-            </w:r>
-          </w:p>
-        </w:tc>
-        <w:tc>
-          <w:tcPr>
-            <w:tcW w:type="dxa" w:w="2608"/>
-          </w:tcPr>
-          <w:p>
-            <w:pPr>
-              <w:spacing w:before="60" w:after="60"/>
-              <w:ind w:left="85"/>
-            </w:pPr>
-            <w:r>
-              <w:rPr>
-                <w:rFonts w:ascii="Calibri" w:hAnsi="Calibri"/>
-                <w:b w:val="0"/>
-                <w:i w:val="0"/>
-                <w:color w:val="374151"/>
-                <w:sz w:val="17"/>
-              </w:rPr>
-              <w:t>Duy trì kênh ETC bệnh viện chuyên khoa</w:t>
-            </w:r>
-          </w:p>
-        </w:tc>
-      </w:tr>
-      <w:tr>
-        <w:tc>
-          <w:tcPr>
-            <w:tcW w:type="dxa" w:w="1701"/>
-          </w:tcPr>
-          <w:p>
-            <w:pPr>
-              <w:spacing w:before="60" w:after="60"/>
-              <w:ind w:left="85"/>
-            </w:pPr>
-            <w:r>
-              <w:rPr>
-                <w:rFonts w:ascii="Calibri" w:hAnsi="Calibri"/>
-                <w:b/>
-                <w:i w:val="0"/>
-                <w:color w:val="003B71"/>
-                <w:sz w:val="17"/>
-              </w:rPr>
-              <w:t>LAFAXOR</w:t>
-            </w:r>
-          </w:p>
-        </w:tc>
-        <w:tc>
-          <w:tcPr>
-            <w:tcW w:type="dxa" w:w="2381"/>
-          </w:tcPr>
-          <w:p>
-            <w:pPr>
-              <w:spacing w:before="60" w:after="60"/>
-              <w:ind w:left="85"/>
-            </w:pPr>
-            <w:r>
-              <w:rPr>
-                <w:rFonts w:ascii="Calibri" w:hAnsi="Calibri"/>
-                <w:b w:val="0"/>
-                <w:i w:val="0"/>
-                <w:color w:val="374151"/>
-                <w:sz w:val="17"/>
-              </w:rPr>
-              <w:t>Venlafaxine</w:t>
-            </w:r>
-          </w:p>
-        </w:tc>
-        <w:tc>
-          <w:tcPr>
-            <w:tcW w:type="dxa" w:w="1134"/>
-          </w:tcPr>
-          <w:p>
-            <w:pPr>
-              <w:spacing w:before="60" w:after="60"/>
-              <w:ind w:left="85"/>
-            </w:pPr>
-            <w:r>
-              <w:rPr>
-                <w:rFonts w:ascii="Calibri" w:hAnsi="Calibri"/>
-                <w:b w:val="0"/>
-                <w:i w:val="0"/>
-                <w:color w:val="374151"/>
-                <w:sz w:val="17"/>
-              </w:rPr>
-              <w:t>159,000đ/hộp</w:t>
-            </w:r>
-          </w:p>
-        </w:tc>
-        <w:tc>
-          <w:tcPr>
-            <w:tcW w:type="dxa" w:w="1247"/>
-            <w:shd w:val="clear" w:color="auto" w:fill="EFF6FF"/>
-          </w:tcPr>
-          <w:p>
-            <w:pPr>
-              <w:spacing w:before="60" w:after="60"/>
-              <w:ind w:left="85"/>
-            </w:pPr>
-            <w:r>
-              <w:rPr>
-                <w:rFonts w:ascii="Calibri" w:hAnsi="Calibri"/>
-                <w:b/>
-                <w:i w:val="0"/>
-                <w:color w:val="0056D2"/>
-                <w:sz w:val="17"/>
-              </w:rPr>
-              <w:t>Ổn định</w:t>
-            </w:r>
-          </w:p>
-        </w:tc>
-        <w:tc>
-          <w:tcPr>
-            <w:tcW w:type="dxa" w:w="2608"/>
-          </w:tcPr>
-          <w:p>
-            <w:pPr>
-              <w:spacing w:before="60" w:after="60"/>
-              <w:ind w:left="85"/>
-            </w:pPr>
-            <w:r>
-              <w:rPr>
-                <w:rFonts w:ascii="Calibri" w:hAnsi="Calibri"/>
-                <w:b w:val="0"/>
-                <w:i w:val="0"/>
-                <w:color w:val="374151"/>
-                <w:sz w:val="17"/>
-              </w:rPr>
-              <w:t>Kênh phòng khám tư nhân – tiềm năng tăng</w:t>
-            </w:r>
-          </w:p>
-        </w:tc>
-      </w:tr>
-      <w:tr>
-        <w:tc>
-          <w:tcPr>
-            <w:tcW w:type="dxa" w:w="1701"/>
-          </w:tcPr>
-          <w:p>
-            <w:pPr>
-              <w:spacing w:before="60" w:after="60"/>
-              <w:ind w:left="85"/>
-            </w:pPr>
-            <w:r>
-              <w:rPr>
-                <w:rFonts w:ascii="Calibri" w:hAnsi="Calibri"/>
-                <w:b/>
-                <w:i w:val="0"/>
-                <w:color w:val="003B71"/>
-                <w:sz w:val="17"/>
-              </w:rPr>
-              <w:t>HYYR</w:t>
-            </w:r>
-          </w:p>
-        </w:tc>
-        <w:tc>
-          <w:tcPr>
-            <w:tcW w:type="dxa" w:w="2381"/>
-          </w:tcPr>
-          <w:p>
-            <w:pPr>
-              <w:spacing w:before="60" w:after="60"/>
-              <w:ind w:left="85"/>
-            </w:pPr>
-            <w:r>
-              <w:rPr>
-                <w:rFonts w:ascii="Calibri" w:hAnsi="Calibri"/>
-                <w:b w:val="0"/>
-                <w:i w:val="0"/>
-                <w:color w:val="374151"/>
-                <w:sz w:val="17"/>
-              </w:rPr>
-              <w:t>Erlotinib</w:t>
-            </w:r>
-          </w:p>
-        </w:tc>
-        <w:tc>
-          <w:tcPr>
-            <w:tcW w:type="dxa" w:w="1134"/>
-          </w:tcPr>
-          <w:p>
-            <w:pPr>
-              <w:spacing w:before="60" w:after="60"/>
-              <w:ind w:left="85"/>
-            </w:pPr>
-            <w:r>
-              <w:rPr>
-                <w:rFonts w:ascii="Calibri" w:hAnsi="Calibri"/>
-                <w:b w:val="0"/>
-                <w:i w:val="0"/>
-                <w:color w:val="374151"/>
-                <w:sz w:val="17"/>
-              </w:rPr>
-              <w:t>1,500,000đ/hộp</w:t>
-            </w:r>
-          </w:p>
-        </w:tc>
-        <w:tc>
-          <w:tcPr>
-            <w:tcW w:type="dxa" w:w="1247"/>
-            <w:shd w:val="clear" w:color="auto" w:fill="E7F9EE"/>
-          </w:tcPr>
-          <w:p>
-            <w:pPr>
-              <w:spacing w:before="60" w:after="60"/>
-              <w:ind w:left="85"/>
-            </w:pPr>
-            <w:r>
-              <w:rPr>
-                <w:rFonts w:ascii="Calibri" w:hAnsi="Calibri"/>
-                <w:b/>
-                <w:i w:val="0"/>
-                <w:color w:val="166534"/>
-                <w:sz w:val="17"/>
-              </w:rPr>
-              <w:t>Cơ hội cao</w:t>
-            </w:r>
-          </w:p>
-        </w:tc>
-        <w:tc>
-          <w:tcPr>
-            <w:tcW w:type="dxa" w:w="2608"/>
-          </w:tcPr>
-          <w:p>
-            <w:pPr>
-              <w:spacing w:before="60" w:after="60"/>
-              <w:ind w:left="85"/>
-            </w:pPr>
-            <w:r>
-              <w:rPr>
-                <w:rFonts w:ascii="Calibri" w:hAnsi="Calibri"/>
-                <w:b w:val="0"/>
-                <w:i w:val="0"/>
-                <w:color w:val="374151"/>
-                <w:sz w:val="17"/>
-              </w:rPr>
-              <w:t>Thuốc đặc trị – ưu tiên thầu bệnh viện ung bướu</w:t>
-            </w:r>
-          </w:p>
-        </w:tc>
-      </w:tr>
-      <w:tr>
-        <w:tc>
-          <w:tcPr>
-            <w:tcW w:type="dxa" w:w="1701"/>
-          </w:tcPr>
-          <w:p>
-            <w:pPr>
-              <w:spacing w:before="60" w:after="60"/>
-              <w:ind w:left="85"/>
-            </w:pPr>
-            <w:r>
-              <w:rPr>
-                <w:rFonts w:ascii="Calibri" w:hAnsi="Calibri"/>
-                <w:b/>
-                <w:i w:val="0"/>
-                <w:color w:val="003B71"/>
-                <w:sz w:val="17"/>
-              </w:rPr>
-              <w:t>LARRIVEY</w:t>
-            </w:r>
-          </w:p>
-        </w:tc>
-        <w:tc>
-          <w:tcPr>
-            <w:tcW w:type="dxa" w:w="2381"/>
-          </w:tcPr>
-          <w:p>
-            <w:pPr>
-              <w:spacing w:before="60" w:after="60"/>
-              <w:ind w:left="85"/>
-            </w:pPr>
-            <w:r>
-              <w:rPr>
-                <w:rFonts w:ascii="Calibri" w:hAnsi="Calibri"/>
-                <w:b w:val="0"/>
-                <w:i w:val="0"/>
-                <w:color w:val="374151"/>
-                <w:sz w:val="17"/>
-              </w:rPr>
-              <w:t>Bicalutamide</w:t>
-            </w:r>
-          </w:p>
-        </w:tc>
-        <w:tc>
-          <w:tcPr>
-            <w:tcW w:type="dxa" w:w="1134"/>
-          </w:tcPr>
-          <w:p>
-            <w:pPr>
-              <w:spacing w:before="60" w:after="60"/>
-              <w:ind w:left="85"/>
-            </w:pPr>
-            <w:r>
-              <w:rPr>
-                <w:rFonts w:ascii="Calibri" w:hAnsi="Calibri"/>
-                <w:b w:val="0"/>
-                <w:i w:val="0"/>
-                <w:color w:val="374151"/>
-                <w:sz w:val="17"/>
-              </w:rPr>
-              <w:t>823,200đ/hộp</w:t>
-            </w:r>
-          </w:p>
-        </w:tc>
-        <w:tc>
-          <w:tcPr>
-            <w:tcW w:type="dxa" w:w="1247"/>
-            <w:shd w:val="clear" w:color="auto" w:fill="EFF6FF"/>
-          </w:tcPr>
-          <w:p>
-            <w:pPr>
-              <w:spacing w:before="60" w:after="60"/>
-              <w:ind w:left="85"/>
-            </w:pPr>
-            <w:r>
-              <w:rPr>
-                <w:rFonts w:ascii="Calibri" w:hAnsi="Calibri"/>
-                <w:b/>
-                <w:i w:val="0"/>
-                <w:color w:val="0056D2"/>
-                <w:sz w:val="17"/>
-              </w:rPr>
-              <w:t>Ổn định</w:t>
-            </w:r>
-          </w:p>
-        </w:tc>
-        <w:tc>
-          <w:tcPr>
-            <w:tcW w:type="dxa" w:w="2608"/>
-          </w:tcPr>
-          <w:p>
-            <w:pPr>
-              <w:spacing w:before="60" w:after="60"/>
-              <w:ind w:left="85"/>
-            </w:pPr>
-            <w:r>
-              <w:rPr>
-                <w:rFonts w:ascii="Calibri" w:hAnsi="Calibri"/>
-                <w:b w:val="0"/>
-                <w:i w:val="0"/>
-                <w:color w:val="374151"/>
-                <w:sz w:val="17"/>
-              </w:rPr>
-              <w:t>Theo dõi phác đồ bệnh viện – biên lợi nhuận cao</w:t>
-            </w:r>
-          </w:p>
-        </w:tc>
-      </w:tr>
-      <w:tr>
-        <w:tc>
-          <w:tcPr>
-            <w:tcW w:type="dxa" w:w="1701"/>
-          </w:tcPr>
-          <w:p>
-            <w:pPr>
-              <w:spacing w:before="60" w:after="60"/>
-              <w:ind w:left="85"/>
-            </w:pPr>
-            <w:r>
-              <w:rPr>
-                <w:rFonts w:ascii="Calibri" w:hAnsi="Calibri"/>
-                <w:b/>
-                <w:i w:val="0"/>
-                <w:color w:val="003B71"/>
-                <w:sz w:val="17"/>
-              </w:rPr>
-              <w:t>METILONE-4</w:t>
-            </w:r>
-          </w:p>
-        </w:tc>
-        <w:tc>
-          <w:tcPr>
-            <w:tcW w:type="dxa" w:w="2381"/>
-          </w:tcPr>
-          <w:p>
-            <w:pPr>
-              <w:spacing w:before="60" w:after="60"/>
-              <w:ind w:left="85"/>
-            </w:pPr>
-            <w:r>
-              <w:rPr>
-                <w:rFonts w:ascii="Calibri" w:hAnsi="Calibri"/>
-                <w:b w:val="0"/>
-                <w:i w:val="0"/>
-                <w:color w:val="374151"/>
-                <w:sz w:val="17"/>
-              </w:rPr>
-              <w:t>Methylprednisolone 4mg</w:t>
-            </w:r>
-          </w:p>
-        </w:tc>
-        <w:tc>
-          <w:tcPr>
-            <w:tcW w:type="dxa" w:w="1134"/>
-          </w:tcPr>
-          <w:p>
-            <w:pPr>
-              <w:spacing w:before="60" w:after="60"/>
-              <w:ind w:left="85"/>
-            </w:pPr>
-            <w:r>
-              <w:rPr>
-                <w:rFonts w:ascii="Calibri" w:hAnsi="Calibri"/>
-                <w:b w:val="0"/>
-                <w:i w:val="0"/>
-                <w:color w:val="374151"/>
-                <w:sz w:val="17"/>
-              </w:rPr>
-              <w:t>74,000đ/hộp</w:t>
-            </w:r>
-          </w:p>
-        </w:tc>
-        <w:tc>
-          <w:tcPr>
-            <w:tcW w:type="dxa" w:w="1247"/>
-            <w:shd w:val="clear" w:color="auto" w:fill="EFF6FF"/>
-          </w:tcPr>
-          <w:p>
-            <w:pPr>
-              <w:spacing w:before="60" w:after="60"/>
-              <w:ind w:left="85"/>
-            </w:pPr>
-            <w:r>
-              <w:rPr>
-                <w:rFonts w:ascii="Calibri" w:hAnsi="Calibri"/>
-                <w:b/>
-                <w:i w:val="0"/>
-                <w:color w:val="0056D2"/>
-                <w:sz w:val="17"/>
-              </w:rPr>
-              <w:t>Ổn định</w:t>
-            </w:r>
-          </w:p>
-        </w:tc>
-        <w:tc>
-          <w:tcPr>
-            <w:tcW w:type="dxa" w:w="2608"/>
-          </w:tcPr>
-          <w:p>
-            <w:pPr>
-              <w:spacing w:before="60" w:after="60"/>
-              <w:ind w:left="85"/>
-            </w:pPr>
-            <w:r>
-              <w:rPr>
-                <w:rFonts w:ascii="Calibri" w:hAnsi="Calibri"/>
-                <w:b w:val="0"/>
-                <w:i w:val="0"/>
-                <w:color w:val="374151"/>
-                <w:sz w:val="17"/>
-              </w:rPr>
-              <w:t>Duy trì kênh ETC – theo dõi thầu TT Corticoid</w:t>
-            </w:r>
-          </w:p>
-        </w:tc>
-      </w:tr>
     </w:tbl>
     <w:p>
       <w:pPr>
@@ -4737,47 +1139,7 @@
           <w:color w:val="9CA3AF"/>
           <w:sz w:val="17"/>
         </w:rPr>
-        <w:t>Google Search Console  ·  30 ngày gần nhất  ·  Dữ liệu: 13/05/2026</w:t>
-      </w:r>
-    </w:p>
-    <w:p>
-      <w:pPr>
-        <w:spacing w:before="120" w:after="120"/>
-        <w:jc w:val="center"/>
-      </w:pPr>
-      <w:r>
-        <w:drawing>
-          <wp:inline xmlns:a="http://schemas.openxmlformats.org/drawingml/2006/main" xmlns:pic="http://schemas.openxmlformats.org/drawingml/2006/picture">
-            <wp:extent cx="5580000" cy="2444219"/>
-            <wp:docPr id="2" name="Picture 2"/>
-            <wp:cNvGraphicFramePr>
-              <a:graphicFrameLocks noChangeAspect="1"/>
-            </wp:cNvGraphicFramePr>
-            <a:graphic>
-              <a:graphicData uri="http://schemas.openxmlformats.org/drawingml/2006/picture">
-                <pic:pic>
-                  <pic:nvPicPr>
-                    <pic:cNvPr id="0" name="image.png"/>
-                    <pic:cNvPicPr/>
-                  </pic:nvPicPr>
-                  <pic:blipFill>
-                    <a:blip r:embed="rId11"/>
-                    <a:stretch>
-                      <a:fillRect/>
-                    </a:stretch>
-                  </pic:blipFill>
-                  <pic:spPr>
-                    <a:xfrm>
-                      <a:off x="0" y="0"/>
-                      <a:ext cx="5580000" cy="2444219"/>
-                    </a:xfrm>
-                    <a:prstGeom prst="rect"/>
-                  </pic:spPr>
-                </pic:pic>
-              </a:graphicData>
-            </a:graphic>
-          </wp:inline>
-        </w:drawing>
+        <w:t>Google Search Console  ·  30 ngày gần nhất  ·  Dữ liệu: 16/05/2026</w:t>
       </w:r>
     </w:p>
     <w:p>
@@ -4954,411 +1316,6 @@
           </w:p>
         </w:tc>
       </w:tr>
-      <w:tr>
-        <w:tc>
-          <w:tcPr>
-            <w:tcW w:type="dxa" w:w="454"/>
-            <w:shd w:val="clear" w:color="auto" w:fill="FEE2E2"/>
-            <w:tcBorders>
-              <w:top w:val="none" w:sz="6" w:color="auto"/>
-              <w:bottom w:val="none" w:sz="6" w:color="auto"/>
-              <w:left w:val="none" w:sz="6" w:color="auto"/>
-              <w:right w:val="none" w:sz="6" w:color="auto"/>
-            </w:tcBorders>
-          </w:tcPr>
-          <w:p>
-            <w:pPr>
-              <w:spacing w:before="100" w:after="100"/>
-              <w:jc w:val="center"/>
-            </w:pPr>
-            <w:r>
-              <w:t>🔴</w:t>
-            </w:r>
-          </w:p>
-        </w:tc>
-        <w:tc>
-          <w:tcPr>
-            <w:tcW w:type="dxa" w:w="4422"/>
-            <w:shd w:val="clear" w:color="auto" w:fill="FFFFFF"/>
-            <w:tcBorders>
-              <w:top w:val="none" w:sz="6" w:color="auto"/>
-              <w:bottom w:val="none" w:sz="6" w:color="auto"/>
-              <w:left w:val="none" w:sz="6" w:color="auto"/>
-              <w:right w:val="none" w:sz="6" w:color="auto"/>
-            </w:tcBorders>
-          </w:tcPr>
-          <w:p>
-            <w:pPr>
-              <w:spacing w:before="80" w:after="80"/>
-              <w:ind w:left="85"/>
-            </w:pPr>
-            <w:r>
-              <w:rPr>
-                <w:rFonts w:ascii="Calibri" w:hAnsi="Calibri"/>
-                <w:b/>
-                <w:i w:val="0"/>
-                <w:color w:val="111827"/>
-                <w:sz w:val="18"/>
-              </w:rPr>
-              <w:t>Chuẩn bị tài liệu kê đơn RAVASTEL, EIMLER-10, ZLATKO cho bệnh nhân sau sàng lọc định kỳ miễn phí — ưu tiên tuyến huyện trước chu kỳ thầu</w:t>
-            </w:r>
-          </w:p>
-        </w:tc>
-        <w:tc>
-          <w:tcPr>
-            <w:tcW w:type="dxa" w:w="1417"/>
-            <w:shd w:val="clear" w:color="auto" w:fill="FFFFFF"/>
-            <w:tcBorders>
-              <w:top w:val="none" w:sz="6" w:color="auto"/>
-              <w:bottom w:val="none" w:sz="6" w:color="auto"/>
-              <w:left w:val="none" w:sz="6" w:color="auto"/>
-              <w:right w:val="none" w:sz="6" w:color="auto"/>
-            </w:tcBorders>
-          </w:tcPr>
-          <w:p>
-            <w:pPr>
-              <w:spacing w:before="80" w:after="80"/>
-              <w:jc w:val="center"/>
-            </w:pPr>
-            <w:r>
-              <w:rPr>
-                <w:rFonts w:ascii="Calibri" w:hAnsi="Calibri"/>
-                <w:b w:val="0"/>
-                <w:i w:val="0"/>
-                <w:color w:val="003B71"/>
-                <w:sz w:val="17"/>
-              </w:rPr>
-              <w:t>Marketing / Medical Affairs</w:t>
-            </w:r>
-          </w:p>
-        </w:tc>
-        <w:tc>
-          <w:tcPr>
-            <w:tcW w:type="dxa" w:w="1134"/>
-            <w:shd w:val="clear" w:color="auto" w:fill="FFFFFF"/>
-            <w:tcBorders>
-              <w:top w:val="none" w:sz="6" w:color="auto"/>
-              <w:bottom w:val="none" w:sz="6" w:color="auto"/>
-              <w:left w:val="none" w:sz="6" w:color="auto"/>
-              <w:right w:val="none" w:sz="6" w:color="auto"/>
-            </w:tcBorders>
-          </w:tcPr>
-          <w:p>
-            <w:pPr>
-              <w:spacing w:before="80" w:after="80"/>
-              <w:jc w:val="center"/>
-            </w:pPr>
-            <w:r>
-              <w:rPr>
-                <w:rFonts w:ascii="Calibri" w:hAnsi="Calibri"/>
-                <w:b w:val="0"/>
-                <w:i w:val="0"/>
-                <w:color w:val="6B7280"/>
-                <w:sz w:val="17"/>
-              </w:rPr>
-              <w:t>Khám sức khỏe định kỳ miễn phí toàn dân — mở rộng phễu bệnh nhân mạn tính</w:t>
-            </w:r>
-          </w:p>
-        </w:tc>
-        <w:tc>
-          <w:tcPr>
-            <w:tcW w:type="dxa" w:w="1644"/>
-            <w:shd w:val="clear" w:color="auto" w:fill="FEE2E2"/>
-            <w:tcBorders>
-              <w:top w:val="none" w:sz="6" w:color="auto"/>
-              <w:bottom w:val="none" w:sz="6" w:color="auto"/>
-              <w:left w:val="none" w:sz="6" w:color="auto"/>
-              <w:right w:val="none" w:sz="6" w:color="auto"/>
-            </w:tcBorders>
-          </w:tcPr>
-          <w:p>
-            <w:pPr>
-              <w:spacing w:before="80" w:after="80"/>
-              <w:jc w:val="center"/>
-            </w:pPr>
-            <w:r>
-              <w:rPr>
-                <w:rFonts w:ascii="Calibri" w:hAnsi="Calibri"/>
-                <w:b/>
-                <w:i w:val="0"/>
-                <w:color w:val="EF4444"/>
-                <w:sz w:val="17"/>
-              </w:rPr>
-              <w:t>🔴 Cao</w:t>
-            </w:r>
-          </w:p>
-        </w:tc>
-      </w:tr>
-      <w:tr>
-        <w:tc>
-          <w:tcPr>
-            <w:tcW w:type="dxa" w:w="454"/>
-            <w:shd w:val="clear" w:color="auto" w:fill="FEE2E2"/>
-            <w:tcBorders>
-              <w:top w:val="none" w:sz="6" w:color="auto"/>
-              <w:bottom w:val="none" w:sz="6" w:color="auto"/>
-              <w:left w:val="none" w:sz="6" w:color="auto"/>
-              <w:right w:val="none" w:sz="6" w:color="auto"/>
-            </w:tcBorders>
-          </w:tcPr>
-          <w:p>
-            <w:pPr>
-              <w:spacing w:before="100" w:after="100"/>
-              <w:jc w:val="center"/>
-            </w:pPr>
-            <w:r>
-              <w:t>🔴</w:t>
-            </w:r>
-          </w:p>
-        </w:tc>
-        <w:tc>
-          <w:tcPr>
-            <w:tcW w:type="dxa" w:w="4422"/>
-            <w:shd w:val="clear" w:color="auto" w:fill="FAFBFF"/>
-            <w:tcBorders>
-              <w:top w:val="none" w:sz="6" w:color="auto"/>
-              <w:bottom w:val="none" w:sz="6" w:color="auto"/>
-              <w:left w:val="none" w:sz="6" w:color="auto"/>
-              <w:right w:val="none" w:sz="6" w:color="auto"/>
-            </w:tcBorders>
-          </w:tcPr>
-          <w:p>
-            <w:pPr>
-              <w:spacing w:before="80" w:after="80"/>
-              <w:ind w:left="85"/>
-            </w:pPr>
-            <w:r>
-              <w:rPr>
-                <w:rFonts w:ascii="Calibri" w:hAnsi="Calibri"/>
-                <w:b/>
-                <w:i w:val="0"/>
-                <w:color w:val="111827"/>
-                <w:sz w:val="18"/>
-              </w:rPr>
-              <w:t>Triển khai detailing PECHAUNOX (Perindopril+Amlodipin) nhân Ngày Tăng huyết áp 17/5 — thông điệp FDC tuân thủ điều trị tại bệnh viện tỉnh</w:t>
-            </w:r>
-          </w:p>
-        </w:tc>
-        <w:tc>
-          <w:tcPr>
-            <w:tcW w:type="dxa" w:w="1417"/>
-            <w:shd w:val="clear" w:color="auto" w:fill="FAFBFF"/>
-            <w:tcBorders>
-              <w:top w:val="none" w:sz="6" w:color="auto"/>
-              <w:bottom w:val="none" w:sz="6" w:color="auto"/>
-              <w:left w:val="none" w:sz="6" w:color="auto"/>
-              <w:right w:val="none" w:sz="6" w:color="auto"/>
-            </w:tcBorders>
-          </w:tcPr>
-          <w:p>
-            <w:pPr>
-              <w:spacing w:before="80" w:after="80"/>
-              <w:jc w:val="center"/>
-            </w:pPr>
-            <w:r>
-              <w:rPr>
-                <w:rFonts w:ascii="Calibri" w:hAnsi="Calibri"/>
-                <w:b w:val="0"/>
-                <w:i w:val="0"/>
-                <w:color w:val="003B71"/>
-                <w:sz w:val="17"/>
-              </w:rPr>
-              <w:t>Sales / Marketing</w:t>
-            </w:r>
-          </w:p>
-        </w:tc>
-        <w:tc>
-          <w:tcPr>
-            <w:tcW w:type="dxa" w:w="1134"/>
-            <w:shd w:val="clear" w:color="auto" w:fill="FAFBFF"/>
-            <w:tcBorders>
-              <w:top w:val="none" w:sz="6" w:color="auto"/>
-              <w:bottom w:val="none" w:sz="6" w:color="auto"/>
-              <w:left w:val="none" w:sz="6" w:color="auto"/>
-              <w:right w:val="none" w:sz="6" w:color="auto"/>
-            </w:tcBorders>
-          </w:tcPr>
-          <w:p>
-            <w:pPr>
-              <w:spacing w:before="80" w:after="80"/>
-              <w:jc w:val="center"/>
-            </w:pPr>
-            <w:r>
-              <w:rPr>
-                <w:rFonts w:ascii="Calibri" w:hAnsi="Calibri"/>
-                <w:b w:val="0"/>
-                <w:i w:val="0"/>
-                <w:color w:val="6B7280"/>
-                <w:sz w:val="17"/>
-              </w:rPr>
-              <w:t>Tăng huyết áp bỏ sót hàng triệu người Việt — cơ hội FDC và đấu thầu ETC</w:t>
-            </w:r>
-          </w:p>
-        </w:tc>
-        <w:tc>
-          <w:tcPr>
-            <w:tcW w:type="dxa" w:w="1644"/>
-            <w:shd w:val="clear" w:color="auto" w:fill="FEE2E2"/>
-            <w:tcBorders>
-              <w:top w:val="none" w:sz="6" w:color="auto"/>
-              <w:bottom w:val="none" w:sz="6" w:color="auto"/>
-              <w:left w:val="none" w:sz="6" w:color="auto"/>
-              <w:right w:val="none" w:sz="6" w:color="auto"/>
-            </w:tcBorders>
-          </w:tcPr>
-          <w:p>
-            <w:pPr>
-              <w:spacing w:before="80" w:after="80"/>
-              <w:jc w:val="center"/>
-            </w:pPr>
-            <w:r>
-              <w:rPr>
-                <w:rFonts w:ascii="Calibri" w:hAnsi="Calibri"/>
-                <w:b/>
-                <w:i w:val="0"/>
-                <w:color w:val="EF4444"/>
-                <w:sz w:val="17"/>
-              </w:rPr>
-              <w:t>🔴 Cao</w:t>
-            </w:r>
-          </w:p>
-        </w:tc>
-      </w:tr>
-      <w:tr>
-        <w:tc>
-          <w:tcPr>
-            <w:tcW w:type="dxa" w:w="454"/>
-            <w:shd w:val="clear" w:color="auto" w:fill="FEF3C7"/>
-            <w:tcBorders>
-              <w:top w:val="none" w:sz="6" w:color="auto"/>
-              <w:bottom w:val="none" w:sz="6" w:color="auto"/>
-              <w:left w:val="none" w:sz="6" w:color="auto"/>
-              <w:right w:val="none" w:sz="6" w:color="auto"/>
-            </w:tcBorders>
-          </w:tcPr>
-          <w:p>
-            <w:pPr>
-              <w:spacing w:before="100" w:after="100"/>
-              <w:jc w:val="center"/>
-            </w:pPr>
-            <w:r>
-              <w:t>🟡</w:t>
-            </w:r>
-          </w:p>
-        </w:tc>
-        <w:tc>
-          <w:tcPr>
-            <w:tcW w:type="dxa" w:w="4422"/>
-            <w:shd w:val="clear" w:color="auto" w:fill="FFFFFF"/>
-            <w:tcBorders>
-              <w:top w:val="none" w:sz="6" w:color="auto"/>
-              <w:bottom w:val="none" w:sz="6" w:color="auto"/>
-              <w:left w:val="none" w:sz="6" w:color="auto"/>
-              <w:right w:val="none" w:sz="6" w:color="auto"/>
-            </w:tcBorders>
-          </w:tcPr>
-          <w:p>
-            <w:pPr>
-              <w:spacing w:before="80" w:after="80"/>
-              <w:ind w:left="85"/>
-            </w:pPr>
-            <w:r>
-              <w:rPr>
-                <w:rFonts w:ascii="Calibri" w:hAnsi="Calibri"/>
-                <w:b/>
-                <w:i w:val="0"/>
-                <w:color w:val="111827"/>
-                <w:sz w:val="18"/>
-              </w:rPr>
-              <w:t>Detailing JIRACEK, MARTAZ tại khoa Tiêu hóa Bạch Mai, Chợ Rẫy — nhấn mạnh vai trò PPI trong phác đồ diệt HP trước thầu Q3/2026</w:t>
-            </w:r>
-          </w:p>
-        </w:tc>
-        <w:tc>
-          <w:tcPr>
-            <w:tcW w:type="dxa" w:w="1417"/>
-            <w:shd w:val="clear" w:color="auto" w:fill="FFFFFF"/>
-            <w:tcBorders>
-              <w:top w:val="none" w:sz="6" w:color="auto"/>
-              <w:bottom w:val="none" w:sz="6" w:color="auto"/>
-              <w:left w:val="none" w:sz="6" w:color="auto"/>
-              <w:right w:val="none" w:sz="6" w:color="auto"/>
-            </w:tcBorders>
-          </w:tcPr>
-          <w:p>
-            <w:pPr>
-              <w:spacing w:before="80" w:after="80"/>
-              <w:jc w:val="center"/>
-            </w:pPr>
-            <w:r>
-              <w:rPr>
-                <w:rFonts w:ascii="Calibri" w:hAnsi="Calibri"/>
-                <w:b w:val="0"/>
-                <w:i w:val="0"/>
-                <w:color w:val="003B71"/>
-                <w:sz w:val="17"/>
-              </w:rPr>
-              <w:t>Sales / Medical Affairs</w:t>
-            </w:r>
-          </w:p>
-        </w:tc>
-        <w:tc>
-          <w:tcPr>
-            <w:tcW w:type="dxa" w:w="1134"/>
-            <w:shd w:val="clear" w:color="auto" w:fill="FFFFFF"/>
-            <w:tcBorders>
-              <w:top w:val="none" w:sz="6" w:color="auto"/>
-              <w:bottom w:val="none" w:sz="6" w:color="auto"/>
-              <w:left w:val="none" w:sz="6" w:color="auto"/>
-              <w:right w:val="none" w:sz="6" w:color="auto"/>
-            </w:tcBorders>
-          </w:tcPr>
-          <w:p>
-            <w:pPr>
-              <w:spacing w:before="80" w:after="80"/>
-              <w:jc w:val="center"/>
-            </w:pPr>
-            <w:r>
-              <w:rPr>
-                <w:rFonts w:ascii="Calibri" w:hAnsi="Calibri"/>
-                <w:b w:val="0"/>
-                <w:i w:val="0"/>
-                <w:color w:val="6B7280"/>
-                <w:sz w:val="17"/>
-              </w:rPr>
-              <w:t>Nhận thức HP &amp; ung thư dạ dày tăng — nhu cầu PPI dài hạn kênh ETC</w:t>
-            </w:r>
-          </w:p>
-        </w:tc>
-        <w:tc>
-          <w:tcPr>
-            <w:tcW w:type="dxa" w:w="1644"/>
-            <w:shd w:val="clear" w:color="auto" w:fill="FEF3C7"/>
-            <w:tcBorders>
-              <w:top w:val="none" w:sz="6" w:color="auto"/>
-              <w:bottom w:val="none" w:sz="6" w:color="auto"/>
-              <w:left w:val="none" w:sz="6" w:color="auto"/>
-              <w:right w:val="none" w:sz="6" w:color="auto"/>
-            </w:tcBorders>
-          </w:tcPr>
-          <w:p>
-            <w:pPr>
-              <w:spacing w:before="80" w:after="80"/>
-              <w:jc w:val="center"/>
-            </w:pPr>
-            <w:r>
-              <w:rPr>
-                <w:rFonts w:ascii="Calibri" w:hAnsi="Calibri"/>
-                <w:b/>
-                <w:i w:val="0"/>
-                <w:color w:val="D97706"/>
-                <w:sz w:val="17"/>
-              </w:rPr>
-              <w:t>🟡 Trung</w:t>
-            </w:r>
-          </w:p>
-        </w:tc>
-      </w:tr>
     </w:tbl>
     <w:p>
       <w:pPr>
@@ -5399,7 +1356,7 @@
                 <w:color w:val="9CA3AF"/>
                 <w:sz w:val="15"/>
               </w:rPr>
-              <w:t>Davipharm Market Intelligence System  ·  Powered by Claude Sonnet 4.6  ·  13/05/2026  ·  CONFIDENTIAL</w:t>
+              <w:t>Davipharm Market Intelligence System  ·  Powered by Claude Sonnet 4.6  ·  16/05/2026  ·  CONFIDENTIAL</w:t>
             </w:r>
           </w:p>
         </w:tc>

</xml_diff>